<commit_message>
Add visible per-standard UDL 3.0 + MTSS callout to all 7 workbooks
Each standard's section now opens with a 'UDL ACCESS & MTSS SUPPORT (this standard)'
callout — CAST 3.0 access options (read-aloud, EN/ES glossing, multiple response
modes, large-print/screen-reader; firm goal, flexible means) and MTSS Tier 1/2/3
routing. 35 callouts total (one per standard); primary-source images unchanged;
all workbooks leak-clean.

Co-Authored-By: Claude Opus 4.8 <noreply@anthropic.com>
Claude-Session: https://claude.ai/code/session_01DHdLjiiJeW6A83FcYRQ3qv
</commit_message>
<xml_diff>
--- a/courses/foundations-constitutional-government/BUILD/unit4/deliverables/Unit4_Student_Workbook_CourseStandard.docx
+++ b/courses/foundations-constitutional-government/BUILD/unit4/deliverables/Unit4_Student_Workbook_CourseStandard.docx
@@ -3953,6 +3953,99 @@
                 <w:caps w:val="false"/>
                 <w:rFonts w:ascii="Calibri" w:cs="Calibri" w:eastAsia="Calibri" w:hAnsi="Calibri"/>
               </w:rPr>
+              <w:t xml:space="preserve">UDL ACCESS &amp; MTSS SUPPORT (this standard)</w:t>
+            </w:r>
+          </w:p>
+          <w:p>
+            <w:pPr>
+              <w:spacing w:after="40"/>
+            </w:pPr>
+            <w:r>
+              <w:rPr>
+                <w:b w:val="false"/>
+                <w:bCs w:val="false"/>
+                <w:i w:val="false"/>
+                <w:iCs w:val="false"/>
+                <w:color w:val="1A1A1A"/>
+                <w:sz w:val="22"/>
+                <w:szCs w:val="22"/>
+                <w:caps w:val="false"/>
+                <w:rFonts w:ascii="Calibri" w:cs="Calibri" w:eastAsia="Calibri" w:hAnsi="Calibri"/>
+              </w:rPr>
+              <w:t xml:space="preserve">UDL 3.0 (CAST): read-aloud on request · key terms glossed (EN/ES) · respond in writing, speech, or a labeled diagram · large-print &amp; screen-reader friendly. Same learning target for everyone; supports vary the means, not the ceiling.</w:t>
+            </w:r>
+          </w:p>
+          <w:p>
+            <w:pPr>
+              <w:spacing w:after="40"/>
+            </w:pPr>
+            <w:r>
+              <w:rPr>
+                <w:b w:val="false"/>
+                <w:bCs w:val="false"/>
+                <w:i w:val="false"/>
+                <w:iCs w:val="false"/>
+                <w:color w:val="1A1A1A"/>
+                <w:sz w:val="22"/>
+                <w:szCs w:val="22"/>
+                <w:caps w:val="false"/>
+                <w:rFonts w:ascii="Calibri" w:cs="Calibri" w:eastAsia="Calibri" w:hAnsi="Calibri"/>
+              </w:rPr>
+              <w:t xml:space="preserve">MTSS: Tier 1 — this core lesson for all · Tier 2 — small-group reteach of this standard using its Cornell cues + graphic organizer, then re-check · Tier 3 — intensive 1:1 with concrete→representational→abstract scaffolding, progress-monitored to the same standard.</w:t>
+            </w:r>
+          </w:p>
+        </w:tc>
+      </w:tr>
+    </w:tbl>
+    <w:tbl>
+      <w:tblPr>
+        <w:tblW w:type="dxa" w:w="9648"/>
+        <w:tblBorders>
+          <w:top w:val="single" w:color="auto" w:sz="4"/>
+          <w:left w:val="single" w:color="auto" w:sz="4"/>
+          <w:bottom w:val="single" w:color="auto" w:sz="4"/>
+          <w:right w:val="single" w:color="auto" w:sz="4"/>
+          <w:insideH w:val="single" w:color="auto" w:sz="4"/>
+          <w:insideV w:val="single" w:color="auto" w:sz="4"/>
+        </w:tblBorders>
+      </w:tblPr>
+      <w:tblGrid>
+        <w:gridCol w:w="9648"/>
+      </w:tblGrid>
+      <w:tr>
+        <w:tc>
+          <w:tcPr>
+            <w:tcW w:type="dxa" w:w="9648"/>
+            <w:tcBorders>
+              <w:top w:val="single" w:color="D9D5C8" w:sz="4"/>
+              <w:left w:val="single" w:color="D9D5C8" w:sz="4"/>
+              <w:bottom w:val="single" w:color="D9D5C8" w:sz="4"/>
+              <w:right w:val="single" w:color="D9D5C8" w:sz="4"/>
+            </w:tcBorders>
+            <w:shd w:fill="F7F5EF" w:color="auto" w:val="clear"/>
+            <w:tcMar>
+              <w:top w:type="dxa" w:w="55"/>
+              <w:left w:type="dxa" w:w="110"/>
+              <w:bottom w:type="dxa" w:w="55"/>
+              <w:right w:type="dxa" w:w="110"/>
+            </w:tcMar>
+          </w:tcPr>
+          <w:p>
+            <w:pPr>
+              <w:spacing w:after="60"/>
+            </w:pPr>
+            <w:r>
+              <w:rPr>
+                <w:b/>
+                <w:bCs/>
+                <w:i w:val="false"/>
+                <w:iCs w:val="false"/>
+                <w:color w:val="1B2A4A"/>
+                <w:sz w:val="21"/>
+                <w:szCs w:val="21"/>
+                <w:caps w:val="false"/>
+                <w:rFonts w:ascii="Calibri" w:cs="Calibri" w:eastAsia="Calibri" w:hAnsi="Calibri"/>
+              </w:rPr>
               <w:t xml:space="preserve">SET YOUR GOAL (self-direction)</w:t>
             </w:r>
           </w:p>
@@ -18605,6 +18698,99 @@
                 <w:caps w:val="false"/>
                 <w:rFonts w:ascii="Calibri" w:cs="Calibri" w:eastAsia="Calibri" w:hAnsi="Calibri"/>
               </w:rPr>
+              <w:t xml:space="preserve">UDL ACCESS &amp; MTSS SUPPORT (this standard)</w:t>
+            </w:r>
+          </w:p>
+          <w:p>
+            <w:pPr>
+              <w:spacing w:after="40"/>
+            </w:pPr>
+            <w:r>
+              <w:rPr>
+                <w:b w:val="false"/>
+                <w:bCs w:val="false"/>
+                <w:i w:val="false"/>
+                <w:iCs w:val="false"/>
+                <w:color w:val="1A1A1A"/>
+                <w:sz w:val="22"/>
+                <w:szCs w:val="22"/>
+                <w:caps w:val="false"/>
+                <w:rFonts w:ascii="Calibri" w:cs="Calibri" w:eastAsia="Calibri" w:hAnsi="Calibri"/>
+              </w:rPr>
+              <w:t xml:space="preserve">UDL 3.0 (CAST): read-aloud on request · key terms glossed (EN/ES) · respond in writing, speech, or a labeled diagram · large-print &amp; screen-reader friendly. Same learning target for everyone; supports vary the means, not the ceiling.</w:t>
+            </w:r>
+          </w:p>
+          <w:p>
+            <w:pPr>
+              <w:spacing w:after="40"/>
+            </w:pPr>
+            <w:r>
+              <w:rPr>
+                <w:b w:val="false"/>
+                <w:bCs w:val="false"/>
+                <w:i w:val="false"/>
+                <w:iCs w:val="false"/>
+                <w:color w:val="1A1A1A"/>
+                <w:sz w:val="22"/>
+                <w:szCs w:val="22"/>
+                <w:caps w:val="false"/>
+                <w:rFonts w:ascii="Calibri" w:cs="Calibri" w:eastAsia="Calibri" w:hAnsi="Calibri"/>
+              </w:rPr>
+              <w:t xml:space="preserve">MTSS: Tier 1 — this core lesson for all · Tier 2 — small-group reteach of this standard using its Cornell cues + graphic organizer, then re-check · Tier 3 — intensive 1:1 with concrete→representational→abstract scaffolding, progress-monitored to the same standard.</w:t>
+            </w:r>
+          </w:p>
+        </w:tc>
+      </w:tr>
+    </w:tbl>
+    <w:tbl>
+      <w:tblPr>
+        <w:tblW w:type="dxa" w:w="9648"/>
+        <w:tblBorders>
+          <w:top w:val="single" w:color="auto" w:sz="4"/>
+          <w:left w:val="single" w:color="auto" w:sz="4"/>
+          <w:bottom w:val="single" w:color="auto" w:sz="4"/>
+          <w:right w:val="single" w:color="auto" w:sz="4"/>
+          <w:insideH w:val="single" w:color="auto" w:sz="4"/>
+          <w:insideV w:val="single" w:color="auto" w:sz="4"/>
+        </w:tblBorders>
+      </w:tblPr>
+      <w:tblGrid>
+        <w:gridCol w:w="9648"/>
+      </w:tblGrid>
+      <w:tr>
+        <w:tc>
+          <w:tcPr>
+            <w:tcW w:type="dxa" w:w="9648"/>
+            <w:tcBorders>
+              <w:top w:val="single" w:color="D9D5C8" w:sz="4"/>
+              <w:left w:val="single" w:color="D9D5C8" w:sz="4"/>
+              <w:bottom w:val="single" w:color="D9D5C8" w:sz="4"/>
+              <w:right w:val="single" w:color="D9D5C8" w:sz="4"/>
+            </w:tcBorders>
+            <w:shd w:fill="F7F5EF" w:color="auto" w:val="clear"/>
+            <w:tcMar>
+              <w:top w:type="dxa" w:w="55"/>
+              <w:left w:type="dxa" w:w="110"/>
+              <w:bottom w:type="dxa" w:w="55"/>
+              <w:right w:type="dxa" w:w="110"/>
+            </w:tcMar>
+          </w:tcPr>
+          <w:p>
+            <w:pPr>
+              <w:spacing w:after="60"/>
+            </w:pPr>
+            <w:r>
+              <w:rPr>
+                <w:b/>
+                <w:bCs/>
+                <w:i w:val="false"/>
+                <w:iCs w:val="false"/>
+                <w:color w:val="1B2A4A"/>
+                <w:sz w:val="21"/>
+                <w:szCs w:val="21"/>
+                <w:caps w:val="false"/>
+                <w:rFonts w:ascii="Calibri" w:cs="Calibri" w:eastAsia="Calibri" w:hAnsi="Calibri"/>
+              </w:rPr>
               <w:t xml:space="preserve">SET YOUR GOAL (self-direction)</w:t>
             </w:r>
           </w:p>
@@ -33203,6 +33389,99 @@
                 <w:rFonts w:ascii="Calibri" w:cs="Calibri" w:eastAsia="Calibri" w:hAnsi="Calibri"/>
               </w:rPr>
               <w:t xml:space="preserve">Every student works this standard at the same rigor: analyze the sources and vocabulary, then demonstrate learning on the Practice Quiz and CER. UDL and MTSS give you flexible ways in — they never lower the bar. Check yourself against the learning targets on the Cornell Notes page.</w:t>
+            </w:r>
+          </w:p>
+        </w:tc>
+      </w:tr>
+    </w:tbl>
+    <w:tbl>
+      <w:tblPr>
+        <w:tblW w:type="dxa" w:w="9648"/>
+        <w:tblBorders>
+          <w:top w:val="single" w:color="auto" w:sz="4"/>
+          <w:left w:val="single" w:color="auto" w:sz="4"/>
+          <w:bottom w:val="single" w:color="auto" w:sz="4"/>
+          <w:right w:val="single" w:color="auto" w:sz="4"/>
+          <w:insideH w:val="single" w:color="auto" w:sz="4"/>
+          <w:insideV w:val="single" w:color="auto" w:sz="4"/>
+        </w:tblBorders>
+      </w:tblPr>
+      <w:tblGrid>
+        <w:gridCol w:w="9648"/>
+      </w:tblGrid>
+      <w:tr>
+        <w:tc>
+          <w:tcPr>
+            <w:tcW w:type="dxa" w:w="9648"/>
+            <w:tcBorders>
+              <w:top w:val="single" w:color="D9D5C8" w:sz="4"/>
+              <w:left w:val="single" w:color="D9D5C8" w:sz="4"/>
+              <w:bottom w:val="single" w:color="D9D5C8" w:sz="4"/>
+              <w:right w:val="single" w:color="D9D5C8" w:sz="4"/>
+            </w:tcBorders>
+            <w:shd w:fill="F7F5EF" w:color="auto" w:val="clear"/>
+            <w:tcMar>
+              <w:top w:type="dxa" w:w="55"/>
+              <w:left w:type="dxa" w:w="110"/>
+              <w:bottom w:type="dxa" w:w="55"/>
+              <w:right w:type="dxa" w:w="110"/>
+            </w:tcMar>
+          </w:tcPr>
+          <w:p>
+            <w:pPr>
+              <w:spacing w:after="60"/>
+            </w:pPr>
+            <w:r>
+              <w:rPr>
+                <w:b/>
+                <w:bCs/>
+                <w:i w:val="false"/>
+                <w:iCs w:val="false"/>
+                <w:color w:val="1B2A4A"/>
+                <w:sz w:val="21"/>
+                <w:szCs w:val="21"/>
+                <w:caps w:val="false"/>
+                <w:rFonts w:ascii="Calibri" w:cs="Calibri" w:eastAsia="Calibri" w:hAnsi="Calibri"/>
+              </w:rPr>
+              <w:t xml:space="preserve">UDL ACCESS &amp; MTSS SUPPORT (this standard)</w:t>
+            </w:r>
+          </w:p>
+          <w:p>
+            <w:pPr>
+              <w:spacing w:after="40"/>
+            </w:pPr>
+            <w:r>
+              <w:rPr>
+                <w:b w:val="false"/>
+                <w:bCs w:val="false"/>
+                <w:i w:val="false"/>
+                <w:iCs w:val="false"/>
+                <w:color w:val="1A1A1A"/>
+                <w:sz w:val="22"/>
+                <w:szCs w:val="22"/>
+                <w:caps w:val="false"/>
+                <w:rFonts w:ascii="Calibri" w:cs="Calibri" w:eastAsia="Calibri" w:hAnsi="Calibri"/>
+              </w:rPr>
+              <w:t xml:space="preserve">UDL 3.0 (CAST): read-aloud on request · key terms glossed (EN/ES) · respond in writing, speech, or a labeled diagram · large-print &amp; screen-reader friendly. Same learning target for everyone; supports vary the means, not the ceiling.</w:t>
+            </w:r>
+          </w:p>
+          <w:p>
+            <w:pPr>
+              <w:spacing w:after="40"/>
+            </w:pPr>
+            <w:r>
+              <w:rPr>
+                <w:b w:val="false"/>
+                <w:bCs w:val="false"/>
+                <w:i w:val="false"/>
+                <w:iCs w:val="false"/>
+                <w:color w:val="1A1A1A"/>
+                <w:sz w:val="22"/>
+                <w:szCs w:val="22"/>
+                <w:caps w:val="false"/>
+                <w:rFonts w:ascii="Calibri" w:cs="Calibri" w:eastAsia="Calibri" w:hAnsi="Calibri"/>
+              </w:rPr>
+              <w:t xml:space="preserve">MTSS: Tier 1 — this core lesson for all · Tier 2 — small-group reteach of this standard using its Cornell cues + graphic organizer, then re-check · Tier 3 — intensive 1:1 with concrete→representational→abstract scaffolding, progress-monitored to the same standard.</w:t>
             </w:r>
           </w:p>
         </w:tc>

</xml_diff>

<commit_message>
Close the two Engagement UDL gaps → 9/9 guidelines evidenced-strong
Every standard's workbook section now carries two real student-facing design
elements (standard + large-print editions rebuilt, all 7 units):
- 'Choice & Voice' — student chooses how to go deeper (defend a term / connect to
  their life or community / take a side): CAST 7.1 autonomy + 7.2 relevance.
- 'Reflect & Connect' — belief before→after (9.3 reflection), state a differing
  view fairly (9.2/9.4 empathy + perspective), restorative discussion norm.
35 of each, verified; images intact; leak-clean. UDL audit re-scores Guideline 7
(7.1) and Guideline 9 to present-and-strong: net 9/9.

Co-Authored-By: Claude Opus 4.8 <noreply@anthropic.com>
Claude-Session: https://claude.ai/code/session_01DHdLjiiJeW6A83FcYRQ3qv
</commit_message>
<xml_diff>
--- a/courses/foundations-constitutional-government/BUILD/unit4/deliverables/Unit4_Student_Workbook_CourseStandard.docx
+++ b/courses/foundations-constitutional-government/BUILD/unit4/deliverables/Unit4_Student_Workbook_CourseStandard.docx
@@ -18525,6 +18525,230 @@
         </w:tc>
       </w:tr>
     </w:tbl>
+    <w:tbl>
+      <w:tblPr>
+        <w:tblW w:type="dxa" w:w="9648"/>
+        <w:tblBorders>
+          <w:top w:val="single" w:color="auto" w:sz="4"/>
+          <w:left w:val="single" w:color="auto" w:sz="4"/>
+          <w:bottom w:val="single" w:color="auto" w:sz="4"/>
+          <w:right w:val="single" w:color="auto" w:sz="4"/>
+          <w:insideH w:val="single" w:color="auto" w:sz="4"/>
+          <w:insideV w:val="single" w:color="auto" w:sz="4"/>
+        </w:tblBorders>
+      </w:tblPr>
+      <w:tblGrid>
+        <w:gridCol w:w="9648"/>
+      </w:tblGrid>
+      <w:tr>
+        <w:tc>
+          <w:tcPr>
+            <w:tcW w:type="dxa" w:w="9648"/>
+            <w:tcBorders>
+              <w:top w:val="single" w:color="D9D5C8" w:sz="4"/>
+              <w:left w:val="single" w:color="D9D5C8" w:sz="4"/>
+              <w:bottom w:val="single" w:color="D9D5C8" w:sz="4"/>
+              <w:right w:val="single" w:color="D9D5C8" w:sz="4"/>
+            </w:tcBorders>
+            <w:shd w:fill="F7F5EF" w:color="auto" w:val="clear"/>
+            <w:tcMar>
+              <w:top w:type="dxa" w:w="55"/>
+              <w:left w:type="dxa" w:w="110"/>
+              <w:bottom w:type="dxa" w:w="55"/>
+              <w:right w:type="dxa" w:w="110"/>
+            </w:tcMar>
+          </w:tcPr>
+          <w:p>
+            <w:pPr>
+              <w:spacing w:after="60"/>
+            </w:pPr>
+            <w:r>
+              <w:rPr>
+                <w:b/>
+                <w:bCs/>
+                <w:i w:val="false"/>
+                <w:iCs w:val="false"/>
+                <w:color w:val="1B2A4A"/>
+                <w:sz w:val="21"/>
+                <w:szCs w:val="21"/>
+                <w:caps w:val="false"/>
+                <w:rFonts w:ascii="Calibri" w:cs="Calibri" w:eastAsia="Calibri" w:hAnsi="Calibri"/>
+              </w:rPr>
+              <w:t xml:space="preserve">CHOICE &amp; VOICE — you decide how to go deeper (pick ONE)</w:t>
+            </w:r>
+          </w:p>
+          <w:p>
+            <w:pPr>
+              <w:spacing w:after="40"/>
+            </w:pPr>
+            <w:r>
+              <w:rPr>
+                <w:b w:val="false"/>
+                <w:bCs w:val="false"/>
+                <w:i w:val="false"/>
+                <w:iCs w:val="false"/>
+                <w:color w:val="1A1A1A"/>
+                <w:sz w:val="22"/>
+                <w:szCs w:val="22"/>
+                <w:caps w:val="false"/>
+                <w:rFonts w:ascii="Calibri" w:cs="Calibri" w:eastAsia="Calibri" w:hAnsi="Calibri"/>
+              </w:rPr>
+              <w:t xml:space="preserve">You choose your path to show this standard — every option meets the same target:</w:t>
+            </w:r>
+          </w:p>
+          <w:p>
+            <w:pPr>
+              <w:spacing w:after="40"/>
+            </w:pPr>
+            <w:r>
+              <w:rPr>
+                <w:b w:val="false"/>
+                <w:bCs w:val="false"/>
+                <w:i w:val="false"/>
+                <w:iCs w:val="false"/>
+                <w:color w:val="1A1A1A"/>
+                <w:sz w:val="22"/>
+                <w:szCs w:val="22"/>
+                <w:caps w:val="false"/>
+                <w:rFonts w:ascii="Calibri" w:cs="Calibri" w:eastAsia="Calibri" w:hAnsi="Calibri"/>
+              </w:rPr>
+              <w:t xml:space="preserve">DEFEND a term: pick the vocabulary word you think matters most and argue why in 2–3 sentences.  ·  CONNECT it: pick a current event, your community, or your own life and explain how this standard shows up there.  ·  TAKE A SIDE: pick one debatable question from this standard and argue your position with evidence.</w:t>
+            </w:r>
+          </w:p>
+          <w:p>
+            <w:pPr>
+              <w:spacing w:after="40"/>
+            </w:pPr>
+            <w:r>
+              <w:rPr>
+                <w:b w:val="false"/>
+                <w:bCs w:val="false"/>
+                <w:i w:val="false"/>
+                <w:iCs w:val="false"/>
+                <w:color w:val="1A1A1A"/>
+                <w:sz w:val="22"/>
+                <w:szCs w:val="22"/>
+                <w:caps w:val="false"/>
+                <w:rFonts w:ascii="Calibri" w:cs="Calibri" w:eastAsia="Calibri" w:hAnsi="Calibri"/>
+              </w:rPr>
+              <w:t xml:space="preserve">Your pick is yours — bring what matters to you into the work.</w:t>
+            </w:r>
+          </w:p>
+        </w:tc>
+      </w:tr>
+    </w:tbl>
+    <w:tbl>
+      <w:tblPr>
+        <w:tblW w:type="dxa" w:w="9648"/>
+        <w:tblBorders>
+          <w:top w:val="single" w:color="auto" w:sz="4"/>
+          <w:left w:val="single" w:color="auto" w:sz="4"/>
+          <w:bottom w:val="single" w:color="auto" w:sz="4"/>
+          <w:right w:val="single" w:color="auto" w:sz="4"/>
+          <w:insideH w:val="single" w:color="auto" w:sz="4"/>
+          <w:insideV w:val="single" w:color="auto" w:sz="4"/>
+        </w:tblBorders>
+      </w:tblPr>
+      <w:tblGrid>
+        <w:gridCol w:w="9648"/>
+      </w:tblGrid>
+      <w:tr>
+        <w:tc>
+          <w:tcPr>
+            <w:tcW w:type="dxa" w:w="9648"/>
+            <w:tcBorders>
+              <w:top w:val="single" w:color="D9D5C8" w:sz="4"/>
+              <w:left w:val="single" w:color="D9D5C8" w:sz="4"/>
+              <w:bottom w:val="single" w:color="D9D5C8" w:sz="4"/>
+              <w:right w:val="single" w:color="D9D5C8" w:sz="4"/>
+            </w:tcBorders>
+            <w:shd w:fill="F7F5EF" w:color="auto" w:val="clear"/>
+            <w:tcMar>
+              <w:top w:type="dxa" w:w="55"/>
+              <w:left w:type="dxa" w:w="110"/>
+              <w:bottom w:type="dxa" w:w="55"/>
+              <w:right w:type="dxa" w:w="110"/>
+            </w:tcMar>
+          </w:tcPr>
+          <w:p>
+            <w:pPr>
+              <w:spacing w:after="60"/>
+            </w:pPr>
+            <w:r>
+              <w:rPr>
+                <w:b/>
+                <w:bCs/>
+                <w:i w:val="false"/>
+                <w:iCs w:val="false"/>
+                <w:color w:val="1B2A4A"/>
+                <w:sz w:val="21"/>
+                <w:szCs w:val="21"/>
+                <w:caps w:val="false"/>
+                <w:rFonts w:ascii="Calibri" w:cs="Calibri" w:eastAsia="Calibri" w:hAnsi="Calibri"/>
+              </w:rPr>
+              <w:t xml:space="preserve">REFLECT &amp; CONNECT — how your thinking grew, and whose view you weighed</w:t>
+            </w:r>
+          </w:p>
+          <w:p>
+            <w:pPr>
+              <w:spacing w:after="40"/>
+            </w:pPr>
+            <w:r>
+              <w:rPr>
+                <w:b w:val="false"/>
+                <w:bCs w:val="false"/>
+                <w:i w:val="false"/>
+                <w:iCs w:val="false"/>
+                <w:color w:val="1A1A1A"/>
+                <w:sz w:val="22"/>
+                <w:szCs w:val="22"/>
+                <w:caps w:val="false"/>
+                <w:rFonts w:ascii="Calibri" w:cs="Calibri" w:eastAsia="Calibri" w:hAnsi="Calibri"/>
+              </w:rPr>
+              <w:t xml:space="preserve">Reflect (self-awareness): What did you believe about this topic BEFORE, and what changed AFTER? Name one thing to revisit.</w:t>
+            </w:r>
+          </w:p>
+          <w:p>
+            <w:pPr>
+              <w:spacing w:after="40"/>
+            </w:pPr>
+            <w:r>
+              <w:rPr>
+                <w:b w:val="false"/>
+                <w:bCs w:val="false"/>
+                <w:i w:val="false"/>
+                <w:iCs w:val="false"/>
+                <w:color w:val="1A1A1A"/>
+                <w:sz w:val="22"/>
+                <w:szCs w:val="22"/>
+                <w:caps w:val="false"/>
+                <w:rFonts w:ascii="Calibri" w:cs="Calibri" w:eastAsia="Calibri" w:hAnsi="Calibri"/>
+              </w:rPr>
+              <w:t xml:space="preserve">Consider another view (empathy): Name one person or group who might see this standard differently than you. State their view fairly in one sentence — even if you disagree.</w:t>
+            </w:r>
+          </w:p>
+          <w:p>
+            <w:pPr>
+              <w:spacing w:after="40"/>
+            </w:pPr>
+            <w:r>
+              <w:rPr>
+                <w:b w:val="false"/>
+                <w:bCs w:val="false"/>
+                <w:i w:val="false"/>
+                <w:iCs w:val="false"/>
+                <w:color w:val="1A1A1A"/>
+                <w:sz w:val="22"/>
+                <w:szCs w:val="22"/>
+                <w:caps w:val="false"/>
+                <w:rFonts w:ascii="Calibri" w:cs="Calibri" w:eastAsia="Calibri" w:hAnsi="Calibri"/>
+              </w:rPr>
+              <w:t xml:space="preserve">Norm (restorative): we critique ideas, not people; we assume good faith; we make room for every voice.</w:t>
+            </w:r>
+          </w:p>
+        </w:tc>
+      </w:tr>
+    </w:tbl>
     <w:p>
       <w:pPr>
         <w:pStyle w:val="Heading1"/>
@@ -33382,6 +33606,230 @@
         </w:tc>
       </w:tr>
     </w:tbl>
+    <w:tbl>
+      <w:tblPr>
+        <w:tblW w:type="dxa" w:w="9648"/>
+        <w:tblBorders>
+          <w:top w:val="single" w:color="auto" w:sz="4"/>
+          <w:left w:val="single" w:color="auto" w:sz="4"/>
+          <w:bottom w:val="single" w:color="auto" w:sz="4"/>
+          <w:right w:val="single" w:color="auto" w:sz="4"/>
+          <w:insideH w:val="single" w:color="auto" w:sz="4"/>
+          <w:insideV w:val="single" w:color="auto" w:sz="4"/>
+        </w:tblBorders>
+      </w:tblPr>
+      <w:tblGrid>
+        <w:gridCol w:w="9648"/>
+      </w:tblGrid>
+      <w:tr>
+        <w:tc>
+          <w:tcPr>
+            <w:tcW w:type="dxa" w:w="9648"/>
+            <w:tcBorders>
+              <w:top w:val="single" w:color="D9D5C8" w:sz="4"/>
+              <w:left w:val="single" w:color="D9D5C8" w:sz="4"/>
+              <w:bottom w:val="single" w:color="D9D5C8" w:sz="4"/>
+              <w:right w:val="single" w:color="D9D5C8" w:sz="4"/>
+            </w:tcBorders>
+            <w:shd w:fill="F7F5EF" w:color="auto" w:val="clear"/>
+            <w:tcMar>
+              <w:top w:type="dxa" w:w="55"/>
+              <w:left w:type="dxa" w:w="110"/>
+              <w:bottom w:type="dxa" w:w="55"/>
+              <w:right w:type="dxa" w:w="110"/>
+            </w:tcMar>
+          </w:tcPr>
+          <w:p>
+            <w:pPr>
+              <w:spacing w:after="60"/>
+            </w:pPr>
+            <w:r>
+              <w:rPr>
+                <w:b/>
+                <w:bCs/>
+                <w:i w:val="false"/>
+                <w:iCs w:val="false"/>
+                <w:color w:val="1B2A4A"/>
+                <w:sz w:val="21"/>
+                <w:szCs w:val="21"/>
+                <w:caps w:val="false"/>
+                <w:rFonts w:ascii="Calibri" w:cs="Calibri" w:eastAsia="Calibri" w:hAnsi="Calibri"/>
+              </w:rPr>
+              <w:t xml:space="preserve">CHOICE &amp; VOICE — you decide how to go deeper (pick ONE)</w:t>
+            </w:r>
+          </w:p>
+          <w:p>
+            <w:pPr>
+              <w:spacing w:after="40"/>
+            </w:pPr>
+            <w:r>
+              <w:rPr>
+                <w:b w:val="false"/>
+                <w:bCs w:val="false"/>
+                <w:i w:val="false"/>
+                <w:iCs w:val="false"/>
+                <w:color w:val="1A1A1A"/>
+                <w:sz w:val="22"/>
+                <w:szCs w:val="22"/>
+                <w:caps w:val="false"/>
+                <w:rFonts w:ascii="Calibri" w:cs="Calibri" w:eastAsia="Calibri" w:hAnsi="Calibri"/>
+              </w:rPr>
+              <w:t xml:space="preserve">You choose your path to show this standard — every option meets the same target:</w:t>
+            </w:r>
+          </w:p>
+          <w:p>
+            <w:pPr>
+              <w:spacing w:after="40"/>
+            </w:pPr>
+            <w:r>
+              <w:rPr>
+                <w:b w:val="false"/>
+                <w:bCs w:val="false"/>
+                <w:i w:val="false"/>
+                <w:iCs w:val="false"/>
+                <w:color w:val="1A1A1A"/>
+                <w:sz w:val="22"/>
+                <w:szCs w:val="22"/>
+                <w:caps w:val="false"/>
+                <w:rFonts w:ascii="Calibri" w:cs="Calibri" w:eastAsia="Calibri" w:hAnsi="Calibri"/>
+              </w:rPr>
+              <w:t xml:space="preserve">DEFEND a term: pick the vocabulary word you think matters most and argue why in 2–3 sentences.  ·  CONNECT it: pick a current event, your community, or your own life and explain how this standard shows up there.  ·  TAKE A SIDE: pick one debatable question from this standard and argue your position with evidence.</w:t>
+            </w:r>
+          </w:p>
+          <w:p>
+            <w:pPr>
+              <w:spacing w:after="40"/>
+            </w:pPr>
+            <w:r>
+              <w:rPr>
+                <w:b w:val="false"/>
+                <w:bCs w:val="false"/>
+                <w:i w:val="false"/>
+                <w:iCs w:val="false"/>
+                <w:color w:val="1A1A1A"/>
+                <w:sz w:val="22"/>
+                <w:szCs w:val="22"/>
+                <w:caps w:val="false"/>
+                <w:rFonts w:ascii="Calibri" w:cs="Calibri" w:eastAsia="Calibri" w:hAnsi="Calibri"/>
+              </w:rPr>
+              <w:t xml:space="preserve">Your pick is yours — bring what matters to you into the work.</w:t>
+            </w:r>
+          </w:p>
+        </w:tc>
+      </w:tr>
+    </w:tbl>
+    <w:tbl>
+      <w:tblPr>
+        <w:tblW w:type="dxa" w:w="9648"/>
+        <w:tblBorders>
+          <w:top w:val="single" w:color="auto" w:sz="4"/>
+          <w:left w:val="single" w:color="auto" w:sz="4"/>
+          <w:bottom w:val="single" w:color="auto" w:sz="4"/>
+          <w:right w:val="single" w:color="auto" w:sz="4"/>
+          <w:insideH w:val="single" w:color="auto" w:sz="4"/>
+          <w:insideV w:val="single" w:color="auto" w:sz="4"/>
+        </w:tblBorders>
+      </w:tblPr>
+      <w:tblGrid>
+        <w:gridCol w:w="9648"/>
+      </w:tblGrid>
+      <w:tr>
+        <w:tc>
+          <w:tcPr>
+            <w:tcW w:type="dxa" w:w="9648"/>
+            <w:tcBorders>
+              <w:top w:val="single" w:color="D9D5C8" w:sz="4"/>
+              <w:left w:val="single" w:color="D9D5C8" w:sz="4"/>
+              <w:bottom w:val="single" w:color="D9D5C8" w:sz="4"/>
+              <w:right w:val="single" w:color="D9D5C8" w:sz="4"/>
+            </w:tcBorders>
+            <w:shd w:fill="F7F5EF" w:color="auto" w:val="clear"/>
+            <w:tcMar>
+              <w:top w:type="dxa" w:w="55"/>
+              <w:left w:type="dxa" w:w="110"/>
+              <w:bottom w:type="dxa" w:w="55"/>
+              <w:right w:type="dxa" w:w="110"/>
+            </w:tcMar>
+          </w:tcPr>
+          <w:p>
+            <w:pPr>
+              <w:spacing w:after="60"/>
+            </w:pPr>
+            <w:r>
+              <w:rPr>
+                <w:b/>
+                <w:bCs/>
+                <w:i w:val="false"/>
+                <w:iCs w:val="false"/>
+                <w:color w:val="1B2A4A"/>
+                <w:sz w:val="21"/>
+                <w:szCs w:val="21"/>
+                <w:caps w:val="false"/>
+                <w:rFonts w:ascii="Calibri" w:cs="Calibri" w:eastAsia="Calibri" w:hAnsi="Calibri"/>
+              </w:rPr>
+              <w:t xml:space="preserve">REFLECT &amp; CONNECT — how your thinking grew, and whose view you weighed</w:t>
+            </w:r>
+          </w:p>
+          <w:p>
+            <w:pPr>
+              <w:spacing w:after="40"/>
+            </w:pPr>
+            <w:r>
+              <w:rPr>
+                <w:b w:val="false"/>
+                <w:bCs w:val="false"/>
+                <w:i w:val="false"/>
+                <w:iCs w:val="false"/>
+                <w:color w:val="1A1A1A"/>
+                <w:sz w:val="22"/>
+                <w:szCs w:val="22"/>
+                <w:caps w:val="false"/>
+                <w:rFonts w:ascii="Calibri" w:cs="Calibri" w:eastAsia="Calibri" w:hAnsi="Calibri"/>
+              </w:rPr>
+              <w:t xml:space="preserve">Reflect (self-awareness): What did you believe about this topic BEFORE, and what changed AFTER? Name one thing to revisit.</w:t>
+            </w:r>
+          </w:p>
+          <w:p>
+            <w:pPr>
+              <w:spacing w:after="40"/>
+            </w:pPr>
+            <w:r>
+              <w:rPr>
+                <w:b w:val="false"/>
+                <w:bCs w:val="false"/>
+                <w:i w:val="false"/>
+                <w:iCs w:val="false"/>
+                <w:color w:val="1A1A1A"/>
+                <w:sz w:val="22"/>
+                <w:szCs w:val="22"/>
+                <w:caps w:val="false"/>
+                <w:rFonts w:ascii="Calibri" w:cs="Calibri" w:eastAsia="Calibri" w:hAnsi="Calibri"/>
+              </w:rPr>
+              <w:t xml:space="preserve">Consider another view (empathy): Name one person or group who might see this standard differently than you. State their view fairly in one sentence — even if you disagree.</w:t>
+            </w:r>
+          </w:p>
+          <w:p>
+            <w:pPr>
+              <w:spacing w:after="40"/>
+            </w:pPr>
+            <w:r>
+              <w:rPr>
+                <w:b w:val="false"/>
+                <w:bCs w:val="false"/>
+                <w:i w:val="false"/>
+                <w:iCs w:val="false"/>
+                <w:color w:val="1A1A1A"/>
+                <w:sz w:val="22"/>
+                <w:szCs w:val="22"/>
+                <w:caps w:val="false"/>
+                <w:rFonts w:ascii="Calibri" w:cs="Calibri" w:eastAsia="Calibri" w:hAnsi="Calibri"/>
+              </w:rPr>
+              <w:t xml:space="preserve">Norm (restorative): we critique ideas, not people; we assume good faith; we make room for every voice.</w:t>
+            </w:r>
+          </w:p>
+        </w:tc>
+      </w:tr>
+    </w:tbl>
     <w:p>
       <w:pPr>
         <w:pStyle w:val="Heading1"/>
@@ -48234,6 +48682,230 @@
                 <w:rFonts w:ascii="Calibri" w:cs="Calibri" w:eastAsia="Calibri" w:hAnsi="Calibri"/>
               </w:rPr>
               <w:t xml:space="preserve">Before submitting: Is my claim defensible? Do I have TWO specific pieces of evidence? Does my reasoning explain HOW the evidence proves the claim?</w:t>
+            </w:r>
+          </w:p>
+        </w:tc>
+      </w:tr>
+    </w:tbl>
+    <w:tbl>
+      <w:tblPr>
+        <w:tblW w:type="dxa" w:w="9648"/>
+        <w:tblBorders>
+          <w:top w:val="single" w:color="auto" w:sz="4"/>
+          <w:left w:val="single" w:color="auto" w:sz="4"/>
+          <w:bottom w:val="single" w:color="auto" w:sz="4"/>
+          <w:right w:val="single" w:color="auto" w:sz="4"/>
+          <w:insideH w:val="single" w:color="auto" w:sz="4"/>
+          <w:insideV w:val="single" w:color="auto" w:sz="4"/>
+        </w:tblBorders>
+      </w:tblPr>
+      <w:tblGrid>
+        <w:gridCol w:w="9648"/>
+      </w:tblGrid>
+      <w:tr>
+        <w:tc>
+          <w:tcPr>
+            <w:tcW w:type="dxa" w:w="9648"/>
+            <w:tcBorders>
+              <w:top w:val="single" w:color="D9D5C8" w:sz="4"/>
+              <w:left w:val="single" w:color="D9D5C8" w:sz="4"/>
+              <w:bottom w:val="single" w:color="D9D5C8" w:sz="4"/>
+              <w:right w:val="single" w:color="D9D5C8" w:sz="4"/>
+            </w:tcBorders>
+            <w:shd w:fill="F7F5EF" w:color="auto" w:val="clear"/>
+            <w:tcMar>
+              <w:top w:type="dxa" w:w="55"/>
+              <w:left w:type="dxa" w:w="110"/>
+              <w:bottom w:type="dxa" w:w="55"/>
+              <w:right w:type="dxa" w:w="110"/>
+            </w:tcMar>
+          </w:tcPr>
+          <w:p>
+            <w:pPr>
+              <w:spacing w:after="60"/>
+            </w:pPr>
+            <w:r>
+              <w:rPr>
+                <w:b/>
+                <w:bCs/>
+                <w:i w:val="false"/>
+                <w:iCs w:val="false"/>
+                <w:color w:val="1B2A4A"/>
+                <w:sz w:val="21"/>
+                <w:szCs w:val="21"/>
+                <w:caps w:val="false"/>
+                <w:rFonts w:ascii="Calibri" w:cs="Calibri" w:eastAsia="Calibri" w:hAnsi="Calibri"/>
+              </w:rPr>
+              <w:t xml:space="preserve">CHOICE &amp; VOICE — you decide how to go deeper (pick ONE)</w:t>
+            </w:r>
+          </w:p>
+          <w:p>
+            <w:pPr>
+              <w:spacing w:after="40"/>
+            </w:pPr>
+            <w:r>
+              <w:rPr>
+                <w:b w:val="false"/>
+                <w:bCs w:val="false"/>
+                <w:i w:val="false"/>
+                <w:iCs w:val="false"/>
+                <w:color w:val="1A1A1A"/>
+                <w:sz w:val="22"/>
+                <w:szCs w:val="22"/>
+                <w:caps w:val="false"/>
+                <w:rFonts w:ascii="Calibri" w:cs="Calibri" w:eastAsia="Calibri" w:hAnsi="Calibri"/>
+              </w:rPr>
+              <w:t xml:space="preserve">You choose your path to show this standard — every option meets the same target:</w:t>
+            </w:r>
+          </w:p>
+          <w:p>
+            <w:pPr>
+              <w:spacing w:after="40"/>
+            </w:pPr>
+            <w:r>
+              <w:rPr>
+                <w:b w:val="false"/>
+                <w:bCs w:val="false"/>
+                <w:i w:val="false"/>
+                <w:iCs w:val="false"/>
+                <w:color w:val="1A1A1A"/>
+                <w:sz w:val="22"/>
+                <w:szCs w:val="22"/>
+                <w:caps w:val="false"/>
+                <w:rFonts w:ascii="Calibri" w:cs="Calibri" w:eastAsia="Calibri" w:hAnsi="Calibri"/>
+              </w:rPr>
+              <w:t xml:space="preserve">DEFEND a term: pick the vocabulary word you think matters most and argue why in 2–3 sentences.  ·  CONNECT it: pick a current event, your community, or your own life and explain how this standard shows up there.  ·  TAKE A SIDE: pick one debatable question from this standard and argue your position with evidence.</w:t>
+            </w:r>
+          </w:p>
+          <w:p>
+            <w:pPr>
+              <w:spacing w:after="40"/>
+            </w:pPr>
+            <w:r>
+              <w:rPr>
+                <w:b w:val="false"/>
+                <w:bCs w:val="false"/>
+                <w:i w:val="false"/>
+                <w:iCs w:val="false"/>
+                <w:color w:val="1A1A1A"/>
+                <w:sz w:val="22"/>
+                <w:szCs w:val="22"/>
+                <w:caps w:val="false"/>
+                <w:rFonts w:ascii="Calibri" w:cs="Calibri" w:eastAsia="Calibri" w:hAnsi="Calibri"/>
+              </w:rPr>
+              <w:t xml:space="preserve">Your pick is yours — bring what matters to you into the work.</w:t>
+            </w:r>
+          </w:p>
+        </w:tc>
+      </w:tr>
+    </w:tbl>
+    <w:tbl>
+      <w:tblPr>
+        <w:tblW w:type="dxa" w:w="9648"/>
+        <w:tblBorders>
+          <w:top w:val="single" w:color="auto" w:sz="4"/>
+          <w:left w:val="single" w:color="auto" w:sz="4"/>
+          <w:bottom w:val="single" w:color="auto" w:sz="4"/>
+          <w:right w:val="single" w:color="auto" w:sz="4"/>
+          <w:insideH w:val="single" w:color="auto" w:sz="4"/>
+          <w:insideV w:val="single" w:color="auto" w:sz="4"/>
+        </w:tblBorders>
+      </w:tblPr>
+      <w:tblGrid>
+        <w:gridCol w:w="9648"/>
+      </w:tblGrid>
+      <w:tr>
+        <w:tc>
+          <w:tcPr>
+            <w:tcW w:type="dxa" w:w="9648"/>
+            <w:tcBorders>
+              <w:top w:val="single" w:color="D9D5C8" w:sz="4"/>
+              <w:left w:val="single" w:color="D9D5C8" w:sz="4"/>
+              <w:bottom w:val="single" w:color="D9D5C8" w:sz="4"/>
+              <w:right w:val="single" w:color="D9D5C8" w:sz="4"/>
+            </w:tcBorders>
+            <w:shd w:fill="F7F5EF" w:color="auto" w:val="clear"/>
+            <w:tcMar>
+              <w:top w:type="dxa" w:w="55"/>
+              <w:left w:type="dxa" w:w="110"/>
+              <w:bottom w:type="dxa" w:w="55"/>
+              <w:right w:type="dxa" w:w="110"/>
+            </w:tcMar>
+          </w:tcPr>
+          <w:p>
+            <w:pPr>
+              <w:spacing w:after="60"/>
+            </w:pPr>
+            <w:r>
+              <w:rPr>
+                <w:b/>
+                <w:bCs/>
+                <w:i w:val="false"/>
+                <w:iCs w:val="false"/>
+                <w:color w:val="1B2A4A"/>
+                <w:sz w:val="21"/>
+                <w:szCs w:val="21"/>
+                <w:caps w:val="false"/>
+                <w:rFonts w:ascii="Calibri" w:cs="Calibri" w:eastAsia="Calibri" w:hAnsi="Calibri"/>
+              </w:rPr>
+              <w:t xml:space="preserve">REFLECT &amp; CONNECT — how your thinking grew, and whose view you weighed</w:t>
+            </w:r>
+          </w:p>
+          <w:p>
+            <w:pPr>
+              <w:spacing w:after="40"/>
+            </w:pPr>
+            <w:r>
+              <w:rPr>
+                <w:b w:val="false"/>
+                <w:bCs w:val="false"/>
+                <w:i w:val="false"/>
+                <w:iCs w:val="false"/>
+                <w:color w:val="1A1A1A"/>
+                <w:sz w:val="22"/>
+                <w:szCs w:val="22"/>
+                <w:caps w:val="false"/>
+                <w:rFonts w:ascii="Calibri" w:cs="Calibri" w:eastAsia="Calibri" w:hAnsi="Calibri"/>
+              </w:rPr>
+              <w:t xml:space="preserve">Reflect (self-awareness): What did you believe about this topic BEFORE, and what changed AFTER? Name one thing to revisit.</w:t>
+            </w:r>
+          </w:p>
+          <w:p>
+            <w:pPr>
+              <w:spacing w:after="40"/>
+            </w:pPr>
+            <w:r>
+              <w:rPr>
+                <w:b w:val="false"/>
+                <w:bCs w:val="false"/>
+                <w:i w:val="false"/>
+                <w:iCs w:val="false"/>
+                <w:color w:val="1A1A1A"/>
+                <w:sz w:val="22"/>
+                <w:szCs w:val="22"/>
+                <w:caps w:val="false"/>
+                <w:rFonts w:ascii="Calibri" w:cs="Calibri" w:eastAsia="Calibri" w:hAnsi="Calibri"/>
+              </w:rPr>
+              <w:t xml:space="preserve">Consider another view (empathy): Name one person or group who might see this standard differently than you. State their view fairly in one sentence — even if you disagree.</w:t>
+            </w:r>
+          </w:p>
+          <w:p>
+            <w:pPr>
+              <w:spacing w:after="40"/>
+            </w:pPr>
+            <w:r>
+              <w:rPr>
+                <w:b w:val="false"/>
+                <w:bCs w:val="false"/>
+                <w:i w:val="false"/>
+                <w:iCs w:val="false"/>
+                <w:color w:val="1A1A1A"/>
+                <w:sz w:val="22"/>
+                <w:szCs w:val="22"/>
+                <w:caps w:val="false"/>
+                <w:rFonts w:ascii="Calibri" w:cs="Calibri" w:eastAsia="Calibri" w:hAnsi="Calibri"/>
+              </w:rPr>
+              <w:t xml:space="preserve">Norm (restorative): we critique ideas, not people; we assume good faith; we make room for every voice.</w:t>
             </w:r>
           </w:p>
         </w:tc>

</xml_diff>

<commit_message>
Make Government workbook activities 100% identical to the History Hack brand format
Removed the four callouts I had injected into the activity flow (per-standard UDL/MTSS
strip, SHOW WHAT YOU KNOW response-mode, CHOICE & VOICE, REFLECT & CONNECT) — they
shifted content and split the Cornell-notes write-boxes across pages, causing the
off-boxes and half/blank pages. The seven-activity rendering is now byte-identical to
HistoryHack_Platinum/build/build_workbook.js (verified via structural diff: only the
required content parameterization + the parameterized Tennessee connection differ, no
formatting divergence). Rebuilt all 7 standard + large-print editions; 7/7 activities,
images intact, leak-clean. UDL/MTSS remains embedded the brand-native way (CORE PATH
callout + Guided/Light Support backs + EN/ES vocab + the question-bank per-item UDL).

Co-Authored-By: Claude Opus 4.8 <noreply@anthropic.com>
Claude-Session: https://claude.ai/code/session_01DHdLjiiJeW6A83FcYRQ3qv
</commit_message>
<xml_diff>
--- a/courses/foundations-constitutional-government/BUILD/unit4/deliverables/Unit4_Student_Workbook_CourseStandard.docx
+++ b/courses/foundations-constitutional-government/BUILD/unit4/deliverables/Unit4_Student_Workbook_CourseStandard.docx
@@ -3953,99 +3953,6 @@
                 <w:caps w:val="false"/>
                 <w:rFonts w:ascii="Calibri" w:cs="Calibri" w:eastAsia="Calibri" w:hAnsi="Calibri"/>
               </w:rPr>
-              <w:t xml:space="preserve">UDL ACCESS &amp; MTSS SUPPORT (this standard)</w:t>
-            </w:r>
-          </w:p>
-          <w:p>
-            <w:pPr>
-              <w:spacing w:after="40"/>
-            </w:pPr>
-            <w:r>
-              <w:rPr>
-                <w:b w:val="false"/>
-                <w:bCs w:val="false"/>
-                <w:i w:val="false"/>
-                <w:iCs w:val="false"/>
-                <w:color w:val="1A1A1A"/>
-                <w:sz w:val="22"/>
-                <w:szCs w:val="22"/>
-                <w:caps w:val="false"/>
-                <w:rFonts w:ascii="Calibri" w:cs="Calibri" w:eastAsia="Calibri" w:hAnsi="Calibri"/>
-              </w:rPr>
-              <w:t xml:space="preserve">UDL 3.0 (CAST): read-aloud on request · key terms glossed (EN/ES) · respond in writing, speech, or a labeled diagram · large-print &amp; screen-reader friendly. Same learning target for everyone; supports vary the means, not the ceiling.</w:t>
-            </w:r>
-          </w:p>
-          <w:p>
-            <w:pPr>
-              <w:spacing w:after="40"/>
-            </w:pPr>
-            <w:r>
-              <w:rPr>
-                <w:b w:val="false"/>
-                <w:bCs w:val="false"/>
-                <w:i w:val="false"/>
-                <w:iCs w:val="false"/>
-                <w:color w:val="1A1A1A"/>
-                <w:sz w:val="22"/>
-                <w:szCs w:val="22"/>
-                <w:caps w:val="false"/>
-                <w:rFonts w:ascii="Calibri" w:cs="Calibri" w:eastAsia="Calibri" w:hAnsi="Calibri"/>
-              </w:rPr>
-              <w:t xml:space="preserve">MTSS: Tier 1 — this core lesson for all · Tier 2 — small-group reteach of this standard using its Cornell cues + graphic organizer, then re-check · Tier 3 — intensive 1:1 with concrete→representational→abstract scaffolding, progress-monitored to the same standard.</w:t>
-            </w:r>
-          </w:p>
-        </w:tc>
-      </w:tr>
-    </w:tbl>
-    <w:tbl>
-      <w:tblPr>
-        <w:tblW w:type="dxa" w:w="9648"/>
-        <w:tblBorders>
-          <w:top w:val="single" w:color="auto" w:sz="4"/>
-          <w:left w:val="single" w:color="auto" w:sz="4"/>
-          <w:bottom w:val="single" w:color="auto" w:sz="4"/>
-          <w:right w:val="single" w:color="auto" w:sz="4"/>
-          <w:insideH w:val="single" w:color="auto" w:sz="4"/>
-          <w:insideV w:val="single" w:color="auto" w:sz="4"/>
-        </w:tblBorders>
-      </w:tblPr>
-      <w:tblGrid>
-        <w:gridCol w:w="9648"/>
-      </w:tblGrid>
-      <w:tr>
-        <w:tc>
-          <w:tcPr>
-            <w:tcW w:type="dxa" w:w="9648"/>
-            <w:tcBorders>
-              <w:top w:val="single" w:color="D9D5C8" w:sz="4"/>
-              <w:left w:val="single" w:color="D9D5C8" w:sz="4"/>
-              <w:bottom w:val="single" w:color="D9D5C8" w:sz="4"/>
-              <w:right w:val="single" w:color="D9D5C8" w:sz="4"/>
-            </w:tcBorders>
-            <w:shd w:fill="F7F5EF" w:color="auto" w:val="clear"/>
-            <w:tcMar>
-              <w:top w:type="dxa" w:w="55"/>
-              <w:left w:type="dxa" w:w="110"/>
-              <w:bottom w:type="dxa" w:w="55"/>
-              <w:right w:type="dxa" w:w="110"/>
-            </w:tcMar>
-          </w:tcPr>
-          <w:p>
-            <w:pPr>
-              <w:spacing w:after="60"/>
-            </w:pPr>
-            <w:r>
-              <w:rPr>
-                <w:b/>
-                <w:bCs/>
-                <w:i w:val="false"/>
-                <w:iCs w:val="false"/>
-                <w:color w:val="1B2A4A"/>
-                <w:sz w:val="21"/>
-                <w:szCs w:val="21"/>
-                <w:caps w:val="false"/>
-                <w:rFonts w:ascii="Calibri" w:cs="Calibri" w:eastAsia="Calibri" w:hAnsi="Calibri"/>
-              </w:rPr>
               <w:t xml:space="preserve">SET YOUR GOAL (self-direction)</w:t>
             </w:r>
           </w:p>
@@ -17656,118 +17563,6 @@
         </w:tblBorders>
       </w:tblPr>
       <w:tblGrid>
-        <w:gridCol w:w="9648"/>
-      </w:tblGrid>
-      <w:tr>
-        <w:tc>
-          <w:tcPr>
-            <w:tcW w:type="dxa" w:w="9648"/>
-            <w:tcBorders>
-              <w:top w:val="single" w:color="D9D5C8" w:sz="4"/>
-              <w:left w:val="single" w:color="D9D5C8" w:sz="4"/>
-              <w:bottom w:val="single" w:color="D9D5C8" w:sz="4"/>
-              <w:right w:val="single" w:color="D9D5C8" w:sz="4"/>
-            </w:tcBorders>
-            <w:shd w:fill="F7F5EF" w:color="auto" w:val="clear"/>
-            <w:tcMar>
-              <w:top w:type="dxa" w:w="55"/>
-              <w:left w:type="dxa" w:w="110"/>
-              <w:bottom w:type="dxa" w:w="55"/>
-              <w:right w:type="dxa" w:w="110"/>
-            </w:tcMar>
-          </w:tcPr>
-          <w:p>
-            <w:pPr>
-              <w:spacing w:after="60"/>
-            </w:pPr>
-            <w:r>
-              <w:rPr>
-                <w:b/>
-                <w:bCs/>
-                <w:i w:val="false"/>
-                <w:iCs w:val="false"/>
-                <w:color w:val="1B2A4A"/>
-                <w:sz w:val="21"/>
-                <w:szCs w:val="21"/>
-                <w:caps w:val="false"/>
-                <w:rFonts w:ascii="Calibri" w:cs="Calibri" w:eastAsia="Calibri" w:hAnsi="Calibri"/>
-              </w:rPr>
-              <w:t xml:space="preserve">SHOW WHAT YOU KNOW — YOUR WAY (same CER rubric, same standard)</w:t>
-            </w:r>
-          </w:p>
-          <w:p>
-            <w:pPr>
-              <w:spacing w:after="40"/>
-            </w:pPr>
-            <w:r>
-              <w:rPr>
-                <w:b w:val="false"/>
-                <w:bCs w:val="false"/>
-                <w:i w:val="false"/>
-                <w:iCs w:val="false"/>
-                <w:color w:val="1A1A1A"/>
-                <w:sz w:val="22"/>
-                <w:szCs w:val="22"/>
-                <w:caps w:val="false"/>
-                <w:rFonts w:ascii="Calibri" w:cs="Calibri" w:eastAsia="Calibri" w:hAnsi="Calibri"/>
-              </w:rPr>
-              <w:t xml:space="preserve">Build your Claim–Evidence–Reasoning in whichever mode lets you think best. The standard and the CER rubric are identical for every mode — the mode changes how you SHOW it, never what you are held to:</w:t>
-            </w:r>
-          </w:p>
-          <w:p>
-            <w:pPr>
-              <w:spacing w:after="40"/>
-            </w:pPr>
-            <w:r>
-              <w:rPr>
-                <w:b w:val="false"/>
-                <w:bCs w:val="false"/>
-                <w:i w:val="false"/>
-                <w:iCs w:val="false"/>
-                <w:color w:val="1A1A1A"/>
-                <w:sz w:val="22"/>
-                <w:szCs w:val="22"/>
-                <w:caps w:val="false"/>
-                <w:rFonts w:ascii="Calibri" w:cs="Calibri" w:eastAsia="Calibri" w:hAnsi="Calibri"/>
-              </w:rPr>
-              <w:t xml:space="preserve">WRITE it on the lines below  ·  SAY it aloud and record it (audio or video)  ·  DRAW and label a diagram that makes the argument  ·  BUILD a model or artifact and caption its claim, evidence, and reasoning.</w:t>
-            </w:r>
-          </w:p>
-          <w:p>
-            <w:pPr>
-              <w:spacing w:after="40"/>
-            </w:pPr>
-            <w:r>
-              <w:rPr>
-                <w:b w:val="false"/>
-                <w:bCs w:val="false"/>
-                <w:i w:val="false"/>
-                <w:iCs w:val="false"/>
-                <w:color w:val="1A1A1A"/>
-                <w:sz w:val="22"/>
-                <w:szCs w:val="22"/>
-                <w:caps w:val="false"/>
-                <w:rFonts w:ascii="Calibri" w:cs="Calibri" w:eastAsia="Calibri" w:hAnsi="Calibri"/>
-              </w:rPr>
-              <w:t xml:space="preserve">You may ask for a word processor, speech-to-text, a scribe, or a sentence/argument frame — these change how you produce, not the standard you meet.</w:t>
-            </w:r>
-          </w:p>
-        </w:tc>
-      </w:tr>
-    </w:tbl>
-    <w:tbl>
-      <w:tblPr>
-        <w:tblW w:type="dxa" w:w="9648"/>
-        <w:tblBorders>
-          <w:top w:val="single" w:color="auto" w:sz="4"/>
-          <w:left w:val="single" w:color="auto" w:sz="4"/>
-          <w:bottom w:val="single" w:color="auto" w:sz="4"/>
-          <w:right w:val="single" w:color="auto" w:sz="4"/>
-          <w:insideH w:val="single" w:color="auto" w:sz="4"/>
-          <w:insideV w:val="single" w:color="auto" w:sz="4"/>
-        </w:tblBorders>
-      </w:tblPr>
-      <w:tblGrid>
         <w:gridCol w:w="2200"/>
         <w:gridCol w:w="7448"/>
       </w:tblGrid>
@@ -18520,230 +18315,6 @@
                 <w:rFonts w:ascii="Calibri" w:cs="Calibri" w:eastAsia="Calibri" w:hAnsi="Calibri"/>
               </w:rPr>
               <w:t xml:space="preserve">Before submitting: Is my claim defensible? Do I have TWO specific pieces of evidence? Does my reasoning explain HOW the evidence proves the claim?</w:t>
-            </w:r>
-          </w:p>
-        </w:tc>
-      </w:tr>
-    </w:tbl>
-    <w:tbl>
-      <w:tblPr>
-        <w:tblW w:type="dxa" w:w="9648"/>
-        <w:tblBorders>
-          <w:top w:val="single" w:color="auto" w:sz="4"/>
-          <w:left w:val="single" w:color="auto" w:sz="4"/>
-          <w:bottom w:val="single" w:color="auto" w:sz="4"/>
-          <w:right w:val="single" w:color="auto" w:sz="4"/>
-          <w:insideH w:val="single" w:color="auto" w:sz="4"/>
-          <w:insideV w:val="single" w:color="auto" w:sz="4"/>
-        </w:tblBorders>
-      </w:tblPr>
-      <w:tblGrid>
-        <w:gridCol w:w="9648"/>
-      </w:tblGrid>
-      <w:tr>
-        <w:tc>
-          <w:tcPr>
-            <w:tcW w:type="dxa" w:w="9648"/>
-            <w:tcBorders>
-              <w:top w:val="single" w:color="D9D5C8" w:sz="4"/>
-              <w:left w:val="single" w:color="D9D5C8" w:sz="4"/>
-              <w:bottom w:val="single" w:color="D9D5C8" w:sz="4"/>
-              <w:right w:val="single" w:color="D9D5C8" w:sz="4"/>
-            </w:tcBorders>
-            <w:shd w:fill="F7F5EF" w:color="auto" w:val="clear"/>
-            <w:tcMar>
-              <w:top w:type="dxa" w:w="55"/>
-              <w:left w:type="dxa" w:w="110"/>
-              <w:bottom w:type="dxa" w:w="55"/>
-              <w:right w:type="dxa" w:w="110"/>
-            </w:tcMar>
-          </w:tcPr>
-          <w:p>
-            <w:pPr>
-              <w:spacing w:after="60"/>
-            </w:pPr>
-            <w:r>
-              <w:rPr>
-                <w:b/>
-                <w:bCs/>
-                <w:i w:val="false"/>
-                <w:iCs w:val="false"/>
-                <w:color w:val="1B2A4A"/>
-                <w:sz w:val="21"/>
-                <w:szCs w:val="21"/>
-                <w:caps w:val="false"/>
-                <w:rFonts w:ascii="Calibri" w:cs="Calibri" w:eastAsia="Calibri" w:hAnsi="Calibri"/>
-              </w:rPr>
-              <w:t xml:space="preserve">CHOICE &amp; VOICE — you decide how to go deeper (pick ONE)</w:t>
-            </w:r>
-          </w:p>
-          <w:p>
-            <w:pPr>
-              <w:spacing w:after="40"/>
-            </w:pPr>
-            <w:r>
-              <w:rPr>
-                <w:b w:val="false"/>
-                <w:bCs w:val="false"/>
-                <w:i w:val="false"/>
-                <w:iCs w:val="false"/>
-                <w:color w:val="1A1A1A"/>
-                <w:sz w:val="22"/>
-                <w:szCs w:val="22"/>
-                <w:caps w:val="false"/>
-                <w:rFonts w:ascii="Calibri" w:cs="Calibri" w:eastAsia="Calibri" w:hAnsi="Calibri"/>
-              </w:rPr>
-              <w:t xml:space="preserve">You choose your path to show this standard — every option meets the same target:</w:t>
-            </w:r>
-          </w:p>
-          <w:p>
-            <w:pPr>
-              <w:spacing w:after="40"/>
-            </w:pPr>
-            <w:r>
-              <w:rPr>
-                <w:b w:val="false"/>
-                <w:bCs w:val="false"/>
-                <w:i w:val="false"/>
-                <w:iCs w:val="false"/>
-                <w:color w:val="1A1A1A"/>
-                <w:sz w:val="22"/>
-                <w:szCs w:val="22"/>
-                <w:caps w:val="false"/>
-                <w:rFonts w:ascii="Calibri" w:cs="Calibri" w:eastAsia="Calibri" w:hAnsi="Calibri"/>
-              </w:rPr>
-              <w:t xml:space="preserve">DEFEND a term: pick the vocabulary word you think matters most and argue why in 2–3 sentences.  ·  CONNECT it: pick a current event, your community, or your own life and explain how this standard shows up there.  ·  TAKE A SIDE: pick one debatable question from this standard and argue your position with evidence.</w:t>
-            </w:r>
-          </w:p>
-          <w:p>
-            <w:pPr>
-              <w:spacing w:after="40"/>
-            </w:pPr>
-            <w:r>
-              <w:rPr>
-                <w:b w:val="false"/>
-                <w:bCs w:val="false"/>
-                <w:i w:val="false"/>
-                <w:iCs w:val="false"/>
-                <w:color w:val="1A1A1A"/>
-                <w:sz w:val="22"/>
-                <w:szCs w:val="22"/>
-                <w:caps w:val="false"/>
-                <w:rFonts w:ascii="Calibri" w:cs="Calibri" w:eastAsia="Calibri" w:hAnsi="Calibri"/>
-              </w:rPr>
-              <w:t xml:space="preserve">Your pick is yours — bring what matters to you into the work.</w:t>
-            </w:r>
-          </w:p>
-        </w:tc>
-      </w:tr>
-    </w:tbl>
-    <w:tbl>
-      <w:tblPr>
-        <w:tblW w:type="dxa" w:w="9648"/>
-        <w:tblBorders>
-          <w:top w:val="single" w:color="auto" w:sz="4"/>
-          <w:left w:val="single" w:color="auto" w:sz="4"/>
-          <w:bottom w:val="single" w:color="auto" w:sz="4"/>
-          <w:right w:val="single" w:color="auto" w:sz="4"/>
-          <w:insideH w:val="single" w:color="auto" w:sz="4"/>
-          <w:insideV w:val="single" w:color="auto" w:sz="4"/>
-        </w:tblBorders>
-      </w:tblPr>
-      <w:tblGrid>
-        <w:gridCol w:w="9648"/>
-      </w:tblGrid>
-      <w:tr>
-        <w:tc>
-          <w:tcPr>
-            <w:tcW w:type="dxa" w:w="9648"/>
-            <w:tcBorders>
-              <w:top w:val="single" w:color="D9D5C8" w:sz="4"/>
-              <w:left w:val="single" w:color="D9D5C8" w:sz="4"/>
-              <w:bottom w:val="single" w:color="D9D5C8" w:sz="4"/>
-              <w:right w:val="single" w:color="D9D5C8" w:sz="4"/>
-            </w:tcBorders>
-            <w:shd w:fill="F7F5EF" w:color="auto" w:val="clear"/>
-            <w:tcMar>
-              <w:top w:type="dxa" w:w="55"/>
-              <w:left w:type="dxa" w:w="110"/>
-              <w:bottom w:type="dxa" w:w="55"/>
-              <w:right w:type="dxa" w:w="110"/>
-            </w:tcMar>
-          </w:tcPr>
-          <w:p>
-            <w:pPr>
-              <w:spacing w:after="60"/>
-            </w:pPr>
-            <w:r>
-              <w:rPr>
-                <w:b/>
-                <w:bCs/>
-                <w:i w:val="false"/>
-                <w:iCs w:val="false"/>
-                <w:color w:val="1B2A4A"/>
-                <w:sz w:val="21"/>
-                <w:szCs w:val="21"/>
-                <w:caps w:val="false"/>
-                <w:rFonts w:ascii="Calibri" w:cs="Calibri" w:eastAsia="Calibri" w:hAnsi="Calibri"/>
-              </w:rPr>
-              <w:t xml:space="preserve">REFLECT &amp; CONNECT — how your thinking grew, and whose view you weighed</w:t>
-            </w:r>
-          </w:p>
-          <w:p>
-            <w:pPr>
-              <w:spacing w:after="40"/>
-            </w:pPr>
-            <w:r>
-              <w:rPr>
-                <w:b w:val="false"/>
-                <w:bCs w:val="false"/>
-                <w:i w:val="false"/>
-                <w:iCs w:val="false"/>
-                <w:color w:val="1A1A1A"/>
-                <w:sz w:val="22"/>
-                <w:szCs w:val="22"/>
-                <w:caps w:val="false"/>
-                <w:rFonts w:ascii="Calibri" w:cs="Calibri" w:eastAsia="Calibri" w:hAnsi="Calibri"/>
-              </w:rPr>
-              <w:t xml:space="preserve">Reflect (self-awareness): What did you believe about this topic BEFORE, and what changed AFTER? Name one thing to revisit.</w:t>
-            </w:r>
-          </w:p>
-          <w:p>
-            <w:pPr>
-              <w:spacing w:after="40"/>
-            </w:pPr>
-            <w:r>
-              <w:rPr>
-                <w:b w:val="false"/>
-                <w:bCs w:val="false"/>
-                <w:i w:val="false"/>
-                <w:iCs w:val="false"/>
-                <w:color w:val="1A1A1A"/>
-                <w:sz w:val="22"/>
-                <w:szCs w:val="22"/>
-                <w:caps w:val="false"/>
-                <w:rFonts w:ascii="Calibri" w:cs="Calibri" w:eastAsia="Calibri" w:hAnsi="Calibri"/>
-              </w:rPr>
-              <w:t xml:space="preserve">Consider another view (empathy): Name one person or group who might see this standard differently than you. State their view fairly in one sentence — even if you disagree.</w:t>
-            </w:r>
-          </w:p>
-          <w:p>
-            <w:pPr>
-              <w:spacing w:after="40"/>
-            </w:pPr>
-            <w:r>
-              <w:rPr>
-                <w:b w:val="false"/>
-                <w:bCs w:val="false"/>
-                <w:i w:val="false"/>
-                <w:iCs w:val="false"/>
-                <w:color w:val="1A1A1A"/>
-                <w:sz w:val="22"/>
-                <w:szCs w:val="22"/>
-                <w:caps w:val="false"/>
-                <w:rFonts w:ascii="Calibri" w:cs="Calibri" w:eastAsia="Calibri" w:hAnsi="Calibri"/>
-              </w:rPr>
-              <w:t xml:space="preserve">Norm (restorative): we critique ideas, not people; we assume good faith; we make room for every voice.</w:t>
             </w:r>
           </w:p>
         </w:tc>
@@ -18980,99 +18551,6 @@
                 <w:rFonts w:ascii="Calibri" w:cs="Calibri" w:eastAsia="Calibri" w:hAnsi="Calibri"/>
               </w:rPr>
               <w:t xml:space="preserve">Every student works this standard at the same rigor: analyze the sources and vocabulary, then demonstrate learning on the Practice Quiz and CER. UDL and MTSS give you flexible ways in — they never lower the bar. Check yourself against the learning targets on the Cornell Notes page.</w:t>
-            </w:r>
-          </w:p>
-        </w:tc>
-      </w:tr>
-    </w:tbl>
-    <w:tbl>
-      <w:tblPr>
-        <w:tblW w:type="dxa" w:w="9648"/>
-        <w:tblBorders>
-          <w:top w:val="single" w:color="auto" w:sz="4"/>
-          <w:left w:val="single" w:color="auto" w:sz="4"/>
-          <w:bottom w:val="single" w:color="auto" w:sz="4"/>
-          <w:right w:val="single" w:color="auto" w:sz="4"/>
-          <w:insideH w:val="single" w:color="auto" w:sz="4"/>
-          <w:insideV w:val="single" w:color="auto" w:sz="4"/>
-        </w:tblBorders>
-      </w:tblPr>
-      <w:tblGrid>
-        <w:gridCol w:w="9648"/>
-      </w:tblGrid>
-      <w:tr>
-        <w:tc>
-          <w:tcPr>
-            <w:tcW w:type="dxa" w:w="9648"/>
-            <w:tcBorders>
-              <w:top w:val="single" w:color="D9D5C8" w:sz="4"/>
-              <w:left w:val="single" w:color="D9D5C8" w:sz="4"/>
-              <w:bottom w:val="single" w:color="D9D5C8" w:sz="4"/>
-              <w:right w:val="single" w:color="D9D5C8" w:sz="4"/>
-            </w:tcBorders>
-            <w:shd w:fill="F7F5EF" w:color="auto" w:val="clear"/>
-            <w:tcMar>
-              <w:top w:type="dxa" w:w="55"/>
-              <w:left w:type="dxa" w:w="110"/>
-              <w:bottom w:type="dxa" w:w="55"/>
-              <w:right w:type="dxa" w:w="110"/>
-            </w:tcMar>
-          </w:tcPr>
-          <w:p>
-            <w:pPr>
-              <w:spacing w:after="60"/>
-            </w:pPr>
-            <w:r>
-              <w:rPr>
-                <w:b/>
-                <w:bCs/>
-                <w:i w:val="false"/>
-                <w:iCs w:val="false"/>
-                <w:color w:val="1B2A4A"/>
-                <w:sz w:val="21"/>
-                <w:szCs w:val="21"/>
-                <w:caps w:val="false"/>
-                <w:rFonts w:ascii="Calibri" w:cs="Calibri" w:eastAsia="Calibri" w:hAnsi="Calibri"/>
-              </w:rPr>
-              <w:t xml:space="preserve">UDL ACCESS &amp; MTSS SUPPORT (this standard)</w:t>
-            </w:r>
-          </w:p>
-          <w:p>
-            <w:pPr>
-              <w:spacing w:after="40"/>
-            </w:pPr>
-            <w:r>
-              <w:rPr>
-                <w:b w:val="false"/>
-                <w:bCs w:val="false"/>
-                <w:i w:val="false"/>
-                <w:iCs w:val="false"/>
-                <w:color w:val="1A1A1A"/>
-                <w:sz w:val="22"/>
-                <w:szCs w:val="22"/>
-                <w:caps w:val="false"/>
-                <w:rFonts w:ascii="Calibri" w:cs="Calibri" w:eastAsia="Calibri" w:hAnsi="Calibri"/>
-              </w:rPr>
-              <w:t xml:space="preserve">UDL 3.0 (CAST): read-aloud on request · key terms glossed (EN/ES) · respond in writing, speech, or a labeled diagram · large-print &amp; screen-reader friendly. Same learning target for everyone; supports vary the means, not the ceiling.</w:t>
-            </w:r>
-          </w:p>
-          <w:p>
-            <w:pPr>
-              <w:spacing w:after="40"/>
-            </w:pPr>
-            <w:r>
-              <w:rPr>
-                <w:b w:val="false"/>
-                <w:bCs w:val="false"/>
-                <w:i w:val="false"/>
-                <w:iCs w:val="false"/>
-                <w:color w:val="1A1A1A"/>
-                <w:sz w:val="22"/>
-                <w:szCs w:val="22"/>
-                <w:caps w:val="false"/>
-                <w:rFonts w:ascii="Calibri" w:cs="Calibri" w:eastAsia="Calibri" w:hAnsi="Calibri"/>
-              </w:rPr>
-              <w:t xml:space="preserve">MTSS: Tier 1 — this core lesson for all · Tier 2 — small-group reteach of this standard using its Cornell cues + graphic organizer, then re-check · Tier 3 — intensive 1:1 with concrete→representational→abstract scaffolding, progress-monitored to the same standard.</w:t>
             </w:r>
           </w:p>
         </w:tc>
@@ -32737,118 +32215,6 @@
         </w:tblBorders>
       </w:tblPr>
       <w:tblGrid>
-        <w:gridCol w:w="9648"/>
-      </w:tblGrid>
-      <w:tr>
-        <w:tc>
-          <w:tcPr>
-            <w:tcW w:type="dxa" w:w="9648"/>
-            <w:tcBorders>
-              <w:top w:val="single" w:color="D9D5C8" w:sz="4"/>
-              <w:left w:val="single" w:color="D9D5C8" w:sz="4"/>
-              <w:bottom w:val="single" w:color="D9D5C8" w:sz="4"/>
-              <w:right w:val="single" w:color="D9D5C8" w:sz="4"/>
-            </w:tcBorders>
-            <w:shd w:fill="F7F5EF" w:color="auto" w:val="clear"/>
-            <w:tcMar>
-              <w:top w:type="dxa" w:w="55"/>
-              <w:left w:type="dxa" w:w="110"/>
-              <w:bottom w:type="dxa" w:w="55"/>
-              <w:right w:type="dxa" w:w="110"/>
-            </w:tcMar>
-          </w:tcPr>
-          <w:p>
-            <w:pPr>
-              <w:spacing w:after="60"/>
-            </w:pPr>
-            <w:r>
-              <w:rPr>
-                <w:b/>
-                <w:bCs/>
-                <w:i w:val="false"/>
-                <w:iCs w:val="false"/>
-                <w:color w:val="1B2A4A"/>
-                <w:sz w:val="21"/>
-                <w:szCs w:val="21"/>
-                <w:caps w:val="false"/>
-                <w:rFonts w:ascii="Calibri" w:cs="Calibri" w:eastAsia="Calibri" w:hAnsi="Calibri"/>
-              </w:rPr>
-              <w:t xml:space="preserve">SHOW WHAT YOU KNOW — YOUR WAY (same CER rubric, same standard)</w:t>
-            </w:r>
-          </w:p>
-          <w:p>
-            <w:pPr>
-              <w:spacing w:after="40"/>
-            </w:pPr>
-            <w:r>
-              <w:rPr>
-                <w:b w:val="false"/>
-                <w:bCs w:val="false"/>
-                <w:i w:val="false"/>
-                <w:iCs w:val="false"/>
-                <w:color w:val="1A1A1A"/>
-                <w:sz w:val="22"/>
-                <w:szCs w:val="22"/>
-                <w:caps w:val="false"/>
-                <w:rFonts w:ascii="Calibri" w:cs="Calibri" w:eastAsia="Calibri" w:hAnsi="Calibri"/>
-              </w:rPr>
-              <w:t xml:space="preserve">Build your Claim–Evidence–Reasoning in whichever mode lets you think best. The standard and the CER rubric are identical for every mode — the mode changes how you SHOW it, never what you are held to:</w:t>
-            </w:r>
-          </w:p>
-          <w:p>
-            <w:pPr>
-              <w:spacing w:after="40"/>
-            </w:pPr>
-            <w:r>
-              <w:rPr>
-                <w:b w:val="false"/>
-                <w:bCs w:val="false"/>
-                <w:i w:val="false"/>
-                <w:iCs w:val="false"/>
-                <w:color w:val="1A1A1A"/>
-                <w:sz w:val="22"/>
-                <w:szCs w:val="22"/>
-                <w:caps w:val="false"/>
-                <w:rFonts w:ascii="Calibri" w:cs="Calibri" w:eastAsia="Calibri" w:hAnsi="Calibri"/>
-              </w:rPr>
-              <w:t xml:space="preserve">WRITE it on the lines below  ·  SAY it aloud and record it (audio or video)  ·  DRAW and label a diagram that makes the argument  ·  BUILD a model or artifact and caption its claim, evidence, and reasoning.</w:t>
-            </w:r>
-          </w:p>
-          <w:p>
-            <w:pPr>
-              <w:spacing w:after="40"/>
-            </w:pPr>
-            <w:r>
-              <w:rPr>
-                <w:b w:val="false"/>
-                <w:bCs w:val="false"/>
-                <w:i w:val="false"/>
-                <w:iCs w:val="false"/>
-                <w:color w:val="1A1A1A"/>
-                <w:sz w:val="22"/>
-                <w:szCs w:val="22"/>
-                <w:caps w:val="false"/>
-                <w:rFonts w:ascii="Calibri" w:cs="Calibri" w:eastAsia="Calibri" w:hAnsi="Calibri"/>
-              </w:rPr>
-              <w:t xml:space="preserve">You may ask for a word processor, speech-to-text, a scribe, or a sentence/argument frame — these change how you produce, not the standard you meet.</w:t>
-            </w:r>
-          </w:p>
-        </w:tc>
-      </w:tr>
-    </w:tbl>
-    <w:tbl>
-      <w:tblPr>
-        <w:tblW w:type="dxa" w:w="9648"/>
-        <w:tblBorders>
-          <w:top w:val="single" w:color="auto" w:sz="4"/>
-          <w:left w:val="single" w:color="auto" w:sz="4"/>
-          <w:bottom w:val="single" w:color="auto" w:sz="4"/>
-          <w:right w:val="single" w:color="auto" w:sz="4"/>
-          <w:insideH w:val="single" w:color="auto" w:sz="4"/>
-          <w:insideV w:val="single" w:color="auto" w:sz="4"/>
-        </w:tblBorders>
-      </w:tblPr>
-      <w:tblGrid>
         <w:gridCol w:w="2200"/>
         <w:gridCol w:w="7448"/>
       </w:tblGrid>
@@ -33601,230 +32967,6 @@
                 <w:rFonts w:ascii="Calibri" w:cs="Calibri" w:eastAsia="Calibri" w:hAnsi="Calibri"/>
               </w:rPr>
               <w:t xml:space="preserve">Before submitting: Is my claim defensible? Do I have TWO specific pieces of evidence? Does my reasoning explain HOW the evidence proves the claim?</w:t>
-            </w:r>
-          </w:p>
-        </w:tc>
-      </w:tr>
-    </w:tbl>
-    <w:tbl>
-      <w:tblPr>
-        <w:tblW w:type="dxa" w:w="9648"/>
-        <w:tblBorders>
-          <w:top w:val="single" w:color="auto" w:sz="4"/>
-          <w:left w:val="single" w:color="auto" w:sz="4"/>
-          <w:bottom w:val="single" w:color="auto" w:sz="4"/>
-          <w:right w:val="single" w:color="auto" w:sz="4"/>
-          <w:insideH w:val="single" w:color="auto" w:sz="4"/>
-          <w:insideV w:val="single" w:color="auto" w:sz="4"/>
-        </w:tblBorders>
-      </w:tblPr>
-      <w:tblGrid>
-        <w:gridCol w:w="9648"/>
-      </w:tblGrid>
-      <w:tr>
-        <w:tc>
-          <w:tcPr>
-            <w:tcW w:type="dxa" w:w="9648"/>
-            <w:tcBorders>
-              <w:top w:val="single" w:color="D9D5C8" w:sz="4"/>
-              <w:left w:val="single" w:color="D9D5C8" w:sz="4"/>
-              <w:bottom w:val="single" w:color="D9D5C8" w:sz="4"/>
-              <w:right w:val="single" w:color="D9D5C8" w:sz="4"/>
-            </w:tcBorders>
-            <w:shd w:fill="F7F5EF" w:color="auto" w:val="clear"/>
-            <w:tcMar>
-              <w:top w:type="dxa" w:w="55"/>
-              <w:left w:type="dxa" w:w="110"/>
-              <w:bottom w:type="dxa" w:w="55"/>
-              <w:right w:type="dxa" w:w="110"/>
-            </w:tcMar>
-          </w:tcPr>
-          <w:p>
-            <w:pPr>
-              <w:spacing w:after="60"/>
-            </w:pPr>
-            <w:r>
-              <w:rPr>
-                <w:b/>
-                <w:bCs/>
-                <w:i w:val="false"/>
-                <w:iCs w:val="false"/>
-                <w:color w:val="1B2A4A"/>
-                <w:sz w:val="21"/>
-                <w:szCs w:val="21"/>
-                <w:caps w:val="false"/>
-                <w:rFonts w:ascii="Calibri" w:cs="Calibri" w:eastAsia="Calibri" w:hAnsi="Calibri"/>
-              </w:rPr>
-              <w:t xml:space="preserve">CHOICE &amp; VOICE — you decide how to go deeper (pick ONE)</w:t>
-            </w:r>
-          </w:p>
-          <w:p>
-            <w:pPr>
-              <w:spacing w:after="40"/>
-            </w:pPr>
-            <w:r>
-              <w:rPr>
-                <w:b w:val="false"/>
-                <w:bCs w:val="false"/>
-                <w:i w:val="false"/>
-                <w:iCs w:val="false"/>
-                <w:color w:val="1A1A1A"/>
-                <w:sz w:val="22"/>
-                <w:szCs w:val="22"/>
-                <w:caps w:val="false"/>
-                <w:rFonts w:ascii="Calibri" w:cs="Calibri" w:eastAsia="Calibri" w:hAnsi="Calibri"/>
-              </w:rPr>
-              <w:t xml:space="preserve">You choose your path to show this standard — every option meets the same target:</w:t>
-            </w:r>
-          </w:p>
-          <w:p>
-            <w:pPr>
-              <w:spacing w:after="40"/>
-            </w:pPr>
-            <w:r>
-              <w:rPr>
-                <w:b w:val="false"/>
-                <w:bCs w:val="false"/>
-                <w:i w:val="false"/>
-                <w:iCs w:val="false"/>
-                <w:color w:val="1A1A1A"/>
-                <w:sz w:val="22"/>
-                <w:szCs w:val="22"/>
-                <w:caps w:val="false"/>
-                <w:rFonts w:ascii="Calibri" w:cs="Calibri" w:eastAsia="Calibri" w:hAnsi="Calibri"/>
-              </w:rPr>
-              <w:t xml:space="preserve">DEFEND a term: pick the vocabulary word you think matters most and argue why in 2–3 sentences.  ·  CONNECT it: pick a current event, your community, or your own life and explain how this standard shows up there.  ·  TAKE A SIDE: pick one debatable question from this standard and argue your position with evidence.</w:t>
-            </w:r>
-          </w:p>
-          <w:p>
-            <w:pPr>
-              <w:spacing w:after="40"/>
-            </w:pPr>
-            <w:r>
-              <w:rPr>
-                <w:b w:val="false"/>
-                <w:bCs w:val="false"/>
-                <w:i w:val="false"/>
-                <w:iCs w:val="false"/>
-                <w:color w:val="1A1A1A"/>
-                <w:sz w:val="22"/>
-                <w:szCs w:val="22"/>
-                <w:caps w:val="false"/>
-                <w:rFonts w:ascii="Calibri" w:cs="Calibri" w:eastAsia="Calibri" w:hAnsi="Calibri"/>
-              </w:rPr>
-              <w:t xml:space="preserve">Your pick is yours — bring what matters to you into the work.</w:t>
-            </w:r>
-          </w:p>
-        </w:tc>
-      </w:tr>
-    </w:tbl>
-    <w:tbl>
-      <w:tblPr>
-        <w:tblW w:type="dxa" w:w="9648"/>
-        <w:tblBorders>
-          <w:top w:val="single" w:color="auto" w:sz="4"/>
-          <w:left w:val="single" w:color="auto" w:sz="4"/>
-          <w:bottom w:val="single" w:color="auto" w:sz="4"/>
-          <w:right w:val="single" w:color="auto" w:sz="4"/>
-          <w:insideH w:val="single" w:color="auto" w:sz="4"/>
-          <w:insideV w:val="single" w:color="auto" w:sz="4"/>
-        </w:tblBorders>
-      </w:tblPr>
-      <w:tblGrid>
-        <w:gridCol w:w="9648"/>
-      </w:tblGrid>
-      <w:tr>
-        <w:tc>
-          <w:tcPr>
-            <w:tcW w:type="dxa" w:w="9648"/>
-            <w:tcBorders>
-              <w:top w:val="single" w:color="D9D5C8" w:sz="4"/>
-              <w:left w:val="single" w:color="D9D5C8" w:sz="4"/>
-              <w:bottom w:val="single" w:color="D9D5C8" w:sz="4"/>
-              <w:right w:val="single" w:color="D9D5C8" w:sz="4"/>
-            </w:tcBorders>
-            <w:shd w:fill="F7F5EF" w:color="auto" w:val="clear"/>
-            <w:tcMar>
-              <w:top w:type="dxa" w:w="55"/>
-              <w:left w:type="dxa" w:w="110"/>
-              <w:bottom w:type="dxa" w:w="55"/>
-              <w:right w:type="dxa" w:w="110"/>
-            </w:tcMar>
-          </w:tcPr>
-          <w:p>
-            <w:pPr>
-              <w:spacing w:after="60"/>
-            </w:pPr>
-            <w:r>
-              <w:rPr>
-                <w:b/>
-                <w:bCs/>
-                <w:i w:val="false"/>
-                <w:iCs w:val="false"/>
-                <w:color w:val="1B2A4A"/>
-                <w:sz w:val="21"/>
-                <w:szCs w:val="21"/>
-                <w:caps w:val="false"/>
-                <w:rFonts w:ascii="Calibri" w:cs="Calibri" w:eastAsia="Calibri" w:hAnsi="Calibri"/>
-              </w:rPr>
-              <w:t xml:space="preserve">REFLECT &amp; CONNECT — how your thinking grew, and whose view you weighed</w:t>
-            </w:r>
-          </w:p>
-          <w:p>
-            <w:pPr>
-              <w:spacing w:after="40"/>
-            </w:pPr>
-            <w:r>
-              <w:rPr>
-                <w:b w:val="false"/>
-                <w:bCs w:val="false"/>
-                <w:i w:val="false"/>
-                <w:iCs w:val="false"/>
-                <w:color w:val="1A1A1A"/>
-                <w:sz w:val="22"/>
-                <w:szCs w:val="22"/>
-                <w:caps w:val="false"/>
-                <w:rFonts w:ascii="Calibri" w:cs="Calibri" w:eastAsia="Calibri" w:hAnsi="Calibri"/>
-              </w:rPr>
-              <w:t xml:space="preserve">Reflect (self-awareness): What did you believe about this topic BEFORE, and what changed AFTER? Name one thing to revisit.</w:t>
-            </w:r>
-          </w:p>
-          <w:p>
-            <w:pPr>
-              <w:spacing w:after="40"/>
-            </w:pPr>
-            <w:r>
-              <w:rPr>
-                <w:b w:val="false"/>
-                <w:bCs w:val="false"/>
-                <w:i w:val="false"/>
-                <w:iCs w:val="false"/>
-                <w:color w:val="1A1A1A"/>
-                <w:sz w:val="22"/>
-                <w:szCs w:val="22"/>
-                <w:caps w:val="false"/>
-                <w:rFonts w:ascii="Calibri" w:cs="Calibri" w:eastAsia="Calibri" w:hAnsi="Calibri"/>
-              </w:rPr>
-              <w:t xml:space="preserve">Consider another view (empathy): Name one person or group who might see this standard differently than you. State their view fairly in one sentence — even if you disagree.</w:t>
-            </w:r>
-          </w:p>
-          <w:p>
-            <w:pPr>
-              <w:spacing w:after="40"/>
-            </w:pPr>
-            <w:r>
-              <w:rPr>
-                <w:b w:val="false"/>
-                <w:bCs w:val="false"/>
-                <w:i w:val="false"/>
-                <w:iCs w:val="false"/>
-                <w:color w:val="1A1A1A"/>
-                <w:sz w:val="22"/>
-                <w:szCs w:val="22"/>
-                <w:caps w:val="false"/>
-                <w:rFonts w:ascii="Calibri" w:cs="Calibri" w:eastAsia="Calibri" w:hAnsi="Calibri"/>
-              </w:rPr>
-              <w:t xml:space="preserve">Norm (restorative): we critique ideas, not people; we assume good faith; we make room for every voice.</w:t>
             </w:r>
           </w:p>
         </w:tc>
@@ -34061,99 +33203,6 @@
                 <w:rFonts w:ascii="Calibri" w:cs="Calibri" w:eastAsia="Calibri" w:hAnsi="Calibri"/>
               </w:rPr>
               <w:t xml:space="preserve">Every student works this standard at the same rigor: analyze the sources and vocabulary, then demonstrate learning on the Practice Quiz and CER. UDL and MTSS give you flexible ways in — they never lower the bar. Check yourself against the learning targets on the Cornell Notes page.</w:t>
-            </w:r>
-          </w:p>
-        </w:tc>
-      </w:tr>
-    </w:tbl>
-    <w:tbl>
-      <w:tblPr>
-        <w:tblW w:type="dxa" w:w="9648"/>
-        <w:tblBorders>
-          <w:top w:val="single" w:color="auto" w:sz="4"/>
-          <w:left w:val="single" w:color="auto" w:sz="4"/>
-          <w:bottom w:val="single" w:color="auto" w:sz="4"/>
-          <w:right w:val="single" w:color="auto" w:sz="4"/>
-          <w:insideH w:val="single" w:color="auto" w:sz="4"/>
-          <w:insideV w:val="single" w:color="auto" w:sz="4"/>
-        </w:tblBorders>
-      </w:tblPr>
-      <w:tblGrid>
-        <w:gridCol w:w="9648"/>
-      </w:tblGrid>
-      <w:tr>
-        <w:tc>
-          <w:tcPr>
-            <w:tcW w:type="dxa" w:w="9648"/>
-            <w:tcBorders>
-              <w:top w:val="single" w:color="D9D5C8" w:sz="4"/>
-              <w:left w:val="single" w:color="D9D5C8" w:sz="4"/>
-              <w:bottom w:val="single" w:color="D9D5C8" w:sz="4"/>
-              <w:right w:val="single" w:color="D9D5C8" w:sz="4"/>
-            </w:tcBorders>
-            <w:shd w:fill="F7F5EF" w:color="auto" w:val="clear"/>
-            <w:tcMar>
-              <w:top w:type="dxa" w:w="55"/>
-              <w:left w:type="dxa" w:w="110"/>
-              <w:bottom w:type="dxa" w:w="55"/>
-              <w:right w:type="dxa" w:w="110"/>
-            </w:tcMar>
-          </w:tcPr>
-          <w:p>
-            <w:pPr>
-              <w:spacing w:after="60"/>
-            </w:pPr>
-            <w:r>
-              <w:rPr>
-                <w:b/>
-                <w:bCs/>
-                <w:i w:val="false"/>
-                <w:iCs w:val="false"/>
-                <w:color w:val="1B2A4A"/>
-                <w:sz w:val="21"/>
-                <w:szCs w:val="21"/>
-                <w:caps w:val="false"/>
-                <w:rFonts w:ascii="Calibri" w:cs="Calibri" w:eastAsia="Calibri" w:hAnsi="Calibri"/>
-              </w:rPr>
-              <w:t xml:space="preserve">UDL ACCESS &amp; MTSS SUPPORT (this standard)</w:t>
-            </w:r>
-          </w:p>
-          <w:p>
-            <w:pPr>
-              <w:spacing w:after="40"/>
-            </w:pPr>
-            <w:r>
-              <w:rPr>
-                <w:b w:val="false"/>
-                <w:bCs w:val="false"/>
-                <w:i w:val="false"/>
-                <w:iCs w:val="false"/>
-                <w:color w:val="1A1A1A"/>
-                <w:sz w:val="22"/>
-                <w:szCs w:val="22"/>
-                <w:caps w:val="false"/>
-                <w:rFonts w:ascii="Calibri" w:cs="Calibri" w:eastAsia="Calibri" w:hAnsi="Calibri"/>
-              </w:rPr>
-              <w:t xml:space="preserve">UDL 3.0 (CAST): read-aloud on request · key terms glossed (EN/ES) · respond in writing, speech, or a labeled diagram · large-print &amp; screen-reader friendly. Same learning target for everyone; supports vary the means, not the ceiling.</w:t>
-            </w:r>
-          </w:p>
-          <w:p>
-            <w:pPr>
-              <w:spacing w:after="40"/>
-            </w:pPr>
-            <w:r>
-              <w:rPr>
-                <w:b w:val="false"/>
-                <w:bCs w:val="false"/>
-                <w:i w:val="false"/>
-                <w:iCs w:val="false"/>
-                <w:color w:val="1A1A1A"/>
-                <w:sz w:val="22"/>
-                <w:szCs w:val="22"/>
-                <w:caps w:val="false"/>
-                <w:rFonts w:ascii="Calibri" w:cs="Calibri" w:eastAsia="Calibri" w:hAnsi="Calibri"/>
-              </w:rPr>
-              <w:t xml:space="preserve">MTSS: Tier 1 — this core lesson for all · Tier 2 — small-group reteach of this standard using its Cornell cues + graphic organizer, then re-check · Tier 3 — intensive 1:1 with concrete→representational→abstract scaffolding, progress-monitored to the same standard.</w:t>
             </w:r>
           </w:p>
         </w:tc>
@@ -47818,118 +46867,6 @@
         </w:tblBorders>
       </w:tblPr>
       <w:tblGrid>
-        <w:gridCol w:w="9648"/>
-      </w:tblGrid>
-      <w:tr>
-        <w:tc>
-          <w:tcPr>
-            <w:tcW w:type="dxa" w:w="9648"/>
-            <w:tcBorders>
-              <w:top w:val="single" w:color="D9D5C8" w:sz="4"/>
-              <w:left w:val="single" w:color="D9D5C8" w:sz="4"/>
-              <w:bottom w:val="single" w:color="D9D5C8" w:sz="4"/>
-              <w:right w:val="single" w:color="D9D5C8" w:sz="4"/>
-            </w:tcBorders>
-            <w:shd w:fill="F7F5EF" w:color="auto" w:val="clear"/>
-            <w:tcMar>
-              <w:top w:type="dxa" w:w="55"/>
-              <w:left w:type="dxa" w:w="110"/>
-              <w:bottom w:type="dxa" w:w="55"/>
-              <w:right w:type="dxa" w:w="110"/>
-            </w:tcMar>
-          </w:tcPr>
-          <w:p>
-            <w:pPr>
-              <w:spacing w:after="60"/>
-            </w:pPr>
-            <w:r>
-              <w:rPr>
-                <w:b/>
-                <w:bCs/>
-                <w:i w:val="false"/>
-                <w:iCs w:val="false"/>
-                <w:color w:val="1B2A4A"/>
-                <w:sz w:val="21"/>
-                <w:szCs w:val="21"/>
-                <w:caps w:val="false"/>
-                <w:rFonts w:ascii="Calibri" w:cs="Calibri" w:eastAsia="Calibri" w:hAnsi="Calibri"/>
-              </w:rPr>
-              <w:t xml:space="preserve">SHOW WHAT YOU KNOW — YOUR WAY (same CER rubric, same standard)</w:t>
-            </w:r>
-          </w:p>
-          <w:p>
-            <w:pPr>
-              <w:spacing w:after="40"/>
-            </w:pPr>
-            <w:r>
-              <w:rPr>
-                <w:b w:val="false"/>
-                <w:bCs w:val="false"/>
-                <w:i w:val="false"/>
-                <w:iCs w:val="false"/>
-                <w:color w:val="1A1A1A"/>
-                <w:sz w:val="22"/>
-                <w:szCs w:val="22"/>
-                <w:caps w:val="false"/>
-                <w:rFonts w:ascii="Calibri" w:cs="Calibri" w:eastAsia="Calibri" w:hAnsi="Calibri"/>
-              </w:rPr>
-              <w:t xml:space="preserve">Build your Claim–Evidence–Reasoning in whichever mode lets you think best. The standard and the CER rubric are identical for every mode — the mode changes how you SHOW it, never what you are held to:</w:t>
-            </w:r>
-          </w:p>
-          <w:p>
-            <w:pPr>
-              <w:spacing w:after="40"/>
-            </w:pPr>
-            <w:r>
-              <w:rPr>
-                <w:b w:val="false"/>
-                <w:bCs w:val="false"/>
-                <w:i w:val="false"/>
-                <w:iCs w:val="false"/>
-                <w:color w:val="1A1A1A"/>
-                <w:sz w:val="22"/>
-                <w:szCs w:val="22"/>
-                <w:caps w:val="false"/>
-                <w:rFonts w:ascii="Calibri" w:cs="Calibri" w:eastAsia="Calibri" w:hAnsi="Calibri"/>
-              </w:rPr>
-              <w:t xml:space="preserve">WRITE it on the lines below  ·  SAY it aloud and record it (audio or video)  ·  DRAW and label a diagram that makes the argument  ·  BUILD a model or artifact and caption its claim, evidence, and reasoning.</w:t>
-            </w:r>
-          </w:p>
-          <w:p>
-            <w:pPr>
-              <w:spacing w:after="40"/>
-            </w:pPr>
-            <w:r>
-              <w:rPr>
-                <w:b w:val="false"/>
-                <w:bCs w:val="false"/>
-                <w:i w:val="false"/>
-                <w:iCs w:val="false"/>
-                <w:color w:val="1A1A1A"/>
-                <w:sz w:val="22"/>
-                <w:szCs w:val="22"/>
-                <w:caps w:val="false"/>
-                <w:rFonts w:ascii="Calibri" w:cs="Calibri" w:eastAsia="Calibri" w:hAnsi="Calibri"/>
-              </w:rPr>
-              <w:t xml:space="preserve">You may ask for a word processor, speech-to-text, a scribe, or a sentence/argument frame — these change how you produce, not the standard you meet.</w:t>
-            </w:r>
-          </w:p>
-        </w:tc>
-      </w:tr>
-    </w:tbl>
-    <w:tbl>
-      <w:tblPr>
-        <w:tblW w:type="dxa" w:w="9648"/>
-        <w:tblBorders>
-          <w:top w:val="single" w:color="auto" w:sz="4"/>
-          <w:left w:val="single" w:color="auto" w:sz="4"/>
-          <w:bottom w:val="single" w:color="auto" w:sz="4"/>
-          <w:right w:val="single" w:color="auto" w:sz="4"/>
-          <w:insideH w:val="single" w:color="auto" w:sz="4"/>
-          <w:insideV w:val="single" w:color="auto" w:sz="4"/>
-        </w:tblBorders>
-      </w:tblPr>
-      <w:tblGrid>
         <w:gridCol w:w="2200"/>
         <w:gridCol w:w="7448"/>
       </w:tblGrid>
@@ -48682,230 +47619,6 @@
                 <w:rFonts w:ascii="Calibri" w:cs="Calibri" w:eastAsia="Calibri" w:hAnsi="Calibri"/>
               </w:rPr>
               <w:t xml:space="preserve">Before submitting: Is my claim defensible? Do I have TWO specific pieces of evidence? Does my reasoning explain HOW the evidence proves the claim?</w:t>
-            </w:r>
-          </w:p>
-        </w:tc>
-      </w:tr>
-    </w:tbl>
-    <w:tbl>
-      <w:tblPr>
-        <w:tblW w:type="dxa" w:w="9648"/>
-        <w:tblBorders>
-          <w:top w:val="single" w:color="auto" w:sz="4"/>
-          <w:left w:val="single" w:color="auto" w:sz="4"/>
-          <w:bottom w:val="single" w:color="auto" w:sz="4"/>
-          <w:right w:val="single" w:color="auto" w:sz="4"/>
-          <w:insideH w:val="single" w:color="auto" w:sz="4"/>
-          <w:insideV w:val="single" w:color="auto" w:sz="4"/>
-        </w:tblBorders>
-      </w:tblPr>
-      <w:tblGrid>
-        <w:gridCol w:w="9648"/>
-      </w:tblGrid>
-      <w:tr>
-        <w:tc>
-          <w:tcPr>
-            <w:tcW w:type="dxa" w:w="9648"/>
-            <w:tcBorders>
-              <w:top w:val="single" w:color="D9D5C8" w:sz="4"/>
-              <w:left w:val="single" w:color="D9D5C8" w:sz="4"/>
-              <w:bottom w:val="single" w:color="D9D5C8" w:sz="4"/>
-              <w:right w:val="single" w:color="D9D5C8" w:sz="4"/>
-            </w:tcBorders>
-            <w:shd w:fill="F7F5EF" w:color="auto" w:val="clear"/>
-            <w:tcMar>
-              <w:top w:type="dxa" w:w="55"/>
-              <w:left w:type="dxa" w:w="110"/>
-              <w:bottom w:type="dxa" w:w="55"/>
-              <w:right w:type="dxa" w:w="110"/>
-            </w:tcMar>
-          </w:tcPr>
-          <w:p>
-            <w:pPr>
-              <w:spacing w:after="60"/>
-            </w:pPr>
-            <w:r>
-              <w:rPr>
-                <w:b/>
-                <w:bCs/>
-                <w:i w:val="false"/>
-                <w:iCs w:val="false"/>
-                <w:color w:val="1B2A4A"/>
-                <w:sz w:val="21"/>
-                <w:szCs w:val="21"/>
-                <w:caps w:val="false"/>
-                <w:rFonts w:ascii="Calibri" w:cs="Calibri" w:eastAsia="Calibri" w:hAnsi="Calibri"/>
-              </w:rPr>
-              <w:t xml:space="preserve">CHOICE &amp; VOICE — you decide how to go deeper (pick ONE)</w:t>
-            </w:r>
-          </w:p>
-          <w:p>
-            <w:pPr>
-              <w:spacing w:after="40"/>
-            </w:pPr>
-            <w:r>
-              <w:rPr>
-                <w:b w:val="false"/>
-                <w:bCs w:val="false"/>
-                <w:i w:val="false"/>
-                <w:iCs w:val="false"/>
-                <w:color w:val="1A1A1A"/>
-                <w:sz w:val="22"/>
-                <w:szCs w:val="22"/>
-                <w:caps w:val="false"/>
-                <w:rFonts w:ascii="Calibri" w:cs="Calibri" w:eastAsia="Calibri" w:hAnsi="Calibri"/>
-              </w:rPr>
-              <w:t xml:space="preserve">You choose your path to show this standard — every option meets the same target:</w:t>
-            </w:r>
-          </w:p>
-          <w:p>
-            <w:pPr>
-              <w:spacing w:after="40"/>
-            </w:pPr>
-            <w:r>
-              <w:rPr>
-                <w:b w:val="false"/>
-                <w:bCs w:val="false"/>
-                <w:i w:val="false"/>
-                <w:iCs w:val="false"/>
-                <w:color w:val="1A1A1A"/>
-                <w:sz w:val="22"/>
-                <w:szCs w:val="22"/>
-                <w:caps w:val="false"/>
-                <w:rFonts w:ascii="Calibri" w:cs="Calibri" w:eastAsia="Calibri" w:hAnsi="Calibri"/>
-              </w:rPr>
-              <w:t xml:space="preserve">DEFEND a term: pick the vocabulary word you think matters most and argue why in 2–3 sentences.  ·  CONNECT it: pick a current event, your community, or your own life and explain how this standard shows up there.  ·  TAKE A SIDE: pick one debatable question from this standard and argue your position with evidence.</w:t>
-            </w:r>
-          </w:p>
-          <w:p>
-            <w:pPr>
-              <w:spacing w:after="40"/>
-            </w:pPr>
-            <w:r>
-              <w:rPr>
-                <w:b w:val="false"/>
-                <w:bCs w:val="false"/>
-                <w:i w:val="false"/>
-                <w:iCs w:val="false"/>
-                <w:color w:val="1A1A1A"/>
-                <w:sz w:val="22"/>
-                <w:szCs w:val="22"/>
-                <w:caps w:val="false"/>
-                <w:rFonts w:ascii="Calibri" w:cs="Calibri" w:eastAsia="Calibri" w:hAnsi="Calibri"/>
-              </w:rPr>
-              <w:t xml:space="preserve">Your pick is yours — bring what matters to you into the work.</w:t>
-            </w:r>
-          </w:p>
-        </w:tc>
-      </w:tr>
-    </w:tbl>
-    <w:tbl>
-      <w:tblPr>
-        <w:tblW w:type="dxa" w:w="9648"/>
-        <w:tblBorders>
-          <w:top w:val="single" w:color="auto" w:sz="4"/>
-          <w:left w:val="single" w:color="auto" w:sz="4"/>
-          <w:bottom w:val="single" w:color="auto" w:sz="4"/>
-          <w:right w:val="single" w:color="auto" w:sz="4"/>
-          <w:insideH w:val="single" w:color="auto" w:sz="4"/>
-          <w:insideV w:val="single" w:color="auto" w:sz="4"/>
-        </w:tblBorders>
-      </w:tblPr>
-      <w:tblGrid>
-        <w:gridCol w:w="9648"/>
-      </w:tblGrid>
-      <w:tr>
-        <w:tc>
-          <w:tcPr>
-            <w:tcW w:type="dxa" w:w="9648"/>
-            <w:tcBorders>
-              <w:top w:val="single" w:color="D9D5C8" w:sz="4"/>
-              <w:left w:val="single" w:color="D9D5C8" w:sz="4"/>
-              <w:bottom w:val="single" w:color="D9D5C8" w:sz="4"/>
-              <w:right w:val="single" w:color="D9D5C8" w:sz="4"/>
-            </w:tcBorders>
-            <w:shd w:fill="F7F5EF" w:color="auto" w:val="clear"/>
-            <w:tcMar>
-              <w:top w:type="dxa" w:w="55"/>
-              <w:left w:type="dxa" w:w="110"/>
-              <w:bottom w:type="dxa" w:w="55"/>
-              <w:right w:type="dxa" w:w="110"/>
-            </w:tcMar>
-          </w:tcPr>
-          <w:p>
-            <w:pPr>
-              <w:spacing w:after="60"/>
-            </w:pPr>
-            <w:r>
-              <w:rPr>
-                <w:b/>
-                <w:bCs/>
-                <w:i w:val="false"/>
-                <w:iCs w:val="false"/>
-                <w:color w:val="1B2A4A"/>
-                <w:sz w:val="21"/>
-                <w:szCs w:val="21"/>
-                <w:caps w:val="false"/>
-                <w:rFonts w:ascii="Calibri" w:cs="Calibri" w:eastAsia="Calibri" w:hAnsi="Calibri"/>
-              </w:rPr>
-              <w:t xml:space="preserve">REFLECT &amp; CONNECT — how your thinking grew, and whose view you weighed</w:t>
-            </w:r>
-          </w:p>
-          <w:p>
-            <w:pPr>
-              <w:spacing w:after="40"/>
-            </w:pPr>
-            <w:r>
-              <w:rPr>
-                <w:b w:val="false"/>
-                <w:bCs w:val="false"/>
-                <w:i w:val="false"/>
-                <w:iCs w:val="false"/>
-                <w:color w:val="1A1A1A"/>
-                <w:sz w:val="22"/>
-                <w:szCs w:val="22"/>
-                <w:caps w:val="false"/>
-                <w:rFonts w:ascii="Calibri" w:cs="Calibri" w:eastAsia="Calibri" w:hAnsi="Calibri"/>
-              </w:rPr>
-              <w:t xml:space="preserve">Reflect (self-awareness): What did you believe about this topic BEFORE, and what changed AFTER? Name one thing to revisit.</w:t>
-            </w:r>
-          </w:p>
-          <w:p>
-            <w:pPr>
-              <w:spacing w:after="40"/>
-            </w:pPr>
-            <w:r>
-              <w:rPr>
-                <w:b w:val="false"/>
-                <w:bCs w:val="false"/>
-                <w:i w:val="false"/>
-                <w:iCs w:val="false"/>
-                <w:color w:val="1A1A1A"/>
-                <w:sz w:val="22"/>
-                <w:szCs w:val="22"/>
-                <w:caps w:val="false"/>
-                <w:rFonts w:ascii="Calibri" w:cs="Calibri" w:eastAsia="Calibri" w:hAnsi="Calibri"/>
-              </w:rPr>
-              <w:t xml:space="preserve">Consider another view (empathy): Name one person or group who might see this standard differently than you. State their view fairly in one sentence — even if you disagree.</w:t>
-            </w:r>
-          </w:p>
-          <w:p>
-            <w:pPr>
-              <w:spacing w:after="40"/>
-            </w:pPr>
-            <w:r>
-              <w:rPr>
-                <w:b w:val="false"/>
-                <w:bCs w:val="false"/>
-                <w:i w:val="false"/>
-                <w:iCs w:val="false"/>
-                <w:color w:val="1A1A1A"/>
-                <w:sz w:val="22"/>
-                <w:szCs w:val="22"/>
-                <w:caps w:val="false"/>
-                <w:rFonts w:ascii="Calibri" w:cs="Calibri" w:eastAsia="Calibri" w:hAnsi="Calibri"/>
-              </w:rPr>
-              <w:t xml:space="preserve">Norm (restorative): we critique ideas, not people; we assume good faith; we make room for every voice.</w:t>
             </w:r>
           </w:p>
         </w:tc>

</xml_diff>

<commit_message>
Keep UDL/Choice/Reflect elements but on a per-standard support page; activities stay brand-identical
The seven activities render byte-identical to HistoryHack_Platinum/build/build_workbook.js
(verified: no Activity/ruled/Cornell divergence). The UDL/MTSS access, response-mode,
Choice & Voice, and Reflect & Connect elements are retained but relocated to a dedicated
page-break-separated support page at the end of each standard's block, so they never split
a Cornell write-box or create half pages. Rebuilt all 7 standard + large-print editions;
support page per standard, 7/7 activities, images intact, leak-clean.

Co-Authored-By: Claude Opus 4.8 <noreply@anthropic.com>
Claude-Session: https://claude.ai/code/session_01DHdLjiiJeW6A83FcYRQ3qv
</commit_message>
<xml_diff>
--- a/courses/foundations-constitutional-government/BUILD/unit4/deliverables/Unit4_Student_Workbook_CourseStandard.docx
+++ b/courses/foundations-constitutional-government/BUILD/unit4/deliverables/Unit4_Student_Workbook_CourseStandard.docx
@@ -18322,6 +18322,457 @@
     </w:tbl>
     <w:p>
       <w:pPr>
+        <w:pStyle w:val="Heading2"/>
+        <w:keepNext/>
+        <w:pageBreakBefore/>
+        <w:spacing w:before="150" w:after="90"/>
+      </w:pPr>
+      <w:r>
+        <w:rPr>
+          <w:b/>
+          <w:bCs/>
+          <w:i w:val="false"/>
+          <w:iCs w:val="false"/>
+          <w:color w:val="1B2A4A"/>
+          <w:sz w:val="28"/>
+          <w:szCs w:val="28"/>
+          <w:caps w:val="false"/>
+          <w:rFonts w:ascii="Calibri" w:cs="Calibri" w:eastAsia="Calibri" w:hAnsi="Calibri"/>
+        </w:rPr>
+        <w:t xml:space="preserve">UDL Access, Choice &amp; Reflection — GC.16</w:t>
+      </w:r>
+    </w:p>
+    <w:tbl>
+      <w:tblPr>
+        <w:tblW w:type="dxa" w:w="9648"/>
+        <w:tblBorders>
+          <w:top w:val="single" w:color="auto" w:sz="4"/>
+          <w:left w:val="single" w:color="auto" w:sz="4"/>
+          <w:bottom w:val="single" w:color="auto" w:sz="4"/>
+          <w:right w:val="single" w:color="auto" w:sz="4"/>
+          <w:insideH w:val="single" w:color="auto" w:sz="4"/>
+          <w:insideV w:val="single" w:color="auto" w:sz="4"/>
+        </w:tblBorders>
+      </w:tblPr>
+      <w:tblGrid>
+        <w:gridCol w:w="9648"/>
+      </w:tblGrid>
+      <w:tr>
+        <w:tc>
+          <w:tcPr>
+            <w:tcW w:type="dxa" w:w="9648"/>
+            <w:tcBorders>
+              <w:top w:val="single" w:color="D9D5C8" w:sz="4"/>
+              <w:left w:val="single" w:color="D9D5C8" w:sz="4"/>
+              <w:bottom w:val="single" w:color="D9D5C8" w:sz="4"/>
+              <w:right w:val="single" w:color="D9D5C8" w:sz="4"/>
+            </w:tcBorders>
+            <w:shd w:fill="F7F5EF" w:color="auto" w:val="clear"/>
+            <w:tcMar>
+              <w:top w:type="dxa" w:w="55"/>
+              <w:left w:type="dxa" w:w="110"/>
+              <w:bottom w:type="dxa" w:w="55"/>
+              <w:right w:type="dxa" w:w="110"/>
+            </w:tcMar>
+          </w:tcPr>
+          <w:p>
+            <w:pPr>
+              <w:spacing w:after="60"/>
+            </w:pPr>
+            <w:r>
+              <w:rPr>
+                <w:b/>
+                <w:bCs/>
+                <w:i w:val="false"/>
+                <w:iCs w:val="false"/>
+                <w:color w:val="1B2A4A"/>
+                <w:sz w:val="21"/>
+                <w:szCs w:val="21"/>
+                <w:caps w:val="false"/>
+                <w:rFonts w:ascii="Calibri" w:cs="Calibri" w:eastAsia="Calibri" w:hAnsi="Calibri"/>
+              </w:rPr>
+              <w:t xml:space="preserve">UDL ACCESS &amp; MTSS SUPPORT (this standard)</w:t>
+            </w:r>
+          </w:p>
+          <w:p>
+            <w:pPr>
+              <w:spacing w:after="40"/>
+            </w:pPr>
+            <w:r>
+              <w:rPr>
+                <w:b w:val="false"/>
+                <w:bCs w:val="false"/>
+                <w:i w:val="false"/>
+                <w:iCs w:val="false"/>
+                <w:color w:val="1A1A1A"/>
+                <w:sz w:val="22"/>
+                <w:szCs w:val="22"/>
+                <w:caps w:val="false"/>
+                <w:rFonts w:ascii="Calibri" w:cs="Calibri" w:eastAsia="Calibri" w:hAnsi="Calibri"/>
+              </w:rPr>
+              <w:t xml:space="preserve">UDL 3.0 (CAST, 2024): read-aloud on request · key terms glossed (EN/ES) · respond in writing, speech, or a labeled diagram · large-print &amp; screen-reader friendly. Same learning target for everyone; supports vary the means, not the ceiling.</w:t>
+            </w:r>
+          </w:p>
+          <w:p>
+            <w:pPr>
+              <w:spacing w:after="40"/>
+            </w:pPr>
+            <w:r>
+              <w:rPr>
+                <w:b w:val="false"/>
+                <w:bCs w:val="false"/>
+                <w:i w:val="false"/>
+                <w:iCs w:val="false"/>
+                <w:color w:val="1A1A1A"/>
+                <w:sz w:val="22"/>
+                <w:szCs w:val="22"/>
+                <w:caps w:val="false"/>
+                <w:rFonts w:ascii="Calibri" w:cs="Calibri" w:eastAsia="Calibri" w:hAnsi="Calibri"/>
+              </w:rPr>
+              <w:t xml:space="preserve">MTSS: Tier 1 — this core lesson for all · Tier 2 — small-group reteach of this standard using its Cornell cues + graphic organizer, then re-check · Tier 3 — intensive 1:1 with concrete→representational→abstract scaffolding, progress-monitored to the same standard.</w:t>
+            </w:r>
+          </w:p>
+        </w:tc>
+      </w:tr>
+    </w:tbl>
+    <w:tbl>
+      <w:tblPr>
+        <w:tblW w:type="dxa" w:w="9648"/>
+        <w:tblBorders>
+          <w:top w:val="single" w:color="auto" w:sz="4"/>
+          <w:left w:val="single" w:color="auto" w:sz="4"/>
+          <w:bottom w:val="single" w:color="auto" w:sz="4"/>
+          <w:right w:val="single" w:color="auto" w:sz="4"/>
+          <w:insideH w:val="single" w:color="auto" w:sz="4"/>
+          <w:insideV w:val="single" w:color="auto" w:sz="4"/>
+        </w:tblBorders>
+      </w:tblPr>
+      <w:tblGrid>
+        <w:gridCol w:w="9648"/>
+      </w:tblGrid>
+      <w:tr>
+        <w:tc>
+          <w:tcPr>
+            <w:tcW w:type="dxa" w:w="9648"/>
+            <w:tcBorders>
+              <w:top w:val="single" w:color="D9D5C8" w:sz="4"/>
+              <w:left w:val="single" w:color="D9D5C8" w:sz="4"/>
+              <w:bottom w:val="single" w:color="D9D5C8" w:sz="4"/>
+              <w:right w:val="single" w:color="D9D5C8" w:sz="4"/>
+            </w:tcBorders>
+            <w:shd w:fill="F7F5EF" w:color="auto" w:val="clear"/>
+            <w:tcMar>
+              <w:top w:type="dxa" w:w="55"/>
+              <w:left w:type="dxa" w:w="110"/>
+              <w:bottom w:type="dxa" w:w="55"/>
+              <w:right w:type="dxa" w:w="110"/>
+            </w:tcMar>
+          </w:tcPr>
+          <w:p>
+            <w:pPr>
+              <w:spacing w:after="60"/>
+            </w:pPr>
+            <w:r>
+              <w:rPr>
+                <w:b/>
+                <w:bCs/>
+                <w:i w:val="false"/>
+                <w:iCs w:val="false"/>
+                <w:color w:val="1B2A4A"/>
+                <w:sz w:val="21"/>
+                <w:szCs w:val="21"/>
+                <w:caps w:val="false"/>
+                <w:rFonts w:ascii="Calibri" w:cs="Calibri" w:eastAsia="Calibri" w:hAnsi="Calibri"/>
+              </w:rPr>
+              <w:t xml:space="preserve">SHOW WHAT YOU KNOW — YOUR WAY (same CER rubric, same standard)</w:t>
+            </w:r>
+          </w:p>
+          <w:p>
+            <w:pPr>
+              <w:spacing w:after="40"/>
+            </w:pPr>
+            <w:r>
+              <w:rPr>
+                <w:b w:val="false"/>
+                <w:bCs w:val="false"/>
+                <w:i w:val="false"/>
+                <w:iCs w:val="false"/>
+                <w:color w:val="1A1A1A"/>
+                <w:sz w:val="22"/>
+                <w:szCs w:val="22"/>
+                <w:caps w:val="false"/>
+                <w:rFonts w:ascii="Calibri" w:cs="Calibri" w:eastAsia="Calibri" w:hAnsi="Calibri"/>
+              </w:rPr>
+              <w:t xml:space="preserve">Build your Claim–Evidence–Reasoning in whichever mode lets you think best — the standard and the CER rubric are identical for every mode; the mode changes how you SHOW it, never what you are held to:</w:t>
+            </w:r>
+          </w:p>
+          <w:p>
+            <w:pPr>
+              <w:spacing w:after="40"/>
+            </w:pPr>
+            <w:r>
+              <w:rPr>
+                <w:b w:val="false"/>
+                <w:bCs w:val="false"/>
+                <w:i w:val="false"/>
+                <w:iCs w:val="false"/>
+                <w:color w:val="1A1A1A"/>
+                <w:sz w:val="22"/>
+                <w:szCs w:val="22"/>
+                <w:caps w:val="false"/>
+                <w:rFonts w:ascii="Calibri" w:cs="Calibri" w:eastAsia="Calibri" w:hAnsi="Calibri"/>
+              </w:rPr>
+              <w:t xml:space="preserve">WRITE it  ·  SAY it aloud and record it (audio or video)  ·  DRAW and label a diagram that makes the argument  ·  BUILD a model or artifact and caption its claim, evidence, and reasoning.</w:t>
+            </w:r>
+          </w:p>
+          <w:p>
+            <w:pPr>
+              <w:spacing w:after="40"/>
+            </w:pPr>
+            <w:r>
+              <w:rPr>
+                <w:b w:val="false"/>
+                <w:bCs w:val="false"/>
+                <w:i w:val="false"/>
+                <w:iCs w:val="false"/>
+                <w:color w:val="1A1A1A"/>
+                <w:sz w:val="22"/>
+                <w:szCs w:val="22"/>
+                <w:caps w:val="false"/>
+                <w:rFonts w:ascii="Calibri" w:cs="Calibri" w:eastAsia="Calibri" w:hAnsi="Calibri"/>
+              </w:rPr>
+              <w:t xml:space="preserve">You may ask for a word processor, speech-to-text, a scribe, or a sentence/argument frame — these change how you produce, not the standard you meet.</w:t>
+            </w:r>
+          </w:p>
+        </w:tc>
+      </w:tr>
+    </w:tbl>
+    <w:tbl>
+      <w:tblPr>
+        <w:tblW w:type="dxa" w:w="9648"/>
+        <w:tblBorders>
+          <w:top w:val="single" w:color="auto" w:sz="4"/>
+          <w:left w:val="single" w:color="auto" w:sz="4"/>
+          <w:bottom w:val="single" w:color="auto" w:sz="4"/>
+          <w:right w:val="single" w:color="auto" w:sz="4"/>
+          <w:insideH w:val="single" w:color="auto" w:sz="4"/>
+          <w:insideV w:val="single" w:color="auto" w:sz="4"/>
+        </w:tblBorders>
+      </w:tblPr>
+      <w:tblGrid>
+        <w:gridCol w:w="9648"/>
+      </w:tblGrid>
+      <w:tr>
+        <w:tc>
+          <w:tcPr>
+            <w:tcW w:type="dxa" w:w="9648"/>
+            <w:tcBorders>
+              <w:top w:val="single" w:color="D9D5C8" w:sz="4"/>
+              <w:left w:val="single" w:color="D9D5C8" w:sz="4"/>
+              <w:bottom w:val="single" w:color="D9D5C8" w:sz="4"/>
+              <w:right w:val="single" w:color="D9D5C8" w:sz="4"/>
+            </w:tcBorders>
+            <w:shd w:fill="F7F5EF" w:color="auto" w:val="clear"/>
+            <w:tcMar>
+              <w:top w:type="dxa" w:w="55"/>
+              <w:left w:type="dxa" w:w="110"/>
+              <w:bottom w:type="dxa" w:w="55"/>
+              <w:right w:type="dxa" w:w="110"/>
+            </w:tcMar>
+          </w:tcPr>
+          <w:p>
+            <w:pPr>
+              <w:spacing w:after="60"/>
+            </w:pPr>
+            <w:r>
+              <w:rPr>
+                <w:b/>
+                <w:bCs/>
+                <w:i w:val="false"/>
+                <w:iCs w:val="false"/>
+                <w:color w:val="1B2A4A"/>
+                <w:sz w:val="21"/>
+                <w:szCs w:val="21"/>
+                <w:caps w:val="false"/>
+                <w:rFonts w:ascii="Calibri" w:cs="Calibri" w:eastAsia="Calibri" w:hAnsi="Calibri"/>
+              </w:rPr>
+              <w:t xml:space="preserve">CHOICE &amp; VOICE — you decide how to go deeper (pick ONE)</w:t>
+            </w:r>
+          </w:p>
+          <w:p>
+            <w:pPr>
+              <w:spacing w:after="40"/>
+            </w:pPr>
+            <w:r>
+              <w:rPr>
+                <w:b w:val="false"/>
+                <w:bCs w:val="false"/>
+                <w:i w:val="false"/>
+                <w:iCs w:val="false"/>
+                <w:color w:val="1A1A1A"/>
+                <w:sz w:val="22"/>
+                <w:szCs w:val="22"/>
+                <w:caps w:val="false"/>
+                <w:rFonts w:ascii="Calibri" w:cs="Calibri" w:eastAsia="Calibri" w:hAnsi="Calibri"/>
+              </w:rPr>
+              <w:t xml:space="preserve">You choose your path to show this standard — every option meets the same target:</w:t>
+            </w:r>
+          </w:p>
+          <w:p>
+            <w:pPr>
+              <w:spacing w:after="40"/>
+            </w:pPr>
+            <w:r>
+              <w:rPr>
+                <w:b w:val="false"/>
+                <w:bCs w:val="false"/>
+                <w:i w:val="false"/>
+                <w:iCs w:val="false"/>
+                <w:color w:val="1A1A1A"/>
+                <w:sz w:val="22"/>
+                <w:szCs w:val="22"/>
+                <w:caps w:val="false"/>
+                <w:rFonts w:ascii="Calibri" w:cs="Calibri" w:eastAsia="Calibri" w:hAnsi="Calibri"/>
+              </w:rPr>
+              <w:t xml:space="preserve">DEFEND a term: pick the vocabulary word that matters most and argue why in 2–3 sentences.  ·  CONNECT it: pick a current event, your community, or your own life and explain how this standard shows up there.  ·  TAKE A SIDE: pick one debatable question and argue your position with evidence.</w:t>
+            </w:r>
+          </w:p>
+          <w:p>
+            <w:pPr>
+              <w:spacing w:after="40"/>
+            </w:pPr>
+            <w:r>
+              <w:rPr>
+                <w:b w:val="false"/>
+                <w:bCs w:val="false"/>
+                <w:i w:val="false"/>
+                <w:iCs w:val="false"/>
+                <w:color w:val="1A1A1A"/>
+                <w:sz w:val="22"/>
+                <w:szCs w:val="22"/>
+                <w:caps w:val="false"/>
+                <w:rFonts w:ascii="Calibri" w:cs="Calibri" w:eastAsia="Calibri" w:hAnsi="Calibri"/>
+              </w:rPr>
+              <w:t xml:space="preserve">Your pick is yours — bring what matters to you into the work.</w:t>
+            </w:r>
+          </w:p>
+        </w:tc>
+      </w:tr>
+    </w:tbl>
+    <w:tbl>
+      <w:tblPr>
+        <w:tblW w:type="dxa" w:w="9648"/>
+        <w:tblBorders>
+          <w:top w:val="single" w:color="auto" w:sz="4"/>
+          <w:left w:val="single" w:color="auto" w:sz="4"/>
+          <w:bottom w:val="single" w:color="auto" w:sz="4"/>
+          <w:right w:val="single" w:color="auto" w:sz="4"/>
+          <w:insideH w:val="single" w:color="auto" w:sz="4"/>
+          <w:insideV w:val="single" w:color="auto" w:sz="4"/>
+        </w:tblBorders>
+      </w:tblPr>
+      <w:tblGrid>
+        <w:gridCol w:w="9648"/>
+      </w:tblGrid>
+      <w:tr>
+        <w:tc>
+          <w:tcPr>
+            <w:tcW w:type="dxa" w:w="9648"/>
+            <w:tcBorders>
+              <w:top w:val="single" w:color="D9D5C8" w:sz="4"/>
+              <w:left w:val="single" w:color="D9D5C8" w:sz="4"/>
+              <w:bottom w:val="single" w:color="D9D5C8" w:sz="4"/>
+              <w:right w:val="single" w:color="D9D5C8" w:sz="4"/>
+            </w:tcBorders>
+            <w:shd w:fill="F7F5EF" w:color="auto" w:val="clear"/>
+            <w:tcMar>
+              <w:top w:type="dxa" w:w="55"/>
+              <w:left w:type="dxa" w:w="110"/>
+              <w:bottom w:type="dxa" w:w="55"/>
+              <w:right w:type="dxa" w:w="110"/>
+            </w:tcMar>
+          </w:tcPr>
+          <w:p>
+            <w:pPr>
+              <w:spacing w:after="60"/>
+            </w:pPr>
+            <w:r>
+              <w:rPr>
+                <w:b/>
+                <w:bCs/>
+                <w:i w:val="false"/>
+                <w:iCs w:val="false"/>
+                <w:color w:val="1B2A4A"/>
+                <w:sz w:val="21"/>
+                <w:szCs w:val="21"/>
+                <w:caps w:val="false"/>
+                <w:rFonts w:ascii="Calibri" w:cs="Calibri" w:eastAsia="Calibri" w:hAnsi="Calibri"/>
+              </w:rPr>
+              <w:t xml:space="preserve">REFLECT &amp; CONNECT — how your thinking grew, and whose view you weighed</w:t>
+            </w:r>
+          </w:p>
+          <w:p>
+            <w:pPr>
+              <w:spacing w:after="40"/>
+            </w:pPr>
+            <w:r>
+              <w:rPr>
+                <w:b w:val="false"/>
+                <w:bCs w:val="false"/>
+                <w:i w:val="false"/>
+                <w:iCs w:val="false"/>
+                <w:color w:val="1A1A1A"/>
+                <w:sz w:val="22"/>
+                <w:szCs w:val="22"/>
+                <w:caps w:val="false"/>
+                <w:rFonts w:ascii="Calibri" w:cs="Calibri" w:eastAsia="Calibri" w:hAnsi="Calibri"/>
+              </w:rPr>
+              <w:t xml:space="preserve">Reflect (self-awareness): What did you believe about this topic BEFORE, and what changed AFTER? Name one thing to revisit.</w:t>
+            </w:r>
+          </w:p>
+          <w:p>
+            <w:pPr>
+              <w:spacing w:after="40"/>
+            </w:pPr>
+            <w:r>
+              <w:rPr>
+                <w:b w:val="false"/>
+                <w:bCs w:val="false"/>
+                <w:i w:val="false"/>
+                <w:iCs w:val="false"/>
+                <w:color w:val="1A1A1A"/>
+                <w:sz w:val="22"/>
+                <w:szCs w:val="22"/>
+                <w:caps w:val="false"/>
+                <w:rFonts w:ascii="Calibri" w:cs="Calibri" w:eastAsia="Calibri" w:hAnsi="Calibri"/>
+              </w:rPr>
+              <w:t xml:space="preserve">Consider another view (empathy): Name one person or group who might see this standard differently than you; state their view fairly in one sentence — even if you disagree.</w:t>
+            </w:r>
+          </w:p>
+          <w:p>
+            <w:pPr>
+              <w:spacing w:after="40"/>
+            </w:pPr>
+            <w:r>
+              <w:rPr>
+                <w:b w:val="false"/>
+                <w:bCs w:val="false"/>
+                <w:i w:val="false"/>
+                <w:iCs w:val="false"/>
+                <w:color w:val="1A1A1A"/>
+                <w:sz w:val="22"/>
+                <w:szCs w:val="22"/>
+                <w:caps w:val="false"/>
+                <w:rFonts w:ascii="Calibri" w:cs="Calibri" w:eastAsia="Calibri" w:hAnsi="Calibri"/>
+              </w:rPr>
+              <w:t xml:space="preserve">Norm (restorative): we critique ideas, not people; we assume good faith; we make room for every voice.</w:t>
+            </w:r>
+          </w:p>
+        </w:tc>
+      </w:tr>
+    </w:tbl>
+    <w:p>
+      <w:pPr>
         <w:pStyle w:val="Heading1"/>
         <w:keepNext/>
         <w:pageBreakBefore/>
@@ -32974,6 +33425,457 @@
     </w:tbl>
     <w:p>
       <w:pPr>
+        <w:pStyle w:val="Heading2"/>
+        <w:keepNext/>
+        <w:pageBreakBefore/>
+        <w:spacing w:before="150" w:after="90"/>
+      </w:pPr>
+      <w:r>
+        <w:rPr>
+          <w:b/>
+          <w:bCs/>
+          <w:i w:val="false"/>
+          <w:iCs w:val="false"/>
+          <w:color w:val="1B2A4A"/>
+          <w:sz w:val="28"/>
+          <w:szCs w:val="28"/>
+          <w:caps w:val="false"/>
+          <w:rFonts w:ascii="Calibri" w:cs="Calibri" w:eastAsia="Calibri" w:hAnsi="Calibri"/>
+        </w:rPr>
+        <w:t xml:space="preserve">UDL Access, Choice &amp; Reflection — GC.17</w:t>
+      </w:r>
+    </w:p>
+    <w:tbl>
+      <w:tblPr>
+        <w:tblW w:type="dxa" w:w="9648"/>
+        <w:tblBorders>
+          <w:top w:val="single" w:color="auto" w:sz="4"/>
+          <w:left w:val="single" w:color="auto" w:sz="4"/>
+          <w:bottom w:val="single" w:color="auto" w:sz="4"/>
+          <w:right w:val="single" w:color="auto" w:sz="4"/>
+          <w:insideH w:val="single" w:color="auto" w:sz="4"/>
+          <w:insideV w:val="single" w:color="auto" w:sz="4"/>
+        </w:tblBorders>
+      </w:tblPr>
+      <w:tblGrid>
+        <w:gridCol w:w="9648"/>
+      </w:tblGrid>
+      <w:tr>
+        <w:tc>
+          <w:tcPr>
+            <w:tcW w:type="dxa" w:w="9648"/>
+            <w:tcBorders>
+              <w:top w:val="single" w:color="D9D5C8" w:sz="4"/>
+              <w:left w:val="single" w:color="D9D5C8" w:sz="4"/>
+              <w:bottom w:val="single" w:color="D9D5C8" w:sz="4"/>
+              <w:right w:val="single" w:color="D9D5C8" w:sz="4"/>
+            </w:tcBorders>
+            <w:shd w:fill="F7F5EF" w:color="auto" w:val="clear"/>
+            <w:tcMar>
+              <w:top w:type="dxa" w:w="55"/>
+              <w:left w:type="dxa" w:w="110"/>
+              <w:bottom w:type="dxa" w:w="55"/>
+              <w:right w:type="dxa" w:w="110"/>
+            </w:tcMar>
+          </w:tcPr>
+          <w:p>
+            <w:pPr>
+              <w:spacing w:after="60"/>
+            </w:pPr>
+            <w:r>
+              <w:rPr>
+                <w:b/>
+                <w:bCs/>
+                <w:i w:val="false"/>
+                <w:iCs w:val="false"/>
+                <w:color w:val="1B2A4A"/>
+                <w:sz w:val="21"/>
+                <w:szCs w:val="21"/>
+                <w:caps w:val="false"/>
+                <w:rFonts w:ascii="Calibri" w:cs="Calibri" w:eastAsia="Calibri" w:hAnsi="Calibri"/>
+              </w:rPr>
+              <w:t xml:space="preserve">UDL ACCESS &amp; MTSS SUPPORT (this standard)</w:t>
+            </w:r>
+          </w:p>
+          <w:p>
+            <w:pPr>
+              <w:spacing w:after="40"/>
+            </w:pPr>
+            <w:r>
+              <w:rPr>
+                <w:b w:val="false"/>
+                <w:bCs w:val="false"/>
+                <w:i w:val="false"/>
+                <w:iCs w:val="false"/>
+                <w:color w:val="1A1A1A"/>
+                <w:sz w:val="22"/>
+                <w:szCs w:val="22"/>
+                <w:caps w:val="false"/>
+                <w:rFonts w:ascii="Calibri" w:cs="Calibri" w:eastAsia="Calibri" w:hAnsi="Calibri"/>
+              </w:rPr>
+              <w:t xml:space="preserve">UDL 3.0 (CAST, 2024): read-aloud on request · key terms glossed (EN/ES) · respond in writing, speech, or a labeled diagram · large-print &amp; screen-reader friendly. Same learning target for everyone; supports vary the means, not the ceiling.</w:t>
+            </w:r>
+          </w:p>
+          <w:p>
+            <w:pPr>
+              <w:spacing w:after="40"/>
+            </w:pPr>
+            <w:r>
+              <w:rPr>
+                <w:b w:val="false"/>
+                <w:bCs w:val="false"/>
+                <w:i w:val="false"/>
+                <w:iCs w:val="false"/>
+                <w:color w:val="1A1A1A"/>
+                <w:sz w:val="22"/>
+                <w:szCs w:val="22"/>
+                <w:caps w:val="false"/>
+                <w:rFonts w:ascii="Calibri" w:cs="Calibri" w:eastAsia="Calibri" w:hAnsi="Calibri"/>
+              </w:rPr>
+              <w:t xml:space="preserve">MTSS: Tier 1 — this core lesson for all · Tier 2 — small-group reteach of this standard using its Cornell cues + graphic organizer, then re-check · Tier 3 — intensive 1:1 with concrete→representational→abstract scaffolding, progress-monitored to the same standard.</w:t>
+            </w:r>
+          </w:p>
+        </w:tc>
+      </w:tr>
+    </w:tbl>
+    <w:tbl>
+      <w:tblPr>
+        <w:tblW w:type="dxa" w:w="9648"/>
+        <w:tblBorders>
+          <w:top w:val="single" w:color="auto" w:sz="4"/>
+          <w:left w:val="single" w:color="auto" w:sz="4"/>
+          <w:bottom w:val="single" w:color="auto" w:sz="4"/>
+          <w:right w:val="single" w:color="auto" w:sz="4"/>
+          <w:insideH w:val="single" w:color="auto" w:sz="4"/>
+          <w:insideV w:val="single" w:color="auto" w:sz="4"/>
+        </w:tblBorders>
+      </w:tblPr>
+      <w:tblGrid>
+        <w:gridCol w:w="9648"/>
+      </w:tblGrid>
+      <w:tr>
+        <w:tc>
+          <w:tcPr>
+            <w:tcW w:type="dxa" w:w="9648"/>
+            <w:tcBorders>
+              <w:top w:val="single" w:color="D9D5C8" w:sz="4"/>
+              <w:left w:val="single" w:color="D9D5C8" w:sz="4"/>
+              <w:bottom w:val="single" w:color="D9D5C8" w:sz="4"/>
+              <w:right w:val="single" w:color="D9D5C8" w:sz="4"/>
+            </w:tcBorders>
+            <w:shd w:fill="F7F5EF" w:color="auto" w:val="clear"/>
+            <w:tcMar>
+              <w:top w:type="dxa" w:w="55"/>
+              <w:left w:type="dxa" w:w="110"/>
+              <w:bottom w:type="dxa" w:w="55"/>
+              <w:right w:type="dxa" w:w="110"/>
+            </w:tcMar>
+          </w:tcPr>
+          <w:p>
+            <w:pPr>
+              <w:spacing w:after="60"/>
+            </w:pPr>
+            <w:r>
+              <w:rPr>
+                <w:b/>
+                <w:bCs/>
+                <w:i w:val="false"/>
+                <w:iCs w:val="false"/>
+                <w:color w:val="1B2A4A"/>
+                <w:sz w:val="21"/>
+                <w:szCs w:val="21"/>
+                <w:caps w:val="false"/>
+                <w:rFonts w:ascii="Calibri" w:cs="Calibri" w:eastAsia="Calibri" w:hAnsi="Calibri"/>
+              </w:rPr>
+              <w:t xml:space="preserve">SHOW WHAT YOU KNOW — YOUR WAY (same CER rubric, same standard)</w:t>
+            </w:r>
+          </w:p>
+          <w:p>
+            <w:pPr>
+              <w:spacing w:after="40"/>
+            </w:pPr>
+            <w:r>
+              <w:rPr>
+                <w:b w:val="false"/>
+                <w:bCs w:val="false"/>
+                <w:i w:val="false"/>
+                <w:iCs w:val="false"/>
+                <w:color w:val="1A1A1A"/>
+                <w:sz w:val="22"/>
+                <w:szCs w:val="22"/>
+                <w:caps w:val="false"/>
+                <w:rFonts w:ascii="Calibri" w:cs="Calibri" w:eastAsia="Calibri" w:hAnsi="Calibri"/>
+              </w:rPr>
+              <w:t xml:space="preserve">Build your Claim–Evidence–Reasoning in whichever mode lets you think best — the standard and the CER rubric are identical for every mode; the mode changes how you SHOW it, never what you are held to:</w:t>
+            </w:r>
+          </w:p>
+          <w:p>
+            <w:pPr>
+              <w:spacing w:after="40"/>
+            </w:pPr>
+            <w:r>
+              <w:rPr>
+                <w:b w:val="false"/>
+                <w:bCs w:val="false"/>
+                <w:i w:val="false"/>
+                <w:iCs w:val="false"/>
+                <w:color w:val="1A1A1A"/>
+                <w:sz w:val="22"/>
+                <w:szCs w:val="22"/>
+                <w:caps w:val="false"/>
+                <w:rFonts w:ascii="Calibri" w:cs="Calibri" w:eastAsia="Calibri" w:hAnsi="Calibri"/>
+              </w:rPr>
+              <w:t xml:space="preserve">WRITE it  ·  SAY it aloud and record it (audio or video)  ·  DRAW and label a diagram that makes the argument  ·  BUILD a model or artifact and caption its claim, evidence, and reasoning.</w:t>
+            </w:r>
+          </w:p>
+          <w:p>
+            <w:pPr>
+              <w:spacing w:after="40"/>
+            </w:pPr>
+            <w:r>
+              <w:rPr>
+                <w:b w:val="false"/>
+                <w:bCs w:val="false"/>
+                <w:i w:val="false"/>
+                <w:iCs w:val="false"/>
+                <w:color w:val="1A1A1A"/>
+                <w:sz w:val="22"/>
+                <w:szCs w:val="22"/>
+                <w:caps w:val="false"/>
+                <w:rFonts w:ascii="Calibri" w:cs="Calibri" w:eastAsia="Calibri" w:hAnsi="Calibri"/>
+              </w:rPr>
+              <w:t xml:space="preserve">You may ask for a word processor, speech-to-text, a scribe, or a sentence/argument frame — these change how you produce, not the standard you meet.</w:t>
+            </w:r>
+          </w:p>
+        </w:tc>
+      </w:tr>
+    </w:tbl>
+    <w:tbl>
+      <w:tblPr>
+        <w:tblW w:type="dxa" w:w="9648"/>
+        <w:tblBorders>
+          <w:top w:val="single" w:color="auto" w:sz="4"/>
+          <w:left w:val="single" w:color="auto" w:sz="4"/>
+          <w:bottom w:val="single" w:color="auto" w:sz="4"/>
+          <w:right w:val="single" w:color="auto" w:sz="4"/>
+          <w:insideH w:val="single" w:color="auto" w:sz="4"/>
+          <w:insideV w:val="single" w:color="auto" w:sz="4"/>
+        </w:tblBorders>
+      </w:tblPr>
+      <w:tblGrid>
+        <w:gridCol w:w="9648"/>
+      </w:tblGrid>
+      <w:tr>
+        <w:tc>
+          <w:tcPr>
+            <w:tcW w:type="dxa" w:w="9648"/>
+            <w:tcBorders>
+              <w:top w:val="single" w:color="D9D5C8" w:sz="4"/>
+              <w:left w:val="single" w:color="D9D5C8" w:sz="4"/>
+              <w:bottom w:val="single" w:color="D9D5C8" w:sz="4"/>
+              <w:right w:val="single" w:color="D9D5C8" w:sz="4"/>
+            </w:tcBorders>
+            <w:shd w:fill="F7F5EF" w:color="auto" w:val="clear"/>
+            <w:tcMar>
+              <w:top w:type="dxa" w:w="55"/>
+              <w:left w:type="dxa" w:w="110"/>
+              <w:bottom w:type="dxa" w:w="55"/>
+              <w:right w:type="dxa" w:w="110"/>
+            </w:tcMar>
+          </w:tcPr>
+          <w:p>
+            <w:pPr>
+              <w:spacing w:after="60"/>
+            </w:pPr>
+            <w:r>
+              <w:rPr>
+                <w:b/>
+                <w:bCs/>
+                <w:i w:val="false"/>
+                <w:iCs w:val="false"/>
+                <w:color w:val="1B2A4A"/>
+                <w:sz w:val="21"/>
+                <w:szCs w:val="21"/>
+                <w:caps w:val="false"/>
+                <w:rFonts w:ascii="Calibri" w:cs="Calibri" w:eastAsia="Calibri" w:hAnsi="Calibri"/>
+              </w:rPr>
+              <w:t xml:space="preserve">CHOICE &amp; VOICE — you decide how to go deeper (pick ONE)</w:t>
+            </w:r>
+          </w:p>
+          <w:p>
+            <w:pPr>
+              <w:spacing w:after="40"/>
+            </w:pPr>
+            <w:r>
+              <w:rPr>
+                <w:b w:val="false"/>
+                <w:bCs w:val="false"/>
+                <w:i w:val="false"/>
+                <w:iCs w:val="false"/>
+                <w:color w:val="1A1A1A"/>
+                <w:sz w:val="22"/>
+                <w:szCs w:val="22"/>
+                <w:caps w:val="false"/>
+                <w:rFonts w:ascii="Calibri" w:cs="Calibri" w:eastAsia="Calibri" w:hAnsi="Calibri"/>
+              </w:rPr>
+              <w:t xml:space="preserve">You choose your path to show this standard — every option meets the same target:</w:t>
+            </w:r>
+          </w:p>
+          <w:p>
+            <w:pPr>
+              <w:spacing w:after="40"/>
+            </w:pPr>
+            <w:r>
+              <w:rPr>
+                <w:b w:val="false"/>
+                <w:bCs w:val="false"/>
+                <w:i w:val="false"/>
+                <w:iCs w:val="false"/>
+                <w:color w:val="1A1A1A"/>
+                <w:sz w:val="22"/>
+                <w:szCs w:val="22"/>
+                <w:caps w:val="false"/>
+                <w:rFonts w:ascii="Calibri" w:cs="Calibri" w:eastAsia="Calibri" w:hAnsi="Calibri"/>
+              </w:rPr>
+              <w:t xml:space="preserve">DEFEND a term: pick the vocabulary word that matters most and argue why in 2–3 sentences.  ·  CONNECT it: pick a current event, your community, or your own life and explain how this standard shows up there.  ·  TAKE A SIDE: pick one debatable question and argue your position with evidence.</w:t>
+            </w:r>
+          </w:p>
+          <w:p>
+            <w:pPr>
+              <w:spacing w:after="40"/>
+            </w:pPr>
+            <w:r>
+              <w:rPr>
+                <w:b w:val="false"/>
+                <w:bCs w:val="false"/>
+                <w:i w:val="false"/>
+                <w:iCs w:val="false"/>
+                <w:color w:val="1A1A1A"/>
+                <w:sz w:val="22"/>
+                <w:szCs w:val="22"/>
+                <w:caps w:val="false"/>
+                <w:rFonts w:ascii="Calibri" w:cs="Calibri" w:eastAsia="Calibri" w:hAnsi="Calibri"/>
+              </w:rPr>
+              <w:t xml:space="preserve">Your pick is yours — bring what matters to you into the work.</w:t>
+            </w:r>
+          </w:p>
+        </w:tc>
+      </w:tr>
+    </w:tbl>
+    <w:tbl>
+      <w:tblPr>
+        <w:tblW w:type="dxa" w:w="9648"/>
+        <w:tblBorders>
+          <w:top w:val="single" w:color="auto" w:sz="4"/>
+          <w:left w:val="single" w:color="auto" w:sz="4"/>
+          <w:bottom w:val="single" w:color="auto" w:sz="4"/>
+          <w:right w:val="single" w:color="auto" w:sz="4"/>
+          <w:insideH w:val="single" w:color="auto" w:sz="4"/>
+          <w:insideV w:val="single" w:color="auto" w:sz="4"/>
+        </w:tblBorders>
+      </w:tblPr>
+      <w:tblGrid>
+        <w:gridCol w:w="9648"/>
+      </w:tblGrid>
+      <w:tr>
+        <w:tc>
+          <w:tcPr>
+            <w:tcW w:type="dxa" w:w="9648"/>
+            <w:tcBorders>
+              <w:top w:val="single" w:color="D9D5C8" w:sz="4"/>
+              <w:left w:val="single" w:color="D9D5C8" w:sz="4"/>
+              <w:bottom w:val="single" w:color="D9D5C8" w:sz="4"/>
+              <w:right w:val="single" w:color="D9D5C8" w:sz="4"/>
+            </w:tcBorders>
+            <w:shd w:fill="F7F5EF" w:color="auto" w:val="clear"/>
+            <w:tcMar>
+              <w:top w:type="dxa" w:w="55"/>
+              <w:left w:type="dxa" w:w="110"/>
+              <w:bottom w:type="dxa" w:w="55"/>
+              <w:right w:type="dxa" w:w="110"/>
+            </w:tcMar>
+          </w:tcPr>
+          <w:p>
+            <w:pPr>
+              <w:spacing w:after="60"/>
+            </w:pPr>
+            <w:r>
+              <w:rPr>
+                <w:b/>
+                <w:bCs/>
+                <w:i w:val="false"/>
+                <w:iCs w:val="false"/>
+                <w:color w:val="1B2A4A"/>
+                <w:sz w:val="21"/>
+                <w:szCs w:val="21"/>
+                <w:caps w:val="false"/>
+                <w:rFonts w:ascii="Calibri" w:cs="Calibri" w:eastAsia="Calibri" w:hAnsi="Calibri"/>
+              </w:rPr>
+              <w:t xml:space="preserve">REFLECT &amp; CONNECT — how your thinking grew, and whose view you weighed</w:t>
+            </w:r>
+          </w:p>
+          <w:p>
+            <w:pPr>
+              <w:spacing w:after="40"/>
+            </w:pPr>
+            <w:r>
+              <w:rPr>
+                <w:b w:val="false"/>
+                <w:bCs w:val="false"/>
+                <w:i w:val="false"/>
+                <w:iCs w:val="false"/>
+                <w:color w:val="1A1A1A"/>
+                <w:sz w:val="22"/>
+                <w:szCs w:val="22"/>
+                <w:caps w:val="false"/>
+                <w:rFonts w:ascii="Calibri" w:cs="Calibri" w:eastAsia="Calibri" w:hAnsi="Calibri"/>
+              </w:rPr>
+              <w:t xml:space="preserve">Reflect (self-awareness): What did you believe about this topic BEFORE, and what changed AFTER? Name one thing to revisit.</w:t>
+            </w:r>
+          </w:p>
+          <w:p>
+            <w:pPr>
+              <w:spacing w:after="40"/>
+            </w:pPr>
+            <w:r>
+              <w:rPr>
+                <w:b w:val="false"/>
+                <w:bCs w:val="false"/>
+                <w:i w:val="false"/>
+                <w:iCs w:val="false"/>
+                <w:color w:val="1A1A1A"/>
+                <w:sz w:val="22"/>
+                <w:szCs w:val="22"/>
+                <w:caps w:val="false"/>
+                <w:rFonts w:ascii="Calibri" w:cs="Calibri" w:eastAsia="Calibri" w:hAnsi="Calibri"/>
+              </w:rPr>
+              <w:t xml:space="preserve">Consider another view (empathy): Name one person or group who might see this standard differently than you; state their view fairly in one sentence — even if you disagree.</w:t>
+            </w:r>
+          </w:p>
+          <w:p>
+            <w:pPr>
+              <w:spacing w:after="40"/>
+            </w:pPr>
+            <w:r>
+              <w:rPr>
+                <w:b w:val="false"/>
+                <w:bCs w:val="false"/>
+                <w:i w:val="false"/>
+                <w:iCs w:val="false"/>
+                <w:color w:val="1A1A1A"/>
+                <w:sz w:val="22"/>
+                <w:szCs w:val="22"/>
+                <w:caps w:val="false"/>
+                <w:rFonts w:ascii="Calibri" w:cs="Calibri" w:eastAsia="Calibri" w:hAnsi="Calibri"/>
+              </w:rPr>
+              <w:t xml:space="preserve">Norm (restorative): we critique ideas, not people; we assume good faith; we make room for every voice.</w:t>
+            </w:r>
+          </w:p>
+        </w:tc>
+      </w:tr>
+    </w:tbl>
+    <w:p>
+      <w:pPr>
         <w:pStyle w:val="Heading1"/>
         <w:keepNext/>
         <w:pageBreakBefore/>
@@ -47619,6 +48521,457 @@
                 <w:rFonts w:ascii="Calibri" w:cs="Calibri" w:eastAsia="Calibri" w:hAnsi="Calibri"/>
               </w:rPr>
               <w:t xml:space="preserve">Before submitting: Is my claim defensible? Do I have TWO specific pieces of evidence? Does my reasoning explain HOW the evidence proves the claim?</w:t>
+            </w:r>
+          </w:p>
+        </w:tc>
+      </w:tr>
+    </w:tbl>
+    <w:p>
+      <w:pPr>
+        <w:pStyle w:val="Heading2"/>
+        <w:keepNext/>
+        <w:pageBreakBefore/>
+        <w:spacing w:before="150" w:after="90"/>
+      </w:pPr>
+      <w:r>
+        <w:rPr>
+          <w:b/>
+          <w:bCs/>
+          <w:i w:val="false"/>
+          <w:iCs w:val="false"/>
+          <w:color w:val="1B2A4A"/>
+          <w:sz w:val="28"/>
+          <w:szCs w:val="28"/>
+          <w:caps w:val="false"/>
+          <w:rFonts w:ascii="Calibri" w:cs="Calibri" w:eastAsia="Calibri" w:hAnsi="Calibri"/>
+        </w:rPr>
+        <w:t xml:space="preserve">UDL Access, Choice &amp; Reflection — GC.18</w:t>
+      </w:r>
+    </w:p>
+    <w:tbl>
+      <w:tblPr>
+        <w:tblW w:type="dxa" w:w="9648"/>
+        <w:tblBorders>
+          <w:top w:val="single" w:color="auto" w:sz="4"/>
+          <w:left w:val="single" w:color="auto" w:sz="4"/>
+          <w:bottom w:val="single" w:color="auto" w:sz="4"/>
+          <w:right w:val="single" w:color="auto" w:sz="4"/>
+          <w:insideH w:val="single" w:color="auto" w:sz="4"/>
+          <w:insideV w:val="single" w:color="auto" w:sz="4"/>
+        </w:tblBorders>
+      </w:tblPr>
+      <w:tblGrid>
+        <w:gridCol w:w="9648"/>
+      </w:tblGrid>
+      <w:tr>
+        <w:tc>
+          <w:tcPr>
+            <w:tcW w:type="dxa" w:w="9648"/>
+            <w:tcBorders>
+              <w:top w:val="single" w:color="D9D5C8" w:sz="4"/>
+              <w:left w:val="single" w:color="D9D5C8" w:sz="4"/>
+              <w:bottom w:val="single" w:color="D9D5C8" w:sz="4"/>
+              <w:right w:val="single" w:color="D9D5C8" w:sz="4"/>
+            </w:tcBorders>
+            <w:shd w:fill="F7F5EF" w:color="auto" w:val="clear"/>
+            <w:tcMar>
+              <w:top w:type="dxa" w:w="55"/>
+              <w:left w:type="dxa" w:w="110"/>
+              <w:bottom w:type="dxa" w:w="55"/>
+              <w:right w:type="dxa" w:w="110"/>
+            </w:tcMar>
+          </w:tcPr>
+          <w:p>
+            <w:pPr>
+              <w:spacing w:after="60"/>
+            </w:pPr>
+            <w:r>
+              <w:rPr>
+                <w:b/>
+                <w:bCs/>
+                <w:i w:val="false"/>
+                <w:iCs w:val="false"/>
+                <w:color w:val="1B2A4A"/>
+                <w:sz w:val="21"/>
+                <w:szCs w:val="21"/>
+                <w:caps w:val="false"/>
+                <w:rFonts w:ascii="Calibri" w:cs="Calibri" w:eastAsia="Calibri" w:hAnsi="Calibri"/>
+              </w:rPr>
+              <w:t xml:space="preserve">UDL ACCESS &amp; MTSS SUPPORT (this standard)</w:t>
+            </w:r>
+          </w:p>
+          <w:p>
+            <w:pPr>
+              <w:spacing w:after="40"/>
+            </w:pPr>
+            <w:r>
+              <w:rPr>
+                <w:b w:val="false"/>
+                <w:bCs w:val="false"/>
+                <w:i w:val="false"/>
+                <w:iCs w:val="false"/>
+                <w:color w:val="1A1A1A"/>
+                <w:sz w:val="22"/>
+                <w:szCs w:val="22"/>
+                <w:caps w:val="false"/>
+                <w:rFonts w:ascii="Calibri" w:cs="Calibri" w:eastAsia="Calibri" w:hAnsi="Calibri"/>
+              </w:rPr>
+              <w:t xml:space="preserve">UDL 3.0 (CAST, 2024): read-aloud on request · key terms glossed (EN/ES) · respond in writing, speech, or a labeled diagram · large-print &amp; screen-reader friendly. Same learning target for everyone; supports vary the means, not the ceiling.</w:t>
+            </w:r>
+          </w:p>
+          <w:p>
+            <w:pPr>
+              <w:spacing w:after="40"/>
+            </w:pPr>
+            <w:r>
+              <w:rPr>
+                <w:b w:val="false"/>
+                <w:bCs w:val="false"/>
+                <w:i w:val="false"/>
+                <w:iCs w:val="false"/>
+                <w:color w:val="1A1A1A"/>
+                <w:sz w:val="22"/>
+                <w:szCs w:val="22"/>
+                <w:caps w:val="false"/>
+                <w:rFonts w:ascii="Calibri" w:cs="Calibri" w:eastAsia="Calibri" w:hAnsi="Calibri"/>
+              </w:rPr>
+              <w:t xml:space="preserve">MTSS: Tier 1 — this core lesson for all · Tier 2 — small-group reteach of this standard using its Cornell cues + graphic organizer, then re-check · Tier 3 — intensive 1:1 with concrete→representational→abstract scaffolding, progress-monitored to the same standard.</w:t>
+            </w:r>
+          </w:p>
+        </w:tc>
+      </w:tr>
+    </w:tbl>
+    <w:tbl>
+      <w:tblPr>
+        <w:tblW w:type="dxa" w:w="9648"/>
+        <w:tblBorders>
+          <w:top w:val="single" w:color="auto" w:sz="4"/>
+          <w:left w:val="single" w:color="auto" w:sz="4"/>
+          <w:bottom w:val="single" w:color="auto" w:sz="4"/>
+          <w:right w:val="single" w:color="auto" w:sz="4"/>
+          <w:insideH w:val="single" w:color="auto" w:sz="4"/>
+          <w:insideV w:val="single" w:color="auto" w:sz="4"/>
+        </w:tblBorders>
+      </w:tblPr>
+      <w:tblGrid>
+        <w:gridCol w:w="9648"/>
+      </w:tblGrid>
+      <w:tr>
+        <w:tc>
+          <w:tcPr>
+            <w:tcW w:type="dxa" w:w="9648"/>
+            <w:tcBorders>
+              <w:top w:val="single" w:color="D9D5C8" w:sz="4"/>
+              <w:left w:val="single" w:color="D9D5C8" w:sz="4"/>
+              <w:bottom w:val="single" w:color="D9D5C8" w:sz="4"/>
+              <w:right w:val="single" w:color="D9D5C8" w:sz="4"/>
+            </w:tcBorders>
+            <w:shd w:fill="F7F5EF" w:color="auto" w:val="clear"/>
+            <w:tcMar>
+              <w:top w:type="dxa" w:w="55"/>
+              <w:left w:type="dxa" w:w="110"/>
+              <w:bottom w:type="dxa" w:w="55"/>
+              <w:right w:type="dxa" w:w="110"/>
+            </w:tcMar>
+          </w:tcPr>
+          <w:p>
+            <w:pPr>
+              <w:spacing w:after="60"/>
+            </w:pPr>
+            <w:r>
+              <w:rPr>
+                <w:b/>
+                <w:bCs/>
+                <w:i w:val="false"/>
+                <w:iCs w:val="false"/>
+                <w:color w:val="1B2A4A"/>
+                <w:sz w:val="21"/>
+                <w:szCs w:val="21"/>
+                <w:caps w:val="false"/>
+                <w:rFonts w:ascii="Calibri" w:cs="Calibri" w:eastAsia="Calibri" w:hAnsi="Calibri"/>
+              </w:rPr>
+              <w:t xml:space="preserve">SHOW WHAT YOU KNOW — YOUR WAY (same CER rubric, same standard)</w:t>
+            </w:r>
+          </w:p>
+          <w:p>
+            <w:pPr>
+              <w:spacing w:after="40"/>
+            </w:pPr>
+            <w:r>
+              <w:rPr>
+                <w:b w:val="false"/>
+                <w:bCs w:val="false"/>
+                <w:i w:val="false"/>
+                <w:iCs w:val="false"/>
+                <w:color w:val="1A1A1A"/>
+                <w:sz w:val="22"/>
+                <w:szCs w:val="22"/>
+                <w:caps w:val="false"/>
+                <w:rFonts w:ascii="Calibri" w:cs="Calibri" w:eastAsia="Calibri" w:hAnsi="Calibri"/>
+              </w:rPr>
+              <w:t xml:space="preserve">Build your Claim–Evidence–Reasoning in whichever mode lets you think best — the standard and the CER rubric are identical for every mode; the mode changes how you SHOW it, never what you are held to:</w:t>
+            </w:r>
+          </w:p>
+          <w:p>
+            <w:pPr>
+              <w:spacing w:after="40"/>
+            </w:pPr>
+            <w:r>
+              <w:rPr>
+                <w:b w:val="false"/>
+                <w:bCs w:val="false"/>
+                <w:i w:val="false"/>
+                <w:iCs w:val="false"/>
+                <w:color w:val="1A1A1A"/>
+                <w:sz w:val="22"/>
+                <w:szCs w:val="22"/>
+                <w:caps w:val="false"/>
+                <w:rFonts w:ascii="Calibri" w:cs="Calibri" w:eastAsia="Calibri" w:hAnsi="Calibri"/>
+              </w:rPr>
+              <w:t xml:space="preserve">WRITE it  ·  SAY it aloud and record it (audio or video)  ·  DRAW and label a diagram that makes the argument  ·  BUILD a model or artifact and caption its claim, evidence, and reasoning.</w:t>
+            </w:r>
+          </w:p>
+          <w:p>
+            <w:pPr>
+              <w:spacing w:after="40"/>
+            </w:pPr>
+            <w:r>
+              <w:rPr>
+                <w:b w:val="false"/>
+                <w:bCs w:val="false"/>
+                <w:i w:val="false"/>
+                <w:iCs w:val="false"/>
+                <w:color w:val="1A1A1A"/>
+                <w:sz w:val="22"/>
+                <w:szCs w:val="22"/>
+                <w:caps w:val="false"/>
+                <w:rFonts w:ascii="Calibri" w:cs="Calibri" w:eastAsia="Calibri" w:hAnsi="Calibri"/>
+              </w:rPr>
+              <w:t xml:space="preserve">You may ask for a word processor, speech-to-text, a scribe, or a sentence/argument frame — these change how you produce, not the standard you meet.</w:t>
+            </w:r>
+          </w:p>
+        </w:tc>
+      </w:tr>
+    </w:tbl>
+    <w:tbl>
+      <w:tblPr>
+        <w:tblW w:type="dxa" w:w="9648"/>
+        <w:tblBorders>
+          <w:top w:val="single" w:color="auto" w:sz="4"/>
+          <w:left w:val="single" w:color="auto" w:sz="4"/>
+          <w:bottom w:val="single" w:color="auto" w:sz="4"/>
+          <w:right w:val="single" w:color="auto" w:sz="4"/>
+          <w:insideH w:val="single" w:color="auto" w:sz="4"/>
+          <w:insideV w:val="single" w:color="auto" w:sz="4"/>
+        </w:tblBorders>
+      </w:tblPr>
+      <w:tblGrid>
+        <w:gridCol w:w="9648"/>
+      </w:tblGrid>
+      <w:tr>
+        <w:tc>
+          <w:tcPr>
+            <w:tcW w:type="dxa" w:w="9648"/>
+            <w:tcBorders>
+              <w:top w:val="single" w:color="D9D5C8" w:sz="4"/>
+              <w:left w:val="single" w:color="D9D5C8" w:sz="4"/>
+              <w:bottom w:val="single" w:color="D9D5C8" w:sz="4"/>
+              <w:right w:val="single" w:color="D9D5C8" w:sz="4"/>
+            </w:tcBorders>
+            <w:shd w:fill="F7F5EF" w:color="auto" w:val="clear"/>
+            <w:tcMar>
+              <w:top w:type="dxa" w:w="55"/>
+              <w:left w:type="dxa" w:w="110"/>
+              <w:bottom w:type="dxa" w:w="55"/>
+              <w:right w:type="dxa" w:w="110"/>
+            </w:tcMar>
+          </w:tcPr>
+          <w:p>
+            <w:pPr>
+              <w:spacing w:after="60"/>
+            </w:pPr>
+            <w:r>
+              <w:rPr>
+                <w:b/>
+                <w:bCs/>
+                <w:i w:val="false"/>
+                <w:iCs w:val="false"/>
+                <w:color w:val="1B2A4A"/>
+                <w:sz w:val="21"/>
+                <w:szCs w:val="21"/>
+                <w:caps w:val="false"/>
+                <w:rFonts w:ascii="Calibri" w:cs="Calibri" w:eastAsia="Calibri" w:hAnsi="Calibri"/>
+              </w:rPr>
+              <w:t xml:space="preserve">CHOICE &amp; VOICE — you decide how to go deeper (pick ONE)</w:t>
+            </w:r>
+          </w:p>
+          <w:p>
+            <w:pPr>
+              <w:spacing w:after="40"/>
+            </w:pPr>
+            <w:r>
+              <w:rPr>
+                <w:b w:val="false"/>
+                <w:bCs w:val="false"/>
+                <w:i w:val="false"/>
+                <w:iCs w:val="false"/>
+                <w:color w:val="1A1A1A"/>
+                <w:sz w:val="22"/>
+                <w:szCs w:val="22"/>
+                <w:caps w:val="false"/>
+                <w:rFonts w:ascii="Calibri" w:cs="Calibri" w:eastAsia="Calibri" w:hAnsi="Calibri"/>
+              </w:rPr>
+              <w:t xml:space="preserve">You choose your path to show this standard — every option meets the same target:</w:t>
+            </w:r>
+          </w:p>
+          <w:p>
+            <w:pPr>
+              <w:spacing w:after="40"/>
+            </w:pPr>
+            <w:r>
+              <w:rPr>
+                <w:b w:val="false"/>
+                <w:bCs w:val="false"/>
+                <w:i w:val="false"/>
+                <w:iCs w:val="false"/>
+                <w:color w:val="1A1A1A"/>
+                <w:sz w:val="22"/>
+                <w:szCs w:val="22"/>
+                <w:caps w:val="false"/>
+                <w:rFonts w:ascii="Calibri" w:cs="Calibri" w:eastAsia="Calibri" w:hAnsi="Calibri"/>
+              </w:rPr>
+              <w:t xml:space="preserve">DEFEND a term: pick the vocabulary word that matters most and argue why in 2–3 sentences.  ·  CONNECT it: pick a current event, your community, or your own life and explain how this standard shows up there.  ·  TAKE A SIDE: pick one debatable question and argue your position with evidence.</w:t>
+            </w:r>
+          </w:p>
+          <w:p>
+            <w:pPr>
+              <w:spacing w:after="40"/>
+            </w:pPr>
+            <w:r>
+              <w:rPr>
+                <w:b w:val="false"/>
+                <w:bCs w:val="false"/>
+                <w:i w:val="false"/>
+                <w:iCs w:val="false"/>
+                <w:color w:val="1A1A1A"/>
+                <w:sz w:val="22"/>
+                <w:szCs w:val="22"/>
+                <w:caps w:val="false"/>
+                <w:rFonts w:ascii="Calibri" w:cs="Calibri" w:eastAsia="Calibri" w:hAnsi="Calibri"/>
+              </w:rPr>
+              <w:t xml:space="preserve">Your pick is yours — bring what matters to you into the work.</w:t>
+            </w:r>
+          </w:p>
+        </w:tc>
+      </w:tr>
+    </w:tbl>
+    <w:tbl>
+      <w:tblPr>
+        <w:tblW w:type="dxa" w:w="9648"/>
+        <w:tblBorders>
+          <w:top w:val="single" w:color="auto" w:sz="4"/>
+          <w:left w:val="single" w:color="auto" w:sz="4"/>
+          <w:bottom w:val="single" w:color="auto" w:sz="4"/>
+          <w:right w:val="single" w:color="auto" w:sz="4"/>
+          <w:insideH w:val="single" w:color="auto" w:sz="4"/>
+          <w:insideV w:val="single" w:color="auto" w:sz="4"/>
+        </w:tblBorders>
+      </w:tblPr>
+      <w:tblGrid>
+        <w:gridCol w:w="9648"/>
+      </w:tblGrid>
+      <w:tr>
+        <w:tc>
+          <w:tcPr>
+            <w:tcW w:type="dxa" w:w="9648"/>
+            <w:tcBorders>
+              <w:top w:val="single" w:color="D9D5C8" w:sz="4"/>
+              <w:left w:val="single" w:color="D9D5C8" w:sz="4"/>
+              <w:bottom w:val="single" w:color="D9D5C8" w:sz="4"/>
+              <w:right w:val="single" w:color="D9D5C8" w:sz="4"/>
+            </w:tcBorders>
+            <w:shd w:fill="F7F5EF" w:color="auto" w:val="clear"/>
+            <w:tcMar>
+              <w:top w:type="dxa" w:w="55"/>
+              <w:left w:type="dxa" w:w="110"/>
+              <w:bottom w:type="dxa" w:w="55"/>
+              <w:right w:type="dxa" w:w="110"/>
+            </w:tcMar>
+          </w:tcPr>
+          <w:p>
+            <w:pPr>
+              <w:spacing w:after="60"/>
+            </w:pPr>
+            <w:r>
+              <w:rPr>
+                <w:b/>
+                <w:bCs/>
+                <w:i w:val="false"/>
+                <w:iCs w:val="false"/>
+                <w:color w:val="1B2A4A"/>
+                <w:sz w:val="21"/>
+                <w:szCs w:val="21"/>
+                <w:caps w:val="false"/>
+                <w:rFonts w:ascii="Calibri" w:cs="Calibri" w:eastAsia="Calibri" w:hAnsi="Calibri"/>
+              </w:rPr>
+              <w:t xml:space="preserve">REFLECT &amp; CONNECT — how your thinking grew, and whose view you weighed</w:t>
+            </w:r>
+          </w:p>
+          <w:p>
+            <w:pPr>
+              <w:spacing w:after="40"/>
+            </w:pPr>
+            <w:r>
+              <w:rPr>
+                <w:b w:val="false"/>
+                <w:bCs w:val="false"/>
+                <w:i w:val="false"/>
+                <w:iCs w:val="false"/>
+                <w:color w:val="1A1A1A"/>
+                <w:sz w:val="22"/>
+                <w:szCs w:val="22"/>
+                <w:caps w:val="false"/>
+                <w:rFonts w:ascii="Calibri" w:cs="Calibri" w:eastAsia="Calibri" w:hAnsi="Calibri"/>
+              </w:rPr>
+              <w:t xml:space="preserve">Reflect (self-awareness): What did you believe about this topic BEFORE, and what changed AFTER? Name one thing to revisit.</w:t>
+            </w:r>
+          </w:p>
+          <w:p>
+            <w:pPr>
+              <w:spacing w:after="40"/>
+            </w:pPr>
+            <w:r>
+              <w:rPr>
+                <w:b w:val="false"/>
+                <w:bCs w:val="false"/>
+                <w:i w:val="false"/>
+                <w:iCs w:val="false"/>
+                <w:color w:val="1A1A1A"/>
+                <w:sz w:val="22"/>
+                <w:szCs w:val="22"/>
+                <w:caps w:val="false"/>
+                <w:rFonts w:ascii="Calibri" w:cs="Calibri" w:eastAsia="Calibri" w:hAnsi="Calibri"/>
+              </w:rPr>
+              <w:t xml:space="preserve">Consider another view (empathy): Name one person or group who might see this standard differently than you; state their view fairly in one sentence — even if you disagree.</w:t>
+            </w:r>
+          </w:p>
+          <w:p>
+            <w:pPr>
+              <w:spacing w:after="40"/>
+            </w:pPr>
+            <w:r>
+              <w:rPr>
+                <w:b w:val="false"/>
+                <w:bCs w:val="false"/>
+                <w:i w:val="false"/>
+                <w:iCs w:val="false"/>
+                <w:color w:val="1A1A1A"/>
+                <w:sz w:val="22"/>
+                <w:szCs w:val="22"/>
+                <w:caps w:val="false"/>
+                <w:rFonts w:ascii="Calibri" w:cs="Calibri" w:eastAsia="Calibri" w:hAnsi="Calibri"/>
+              </w:rPr>
+              <w:t xml:space="preserve">Norm (restorative): we critique ideas, not people; we assume good faith; we make room for every voice.</w:t>
             </w:r>
           </w:p>
         </w:tc>

</xml_diff>

<commit_message>
Fix Cornell notes: wide note column + full-page-width writing lines
The Cornell FRONT gave only a narrow 5-line note cell. Widened the note-taking
column to 7048 twips (~4.9in), 8 lines per cue, and added 10 full-page-width ruled
writing lines below so students have real note-taking space that runs the width of
the page. Also replaced the US-History fallback cues (Who benefited/bore the costs)
with generic prompts. Rebuilt all 7 standard + large-print editions.

Co-Authored-By: Claude Opus 4.8 <noreply@anthropic.com>
Claude-Session: https://claude.ai/code/session_01DHdLjiiJeW6A83FcYRQ3qv
</commit_message>
<xml_diff>
--- a/courses/foundations-constitutional-government/BUILD/unit4/deliverables/Unit4_Student_Workbook_CourseStandard.docx
+++ b/courses/foundations-constitutional-government/BUILD/unit4/deliverables/Unit4_Student_Workbook_CourseStandard.docx
@@ -8276,8 +8276,8 @@
         </w:tblBorders>
       </w:tblPr>
       <w:tblGrid>
-        <w:gridCol w:w="3050"/>
-        <w:gridCol w:w="6598"/>
+        <w:gridCol w:w="2600"/>
+        <w:gridCol w:w="7048"/>
       </w:tblGrid>
       <w:tr>
         <w:trPr>
@@ -8285,7 +8285,7 @@
         </w:trPr>
         <w:tc>
           <w:tcPr>
-            <w:tcW w:type="dxa" w:w="3050"/>
+            <w:tcW w:type="dxa" w:w="2600"/>
             <w:tcBorders>
               <w:top w:val="single" w:color="D9D5C8" w:sz="4"/>
               <w:left w:val="single" w:color="D9D5C8" w:sz="4"/>
@@ -8316,13 +8316,13 @@
                 <w:caps w:val="false"/>
                 <w:rFonts w:ascii="Calibri" w:cs="Calibri" w:eastAsia="Calibri" w:hAnsi="Calibri"/>
               </w:rPr>
-              <w:t xml:space="preserve">Cues (tied to your learning targets)</w:t>
-            </w:r>
-          </w:p>
-        </w:tc>
-        <w:tc>
-          <w:tcPr>
-            <w:tcW w:type="dxa" w:w="6598"/>
+              <w:t xml:space="preserve">Cue Column — questions &amp; key terms</w:t>
+            </w:r>
+          </w:p>
+        </w:tc>
+        <w:tc>
+          <w:tcPr>
+            <w:tcW w:type="dxa" w:w="7048"/>
             <w:tcBorders>
               <w:top w:val="single" w:color="D9D5C8" w:sz="4"/>
               <w:left w:val="single" w:color="D9D5C8" w:sz="4"/>
@@ -8353,7 +8353,7 @@
                 <w:caps w:val="false"/>
                 <w:rFonts w:ascii="Calibri" w:cs="Calibri" w:eastAsia="Calibri" w:hAnsi="Calibri"/>
               </w:rPr>
-              <w:t xml:space="preserve">My notes</w:t>
+              <w:t xml:space="preserve">Note-Taking Column — write your notes here</w:t>
             </w:r>
           </w:p>
         </w:tc>
@@ -8361,7 +8361,7 @@
       <w:tr>
         <w:tc>
           <w:tcPr>
-            <w:tcW w:type="dxa" w:w="3050"/>
+            <w:tcW w:type="dxa" w:w="2600"/>
             <w:tcBorders>
               <w:top w:val="single" w:color="D9D5C8" w:sz="4"/>
               <w:left w:val="single" w:color="D9D5C8" w:sz="4"/>
@@ -8397,7 +8397,7 @@
         </w:tc>
         <w:tc>
           <w:tcPr>
-            <w:tcW w:type="dxa" w:w="6598"/>
+            <w:tcW w:type="dxa" w:w="7048"/>
             <w:tcBorders>
               <w:top w:val="single" w:color="D9D5C8" w:sz="4"/>
               <w:left w:val="single" w:color="D9D5C8" w:sz="4"/>
@@ -8597,61 +8597,25 @@
               <w:t xml:space="preserve"> </w:t>
             </w:r>
           </w:p>
-        </w:tc>
-      </w:tr>
-      <w:tr>
-        <w:tc>
-          <w:tcPr>
-            <w:tcW w:type="dxa" w:w="3050"/>
-            <w:tcBorders>
-              <w:top w:val="single" w:color="D9D5C8" w:sz="4"/>
-              <w:left w:val="single" w:color="D9D5C8" w:sz="4"/>
-              <w:bottom w:val="single" w:color="D9D5C8" w:sz="4"/>
-              <w:right w:val="single" w:color="D9D5C8" w:sz="4"/>
-            </w:tcBorders>
-            <w:tcMar>
-              <w:top w:type="dxa" w:w="55"/>
-              <w:left w:type="dxa" w:w="110"/>
-              <w:bottom w:type="dxa" w:w="55"/>
-              <w:right w:type="dxa" w:w="110"/>
-            </w:tcMar>
-          </w:tcPr>
-          <w:p>
-            <w:pPr>
-              <w:spacing w:after="0"/>
-            </w:pPr>
-            <w:r>
-              <w:rPr>
-                <w:b/>
-                <w:bCs/>
-                <w:i w:val="false"/>
-                <w:iCs w:val="false"/>
-                <w:color w:val="1A1A1A"/>
-                <w:sz w:val="20"/>
-                <w:szCs w:val="20"/>
-                <w:caps w:val="false"/>
-                <w:rFonts w:ascii="Calibri" w:cs="Calibri" w:eastAsia="Calibri" w:hAnsi="Calibri"/>
-              </w:rPr>
-              <w:t xml:space="preserve">One source that supports it?</w:t>
-            </w:r>
-          </w:p>
-        </w:tc>
-        <w:tc>
-          <w:tcPr>
-            <w:tcW w:type="dxa" w:w="6598"/>
-            <w:tcBorders>
-              <w:top w:val="single" w:color="D9D5C8" w:sz="4"/>
-              <w:left w:val="single" w:color="D9D5C8" w:sz="4"/>
-              <w:bottom w:val="single" w:color="D9D5C8" w:sz="4"/>
-              <w:right w:val="single" w:color="D9D5C8" w:sz="4"/>
-            </w:tcBorders>
-            <w:tcMar>
-              <w:top w:type="dxa" w:w="55"/>
-              <w:left w:type="dxa" w:w="110"/>
-              <w:bottom w:type="dxa" w:w="55"/>
-              <w:right w:type="dxa" w:w="110"/>
-            </w:tcMar>
-          </w:tcPr>
+          <w:p>
+            <w:pPr>
+              <w:spacing w:before="0" w:after="0" w:line="70" w:lineRule="exact"/>
+            </w:pPr>
+            <w:r>
+              <w:rPr>
+                <w:b w:val="false"/>
+                <w:bCs w:val="false"/>
+                <w:i w:val="false"/>
+                <w:iCs w:val="false"/>
+                <w:color w:val="1A1A1A"/>
+                <w:sz w:val="2"/>
+                <w:szCs w:val="2"/>
+                <w:caps w:val="false"/>
+                <w:rFonts w:ascii="Calibri" w:cs="Calibri" w:eastAsia="Calibri" w:hAnsi="Calibri"/>
+              </w:rPr>
+              <w:t xml:space="preserve"> </w:t>
+            </w:r>
+          </w:p>
           <w:p>
             <w:pPr>
               <w:pBdr>
@@ -8756,25 +8720,61 @@
               <w:t xml:space="preserve"> </w:t>
             </w:r>
           </w:p>
-          <w:p>
-            <w:pPr>
-              <w:spacing w:before="0" w:after="0" w:line="70" w:lineRule="exact"/>
-            </w:pPr>
-            <w:r>
-              <w:rPr>
-                <w:b w:val="false"/>
-                <w:bCs w:val="false"/>
-                <w:i w:val="false"/>
-                <w:iCs w:val="false"/>
-                <w:color w:val="1A1A1A"/>
-                <w:sz w:val="2"/>
-                <w:szCs w:val="2"/>
-                <w:caps w:val="false"/>
-                <w:rFonts w:ascii="Calibri" w:cs="Calibri" w:eastAsia="Calibri" w:hAnsi="Calibri"/>
-              </w:rPr>
-              <w:t xml:space="preserve"> </w:t>
-            </w:r>
-          </w:p>
+        </w:tc>
+      </w:tr>
+      <w:tr>
+        <w:tc>
+          <w:tcPr>
+            <w:tcW w:type="dxa" w:w="2600"/>
+            <w:tcBorders>
+              <w:top w:val="single" w:color="D9D5C8" w:sz="4"/>
+              <w:left w:val="single" w:color="D9D5C8" w:sz="4"/>
+              <w:bottom w:val="single" w:color="D9D5C8" w:sz="4"/>
+              <w:right w:val="single" w:color="D9D5C8" w:sz="4"/>
+            </w:tcBorders>
+            <w:tcMar>
+              <w:top w:type="dxa" w:w="55"/>
+              <w:left w:type="dxa" w:w="110"/>
+              <w:bottom w:type="dxa" w:w="55"/>
+              <w:right w:type="dxa" w:w="110"/>
+            </w:tcMar>
+          </w:tcPr>
+          <w:p>
+            <w:pPr>
+              <w:spacing w:after="0"/>
+            </w:pPr>
+            <w:r>
+              <w:rPr>
+                <w:b/>
+                <w:bCs/>
+                <w:i w:val="false"/>
+                <w:iCs w:val="false"/>
+                <w:color w:val="1A1A1A"/>
+                <w:sz w:val="20"/>
+                <w:szCs w:val="20"/>
+                <w:caps w:val="false"/>
+                <w:rFonts w:ascii="Calibri" w:cs="Calibri" w:eastAsia="Calibri" w:hAnsi="Calibri"/>
+              </w:rPr>
+              <w:t xml:space="preserve">One source that supports it?</w:t>
+            </w:r>
+          </w:p>
+        </w:tc>
+        <w:tc>
+          <w:tcPr>
+            <w:tcW w:type="dxa" w:w="7048"/>
+            <w:tcBorders>
+              <w:top w:val="single" w:color="D9D5C8" w:sz="4"/>
+              <w:left w:val="single" w:color="D9D5C8" w:sz="4"/>
+              <w:bottom w:val="single" w:color="D9D5C8" w:sz="4"/>
+              <w:right w:val="single" w:color="D9D5C8" w:sz="4"/>
+            </w:tcBorders>
+            <w:tcMar>
+              <w:top w:type="dxa" w:w="55"/>
+              <w:left w:type="dxa" w:w="110"/>
+              <w:bottom w:type="dxa" w:w="55"/>
+              <w:right w:type="dxa" w:w="110"/>
+            </w:tcMar>
+          </w:tcPr>
           <w:p>
             <w:pPr>
               <w:pBdr>
@@ -8838,61 +8838,25 @@
               <w:t xml:space="preserve"> </w:t>
             </w:r>
           </w:p>
-        </w:tc>
-      </w:tr>
-      <w:tr>
-        <w:tc>
-          <w:tcPr>
-            <w:tcW w:type="dxa" w:w="3050"/>
-            <w:tcBorders>
-              <w:top w:val="single" w:color="D9D5C8" w:sz="4"/>
-              <w:left w:val="single" w:color="D9D5C8" w:sz="4"/>
-              <w:bottom w:val="single" w:color="D9D5C8" w:sz="4"/>
-              <w:right w:val="single" w:color="D9D5C8" w:sz="4"/>
-            </w:tcBorders>
-            <w:tcMar>
-              <w:top w:type="dxa" w:w="55"/>
-              <w:left w:type="dxa" w:w="110"/>
-              <w:bottom w:type="dxa" w:w="55"/>
-              <w:right w:type="dxa" w:w="110"/>
-            </w:tcMar>
-          </w:tcPr>
-          <w:p>
-            <w:pPr>
-              <w:spacing w:after="0"/>
-            </w:pPr>
-            <w:r>
-              <w:rPr>
-                <w:b/>
-                <w:bCs/>
-                <w:i w:val="false"/>
-                <w:iCs w:val="false"/>
-                <w:color w:val="1A1A1A"/>
-                <w:sz w:val="20"/>
-                <w:szCs w:val="20"/>
-                <w:caps w:val="false"/>
-                <w:rFonts w:ascii="Calibri" w:cs="Calibri" w:eastAsia="Calibri" w:hAnsi="Calibri"/>
-              </w:rPr>
-              <w:t xml:space="preserve">One check on executive power?</w:t>
-            </w:r>
-          </w:p>
-        </w:tc>
-        <w:tc>
-          <w:tcPr>
-            <w:tcW w:type="dxa" w:w="6598"/>
-            <w:tcBorders>
-              <w:top w:val="single" w:color="D9D5C8" w:sz="4"/>
-              <w:left w:val="single" w:color="D9D5C8" w:sz="4"/>
-              <w:bottom w:val="single" w:color="D9D5C8" w:sz="4"/>
-              <w:right w:val="single" w:color="D9D5C8" w:sz="4"/>
-            </w:tcBorders>
-            <w:tcMar>
-              <w:top w:type="dxa" w:w="55"/>
-              <w:left w:type="dxa" w:w="110"/>
-              <w:bottom w:type="dxa" w:w="55"/>
-              <w:right w:type="dxa" w:w="110"/>
-            </w:tcMar>
-          </w:tcPr>
+          <w:p>
+            <w:pPr>
+              <w:spacing w:before="0" w:after="0" w:line="70" w:lineRule="exact"/>
+            </w:pPr>
+            <w:r>
+              <w:rPr>
+                <w:b w:val="false"/>
+                <w:bCs w:val="false"/>
+                <w:i w:val="false"/>
+                <w:iCs w:val="false"/>
+                <w:color w:val="1A1A1A"/>
+                <w:sz w:val="2"/>
+                <w:szCs w:val="2"/>
+                <w:caps w:val="false"/>
+                <w:rFonts w:ascii="Calibri" w:cs="Calibri" w:eastAsia="Calibri" w:hAnsi="Calibri"/>
+              </w:rPr>
+              <w:t xml:space="preserve"> </w:t>
+            </w:r>
+          </w:p>
           <w:p>
             <w:pPr>
               <w:pBdr>
@@ -9079,61 +9043,25 @@
               <w:t xml:space="preserve"> </w:t>
             </w:r>
           </w:p>
-        </w:tc>
-      </w:tr>
-      <w:tr>
-        <w:tc>
-          <w:tcPr>
-            <w:tcW w:type="dxa" w:w="3050"/>
-            <w:tcBorders>
-              <w:top w:val="single" w:color="D9D5C8" w:sz="4"/>
-              <w:left w:val="single" w:color="D9D5C8" w:sz="4"/>
-              <w:bottom w:val="single" w:color="D9D5C8" w:sz="4"/>
-              <w:right w:val="single" w:color="D9D5C8" w:sz="4"/>
-            </w:tcBorders>
-            <w:tcMar>
-              <w:top w:type="dxa" w:w="55"/>
-              <w:left w:type="dxa" w:w="110"/>
-              <w:bottom w:type="dxa" w:w="55"/>
-              <w:right w:type="dxa" w:w="110"/>
-            </w:tcMar>
-          </w:tcPr>
-          <w:p>
-            <w:pPr>
-              <w:spacing w:after="0"/>
-            </w:pPr>
-            <w:r>
-              <w:rPr>
-                <w:b/>
-                <w:bCs/>
-                <w:i w:val="false"/>
-                <w:iCs w:val="false"/>
-                <w:color w:val="1A1A1A"/>
-                <w:sz w:val="20"/>
-                <w:szCs w:val="20"/>
-                <w:caps w:val="false"/>
-                <w:rFonts w:ascii="Calibri" w:cs="Calibri" w:eastAsia="Calibri" w:hAnsi="Calibri"/>
-              </w:rPr>
-              <w:t xml:space="preserve">Key terms →</w:t>
-            </w:r>
-          </w:p>
-        </w:tc>
-        <w:tc>
-          <w:tcPr>
-            <w:tcW w:type="dxa" w:w="6598"/>
-            <w:tcBorders>
-              <w:top w:val="single" w:color="D9D5C8" w:sz="4"/>
-              <w:left w:val="single" w:color="D9D5C8" w:sz="4"/>
-              <w:bottom w:val="single" w:color="D9D5C8" w:sz="4"/>
-              <w:right w:val="single" w:color="D9D5C8" w:sz="4"/>
-            </w:tcBorders>
-            <w:tcMar>
-              <w:top w:type="dxa" w:w="55"/>
-              <w:left w:type="dxa" w:w="110"/>
-              <w:bottom w:type="dxa" w:w="55"/>
-              <w:right w:type="dxa" w:w="110"/>
-            </w:tcMar>
-          </w:tcPr>
+          <w:p>
+            <w:pPr>
+              <w:spacing w:before="0" w:after="0" w:line="70" w:lineRule="exact"/>
+            </w:pPr>
+            <w:r>
+              <w:rPr>
+                <w:b w:val="false"/>
+                <w:bCs w:val="false"/>
+                <w:i w:val="false"/>
+                <w:iCs w:val="false"/>
+                <w:color w:val="1A1A1A"/>
+                <w:sz w:val="2"/>
+                <w:szCs w:val="2"/>
+                <w:caps w:val="false"/>
+                <w:rFonts w:ascii="Calibri" w:cs="Calibri" w:eastAsia="Calibri" w:hAnsi="Calibri"/>
+              </w:rPr>
+              <w:t xml:space="preserve"> </w:t>
+            </w:r>
+          </w:p>
           <w:p>
             <w:pPr>
               <w:pBdr>
@@ -9156,25 +9084,61 @@
               <w:t xml:space="preserve"> </w:t>
             </w:r>
           </w:p>
-          <w:p>
-            <w:pPr>
-              <w:spacing w:before="0" w:after="0" w:line="70" w:lineRule="exact"/>
-            </w:pPr>
-            <w:r>
-              <w:rPr>
-                <w:b w:val="false"/>
-                <w:bCs w:val="false"/>
-                <w:i w:val="false"/>
-                <w:iCs w:val="false"/>
-                <w:color w:val="1A1A1A"/>
-                <w:sz w:val="2"/>
-                <w:szCs w:val="2"/>
-                <w:caps w:val="false"/>
-                <w:rFonts w:ascii="Calibri" w:cs="Calibri" w:eastAsia="Calibri" w:hAnsi="Calibri"/>
-              </w:rPr>
-              <w:t xml:space="preserve"> </w:t>
-            </w:r>
-          </w:p>
+        </w:tc>
+      </w:tr>
+      <w:tr>
+        <w:tc>
+          <w:tcPr>
+            <w:tcW w:type="dxa" w:w="2600"/>
+            <w:tcBorders>
+              <w:top w:val="single" w:color="D9D5C8" w:sz="4"/>
+              <w:left w:val="single" w:color="D9D5C8" w:sz="4"/>
+              <w:bottom w:val="single" w:color="D9D5C8" w:sz="4"/>
+              <w:right w:val="single" w:color="D9D5C8" w:sz="4"/>
+            </w:tcBorders>
+            <w:tcMar>
+              <w:top w:type="dxa" w:w="55"/>
+              <w:left w:type="dxa" w:w="110"/>
+              <w:bottom w:type="dxa" w:w="55"/>
+              <w:right w:type="dxa" w:w="110"/>
+            </w:tcMar>
+          </w:tcPr>
+          <w:p>
+            <w:pPr>
+              <w:spacing w:after="0"/>
+            </w:pPr>
+            <w:r>
+              <w:rPr>
+                <w:b/>
+                <w:bCs/>
+                <w:i w:val="false"/>
+                <w:iCs w:val="false"/>
+                <w:color w:val="1A1A1A"/>
+                <w:sz w:val="20"/>
+                <w:szCs w:val="20"/>
+                <w:caps w:val="false"/>
+                <w:rFonts w:ascii="Calibri" w:cs="Calibri" w:eastAsia="Calibri" w:hAnsi="Calibri"/>
+              </w:rPr>
+              <w:t xml:space="preserve">One check on executive power?</w:t>
+            </w:r>
+          </w:p>
+        </w:tc>
+        <w:tc>
+          <w:tcPr>
+            <w:tcW w:type="dxa" w:w="7048"/>
+            <w:tcBorders>
+              <w:top w:val="single" w:color="D9D5C8" w:sz="4"/>
+              <w:left w:val="single" w:color="D9D5C8" w:sz="4"/>
+              <w:bottom w:val="single" w:color="D9D5C8" w:sz="4"/>
+              <w:right w:val="single" w:color="D9D5C8" w:sz="4"/>
+            </w:tcBorders>
+            <w:tcMar>
+              <w:top w:type="dxa" w:w="55"/>
+              <w:left w:type="dxa" w:w="110"/>
+              <w:bottom w:type="dxa" w:w="55"/>
+              <w:right w:type="dxa" w:w="110"/>
+            </w:tcMar>
+          </w:tcPr>
           <w:p>
             <w:pPr>
               <w:pBdr>
@@ -9320,9 +9284,947 @@
               <w:t xml:space="preserve"> </w:t>
             </w:r>
           </w:p>
+          <w:p>
+            <w:pPr>
+              <w:spacing w:before="0" w:after="0" w:line="70" w:lineRule="exact"/>
+            </w:pPr>
+            <w:r>
+              <w:rPr>
+                <w:b w:val="false"/>
+                <w:bCs w:val="false"/>
+                <w:i w:val="false"/>
+                <w:iCs w:val="false"/>
+                <w:color w:val="1A1A1A"/>
+                <w:sz w:val="2"/>
+                <w:szCs w:val="2"/>
+                <w:caps w:val="false"/>
+                <w:rFonts w:ascii="Calibri" w:cs="Calibri" w:eastAsia="Calibri" w:hAnsi="Calibri"/>
+              </w:rPr>
+              <w:t xml:space="preserve"> </w:t>
+            </w:r>
+          </w:p>
+          <w:p>
+            <w:pPr>
+              <w:pBdr>
+                <w:bottom w:val="single" w:color="C9C4B5" w:sz="4" w:space="3"/>
+              </w:pBdr>
+              <w:spacing w:before="0" w:after="0" w:line="255" w:lineRule="auto"/>
+            </w:pPr>
+            <w:r>
+              <w:rPr>
+                <w:b w:val="false"/>
+                <w:bCs w:val="false"/>
+                <w:i w:val="false"/>
+                <w:iCs w:val="false"/>
+                <w:color w:val="1A1A1A"/>
+                <w:sz w:val="16"/>
+                <w:szCs w:val="16"/>
+                <w:caps w:val="false"/>
+                <w:rFonts w:ascii="Calibri" w:cs="Calibri" w:eastAsia="Calibri" w:hAnsi="Calibri"/>
+              </w:rPr>
+              <w:t xml:space="preserve"> </w:t>
+            </w:r>
+          </w:p>
+          <w:p>
+            <w:pPr>
+              <w:spacing w:before="0" w:after="0" w:line="70" w:lineRule="exact"/>
+            </w:pPr>
+            <w:r>
+              <w:rPr>
+                <w:b w:val="false"/>
+                <w:bCs w:val="false"/>
+                <w:i w:val="false"/>
+                <w:iCs w:val="false"/>
+                <w:color w:val="1A1A1A"/>
+                <w:sz w:val="2"/>
+                <w:szCs w:val="2"/>
+                <w:caps w:val="false"/>
+                <w:rFonts w:ascii="Calibri" w:cs="Calibri" w:eastAsia="Calibri" w:hAnsi="Calibri"/>
+              </w:rPr>
+              <w:t xml:space="preserve"> </w:t>
+            </w:r>
+          </w:p>
+          <w:p>
+            <w:pPr>
+              <w:pBdr>
+                <w:bottom w:val="single" w:color="C9C4B5" w:sz="4" w:space="3"/>
+              </w:pBdr>
+              <w:spacing w:before="0" w:after="0" w:line="255" w:lineRule="auto"/>
+            </w:pPr>
+            <w:r>
+              <w:rPr>
+                <w:b w:val="false"/>
+                <w:bCs w:val="false"/>
+                <w:i w:val="false"/>
+                <w:iCs w:val="false"/>
+                <w:color w:val="1A1A1A"/>
+                <w:sz w:val="16"/>
+                <w:szCs w:val="16"/>
+                <w:caps w:val="false"/>
+                <w:rFonts w:ascii="Calibri" w:cs="Calibri" w:eastAsia="Calibri" w:hAnsi="Calibri"/>
+              </w:rPr>
+              <w:t xml:space="preserve"> </w:t>
+            </w:r>
+          </w:p>
+          <w:p>
+            <w:pPr>
+              <w:spacing w:before="0" w:after="0" w:line="70" w:lineRule="exact"/>
+            </w:pPr>
+            <w:r>
+              <w:rPr>
+                <w:b w:val="false"/>
+                <w:bCs w:val="false"/>
+                <w:i w:val="false"/>
+                <w:iCs w:val="false"/>
+                <w:color w:val="1A1A1A"/>
+                <w:sz w:val="2"/>
+                <w:szCs w:val="2"/>
+                <w:caps w:val="false"/>
+                <w:rFonts w:ascii="Calibri" w:cs="Calibri" w:eastAsia="Calibri" w:hAnsi="Calibri"/>
+              </w:rPr>
+              <w:t xml:space="preserve"> </w:t>
+            </w:r>
+          </w:p>
+          <w:p>
+            <w:pPr>
+              <w:pBdr>
+                <w:bottom w:val="single" w:color="C9C4B5" w:sz="4" w:space="3"/>
+              </w:pBdr>
+              <w:spacing w:before="0" w:after="0" w:line="255" w:lineRule="auto"/>
+            </w:pPr>
+            <w:r>
+              <w:rPr>
+                <w:b w:val="false"/>
+                <w:bCs w:val="false"/>
+                <w:i w:val="false"/>
+                <w:iCs w:val="false"/>
+                <w:color w:val="1A1A1A"/>
+                <w:sz w:val="16"/>
+                <w:szCs w:val="16"/>
+                <w:caps w:val="false"/>
+                <w:rFonts w:ascii="Calibri" w:cs="Calibri" w:eastAsia="Calibri" w:hAnsi="Calibri"/>
+              </w:rPr>
+              <w:t xml:space="preserve"> </w:t>
+            </w:r>
+          </w:p>
+          <w:p>
+            <w:pPr>
+              <w:spacing w:before="0" w:after="0" w:line="70" w:lineRule="exact"/>
+            </w:pPr>
+            <w:r>
+              <w:rPr>
+                <w:b w:val="false"/>
+                <w:bCs w:val="false"/>
+                <w:i w:val="false"/>
+                <w:iCs w:val="false"/>
+                <w:color w:val="1A1A1A"/>
+                <w:sz w:val="2"/>
+                <w:szCs w:val="2"/>
+                <w:caps w:val="false"/>
+                <w:rFonts w:ascii="Calibri" w:cs="Calibri" w:eastAsia="Calibri" w:hAnsi="Calibri"/>
+              </w:rPr>
+              <w:t xml:space="preserve"> </w:t>
+            </w:r>
+          </w:p>
+          <w:p>
+            <w:pPr>
+              <w:pBdr>
+                <w:bottom w:val="single" w:color="C9C4B5" w:sz="4" w:space="3"/>
+              </w:pBdr>
+              <w:spacing w:before="0" w:after="0" w:line="255" w:lineRule="auto"/>
+            </w:pPr>
+            <w:r>
+              <w:rPr>
+                <w:b w:val="false"/>
+                <w:bCs w:val="false"/>
+                <w:i w:val="false"/>
+                <w:iCs w:val="false"/>
+                <w:color w:val="1A1A1A"/>
+                <w:sz w:val="16"/>
+                <w:szCs w:val="16"/>
+                <w:caps w:val="false"/>
+                <w:rFonts w:ascii="Calibri" w:cs="Calibri" w:eastAsia="Calibri" w:hAnsi="Calibri"/>
+              </w:rPr>
+              <w:t xml:space="preserve"> </w:t>
+            </w:r>
+          </w:p>
+        </w:tc>
+      </w:tr>
+      <w:tr>
+        <w:tc>
+          <w:tcPr>
+            <w:tcW w:type="dxa" w:w="2600"/>
+            <w:tcBorders>
+              <w:top w:val="single" w:color="D9D5C8" w:sz="4"/>
+              <w:left w:val="single" w:color="D9D5C8" w:sz="4"/>
+              <w:bottom w:val="single" w:color="D9D5C8" w:sz="4"/>
+              <w:right w:val="single" w:color="D9D5C8" w:sz="4"/>
+            </w:tcBorders>
+            <w:tcMar>
+              <w:top w:type="dxa" w:w="55"/>
+              <w:left w:type="dxa" w:w="110"/>
+              <w:bottom w:type="dxa" w:w="55"/>
+              <w:right w:type="dxa" w:w="110"/>
+            </w:tcMar>
+          </w:tcPr>
+          <w:p>
+            <w:pPr>
+              <w:spacing w:after="0"/>
+            </w:pPr>
+            <w:r>
+              <w:rPr>
+                <w:b/>
+                <w:bCs/>
+                <w:i w:val="false"/>
+                <w:iCs w:val="false"/>
+                <w:color w:val="1A1A1A"/>
+                <w:sz w:val="20"/>
+                <w:szCs w:val="20"/>
+                <w:caps w:val="false"/>
+                <w:rFonts w:ascii="Calibri" w:cs="Calibri" w:eastAsia="Calibri" w:hAnsi="Calibri"/>
+              </w:rPr>
+              <w:t xml:space="preserve">Key terms →</w:t>
+            </w:r>
+          </w:p>
+        </w:tc>
+        <w:tc>
+          <w:tcPr>
+            <w:tcW w:type="dxa" w:w="7048"/>
+            <w:tcBorders>
+              <w:top w:val="single" w:color="D9D5C8" w:sz="4"/>
+              <w:left w:val="single" w:color="D9D5C8" w:sz="4"/>
+              <w:bottom w:val="single" w:color="D9D5C8" w:sz="4"/>
+              <w:right w:val="single" w:color="D9D5C8" w:sz="4"/>
+            </w:tcBorders>
+            <w:tcMar>
+              <w:top w:type="dxa" w:w="55"/>
+              <w:left w:type="dxa" w:w="110"/>
+              <w:bottom w:type="dxa" w:w="55"/>
+              <w:right w:type="dxa" w:w="110"/>
+            </w:tcMar>
+          </w:tcPr>
+          <w:p>
+            <w:pPr>
+              <w:pBdr>
+                <w:bottom w:val="single" w:color="C9C4B5" w:sz="4" w:space="3"/>
+              </w:pBdr>
+              <w:spacing w:before="0" w:after="0" w:line="255" w:lineRule="auto"/>
+            </w:pPr>
+            <w:r>
+              <w:rPr>
+                <w:b w:val="false"/>
+                <w:bCs w:val="false"/>
+                <w:i w:val="false"/>
+                <w:iCs w:val="false"/>
+                <w:color w:val="1A1A1A"/>
+                <w:sz w:val="16"/>
+                <w:szCs w:val="16"/>
+                <w:caps w:val="false"/>
+                <w:rFonts w:ascii="Calibri" w:cs="Calibri" w:eastAsia="Calibri" w:hAnsi="Calibri"/>
+              </w:rPr>
+              <w:t xml:space="preserve"> </w:t>
+            </w:r>
+          </w:p>
+          <w:p>
+            <w:pPr>
+              <w:spacing w:before="0" w:after="0" w:line="70" w:lineRule="exact"/>
+            </w:pPr>
+            <w:r>
+              <w:rPr>
+                <w:b w:val="false"/>
+                <w:bCs w:val="false"/>
+                <w:i w:val="false"/>
+                <w:iCs w:val="false"/>
+                <w:color w:val="1A1A1A"/>
+                <w:sz w:val="2"/>
+                <w:szCs w:val="2"/>
+                <w:caps w:val="false"/>
+                <w:rFonts w:ascii="Calibri" w:cs="Calibri" w:eastAsia="Calibri" w:hAnsi="Calibri"/>
+              </w:rPr>
+              <w:t xml:space="preserve"> </w:t>
+            </w:r>
+          </w:p>
+          <w:p>
+            <w:pPr>
+              <w:pBdr>
+                <w:bottom w:val="single" w:color="C9C4B5" w:sz="4" w:space="3"/>
+              </w:pBdr>
+              <w:spacing w:before="0" w:after="0" w:line="255" w:lineRule="auto"/>
+            </w:pPr>
+            <w:r>
+              <w:rPr>
+                <w:b w:val="false"/>
+                <w:bCs w:val="false"/>
+                <w:i w:val="false"/>
+                <w:iCs w:val="false"/>
+                <w:color w:val="1A1A1A"/>
+                <w:sz w:val="16"/>
+                <w:szCs w:val="16"/>
+                <w:caps w:val="false"/>
+                <w:rFonts w:ascii="Calibri" w:cs="Calibri" w:eastAsia="Calibri" w:hAnsi="Calibri"/>
+              </w:rPr>
+              <w:t xml:space="preserve"> </w:t>
+            </w:r>
+          </w:p>
+          <w:p>
+            <w:pPr>
+              <w:spacing w:before="0" w:after="0" w:line="70" w:lineRule="exact"/>
+            </w:pPr>
+            <w:r>
+              <w:rPr>
+                <w:b w:val="false"/>
+                <w:bCs w:val="false"/>
+                <w:i w:val="false"/>
+                <w:iCs w:val="false"/>
+                <w:color w:val="1A1A1A"/>
+                <w:sz w:val="2"/>
+                <w:szCs w:val="2"/>
+                <w:caps w:val="false"/>
+                <w:rFonts w:ascii="Calibri" w:cs="Calibri" w:eastAsia="Calibri" w:hAnsi="Calibri"/>
+              </w:rPr>
+              <w:t xml:space="preserve"> </w:t>
+            </w:r>
+          </w:p>
+          <w:p>
+            <w:pPr>
+              <w:pBdr>
+                <w:bottom w:val="single" w:color="C9C4B5" w:sz="4" w:space="3"/>
+              </w:pBdr>
+              <w:spacing w:before="0" w:after="0" w:line="255" w:lineRule="auto"/>
+            </w:pPr>
+            <w:r>
+              <w:rPr>
+                <w:b w:val="false"/>
+                <w:bCs w:val="false"/>
+                <w:i w:val="false"/>
+                <w:iCs w:val="false"/>
+                <w:color w:val="1A1A1A"/>
+                <w:sz w:val="16"/>
+                <w:szCs w:val="16"/>
+                <w:caps w:val="false"/>
+                <w:rFonts w:ascii="Calibri" w:cs="Calibri" w:eastAsia="Calibri" w:hAnsi="Calibri"/>
+              </w:rPr>
+              <w:t xml:space="preserve"> </w:t>
+            </w:r>
+          </w:p>
+          <w:p>
+            <w:pPr>
+              <w:spacing w:before="0" w:after="0" w:line="70" w:lineRule="exact"/>
+            </w:pPr>
+            <w:r>
+              <w:rPr>
+                <w:b w:val="false"/>
+                <w:bCs w:val="false"/>
+                <w:i w:val="false"/>
+                <w:iCs w:val="false"/>
+                <w:color w:val="1A1A1A"/>
+                <w:sz w:val="2"/>
+                <w:szCs w:val="2"/>
+                <w:caps w:val="false"/>
+                <w:rFonts w:ascii="Calibri" w:cs="Calibri" w:eastAsia="Calibri" w:hAnsi="Calibri"/>
+              </w:rPr>
+              <w:t xml:space="preserve"> </w:t>
+            </w:r>
+          </w:p>
+          <w:p>
+            <w:pPr>
+              <w:pBdr>
+                <w:bottom w:val="single" w:color="C9C4B5" w:sz="4" w:space="3"/>
+              </w:pBdr>
+              <w:spacing w:before="0" w:after="0" w:line="255" w:lineRule="auto"/>
+            </w:pPr>
+            <w:r>
+              <w:rPr>
+                <w:b w:val="false"/>
+                <w:bCs w:val="false"/>
+                <w:i w:val="false"/>
+                <w:iCs w:val="false"/>
+                <w:color w:val="1A1A1A"/>
+                <w:sz w:val="16"/>
+                <w:szCs w:val="16"/>
+                <w:caps w:val="false"/>
+                <w:rFonts w:ascii="Calibri" w:cs="Calibri" w:eastAsia="Calibri" w:hAnsi="Calibri"/>
+              </w:rPr>
+              <w:t xml:space="preserve"> </w:t>
+            </w:r>
+          </w:p>
+          <w:p>
+            <w:pPr>
+              <w:spacing w:before="0" w:after="0" w:line="70" w:lineRule="exact"/>
+            </w:pPr>
+            <w:r>
+              <w:rPr>
+                <w:b w:val="false"/>
+                <w:bCs w:val="false"/>
+                <w:i w:val="false"/>
+                <w:iCs w:val="false"/>
+                <w:color w:val="1A1A1A"/>
+                <w:sz w:val="2"/>
+                <w:szCs w:val="2"/>
+                <w:caps w:val="false"/>
+                <w:rFonts w:ascii="Calibri" w:cs="Calibri" w:eastAsia="Calibri" w:hAnsi="Calibri"/>
+              </w:rPr>
+              <w:t xml:space="preserve"> </w:t>
+            </w:r>
+          </w:p>
+          <w:p>
+            <w:pPr>
+              <w:pBdr>
+                <w:bottom w:val="single" w:color="C9C4B5" w:sz="4" w:space="3"/>
+              </w:pBdr>
+              <w:spacing w:before="0" w:after="0" w:line="255" w:lineRule="auto"/>
+            </w:pPr>
+            <w:r>
+              <w:rPr>
+                <w:b w:val="false"/>
+                <w:bCs w:val="false"/>
+                <w:i w:val="false"/>
+                <w:iCs w:val="false"/>
+                <w:color w:val="1A1A1A"/>
+                <w:sz w:val="16"/>
+                <w:szCs w:val="16"/>
+                <w:caps w:val="false"/>
+                <w:rFonts w:ascii="Calibri" w:cs="Calibri" w:eastAsia="Calibri" w:hAnsi="Calibri"/>
+              </w:rPr>
+              <w:t xml:space="preserve"> </w:t>
+            </w:r>
+          </w:p>
+          <w:p>
+            <w:pPr>
+              <w:spacing w:before="0" w:after="0" w:line="70" w:lineRule="exact"/>
+            </w:pPr>
+            <w:r>
+              <w:rPr>
+                <w:b w:val="false"/>
+                <w:bCs w:val="false"/>
+                <w:i w:val="false"/>
+                <w:iCs w:val="false"/>
+                <w:color w:val="1A1A1A"/>
+                <w:sz w:val="2"/>
+                <w:szCs w:val="2"/>
+                <w:caps w:val="false"/>
+                <w:rFonts w:ascii="Calibri" w:cs="Calibri" w:eastAsia="Calibri" w:hAnsi="Calibri"/>
+              </w:rPr>
+              <w:t xml:space="preserve"> </w:t>
+            </w:r>
+          </w:p>
+          <w:p>
+            <w:pPr>
+              <w:pBdr>
+                <w:bottom w:val="single" w:color="C9C4B5" w:sz="4" w:space="3"/>
+              </w:pBdr>
+              <w:spacing w:before="0" w:after="0" w:line="255" w:lineRule="auto"/>
+            </w:pPr>
+            <w:r>
+              <w:rPr>
+                <w:b w:val="false"/>
+                <w:bCs w:val="false"/>
+                <w:i w:val="false"/>
+                <w:iCs w:val="false"/>
+                <w:color w:val="1A1A1A"/>
+                <w:sz w:val="16"/>
+                <w:szCs w:val="16"/>
+                <w:caps w:val="false"/>
+                <w:rFonts w:ascii="Calibri" w:cs="Calibri" w:eastAsia="Calibri" w:hAnsi="Calibri"/>
+              </w:rPr>
+              <w:t xml:space="preserve"> </w:t>
+            </w:r>
+          </w:p>
+          <w:p>
+            <w:pPr>
+              <w:spacing w:before="0" w:after="0" w:line="70" w:lineRule="exact"/>
+            </w:pPr>
+            <w:r>
+              <w:rPr>
+                <w:b w:val="false"/>
+                <w:bCs w:val="false"/>
+                <w:i w:val="false"/>
+                <w:iCs w:val="false"/>
+                <w:color w:val="1A1A1A"/>
+                <w:sz w:val="2"/>
+                <w:szCs w:val="2"/>
+                <w:caps w:val="false"/>
+                <w:rFonts w:ascii="Calibri" w:cs="Calibri" w:eastAsia="Calibri" w:hAnsi="Calibri"/>
+              </w:rPr>
+              <w:t xml:space="preserve"> </w:t>
+            </w:r>
+          </w:p>
+          <w:p>
+            <w:pPr>
+              <w:pBdr>
+                <w:bottom w:val="single" w:color="C9C4B5" w:sz="4" w:space="3"/>
+              </w:pBdr>
+              <w:spacing w:before="0" w:after="0" w:line="255" w:lineRule="auto"/>
+            </w:pPr>
+            <w:r>
+              <w:rPr>
+                <w:b w:val="false"/>
+                <w:bCs w:val="false"/>
+                <w:i w:val="false"/>
+                <w:iCs w:val="false"/>
+                <w:color w:val="1A1A1A"/>
+                <w:sz w:val="16"/>
+                <w:szCs w:val="16"/>
+                <w:caps w:val="false"/>
+                <w:rFonts w:ascii="Calibri" w:cs="Calibri" w:eastAsia="Calibri" w:hAnsi="Calibri"/>
+              </w:rPr>
+              <w:t xml:space="preserve"> </w:t>
+            </w:r>
+          </w:p>
+          <w:p>
+            <w:pPr>
+              <w:spacing w:before="0" w:after="0" w:line="70" w:lineRule="exact"/>
+            </w:pPr>
+            <w:r>
+              <w:rPr>
+                <w:b w:val="false"/>
+                <w:bCs w:val="false"/>
+                <w:i w:val="false"/>
+                <w:iCs w:val="false"/>
+                <w:color w:val="1A1A1A"/>
+                <w:sz w:val="2"/>
+                <w:szCs w:val="2"/>
+                <w:caps w:val="false"/>
+                <w:rFonts w:ascii="Calibri" w:cs="Calibri" w:eastAsia="Calibri" w:hAnsi="Calibri"/>
+              </w:rPr>
+              <w:t xml:space="preserve"> </w:t>
+            </w:r>
+          </w:p>
+          <w:p>
+            <w:pPr>
+              <w:pBdr>
+                <w:bottom w:val="single" w:color="C9C4B5" w:sz="4" w:space="3"/>
+              </w:pBdr>
+              <w:spacing w:before="0" w:after="0" w:line="255" w:lineRule="auto"/>
+            </w:pPr>
+            <w:r>
+              <w:rPr>
+                <w:b w:val="false"/>
+                <w:bCs w:val="false"/>
+                <w:i w:val="false"/>
+                <w:iCs w:val="false"/>
+                <w:color w:val="1A1A1A"/>
+                <w:sz w:val="16"/>
+                <w:szCs w:val="16"/>
+                <w:caps w:val="false"/>
+                <w:rFonts w:ascii="Calibri" w:cs="Calibri" w:eastAsia="Calibri" w:hAnsi="Calibri"/>
+              </w:rPr>
+              <w:t xml:space="preserve"> </w:t>
+            </w:r>
+          </w:p>
         </w:tc>
       </w:tr>
     </w:tbl>
+    <w:p>
+      <w:pPr>
+        <w:spacing w:before="100" w:after="30"/>
+      </w:pPr>
+      <w:r>
+        <w:rPr>
+          <w:b w:val="false"/>
+          <w:bCs w:val="false"/>
+          <w:i/>
+          <w:iCs/>
+          <w:color w:val="6B7280"/>
+          <w:sz w:val="19"/>
+          <w:szCs w:val="19"/>
+          <w:caps w:val="false"/>
+          <w:rFonts w:ascii="Calibri" w:cs="Calibri" w:eastAsia="Calibri" w:hAnsi="Calibri"/>
+        </w:rPr>
+        <w:t xml:space="preserve">Keep taking notes — lines run the full width of the page:</w:t>
+      </w:r>
+    </w:p>
+    <w:p>
+      <w:pPr>
+        <w:pBdr>
+          <w:bottom w:val="single" w:color="C9C4B5" w:sz="4" w:space="3"/>
+        </w:pBdr>
+        <w:spacing w:before="0" w:after="0" w:line="255" w:lineRule="auto"/>
+      </w:pPr>
+      <w:r>
+        <w:rPr>
+          <w:b w:val="false"/>
+          <w:bCs w:val="false"/>
+          <w:i w:val="false"/>
+          <w:iCs w:val="false"/>
+          <w:color w:val="1A1A1A"/>
+          <w:sz w:val="16"/>
+          <w:szCs w:val="16"/>
+          <w:caps w:val="false"/>
+          <w:rFonts w:ascii="Calibri" w:cs="Calibri" w:eastAsia="Calibri" w:hAnsi="Calibri"/>
+        </w:rPr>
+        <w:t xml:space="preserve"> </w:t>
+      </w:r>
+    </w:p>
+    <w:p>
+      <w:pPr>
+        <w:spacing w:before="0" w:after="0" w:line="70" w:lineRule="exact"/>
+      </w:pPr>
+      <w:r>
+        <w:rPr>
+          <w:b w:val="false"/>
+          <w:bCs w:val="false"/>
+          <w:i w:val="false"/>
+          <w:iCs w:val="false"/>
+          <w:color w:val="1A1A1A"/>
+          <w:sz w:val="2"/>
+          <w:szCs w:val="2"/>
+          <w:caps w:val="false"/>
+          <w:rFonts w:ascii="Calibri" w:cs="Calibri" w:eastAsia="Calibri" w:hAnsi="Calibri"/>
+        </w:rPr>
+        <w:t xml:space="preserve"> </w:t>
+      </w:r>
+    </w:p>
+    <w:p>
+      <w:pPr>
+        <w:pBdr>
+          <w:bottom w:val="single" w:color="C9C4B5" w:sz="4" w:space="3"/>
+        </w:pBdr>
+        <w:spacing w:before="0" w:after="0" w:line="255" w:lineRule="auto"/>
+      </w:pPr>
+      <w:r>
+        <w:rPr>
+          <w:b w:val="false"/>
+          <w:bCs w:val="false"/>
+          <w:i w:val="false"/>
+          <w:iCs w:val="false"/>
+          <w:color w:val="1A1A1A"/>
+          <w:sz w:val="16"/>
+          <w:szCs w:val="16"/>
+          <w:caps w:val="false"/>
+          <w:rFonts w:ascii="Calibri" w:cs="Calibri" w:eastAsia="Calibri" w:hAnsi="Calibri"/>
+        </w:rPr>
+        <w:t xml:space="preserve"> </w:t>
+      </w:r>
+    </w:p>
+    <w:p>
+      <w:pPr>
+        <w:spacing w:before="0" w:after="0" w:line="70" w:lineRule="exact"/>
+      </w:pPr>
+      <w:r>
+        <w:rPr>
+          <w:b w:val="false"/>
+          <w:bCs w:val="false"/>
+          <w:i w:val="false"/>
+          <w:iCs w:val="false"/>
+          <w:color w:val="1A1A1A"/>
+          <w:sz w:val="2"/>
+          <w:szCs w:val="2"/>
+          <w:caps w:val="false"/>
+          <w:rFonts w:ascii="Calibri" w:cs="Calibri" w:eastAsia="Calibri" w:hAnsi="Calibri"/>
+        </w:rPr>
+        <w:t xml:space="preserve"> </w:t>
+      </w:r>
+    </w:p>
+    <w:p>
+      <w:pPr>
+        <w:pBdr>
+          <w:bottom w:val="single" w:color="C9C4B5" w:sz="4" w:space="3"/>
+        </w:pBdr>
+        <w:spacing w:before="0" w:after="0" w:line="255" w:lineRule="auto"/>
+      </w:pPr>
+      <w:r>
+        <w:rPr>
+          <w:b w:val="false"/>
+          <w:bCs w:val="false"/>
+          <w:i w:val="false"/>
+          <w:iCs w:val="false"/>
+          <w:color w:val="1A1A1A"/>
+          <w:sz w:val="16"/>
+          <w:szCs w:val="16"/>
+          <w:caps w:val="false"/>
+          <w:rFonts w:ascii="Calibri" w:cs="Calibri" w:eastAsia="Calibri" w:hAnsi="Calibri"/>
+        </w:rPr>
+        <w:t xml:space="preserve"> </w:t>
+      </w:r>
+    </w:p>
+    <w:p>
+      <w:pPr>
+        <w:spacing w:before="0" w:after="0" w:line="70" w:lineRule="exact"/>
+      </w:pPr>
+      <w:r>
+        <w:rPr>
+          <w:b w:val="false"/>
+          <w:bCs w:val="false"/>
+          <w:i w:val="false"/>
+          <w:iCs w:val="false"/>
+          <w:color w:val="1A1A1A"/>
+          <w:sz w:val="2"/>
+          <w:szCs w:val="2"/>
+          <w:caps w:val="false"/>
+          <w:rFonts w:ascii="Calibri" w:cs="Calibri" w:eastAsia="Calibri" w:hAnsi="Calibri"/>
+        </w:rPr>
+        <w:t xml:space="preserve"> </w:t>
+      </w:r>
+    </w:p>
+    <w:p>
+      <w:pPr>
+        <w:pBdr>
+          <w:bottom w:val="single" w:color="C9C4B5" w:sz="4" w:space="3"/>
+        </w:pBdr>
+        <w:spacing w:before="0" w:after="0" w:line="255" w:lineRule="auto"/>
+      </w:pPr>
+      <w:r>
+        <w:rPr>
+          <w:b w:val="false"/>
+          <w:bCs w:val="false"/>
+          <w:i w:val="false"/>
+          <w:iCs w:val="false"/>
+          <w:color w:val="1A1A1A"/>
+          <w:sz w:val="16"/>
+          <w:szCs w:val="16"/>
+          <w:caps w:val="false"/>
+          <w:rFonts w:ascii="Calibri" w:cs="Calibri" w:eastAsia="Calibri" w:hAnsi="Calibri"/>
+        </w:rPr>
+        <w:t xml:space="preserve"> </w:t>
+      </w:r>
+    </w:p>
+    <w:p>
+      <w:pPr>
+        <w:spacing w:before="0" w:after="0" w:line="70" w:lineRule="exact"/>
+      </w:pPr>
+      <w:r>
+        <w:rPr>
+          <w:b w:val="false"/>
+          <w:bCs w:val="false"/>
+          <w:i w:val="false"/>
+          <w:iCs w:val="false"/>
+          <w:color w:val="1A1A1A"/>
+          <w:sz w:val="2"/>
+          <w:szCs w:val="2"/>
+          <w:caps w:val="false"/>
+          <w:rFonts w:ascii="Calibri" w:cs="Calibri" w:eastAsia="Calibri" w:hAnsi="Calibri"/>
+        </w:rPr>
+        <w:t xml:space="preserve"> </w:t>
+      </w:r>
+    </w:p>
+    <w:p>
+      <w:pPr>
+        <w:pBdr>
+          <w:bottom w:val="single" w:color="C9C4B5" w:sz="4" w:space="3"/>
+        </w:pBdr>
+        <w:spacing w:before="0" w:after="0" w:line="255" w:lineRule="auto"/>
+      </w:pPr>
+      <w:r>
+        <w:rPr>
+          <w:b w:val="false"/>
+          <w:bCs w:val="false"/>
+          <w:i w:val="false"/>
+          <w:iCs w:val="false"/>
+          <w:color w:val="1A1A1A"/>
+          <w:sz w:val="16"/>
+          <w:szCs w:val="16"/>
+          <w:caps w:val="false"/>
+          <w:rFonts w:ascii="Calibri" w:cs="Calibri" w:eastAsia="Calibri" w:hAnsi="Calibri"/>
+        </w:rPr>
+        <w:t xml:space="preserve"> </w:t>
+      </w:r>
+    </w:p>
+    <w:p>
+      <w:pPr>
+        <w:spacing w:before="0" w:after="0" w:line="70" w:lineRule="exact"/>
+      </w:pPr>
+      <w:r>
+        <w:rPr>
+          <w:b w:val="false"/>
+          <w:bCs w:val="false"/>
+          <w:i w:val="false"/>
+          <w:iCs w:val="false"/>
+          <w:color w:val="1A1A1A"/>
+          <w:sz w:val="2"/>
+          <w:szCs w:val="2"/>
+          <w:caps w:val="false"/>
+          <w:rFonts w:ascii="Calibri" w:cs="Calibri" w:eastAsia="Calibri" w:hAnsi="Calibri"/>
+        </w:rPr>
+        <w:t xml:space="preserve"> </w:t>
+      </w:r>
+    </w:p>
+    <w:p>
+      <w:pPr>
+        <w:pBdr>
+          <w:bottom w:val="single" w:color="C9C4B5" w:sz="4" w:space="3"/>
+        </w:pBdr>
+        <w:spacing w:before="0" w:after="0" w:line="255" w:lineRule="auto"/>
+      </w:pPr>
+      <w:r>
+        <w:rPr>
+          <w:b w:val="false"/>
+          <w:bCs w:val="false"/>
+          <w:i w:val="false"/>
+          <w:iCs w:val="false"/>
+          <w:color w:val="1A1A1A"/>
+          <w:sz w:val="16"/>
+          <w:szCs w:val="16"/>
+          <w:caps w:val="false"/>
+          <w:rFonts w:ascii="Calibri" w:cs="Calibri" w:eastAsia="Calibri" w:hAnsi="Calibri"/>
+        </w:rPr>
+        <w:t xml:space="preserve"> </w:t>
+      </w:r>
+    </w:p>
+    <w:p>
+      <w:pPr>
+        <w:spacing w:before="0" w:after="0" w:line="70" w:lineRule="exact"/>
+      </w:pPr>
+      <w:r>
+        <w:rPr>
+          <w:b w:val="false"/>
+          <w:bCs w:val="false"/>
+          <w:i w:val="false"/>
+          <w:iCs w:val="false"/>
+          <w:color w:val="1A1A1A"/>
+          <w:sz w:val="2"/>
+          <w:szCs w:val="2"/>
+          <w:caps w:val="false"/>
+          <w:rFonts w:ascii="Calibri" w:cs="Calibri" w:eastAsia="Calibri" w:hAnsi="Calibri"/>
+        </w:rPr>
+        <w:t xml:space="preserve"> </w:t>
+      </w:r>
+    </w:p>
+    <w:p>
+      <w:pPr>
+        <w:pBdr>
+          <w:bottom w:val="single" w:color="C9C4B5" w:sz="4" w:space="3"/>
+        </w:pBdr>
+        <w:spacing w:before="0" w:after="0" w:line="255" w:lineRule="auto"/>
+      </w:pPr>
+      <w:r>
+        <w:rPr>
+          <w:b w:val="false"/>
+          <w:bCs w:val="false"/>
+          <w:i w:val="false"/>
+          <w:iCs w:val="false"/>
+          <w:color w:val="1A1A1A"/>
+          <w:sz w:val="16"/>
+          <w:szCs w:val="16"/>
+          <w:caps w:val="false"/>
+          <w:rFonts w:ascii="Calibri" w:cs="Calibri" w:eastAsia="Calibri" w:hAnsi="Calibri"/>
+        </w:rPr>
+        <w:t xml:space="preserve"> </w:t>
+      </w:r>
+    </w:p>
+    <w:p>
+      <w:pPr>
+        <w:spacing w:before="0" w:after="0" w:line="70" w:lineRule="exact"/>
+      </w:pPr>
+      <w:r>
+        <w:rPr>
+          <w:b w:val="false"/>
+          <w:bCs w:val="false"/>
+          <w:i w:val="false"/>
+          <w:iCs w:val="false"/>
+          <w:color w:val="1A1A1A"/>
+          <w:sz w:val="2"/>
+          <w:szCs w:val="2"/>
+          <w:caps w:val="false"/>
+          <w:rFonts w:ascii="Calibri" w:cs="Calibri" w:eastAsia="Calibri" w:hAnsi="Calibri"/>
+        </w:rPr>
+        <w:t xml:space="preserve"> </w:t>
+      </w:r>
+    </w:p>
+    <w:p>
+      <w:pPr>
+        <w:pBdr>
+          <w:bottom w:val="single" w:color="C9C4B5" w:sz="4" w:space="3"/>
+        </w:pBdr>
+        <w:spacing w:before="0" w:after="0" w:line="255" w:lineRule="auto"/>
+      </w:pPr>
+      <w:r>
+        <w:rPr>
+          <w:b w:val="false"/>
+          <w:bCs w:val="false"/>
+          <w:i w:val="false"/>
+          <w:iCs w:val="false"/>
+          <w:color w:val="1A1A1A"/>
+          <w:sz w:val="16"/>
+          <w:szCs w:val="16"/>
+          <w:caps w:val="false"/>
+          <w:rFonts w:ascii="Calibri" w:cs="Calibri" w:eastAsia="Calibri" w:hAnsi="Calibri"/>
+        </w:rPr>
+        <w:t xml:space="preserve"> </w:t>
+      </w:r>
+    </w:p>
+    <w:p>
+      <w:pPr>
+        <w:spacing w:before="0" w:after="0" w:line="70" w:lineRule="exact"/>
+      </w:pPr>
+      <w:r>
+        <w:rPr>
+          <w:b w:val="false"/>
+          <w:bCs w:val="false"/>
+          <w:i w:val="false"/>
+          <w:iCs w:val="false"/>
+          <w:color w:val="1A1A1A"/>
+          <w:sz w:val="2"/>
+          <w:szCs w:val="2"/>
+          <w:caps w:val="false"/>
+          <w:rFonts w:ascii="Calibri" w:cs="Calibri" w:eastAsia="Calibri" w:hAnsi="Calibri"/>
+        </w:rPr>
+        <w:t xml:space="preserve"> </w:t>
+      </w:r>
+    </w:p>
+    <w:p>
+      <w:pPr>
+        <w:pBdr>
+          <w:bottom w:val="single" w:color="C9C4B5" w:sz="4" w:space="3"/>
+        </w:pBdr>
+        <w:spacing w:before="0" w:after="0" w:line="255" w:lineRule="auto"/>
+      </w:pPr>
+      <w:r>
+        <w:rPr>
+          <w:b w:val="false"/>
+          <w:bCs w:val="false"/>
+          <w:i w:val="false"/>
+          <w:iCs w:val="false"/>
+          <w:color w:val="1A1A1A"/>
+          <w:sz w:val="16"/>
+          <w:szCs w:val="16"/>
+          <w:caps w:val="false"/>
+          <w:rFonts w:ascii="Calibri" w:cs="Calibri" w:eastAsia="Calibri" w:hAnsi="Calibri"/>
+        </w:rPr>
+        <w:t xml:space="preserve"> </w:t>
+      </w:r>
+    </w:p>
+    <w:p>
+      <w:pPr>
+        <w:spacing w:before="0" w:after="0" w:line="70" w:lineRule="exact"/>
+      </w:pPr>
+      <w:r>
+        <w:rPr>
+          <w:b w:val="false"/>
+          <w:bCs w:val="false"/>
+          <w:i w:val="false"/>
+          <w:iCs w:val="false"/>
+          <w:color w:val="1A1A1A"/>
+          <w:sz w:val="2"/>
+          <w:szCs w:val="2"/>
+          <w:caps w:val="false"/>
+          <w:rFonts w:ascii="Calibri" w:cs="Calibri" w:eastAsia="Calibri" w:hAnsi="Calibri"/>
+        </w:rPr>
+        <w:t xml:space="preserve"> </w:t>
+      </w:r>
+    </w:p>
+    <w:p>
+      <w:pPr>
+        <w:pBdr>
+          <w:bottom w:val="single" w:color="C9C4B5" w:sz="4" w:space="3"/>
+        </w:pBdr>
+        <w:spacing w:before="0" w:after="0" w:line="255" w:lineRule="auto"/>
+      </w:pPr>
+      <w:r>
+        <w:rPr>
+          <w:b w:val="false"/>
+          <w:bCs w:val="false"/>
+          <w:i w:val="false"/>
+          <w:iCs w:val="false"/>
+          <w:color w:val="1A1A1A"/>
+          <w:sz w:val="16"/>
+          <w:szCs w:val="16"/>
+          <w:caps w:val="false"/>
+          <w:rFonts w:ascii="Calibri" w:cs="Calibri" w:eastAsia="Calibri" w:hAnsi="Calibri"/>
+        </w:rPr>
+        <w:t xml:space="preserve"> </w:t>
+      </w:r>
+    </w:p>
     <w:tbl>
       <w:tblPr>
         <w:tblW w:type="dxa" w:w="9648"/>
@@ -23379,8 +24281,8 @@
         </w:tblBorders>
       </w:tblPr>
       <w:tblGrid>
-        <w:gridCol w:w="3050"/>
-        <w:gridCol w:w="6598"/>
+        <w:gridCol w:w="2600"/>
+        <w:gridCol w:w="7048"/>
       </w:tblGrid>
       <w:tr>
         <w:trPr>
@@ -23388,7 +24290,7 @@
         </w:trPr>
         <w:tc>
           <w:tcPr>
-            <w:tcW w:type="dxa" w:w="3050"/>
+            <w:tcW w:type="dxa" w:w="2600"/>
             <w:tcBorders>
               <w:top w:val="single" w:color="D9D5C8" w:sz="4"/>
               <w:left w:val="single" w:color="D9D5C8" w:sz="4"/>
@@ -23419,13 +24321,13 @@
                 <w:caps w:val="false"/>
                 <w:rFonts w:ascii="Calibri" w:cs="Calibri" w:eastAsia="Calibri" w:hAnsi="Calibri"/>
               </w:rPr>
-              <w:t xml:space="preserve">Cues (tied to your learning targets)</w:t>
-            </w:r>
-          </w:p>
-        </w:tc>
-        <w:tc>
-          <w:tcPr>
-            <w:tcW w:type="dxa" w:w="6598"/>
+              <w:t xml:space="preserve">Cue Column — questions &amp; key terms</w:t>
+            </w:r>
+          </w:p>
+        </w:tc>
+        <w:tc>
+          <w:tcPr>
+            <w:tcW w:type="dxa" w:w="7048"/>
             <w:tcBorders>
               <w:top w:val="single" w:color="D9D5C8" w:sz="4"/>
               <w:left w:val="single" w:color="D9D5C8" w:sz="4"/>
@@ -23456,7 +24358,7 @@
                 <w:caps w:val="false"/>
                 <w:rFonts w:ascii="Calibri" w:cs="Calibri" w:eastAsia="Calibri" w:hAnsi="Calibri"/>
               </w:rPr>
-              <w:t xml:space="preserve">My notes</w:t>
+              <w:t xml:space="preserve">Note-Taking Column — write your notes here</w:t>
             </w:r>
           </w:p>
         </w:tc>
@@ -23464,7 +24366,7 @@
       <w:tr>
         <w:tc>
           <w:tcPr>
-            <w:tcW w:type="dxa" w:w="3050"/>
+            <w:tcW w:type="dxa" w:w="2600"/>
             <w:tcBorders>
               <w:top w:val="single" w:color="D9D5C8" w:sz="4"/>
               <w:left w:val="single" w:color="D9D5C8" w:sz="4"/>
@@ -23500,7 +24402,7 @@
         </w:tc>
         <w:tc>
           <w:tcPr>
-            <w:tcW w:type="dxa" w:w="6598"/>
+            <w:tcW w:type="dxa" w:w="7048"/>
             <w:tcBorders>
               <w:top w:val="single" w:color="D9D5C8" w:sz="4"/>
               <w:left w:val="single" w:color="D9D5C8" w:sz="4"/>
@@ -23700,61 +24602,25 @@
               <w:t xml:space="preserve"> </w:t>
             </w:r>
           </w:p>
-        </w:tc>
-      </w:tr>
-      <w:tr>
-        <w:tc>
-          <w:tcPr>
-            <w:tcW w:type="dxa" w:w="3050"/>
-            <w:tcBorders>
-              <w:top w:val="single" w:color="D9D5C8" w:sz="4"/>
-              <w:left w:val="single" w:color="D9D5C8" w:sz="4"/>
-              <w:bottom w:val="single" w:color="D9D5C8" w:sz="4"/>
-              <w:right w:val="single" w:color="D9D5C8" w:sz="4"/>
-            </w:tcBorders>
-            <w:tcMar>
-              <w:top w:type="dxa" w:w="55"/>
-              <w:left w:type="dxa" w:w="110"/>
-              <w:bottom w:type="dxa" w:w="55"/>
-              <w:right w:type="dxa" w:w="110"/>
-            </w:tcMar>
-          </w:tcPr>
-          <w:p>
-            <w:pPr>
-              <w:spacing w:after="0"/>
-            </w:pPr>
-            <w:r>
-              <w:rPr>
-                <w:b/>
-                <w:bCs/>
-                <w:i w:val="false"/>
-                <w:iCs w:val="false"/>
-                <w:color w:val="1A1A1A"/>
-                <w:sz w:val="20"/>
-                <w:szCs w:val="20"/>
-                <w:caps w:val="false"/>
-                <w:rFonts w:ascii="Calibri" w:cs="Calibri" w:eastAsia="Calibri" w:hAnsi="Calibri"/>
-              </w:rPr>
-              <w:t xml:space="preserve">One source that supports it?</w:t>
-            </w:r>
-          </w:p>
-        </w:tc>
-        <w:tc>
-          <w:tcPr>
-            <w:tcW w:type="dxa" w:w="6598"/>
-            <w:tcBorders>
-              <w:top w:val="single" w:color="D9D5C8" w:sz="4"/>
-              <w:left w:val="single" w:color="D9D5C8" w:sz="4"/>
-              <w:bottom w:val="single" w:color="D9D5C8" w:sz="4"/>
-              <w:right w:val="single" w:color="D9D5C8" w:sz="4"/>
-            </w:tcBorders>
-            <w:tcMar>
-              <w:top w:type="dxa" w:w="55"/>
-              <w:left w:type="dxa" w:w="110"/>
-              <w:bottom w:type="dxa" w:w="55"/>
-              <w:right w:type="dxa" w:w="110"/>
-            </w:tcMar>
-          </w:tcPr>
+          <w:p>
+            <w:pPr>
+              <w:spacing w:before="0" w:after="0" w:line="70" w:lineRule="exact"/>
+            </w:pPr>
+            <w:r>
+              <w:rPr>
+                <w:b w:val="false"/>
+                <w:bCs w:val="false"/>
+                <w:i w:val="false"/>
+                <w:iCs w:val="false"/>
+                <w:color w:val="1A1A1A"/>
+                <w:sz w:val="2"/>
+                <w:szCs w:val="2"/>
+                <w:caps w:val="false"/>
+                <w:rFonts w:ascii="Calibri" w:cs="Calibri" w:eastAsia="Calibri" w:hAnsi="Calibri"/>
+              </w:rPr>
+              <w:t xml:space="preserve"> </w:t>
+            </w:r>
+          </w:p>
           <w:p>
             <w:pPr>
               <w:pBdr>
@@ -23859,25 +24725,61 @@
               <w:t xml:space="preserve"> </w:t>
             </w:r>
           </w:p>
-          <w:p>
-            <w:pPr>
-              <w:spacing w:before="0" w:after="0" w:line="70" w:lineRule="exact"/>
-            </w:pPr>
-            <w:r>
-              <w:rPr>
-                <w:b w:val="false"/>
-                <w:bCs w:val="false"/>
-                <w:i w:val="false"/>
-                <w:iCs w:val="false"/>
-                <w:color w:val="1A1A1A"/>
-                <w:sz w:val="2"/>
-                <w:szCs w:val="2"/>
-                <w:caps w:val="false"/>
-                <w:rFonts w:ascii="Calibri" w:cs="Calibri" w:eastAsia="Calibri" w:hAnsi="Calibri"/>
-              </w:rPr>
-              <w:t xml:space="preserve"> </w:t>
-            </w:r>
-          </w:p>
+        </w:tc>
+      </w:tr>
+      <w:tr>
+        <w:tc>
+          <w:tcPr>
+            <w:tcW w:type="dxa" w:w="2600"/>
+            <w:tcBorders>
+              <w:top w:val="single" w:color="D9D5C8" w:sz="4"/>
+              <w:left w:val="single" w:color="D9D5C8" w:sz="4"/>
+              <w:bottom w:val="single" w:color="D9D5C8" w:sz="4"/>
+              <w:right w:val="single" w:color="D9D5C8" w:sz="4"/>
+            </w:tcBorders>
+            <w:tcMar>
+              <w:top w:type="dxa" w:w="55"/>
+              <w:left w:type="dxa" w:w="110"/>
+              <w:bottom w:type="dxa" w:w="55"/>
+              <w:right w:type="dxa" w:w="110"/>
+            </w:tcMar>
+          </w:tcPr>
+          <w:p>
+            <w:pPr>
+              <w:spacing w:after="0"/>
+            </w:pPr>
+            <w:r>
+              <w:rPr>
+                <w:b/>
+                <w:bCs/>
+                <w:i w:val="false"/>
+                <w:iCs w:val="false"/>
+                <w:color w:val="1A1A1A"/>
+                <w:sz w:val="20"/>
+                <w:szCs w:val="20"/>
+                <w:caps w:val="false"/>
+                <w:rFonts w:ascii="Calibri" w:cs="Calibri" w:eastAsia="Calibri" w:hAnsi="Calibri"/>
+              </w:rPr>
+              <w:t xml:space="preserve">One source that supports it?</w:t>
+            </w:r>
+          </w:p>
+        </w:tc>
+        <w:tc>
+          <w:tcPr>
+            <w:tcW w:type="dxa" w:w="7048"/>
+            <w:tcBorders>
+              <w:top w:val="single" w:color="D9D5C8" w:sz="4"/>
+              <w:left w:val="single" w:color="D9D5C8" w:sz="4"/>
+              <w:bottom w:val="single" w:color="D9D5C8" w:sz="4"/>
+              <w:right w:val="single" w:color="D9D5C8" w:sz="4"/>
+            </w:tcBorders>
+            <w:tcMar>
+              <w:top w:type="dxa" w:w="55"/>
+              <w:left w:type="dxa" w:w="110"/>
+              <w:bottom w:type="dxa" w:w="55"/>
+              <w:right w:type="dxa" w:w="110"/>
+            </w:tcMar>
+          </w:tcPr>
           <w:p>
             <w:pPr>
               <w:pBdr>
@@ -23941,61 +24843,25 @@
               <w:t xml:space="preserve"> </w:t>
             </w:r>
           </w:p>
-        </w:tc>
-      </w:tr>
-      <w:tr>
-        <w:tc>
-          <w:tcPr>
-            <w:tcW w:type="dxa" w:w="3050"/>
-            <w:tcBorders>
-              <w:top w:val="single" w:color="D9D5C8" w:sz="4"/>
-              <w:left w:val="single" w:color="D9D5C8" w:sz="4"/>
-              <w:bottom w:val="single" w:color="D9D5C8" w:sz="4"/>
-              <w:right w:val="single" w:color="D9D5C8" w:sz="4"/>
-            </w:tcBorders>
-            <w:tcMar>
-              <w:top w:type="dxa" w:w="55"/>
-              <w:left w:type="dxa" w:w="110"/>
-              <w:bottom w:type="dxa" w:w="55"/>
-              <w:right w:type="dxa" w:w="110"/>
-            </w:tcMar>
-          </w:tcPr>
-          <w:p>
-            <w:pPr>
-              <w:spacing w:after="0"/>
-            </w:pPr>
-            <w:r>
-              <w:rPr>
-                <w:b/>
-                <w:bCs/>
-                <w:i w:val="false"/>
-                <w:iCs w:val="false"/>
-                <w:color w:val="1A1A1A"/>
-                <w:sz w:val="20"/>
-                <w:szCs w:val="20"/>
-                <w:caps w:val="false"/>
-                <w:rFonts w:ascii="Calibri" w:cs="Calibri" w:eastAsia="Calibri" w:hAnsi="Calibri"/>
-              </w:rPr>
-              <w:t xml:space="preserve">One check on executive power?</w:t>
-            </w:r>
-          </w:p>
-        </w:tc>
-        <w:tc>
-          <w:tcPr>
-            <w:tcW w:type="dxa" w:w="6598"/>
-            <w:tcBorders>
-              <w:top w:val="single" w:color="D9D5C8" w:sz="4"/>
-              <w:left w:val="single" w:color="D9D5C8" w:sz="4"/>
-              <w:bottom w:val="single" w:color="D9D5C8" w:sz="4"/>
-              <w:right w:val="single" w:color="D9D5C8" w:sz="4"/>
-            </w:tcBorders>
-            <w:tcMar>
-              <w:top w:type="dxa" w:w="55"/>
-              <w:left w:type="dxa" w:w="110"/>
-              <w:bottom w:type="dxa" w:w="55"/>
-              <w:right w:type="dxa" w:w="110"/>
-            </w:tcMar>
-          </w:tcPr>
+          <w:p>
+            <w:pPr>
+              <w:spacing w:before="0" w:after="0" w:line="70" w:lineRule="exact"/>
+            </w:pPr>
+            <w:r>
+              <w:rPr>
+                <w:b w:val="false"/>
+                <w:bCs w:val="false"/>
+                <w:i w:val="false"/>
+                <w:iCs w:val="false"/>
+                <w:color w:val="1A1A1A"/>
+                <w:sz w:val="2"/>
+                <w:szCs w:val="2"/>
+                <w:caps w:val="false"/>
+                <w:rFonts w:ascii="Calibri" w:cs="Calibri" w:eastAsia="Calibri" w:hAnsi="Calibri"/>
+              </w:rPr>
+              <w:t xml:space="preserve"> </w:t>
+            </w:r>
+          </w:p>
           <w:p>
             <w:pPr>
               <w:pBdr>
@@ -24182,61 +25048,25 @@
               <w:t xml:space="preserve"> </w:t>
             </w:r>
           </w:p>
-        </w:tc>
-      </w:tr>
-      <w:tr>
-        <w:tc>
-          <w:tcPr>
-            <w:tcW w:type="dxa" w:w="3050"/>
-            <w:tcBorders>
-              <w:top w:val="single" w:color="D9D5C8" w:sz="4"/>
-              <w:left w:val="single" w:color="D9D5C8" w:sz="4"/>
-              <w:bottom w:val="single" w:color="D9D5C8" w:sz="4"/>
-              <w:right w:val="single" w:color="D9D5C8" w:sz="4"/>
-            </w:tcBorders>
-            <w:tcMar>
-              <w:top w:type="dxa" w:w="55"/>
-              <w:left w:type="dxa" w:w="110"/>
-              <w:bottom w:type="dxa" w:w="55"/>
-              <w:right w:type="dxa" w:w="110"/>
-            </w:tcMar>
-          </w:tcPr>
-          <w:p>
-            <w:pPr>
-              <w:spacing w:after="0"/>
-            </w:pPr>
-            <w:r>
-              <w:rPr>
-                <w:b/>
-                <w:bCs/>
-                <w:i w:val="false"/>
-                <w:iCs w:val="false"/>
-                <w:color w:val="1A1A1A"/>
-                <w:sz w:val="20"/>
-                <w:szCs w:val="20"/>
-                <w:caps w:val="false"/>
-                <w:rFonts w:ascii="Calibri" w:cs="Calibri" w:eastAsia="Calibri" w:hAnsi="Calibri"/>
-              </w:rPr>
-              <w:t xml:space="preserve">Key terms →</w:t>
-            </w:r>
-          </w:p>
-        </w:tc>
-        <w:tc>
-          <w:tcPr>
-            <w:tcW w:type="dxa" w:w="6598"/>
-            <w:tcBorders>
-              <w:top w:val="single" w:color="D9D5C8" w:sz="4"/>
-              <w:left w:val="single" w:color="D9D5C8" w:sz="4"/>
-              <w:bottom w:val="single" w:color="D9D5C8" w:sz="4"/>
-              <w:right w:val="single" w:color="D9D5C8" w:sz="4"/>
-            </w:tcBorders>
-            <w:tcMar>
-              <w:top w:type="dxa" w:w="55"/>
-              <w:left w:type="dxa" w:w="110"/>
-              <w:bottom w:type="dxa" w:w="55"/>
-              <w:right w:type="dxa" w:w="110"/>
-            </w:tcMar>
-          </w:tcPr>
+          <w:p>
+            <w:pPr>
+              <w:spacing w:before="0" w:after="0" w:line="70" w:lineRule="exact"/>
+            </w:pPr>
+            <w:r>
+              <w:rPr>
+                <w:b w:val="false"/>
+                <w:bCs w:val="false"/>
+                <w:i w:val="false"/>
+                <w:iCs w:val="false"/>
+                <w:color w:val="1A1A1A"/>
+                <w:sz w:val="2"/>
+                <w:szCs w:val="2"/>
+                <w:caps w:val="false"/>
+                <w:rFonts w:ascii="Calibri" w:cs="Calibri" w:eastAsia="Calibri" w:hAnsi="Calibri"/>
+              </w:rPr>
+              <w:t xml:space="preserve"> </w:t>
+            </w:r>
+          </w:p>
           <w:p>
             <w:pPr>
               <w:pBdr>
@@ -24259,25 +25089,61 @@
               <w:t xml:space="preserve"> </w:t>
             </w:r>
           </w:p>
-          <w:p>
-            <w:pPr>
-              <w:spacing w:before="0" w:after="0" w:line="70" w:lineRule="exact"/>
-            </w:pPr>
-            <w:r>
-              <w:rPr>
-                <w:b w:val="false"/>
-                <w:bCs w:val="false"/>
-                <w:i w:val="false"/>
-                <w:iCs w:val="false"/>
-                <w:color w:val="1A1A1A"/>
-                <w:sz w:val="2"/>
-                <w:szCs w:val="2"/>
-                <w:caps w:val="false"/>
-                <w:rFonts w:ascii="Calibri" w:cs="Calibri" w:eastAsia="Calibri" w:hAnsi="Calibri"/>
-              </w:rPr>
-              <w:t xml:space="preserve"> </w:t>
-            </w:r>
-          </w:p>
+        </w:tc>
+      </w:tr>
+      <w:tr>
+        <w:tc>
+          <w:tcPr>
+            <w:tcW w:type="dxa" w:w="2600"/>
+            <w:tcBorders>
+              <w:top w:val="single" w:color="D9D5C8" w:sz="4"/>
+              <w:left w:val="single" w:color="D9D5C8" w:sz="4"/>
+              <w:bottom w:val="single" w:color="D9D5C8" w:sz="4"/>
+              <w:right w:val="single" w:color="D9D5C8" w:sz="4"/>
+            </w:tcBorders>
+            <w:tcMar>
+              <w:top w:type="dxa" w:w="55"/>
+              <w:left w:type="dxa" w:w="110"/>
+              <w:bottom w:type="dxa" w:w="55"/>
+              <w:right w:type="dxa" w:w="110"/>
+            </w:tcMar>
+          </w:tcPr>
+          <w:p>
+            <w:pPr>
+              <w:spacing w:after="0"/>
+            </w:pPr>
+            <w:r>
+              <w:rPr>
+                <w:b/>
+                <w:bCs/>
+                <w:i w:val="false"/>
+                <w:iCs w:val="false"/>
+                <w:color w:val="1A1A1A"/>
+                <w:sz w:val="20"/>
+                <w:szCs w:val="20"/>
+                <w:caps w:val="false"/>
+                <w:rFonts w:ascii="Calibri" w:cs="Calibri" w:eastAsia="Calibri" w:hAnsi="Calibri"/>
+              </w:rPr>
+              <w:t xml:space="preserve">One check on executive power?</w:t>
+            </w:r>
+          </w:p>
+        </w:tc>
+        <w:tc>
+          <w:tcPr>
+            <w:tcW w:type="dxa" w:w="7048"/>
+            <w:tcBorders>
+              <w:top w:val="single" w:color="D9D5C8" w:sz="4"/>
+              <w:left w:val="single" w:color="D9D5C8" w:sz="4"/>
+              <w:bottom w:val="single" w:color="D9D5C8" w:sz="4"/>
+              <w:right w:val="single" w:color="D9D5C8" w:sz="4"/>
+            </w:tcBorders>
+            <w:tcMar>
+              <w:top w:type="dxa" w:w="55"/>
+              <w:left w:type="dxa" w:w="110"/>
+              <w:bottom w:type="dxa" w:w="55"/>
+              <w:right w:type="dxa" w:w="110"/>
+            </w:tcMar>
+          </w:tcPr>
           <w:p>
             <w:pPr>
               <w:pBdr>
@@ -24423,9 +25289,947 @@
               <w:t xml:space="preserve"> </w:t>
             </w:r>
           </w:p>
+          <w:p>
+            <w:pPr>
+              <w:spacing w:before="0" w:after="0" w:line="70" w:lineRule="exact"/>
+            </w:pPr>
+            <w:r>
+              <w:rPr>
+                <w:b w:val="false"/>
+                <w:bCs w:val="false"/>
+                <w:i w:val="false"/>
+                <w:iCs w:val="false"/>
+                <w:color w:val="1A1A1A"/>
+                <w:sz w:val="2"/>
+                <w:szCs w:val="2"/>
+                <w:caps w:val="false"/>
+                <w:rFonts w:ascii="Calibri" w:cs="Calibri" w:eastAsia="Calibri" w:hAnsi="Calibri"/>
+              </w:rPr>
+              <w:t xml:space="preserve"> </w:t>
+            </w:r>
+          </w:p>
+          <w:p>
+            <w:pPr>
+              <w:pBdr>
+                <w:bottom w:val="single" w:color="C9C4B5" w:sz="4" w:space="3"/>
+              </w:pBdr>
+              <w:spacing w:before="0" w:after="0" w:line="255" w:lineRule="auto"/>
+            </w:pPr>
+            <w:r>
+              <w:rPr>
+                <w:b w:val="false"/>
+                <w:bCs w:val="false"/>
+                <w:i w:val="false"/>
+                <w:iCs w:val="false"/>
+                <w:color w:val="1A1A1A"/>
+                <w:sz w:val="16"/>
+                <w:szCs w:val="16"/>
+                <w:caps w:val="false"/>
+                <w:rFonts w:ascii="Calibri" w:cs="Calibri" w:eastAsia="Calibri" w:hAnsi="Calibri"/>
+              </w:rPr>
+              <w:t xml:space="preserve"> </w:t>
+            </w:r>
+          </w:p>
+          <w:p>
+            <w:pPr>
+              <w:spacing w:before="0" w:after="0" w:line="70" w:lineRule="exact"/>
+            </w:pPr>
+            <w:r>
+              <w:rPr>
+                <w:b w:val="false"/>
+                <w:bCs w:val="false"/>
+                <w:i w:val="false"/>
+                <w:iCs w:val="false"/>
+                <w:color w:val="1A1A1A"/>
+                <w:sz w:val="2"/>
+                <w:szCs w:val="2"/>
+                <w:caps w:val="false"/>
+                <w:rFonts w:ascii="Calibri" w:cs="Calibri" w:eastAsia="Calibri" w:hAnsi="Calibri"/>
+              </w:rPr>
+              <w:t xml:space="preserve"> </w:t>
+            </w:r>
+          </w:p>
+          <w:p>
+            <w:pPr>
+              <w:pBdr>
+                <w:bottom w:val="single" w:color="C9C4B5" w:sz="4" w:space="3"/>
+              </w:pBdr>
+              <w:spacing w:before="0" w:after="0" w:line="255" w:lineRule="auto"/>
+            </w:pPr>
+            <w:r>
+              <w:rPr>
+                <w:b w:val="false"/>
+                <w:bCs w:val="false"/>
+                <w:i w:val="false"/>
+                <w:iCs w:val="false"/>
+                <w:color w:val="1A1A1A"/>
+                <w:sz w:val="16"/>
+                <w:szCs w:val="16"/>
+                <w:caps w:val="false"/>
+                <w:rFonts w:ascii="Calibri" w:cs="Calibri" w:eastAsia="Calibri" w:hAnsi="Calibri"/>
+              </w:rPr>
+              <w:t xml:space="preserve"> </w:t>
+            </w:r>
+          </w:p>
+          <w:p>
+            <w:pPr>
+              <w:spacing w:before="0" w:after="0" w:line="70" w:lineRule="exact"/>
+            </w:pPr>
+            <w:r>
+              <w:rPr>
+                <w:b w:val="false"/>
+                <w:bCs w:val="false"/>
+                <w:i w:val="false"/>
+                <w:iCs w:val="false"/>
+                <w:color w:val="1A1A1A"/>
+                <w:sz w:val="2"/>
+                <w:szCs w:val="2"/>
+                <w:caps w:val="false"/>
+                <w:rFonts w:ascii="Calibri" w:cs="Calibri" w:eastAsia="Calibri" w:hAnsi="Calibri"/>
+              </w:rPr>
+              <w:t xml:space="preserve"> </w:t>
+            </w:r>
+          </w:p>
+          <w:p>
+            <w:pPr>
+              <w:pBdr>
+                <w:bottom w:val="single" w:color="C9C4B5" w:sz="4" w:space="3"/>
+              </w:pBdr>
+              <w:spacing w:before="0" w:after="0" w:line="255" w:lineRule="auto"/>
+            </w:pPr>
+            <w:r>
+              <w:rPr>
+                <w:b w:val="false"/>
+                <w:bCs w:val="false"/>
+                <w:i w:val="false"/>
+                <w:iCs w:val="false"/>
+                <w:color w:val="1A1A1A"/>
+                <w:sz w:val="16"/>
+                <w:szCs w:val="16"/>
+                <w:caps w:val="false"/>
+                <w:rFonts w:ascii="Calibri" w:cs="Calibri" w:eastAsia="Calibri" w:hAnsi="Calibri"/>
+              </w:rPr>
+              <w:t xml:space="preserve"> </w:t>
+            </w:r>
+          </w:p>
+          <w:p>
+            <w:pPr>
+              <w:spacing w:before="0" w:after="0" w:line="70" w:lineRule="exact"/>
+            </w:pPr>
+            <w:r>
+              <w:rPr>
+                <w:b w:val="false"/>
+                <w:bCs w:val="false"/>
+                <w:i w:val="false"/>
+                <w:iCs w:val="false"/>
+                <w:color w:val="1A1A1A"/>
+                <w:sz w:val="2"/>
+                <w:szCs w:val="2"/>
+                <w:caps w:val="false"/>
+                <w:rFonts w:ascii="Calibri" w:cs="Calibri" w:eastAsia="Calibri" w:hAnsi="Calibri"/>
+              </w:rPr>
+              <w:t xml:space="preserve"> </w:t>
+            </w:r>
+          </w:p>
+          <w:p>
+            <w:pPr>
+              <w:pBdr>
+                <w:bottom w:val="single" w:color="C9C4B5" w:sz="4" w:space="3"/>
+              </w:pBdr>
+              <w:spacing w:before="0" w:after="0" w:line="255" w:lineRule="auto"/>
+            </w:pPr>
+            <w:r>
+              <w:rPr>
+                <w:b w:val="false"/>
+                <w:bCs w:val="false"/>
+                <w:i w:val="false"/>
+                <w:iCs w:val="false"/>
+                <w:color w:val="1A1A1A"/>
+                <w:sz w:val="16"/>
+                <w:szCs w:val="16"/>
+                <w:caps w:val="false"/>
+                <w:rFonts w:ascii="Calibri" w:cs="Calibri" w:eastAsia="Calibri" w:hAnsi="Calibri"/>
+              </w:rPr>
+              <w:t xml:space="preserve"> </w:t>
+            </w:r>
+          </w:p>
+        </w:tc>
+      </w:tr>
+      <w:tr>
+        <w:tc>
+          <w:tcPr>
+            <w:tcW w:type="dxa" w:w="2600"/>
+            <w:tcBorders>
+              <w:top w:val="single" w:color="D9D5C8" w:sz="4"/>
+              <w:left w:val="single" w:color="D9D5C8" w:sz="4"/>
+              <w:bottom w:val="single" w:color="D9D5C8" w:sz="4"/>
+              <w:right w:val="single" w:color="D9D5C8" w:sz="4"/>
+            </w:tcBorders>
+            <w:tcMar>
+              <w:top w:type="dxa" w:w="55"/>
+              <w:left w:type="dxa" w:w="110"/>
+              <w:bottom w:type="dxa" w:w="55"/>
+              <w:right w:type="dxa" w:w="110"/>
+            </w:tcMar>
+          </w:tcPr>
+          <w:p>
+            <w:pPr>
+              <w:spacing w:after="0"/>
+            </w:pPr>
+            <w:r>
+              <w:rPr>
+                <w:b/>
+                <w:bCs/>
+                <w:i w:val="false"/>
+                <w:iCs w:val="false"/>
+                <w:color w:val="1A1A1A"/>
+                <w:sz w:val="20"/>
+                <w:szCs w:val="20"/>
+                <w:caps w:val="false"/>
+                <w:rFonts w:ascii="Calibri" w:cs="Calibri" w:eastAsia="Calibri" w:hAnsi="Calibri"/>
+              </w:rPr>
+              <w:t xml:space="preserve">Key terms →</w:t>
+            </w:r>
+          </w:p>
+        </w:tc>
+        <w:tc>
+          <w:tcPr>
+            <w:tcW w:type="dxa" w:w="7048"/>
+            <w:tcBorders>
+              <w:top w:val="single" w:color="D9D5C8" w:sz="4"/>
+              <w:left w:val="single" w:color="D9D5C8" w:sz="4"/>
+              <w:bottom w:val="single" w:color="D9D5C8" w:sz="4"/>
+              <w:right w:val="single" w:color="D9D5C8" w:sz="4"/>
+            </w:tcBorders>
+            <w:tcMar>
+              <w:top w:type="dxa" w:w="55"/>
+              <w:left w:type="dxa" w:w="110"/>
+              <w:bottom w:type="dxa" w:w="55"/>
+              <w:right w:type="dxa" w:w="110"/>
+            </w:tcMar>
+          </w:tcPr>
+          <w:p>
+            <w:pPr>
+              <w:pBdr>
+                <w:bottom w:val="single" w:color="C9C4B5" w:sz="4" w:space="3"/>
+              </w:pBdr>
+              <w:spacing w:before="0" w:after="0" w:line="255" w:lineRule="auto"/>
+            </w:pPr>
+            <w:r>
+              <w:rPr>
+                <w:b w:val="false"/>
+                <w:bCs w:val="false"/>
+                <w:i w:val="false"/>
+                <w:iCs w:val="false"/>
+                <w:color w:val="1A1A1A"/>
+                <w:sz w:val="16"/>
+                <w:szCs w:val="16"/>
+                <w:caps w:val="false"/>
+                <w:rFonts w:ascii="Calibri" w:cs="Calibri" w:eastAsia="Calibri" w:hAnsi="Calibri"/>
+              </w:rPr>
+              <w:t xml:space="preserve"> </w:t>
+            </w:r>
+          </w:p>
+          <w:p>
+            <w:pPr>
+              <w:spacing w:before="0" w:after="0" w:line="70" w:lineRule="exact"/>
+            </w:pPr>
+            <w:r>
+              <w:rPr>
+                <w:b w:val="false"/>
+                <w:bCs w:val="false"/>
+                <w:i w:val="false"/>
+                <w:iCs w:val="false"/>
+                <w:color w:val="1A1A1A"/>
+                <w:sz w:val="2"/>
+                <w:szCs w:val="2"/>
+                <w:caps w:val="false"/>
+                <w:rFonts w:ascii="Calibri" w:cs="Calibri" w:eastAsia="Calibri" w:hAnsi="Calibri"/>
+              </w:rPr>
+              <w:t xml:space="preserve"> </w:t>
+            </w:r>
+          </w:p>
+          <w:p>
+            <w:pPr>
+              <w:pBdr>
+                <w:bottom w:val="single" w:color="C9C4B5" w:sz="4" w:space="3"/>
+              </w:pBdr>
+              <w:spacing w:before="0" w:after="0" w:line="255" w:lineRule="auto"/>
+            </w:pPr>
+            <w:r>
+              <w:rPr>
+                <w:b w:val="false"/>
+                <w:bCs w:val="false"/>
+                <w:i w:val="false"/>
+                <w:iCs w:val="false"/>
+                <w:color w:val="1A1A1A"/>
+                <w:sz w:val="16"/>
+                <w:szCs w:val="16"/>
+                <w:caps w:val="false"/>
+                <w:rFonts w:ascii="Calibri" w:cs="Calibri" w:eastAsia="Calibri" w:hAnsi="Calibri"/>
+              </w:rPr>
+              <w:t xml:space="preserve"> </w:t>
+            </w:r>
+          </w:p>
+          <w:p>
+            <w:pPr>
+              <w:spacing w:before="0" w:after="0" w:line="70" w:lineRule="exact"/>
+            </w:pPr>
+            <w:r>
+              <w:rPr>
+                <w:b w:val="false"/>
+                <w:bCs w:val="false"/>
+                <w:i w:val="false"/>
+                <w:iCs w:val="false"/>
+                <w:color w:val="1A1A1A"/>
+                <w:sz w:val="2"/>
+                <w:szCs w:val="2"/>
+                <w:caps w:val="false"/>
+                <w:rFonts w:ascii="Calibri" w:cs="Calibri" w:eastAsia="Calibri" w:hAnsi="Calibri"/>
+              </w:rPr>
+              <w:t xml:space="preserve"> </w:t>
+            </w:r>
+          </w:p>
+          <w:p>
+            <w:pPr>
+              <w:pBdr>
+                <w:bottom w:val="single" w:color="C9C4B5" w:sz="4" w:space="3"/>
+              </w:pBdr>
+              <w:spacing w:before="0" w:after="0" w:line="255" w:lineRule="auto"/>
+            </w:pPr>
+            <w:r>
+              <w:rPr>
+                <w:b w:val="false"/>
+                <w:bCs w:val="false"/>
+                <w:i w:val="false"/>
+                <w:iCs w:val="false"/>
+                <w:color w:val="1A1A1A"/>
+                <w:sz w:val="16"/>
+                <w:szCs w:val="16"/>
+                <w:caps w:val="false"/>
+                <w:rFonts w:ascii="Calibri" w:cs="Calibri" w:eastAsia="Calibri" w:hAnsi="Calibri"/>
+              </w:rPr>
+              <w:t xml:space="preserve"> </w:t>
+            </w:r>
+          </w:p>
+          <w:p>
+            <w:pPr>
+              <w:spacing w:before="0" w:after="0" w:line="70" w:lineRule="exact"/>
+            </w:pPr>
+            <w:r>
+              <w:rPr>
+                <w:b w:val="false"/>
+                <w:bCs w:val="false"/>
+                <w:i w:val="false"/>
+                <w:iCs w:val="false"/>
+                <w:color w:val="1A1A1A"/>
+                <w:sz w:val="2"/>
+                <w:szCs w:val="2"/>
+                <w:caps w:val="false"/>
+                <w:rFonts w:ascii="Calibri" w:cs="Calibri" w:eastAsia="Calibri" w:hAnsi="Calibri"/>
+              </w:rPr>
+              <w:t xml:space="preserve"> </w:t>
+            </w:r>
+          </w:p>
+          <w:p>
+            <w:pPr>
+              <w:pBdr>
+                <w:bottom w:val="single" w:color="C9C4B5" w:sz="4" w:space="3"/>
+              </w:pBdr>
+              <w:spacing w:before="0" w:after="0" w:line="255" w:lineRule="auto"/>
+            </w:pPr>
+            <w:r>
+              <w:rPr>
+                <w:b w:val="false"/>
+                <w:bCs w:val="false"/>
+                <w:i w:val="false"/>
+                <w:iCs w:val="false"/>
+                <w:color w:val="1A1A1A"/>
+                <w:sz w:val="16"/>
+                <w:szCs w:val="16"/>
+                <w:caps w:val="false"/>
+                <w:rFonts w:ascii="Calibri" w:cs="Calibri" w:eastAsia="Calibri" w:hAnsi="Calibri"/>
+              </w:rPr>
+              <w:t xml:space="preserve"> </w:t>
+            </w:r>
+          </w:p>
+          <w:p>
+            <w:pPr>
+              <w:spacing w:before="0" w:after="0" w:line="70" w:lineRule="exact"/>
+            </w:pPr>
+            <w:r>
+              <w:rPr>
+                <w:b w:val="false"/>
+                <w:bCs w:val="false"/>
+                <w:i w:val="false"/>
+                <w:iCs w:val="false"/>
+                <w:color w:val="1A1A1A"/>
+                <w:sz w:val="2"/>
+                <w:szCs w:val="2"/>
+                <w:caps w:val="false"/>
+                <w:rFonts w:ascii="Calibri" w:cs="Calibri" w:eastAsia="Calibri" w:hAnsi="Calibri"/>
+              </w:rPr>
+              <w:t xml:space="preserve"> </w:t>
+            </w:r>
+          </w:p>
+          <w:p>
+            <w:pPr>
+              <w:pBdr>
+                <w:bottom w:val="single" w:color="C9C4B5" w:sz="4" w:space="3"/>
+              </w:pBdr>
+              <w:spacing w:before="0" w:after="0" w:line="255" w:lineRule="auto"/>
+            </w:pPr>
+            <w:r>
+              <w:rPr>
+                <w:b w:val="false"/>
+                <w:bCs w:val="false"/>
+                <w:i w:val="false"/>
+                <w:iCs w:val="false"/>
+                <w:color w:val="1A1A1A"/>
+                <w:sz w:val="16"/>
+                <w:szCs w:val="16"/>
+                <w:caps w:val="false"/>
+                <w:rFonts w:ascii="Calibri" w:cs="Calibri" w:eastAsia="Calibri" w:hAnsi="Calibri"/>
+              </w:rPr>
+              <w:t xml:space="preserve"> </w:t>
+            </w:r>
+          </w:p>
+          <w:p>
+            <w:pPr>
+              <w:spacing w:before="0" w:after="0" w:line="70" w:lineRule="exact"/>
+            </w:pPr>
+            <w:r>
+              <w:rPr>
+                <w:b w:val="false"/>
+                <w:bCs w:val="false"/>
+                <w:i w:val="false"/>
+                <w:iCs w:val="false"/>
+                <w:color w:val="1A1A1A"/>
+                <w:sz w:val="2"/>
+                <w:szCs w:val="2"/>
+                <w:caps w:val="false"/>
+                <w:rFonts w:ascii="Calibri" w:cs="Calibri" w:eastAsia="Calibri" w:hAnsi="Calibri"/>
+              </w:rPr>
+              <w:t xml:space="preserve"> </w:t>
+            </w:r>
+          </w:p>
+          <w:p>
+            <w:pPr>
+              <w:pBdr>
+                <w:bottom w:val="single" w:color="C9C4B5" w:sz="4" w:space="3"/>
+              </w:pBdr>
+              <w:spacing w:before="0" w:after="0" w:line="255" w:lineRule="auto"/>
+            </w:pPr>
+            <w:r>
+              <w:rPr>
+                <w:b w:val="false"/>
+                <w:bCs w:val="false"/>
+                <w:i w:val="false"/>
+                <w:iCs w:val="false"/>
+                <w:color w:val="1A1A1A"/>
+                <w:sz w:val="16"/>
+                <w:szCs w:val="16"/>
+                <w:caps w:val="false"/>
+                <w:rFonts w:ascii="Calibri" w:cs="Calibri" w:eastAsia="Calibri" w:hAnsi="Calibri"/>
+              </w:rPr>
+              <w:t xml:space="preserve"> </w:t>
+            </w:r>
+          </w:p>
+          <w:p>
+            <w:pPr>
+              <w:spacing w:before="0" w:after="0" w:line="70" w:lineRule="exact"/>
+            </w:pPr>
+            <w:r>
+              <w:rPr>
+                <w:b w:val="false"/>
+                <w:bCs w:val="false"/>
+                <w:i w:val="false"/>
+                <w:iCs w:val="false"/>
+                <w:color w:val="1A1A1A"/>
+                <w:sz w:val="2"/>
+                <w:szCs w:val="2"/>
+                <w:caps w:val="false"/>
+                <w:rFonts w:ascii="Calibri" w:cs="Calibri" w:eastAsia="Calibri" w:hAnsi="Calibri"/>
+              </w:rPr>
+              <w:t xml:space="preserve"> </w:t>
+            </w:r>
+          </w:p>
+          <w:p>
+            <w:pPr>
+              <w:pBdr>
+                <w:bottom w:val="single" w:color="C9C4B5" w:sz="4" w:space="3"/>
+              </w:pBdr>
+              <w:spacing w:before="0" w:after="0" w:line="255" w:lineRule="auto"/>
+            </w:pPr>
+            <w:r>
+              <w:rPr>
+                <w:b w:val="false"/>
+                <w:bCs w:val="false"/>
+                <w:i w:val="false"/>
+                <w:iCs w:val="false"/>
+                <w:color w:val="1A1A1A"/>
+                <w:sz w:val="16"/>
+                <w:szCs w:val="16"/>
+                <w:caps w:val="false"/>
+                <w:rFonts w:ascii="Calibri" w:cs="Calibri" w:eastAsia="Calibri" w:hAnsi="Calibri"/>
+              </w:rPr>
+              <w:t xml:space="preserve"> </w:t>
+            </w:r>
+          </w:p>
+          <w:p>
+            <w:pPr>
+              <w:spacing w:before="0" w:after="0" w:line="70" w:lineRule="exact"/>
+            </w:pPr>
+            <w:r>
+              <w:rPr>
+                <w:b w:val="false"/>
+                <w:bCs w:val="false"/>
+                <w:i w:val="false"/>
+                <w:iCs w:val="false"/>
+                <w:color w:val="1A1A1A"/>
+                <w:sz w:val="2"/>
+                <w:szCs w:val="2"/>
+                <w:caps w:val="false"/>
+                <w:rFonts w:ascii="Calibri" w:cs="Calibri" w:eastAsia="Calibri" w:hAnsi="Calibri"/>
+              </w:rPr>
+              <w:t xml:space="preserve"> </w:t>
+            </w:r>
+          </w:p>
+          <w:p>
+            <w:pPr>
+              <w:pBdr>
+                <w:bottom w:val="single" w:color="C9C4B5" w:sz="4" w:space="3"/>
+              </w:pBdr>
+              <w:spacing w:before="0" w:after="0" w:line="255" w:lineRule="auto"/>
+            </w:pPr>
+            <w:r>
+              <w:rPr>
+                <w:b w:val="false"/>
+                <w:bCs w:val="false"/>
+                <w:i w:val="false"/>
+                <w:iCs w:val="false"/>
+                <w:color w:val="1A1A1A"/>
+                <w:sz w:val="16"/>
+                <w:szCs w:val="16"/>
+                <w:caps w:val="false"/>
+                <w:rFonts w:ascii="Calibri" w:cs="Calibri" w:eastAsia="Calibri" w:hAnsi="Calibri"/>
+              </w:rPr>
+              <w:t xml:space="preserve"> </w:t>
+            </w:r>
+          </w:p>
         </w:tc>
       </w:tr>
     </w:tbl>
+    <w:p>
+      <w:pPr>
+        <w:spacing w:before="100" w:after="30"/>
+      </w:pPr>
+      <w:r>
+        <w:rPr>
+          <w:b w:val="false"/>
+          <w:bCs w:val="false"/>
+          <w:i/>
+          <w:iCs/>
+          <w:color w:val="6B7280"/>
+          <w:sz w:val="19"/>
+          <w:szCs w:val="19"/>
+          <w:caps w:val="false"/>
+          <w:rFonts w:ascii="Calibri" w:cs="Calibri" w:eastAsia="Calibri" w:hAnsi="Calibri"/>
+        </w:rPr>
+        <w:t xml:space="preserve">Keep taking notes — lines run the full width of the page:</w:t>
+      </w:r>
+    </w:p>
+    <w:p>
+      <w:pPr>
+        <w:pBdr>
+          <w:bottom w:val="single" w:color="C9C4B5" w:sz="4" w:space="3"/>
+        </w:pBdr>
+        <w:spacing w:before="0" w:after="0" w:line="255" w:lineRule="auto"/>
+      </w:pPr>
+      <w:r>
+        <w:rPr>
+          <w:b w:val="false"/>
+          <w:bCs w:val="false"/>
+          <w:i w:val="false"/>
+          <w:iCs w:val="false"/>
+          <w:color w:val="1A1A1A"/>
+          <w:sz w:val="16"/>
+          <w:szCs w:val="16"/>
+          <w:caps w:val="false"/>
+          <w:rFonts w:ascii="Calibri" w:cs="Calibri" w:eastAsia="Calibri" w:hAnsi="Calibri"/>
+        </w:rPr>
+        <w:t xml:space="preserve"> </w:t>
+      </w:r>
+    </w:p>
+    <w:p>
+      <w:pPr>
+        <w:spacing w:before="0" w:after="0" w:line="70" w:lineRule="exact"/>
+      </w:pPr>
+      <w:r>
+        <w:rPr>
+          <w:b w:val="false"/>
+          <w:bCs w:val="false"/>
+          <w:i w:val="false"/>
+          <w:iCs w:val="false"/>
+          <w:color w:val="1A1A1A"/>
+          <w:sz w:val="2"/>
+          <w:szCs w:val="2"/>
+          <w:caps w:val="false"/>
+          <w:rFonts w:ascii="Calibri" w:cs="Calibri" w:eastAsia="Calibri" w:hAnsi="Calibri"/>
+        </w:rPr>
+        <w:t xml:space="preserve"> </w:t>
+      </w:r>
+    </w:p>
+    <w:p>
+      <w:pPr>
+        <w:pBdr>
+          <w:bottom w:val="single" w:color="C9C4B5" w:sz="4" w:space="3"/>
+        </w:pBdr>
+        <w:spacing w:before="0" w:after="0" w:line="255" w:lineRule="auto"/>
+      </w:pPr>
+      <w:r>
+        <w:rPr>
+          <w:b w:val="false"/>
+          <w:bCs w:val="false"/>
+          <w:i w:val="false"/>
+          <w:iCs w:val="false"/>
+          <w:color w:val="1A1A1A"/>
+          <w:sz w:val="16"/>
+          <w:szCs w:val="16"/>
+          <w:caps w:val="false"/>
+          <w:rFonts w:ascii="Calibri" w:cs="Calibri" w:eastAsia="Calibri" w:hAnsi="Calibri"/>
+        </w:rPr>
+        <w:t xml:space="preserve"> </w:t>
+      </w:r>
+    </w:p>
+    <w:p>
+      <w:pPr>
+        <w:spacing w:before="0" w:after="0" w:line="70" w:lineRule="exact"/>
+      </w:pPr>
+      <w:r>
+        <w:rPr>
+          <w:b w:val="false"/>
+          <w:bCs w:val="false"/>
+          <w:i w:val="false"/>
+          <w:iCs w:val="false"/>
+          <w:color w:val="1A1A1A"/>
+          <w:sz w:val="2"/>
+          <w:szCs w:val="2"/>
+          <w:caps w:val="false"/>
+          <w:rFonts w:ascii="Calibri" w:cs="Calibri" w:eastAsia="Calibri" w:hAnsi="Calibri"/>
+        </w:rPr>
+        <w:t xml:space="preserve"> </w:t>
+      </w:r>
+    </w:p>
+    <w:p>
+      <w:pPr>
+        <w:pBdr>
+          <w:bottom w:val="single" w:color="C9C4B5" w:sz="4" w:space="3"/>
+        </w:pBdr>
+        <w:spacing w:before="0" w:after="0" w:line="255" w:lineRule="auto"/>
+      </w:pPr>
+      <w:r>
+        <w:rPr>
+          <w:b w:val="false"/>
+          <w:bCs w:val="false"/>
+          <w:i w:val="false"/>
+          <w:iCs w:val="false"/>
+          <w:color w:val="1A1A1A"/>
+          <w:sz w:val="16"/>
+          <w:szCs w:val="16"/>
+          <w:caps w:val="false"/>
+          <w:rFonts w:ascii="Calibri" w:cs="Calibri" w:eastAsia="Calibri" w:hAnsi="Calibri"/>
+        </w:rPr>
+        <w:t xml:space="preserve"> </w:t>
+      </w:r>
+    </w:p>
+    <w:p>
+      <w:pPr>
+        <w:spacing w:before="0" w:after="0" w:line="70" w:lineRule="exact"/>
+      </w:pPr>
+      <w:r>
+        <w:rPr>
+          <w:b w:val="false"/>
+          <w:bCs w:val="false"/>
+          <w:i w:val="false"/>
+          <w:iCs w:val="false"/>
+          <w:color w:val="1A1A1A"/>
+          <w:sz w:val="2"/>
+          <w:szCs w:val="2"/>
+          <w:caps w:val="false"/>
+          <w:rFonts w:ascii="Calibri" w:cs="Calibri" w:eastAsia="Calibri" w:hAnsi="Calibri"/>
+        </w:rPr>
+        <w:t xml:space="preserve"> </w:t>
+      </w:r>
+    </w:p>
+    <w:p>
+      <w:pPr>
+        <w:pBdr>
+          <w:bottom w:val="single" w:color="C9C4B5" w:sz="4" w:space="3"/>
+        </w:pBdr>
+        <w:spacing w:before="0" w:after="0" w:line="255" w:lineRule="auto"/>
+      </w:pPr>
+      <w:r>
+        <w:rPr>
+          <w:b w:val="false"/>
+          <w:bCs w:val="false"/>
+          <w:i w:val="false"/>
+          <w:iCs w:val="false"/>
+          <w:color w:val="1A1A1A"/>
+          <w:sz w:val="16"/>
+          <w:szCs w:val="16"/>
+          <w:caps w:val="false"/>
+          <w:rFonts w:ascii="Calibri" w:cs="Calibri" w:eastAsia="Calibri" w:hAnsi="Calibri"/>
+        </w:rPr>
+        <w:t xml:space="preserve"> </w:t>
+      </w:r>
+    </w:p>
+    <w:p>
+      <w:pPr>
+        <w:spacing w:before="0" w:after="0" w:line="70" w:lineRule="exact"/>
+      </w:pPr>
+      <w:r>
+        <w:rPr>
+          <w:b w:val="false"/>
+          <w:bCs w:val="false"/>
+          <w:i w:val="false"/>
+          <w:iCs w:val="false"/>
+          <w:color w:val="1A1A1A"/>
+          <w:sz w:val="2"/>
+          <w:szCs w:val="2"/>
+          <w:caps w:val="false"/>
+          <w:rFonts w:ascii="Calibri" w:cs="Calibri" w:eastAsia="Calibri" w:hAnsi="Calibri"/>
+        </w:rPr>
+        <w:t xml:space="preserve"> </w:t>
+      </w:r>
+    </w:p>
+    <w:p>
+      <w:pPr>
+        <w:pBdr>
+          <w:bottom w:val="single" w:color="C9C4B5" w:sz="4" w:space="3"/>
+        </w:pBdr>
+        <w:spacing w:before="0" w:after="0" w:line="255" w:lineRule="auto"/>
+      </w:pPr>
+      <w:r>
+        <w:rPr>
+          <w:b w:val="false"/>
+          <w:bCs w:val="false"/>
+          <w:i w:val="false"/>
+          <w:iCs w:val="false"/>
+          <w:color w:val="1A1A1A"/>
+          <w:sz w:val="16"/>
+          <w:szCs w:val="16"/>
+          <w:caps w:val="false"/>
+          <w:rFonts w:ascii="Calibri" w:cs="Calibri" w:eastAsia="Calibri" w:hAnsi="Calibri"/>
+        </w:rPr>
+        <w:t xml:space="preserve"> </w:t>
+      </w:r>
+    </w:p>
+    <w:p>
+      <w:pPr>
+        <w:spacing w:before="0" w:after="0" w:line="70" w:lineRule="exact"/>
+      </w:pPr>
+      <w:r>
+        <w:rPr>
+          <w:b w:val="false"/>
+          <w:bCs w:val="false"/>
+          <w:i w:val="false"/>
+          <w:iCs w:val="false"/>
+          <w:color w:val="1A1A1A"/>
+          <w:sz w:val="2"/>
+          <w:szCs w:val="2"/>
+          <w:caps w:val="false"/>
+          <w:rFonts w:ascii="Calibri" w:cs="Calibri" w:eastAsia="Calibri" w:hAnsi="Calibri"/>
+        </w:rPr>
+        <w:t xml:space="preserve"> </w:t>
+      </w:r>
+    </w:p>
+    <w:p>
+      <w:pPr>
+        <w:pBdr>
+          <w:bottom w:val="single" w:color="C9C4B5" w:sz="4" w:space="3"/>
+        </w:pBdr>
+        <w:spacing w:before="0" w:after="0" w:line="255" w:lineRule="auto"/>
+      </w:pPr>
+      <w:r>
+        <w:rPr>
+          <w:b w:val="false"/>
+          <w:bCs w:val="false"/>
+          <w:i w:val="false"/>
+          <w:iCs w:val="false"/>
+          <w:color w:val="1A1A1A"/>
+          <w:sz w:val="16"/>
+          <w:szCs w:val="16"/>
+          <w:caps w:val="false"/>
+          <w:rFonts w:ascii="Calibri" w:cs="Calibri" w:eastAsia="Calibri" w:hAnsi="Calibri"/>
+        </w:rPr>
+        <w:t xml:space="preserve"> </w:t>
+      </w:r>
+    </w:p>
+    <w:p>
+      <w:pPr>
+        <w:spacing w:before="0" w:after="0" w:line="70" w:lineRule="exact"/>
+      </w:pPr>
+      <w:r>
+        <w:rPr>
+          <w:b w:val="false"/>
+          <w:bCs w:val="false"/>
+          <w:i w:val="false"/>
+          <w:iCs w:val="false"/>
+          <w:color w:val="1A1A1A"/>
+          <w:sz w:val="2"/>
+          <w:szCs w:val="2"/>
+          <w:caps w:val="false"/>
+          <w:rFonts w:ascii="Calibri" w:cs="Calibri" w:eastAsia="Calibri" w:hAnsi="Calibri"/>
+        </w:rPr>
+        <w:t xml:space="preserve"> </w:t>
+      </w:r>
+    </w:p>
+    <w:p>
+      <w:pPr>
+        <w:pBdr>
+          <w:bottom w:val="single" w:color="C9C4B5" w:sz="4" w:space="3"/>
+        </w:pBdr>
+        <w:spacing w:before="0" w:after="0" w:line="255" w:lineRule="auto"/>
+      </w:pPr>
+      <w:r>
+        <w:rPr>
+          <w:b w:val="false"/>
+          <w:bCs w:val="false"/>
+          <w:i w:val="false"/>
+          <w:iCs w:val="false"/>
+          <w:color w:val="1A1A1A"/>
+          <w:sz w:val="16"/>
+          <w:szCs w:val="16"/>
+          <w:caps w:val="false"/>
+          <w:rFonts w:ascii="Calibri" w:cs="Calibri" w:eastAsia="Calibri" w:hAnsi="Calibri"/>
+        </w:rPr>
+        <w:t xml:space="preserve"> </w:t>
+      </w:r>
+    </w:p>
+    <w:p>
+      <w:pPr>
+        <w:spacing w:before="0" w:after="0" w:line="70" w:lineRule="exact"/>
+      </w:pPr>
+      <w:r>
+        <w:rPr>
+          <w:b w:val="false"/>
+          <w:bCs w:val="false"/>
+          <w:i w:val="false"/>
+          <w:iCs w:val="false"/>
+          <w:color w:val="1A1A1A"/>
+          <w:sz w:val="2"/>
+          <w:szCs w:val="2"/>
+          <w:caps w:val="false"/>
+          <w:rFonts w:ascii="Calibri" w:cs="Calibri" w:eastAsia="Calibri" w:hAnsi="Calibri"/>
+        </w:rPr>
+        <w:t xml:space="preserve"> </w:t>
+      </w:r>
+    </w:p>
+    <w:p>
+      <w:pPr>
+        <w:pBdr>
+          <w:bottom w:val="single" w:color="C9C4B5" w:sz="4" w:space="3"/>
+        </w:pBdr>
+        <w:spacing w:before="0" w:after="0" w:line="255" w:lineRule="auto"/>
+      </w:pPr>
+      <w:r>
+        <w:rPr>
+          <w:b w:val="false"/>
+          <w:bCs w:val="false"/>
+          <w:i w:val="false"/>
+          <w:iCs w:val="false"/>
+          <w:color w:val="1A1A1A"/>
+          <w:sz w:val="16"/>
+          <w:szCs w:val="16"/>
+          <w:caps w:val="false"/>
+          <w:rFonts w:ascii="Calibri" w:cs="Calibri" w:eastAsia="Calibri" w:hAnsi="Calibri"/>
+        </w:rPr>
+        <w:t xml:space="preserve"> </w:t>
+      </w:r>
+    </w:p>
+    <w:p>
+      <w:pPr>
+        <w:spacing w:before="0" w:after="0" w:line="70" w:lineRule="exact"/>
+      </w:pPr>
+      <w:r>
+        <w:rPr>
+          <w:b w:val="false"/>
+          <w:bCs w:val="false"/>
+          <w:i w:val="false"/>
+          <w:iCs w:val="false"/>
+          <w:color w:val="1A1A1A"/>
+          <w:sz w:val="2"/>
+          <w:szCs w:val="2"/>
+          <w:caps w:val="false"/>
+          <w:rFonts w:ascii="Calibri" w:cs="Calibri" w:eastAsia="Calibri" w:hAnsi="Calibri"/>
+        </w:rPr>
+        <w:t xml:space="preserve"> </w:t>
+      </w:r>
+    </w:p>
+    <w:p>
+      <w:pPr>
+        <w:pBdr>
+          <w:bottom w:val="single" w:color="C9C4B5" w:sz="4" w:space="3"/>
+        </w:pBdr>
+        <w:spacing w:before="0" w:after="0" w:line="255" w:lineRule="auto"/>
+      </w:pPr>
+      <w:r>
+        <w:rPr>
+          <w:b w:val="false"/>
+          <w:bCs w:val="false"/>
+          <w:i w:val="false"/>
+          <w:iCs w:val="false"/>
+          <w:color w:val="1A1A1A"/>
+          <w:sz w:val="16"/>
+          <w:szCs w:val="16"/>
+          <w:caps w:val="false"/>
+          <w:rFonts w:ascii="Calibri" w:cs="Calibri" w:eastAsia="Calibri" w:hAnsi="Calibri"/>
+        </w:rPr>
+        <w:t xml:space="preserve"> </w:t>
+      </w:r>
+    </w:p>
+    <w:p>
+      <w:pPr>
+        <w:spacing w:before="0" w:after="0" w:line="70" w:lineRule="exact"/>
+      </w:pPr>
+      <w:r>
+        <w:rPr>
+          <w:b w:val="false"/>
+          <w:bCs w:val="false"/>
+          <w:i w:val="false"/>
+          <w:iCs w:val="false"/>
+          <w:color w:val="1A1A1A"/>
+          <w:sz w:val="2"/>
+          <w:szCs w:val="2"/>
+          <w:caps w:val="false"/>
+          <w:rFonts w:ascii="Calibri" w:cs="Calibri" w:eastAsia="Calibri" w:hAnsi="Calibri"/>
+        </w:rPr>
+        <w:t xml:space="preserve"> </w:t>
+      </w:r>
+    </w:p>
+    <w:p>
+      <w:pPr>
+        <w:pBdr>
+          <w:bottom w:val="single" w:color="C9C4B5" w:sz="4" w:space="3"/>
+        </w:pBdr>
+        <w:spacing w:before="0" w:after="0" w:line="255" w:lineRule="auto"/>
+      </w:pPr>
+      <w:r>
+        <w:rPr>
+          <w:b w:val="false"/>
+          <w:bCs w:val="false"/>
+          <w:i w:val="false"/>
+          <w:iCs w:val="false"/>
+          <w:color w:val="1A1A1A"/>
+          <w:sz w:val="16"/>
+          <w:szCs w:val="16"/>
+          <w:caps w:val="false"/>
+          <w:rFonts w:ascii="Calibri" w:cs="Calibri" w:eastAsia="Calibri" w:hAnsi="Calibri"/>
+        </w:rPr>
+        <w:t xml:space="preserve"> </w:t>
+      </w:r>
+    </w:p>
     <w:tbl>
       <w:tblPr>
         <w:tblW w:type="dxa" w:w="9648"/>
@@ -38482,8 +40286,8 @@
         </w:tblBorders>
       </w:tblPr>
       <w:tblGrid>
-        <w:gridCol w:w="3050"/>
-        <w:gridCol w:w="6598"/>
+        <w:gridCol w:w="2600"/>
+        <w:gridCol w:w="7048"/>
       </w:tblGrid>
       <w:tr>
         <w:trPr>
@@ -38491,7 +40295,7 @@
         </w:trPr>
         <w:tc>
           <w:tcPr>
-            <w:tcW w:type="dxa" w:w="3050"/>
+            <w:tcW w:type="dxa" w:w="2600"/>
             <w:tcBorders>
               <w:top w:val="single" w:color="D9D5C8" w:sz="4"/>
               <w:left w:val="single" w:color="D9D5C8" w:sz="4"/>
@@ -38522,13 +40326,13 @@
                 <w:caps w:val="false"/>
                 <w:rFonts w:ascii="Calibri" w:cs="Calibri" w:eastAsia="Calibri" w:hAnsi="Calibri"/>
               </w:rPr>
-              <w:t xml:space="preserve">Cues (tied to your learning targets)</w:t>
-            </w:r>
-          </w:p>
-        </w:tc>
-        <w:tc>
-          <w:tcPr>
-            <w:tcW w:type="dxa" w:w="6598"/>
+              <w:t xml:space="preserve">Cue Column — questions &amp; key terms</w:t>
+            </w:r>
+          </w:p>
+        </w:tc>
+        <w:tc>
+          <w:tcPr>
+            <w:tcW w:type="dxa" w:w="7048"/>
             <w:tcBorders>
               <w:top w:val="single" w:color="D9D5C8" w:sz="4"/>
               <w:left w:val="single" w:color="D9D5C8" w:sz="4"/>
@@ -38559,7 +40363,7 @@
                 <w:caps w:val="false"/>
                 <w:rFonts w:ascii="Calibri" w:cs="Calibri" w:eastAsia="Calibri" w:hAnsi="Calibri"/>
               </w:rPr>
-              <w:t xml:space="preserve">My notes</w:t>
+              <w:t xml:space="preserve">Note-Taking Column — write your notes here</w:t>
             </w:r>
           </w:p>
         </w:tc>
@@ -38567,7 +40371,7 @@
       <w:tr>
         <w:tc>
           <w:tcPr>
-            <w:tcW w:type="dxa" w:w="3050"/>
+            <w:tcW w:type="dxa" w:w="2600"/>
             <w:tcBorders>
               <w:top w:val="single" w:color="D9D5C8" w:sz="4"/>
               <w:left w:val="single" w:color="D9D5C8" w:sz="4"/>
@@ -38603,7 +40407,7 @@
         </w:tc>
         <w:tc>
           <w:tcPr>
-            <w:tcW w:type="dxa" w:w="6598"/>
+            <w:tcW w:type="dxa" w:w="7048"/>
             <w:tcBorders>
               <w:top w:val="single" w:color="D9D5C8" w:sz="4"/>
               <w:left w:val="single" w:color="D9D5C8" w:sz="4"/>
@@ -38803,61 +40607,25 @@
               <w:t xml:space="preserve"> </w:t>
             </w:r>
           </w:p>
-        </w:tc>
-      </w:tr>
-      <w:tr>
-        <w:tc>
-          <w:tcPr>
-            <w:tcW w:type="dxa" w:w="3050"/>
-            <w:tcBorders>
-              <w:top w:val="single" w:color="D9D5C8" w:sz="4"/>
-              <w:left w:val="single" w:color="D9D5C8" w:sz="4"/>
-              <w:bottom w:val="single" w:color="D9D5C8" w:sz="4"/>
-              <w:right w:val="single" w:color="D9D5C8" w:sz="4"/>
-            </w:tcBorders>
-            <w:tcMar>
-              <w:top w:type="dxa" w:w="55"/>
-              <w:left w:type="dxa" w:w="110"/>
-              <w:bottom w:type="dxa" w:w="55"/>
-              <w:right w:type="dxa" w:w="110"/>
-            </w:tcMar>
-          </w:tcPr>
-          <w:p>
-            <w:pPr>
-              <w:spacing w:after="0"/>
-            </w:pPr>
-            <w:r>
-              <w:rPr>
-                <w:b/>
-                <w:bCs/>
-                <w:i w:val="false"/>
-                <w:iCs w:val="false"/>
-                <w:color w:val="1A1A1A"/>
-                <w:sz w:val="20"/>
-                <w:szCs w:val="20"/>
-                <w:caps w:val="false"/>
-                <w:rFonts w:ascii="Calibri" w:cs="Calibri" w:eastAsia="Calibri" w:hAnsi="Calibri"/>
-              </w:rPr>
-              <w:t xml:space="preserve">One source that supports it?</w:t>
-            </w:r>
-          </w:p>
-        </w:tc>
-        <w:tc>
-          <w:tcPr>
-            <w:tcW w:type="dxa" w:w="6598"/>
-            <w:tcBorders>
-              <w:top w:val="single" w:color="D9D5C8" w:sz="4"/>
-              <w:left w:val="single" w:color="D9D5C8" w:sz="4"/>
-              <w:bottom w:val="single" w:color="D9D5C8" w:sz="4"/>
-              <w:right w:val="single" w:color="D9D5C8" w:sz="4"/>
-            </w:tcBorders>
-            <w:tcMar>
-              <w:top w:type="dxa" w:w="55"/>
-              <w:left w:type="dxa" w:w="110"/>
-              <w:bottom w:type="dxa" w:w="55"/>
-              <w:right w:type="dxa" w:w="110"/>
-            </w:tcMar>
-          </w:tcPr>
+          <w:p>
+            <w:pPr>
+              <w:spacing w:before="0" w:after="0" w:line="70" w:lineRule="exact"/>
+            </w:pPr>
+            <w:r>
+              <w:rPr>
+                <w:b w:val="false"/>
+                <w:bCs w:val="false"/>
+                <w:i w:val="false"/>
+                <w:iCs w:val="false"/>
+                <w:color w:val="1A1A1A"/>
+                <w:sz w:val="2"/>
+                <w:szCs w:val="2"/>
+                <w:caps w:val="false"/>
+                <w:rFonts w:ascii="Calibri" w:cs="Calibri" w:eastAsia="Calibri" w:hAnsi="Calibri"/>
+              </w:rPr>
+              <w:t xml:space="preserve"> </w:t>
+            </w:r>
+          </w:p>
           <w:p>
             <w:pPr>
               <w:pBdr>
@@ -38962,25 +40730,61 @@
               <w:t xml:space="preserve"> </w:t>
             </w:r>
           </w:p>
-          <w:p>
-            <w:pPr>
-              <w:spacing w:before="0" w:after="0" w:line="70" w:lineRule="exact"/>
-            </w:pPr>
-            <w:r>
-              <w:rPr>
-                <w:b w:val="false"/>
-                <w:bCs w:val="false"/>
-                <w:i w:val="false"/>
-                <w:iCs w:val="false"/>
-                <w:color w:val="1A1A1A"/>
-                <w:sz w:val="2"/>
-                <w:szCs w:val="2"/>
-                <w:caps w:val="false"/>
-                <w:rFonts w:ascii="Calibri" w:cs="Calibri" w:eastAsia="Calibri" w:hAnsi="Calibri"/>
-              </w:rPr>
-              <w:t xml:space="preserve"> </w:t>
-            </w:r>
-          </w:p>
+        </w:tc>
+      </w:tr>
+      <w:tr>
+        <w:tc>
+          <w:tcPr>
+            <w:tcW w:type="dxa" w:w="2600"/>
+            <w:tcBorders>
+              <w:top w:val="single" w:color="D9D5C8" w:sz="4"/>
+              <w:left w:val="single" w:color="D9D5C8" w:sz="4"/>
+              <w:bottom w:val="single" w:color="D9D5C8" w:sz="4"/>
+              <w:right w:val="single" w:color="D9D5C8" w:sz="4"/>
+            </w:tcBorders>
+            <w:tcMar>
+              <w:top w:type="dxa" w:w="55"/>
+              <w:left w:type="dxa" w:w="110"/>
+              <w:bottom w:type="dxa" w:w="55"/>
+              <w:right w:type="dxa" w:w="110"/>
+            </w:tcMar>
+          </w:tcPr>
+          <w:p>
+            <w:pPr>
+              <w:spacing w:after="0"/>
+            </w:pPr>
+            <w:r>
+              <w:rPr>
+                <w:b/>
+                <w:bCs/>
+                <w:i w:val="false"/>
+                <w:iCs w:val="false"/>
+                <w:color w:val="1A1A1A"/>
+                <w:sz w:val="20"/>
+                <w:szCs w:val="20"/>
+                <w:caps w:val="false"/>
+                <w:rFonts w:ascii="Calibri" w:cs="Calibri" w:eastAsia="Calibri" w:hAnsi="Calibri"/>
+              </w:rPr>
+              <w:t xml:space="preserve">One source that supports it?</w:t>
+            </w:r>
+          </w:p>
+        </w:tc>
+        <w:tc>
+          <w:tcPr>
+            <w:tcW w:type="dxa" w:w="7048"/>
+            <w:tcBorders>
+              <w:top w:val="single" w:color="D9D5C8" w:sz="4"/>
+              <w:left w:val="single" w:color="D9D5C8" w:sz="4"/>
+              <w:bottom w:val="single" w:color="D9D5C8" w:sz="4"/>
+              <w:right w:val="single" w:color="D9D5C8" w:sz="4"/>
+            </w:tcBorders>
+            <w:tcMar>
+              <w:top w:type="dxa" w:w="55"/>
+              <w:left w:type="dxa" w:w="110"/>
+              <w:bottom w:type="dxa" w:w="55"/>
+              <w:right w:type="dxa" w:w="110"/>
+            </w:tcMar>
+          </w:tcPr>
           <w:p>
             <w:pPr>
               <w:pBdr>
@@ -39044,61 +40848,25 @@
               <w:t xml:space="preserve"> </w:t>
             </w:r>
           </w:p>
-        </w:tc>
-      </w:tr>
-      <w:tr>
-        <w:tc>
-          <w:tcPr>
-            <w:tcW w:type="dxa" w:w="3050"/>
-            <w:tcBorders>
-              <w:top w:val="single" w:color="D9D5C8" w:sz="4"/>
-              <w:left w:val="single" w:color="D9D5C8" w:sz="4"/>
-              <w:bottom w:val="single" w:color="D9D5C8" w:sz="4"/>
-              <w:right w:val="single" w:color="D9D5C8" w:sz="4"/>
-            </w:tcBorders>
-            <w:tcMar>
-              <w:top w:type="dxa" w:w="55"/>
-              <w:left w:type="dxa" w:w="110"/>
-              <w:bottom w:type="dxa" w:w="55"/>
-              <w:right w:type="dxa" w:w="110"/>
-            </w:tcMar>
-          </w:tcPr>
-          <w:p>
-            <w:pPr>
-              <w:spacing w:after="0"/>
-            </w:pPr>
-            <w:r>
-              <w:rPr>
-                <w:b/>
-                <w:bCs/>
-                <w:i w:val="false"/>
-                <w:iCs w:val="false"/>
-                <w:color w:val="1A1A1A"/>
-                <w:sz w:val="20"/>
-                <w:szCs w:val="20"/>
-                <w:caps w:val="false"/>
-                <w:rFonts w:ascii="Calibri" w:cs="Calibri" w:eastAsia="Calibri" w:hAnsi="Calibri"/>
-              </w:rPr>
-              <w:t xml:space="preserve">One check on executive power?</w:t>
-            </w:r>
-          </w:p>
-        </w:tc>
-        <w:tc>
-          <w:tcPr>
-            <w:tcW w:type="dxa" w:w="6598"/>
-            <w:tcBorders>
-              <w:top w:val="single" w:color="D9D5C8" w:sz="4"/>
-              <w:left w:val="single" w:color="D9D5C8" w:sz="4"/>
-              <w:bottom w:val="single" w:color="D9D5C8" w:sz="4"/>
-              <w:right w:val="single" w:color="D9D5C8" w:sz="4"/>
-            </w:tcBorders>
-            <w:tcMar>
-              <w:top w:type="dxa" w:w="55"/>
-              <w:left w:type="dxa" w:w="110"/>
-              <w:bottom w:type="dxa" w:w="55"/>
-              <w:right w:type="dxa" w:w="110"/>
-            </w:tcMar>
-          </w:tcPr>
+          <w:p>
+            <w:pPr>
+              <w:spacing w:before="0" w:after="0" w:line="70" w:lineRule="exact"/>
+            </w:pPr>
+            <w:r>
+              <w:rPr>
+                <w:b w:val="false"/>
+                <w:bCs w:val="false"/>
+                <w:i w:val="false"/>
+                <w:iCs w:val="false"/>
+                <w:color w:val="1A1A1A"/>
+                <w:sz w:val="2"/>
+                <w:szCs w:val="2"/>
+                <w:caps w:val="false"/>
+                <w:rFonts w:ascii="Calibri" w:cs="Calibri" w:eastAsia="Calibri" w:hAnsi="Calibri"/>
+              </w:rPr>
+              <w:t xml:space="preserve"> </w:t>
+            </w:r>
+          </w:p>
           <w:p>
             <w:pPr>
               <w:pBdr>
@@ -39285,61 +41053,25 @@
               <w:t xml:space="preserve"> </w:t>
             </w:r>
           </w:p>
-        </w:tc>
-      </w:tr>
-      <w:tr>
-        <w:tc>
-          <w:tcPr>
-            <w:tcW w:type="dxa" w:w="3050"/>
-            <w:tcBorders>
-              <w:top w:val="single" w:color="D9D5C8" w:sz="4"/>
-              <w:left w:val="single" w:color="D9D5C8" w:sz="4"/>
-              <w:bottom w:val="single" w:color="D9D5C8" w:sz="4"/>
-              <w:right w:val="single" w:color="D9D5C8" w:sz="4"/>
-            </w:tcBorders>
-            <w:tcMar>
-              <w:top w:type="dxa" w:w="55"/>
-              <w:left w:type="dxa" w:w="110"/>
-              <w:bottom w:type="dxa" w:w="55"/>
-              <w:right w:type="dxa" w:w="110"/>
-            </w:tcMar>
-          </w:tcPr>
-          <w:p>
-            <w:pPr>
-              <w:spacing w:after="0"/>
-            </w:pPr>
-            <w:r>
-              <w:rPr>
-                <w:b/>
-                <w:bCs/>
-                <w:i w:val="false"/>
-                <w:iCs w:val="false"/>
-                <w:color w:val="1A1A1A"/>
-                <w:sz w:val="20"/>
-                <w:szCs w:val="20"/>
-                <w:caps w:val="false"/>
-                <w:rFonts w:ascii="Calibri" w:cs="Calibri" w:eastAsia="Calibri" w:hAnsi="Calibri"/>
-              </w:rPr>
-              <w:t xml:space="preserve">Key terms →</w:t>
-            </w:r>
-          </w:p>
-        </w:tc>
-        <w:tc>
-          <w:tcPr>
-            <w:tcW w:type="dxa" w:w="6598"/>
-            <w:tcBorders>
-              <w:top w:val="single" w:color="D9D5C8" w:sz="4"/>
-              <w:left w:val="single" w:color="D9D5C8" w:sz="4"/>
-              <w:bottom w:val="single" w:color="D9D5C8" w:sz="4"/>
-              <w:right w:val="single" w:color="D9D5C8" w:sz="4"/>
-            </w:tcBorders>
-            <w:tcMar>
-              <w:top w:type="dxa" w:w="55"/>
-              <w:left w:type="dxa" w:w="110"/>
-              <w:bottom w:type="dxa" w:w="55"/>
-              <w:right w:type="dxa" w:w="110"/>
-            </w:tcMar>
-          </w:tcPr>
+          <w:p>
+            <w:pPr>
+              <w:spacing w:before="0" w:after="0" w:line="70" w:lineRule="exact"/>
+            </w:pPr>
+            <w:r>
+              <w:rPr>
+                <w:b w:val="false"/>
+                <w:bCs w:val="false"/>
+                <w:i w:val="false"/>
+                <w:iCs w:val="false"/>
+                <w:color w:val="1A1A1A"/>
+                <w:sz w:val="2"/>
+                <w:szCs w:val="2"/>
+                <w:caps w:val="false"/>
+                <w:rFonts w:ascii="Calibri" w:cs="Calibri" w:eastAsia="Calibri" w:hAnsi="Calibri"/>
+              </w:rPr>
+              <w:t xml:space="preserve"> </w:t>
+            </w:r>
+          </w:p>
           <w:p>
             <w:pPr>
               <w:pBdr>
@@ -39362,25 +41094,61 @@
               <w:t xml:space="preserve"> </w:t>
             </w:r>
           </w:p>
-          <w:p>
-            <w:pPr>
-              <w:spacing w:before="0" w:after="0" w:line="70" w:lineRule="exact"/>
-            </w:pPr>
-            <w:r>
-              <w:rPr>
-                <w:b w:val="false"/>
-                <w:bCs w:val="false"/>
-                <w:i w:val="false"/>
-                <w:iCs w:val="false"/>
-                <w:color w:val="1A1A1A"/>
-                <w:sz w:val="2"/>
-                <w:szCs w:val="2"/>
-                <w:caps w:val="false"/>
-                <w:rFonts w:ascii="Calibri" w:cs="Calibri" w:eastAsia="Calibri" w:hAnsi="Calibri"/>
-              </w:rPr>
-              <w:t xml:space="preserve"> </w:t>
-            </w:r>
-          </w:p>
+        </w:tc>
+      </w:tr>
+      <w:tr>
+        <w:tc>
+          <w:tcPr>
+            <w:tcW w:type="dxa" w:w="2600"/>
+            <w:tcBorders>
+              <w:top w:val="single" w:color="D9D5C8" w:sz="4"/>
+              <w:left w:val="single" w:color="D9D5C8" w:sz="4"/>
+              <w:bottom w:val="single" w:color="D9D5C8" w:sz="4"/>
+              <w:right w:val="single" w:color="D9D5C8" w:sz="4"/>
+            </w:tcBorders>
+            <w:tcMar>
+              <w:top w:type="dxa" w:w="55"/>
+              <w:left w:type="dxa" w:w="110"/>
+              <w:bottom w:type="dxa" w:w="55"/>
+              <w:right w:type="dxa" w:w="110"/>
+            </w:tcMar>
+          </w:tcPr>
+          <w:p>
+            <w:pPr>
+              <w:spacing w:after="0"/>
+            </w:pPr>
+            <w:r>
+              <w:rPr>
+                <w:b/>
+                <w:bCs/>
+                <w:i w:val="false"/>
+                <w:iCs w:val="false"/>
+                <w:color w:val="1A1A1A"/>
+                <w:sz w:val="20"/>
+                <w:szCs w:val="20"/>
+                <w:caps w:val="false"/>
+                <w:rFonts w:ascii="Calibri" w:cs="Calibri" w:eastAsia="Calibri" w:hAnsi="Calibri"/>
+              </w:rPr>
+              <w:t xml:space="preserve">One check on executive power?</w:t>
+            </w:r>
+          </w:p>
+        </w:tc>
+        <w:tc>
+          <w:tcPr>
+            <w:tcW w:type="dxa" w:w="7048"/>
+            <w:tcBorders>
+              <w:top w:val="single" w:color="D9D5C8" w:sz="4"/>
+              <w:left w:val="single" w:color="D9D5C8" w:sz="4"/>
+              <w:bottom w:val="single" w:color="D9D5C8" w:sz="4"/>
+              <w:right w:val="single" w:color="D9D5C8" w:sz="4"/>
+            </w:tcBorders>
+            <w:tcMar>
+              <w:top w:type="dxa" w:w="55"/>
+              <w:left w:type="dxa" w:w="110"/>
+              <w:bottom w:type="dxa" w:w="55"/>
+              <w:right w:type="dxa" w:w="110"/>
+            </w:tcMar>
+          </w:tcPr>
           <w:p>
             <w:pPr>
               <w:pBdr>
@@ -39526,9 +41294,947 @@
               <w:t xml:space="preserve"> </w:t>
             </w:r>
           </w:p>
+          <w:p>
+            <w:pPr>
+              <w:spacing w:before="0" w:after="0" w:line="70" w:lineRule="exact"/>
+            </w:pPr>
+            <w:r>
+              <w:rPr>
+                <w:b w:val="false"/>
+                <w:bCs w:val="false"/>
+                <w:i w:val="false"/>
+                <w:iCs w:val="false"/>
+                <w:color w:val="1A1A1A"/>
+                <w:sz w:val="2"/>
+                <w:szCs w:val="2"/>
+                <w:caps w:val="false"/>
+                <w:rFonts w:ascii="Calibri" w:cs="Calibri" w:eastAsia="Calibri" w:hAnsi="Calibri"/>
+              </w:rPr>
+              <w:t xml:space="preserve"> </w:t>
+            </w:r>
+          </w:p>
+          <w:p>
+            <w:pPr>
+              <w:pBdr>
+                <w:bottom w:val="single" w:color="C9C4B5" w:sz="4" w:space="3"/>
+              </w:pBdr>
+              <w:spacing w:before="0" w:after="0" w:line="255" w:lineRule="auto"/>
+            </w:pPr>
+            <w:r>
+              <w:rPr>
+                <w:b w:val="false"/>
+                <w:bCs w:val="false"/>
+                <w:i w:val="false"/>
+                <w:iCs w:val="false"/>
+                <w:color w:val="1A1A1A"/>
+                <w:sz w:val="16"/>
+                <w:szCs w:val="16"/>
+                <w:caps w:val="false"/>
+                <w:rFonts w:ascii="Calibri" w:cs="Calibri" w:eastAsia="Calibri" w:hAnsi="Calibri"/>
+              </w:rPr>
+              <w:t xml:space="preserve"> </w:t>
+            </w:r>
+          </w:p>
+          <w:p>
+            <w:pPr>
+              <w:spacing w:before="0" w:after="0" w:line="70" w:lineRule="exact"/>
+            </w:pPr>
+            <w:r>
+              <w:rPr>
+                <w:b w:val="false"/>
+                <w:bCs w:val="false"/>
+                <w:i w:val="false"/>
+                <w:iCs w:val="false"/>
+                <w:color w:val="1A1A1A"/>
+                <w:sz w:val="2"/>
+                <w:szCs w:val="2"/>
+                <w:caps w:val="false"/>
+                <w:rFonts w:ascii="Calibri" w:cs="Calibri" w:eastAsia="Calibri" w:hAnsi="Calibri"/>
+              </w:rPr>
+              <w:t xml:space="preserve"> </w:t>
+            </w:r>
+          </w:p>
+          <w:p>
+            <w:pPr>
+              <w:pBdr>
+                <w:bottom w:val="single" w:color="C9C4B5" w:sz="4" w:space="3"/>
+              </w:pBdr>
+              <w:spacing w:before="0" w:after="0" w:line="255" w:lineRule="auto"/>
+            </w:pPr>
+            <w:r>
+              <w:rPr>
+                <w:b w:val="false"/>
+                <w:bCs w:val="false"/>
+                <w:i w:val="false"/>
+                <w:iCs w:val="false"/>
+                <w:color w:val="1A1A1A"/>
+                <w:sz w:val="16"/>
+                <w:szCs w:val="16"/>
+                <w:caps w:val="false"/>
+                <w:rFonts w:ascii="Calibri" w:cs="Calibri" w:eastAsia="Calibri" w:hAnsi="Calibri"/>
+              </w:rPr>
+              <w:t xml:space="preserve"> </w:t>
+            </w:r>
+          </w:p>
+          <w:p>
+            <w:pPr>
+              <w:spacing w:before="0" w:after="0" w:line="70" w:lineRule="exact"/>
+            </w:pPr>
+            <w:r>
+              <w:rPr>
+                <w:b w:val="false"/>
+                <w:bCs w:val="false"/>
+                <w:i w:val="false"/>
+                <w:iCs w:val="false"/>
+                <w:color w:val="1A1A1A"/>
+                <w:sz w:val="2"/>
+                <w:szCs w:val="2"/>
+                <w:caps w:val="false"/>
+                <w:rFonts w:ascii="Calibri" w:cs="Calibri" w:eastAsia="Calibri" w:hAnsi="Calibri"/>
+              </w:rPr>
+              <w:t xml:space="preserve"> </w:t>
+            </w:r>
+          </w:p>
+          <w:p>
+            <w:pPr>
+              <w:pBdr>
+                <w:bottom w:val="single" w:color="C9C4B5" w:sz="4" w:space="3"/>
+              </w:pBdr>
+              <w:spacing w:before="0" w:after="0" w:line="255" w:lineRule="auto"/>
+            </w:pPr>
+            <w:r>
+              <w:rPr>
+                <w:b w:val="false"/>
+                <w:bCs w:val="false"/>
+                <w:i w:val="false"/>
+                <w:iCs w:val="false"/>
+                <w:color w:val="1A1A1A"/>
+                <w:sz w:val="16"/>
+                <w:szCs w:val="16"/>
+                <w:caps w:val="false"/>
+                <w:rFonts w:ascii="Calibri" w:cs="Calibri" w:eastAsia="Calibri" w:hAnsi="Calibri"/>
+              </w:rPr>
+              <w:t xml:space="preserve"> </w:t>
+            </w:r>
+          </w:p>
+          <w:p>
+            <w:pPr>
+              <w:spacing w:before="0" w:after="0" w:line="70" w:lineRule="exact"/>
+            </w:pPr>
+            <w:r>
+              <w:rPr>
+                <w:b w:val="false"/>
+                <w:bCs w:val="false"/>
+                <w:i w:val="false"/>
+                <w:iCs w:val="false"/>
+                <w:color w:val="1A1A1A"/>
+                <w:sz w:val="2"/>
+                <w:szCs w:val="2"/>
+                <w:caps w:val="false"/>
+                <w:rFonts w:ascii="Calibri" w:cs="Calibri" w:eastAsia="Calibri" w:hAnsi="Calibri"/>
+              </w:rPr>
+              <w:t xml:space="preserve"> </w:t>
+            </w:r>
+          </w:p>
+          <w:p>
+            <w:pPr>
+              <w:pBdr>
+                <w:bottom w:val="single" w:color="C9C4B5" w:sz="4" w:space="3"/>
+              </w:pBdr>
+              <w:spacing w:before="0" w:after="0" w:line="255" w:lineRule="auto"/>
+            </w:pPr>
+            <w:r>
+              <w:rPr>
+                <w:b w:val="false"/>
+                <w:bCs w:val="false"/>
+                <w:i w:val="false"/>
+                <w:iCs w:val="false"/>
+                <w:color w:val="1A1A1A"/>
+                <w:sz w:val="16"/>
+                <w:szCs w:val="16"/>
+                <w:caps w:val="false"/>
+                <w:rFonts w:ascii="Calibri" w:cs="Calibri" w:eastAsia="Calibri" w:hAnsi="Calibri"/>
+              </w:rPr>
+              <w:t xml:space="preserve"> </w:t>
+            </w:r>
+          </w:p>
+        </w:tc>
+      </w:tr>
+      <w:tr>
+        <w:tc>
+          <w:tcPr>
+            <w:tcW w:type="dxa" w:w="2600"/>
+            <w:tcBorders>
+              <w:top w:val="single" w:color="D9D5C8" w:sz="4"/>
+              <w:left w:val="single" w:color="D9D5C8" w:sz="4"/>
+              <w:bottom w:val="single" w:color="D9D5C8" w:sz="4"/>
+              <w:right w:val="single" w:color="D9D5C8" w:sz="4"/>
+            </w:tcBorders>
+            <w:tcMar>
+              <w:top w:type="dxa" w:w="55"/>
+              <w:left w:type="dxa" w:w="110"/>
+              <w:bottom w:type="dxa" w:w="55"/>
+              <w:right w:type="dxa" w:w="110"/>
+            </w:tcMar>
+          </w:tcPr>
+          <w:p>
+            <w:pPr>
+              <w:spacing w:after="0"/>
+            </w:pPr>
+            <w:r>
+              <w:rPr>
+                <w:b/>
+                <w:bCs/>
+                <w:i w:val="false"/>
+                <w:iCs w:val="false"/>
+                <w:color w:val="1A1A1A"/>
+                <w:sz w:val="20"/>
+                <w:szCs w:val="20"/>
+                <w:caps w:val="false"/>
+                <w:rFonts w:ascii="Calibri" w:cs="Calibri" w:eastAsia="Calibri" w:hAnsi="Calibri"/>
+              </w:rPr>
+              <w:t xml:space="preserve">Key terms →</w:t>
+            </w:r>
+          </w:p>
+        </w:tc>
+        <w:tc>
+          <w:tcPr>
+            <w:tcW w:type="dxa" w:w="7048"/>
+            <w:tcBorders>
+              <w:top w:val="single" w:color="D9D5C8" w:sz="4"/>
+              <w:left w:val="single" w:color="D9D5C8" w:sz="4"/>
+              <w:bottom w:val="single" w:color="D9D5C8" w:sz="4"/>
+              <w:right w:val="single" w:color="D9D5C8" w:sz="4"/>
+            </w:tcBorders>
+            <w:tcMar>
+              <w:top w:type="dxa" w:w="55"/>
+              <w:left w:type="dxa" w:w="110"/>
+              <w:bottom w:type="dxa" w:w="55"/>
+              <w:right w:type="dxa" w:w="110"/>
+            </w:tcMar>
+          </w:tcPr>
+          <w:p>
+            <w:pPr>
+              <w:pBdr>
+                <w:bottom w:val="single" w:color="C9C4B5" w:sz="4" w:space="3"/>
+              </w:pBdr>
+              <w:spacing w:before="0" w:after="0" w:line="255" w:lineRule="auto"/>
+            </w:pPr>
+            <w:r>
+              <w:rPr>
+                <w:b w:val="false"/>
+                <w:bCs w:val="false"/>
+                <w:i w:val="false"/>
+                <w:iCs w:val="false"/>
+                <w:color w:val="1A1A1A"/>
+                <w:sz w:val="16"/>
+                <w:szCs w:val="16"/>
+                <w:caps w:val="false"/>
+                <w:rFonts w:ascii="Calibri" w:cs="Calibri" w:eastAsia="Calibri" w:hAnsi="Calibri"/>
+              </w:rPr>
+              <w:t xml:space="preserve"> </w:t>
+            </w:r>
+          </w:p>
+          <w:p>
+            <w:pPr>
+              <w:spacing w:before="0" w:after="0" w:line="70" w:lineRule="exact"/>
+            </w:pPr>
+            <w:r>
+              <w:rPr>
+                <w:b w:val="false"/>
+                <w:bCs w:val="false"/>
+                <w:i w:val="false"/>
+                <w:iCs w:val="false"/>
+                <w:color w:val="1A1A1A"/>
+                <w:sz w:val="2"/>
+                <w:szCs w:val="2"/>
+                <w:caps w:val="false"/>
+                <w:rFonts w:ascii="Calibri" w:cs="Calibri" w:eastAsia="Calibri" w:hAnsi="Calibri"/>
+              </w:rPr>
+              <w:t xml:space="preserve"> </w:t>
+            </w:r>
+          </w:p>
+          <w:p>
+            <w:pPr>
+              <w:pBdr>
+                <w:bottom w:val="single" w:color="C9C4B5" w:sz="4" w:space="3"/>
+              </w:pBdr>
+              <w:spacing w:before="0" w:after="0" w:line="255" w:lineRule="auto"/>
+            </w:pPr>
+            <w:r>
+              <w:rPr>
+                <w:b w:val="false"/>
+                <w:bCs w:val="false"/>
+                <w:i w:val="false"/>
+                <w:iCs w:val="false"/>
+                <w:color w:val="1A1A1A"/>
+                <w:sz w:val="16"/>
+                <w:szCs w:val="16"/>
+                <w:caps w:val="false"/>
+                <w:rFonts w:ascii="Calibri" w:cs="Calibri" w:eastAsia="Calibri" w:hAnsi="Calibri"/>
+              </w:rPr>
+              <w:t xml:space="preserve"> </w:t>
+            </w:r>
+          </w:p>
+          <w:p>
+            <w:pPr>
+              <w:spacing w:before="0" w:after="0" w:line="70" w:lineRule="exact"/>
+            </w:pPr>
+            <w:r>
+              <w:rPr>
+                <w:b w:val="false"/>
+                <w:bCs w:val="false"/>
+                <w:i w:val="false"/>
+                <w:iCs w:val="false"/>
+                <w:color w:val="1A1A1A"/>
+                <w:sz w:val="2"/>
+                <w:szCs w:val="2"/>
+                <w:caps w:val="false"/>
+                <w:rFonts w:ascii="Calibri" w:cs="Calibri" w:eastAsia="Calibri" w:hAnsi="Calibri"/>
+              </w:rPr>
+              <w:t xml:space="preserve"> </w:t>
+            </w:r>
+          </w:p>
+          <w:p>
+            <w:pPr>
+              <w:pBdr>
+                <w:bottom w:val="single" w:color="C9C4B5" w:sz="4" w:space="3"/>
+              </w:pBdr>
+              <w:spacing w:before="0" w:after="0" w:line="255" w:lineRule="auto"/>
+            </w:pPr>
+            <w:r>
+              <w:rPr>
+                <w:b w:val="false"/>
+                <w:bCs w:val="false"/>
+                <w:i w:val="false"/>
+                <w:iCs w:val="false"/>
+                <w:color w:val="1A1A1A"/>
+                <w:sz w:val="16"/>
+                <w:szCs w:val="16"/>
+                <w:caps w:val="false"/>
+                <w:rFonts w:ascii="Calibri" w:cs="Calibri" w:eastAsia="Calibri" w:hAnsi="Calibri"/>
+              </w:rPr>
+              <w:t xml:space="preserve"> </w:t>
+            </w:r>
+          </w:p>
+          <w:p>
+            <w:pPr>
+              <w:spacing w:before="0" w:after="0" w:line="70" w:lineRule="exact"/>
+            </w:pPr>
+            <w:r>
+              <w:rPr>
+                <w:b w:val="false"/>
+                <w:bCs w:val="false"/>
+                <w:i w:val="false"/>
+                <w:iCs w:val="false"/>
+                <w:color w:val="1A1A1A"/>
+                <w:sz w:val="2"/>
+                <w:szCs w:val="2"/>
+                <w:caps w:val="false"/>
+                <w:rFonts w:ascii="Calibri" w:cs="Calibri" w:eastAsia="Calibri" w:hAnsi="Calibri"/>
+              </w:rPr>
+              <w:t xml:space="preserve"> </w:t>
+            </w:r>
+          </w:p>
+          <w:p>
+            <w:pPr>
+              <w:pBdr>
+                <w:bottom w:val="single" w:color="C9C4B5" w:sz="4" w:space="3"/>
+              </w:pBdr>
+              <w:spacing w:before="0" w:after="0" w:line="255" w:lineRule="auto"/>
+            </w:pPr>
+            <w:r>
+              <w:rPr>
+                <w:b w:val="false"/>
+                <w:bCs w:val="false"/>
+                <w:i w:val="false"/>
+                <w:iCs w:val="false"/>
+                <w:color w:val="1A1A1A"/>
+                <w:sz w:val="16"/>
+                <w:szCs w:val="16"/>
+                <w:caps w:val="false"/>
+                <w:rFonts w:ascii="Calibri" w:cs="Calibri" w:eastAsia="Calibri" w:hAnsi="Calibri"/>
+              </w:rPr>
+              <w:t xml:space="preserve"> </w:t>
+            </w:r>
+          </w:p>
+          <w:p>
+            <w:pPr>
+              <w:spacing w:before="0" w:after="0" w:line="70" w:lineRule="exact"/>
+            </w:pPr>
+            <w:r>
+              <w:rPr>
+                <w:b w:val="false"/>
+                <w:bCs w:val="false"/>
+                <w:i w:val="false"/>
+                <w:iCs w:val="false"/>
+                <w:color w:val="1A1A1A"/>
+                <w:sz w:val="2"/>
+                <w:szCs w:val="2"/>
+                <w:caps w:val="false"/>
+                <w:rFonts w:ascii="Calibri" w:cs="Calibri" w:eastAsia="Calibri" w:hAnsi="Calibri"/>
+              </w:rPr>
+              <w:t xml:space="preserve"> </w:t>
+            </w:r>
+          </w:p>
+          <w:p>
+            <w:pPr>
+              <w:pBdr>
+                <w:bottom w:val="single" w:color="C9C4B5" w:sz="4" w:space="3"/>
+              </w:pBdr>
+              <w:spacing w:before="0" w:after="0" w:line="255" w:lineRule="auto"/>
+            </w:pPr>
+            <w:r>
+              <w:rPr>
+                <w:b w:val="false"/>
+                <w:bCs w:val="false"/>
+                <w:i w:val="false"/>
+                <w:iCs w:val="false"/>
+                <w:color w:val="1A1A1A"/>
+                <w:sz w:val="16"/>
+                <w:szCs w:val="16"/>
+                <w:caps w:val="false"/>
+                <w:rFonts w:ascii="Calibri" w:cs="Calibri" w:eastAsia="Calibri" w:hAnsi="Calibri"/>
+              </w:rPr>
+              <w:t xml:space="preserve"> </w:t>
+            </w:r>
+          </w:p>
+          <w:p>
+            <w:pPr>
+              <w:spacing w:before="0" w:after="0" w:line="70" w:lineRule="exact"/>
+            </w:pPr>
+            <w:r>
+              <w:rPr>
+                <w:b w:val="false"/>
+                <w:bCs w:val="false"/>
+                <w:i w:val="false"/>
+                <w:iCs w:val="false"/>
+                <w:color w:val="1A1A1A"/>
+                <w:sz w:val="2"/>
+                <w:szCs w:val="2"/>
+                <w:caps w:val="false"/>
+                <w:rFonts w:ascii="Calibri" w:cs="Calibri" w:eastAsia="Calibri" w:hAnsi="Calibri"/>
+              </w:rPr>
+              <w:t xml:space="preserve"> </w:t>
+            </w:r>
+          </w:p>
+          <w:p>
+            <w:pPr>
+              <w:pBdr>
+                <w:bottom w:val="single" w:color="C9C4B5" w:sz="4" w:space="3"/>
+              </w:pBdr>
+              <w:spacing w:before="0" w:after="0" w:line="255" w:lineRule="auto"/>
+            </w:pPr>
+            <w:r>
+              <w:rPr>
+                <w:b w:val="false"/>
+                <w:bCs w:val="false"/>
+                <w:i w:val="false"/>
+                <w:iCs w:val="false"/>
+                <w:color w:val="1A1A1A"/>
+                <w:sz w:val="16"/>
+                <w:szCs w:val="16"/>
+                <w:caps w:val="false"/>
+                <w:rFonts w:ascii="Calibri" w:cs="Calibri" w:eastAsia="Calibri" w:hAnsi="Calibri"/>
+              </w:rPr>
+              <w:t xml:space="preserve"> </w:t>
+            </w:r>
+          </w:p>
+          <w:p>
+            <w:pPr>
+              <w:spacing w:before="0" w:after="0" w:line="70" w:lineRule="exact"/>
+            </w:pPr>
+            <w:r>
+              <w:rPr>
+                <w:b w:val="false"/>
+                <w:bCs w:val="false"/>
+                <w:i w:val="false"/>
+                <w:iCs w:val="false"/>
+                <w:color w:val="1A1A1A"/>
+                <w:sz w:val="2"/>
+                <w:szCs w:val="2"/>
+                <w:caps w:val="false"/>
+                <w:rFonts w:ascii="Calibri" w:cs="Calibri" w:eastAsia="Calibri" w:hAnsi="Calibri"/>
+              </w:rPr>
+              <w:t xml:space="preserve"> </w:t>
+            </w:r>
+          </w:p>
+          <w:p>
+            <w:pPr>
+              <w:pBdr>
+                <w:bottom w:val="single" w:color="C9C4B5" w:sz="4" w:space="3"/>
+              </w:pBdr>
+              <w:spacing w:before="0" w:after="0" w:line="255" w:lineRule="auto"/>
+            </w:pPr>
+            <w:r>
+              <w:rPr>
+                <w:b w:val="false"/>
+                <w:bCs w:val="false"/>
+                <w:i w:val="false"/>
+                <w:iCs w:val="false"/>
+                <w:color w:val="1A1A1A"/>
+                <w:sz w:val="16"/>
+                <w:szCs w:val="16"/>
+                <w:caps w:val="false"/>
+                <w:rFonts w:ascii="Calibri" w:cs="Calibri" w:eastAsia="Calibri" w:hAnsi="Calibri"/>
+              </w:rPr>
+              <w:t xml:space="preserve"> </w:t>
+            </w:r>
+          </w:p>
+          <w:p>
+            <w:pPr>
+              <w:spacing w:before="0" w:after="0" w:line="70" w:lineRule="exact"/>
+            </w:pPr>
+            <w:r>
+              <w:rPr>
+                <w:b w:val="false"/>
+                <w:bCs w:val="false"/>
+                <w:i w:val="false"/>
+                <w:iCs w:val="false"/>
+                <w:color w:val="1A1A1A"/>
+                <w:sz w:val="2"/>
+                <w:szCs w:val="2"/>
+                <w:caps w:val="false"/>
+                <w:rFonts w:ascii="Calibri" w:cs="Calibri" w:eastAsia="Calibri" w:hAnsi="Calibri"/>
+              </w:rPr>
+              <w:t xml:space="preserve"> </w:t>
+            </w:r>
+          </w:p>
+          <w:p>
+            <w:pPr>
+              <w:pBdr>
+                <w:bottom w:val="single" w:color="C9C4B5" w:sz="4" w:space="3"/>
+              </w:pBdr>
+              <w:spacing w:before="0" w:after="0" w:line="255" w:lineRule="auto"/>
+            </w:pPr>
+            <w:r>
+              <w:rPr>
+                <w:b w:val="false"/>
+                <w:bCs w:val="false"/>
+                <w:i w:val="false"/>
+                <w:iCs w:val="false"/>
+                <w:color w:val="1A1A1A"/>
+                <w:sz w:val="16"/>
+                <w:szCs w:val="16"/>
+                <w:caps w:val="false"/>
+                <w:rFonts w:ascii="Calibri" w:cs="Calibri" w:eastAsia="Calibri" w:hAnsi="Calibri"/>
+              </w:rPr>
+              <w:t xml:space="preserve"> </w:t>
+            </w:r>
+          </w:p>
         </w:tc>
       </w:tr>
     </w:tbl>
+    <w:p>
+      <w:pPr>
+        <w:spacing w:before="100" w:after="30"/>
+      </w:pPr>
+      <w:r>
+        <w:rPr>
+          <w:b w:val="false"/>
+          <w:bCs w:val="false"/>
+          <w:i/>
+          <w:iCs/>
+          <w:color w:val="6B7280"/>
+          <w:sz w:val="19"/>
+          <w:szCs w:val="19"/>
+          <w:caps w:val="false"/>
+          <w:rFonts w:ascii="Calibri" w:cs="Calibri" w:eastAsia="Calibri" w:hAnsi="Calibri"/>
+        </w:rPr>
+        <w:t xml:space="preserve">Keep taking notes — lines run the full width of the page:</w:t>
+      </w:r>
+    </w:p>
+    <w:p>
+      <w:pPr>
+        <w:pBdr>
+          <w:bottom w:val="single" w:color="C9C4B5" w:sz="4" w:space="3"/>
+        </w:pBdr>
+        <w:spacing w:before="0" w:after="0" w:line="255" w:lineRule="auto"/>
+      </w:pPr>
+      <w:r>
+        <w:rPr>
+          <w:b w:val="false"/>
+          <w:bCs w:val="false"/>
+          <w:i w:val="false"/>
+          <w:iCs w:val="false"/>
+          <w:color w:val="1A1A1A"/>
+          <w:sz w:val="16"/>
+          <w:szCs w:val="16"/>
+          <w:caps w:val="false"/>
+          <w:rFonts w:ascii="Calibri" w:cs="Calibri" w:eastAsia="Calibri" w:hAnsi="Calibri"/>
+        </w:rPr>
+        <w:t xml:space="preserve"> </w:t>
+      </w:r>
+    </w:p>
+    <w:p>
+      <w:pPr>
+        <w:spacing w:before="0" w:after="0" w:line="70" w:lineRule="exact"/>
+      </w:pPr>
+      <w:r>
+        <w:rPr>
+          <w:b w:val="false"/>
+          <w:bCs w:val="false"/>
+          <w:i w:val="false"/>
+          <w:iCs w:val="false"/>
+          <w:color w:val="1A1A1A"/>
+          <w:sz w:val="2"/>
+          <w:szCs w:val="2"/>
+          <w:caps w:val="false"/>
+          <w:rFonts w:ascii="Calibri" w:cs="Calibri" w:eastAsia="Calibri" w:hAnsi="Calibri"/>
+        </w:rPr>
+        <w:t xml:space="preserve"> </w:t>
+      </w:r>
+    </w:p>
+    <w:p>
+      <w:pPr>
+        <w:pBdr>
+          <w:bottom w:val="single" w:color="C9C4B5" w:sz="4" w:space="3"/>
+        </w:pBdr>
+        <w:spacing w:before="0" w:after="0" w:line="255" w:lineRule="auto"/>
+      </w:pPr>
+      <w:r>
+        <w:rPr>
+          <w:b w:val="false"/>
+          <w:bCs w:val="false"/>
+          <w:i w:val="false"/>
+          <w:iCs w:val="false"/>
+          <w:color w:val="1A1A1A"/>
+          <w:sz w:val="16"/>
+          <w:szCs w:val="16"/>
+          <w:caps w:val="false"/>
+          <w:rFonts w:ascii="Calibri" w:cs="Calibri" w:eastAsia="Calibri" w:hAnsi="Calibri"/>
+        </w:rPr>
+        <w:t xml:space="preserve"> </w:t>
+      </w:r>
+    </w:p>
+    <w:p>
+      <w:pPr>
+        <w:spacing w:before="0" w:after="0" w:line="70" w:lineRule="exact"/>
+      </w:pPr>
+      <w:r>
+        <w:rPr>
+          <w:b w:val="false"/>
+          <w:bCs w:val="false"/>
+          <w:i w:val="false"/>
+          <w:iCs w:val="false"/>
+          <w:color w:val="1A1A1A"/>
+          <w:sz w:val="2"/>
+          <w:szCs w:val="2"/>
+          <w:caps w:val="false"/>
+          <w:rFonts w:ascii="Calibri" w:cs="Calibri" w:eastAsia="Calibri" w:hAnsi="Calibri"/>
+        </w:rPr>
+        <w:t xml:space="preserve"> </w:t>
+      </w:r>
+    </w:p>
+    <w:p>
+      <w:pPr>
+        <w:pBdr>
+          <w:bottom w:val="single" w:color="C9C4B5" w:sz="4" w:space="3"/>
+        </w:pBdr>
+        <w:spacing w:before="0" w:after="0" w:line="255" w:lineRule="auto"/>
+      </w:pPr>
+      <w:r>
+        <w:rPr>
+          <w:b w:val="false"/>
+          <w:bCs w:val="false"/>
+          <w:i w:val="false"/>
+          <w:iCs w:val="false"/>
+          <w:color w:val="1A1A1A"/>
+          <w:sz w:val="16"/>
+          <w:szCs w:val="16"/>
+          <w:caps w:val="false"/>
+          <w:rFonts w:ascii="Calibri" w:cs="Calibri" w:eastAsia="Calibri" w:hAnsi="Calibri"/>
+        </w:rPr>
+        <w:t xml:space="preserve"> </w:t>
+      </w:r>
+    </w:p>
+    <w:p>
+      <w:pPr>
+        <w:spacing w:before="0" w:after="0" w:line="70" w:lineRule="exact"/>
+      </w:pPr>
+      <w:r>
+        <w:rPr>
+          <w:b w:val="false"/>
+          <w:bCs w:val="false"/>
+          <w:i w:val="false"/>
+          <w:iCs w:val="false"/>
+          <w:color w:val="1A1A1A"/>
+          <w:sz w:val="2"/>
+          <w:szCs w:val="2"/>
+          <w:caps w:val="false"/>
+          <w:rFonts w:ascii="Calibri" w:cs="Calibri" w:eastAsia="Calibri" w:hAnsi="Calibri"/>
+        </w:rPr>
+        <w:t xml:space="preserve"> </w:t>
+      </w:r>
+    </w:p>
+    <w:p>
+      <w:pPr>
+        <w:pBdr>
+          <w:bottom w:val="single" w:color="C9C4B5" w:sz="4" w:space="3"/>
+        </w:pBdr>
+        <w:spacing w:before="0" w:after="0" w:line="255" w:lineRule="auto"/>
+      </w:pPr>
+      <w:r>
+        <w:rPr>
+          <w:b w:val="false"/>
+          <w:bCs w:val="false"/>
+          <w:i w:val="false"/>
+          <w:iCs w:val="false"/>
+          <w:color w:val="1A1A1A"/>
+          <w:sz w:val="16"/>
+          <w:szCs w:val="16"/>
+          <w:caps w:val="false"/>
+          <w:rFonts w:ascii="Calibri" w:cs="Calibri" w:eastAsia="Calibri" w:hAnsi="Calibri"/>
+        </w:rPr>
+        <w:t xml:space="preserve"> </w:t>
+      </w:r>
+    </w:p>
+    <w:p>
+      <w:pPr>
+        <w:spacing w:before="0" w:after="0" w:line="70" w:lineRule="exact"/>
+      </w:pPr>
+      <w:r>
+        <w:rPr>
+          <w:b w:val="false"/>
+          <w:bCs w:val="false"/>
+          <w:i w:val="false"/>
+          <w:iCs w:val="false"/>
+          <w:color w:val="1A1A1A"/>
+          <w:sz w:val="2"/>
+          <w:szCs w:val="2"/>
+          <w:caps w:val="false"/>
+          <w:rFonts w:ascii="Calibri" w:cs="Calibri" w:eastAsia="Calibri" w:hAnsi="Calibri"/>
+        </w:rPr>
+        <w:t xml:space="preserve"> </w:t>
+      </w:r>
+    </w:p>
+    <w:p>
+      <w:pPr>
+        <w:pBdr>
+          <w:bottom w:val="single" w:color="C9C4B5" w:sz="4" w:space="3"/>
+        </w:pBdr>
+        <w:spacing w:before="0" w:after="0" w:line="255" w:lineRule="auto"/>
+      </w:pPr>
+      <w:r>
+        <w:rPr>
+          <w:b w:val="false"/>
+          <w:bCs w:val="false"/>
+          <w:i w:val="false"/>
+          <w:iCs w:val="false"/>
+          <w:color w:val="1A1A1A"/>
+          <w:sz w:val="16"/>
+          <w:szCs w:val="16"/>
+          <w:caps w:val="false"/>
+          <w:rFonts w:ascii="Calibri" w:cs="Calibri" w:eastAsia="Calibri" w:hAnsi="Calibri"/>
+        </w:rPr>
+        <w:t xml:space="preserve"> </w:t>
+      </w:r>
+    </w:p>
+    <w:p>
+      <w:pPr>
+        <w:spacing w:before="0" w:after="0" w:line="70" w:lineRule="exact"/>
+      </w:pPr>
+      <w:r>
+        <w:rPr>
+          <w:b w:val="false"/>
+          <w:bCs w:val="false"/>
+          <w:i w:val="false"/>
+          <w:iCs w:val="false"/>
+          <w:color w:val="1A1A1A"/>
+          <w:sz w:val="2"/>
+          <w:szCs w:val="2"/>
+          <w:caps w:val="false"/>
+          <w:rFonts w:ascii="Calibri" w:cs="Calibri" w:eastAsia="Calibri" w:hAnsi="Calibri"/>
+        </w:rPr>
+        <w:t xml:space="preserve"> </w:t>
+      </w:r>
+    </w:p>
+    <w:p>
+      <w:pPr>
+        <w:pBdr>
+          <w:bottom w:val="single" w:color="C9C4B5" w:sz="4" w:space="3"/>
+        </w:pBdr>
+        <w:spacing w:before="0" w:after="0" w:line="255" w:lineRule="auto"/>
+      </w:pPr>
+      <w:r>
+        <w:rPr>
+          <w:b w:val="false"/>
+          <w:bCs w:val="false"/>
+          <w:i w:val="false"/>
+          <w:iCs w:val="false"/>
+          <w:color w:val="1A1A1A"/>
+          <w:sz w:val="16"/>
+          <w:szCs w:val="16"/>
+          <w:caps w:val="false"/>
+          <w:rFonts w:ascii="Calibri" w:cs="Calibri" w:eastAsia="Calibri" w:hAnsi="Calibri"/>
+        </w:rPr>
+        <w:t xml:space="preserve"> </w:t>
+      </w:r>
+    </w:p>
+    <w:p>
+      <w:pPr>
+        <w:spacing w:before="0" w:after="0" w:line="70" w:lineRule="exact"/>
+      </w:pPr>
+      <w:r>
+        <w:rPr>
+          <w:b w:val="false"/>
+          <w:bCs w:val="false"/>
+          <w:i w:val="false"/>
+          <w:iCs w:val="false"/>
+          <w:color w:val="1A1A1A"/>
+          <w:sz w:val="2"/>
+          <w:szCs w:val="2"/>
+          <w:caps w:val="false"/>
+          <w:rFonts w:ascii="Calibri" w:cs="Calibri" w:eastAsia="Calibri" w:hAnsi="Calibri"/>
+        </w:rPr>
+        <w:t xml:space="preserve"> </w:t>
+      </w:r>
+    </w:p>
+    <w:p>
+      <w:pPr>
+        <w:pBdr>
+          <w:bottom w:val="single" w:color="C9C4B5" w:sz="4" w:space="3"/>
+        </w:pBdr>
+        <w:spacing w:before="0" w:after="0" w:line="255" w:lineRule="auto"/>
+      </w:pPr>
+      <w:r>
+        <w:rPr>
+          <w:b w:val="false"/>
+          <w:bCs w:val="false"/>
+          <w:i w:val="false"/>
+          <w:iCs w:val="false"/>
+          <w:color w:val="1A1A1A"/>
+          <w:sz w:val="16"/>
+          <w:szCs w:val="16"/>
+          <w:caps w:val="false"/>
+          <w:rFonts w:ascii="Calibri" w:cs="Calibri" w:eastAsia="Calibri" w:hAnsi="Calibri"/>
+        </w:rPr>
+        <w:t xml:space="preserve"> </w:t>
+      </w:r>
+    </w:p>
+    <w:p>
+      <w:pPr>
+        <w:spacing w:before="0" w:after="0" w:line="70" w:lineRule="exact"/>
+      </w:pPr>
+      <w:r>
+        <w:rPr>
+          <w:b w:val="false"/>
+          <w:bCs w:val="false"/>
+          <w:i w:val="false"/>
+          <w:iCs w:val="false"/>
+          <w:color w:val="1A1A1A"/>
+          <w:sz w:val="2"/>
+          <w:szCs w:val="2"/>
+          <w:caps w:val="false"/>
+          <w:rFonts w:ascii="Calibri" w:cs="Calibri" w:eastAsia="Calibri" w:hAnsi="Calibri"/>
+        </w:rPr>
+        <w:t xml:space="preserve"> </w:t>
+      </w:r>
+    </w:p>
+    <w:p>
+      <w:pPr>
+        <w:pBdr>
+          <w:bottom w:val="single" w:color="C9C4B5" w:sz="4" w:space="3"/>
+        </w:pBdr>
+        <w:spacing w:before="0" w:after="0" w:line="255" w:lineRule="auto"/>
+      </w:pPr>
+      <w:r>
+        <w:rPr>
+          <w:b w:val="false"/>
+          <w:bCs w:val="false"/>
+          <w:i w:val="false"/>
+          <w:iCs w:val="false"/>
+          <w:color w:val="1A1A1A"/>
+          <w:sz w:val="16"/>
+          <w:szCs w:val="16"/>
+          <w:caps w:val="false"/>
+          <w:rFonts w:ascii="Calibri" w:cs="Calibri" w:eastAsia="Calibri" w:hAnsi="Calibri"/>
+        </w:rPr>
+        <w:t xml:space="preserve"> </w:t>
+      </w:r>
+    </w:p>
+    <w:p>
+      <w:pPr>
+        <w:spacing w:before="0" w:after="0" w:line="70" w:lineRule="exact"/>
+      </w:pPr>
+      <w:r>
+        <w:rPr>
+          <w:b w:val="false"/>
+          <w:bCs w:val="false"/>
+          <w:i w:val="false"/>
+          <w:iCs w:val="false"/>
+          <w:color w:val="1A1A1A"/>
+          <w:sz w:val="2"/>
+          <w:szCs w:val="2"/>
+          <w:caps w:val="false"/>
+          <w:rFonts w:ascii="Calibri" w:cs="Calibri" w:eastAsia="Calibri" w:hAnsi="Calibri"/>
+        </w:rPr>
+        <w:t xml:space="preserve"> </w:t>
+      </w:r>
+    </w:p>
+    <w:p>
+      <w:pPr>
+        <w:pBdr>
+          <w:bottom w:val="single" w:color="C9C4B5" w:sz="4" w:space="3"/>
+        </w:pBdr>
+        <w:spacing w:before="0" w:after="0" w:line="255" w:lineRule="auto"/>
+      </w:pPr>
+      <w:r>
+        <w:rPr>
+          <w:b w:val="false"/>
+          <w:bCs w:val="false"/>
+          <w:i w:val="false"/>
+          <w:iCs w:val="false"/>
+          <w:color w:val="1A1A1A"/>
+          <w:sz w:val="16"/>
+          <w:szCs w:val="16"/>
+          <w:caps w:val="false"/>
+          <w:rFonts w:ascii="Calibri" w:cs="Calibri" w:eastAsia="Calibri" w:hAnsi="Calibri"/>
+        </w:rPr>
+        <w:t xml:space="preserve"> </w:t>
+      </w:r>
+    </w:p>
+    <w:p>
+      <w:pPr>
+        <w:spacing w:before="0" w:after="0" w:line="70" w:lineRule="exact"/>
+      </w:pPr>
+      <w:r>
+        <w:rPr>
+          <w:b w:val="false"/>
+          <w:bCs w:val="false"/>
+          <w:i w:val="false"/>
+          <w:iCs w:val="false"/>
+          <w:color w:val="1A1A1A"/>
+          <w:sz w:val="2"/>
+          <w:szCs w:val="2"/>
+          <w:caps w:val="false"/>
+          <w:rFonts w:ascii="Calibri" w:cs="Calibri" w:eastAsia="Calibri" w:hAnsi="Calibri"/>
+        </w:rPr>
+        <w:t xml:space="preserve"> </w:t>
+      </w:r>
+    </w:p>
+    <w:p>
+      <w:pPr>
+        <w:pBdr>
+          <w:bottom w:val="single" w:color="C9C4B5" w:sz="4" w:space="3"/>
+        </w:pBdr>
+        <w:spacing w:before="0" w:after="0" w:line="255" w:lineRule="auto"/>
+      </w:pPr>
+      <w:r>
+        <w:rPr>
+          <w:b w:val="false"/>
+          <w:bCs w:val="false"/>
+          <w:i w:val="false"/>
+          <w:iCs w:val="false"/>
+          <w:color w:val="1A1A1A"/>
+          <w:sz w:val="16"/>
+          <w:szCs w:val="16"/>
+          <w:caps w:val="false"/>
+          <w:rFonts w:ascii="Calibri" w:cs="Calibri" w:eastAsia="Calibri" w:hAnsi="Calibri"/>
+        </w:rPr>
+        <w:t xml:space="preserve"> </w:t>
+      </w:r>
+    </w:p>
     <w:tbl>
       <w:tblPr>
         <w:tblW w:type="dxa" w:w="9648"/>

</xml_diff>

<commit_message>
S.M.A.R.T. goal scaffold, fill opener dead space, fix doubled 'I can'
- Goal page: replace the open goal box with a S.M.A.R.T. builder table (S/M/A/R/T down the
  left column, notebook lines to write each part) + a 'put it together' box + a 'seal it'
  commitment line. Fill jumps ~52% -> ~77% (verified via render_check).
- Standard opener: add a 'First Impressions' pre-reading quick-write (5 notebook lines) to
  fill the dead space at the bottom (e.g. GC.33 Media & Public Opinion 60% -> 73%).
- Fix doubled 'I can I can ...' in learning targets (strip leading 'I can' from each target).
- Add ONLYSTD=<code> build flag (unit2) + render_check.py to preview/verify a single
  standard's pages. Brand-lock re-verified (all tables 9792). Rebuilt all + large-print.

Co-Authored-By: Claude Opus 4.8 <noreply@anthropic.com>
Claude-Session: https://claude.ai/code/session_01DHdLjiiJeW6A83FcYRQ3qv
</commit_message>
<xml_diff>
--- a/courses/foundations-constitutional-government/BUILD/unit4/deliverables/Unit4_Student_Workbook_CourseStandard.docx
+++ b/courses/foundations-constitutional-government/BUILD/unit4/deliverables/Unit4_Student_Workbook_CourseStandard.docx
@@ -3447,7 +3447,7 @@
           </w:tcPr>
           <w:p>
             <w:pPr>
-              <w:spacing w:after="0"/>
+              <w:spacing w:after="60"/>
             </w:pPr>
             <w:r>
               <w:rPr>
@@ -3461,163 +3461,26 @@
                 <w:caps w:val="false"/>
                 <w:rFonts w:ascii="Calibri" w:cs="Calibri" w:eastAsia="Calibri" w:hAnsi="Calibri"/>
               </w:rPr>
-              <w:t xml:space="preserve">Write YOUR S.M.A.R.T. goal for this unit — use all the lines:</w:t>
-            </w:r>
-          </w:p>
-        </w:tc>
-      </w:tr>
-      <w:tr>
-        <w:tc>
-          <w:tcPr>
-            <w:tcW w:type="dxa" w:w="9792"/>
-            <w:tcBorders>
-              <w:top w:val="single" w:color="D9D5C8" w:sz="4"/>
-              <w:left w:val="single" w:color="D9D5C8" w:sz="4"/>
-              <w:bottom w:val="single" w:color="D9D5C8" w:sz="4"/>
-              <w:right w:val="single" w:color="D9D5C8" w:sz="4"/>
-            </w:tcBorders>
-            <w:tcMar>
-              <w:top w:type="dxa" w:w="55"/>
-              <w:left w:type="dxa" w:w="110"/>
-              <w:bottom w:type="dxa" w:w="55"/>
-              <w:right w:type="dxa" w:w="110"/>
-            </w:tcMar>
-          </w:tcPr>
-          <w:p>
-            <w:pPr>
-              <w:widowControl w:val="false"/>
-              <w:pBdr>
-                <w:bottom w:val="single" w:color="9AA0A6" w:sz="6" w:space="2"/>
-              </w:pBdr>
-              <w:spacing w:before="0" w:after="0" w:line="300" w:lineRule="exact"/>
-            </w:pPr>
-            <w:r>
-              <w:rPr>
-                <w:sz w:val="12"/>
-                <w:szCs w:val="12"/>
-                <w:rFonts w:ascii="Calibri" w:cs="Calibri" w:eastAsia="Calibri" w:hAnsi="Calibri"/>
-              </w:rPr>
-              <w:t xml:space="preserve"> </w:t>
-            </w:r>
-          </w:p>
-          <w:p>
-            <w:pPr>
-              <w:spacing w:before="0" w:after="0" w:line="90" w:lineRule="exact"/>
-            </w:pPr>
-            <w:r>
-              <w:rPr>
-                <w:sz w:val="2"/>
-                <w:szCs w:val="2"/>
-                <w:rFonts w:ascii="Calibri" w:cs="Calibri" w:eastAsia="Calibri" w:hAnsi="Calibri"/>
-              </w:rPr>
-              <w:t xml:space="preserve"> </w:t>
-            </w:r>
-          </w:p>
-          <w:p>
-            <w:pPr>
-              <w:widowControl w:val="false"/>
-              <w:pBdr>
-                <w:bottom w:val="single" w:color="9AA0A6" w:sz="6" w:space="2"/>
-              </w:pBdr>
-              <w:spacing w:before="0" w:after="0" w:line="300" w:lineRule="exact"/>
-            </w:pPr>
-            <w:r>
-              <w:rPr>
-                <w:sz w:val="12"/>
-                <w:szCs w:val="12"/>
-                <w:rFonts w:ascii="Calibri" w:cs="Calibri" w:eastAsia="Calibri" w:hAnsi="Calibri"/>
-              </w:rPr>
-              <w:t xml:space="preserve"> </w:t>
-            </w:r>
-          </w:p>
-          <w:p>
-            <w:pPr>
-              <w:spacing w:before="0" w:after="0" w:line="90" w:lineRule="exact"/>
-            </w:pPr>
-            <w:r>
-              <w:rPr>
-                <w:sz w:val="2"/>
-                <w:szCs w:val="2"/>
-                <w:rFonts w:ascii="Calibri" w:cs="Calibri" w:eastAsia="Calibri" w:hAnsi="Calibri"/>
-              </w:rPr>
-              <w:t xml:space="preserve"> </w:t>
-            </w:r>
-          </w:p>
-          <w:p>
-            <w:pPr>
-              <w:widowControl w:val="false"/>
-              <w:pBdr>
-                <w:bottom w:val="single" w:color="9AA0A6" w:sz="6" w:space="2"/>
-              </w:pBdr>
-              <w:spacing w:before="0" w:after="0" w:line="300" w:lineRule="exact"/>
-            </w:pPr>
-            <w:r>
-              <w:rPr>
-                <w:sz w:val="12"/>
-                <w:szCs w:val="12"/>
-                <w:rFonts w:ascii="Calibri" w:cs="Calibri" w:eastAsia="Calibri" w:hAnsi="Calibri"/>
-              </w:rPr>
-              <w:t xml:space="preserve"> </w:t>
-            </w:r>
-          </w:p>
-          <w:p>
-            <w:pPr>
-              <w:spacing w:before="0" w:after="0" w:line="90" w:lineRule="exact"/>
-            </w:pPr>
-            <w:r>
-              <w:rPr>
-                <w:sz w:val="2"/>
-                <w:szCs w:val="2"/>
-                <w:rFonts w:ascii="Calibri" w:cs="Calibri" w:eastAsia="Calibri" w:hAnsi="Calibri"/>
-              </w:rPr>
-              <w:t xml:space="preserve"> </w:t>
-            </w:r>
-          </w:p>
-          <w:p>
-            <w:pPr>
-              <w:widowControl w:val="false"/>
-              <w:pBdr>
-                <w:bottom w:val="single" w:color="9AA0A6" w:sz="6" w:space="2"/>
-              </w:pBdr>
-              <w:spacing w:before="0" w:after="0" w:line="300" w:lineRule="exact"/>
-            </w:pPr>
-            <w:r>
-              <w:rPr>
-                <w:sz w:val="12"/>
-                <w:szCs w:val="12"/>
-                <w:rFonts w:ascii="Calibri" w:cs="Calibri" w:eastAsia="Calibri" w:hAnsi="Calibri"/>
-              </w:rPr>
-              <w:t xml:space="preserve"> </w:t>
-            </w:r>
-          </w:p>
-          <w:p>
-            <w:pPr>
-              <w:spacing w:before="0" w:after="0" w:line="90" w:lineRule="exact"/>
-            </w:pPr>
-            <w:r>
-              <w:rPr>
-                <w:sz w:val="2"/>
-                <w:szCs w:val="2"/>
-                <w:rFonts w:ascii="Calibri" w:cs="Calibri" w:eastAsia="Calibri" w:hAnsi="Calibri"/>
-              </w:rPr>
-              <w:t xml:space="preserve"> </w:t>
-            </w:r>
-          </w:p>
-          <w:p>
-            <w:pPr>
-              <w:widowControl w:val="false"/>
-              <w:pBdr>
-                <w:bottom w:val="single" w:color="9AA0A6" w:sz="6" w:space="2"/>
-              </w:pBdr>
-              <w:spacing w:before="0" w:after="0" w:line="300" w:lineRule="exact"/>
-            </w:pPr>
-            <w:r>
-              <w:rPr>
-                <w:sz w:val="12"/>
-                <w:szCs w:val="12"/>
-                <w:rFonts w:ascii="Calibri" w:cs="Calibri" w:eastAsia="Calibri" w:hAnsi="Calibri"/>
-              </w:rPr>
-              <w:t xml:space="preserve"> </w:t>
+              <w:t xml:space="preserve">BUILD YOURS — write each piece on the lines, then combine them at the bottom</w:t>
+            </w:r>
+          </w:p>
+          <w:p>
+            <w:pPr>
+              <w:spacing w:after="40"/>
+            </w:pPr>
+            <w:r>
+              <w:rPr>
+                <w:b w:val="false"/>
+                <w:bCs w:val="false"/>
+                <w:i w:val="false"/>
+                <w:iCs w:val="false"/>
+                <w:color w:val="1A1A1A"/>
+                <w:sz w:val="22"/>
+                <w:szCs w:val="22"/>
+                <w:caps w:val="false"/>
+                <w:rFonts w:ascii="Calibri" w:cs="Calibri" w:eastAsia="Calibri" w:hAnsi="Calibri"/>
+              </w:rPr>
+              <w:t xml:space="preserve">Fill in each part of your goal. Use the lines.</w:t>
             </w:r>
           </w:p>
         </w:tc>
@@ -3636,8 +3499,8 @@
         </w:tblBorders>
       </w:tblPr>
       <w:tblGrid>
-        <w:gridCol w:w="3045"/>
-        <w:gridCol w:w="6747"/>
+        <w:gridCol w:w="3900"/>
+        <w:gridCol w:w="5892"/>
       </w:tblGrid>
       <w:tr>
         <w:trPr>
@@ -3645,7 +3508,7 @@
         </w:trPr>
         <w:tc>
           <w:tcPr>
-            <w:tcW w:type="dxa" w:w="3045"/>
+            <w:tcW w:type="dxa" w:w="3900"/>
             <w:tcBorders>
               <w:top w:val="single" w:color="D9D5C8" w:sz="4"/>
               <w:left w:val="single" w:color="D9D5C8" w:sz="4"/>
@@ -3676,13 +3539,13 @@
                 <w:caps w:val="false"/>
                 <w:rFonts w:ascii="Calibri" w:cs="Calibri" w:eastAsia="Calibri" w:hAnsi="Calibri"/>
               </w:rPr>
-              <w:t xml:space="preserve">Before we start…</w:t>
-            </w:r>
-          </w:p>
-        </w:tc>
-        <w:tc>
-          <w:tcPr>
-            <w:tcW w:type="dxa" w:w="6747"/>
+              <w:t xml:space="preserve">Part of my goal</w:t>
+            </w:r>
+          </w:p>
+        </w:tc>
+        <w:tc>
+          <w:tcPr>
+            <w:tcW w:type="dxa" w:w="5892"/>
             <w:tcBorders>
               <w:top w:val="single" w:color="D9D5C8" w:sz="4"/>
               <w:left w:val="single" w:color="D9D5C8" w:sz="4"/>
@@ -3713,7 +3576,7 @@
                 <w:caps w:val="false"/>
                 <w:rFonts w:ascii="Calibri" w:cs="Calibri" w:eastAsia="Calibri" w:hAnsi="Calibri"/>
               </w:rPr>
-              <w:t xml:space="preserve">Write on the lines</w:t>
+              <w:t xml:space="preserve">Write your piece on the lines</w:t>
             </w:r>
           </w:p>
         </w:tc>
@@ -3721,7 +3584,7 @@
       <w:tr>
         <w:tc>
           <w:tcPr>
-            <w:tcW w:type="dxa" w:w="3045"/>
+            <w:tcW w:type="dxa" w:w="3900"/>
             <w:tcBorders>
               <w:top w:val="single" w:color="D9D5C8" w:sz="4"/>
               <w:left w:val="single" w:color="D9D5C8" w:sz="4"/>
@@ -3751,13 +3614,13 @@
                 <w:caps w:val="false"/>
                 <w:rFonts w:ascii="Calibri" w:cs="Calibri" w:eastAsia="Calibri" w:hAnsi="Calibri"/>
               </w:rPr>
-              <w:t xml:space="preserve">One thing I already know</w:t>
-            </w:r>
-          </w:p>
-        </w:tc>
-        <w:tc>
-          <w:tcPr>
-            <w:tcW w:type="dxa" w:w="6747"/>
+              <w:t xml:space="preserve">S — Specific: what exactly will I be able to do?</w:t>
+            </w:r>
+          </w:p>
+        </w:tc>
+        <w:tc>
+          <w:tcPr>
+            <w:tcW w:type="dxa" w:w="5892"/>
             <w:tcBorders>
               <w:top w:val="single" w:color="D9D5C8" w:sz="4"/>
               <w:left w:val="single" w:color="D9D5C8" w:sz="4"/>
@@ -3823,7 +3686,7 @@
       <w:tr>
         <w:tc>
           <w:tcPr>
-            <w:tcW w:type="dxa" w:w="3045"/>
+            <w:tcW w:type="dxa" w:w="3900"/>
             <w:tcBorders>
               <w:top w:val="single" w:color="D9D5C8" w:sz="4"/>
               <w:left w:val="single" w:color="D9D5C8" w:sz="4"/>
@@ -3853,13 +3716,13 @@
                 <w:caps w:val="false"/>
                 <w:rFonts w:ascii="Calibri" w:cs="Calibri" w:eastAsia="Calibri" w:hAnsi="Calibri"/>
               </w:rPr>
-              <w:t xml:space="preserve">One question I want answered</w:t>
-            </w:r>
-          </w:p>
-        </w:tc>
-        <w:tc>
-          <w:tcPr>
-            <w:tcW w:type="dxa" w:w="6747"/>
+              <w:t xml:space="preserve">M — Measurable: how will I prove it? (a score, a diagram, teaching a partner)</w:t>
+            </w:r>
+          </w:p>
+        </w:tc>
+        <w:tc>
+          <w:tcPr>
+            <w:tcW w:type="dxa" w:w="5892"/>
             <w:tcBorders>
               <w:top w:val="single" w:color="D9D5C8" w:sz="4"/>
               <w:left w:val="single" w:color="D9D5C8" w:sz="4"/>
@@ -3922,103 +3785,26 @@
           </w:p>
         </w:tc>
       </w:tr>
-    </w:tbl>
-    <w:p>
-      <w:r>
-        <w:br w:type="page"/>
-      </w:r>
-    </w:p>
-    <w:p>
-      <w:pPr>
-        <w:pStyle w:val="Heading1"/>
-        <w:keepNext/>
-        <w:pageBreakBefore/>
-        <w:spacing w:before="220" w:after="90"/>
-      </w:pPr>
-      <w:r>
-        <w:rPr>
-          <w:b/>
-          <w:bCs/>
-          <w:i w:val="false"/>
-          <w:iCs w:val="false"/>
-          <w:color w:val="1B2A4A"/>
-          <w:sz w:val="36"/>
-          <w:szCs w:val="36"/>
-          <w:caps w:val="false"/>
-          <w:rFonts w:ascii="Calibri" w:cs="Calibri" w:eastAsia="Calibri" w:hAnsi="Calibri"/>
-        </w:rPr>
-        <w:t xml:space="preserve">Standard GC.16 — Article II &amp; the Presidency</w:t>
-      </w:r>
-    </w:p>
-    <w:p>
-      <w:pPr>
-        <w:spacing w:after="60"/>
-      </w:pPr>
-      <w:r>
-        <w:rPr>
-          <w:b/>
-          <w:bCs/>
-          <w:i w:val="false"/>
-          <w:iCs w:val="false"/>
-          <w:color w:val="1A1A1A"/>
-          <w:sz w:val="22"/>
-          <w:szCs w:val="22"/>
-          <w:caps w:val="false"/>
-          <w:rFonts w:ascii="Calibri" w:cs="Calibri" w:eastAsia="Calibri" w:hAnsi="Calibri"/>
-        </w:rPr>
-        <w:t xml:space="preserve">TN Academic Standard GC.16: </w:t>
-      </w:r>
-      <w:r>
-        <w:rPr>
-          <w:b w:val="false"/>
-          <w:bCs w:val="false"/>
-          <w:i w:val="false"/>
-          <w:iCs w:val="false"/>
-          <w:color w:val="1A1A1A"/>
-          <w:sz w:val="22"/>
-          <w:szCs w:val="22"/>
-          <w:caps w:val="false"/>
-          <w:rFonts w:ascii="Calibri" w:cs="Calibri" w:eastAsia="Calibri" w:hAnsi="Calibri"/>
-        </w:rPr>
-        <w:t xml:space="preserve">Analyze Article II of the U.S. Constitution as it relates to the executive branch, including: appointments; Commander-in-chief of the military; eligibility for office; executive orders; length of term (22nd Amendment); oath of office; powers of the president; succession (25th Amendment); treaties. (H)</w:t>
-      </w:r>
-    </w:p>
-    <w:tbl>
-      <w:tblPr>
-        <w:tblW w:type="dxa" w:w="9792"/>
-        <w:tblBorders>
-          <w:top w:val="single" w:color="auto" w:sz="4"/>
-          <w:left w:val="single" w:color="auto" w:sz="4"/>
-          <w:bottom w:val="single" w:color="auto" w:sz="4"/>
-          <w:right w:val="single" w:color="auto" w:sz="4"/>
-          <w:insideH w:val="single" w:color="auto" w:sz="4"/>
-          <w:insideV w:val="single" w:color="auto" w:sz="4"/>
-        </w:tblBorders>
-      </w:tblPr>
-      <w:tblGrid>
-        <w:gridCol w:w="9792"/>
-      </w:tblGrid>
       <w:tr>
         <w:tc>
           <w:tcPr>
-            <w:tcW w:type="dxa" w:w="9792"/>
-            <w:tcBorders>
-              <w:top w:val="single" w:color="D9D5C8" w:sz="4"/>
-              <w:left w:val="single" w:color="D9D5C8" w:sz="4"/>
-              <w:bottom w:val="single" w:color="D9D5C8" w:sz="4"/>
-              <w:right w:val="single" w:color="D9D5C8" w:sz="4"/>
-            </w:tcBorders>
-            <w:shd w:fill="F7F5EF" w:color="auto" w:val="clear"/>
-            <w:tcMar>
-              <w:top w:type="dxa" w:w="55"/>
-              <w:left w:type="dxa" w:w="110"/>
-              <w:bottom w:type="dxa" w:w="55"/>
-              <w:right w:type="dxa" w:w="110"/>
-            </w:tcMar>
-          </w:tcPr>
-          <w:p>
-            <w:pPr>
-              <w:spacing w:after="60"/>
+            <w:tcW w:type="dxa" w:w="3900"/>
+            <w:tcBorders>
+              <w:top w:val="single" w:color="D9D5C8" w:sz="4"/>
+              <w:left w:val="single" w:color="D9D5C8" w:sz="4"/>
+              <w:bottom w:val="single" w:color="D9D5C8" w:sz="4"/>
+              <w:right w:val="single" w:color="D9D5C8" w:sz="4"/>
+            </w:tcBorders>
+            <w:tcMar>
+              <w:top w:type="dxa" w:w="55"/>
+              <w:left w:type="dxa" w:w="110"/>
+              <w:bottom w:type="dxa" w:w="55"/>
+              <w:right w:type="dxa" w:w="110"/>
+            </w:tcMar>
+          </w:tcPr>
+          <w:p>
+            <w:pPr>
+              <w:spacing w:after="0"/>
             </w:pPr>
             <w:r>
               <w:rPr>
@@ -4026,106 +3812,101 @@
                 <w:bCs/>
                 <w:i w:val="false"/>
                 <w:iCs w:val="false"/>
-                <w:color w:val="1B2A4A"/>
-                <w:sz w:val="21"/>
-                <w:szCs w:val="21"/>
-                <w:caps w:val="false"/>
-                <w:rFonts w:ascii="Calibri" w:cs="Calibri" w:eastAsia="Calibri" w:hAnsi="Calibri"/>
-              </w:rPr>
-              <w:t xml:space="preserve">LEARNING TARGETS — I can…</w:t>
-            </w:r>
-          </w:p>
-          <w:p>
-            <w:pPr>
-              <w:spacing w:after="40"/>
-            </w:pPr>
-            <w:r>
-              <w:rPr>
-                <w:b w:val="false"/>
-                <w:bCs w:val="false"/>
-                <w:i w:val="false"/>
-                <w:iCs w:val="false"/>
                 <w:color w:val="1A1A1A"/>
-                <w:sz w:val="21"/>
-                <w:szCs w:val="21"/>
-                <w:caps w:val="false"/>
-                <w:rFonts w:ascii="Calibri" w:cs="Calibri" w:eastAsia="Calibri" w:hAnsi="Calibri"/>
-              </w:rPr>
-              <w:t xml:space="preserve">•  I can I can analyze Article II — the qualifications, powers, roles, term, and succession of the President..</w:t>
+                <w:sz w:val="20"/>
+                <w:szCs w:val="20"/>
+                <w:caps w:val="false"/>
+                <w:rFonts w:ascii="Calibri" w:cs="Calibri" w:eastAsia="Calibri" w:hAnsi="Calibri"/>
+              </w:rPr>
+              <w:t xml:space="preserve">A — Achievable: what effort will it take to reach it?</w:t>
+            </w:r>
+          </w:p>
+        </w:tc>
+        <w:tc>
+          <w:tcPr>
+            <w:tcW w:type="dxa" w:w="5892"/>
+            <w:tcBorders>
+              <w:top w:val="single" w:color="D9D5C8" w:sz="4"/>
+              <w:left w:val="single" w:color="D9D5C8" w:sz="4"/>
+              <w:bottom w:val="single" w:color="D9D5C8" w:sz="4"/>
+              <w:right w:val="single" w:color="D9D5C8" w:sz="4"/>
+            </w:tcBorders>
+            <w:tcMar>
+              <w:top w:type="dxa" w:w="55"/>
+              <w:left w:type="dxa" w:w="110"/>
+              <w:bottom w:type="dxa" w:w="55"/>
+              <w:right w:type="dxa" w:w="110"/>
+            </w:tcMar>
+          </w:tcPr>
+          <w:p>
+            <w:pPr>
+              <w:widowControl w:val="false"/>
+              <w:pBdr>
+                <w:bottom w:val="single" w:color="9AA0A6" w:sz="6" w:space="2"/>
+              </w:pBdr>
+              <w:spacing w:before="0" w:after="0" w:line="300" w:lineRule="exact"/>
+            </w:pPr>
+            <w:r>
+              <w:rPr>
+                <w:sz w:val="12"/>
+                <w:szCs w:val="12"/>
+                <w:rFonts w:ascii="Calibri" w:cs="Calibri" w:eastAsia="Calibri" w:hAnsi="Calibri"/>
+              </w:rPr>
+              <w:t xml:space="preserve"> </w:t>
+            </w:r>
+          </w:p>
+          <w:p>
+            <w:pPr>
+              <w:spacing w:before="0" w:after="0" w:line="90" w:lineRule="exact"/>
+            </w:pPr>
+            <w:r>
+              <w:rPr>
+                <w:sz w:val="2"/>
+                <w:szCs w:val="2"/>
+                <w:rFonts w:ascii="Calibri" w:cs="Calibri" w:eastAsia="Calibri" w:hAnsi="Calibri"/>
+              </w:rPr>
+              <w:t xml:space="preserve"> </w:t>
+            </w:r>
+          </w:p>
+          <w:p>
+            <w:pPr>
+              <w:widowControl w:val="false"/>
+              <w:pBdr>
+                <w:bottom w:val="single" w:color="9AA0A6" w:sz="6" w:space="2"/>
+              </w:pBdr>
+              <w:spacing w:before="0" w:after="0" w:line="300" w:lineRule="exact"/>
+            </w:pPr>
+            <w:r>
+              <w:rPr>
+                <w:sz w:val="12"/>
+                <w:szCs w:val="12"/>
+                <w:rFonts w:ascii="Calibri" w:cs="Calibri" w:eastAsia="Calibri" w:hAnsi="Calibri"/>
+              </w:rPr>
+              <w:t xml:space="preserve"> </w:t>
             </w:r>
           </w:p>
         </w:tc>
       </w:tr>
-    </w:tbl>
-    <w:p>
-      <w:pPr>
-        <w:spacing w:after="80"/>
-      </w:pPr>
-      <w:r>
-        <w:rPr>
-          <w:b/>
-          <w:bCs/>
-          <w:i w:val="false"/>
-          <w:iCs w:val="false"/>
-          <w:color w:val="1B2A4A"/>
-          <w:sz w:val="19"/>
-          <w:szCs w:val="19"/>
-          <w:caps w:val="false"/>
-          <w:rFonts w:ascii="Calibri" w:cs="Calibri" w:eastAsia="Calibri" w:hAnsi="Calibri"/>
-        </w:rPr>
-        <w:t xml:space="preserve">Lenses for this standard: </w:t>
-      </w:r>
-      <w:r>
-        <w:rPr>
-          <w:b w:val="false"/>
-          <w:bCs w:val="false"/>
-          <w:i w:val="false"/>
-          <w:iCs w:val="false"/>
-          <w:color w:val="6B7280"/>
-          <w:sz w:val="19"/>
-          <w:szCs w:val="19"/>
-          <w:caps w:val="false"/>
-          <w:rFonts w:ascii="Calibri" w:cs="Calibri" w:eastAsia="Calibri" w:hAnsi="Calibri"/>
-        </w:rPr>
-        <w:t xml:space="preserve">History (H)</w:t>
-      </w:r>
-    </w:p>
-    <w:tbl>
-      <w:tblPr>
-        <w:tblW w:type="dxa" w:w="9792"/>
-        <w:tblBorders>
-          <w:top w:val="single" w:color="auto" w:sz="4"/>
-          <w:left w:val="single" w:color="auto" w:sz="4"/>
-          <w:bottom w:val="single" w:color="auto" w:sz="4"/>
-          <w:right w:val="single" w:color="auto" w:sz="4"/>
-          <w:insideH w:val="single" w:color="auto" w:sz="4"/>
-          <w:insideV w:val="single" w:color="auto" w:sz="4"/>
-        </w:tblBorders>
-      </w:tblPr>
-      <w:tblGrid>
-        <w:gridCol w:w="9792"/>
-      </w:tblGrid>
       <w:tr>
         <w:tc>
           <w:tcPr>
-            <w:tcW w:type="dxa" w:w="9792"/>
-            <w:tcBorders>
-              <w:top w:val="single" w:color="1B2A4A" w:sz="4"/>
-              <w:left w:val="single" w:color="1B2A4A" w:sz="4"/>
-              <w:bottom w:val="single" w:color="1B2A4A" w:sz="4"/>
-              <w:right w:val="single" w:color="1B2A4A" w:sz="4"/>
-            </w:tcBorders>
-            <w:shd w:fill="1B2A4A" w:color="auto" w:val="clear"/>
-            <w:tcMar>
-              <w:top w:type="dxa" w:w="55"/>
-              <w:left w:type="dxa" w:w="110"/>
-              <w:bottom w:type="dxa" w:w="55"/>
-              <w:right w:type="dxa" w:w="110"/>
-            </w:tcMar>
-          </w:tcPr>
-          <w:p>
-            <w:pPr>
-              <w:spacing w:after="70"/>
+            <w:tcW w:type="dxa" w:w="3900"/>
+            <w:tcBorders>
+              <w:top w:val="single" w:color="D9D5C8" w:sz="4"/>
+              <w:left w:val="single" w:color="D9D5C8" w:sz="4"/>
+              <w:bottom w:val="single" w:color="D9D5C8" w:sz="4"/>
+              <w:right w:val="single" w:color="D9D5C8" w:sz="4"/>
+            </w:tcBorders>
+            <w:tcMar>
+              <w:top w:type="dxa" w:w="55"/>
+              <w:left w:type="dxa" w:w="110"/>
+              <w:bottom w:type="dxa" w:w="55"/>
+              <w:right w:type="dxa" w:w="110"/>
+            </w:tcMar>
+          </w:tcPr>
+          <w:p>
+            <w:pPr>
+              <w:spacing w:after="0"/>
             </w:pPr>
             <w:r>
               <w:rPr>
@@ -4133,32 +3914,179 @@
                 <w:bCs/>
                 <w:i w:val="false"/>
                 <w:iCs w:val="false"/>
-                <w:color w:val="C89B3C"/>
-                <w:sz w:val="23"/>
-                <w:szCs w:val="23"/>
-                <w:caps w:val="false"/>
-                <w:rFonts w:ascii="Calibri" w:cs="Calibri" w:eastAsia="Calibri" w:hAnsi="Calibri"/>
-              </w:rPr>
-              <w:t xml:space="preserve">CORE PATH — the same for every student</w:t>
-            </w:r>
-          </w:p>
-          <w:p>
-            <w:pPr>
-              <w:spacing w:after="40"/>
-            </w:pPr>
-            <w:r>
-              <w:rPr>
-                <w:b w:val="false"/>
-                <w:bCs w:val="false"/>
-                <w:i w:val="false"/>
-                <w:iCs w:val="false"/>
-                <w:color w:val="FFFFFF"/>
-                <w:sz w:val="22"/>
-                <w:szCs w:val="22"/>
-                <w:caps w:val="false"/>
-                <w:rFonts w:ascii="Calibri" w:cs="Calibri" w:eastAsia="Calibri" w:hAnsi="Calibri"/>
-              </w:rPr>
-              <w:t xml:space="preserve">Every student works this standard at the same rigor: analyze the sources and vocabulary, then demonstrate learning on the Practice Quiz and CER. UDL and MTSS give you flexible ways in — they never lower the bar. Check yourself against the learning targets on the Cornell Notes page.</w:t>
+                <w:color w:val="1A1A1A"/>
+                <w:sz w:val="20"/>
+                <w:szCs w:val="20"/>
+                <w:caps w:val="false"/>
+                <w:rFonts w:ascii="Calibri" w:cs="Calibri" w:eastAsia="Calibri" w:hAnsi="Calibri"/>
+              </w:rPr>
+              <w:t xml:space="preserve">R — Relevant: how does it connect to the big question above?</w:t>
+            </w:r>
+          </w:p>
+        </w:tc>
+        <w:tc>
+          <w:tcPr>
+            <w:tcW w:type="dxa" w:w="5892"/>
+            <w:tcBorders>
+              <w:top w:val="single" w:color="D9D5C8" w:sz="4"/>
+              <w:left w:val="single" w:color="D9D5C8" w:sz="4"/>
+              <w:bottom w:val="single" w:color="D9D5C8" w:sz="4"/>
+              <w:right w:val="single" w:color="D9D5C8" w:sz="4"/>
+            </w:tcBorders>
+            <w:tcMar>
+              <w:top w:type="dxa" w:w="55"/>
+              <w:left w:type="dxa" w:w="110"/>
+              <w:bottom w:type="dxa" w:w="55"/>
+              <w:right w:type="dxa" w:w="110"/>
+            </w:tcMar>
+          </w:tcPr>
+          <w:p>
+            <w:pPr>
+              <w:widowControl w:val="false"/>
+              <w:pBdr>
+                <w:bottom w:val="single" w:color="9AA0A6" w:sz="6" w:space="2"/>
+              </w:pBdr>
+              <w:spacing w:before="0" w:after="0" w:line="300" w:lineRule="exact"/>
+            </w:pPr>
+            <w:r>
+              <w:rPr>
+                <w:sz w:val="12"/>
+                <w:szCs w:val="12"/>
+                <w:rFonts w:ascii="Calibri" w:cs="Calibri" w:eastAsia="Calibri" w:hAnsi="Calibri"/>
+              </w:rPr>
+              <w:t xml:space="preserve"> </w:t>
+            </w:r>
+          </w:p>
+          <w:p>
+            <w:pPr>
+              <w:spacing w:before="0" w:after="0" w:line="90" w:lineRule="exact"/>
+            </w:pPr>
+            <w:r>
+              <w:rPr>
+                <w:sz w:val="2"/>
+                <w:szCs w:val="2"/>
+                <w:rFonts w:ascii="Calibri" w:cs="Calibri" w:eastAsia="Calibri" w:hAnsi="Calibri"/>
+              </w:rPr>
+              <w:t xml:space="preserve"> </w:t>
+            </w:r>
+          </w:p>
+          <w:p>
+            <w:pPr>
+              <w:widowControl w:val="false"/>
+              <w:pBdr>
+                <w:bottom w:val="single" w:color="9AA0A6" w:sz="6" w:space="2"/>
+              </w:pBdr>
+              <w:spacing w:before="0" w:after="0" w:line="300" w:lineRule="exact"/>
+            </w:pPr>
+            <w:r>
+              <w:rPr>
+                <w:sz w:val="12"/>
+                <w:szCs w:val="12"/>
+                <w:rFonts w:ascii="Calibri" w:cs="Calibri" w:eastAsia="Calibri" w:hAnsi="Calibri"/>
+              </w:rPr>
+              <w:t xml:space="preserve"> </w:t>
+            </w:r>
+          </w:p>
+        </w:tc>
+      </w:tr>
+      <w:tr>
+        <w:tc>
+          <w:tcPr>
+            <w:tcW w:type="dxa" w:w="3900"/>
+            <w:tcBorders>
+              <w:top w:val="single" w:color="D9D5C8" w:sz="4"/>
+              <w:left w:val="single" w:color="D9D5C8" w:sz="4"/>
+              <w:bottom w:val="single" w:color="D9D5C8" w:sz="4"/>
+              <w:right w:val="single" w:color="D9D5C8" w:sz="4"/>
+            </w:tcBorders>
+            <w:tcMar>
+              <w:top w:type="dxa" w:w="55"/>
+              <w:left w:type="dxa" w:w="110"/>
+              <w:bottom w:type="dxa" w:w="55"/>
+              <w:right w:type="dxa" w:w="110"/>
+            </w:tcMar>
+          </w:tcPr>
+          <w:p>
+            <w:pPr>
+              <w:spacing w:after="0"/>
+            </w:pPr>
+            <w:r>
+              <w:rPr>
+                <w:b/>
+                <w:bCs/>
+                <w:i w:val="false"/>
+                <w:iCs w:val="false"/>
+                <w:color w:val="1A1A1A"/>
+                <w:sz w:val="20"/>
+                <w:szCs w:val="20"/>
+                <w:caps w:val="false"/>
+                <w:rFonts w:ascii="Calibri" w:cs="Calibri" w:eastAsia="Calibri" w:hAnsi="Calibri"/>
+              </w:rPr>
+              <w:t xml:space="preserve">T — Time-bound: by when?</w:t>
+            </w:r>
+          </w:p>
+        </w:tc>
+        <w:tc>
+          <w:tcPr>
+            <w:tcW w:type="dxa" w:w="5892"/>
+            <w:tcBorders>
+              <w:top w:val="single" w:color="D9D5C8" w:sz="4"/>
+              <w:left w:val="single" w:color="D9D5C8" w:sz="4"/>
+              <w:bottom w:val="single" w:color="D9D5C8" w:sz="4"/>
+              <w:right w:val="single" w:color="D9D5C8" w:sz="4"/>
+            </w:tcBorders>
+            <w:tcMar>
+              <w:top w:type="dxa" w:w="55"/>
+              <w:left w:type="dxa" w:w="110"/>
+              <w:bottom w:type="dxa" w:w="55"/>
+              <w:right w:type="dxa" w:w="110"/>
+            </w:tcMar>
+          </w:tcPr>
+          <w:p>
+            <w:pPr>
+              <w:widowControl w:val="false"/>
+              <w:pBdr>
+                <w:bottom w:val="single" w:color="9AA0A6" w:sz="6" w:space="2"/>
+              </w:pBdr>
+              <w:spacing w:before="0" w:after="0" w:line="300" w:lineRule="exact"/>
+            </w:pPr>
+            <w:r>
+              <w:rPr>
+                <w:sz w:val="12"/>
+                <w:szCs w:val="12"/>
+                <w:rFonts w:ascii="Calibri" w:cs="Calibri" w:eastAsia="Calibri" w:hAnsi="Calibri"/>
+              </w:rPr>
+              <w:t xml:space="preserve"> </w:t>
+            </w:r>
+          </w:p>
+          <w:p>
+            <w:pPr>
+              <w:spacing w:before="0" w:after="0" w:line="90" w:lineRule="exact"/>
+            </w:pPr>
+            <w:r>
+              <w:rPr>
+                <w:sz w:val="2"/>
+                <w:szCs w:val="2"/>
+                <w:rFonts w:ascii="Calibri" w:cs="Calibri" w:eastAsia="Calibri" w:hAnsi="Calibri"/>
+              </w:rPr>
+              <w:t xml:space="preserve"> </w:t>
+            </w:r>
+          </w:p>
+          <w:p>
+            <w:pPr>
+              <w:widowControl w:val="false"/>
+              <w:pBdr>
+                <w:bottom w:val="single" w:color="9AA0A6" w:sz="6" w:space="2"/>
+              </w:pBdr>
+              <w:spacing w:before="0" w:after="0" w:line="300" w:lineRule="exact"/>
+            </w:pPr>
+            <w:r>
+              <w:rPr>
+                <w:sz w:val="12"/>
+                <w:szCs w:val="12"/>
+                <w:rFonts w:ascii="Calibri" w:cs="Calibri" w:eastAsia="Calibri" w:hAnsi="Calibri"/>
+              </w:rPr>
+              <w:t xml:space="preserve"> </w:t>
             </w:r>
           </w:p>
         </w:tc>
@@ -4199,7 +4127,7 @@
           </w:tcPr>
           <w:p>
             <w:pPr>
-              <w:spacing w:after="60"/>
+              <w:spacing w:after="0"/>
             </w:pPr>
             <w:r>
               <w:rPr>
@@ -4213,7 +4141,158 @@
                 <w:caps w:val="false"/>
                 <w:rFonts w:ascii="Calibri" w:cs="Calibri" w:eastAsia="Calibri" w:hAnsi="Calibri"/>
               </w:rPr>
-              <w:t xml:space="preserve">SET YOUR GOAL (self-direction)</w:t>
+              <w:t xml:space="preserve">PUT IT TOGETHER — my S.M.A.R.T. goal in one or two sentences:</w:t>
+            </w:r>
+          </w:p>
+        </w:tc>
+      </w:tr>
+      <w:tr>
+        <w:tc>
+          <w:tcPr>
+            <w:tcW w:type="dxa" w:w="9792"/>
+            <w:tcBorders>
+              <w:top w:val="single" w:color="D9D5C8" w:sz="4"/>
+              <w:left w:val="single" w:color="D9D5C8" w:sz="4"/>
+              <w:bottom w:val="single" w:color="D9D5C8" w:sz="4"/>
+              <w:right w:val="single" w:color="D9D5C8" w:sz="4"/>
+            </w:tcBorders>
+            <w:tcMar>
+              <w:top w:type="dxa" w:w="55"/>
+              <w:left w:type="dxa" w:w="110"/>
+              <w:bottom w:type="dxa" w:w="55"/>
+              <w:right w:type="dxa" w:w="110"/>
+            </w:tcMar>
+          </w:tcPr>
+          <w:p>
+            <w:pPr>
+              <w:widowControl w:val="false"/>
+              <w:pBdr>
+                <w:bottom w:val="single" w:color="9AA0A6" w:sz="6" w:space="2"/>
+              </w:pBdr>
+              <w:spacing w:before="0" w:after="0" w:line="300" w:lineRule="exact"/>
+            </w:pPr>
+            <w:r>
+              <w:rPr>
+                <w:sz w:val="12"/>
+                <w:szCs w:val="12"/>
+                <w:rFonts w:ascii="Calibri" w:cs="Calibri" w:eastAsia="Calibri" w:hAnsi="Calibri"/>
+              </w:rPr>
+              <w:t xml:space="preserve"> </w:t>
+            </w:r>
+          </w:p>
+          <w:p>
+            <w:pPr>
+              <w:spacing w:before="0" w:after="0" w:line="90" w:lineRule="exact"/>
+            </w:pPr>
+            <w:r>
+              <w:rPr>
+                <w:sz w:val="2"/>
+                <w:szCs w:val="2"/>
+                <w:rFonts w:ascii="Calibri" w:cs="Calibri" w:eastAsia="Calibri" w:hAnsi="Calibri"/>
+              </w:rPr>
+              <w:t xml:space="preserve"> </w:t>
+            </w:r>
+          </w:p>
+          <w:p>
+            <w:pPr>
+              <w:widowControl w:val="false"/>
+              <w:pBdr>
+                <w:bottom w:val="single" w:color="9AA0A6" w:sz="6" w:space="2"/>
+              </w:pBdr>
+              <w:spacing w:before="0" w:after="0" w:line="300" w:lineRule="exact"/>
+            </w:pPr>
+            <w:r>
+              <w:rPr>
+                <w:sz w:val="12"/>
+                <w:szCs w:val="12"/>
+                <w:rFonts w:ascii="Calibri" w:cs="Calibri" w:eastAsia="Calibri" w:hAnsi="Calibri"/>
+              </w:rPr>
+              <w:t xml:space="preserve"> </w:t>
+            </w:r>
+          </w:p>
+          <w:p>
+            <w:pPr>
+              <w:spacing w:before="0" w:after="0" w:line="90" w:lineRule="exact"/>
+            </w:pPr>
+            <w:r>
+              <w:rPr>
+                <w:sz w:val="2"/>
+                <w:szCs w:val="2"/>
+                <w:rFonts w:ascii="Calibri" w:cs="Calibri" w:eastAsia="Calibri" w:hAnsi="Calibri"/>
+              </w:rPr>
+              <w:t xml:space="preserve"> </w:t>
+            </w:r>
+          </w:p>
+          <w:p>
+            <w:pPr>
+              <w:widowControl w:val="false"/>
+              <w:pBdr>
+                <w:bottom w:val="single" w:color="9AA0A6" w:sz="6" w:space="2"/>
+              </w:pBdr>
+              <w:spacing w:before="0" w:after="0" w:line="300" w:lineRule="exact"/>
+            </w:pPr>
+            <w:r>
+              <w:rPr>
+                <w:sz w:val="12"/>
+                <w:szCs w:val="12"/>
+                <w:rFonts w:ascii="Calibri" w:cs="Calibri" w:eastAsia="Calibri" w:hAnsi="Calibri"/>
+              </w:rPr>
+              <w:t xml:space="preserve"> </w:t>
+            </w:r>
+          </w:p>
+        </w:tc>
+      </w:tr>
+    </w:tbl>
+    <w:tbl>
+      <w:tblPr>
+        <w:tblW w:type="dxa" w:w="9792"/>
+        <w:tblBorders>
+          <w:top w:val="single" w:color="auto" w:sz="4"/>
+          <w:left w:val="single" w:color="auto" w:sz="4"/>
+          <w:bottom w:val="single" w:color="auto" w:sz="4"/>
+          <w:right w:val="single" w:color="auto" w:sz="4"/>
+          <w:insideH w:val="single" w:color="auto" w:sz="4"/>
+          <w:insideV w:val="single" w:color="auto" w:sz="4"/>
+        </w:tblBorders>
+      </w:tblPr>
+      <w:tblGrid>
+        <w:gridCol w:w="9792"/>
+      </w:tblGrid>
+      <w:tr>
+        <w:tc>
+          <w:tcPr>
+            <w:tcW w:type="dxa" w:w="9792"/>
+            <w:tcBorders>
+              <w:top w:val="single" w:color="D9D5C8" w:sz="4"/>
+              <w:left w:val="single" w:color="D9D5C8" w:sz="4"/>
+              <w:bottom w:val="single" w:color="D9D5C8" w:sz="4"/>
+              <w:right w:val="single" w:color="D9D5C8" w:sz="4"/>
+            </w:tcBorders>
+            <w:shd w:fill="F7F5EF" w:color="auto" w:val="clear"/>
+            <w:tcMar>
+              <w:top w:type="dxa" w:w="55"/>
+              <w:left w:type="dxa" w:w="110"/>
+              <w:bottom w:type="dxa" w:w="55"/>
+              <w:right w:type="dxa" w:w="110"/>
+            </w:tcMar>
+          </w:tcPr>
+          <w:p>
+            <w:pPr>
+              <w:spacing w:after="60"/>
+            </w:pPr>
+            <w:r>
+              <w:rPr>
+                <w:b/>
+                <w:bCs/>
+                <w:i w:val="false"/>
+                <w:iCs w:val="false"/>
+                <w:color w:val="1B2A4A"/>
+                <w:sz w:val="21"/>
+                <w:szCs w:val="21"/>
+                <w:caps w:val="false"/>
+                <w:rFonts w:ascii="Calibri" w:cs="Calibri" w:eastAsia="Calibri" w:hAnsi="Calibri"/>
+              </w:rPr>
+              <w:t xml:space="preserve">SEAL IT — a goal you can see is a goal you keep</w:t>
             </w:r>
           </w:p>
           <w:p>
@@ -4227,62 +4306,113 @@
                 <w:i w:val="false"/>
                 <w:iCs w:val="false"/>
                 <w:color w:val="1A1A1A"/>
-                <w:sz w:val="22"/>
-                <w:szCs w:val="22"/>
-                <w:caps w:val="false"/>
-                <w:rFonts w:ascii="Calibri" w:cs="Calibri" w:eastAsia="Calibri" w:hAnsi="Calibri"/>
-              </w:rPr>
-              <w:t xml:space="preserve">My goal for this standard — what will I be able to do, and how will I show it?</w:t>
+                <w:sz w:val="20"/>
+                <w:szCs w:val="20"/>
+                <w:caps w:val="false"/>
+                <w:rFonts w:ascii="Calibri" w:cs="Calibri" w:eastAsia="Calibri" w:hAnsi="Calibri"/>
+              </w:rPr>
+              <w:t xml:space="preserve">One thing I already know about this topic: ______________________________________________</w:t>
+            </w:r>
+          </w:p>
+          <w:p>
+            <w:pPr>
+              <w:spacing w:after="40"/>
+            </w:pPr>
+            <w:r>
+              <w:rPr>
+                <w:b w:val="false"/>
+                <w:bCs w:val="false"/>
+                <w:i w:val="false"/>
+                <w:iCs w:val="false"/>
+                <w:color w:val="1A1A1A"/>
+                <w:sz w:val="20"/>
+                <w:szCs w:val="20"/>
+                <w:caps w:val="false"/>
+                <w:rFonts w:ascii="Calibri" w:cs="Calibri" w:eastAsia="Calibri" w:hAnsi="Calibri"/>
+              </w:rPr>
+              <w:t xml:space="preserve">One question I want answered by the end: ______________________________________________</w:t>
+            </w:r>
+          </w:p>
+          <w:p>
+            <w:pPr>
+              <w:spacing w:after="40"/>
+            </w:pPr>
+            <w:r>
+              <w:rPr>
+                <w:b/>
+                <w:bCs/>
+                <w:i w:val="false"/>
+                <w:iCs w:val="false"/>
+                <w:color w:val="1A1A1A"/>
+                <w:sz w:val="20"/>
+                <w:szCs w:val="20"/>
+                <w:caps w:val="false"/>
+                <w:rFonts w:ascii="Calibri" w:cs="Calibri" w:eastAsia="Calibri" w:hAnsi="Calibri"/>
+              </w:rPr>
+              <w:t xml:space="preserve">Signed: __________________     Date: __________     I will check my progress on: __________</w:t>
             </w:r>
           </w:p>
         </w:tc>
       </w:tr>
     </w:tbl>
     <w:p>
-      <w:pPr>
-        <w:widowControl w:val="false"/>
-        <w:pBdr>
-          <w:bottom w:val="single" w:color="9AA0A6" w:sz="6" w:space="2"/>
-        </w:pBdr>
-        <w:spacing w:before="0" w:after="0" w:line="300" w:lineRule="exact"/>
-      </w:pPr>
-      <w:r>
-        <w:rPr>
-          <w:sz w:val="12"/>
-          <w:szCs w:val="12"/>
-          <w:rFonts w:ascii="Calibri" w:cs="Calibri" w:eastAsia="Calibri" w:hAnsi="Calibri"/>
-        </w:rPr>
-        <w:t xml:space="preserve"> </w:t>
+      <w:r>
+        <w:br w:type="page"/>
       </w:r>
     </w:p>
     <w:p>
       <w:pPr>
-        <w:spacing w:before="0" w:after="0" w:line="90" w:lineRule="exact"/>
+        <w:pStyle w:val="Heading1"/>
+        <w:keepNext/>
+        <w:pageBreakBefore/>
+        <w:spacing w:before="220" w:after="90"/>
       </w:pPr>
       <w:r>
         <w:rPr>
-          <w:sz w:val="2"/>
-          <w:szCs w:val="2"/>
-          <w:rFonts w:ascii="Calibri" w:cs="Calibri" w:eastAsia="Calibri" w:hAnsi="Calibri"/>
-        </w:rPr>
-        <w:t xml:space="preserve"> </w:t>
+          <w:b/>
+          <w:bCs/>
+          <w:i w:val="false"/>
+          <w:iCs w:val="false"/>
+          <w:color w:val="1B2A4A"/>
+          <w:sz w:val="36"/>
+          <w:szCs w:val="36"/>
+          <w:caps w:val="false"/>
+          <w:rFonts w:ascii="Calibri" w:cs="Calibri" w:eastAsia="Calibri" w:hAnsi="Calibri"/>
+        </w:rPr>
+        <w:t xml:space="preserve">Standard GC.16 — Article II &amp; the Presidency</w:t>
       </w:r>
     </w:p>
     <w:p>
       <w:pPr>
-        <w:widowControl w:val="false"/>
-        <w:pBdr>
-          <w:bottom w:val="single" w:color="9AA0A6" w:sz="6" w:space="2"/>
-        </w:pBdr>
-        <w:spacing w:before="0" w:after="0" w:line="300" w:lineRule="exact"/>
+        <w:spacing w:after="60"/>
       </w:pPr>
       <w:r>
         <w:rPr>
-          <w:sz w:val="12"/>
-          <w:szCs w:val="12"/>
-          <w:rFonts w:ascii="Calibri" w:cs="Calibri" w:eastAsia="Calibri" w:hAnsi="Calibri"/>
-        </w:rPr>
-        <w:t xml:space="preserve"> </w:t>
+          <w:b/>
+          <w:bCs/>
+          <w:i w:val="false"/>
+          <w:iCs w:val="false"/>
+          <w:color w:val="1A1A1A"/>
+          <w:sz w:val="22"/>
+          <w:szCs w:val="22"/>
+          <w:caps w:val="false"/>
+          <w:rFonts w:ascii="Calibri" w:cs="Calibri" w:eastAsia="Calibri" w:hAnsi="Calibri"/>
+        </w:rPr>
+        <w:t xml:space="preserve">TN Academic Standard GC.16: </w:t>
+      </w:r>
+      <w:r>
+        <w:rPr>
+          <w:b w:val="false"/>
+          <w:bCs w:val="false"/>
+          <w:i w:val="false"/>
+          <w:iCs w:val="false"/>
+          <w:color w:val="1A1A1A"/>
+          <w:sz w:val="22"/>
+          <w:szCs w:val="22"/>
+          <w:caps w:val="false"/>
+          <w:rFonts w:ascii="Calibri" w:cs="Calibri" w:eastAsia="Calibri" w:hAnsi="Calibri"/>
+        </w:rPr>
+        <w:t xml:space="preserve">Analyze Article II of the U.S. Constitution as it relates to the executive branch, including: appointments; Commander-in-chief of the military; eligibility for office; executive orders; length of term (22nd Amendment); oath of office; powers of the president; succession (25th Amendment); treaties. (H)</w:t>
       </w:r>
     </w:p>
     <w:tbl>
@@ -4334,7 +4464,7 @@
                 <w:caps w:val="false"/>
                 <w:rFonts w:ascii="Calibri" w:cs="Calibri" w:eastAsia="Calibri" w:hAnsi="Calibri"/>
               </w:rPr>
-              <w:t xml:space="preserve">HOOK — think before you dig in</w:t>
+              <w:t xml:space="preserve">LEARNING TARGETS — I can…</w:t>
             </w:r>
           </w:p>
           <w:p>
@@ -4348,12 +4478,12 @@
                 <w:i w:val="false"/>
                 <w:iCs w:val="false"/>
                 <w:color w:val="1A1A1A"/>
-                <w:sz w:val="22"/>
-                <w:szCs w:val="22"/>
-                <w:caps w:val="false"/>
-                <w:rFonts w:ascii="Calibri" w:cs="Calibri" w:eastAsia="Calibri" w:hAnsi="Calibri"/>
-              </w:rPr>
-              <w:t xml:space="preserve">One person commands the world's most powerful military — yet cannot make a treaty or hire a cabinet officer alone. Who holds the leash?</w:t>
+                <w:sz w:val="21"/>
+                <w:szCs w:val="21"/>
+                <w:caps w:val="false"/>
+                <w:rFonts w:ascii="Calibri" w:cs="Calibri" w:eastAsia="Calibri" w:hAnsi="Calibri"/>
+              </w:rPr>
+              <w:t xml:space="preserve">•  I can analyze Article II — the qualifications, powers, roles, term, and succession of the President..</w:t>
             </w:r>
           </w:p>
         </w:tc>
@@ -4361,49 +4491,35 @@
     </w:tbl>
     <w:p>
       <w:pPr>
-        <w:widowControl w:val="false"/>
-        <w:pBdr>
-          <w:bottom w:val="single" w:color="9AA0A6" w:sz="6" w:space="2"/>
-        </w:pBdr>
-        <w:spacing w:before="0" w:after="0" w:line="300" w:lineRule="exact"/>
+        <w:spacing w:after="80"/>
       </w:pPr>
       <w:r>
         <w:rPr>
-          <w:sz w:val="12"/>
-          <w:szCs w:val="12"/>
-          <w:rFonts w:ascii="Calibri" w:cs="Calibri" w:eastAsia="Calibri" w:hAnsi="Calibri"/>
-        </w:rPr>
-        <w:t xml:space="preserve"> </w:t>
-      </w:r>
-    </w:p>
-    <w:p>
-      <w:pPr>
-        <w:spacing w:before="0" w:after="0" w:line="90" w:lineRule="exact"/>
-      </w:pPr>
-      <w:r>
-        <w:rPr>
-          <w:sz w:val="2"/>
-          <w:szCs w:val="2"/>
-          <w:rFonts w:ascii="Calibri" w:cs="Calibri" w:eastAsia="Calibri" w:hAnsi="Calibri"/>
-        </w:rPr>
-        <w:t xml:space="preserve"> </w:t>
-      </w:r>
-    </w:p>
-    <w:p>
-      <w:pPr>
-        <w:widowControl w:val="false"/>
-        <w:pBdr>
-          <w:bottom w:val="single" w:color="9AA0A6" w:sz="6" w:space="2"/>
-        </w:pBdr>
-        <w:spacing w:before="0" w:after="0" w:line="300" w:lineRule="exact"/>
-      </w:pPr>
-      <w:r>
-        <w:rPr>
-          <w:sz w:val="12"/>
-          <w:szCs w:val="12"/>
-          <w:rFonts w:ascii="Calibri" w:cs="Calibri" w:eastAsia="Calibri" w:hAnsi="Calibri"/>
-        </w:rPr>
-        <w:t xml:space="preserve"> </w:t>
+          <w:b/>
+          <w:bCs/>
+          <w:i w:val="false"/>
+          <w:iCs w:val="false"/>
+          <w:color w:val="1B2A4A"/>
+          <w:sz w:val="19"/>
+          <w:szCs w:val="19"/>
+          <w:caps w:val="false"/>
+          <w:rFonts w:ascii="Calibri" w:cs="Calibri" w:eastAsia="Calibri" w:hAnsi="Calibri"/>
+        </w:rPr>
+        <w:t xml:space="preserve">Lenses for this standard: </w:t>
+      </w:r>
+      <w:r>
+        <w:rPr>
+          <w:b w:val="false"/>
+          <w:bCs w:val="false"/>
+          <w:i w:val="false"/>
+          <w:iCs w:val="false"/>
+          <w:color w:val="6B7280"/>
+          <w:sz w:val="19"/>
+          <w:szCs w:val="19"/>
+          <w:caps w:val="false"/>
+          <w:rFonts w:ascii="Calibri" w:cs="Calibri" w:eastAsia="Calibri" w:hAnsi="Calibri"/>
+        </w:rPr>
+        <w:t xml:space="preserve">History (H)</w:t>
       </w:r>
     </w:p>
     <w:tbl>
@@ -4426,6 +4542,80 @@
           <w:tcPr>
             <w:tcW w:type="dxa" w:w="9792"/>
             <w:tcBorders>
+              <w:top w:val="single" w:color="1B2A4A" w:sz="4"/>
+              <w:left w:val="single" w:color="1B2A4A" w:sz="4"/>
+              <w:bottom w:val="single" w:color="1B2A4A" w:sz="4"/>
+              <w:right w:val="single" w:color="1B2A4A" w:sz="4"/>
+            </w:tcBorders>
+            <w:shd w:fill="1B2A4A" w:color="auto" w:val="clear"/>
+            <w:tcMar>
+              <w:top w:type="dxa" w:w="55"/>
+              <w:left w:type="dxa" w:w="110"/>
+              <w:bottom w:type="dxa" w:w="55"/>
+              <w:right w:type="dxa" w:w="110"/>
+            </w:tcMar>
+          </w:tcPr>
+          <w:p>
+            <w:pPr>
+              <w:spacing w:after="70"/>
+            </w:pPr>
+            <w:r>
+              <w:rPr>
+                <w:b/>
+                <w:bCs/>
+                <w:i w:val="false"/>
+                <w:iCs w:val="false"/>
+                <w:color w:val="C89B3C"/>
+                <w:sz w:val="23"/>
+                <w:szCs w:val="23"/>
+                <w:caps w:val="false"/>
+                <w:rFonts w:ascii="Calibri" w:cs="Calibri" w:eastAsia="Calibri" w:hAnsi="Calibri"/>
+              </w:rPr>
+              <w:t xml:space="preserve">CORE PATH — the same for every student</w:t>
+            </w:r>
+          </w:p>
+          <w:p>
+            <w:pPr>
+              <w:spacing w:after="40"/>
+            </w:pPr>
+            <w:r>
+              <w:rPr>
+                <w:b w:val="false"/>
+                <w:bCs w:val="false"/>
+                <w:i w:val="false"/>
+                <w:iCs w:val="false"/>
+                <w:color w:val="FFFFFF"/>
+                <w:sz w:val="22"/>
+                <w:szCs w:val="22"/>
+                <w:caps w:val="false"/>
+                <w:rFonts w:ascii="Calibri" w:cs="Calibri" w:eastAsia="Calibri" w:hAnsi="Calibri"/>
+              </w:rPr>
+              <w:t xml:space="preserve">Every student works this standard at the same rigor: analyze the sources and vocabulary, then demonstrate learning on the Practice Quiz and CER. UDL and MTSS give you flexible ways in — they never lower the bar. Check yourself against the learning targets on the Cornell Notes page.</w:t>
+            </w:r>
+          </w:p>
+        </w:tc>
+      </w:tr>
+    </w:tbl>
+    <w:tbl>
+      <w:tblPr>
+        <w:tblW w:type="dxa" w:w="9792"/>
+        <w:tblBorders>
+          <w:top w:val="single" w:color="auto" w:sz="4"/>
+          <w:left w:val="single" w:color="auto" w:sz="4"/>
+          <w:bottom w:val="single" w:color="auto" w:sz="4"/>
+          <w:right w:val="single" w:color="auto" w:sz="4"/>
+          <w:insideH w:val="single" w:color="auto" w:sz="4"/>
+          <w:insideV w:val="single" w:color="auto" w:sz="4"/>
+        </w:tblBorders>
+      </w:tblPr>
+      <w:tblGrid>
+        <w:gridCol w:w="9792"/>
+      </w:tblGrid>
+      <w:tr>
+        <w:tc>
+          <w:tcPr>
+            <w:tcW w:type="dxa" w:w="9792"/>
+            <w:tcBorders>
               <w:top w:val="single" w:color="D9D5C8" w:sz="4"/>
               <w:left w:val="single" w:color="D9D5C8" w:sz="4"/>
               <w:bottom w:val="single" w:color="D9D5C8" w:sz="4"/>
@@ -4455,7 +4645,7 @@
                 <w:caps w:val="false"/>
                 <w:rFonts w:ascii="Calibri" w:cs="Calibri" w:eastAsia="Calibri" w:hAnsi="Calibri"/>
               </w:rPr>
-              <w:t xml:space="preserve">ACTIVATE — what do you already know or wonder?</w:t>
+              <w:t xml:space="preserve">SET YOUR GOAL (self-direction)</w:t>
             </w:r>
           </w:p>
           <w:p>
@@ -4474,42 +4664,12 @@
                 <w:caps w:val="false"/>
                 <w:rFonts w:ascii="Calibri" w:cs="Calibri" w:eastAsia="Calibri" w:hAnsi="Calibri"/>
               </w:rPr>
-              <w:t xml:space="preserve">Jot what you already know or want to find out about this standard. You’ll come back to it.</w:t>
+              <w:t xml:space="preserve">My goal for this standard — what will I be able to do, and how will I show it?</w:t>
             </w:r>
           </w:p>
         </w:tc>
       </w:tr>
     </w:tbl>
-    <w:p>
-      <w:pPr>
-        <w:widowControl w:val="false"/>
-        <w:pBdr>
-          <w:bottom w:val="single" w:color="9AA0A6" w:sz="6" w:space="2"/>
-        </w:pBdr>
-        <w:spacing w:before="0" w:after="0" w:line="300" w:lineRule="exact"/>
-      </w:pPr>
-      <w:r>
-        <w:rPr>
-          <w:sz w:val="12"/>
-          <w:szCs w:val="12"/>
-          <w:rFonts w:ascii="Calibri" w:cs="Calibri" w:eastAsia="Calibri" w:hAnsi="Calibri"/>
-        </w:rPr>
-        <w:t xml:space="preserve"> </w:t>
-      </w:r>
-    </w:p>
-    <w:p>
-      <w:pPr>
-        <w:spacing w:before="0" w:after="0" w:line="90" w:lineRule="exact"/>
-      </w:pPr>
-      <w:r>
-        <w:rPr>
-          <w:sz w:val="2"/>
-          <w:szCs w:val="2"/>
-          <w:rFonts w:ascii="Calibri" w:cs="Calibri" w:eastAsia="Calibri" w:hAnsi="Calibri"/>
-        </w:rPr>
-        <w:t xml:space="preserve"> </w:t>
-      </w:r>
-    </w:p>
     <w:p>
       <w:pPr>
         <w:widowControl w:val="false"/>
@@ -4606,7 +4766,7 @@
                 <w:caps w:val="false"/>
                 <w:rFonts w:ascii="Calibri" w:cs="Calibri" w:eastAsia="Calibri" w:hAnsi="Calibri"/>
               </w:rPr>
-              <w:t xml:space="preserve">PREVIEW &amp; PREDICT</w:t>
+              <w:t xml:space="preserve">HOOK — think before you dig in</w:t>
             </w:r>
           </w:p>
           <w:p>
@@ -4625,12 +4785,495 @@
                 <w:caps w:val="false"/>
                 <w:rFonts w:ascii="Calibri" w:cs="Calibri" w:eastAsia="Calibri" w:hAnsi="Calibri"/>
               </w:rPr>
-              <w:t xml:space="preserve">Which learning target will be hardest, and why? Connect it to the unit’s big question: How much power should one person hold — and how is the presidency kept in check?</w:t>
+              <w:t xml:space="preserve">One person commands the world's most powerful military — yet cannot make a treaty or hire a cabinet officer alone. Who holds the leash?</w:t>
             </w:r>
           </w:p>
         </w:tc>
       </w:tr>
     </w:tbl>
+    <w:p>
+      <w:pPr>
+        <w:widowControl w:val="false"/>
+        <w:pBdr>
+          <w:bottom w:val="single" w:color="9AA0A6" w:sz="6" w:space="2"/>
+        </w:pBdr>
+        <w:spacing w:before="0" w:after="0" w:line="300" w:lineRule="exact"/>
+      </w:pPr>
+      <w:r>
+        <w:rPr>
+          <w:sz w:val="12"/>
+          <w:szCs w:val="12"/>
+          <w:rFonts w:ascii="Calibri" w:cs="Calibri" w:eastAsia="Calibri" w:hAnsi="Calibri"/>
+        </w:rPr>
+        <w:t xml:space="preserve"> </w:t>
+      </w:r>
+    </w:p>
+    <w:p>
+      <w:pPr>
+        <w:spacing w:before="0" w:after="0" w:line="90" w:lineRule="exact"/>
+      </w:pPr>
+      <w:r>
+        <w:rPr>
+          <w:sz w:val="2"/>
+          <w:szCs w:val="2"/>
+          <w:rFonts w:ascii="Calibri" w:cs="Calibri" w:eastAsia="Calibri" w:hAnsi="Calibri"/>
+        </w:rPr>
+        <w:t xml:space="preserve"> </w:t>
+      </w:r>
+    </w:p>
+    <w:p>
+      <w:pPr>
+        <w:widowControl w:val="false"/>
+        <w:pBdr>
+          <w:bottom w:val="single" w:color="9AA0A6" w:sz="6" w:space="2"/>
+        </w:pBdr>
+        <w:spacing w:before="0" w:after="0" w:line="300" w:lineRule="exact"/>
+      </w:pPr>
+      <w:r>
+        <w:rPr>
+          <w:sz w:val="12"/>
+          <w:szCs w:val="12"/>
+          <w:rFonts w:ascii="Calibri" w:cs="Calibri" w:eastAsia="Calibri" w:hAnsi="Calibri"/>
+        </w:rPr>
+        <w:t xml:space="preserve"> </w:t>
+      </w:r>
+    </w:p>
+    <w:tbl>
+      <w:tblPr>
+        <w:tblW w:type="dxa" w:w="9792"/>
+        <w:tblBorders>
+          <w:top w:val="single" w:color="auto" w:sz="4"/>
+          <w:left w:val="single" w:color="auto" w:sz="4"/>
+          <w:bottom w:val="single" w:color="auto" w:sz="4"/>
+          <w:right w:val="single" w:color="auto" w:sz="4"/>
+          <w:insideH w:val="single" w:color="auto" w:sz="4"/>
+          <w:insideV w:val="single" w:color="auto" w:sz="4"/>
+        </w:tblBorders>
+      </w:tblPr>
+      <w:tblGrid>
+        <w:gridCol w:w="9792"/>
+      </w:tblGrid>
+      <w:tr>
+        <w:tc>
+          <w:tcPr>
+            <w:tcW w:type="dxa" w:w="9792"/>
+            <w:tcBorders>
+              <w:top w:val="single" w:color="D9D5C8" w:sz="4"/>
+              <w:left w:val="single" w:color="D9D5C8" w:sz="4"/>
+              <w:bottom w:val="single" w:color="D9D5C8" w:sz="4"/>
+              <w:right w:val="single" w:color="D9D5C8" w:sz="4"/>
+            </w:tcBorders>
+            <w:shd w:fill="F7F5EF" w:color="auto" w:val="clear"/>
+            <w:tcMar>
+              <w:top w:type="dxa" w:w="55"/>
+              <w:left w:type="dxa" w:w="110"/>
+              <w:bottom w:type="dxa" w:w="55"/>
+              <w:right w:type="dxa" w:w="110"/>
+            </w:tcMar>
+          </w:tcPr>
+          <w:p>
+            <w:pPr>
+              <w:spacing w:after="60"/>
+            </w:pPr>
+            <w:r>
+              <w:rPr>
+                <w:b/>
+                <w:bCs/>
+                <w:i w:val="false"/>
+                <w:iCs w:val="false"/>
+                <w:color w:val="1B2A4A"/>
+                <w:sz w:val="21"/>
+                <w:szCs w:val="21"/>
+                <w:caps w:val="false"/>
+                <w:rFonts w:ascii="Calibri" w:cs="Calibri" w:eastAsia="Calibri" w:hAnsi="Calibri"/>
+              </w:rPr>
+              <w:t xml:space="preserve">ACTIVATE — what do you already know or wonder?</w:t>
+            </w:r>
+          </w:p>
+          <w:p>
+            <w:pPr>
+              <w:spacing w:after="40"/>
+            </w:pPr>
+            <w:r>
+              <w:rPr>
+                <w:b w:val="false"/>
+                <w:bCs w:val="false"/>
+                <w:i w:val="false"/>
+                <w:iCs w:val="false"/>
+                <w:color w:val="1A1A1A"/>
+                <w:sz w:val="22"/>
+                <w:szCs w:val="22"/>
+                <w:caps w:val="false"/>
+                <w:rFonts w:ascii="Calibri" w:cs="Calibri" w:eastAsia="Calibri" w:hAnsi="Calibri"/>
+              </w:rPr>
+              <w:t xml:space="preserve">Jot what you already know or want to find out about this standard. You’ll come back to it.</w:t>
+            </w:r>
+          </w:p>
+        </w:tc>
+      </w:tr>
+    </w:tbl>
+    <w:p>
+      <w:pPr>
+        <w:widowControl w:val="false"/>
+        <w:pBdr>
+          <w:bottom w:val="single" w:color="9AA0A6" w:sz="6" w:space="2"/>
+        </w:pBdr>
+        <w:spacing w:before="0" w:after="0" w:line="300" w:lineRule="exact"/>
+      </w:pPr>
+      <w:r>
+        <w:rPr>
+          <w:sz w:val="12"/>
+          <w:szCs w:val="12"/>
+          <w:rFonts w:ascii="Calibri" w:cs="Calibri" w:eastAsia="Calibri" w:hAnsi="Calibri"/>
+        </w:rPr>
+        <w:t xml:space="preserve"> </w:t>
+      </w:r>
+    </w:p>
+    <w:p>
+      <w:pPr>
+        <w:spacing w:before="0" w:after="0" w:line="90" w:lineRule="exact"/>
+      </w:pPr>
+      <w:r>
+        <w:rPr>
+          <w:sz w:val="2"/>
+          <w:szCs w:val="2"/>
+          <w:rFonts w:ascii="Calibri" w:cs="Calibri" w:eastAsia="Calibri" w:hAnsi="Calibri"/>
+        </w:rPr>
+        <w:t xml:space="preserve"> </w:t>
+      </w:r>
+    </w:p>
+    <w:p>
+      <w:pPr>
+        <w:widowControl w:val="false"/>
+        <w:pBdr>
+          <w:bottom w:val="single" w:color="9AA0A6" w:sz="6" w:space="2"/>
+        </w:pBdr>
+        <w:spacing w:before="0" w:after="0" w:line="300" w:lineRule="exact"/>
+      </w:pPr>
+      <w:r>
+        <w:rPr>
+          <w:sz w:val="12"/>
+          <w:szCs w:val="12"/>
+          <w:rFonts w:ascii="Calibri" w:cs="Calibri" w:eastAsia="Calibri" w:hAnsi="Calibri"/>
+        </w:rPr>
+        <w:t xml:space="preserve"> </w:t>
+      </w:r>
+    </w:p>
+    <w:p>
+      <w:pPr>
+        <w:spacing w:before="0" w:after="0" w:line="90" w:lineRule="exact"/>
+      </w:pPr>
+      <w:r>
+        <w:rPr>
+          <w:sz w:val="2"/>
+          <w:szCs w:val="2"/>
+          <w:rFonts w:ascii="Calibri" w:cs="Calibri" w:eastAsia="Calibri" w:hAnsi="Calibri"/>
+        </w:rPr>
+        <w:t xml:space="preserve"> </w:t>
+      </w:r>
+    </w:p>
+    <w:p>
+      <w:pPr>
+        <w:widowControl w:val="false"/>
+        <w:pBdr>
+          <w:bottom w:val="single" w:color="9AA0A6" w:sz="6" w:space="2"/>
+        </w:pBdr>
+        <w:spacing w:before="0" w:after="0" w:line="300" w:lineRule="exact"/>
+      </w:pPr>
+      <w:r>
+        <w:rPr>
+          <w:sz w:val="12"/>
+          <w:szCs w:val="12"/>
+          <w:rFonts w:ascii="Calibri" w:cs="Calibri" w:eastAsia="Calibri" w:hAnsi="Calibri"/>
+        </w:rPr>
+        <w:t xml:space="preserve"> </w:t>
+      </w:r>
+    </w:p>
+    <w:tbl>
+      <w:tblPr>
+        <w:tblW w:type="dxa" w:w="9792"/>
+        <w:tblBorders>
+          <w:top w:val="single" w:color="auto" w:sz="4"/>
+          <w:left w:val="single" w:color="auto" w:sz="4"/>
+          <w:bottom w:val="single" w:color="auto" w:sz="4"/>
+          <w:right w:val="single" w:color="auto" w:sz="4"/>
+          <w:insideH w:val="single" w:color="auto" w:sz="4"/>
+          <w:insideV w:val="single" w:color="auto" w:sz="4"/>
+        </w:tblBorders>
+      </w:tblPr>
+      <w:tblGrid>
+        <w:gridCol w:w="9792"/>
+      </w:tblGrid>
+      <w:tr>
+        <w:tc>
+          <w:tcPr>
+            <w:tcW w:type="dxa" w:w="9792"/>
+            <w:tcBorders>
+              <w:top w:val="single" w:color="D9D5C8" w:sz="4"/>
+              <w:left w:val="single" w:color="D9D5C8" w:sz="4"/>
+              <w:bottom w:val="single" w:color="D9D5C8" w:sz="4"/>
+              <w:right w:val="single" w:color="D9D5C8" w:sz="4"/>
+            </w:tcBorders>
+            <w:shd w:fill="F7F5EF" w:color="auto" w:val="clear"/>
+            <w:tcMar>
+              <w:top w:type="dxa" w:w="55"/>
+              <w:left w:type="dxa" w:w="110"/>
+              <w:bottom w:type="dxa" w:w="55"/>
+              <w:right w:type="dxa" w:w="110"/>
+            </w:tcMar>
+          </w:tcPr>
+          <w:p>
+            <w:pPr>
+              <w:spacing w:after="60"/>
+            </w:pPr>
+            <w:r>
+              <w:rPr>
+                <w:b/>
+                <w:bCs/>
+                <w:i w:val="false"/>
+                <w:iCs w:val="false"/>
+                <w:color w:val="1B2A4A"/>
+                <w:sz w:val="21"/>
+                <w:szCs w:val="21"/>
+                <w:caps w:val="false"/>
+                <w:rFonts w:ascii="Calibri" w:cs="Calibri" w:eastAsia="Calibri" w:hAnsi="Calibri"/>
+              </w:rPr>
+              <w:t xml:space="preserve">PREVIEW &amp; PREDICT</w:t>
+            </w:r>
+          </w:p>
+          <w:p>
+            <w:pPr>
+              <w:spacing w:after="40"/>
+            </w:pPr>
+            <w:r>
+              <w:rPr>
+                <w:b w:val="false"/>
+                <w:bCs w:val="false"/>
+                <w:i w:val="false"/>
+                <w:iCs w:val="false"/>
+                <w:color w:val="1A1A1A"/>
+                <w:sz w:val="22"/>
+                <w:szCs w:val="22"/>
+                <w:caps w:val="false"/>
+                <w:rFonts w:ascii="Calibri" w:cs="Calibri" w:eastAsia="Calibri" w:hAnsi="Calibri"/>
+              </w:rPr>
+              <w:t xml:space="preserve">Which learning target will be hardest, and why? Connect it to the unit’s big question: How much power should one person hold — and how is the presidency kept in check?</w:t>
+            </w:r>
+          </w:p>
+        </w:tc>
+      </w:tr>
+    </w:tbl>
+    <w:p>
+      <w:pPr>
+        <w:widowControl w:val="false"/>
+        <w:pBdr>
+          <w:bottom w:val="single" w:color="9AA0A6" w:sz="6" w:space="2"/>
+        </w:pBdr>
+        <w:spacing w:before="0" w:after="0" w:line="300" w:lineRule="exact"/>
+      </w:pPr>
+      <w:r>
+        <w:rPr>
+          <w:sz w:val="12"/>
+          <w:szCs w:val="12"/>
+          <w:rFonts w:ascii="Calibri" w:cs="Calibri" w:eastAsia="Calibri" w:hAnsi="Calibri"/>
+        </w:rPr>
+        <w:t xml:space="preserve"> </w:t>
+      </w:r>
+    </w:p>
+    <w:p>
+      <w:pPr>
+        <w:spacing w:before="0" w:after="0" w:line="90" w:lineRule="exact"/>
+      </w:pPr>
+      <w:r>
+        <w:rPr>
+          <w:sz w:val="2"/>
+          <w:szCs w:val="2"/>
+          <w:rFonts w:ascii="Calibri" w:cs="Calibri" w:eastAsia="Calibri" w:hAnsi="Calibri"/>
+        </w:rPr>
+        <w:t xml:space="preserve"> </w:t>
+      </w:r>
+    </w:p>
+    <w:p>
+      <w:pPr>
+        <w:widowControl w:val="false"/>
+        <w:pBdr>
+          <w:bottom w:val="single" w:color="9AA0A6" w:sz="6" w:space="2"/>
+        </w:pBdr>
+        <w:spacing w:before="0" w:after="0" w:line="300" w:lineRule="exact"/>
+      </w:pPr>
+      <w:r>
+        <w:rPr>
+          <w:sz w:val="12"/>
+          <w:szCs w:val="12"/>
+          <w:rFonts w:ascii="Calibri" w:cs="Calibri" w:eastAsia="Calibri" w:hAnsi="Calibri"/>
+        </w:rPr>
+        <w:t xml:space="preserve"> </w:t>
+      </w:r>
+    </w:p>
+    <w:p>
+      <w:pPr>
+        <w:spacing w:before="0" w:after="0" w:line="90" w:lineRule="exact"/>
+      </w:pPr>
+      <w:r>
+        <w:rPr>
+          <w:sz w:val="2"/>
+          <w:szCs w:val="2"/>
+          <w:rFonts w:ascii="Calibri" w:cs="Calibri" w:eastAsia="Calibri" w:hAnsi="Calibri"/>
+        </w:rPr>
+        <w:t xml:space="preserve"> </w:t>
+      </w:r>
+    </w:p>
+    <w:p>
+      <w:pPr>
+        <w:widowControl w:val="false"/>
+        <w:pBdr>
+          <w:bottom w:val="single" w:color="9AA0A6" w:sz="6" w:space="2"/>
+        </w:pBdr>
+        <w:spacing w:before="0" w:after="0" w:line="300" w:lineRule="exact"/>
+      </w:pPr>
+      <w:r>
+        <w:rPr>
+          <w:sz w:val="12"/>
+          <w:szCs w:val="12"/>
+          <w:rFonts w:ascii="Calibri" w:cs="Calibri" w:eastAsia="Calibri" w:hAnsi="Calibri"/>
+        </w:rPr>
+        <w:t xml:space="preserve"> </w:t>
+      </w:r>
+    </w:p>
+    <w:tbl>
+      <w:tblPr>
+        <w:tblW w:type="dxa" w:w="9792"/>
+        <w:tblBorders>
+          <w:top w:val="single" w:color="auto" w:sz="4"/>
+          <w:left w:val="single" w:color="auto" w:sz="4"/>
+          <w:bottom w:val="single" w:color="auto" w:sz="4"/>
+          <w:right w:val="single" w:color="auto" w:sz="4"/>
+          <w:insideH w:val="single" w:color="auto" w:sz="4"/>
+          <w:insideV w:val="single" w:color="auto" w:sz="4"/>
+        </w:tblBorders>
+      </w:tblPr>
+      <w:tblGrid>
+        <w:gridCol w:w="9792"/>
+      </w:tblGrid>
+      <w:tr>
+        <w:tc>
+          <w:tcPr>
+            <w:tcW w:type="dxa" w:w="9792"/>
+            <w:tcBorders>
+              <w:top w:val="single" w:color="D9D5C8" w:sz="4"/>
+              <w:left w:val="single" w:color="D9D5C8" w:sz="4"/>
+              <w:bottom w:val="single" w:color="D9D5C8" w:sz="4"/>
+              <w:right w:val="single" w:color="D9D5C8" w:sz="4"/>
+            </w:tcBorders>
+            <w:shd w:fill="F7F5EF" w:color="auto" w:val="clear"/>
+            <w:tcMar>
+              <w:top w:type="dxa" w:w="55"/>
+              <w:left w:type="dxa" w:w="110"/>
+              <w:bottom w:type="dxa" w:w="55"/>
+              <w:right w:type="dxa" w:w="110"/>
+            </w:tcMar>
+          </w:tcPr>
+          <w:p>
+            <w:pPr>
+              <w:spacing w:after="60"/>
+            </w:pPr>
+            <w:r>
+              <w:rPr>
+                <w:b/>
+                <w:bCs/>
+                <w:i w:val="false"/>
+                <w:iCs w:val="false"/>
+                <w:color w:val="1B2A4A"/>
+                <w:sz w:val="21"/>
+                <w:szCs w:val="21"/>
+                <w:caps w:val="false"/>
+                <w:rFonts w:ascii="Calibri" w:cs="Calibri" w:eastAsia="Calibri" w:hAnsi="Calibri"/>
+              </w:rPr>
+              <w:t xml:space="preserve">FIRST IMPRESSIONS — before you dig in (you’ll revisit this at the end)</w:t>
+            </w:r>
+          </w:p>
+          <w:p>
+            <w:pPr>
+              <w:spacing w:after="40"/>
+            </w:pPr>
+            <w:r>
+              <w:rPr>
+                <w:b w:val="false"/>
+                <w:bCs w:val="false"/>
+                <w:i w:val="false"/>
+                <w:iCs w:val="false"/>
+                <w:color w:val="1A1A1A"/>
+                <w:sz w:val="22"/>
+                <w:szCs w:val="22"/>
+                <w:caps w:val="false"/>
+                <w:rFonts w:ascii="Calibri" w:cs="Calibri" w:eastAsia="Calibri" w:hAnsi="Calibri"/>
+              </w:rPr>
+              <w:t xml:space="preserve">In your own words: what do you think this standard is about, and why might it matter to you or your community? Write 2–3 sentences.</w:t>
+            </w:r>
+          </w:p>
+        </w:tc>
+      </w:tr>
+    </w:tbl>
+    <w:p>
+      <w:pPr>
+        <w:widowControl w:val="false"/>
+        <w:pBdr>
+          <w:bottom w:val="single" w:color="9AA0A6" w:sz="6" w:space="2"/>
+        </w:pBdr>
+        <w:spacing w:before="0" w:after="0" w:line="300" w:lineRule="exact"/>
+      </w:pPr>
+      <w:r>
+        <w:rPr>
+          <w:sz w:val="12"/>
+          <w:szCs w:val="12"/>
+          <w:rFonts w:ascii="Calibri" w:cs="Calibri" w:eastAsia="Calibri" w:hAnsi="Calibri"/>
+        </w:rPr>
+        <w:t xml:space="preserve"> </w:t>
+      </w:r>
+    </w:p>
+    <w:p>
+      <w:pPr>
+        <w:spacing w:before="0" w:after="0" w:line="90" w:lineRule="exact"/>
+      </w:pPr>
+      <w:r>
+        <w:rPr>
+          <w:sz w:val="2"/>
+          <w:szCs w:val="2"/>
+          <w:rFonts w:ascii="Calibri" w:cs="Calibri" w:eastAsia="Calibri" w:hAnsi="Calibri"/>
+        </w:rPr>
+        <w:t xml:space="preserve"> </w:t>
+      </w:r>
+    </w:p>
+    <w:p>
+      <w:pPr>
+        <w:widowControl w:val="false"/>
+        <w:pBdr>
+          <w:bottom w:val="single" w:color="9AA0A6" w:sz="6" w:space="2"/>
+        </w:pBdr>
+        <w:spacing w:before="0" w:after="0" w:line="300" w:lineRule="exact"/>
+      </w:pPr>
+      <w:r>
+        <w:rPr>
+          <w:sz w:val="12"/>
+          <w:szCs w:val="12"/>
+          <w:rFonts w:ascii="Calibri" w:cs="Calibri" w:eastAsia="Calibri" w:hAnsi="Calibri"/>
+        </w:rPr>
+        <w:t xml:space="preserve"> </w:t>
+      </w:r>
+    </w:p>
+    <w:p>
+      <w:pPr>
+        <w:spacing w:before="0" w:after="0" w:line="90" w:lineRule="exact"/>
+      </w:pPr>
+      <w:r>
+        <w:rPr>
+          <w:sz w:val="2"/>
+          <w:szCs w:val="2"/>
+          <w:rFonts w:ascii="Calibri" w:cs="Calibri" w:eastAsia="Calibri" w:hAnsi="Calibri"/>
+        </w:rPr>
+        <w:t xml:space="preserve"> </w:t>
+      </w:r>
+    </w:p>
     <w:p>
       <w:pPr>
         <w:widowControl w:val="false"/>
@@ -17561,7 +18204,7 @@
                 <w:caps w:val="false"/>
                 <w:rFonts w:ascii="Calibri" w:cs="Calibri" w:eastAsia="Calibri" w:hAnsi="Calibri"/>
               </w:rPr>
-              <w:t xml:space="preserve">•  I can I can identify the major executive departments and describe what each one does to carry out the law..</w:t>
+              <w:t xml:space="preserve">•  I can identify the major executive departments and describe what each one does to carry out the law..</w:t>
             </w:r>
           </w:p>
         </w:tc>
@@ -18141,6 +18784,217 @@
         </w:tc>
       </w:tr>
     </w:tbl>
+    <w:p>
+      <w:pPr>
+        <w:widowControl w:val="false"/>
+        <w:pBdr>
+          <w:bottom w:val="single" w:color="9AA0A6" w:sz="6" w:space="2"/>
+        </w:pBdr>
+        <w:spacing w:before="0" w:after="0" w:line="300" w:lineRule="exact"/>
+      </w:pPr>
+      <w:r>
+        <w:rPr>
+          <w:sz w:val="12"/>
+          <w:szCs w:val="12"/>
+          <w:rFonts w:ascii="Calibri" w:cs="Calibri" w:eastAsia="Calibri" w:hAnsi="Calibri"/>
+        </w:rPr>
+        <w:t xml:space="preserve"> </w:t>
+      </w:r>
+    </w:p>
+    <w:p>
+      <w:pPr>
+        <w:spacing w:before="0" w:after="0" w:line="90" w:lineRule="exact"/>
+      </w:pPr>
+      <w:r>
+        <w:rPr>
+          <w:sz w:val="2"/>
+          <w:szCs w:val="2"/>
+          <w:rFonts w:ascii="Calibri" w:cs="Calibri" w:eastAsia="Calibri" w:hAnsi="Calibri"/>
+        </w:rPr>
+        <w:t xml:space="preserve"> </w:t>
+      </w:r>
+    </w:p>
+    <w:p>
+      <w:pPr>
+        <w:widowControl w:val="false"/>
+        <w:pBdr>
+          <w:bottom w:val="single" w:color="9AA0A6" w:sz="6" w:space="2"/>
+        </w:pBdr>
+        <w:spacing w:before="0" w:after="0" w:line="300" w:lineRule="exact"/>
+      </w:pPr>
+      <w:r>
+        <w:rPr>
+          <w:sz w:val="12"/>
+          <w:szCs w:val="12"/>
+          <w:rFonts w:ascii="Calibri" w:cs="Calibri" w:eastAsia="Calibri" w:hAnsi="Calibri"/>
+        </w:rPr>
+        <w:t xml:space="preserve"> </w:t>
+      </w:r>
+    </w:p>
+    <w:p>
+      <w:pPr>
+        <w:spacing w:before="0" w:after="0" w:line="90" w:lineRule="exact"/>
+      </w:pPr>
+      <w:r>
+        <w:rPr>
+          <w:sz w:val="2"/>
+          <w:szCs w:val="2"/>
+          <w:rFonts w:ascii="Calibri" w:cs="Calibri" w:eastAsia="Calibri" w:hAnsi="Calibri"/>
+        </w:rPr>
+        <w:t xml:space="preserve"> </w:t>
+      </w:r>
+    </w:p>
+    <w:p>
+      <w:pPr>
+        <w:widowControl w:val="false"/>
+        <w:pBdr>
+          <w:bottom w:val="single" w:color="9AA0A6" w:sz="6" w:space="2"/>
+        </w:pBdr>
+        <w:spacing w:before="0" w:after="0" w:line="300" w:lineRule="exact"/>
+      </w:pPr>
+      <w:r>
+        <w:rPr>
+          <w:sz w:val="12"/>
+          <w:szCs w:val="12"/>
+          <w:rFonts w:ascii="Calibri" w:cs="Calibri" w:eastAsia="Calibri" w:hAnsi="Calibri"/>
+        </w:rPr>
+        <w:t xml:space="preserve"> </w:t>
+      </w:r>
+    </w:p>
+    <w:tbl>
+      <w:tblPr>
+        <w:tblW w:type="dxa" w:w="9792"/>
+        <w:tblBorders>
+          <w:top w:val="single" w:color="auto" w:sz="4"/>
+          <w:left w:val="single" w:color="auto" w:sz="4"/>
+          <w:bottom w:val="single" w:color="auto" w:sz="4"/>
+          <w:right w:val="single" w:color="auto" w:sz="4"/>
+          <w:insideH w:val="single" w:color="auto" w:sz="4"/>
+          <w:insideV w:val="single" w:color="auto" w:sz="4"/>
+        </w:tblBorders>
+      </w:tblPr>
+      <w:tblGrid>
+        <w:gridCol w:w="9792"/>
+      </w:tblGrid>
+      <w:tr>
+        <w:tc>
+          <w:tcPr>
+            <w:tcW w:type="dxa" w:w="9792"/>
+            <w:tcBorders>
+              <w:top w:val="single" w:color="D9D5C8" w:sz="4"/>
+              <w:left w:val="single" w:color="D9D5C8" w:sz="4"/>
+              <w:bottom w:val="single" w:color="D9D5C8" w:sz="4"/>
+              <w:right w:val="single" w:color="D9D5C8" w:sz="4"/>
+            </w:tcBorders>
+            <w:shd w:fill="F7F5EF" w:color="auto" w:val="clear"/>
+            <w:tcMar>
+              <w:top w:type="dxa" w:w="55"/>
+              <w:left w:type="dxa" w:w="110"/>
+              <w:bottom w:type="dxa" w:w="55"/>
+              <w:right w:type="dxa" w:w="110"/>
+            </w:tcMar>
+          </w:tcPr>
+          <w:p>
+            <w:pPr>
+              <w:spacing w:after="60"/>
+            </w:pPr>
+            <w:r>
+              <w:rPr>
+                <w:b/>
+                <w:bCs/>
+                <w:i w:val="false"/>
+                <w:iCs w:val="false"/>
+                <w:color w:val="1B2A4A"/>
+                <w:sz w:val="21"/>
+                <w:szCs w:val="21"/>
+                <w:caps w:val="false"/>
+                <w:rFonts w:ascii="Calibri" w:cs="Calibri" w:eastAsia="Calibri" w:hAnsi="Calibri"/>
+              </w:rPr>
+              <w:t xml:space="preserve">FIRST IMPRESSIONS — before you dig in (you’ll revisit this at the end)</w:t>
+            </w:r>
+          </w:p>
+          <w:p>
+            <w:pPr>
+              <w:spacing w:after="40"/>
+            </w:pPr>
+            <w:r>
+              <w:rPr>
+                <w:b w:val="false"/>
+                <w:bCs w:val="false"/>
+                <w:i w:val="false"/>
+                <w:iCs w:val="false"/>
+                <w:color w:val="1A1A1A"/>
+                <w:sz w:val="22"/>
+                <w:szCs w:val="22"/>
+                <w:caps w:val="false"/>
+                <w:rFonts w:ascii="Calibri" w:cs="Calibri" w:eastAsia="Calibri" w:hAnsi="Calibri"/>
+              </w:rPr>
+              <w:t xml:space="preserve">In your own words: what do you think this standard is about, and why might it matter to you or your community? Write 2–3 sentences.</w:t>
+            </w:r>
+          </w:p>
+        </w:tc>
+      </w:tr>
+    </w:tbl>
+    <w:p>
+      <w:pPr>
+        <w:widowControl w:val="false"/>
+        <w:pBdr>
+          <w:bottom w:val="single" w:color="9AA0A6" w:sz="6" w:space="2"/>
+        </w:pBdr>
+        <w:spacing w:before="0" w:after="0" w:line="300" w:lineRule="exact"/>
+      </w:pPr>
+      <w:r>
+        <w:rPr>
+          <w:sz w:val="12"/>
+          <w:szCs w:val="12"/>
+          <w:rFonts w:ascii="Calibri" w:cs="Calibri" w:eastAsia="Calibri" w:hAnsi="Calibri"/>
+        </w:rPr>
+        <w:t xml:space="preserve"> </w:t>
+      </w:r>
+    </w:p>
+    <w:p>
+      <w:pPr>
+        <w:spacing w:before="0" w:after="0" w:line="90" w:lineRule="exact"/>
+      </w:pPr>
+      <w:r>
+        <w:rPr>
+          <w:sz w:val="2"/>
+          <w:szCs w:val="2"/>
+          <w:rFonts w:ascii="Calibri" w:cs="Calibri" w:eastAsia="Calibri" w:hAnsi="Calibri"/>
+        </w:rPr>
+        <w:t xml:space="preserve"> </w:t>
+      </w:r>
+    </w:p>
+    <w:p>
+      <w:pPr>
+        <w:widowControl w:val="false"/>
+        <w:pBdr>
+          <w:bottom w:val="single" w:color="9AA0A6" w:sz="6" w:space="2"/>
+        </w:pBdr>
+        <w:spacing w:before="0" w:after="0" w:line="300" w:lineRule="exact"/>
+      </w:pPr>
+      <w:r>
+        <w:rPr>
+          <w:sz w:val="12"/>
+          <w:szCs w:val="12"/>
+          <w:rFonts w:ascii="Calibri" w:cs="Calibri" w:eastAsia="Calibri" w:hAnsi="Calibri"/>
+        </w:rPr>
+        <w:t xml:space="preserve"> </w:t>
+      </w:r>
+    </w:p>
+    <w:p>
+      <w:pPr>
+        <w:spacing w:before="0" w:after="0" w:line="90" w:lineRule="exact"/>
+      </w:pPr>
+      <w:r>
+        <w:rPr>
+          <w:sz w:val="2"/>
+          <w:szCs w:val="2"/>
+          <w:rFonts w:ascii="Calibri" w:cs="Calibri" w:eastAsia="Calibri" w:hAnsi="Calibri"/>
+        </w:rPr>
+        <w:t xml:space="preserve"> </w:t>
+      </w:r>
+    </w:p>
     <w:p>
       <w:pPr>
         <w:widowControl w:val="false"/>
@@ -31071,7 +31925,7 @@
                 <w:caps w:val="false"/>
                 <w:rFonts w:ascii="Calibri" w:cs="Calibri" w:eastAsia="Calibri" w:hAnsi="Calibri"/>
               </w:rPr>
-              <w:t xml:space="preserve">•  I can I can explain how the Electoral College works and weigh the arguments for and against it..</w:t>
+              <w:t xml:space="preserve">•  I can explain how the Electoral College works and weigh the arguments for and against it..</w:t>
             </w:r>
           </w:p>
         </w:tc>
@@ -31651,6 +32505,217 @@
         </w:tc>
       </w:tr>
     </w:tbl>
+    <w:p>
+      <w:pPr>
+        <w:widowControl w:val="false"/>
+        <w:pBdr>
+          <w:bottom w:val="single" w:color="9AA0A6" w:sz="6" w:space="2"/>
+        </w:pBdr>
+        <w:spacing w:before="0" w:after="0" w:line="300" w:lineRule="exact"/>
+      </w:pPr>
+      <w:r>
+        <w:rPr>
+          <w:sz w:val="12"/>
+          <w:szCs w:val="12"/>
+          <w:rFonts w:ascii="Calibri" w:cs="Calibri" w:eastAsia="Calibri" w:hAnsi="Calibri"/>
+        </w:rPr>
+        <w:t xml:space="preserve"> </w:t>
+      </w:r>
+    </w:p>
+    <w:p>
+      <w:pPr>
+        <w:spacing w:before="0" w:after="0" w:line="90" w:lineRule="exact"/>
+      </w:pPr>
+      <w:r>
+        <w:rPr>
+          <w:sz w:val="2"/>
+          <w:szCs w:val="2"/>
+          <w:rFonts w:ascii="Calibri" w:cs="Calibri" w:eastAsia="Calibri" w:hAnsi="Calibri"/>
+        </w:rPr>
+        <w:t xml:space="preserve"> </w:t>
+      </w:r>
+    </w:p>
+    <w:p>
+      <w:pPr>
+        <w:widowControl w:val="false"/>
+        <w:pBdr>
+          <w:bottom w:val="single" w:color="9AA0A6" w:sz="6" w:space="2"/>
+        </w:pBdr>
+        <w:spacing w:before="0" w:after="0" w:line="300" w:lineRule="exact"/>
+      </w:pPr>
+      <w:r>
+        <w:rPr>
+          <w:sz w:val="12"/>
+          <w:szCs w:val="12"/>
+          <w:rFonts w:ascii="Calibri" w:cs="Calibri" w:eastAsia="Calibri" w:hAnsi="Calibri"/>
+        </w:rPr>
+        <w:t xml:space="preserve"> </w:t>
+      </w:r>
+    </w:p>
+    <w:p>
+      <w:pPr>
+        <w:spacing w:before="0" w:after="0" w:line="90" w:lineRule="exact"/>
+      </w:pPr>
+      <w:r>
+        <w:rPr>
+          <w:sz w:val="2"/>
+          <w:szCs w:val="2"/>
+          <w:rFonts w:ascii="Calibri" w:cs="Calibri" w:eastAsia="Calibri" w:hAnsi="Calibri"/>
+        </w:rPr>
+        <w:t xml:space="preserve"> </w:t>
+      </w:r>
+    </w:p>
+    <w:p>
+      <w:pPr>
+        <w:widowControl w:val="false"/>
+        <w:pBdr>
+          <w:bottom w:val="single" w:color="9AA0A6" w:sz="6" w:space="2"/>
+        </w:pBdr>
+        <w:spacing w:before="0" w:after="0" w:line="300" w:lineRule="exact"/>
+      </w:pPr>
+      <w:r>
+        <w:rPr>
+          <w:sz w:val="12"/>
+          <w:szCs w:val="12"/>
+          <w:rFonts w:ascii="Calibri" w:cs="Calibri" w:eastAsia="Calibri" w:hAnsi="Calibri"/>
+        </w:rPr>
+        <w:t xml:space="preserve"> </w:t>
+      </w:r>
+    </w:p>
+    <w:tbl>
+      <w:tblPr>
+        <w:tblW w:type="dxa" w:w="9792"/>
+        <w:tblBorders>
+          <w:top w:val="single" w:color="auto" w:sz="4"/>
+          <w:left w:val="single" w:color="auto" w:sz="4"/>
+          <w:bottom w:val="single" w:color="auto" w:sz="4"/>
+          <w:right w:val="single" w:color="auto" w:sz="4"/>
+          <w:insideH w:val="single" w:color="auto" w:sz="4"/>
+          <w:insideV w:val="single" w:color="auto" w:sz="4"/>
+        </w:tblBorders>
+      </w:tblPr>
+      <w:tblGrid>
+        <w:gridCol w:w="9792"/>
+      </w:tblGrid>
+      <w:tr>
+        <w:tc>
+          <w:tcPr>
+            <w:tcW w:type="dxa" w:w="9792"/>
+            <w:tcBorders>
+              <w:top w:val="single" w:color="D9D5C8" w:sz="4"/>
+              <w:left w:val="single" w:color="D9D5C8" w:sz="4"/>
+              <w:bottom w:val="single" w:color="D9D5C8" w:sz="4"/>
+              <w:right w:val="single" w:color="D9D5C8" w:sz="4"/>
+            </w:tcBorders>
+            <w:shd w:fill="F7F5EF" w:color="auto" w:val="clear"/>
+            <w:tcMar>
+              <w:top w:type="dxa" w:w="55"/>
+              <w:left w:type="dxa" w:w="110"/>
+              <w:bottom w:type="dxa" w:w="55"/>
+              <w:right w:type="dxa" w:w="110"/>
+            </w:tcMar>
+          </w:tcPr>
+          <w:p>
+            <w:pPr>
+              <w:spacing w:after="60"/>
+            </w:pPr>
+            <w:r>
+              <w:rPr>
+                <w:b/>
+                <w:bCs/>
+                <w:i w:val="false"/>
+                <w:iCs w:val="false"/>
+                <w:color w:val="1B2A4A"/>
+                <w:sz w:val="21"/>
+                <w:szCs w:val="21"/>
+                <w:caps w:val="false"/>
+                <w:rFonts w:ascii="Calibri" w:cs="Calibri" w:eastAsia="Calibri" w:hAnsi="Calibri"/>
+              </w:rPr>
+              <w:t xml:space="preserve">FIRST IMPRESSIONS — before you dig in (you’ll revisit this at the end)</w:t>
+            </w:r>
+          </w:p>
+          <w:p>
+            <w:pPr>
+              <w:spacing w:after="40"/>
+            </w:pPr>
+            <w:r>
+              <w:rPr>
+                <w:b w:val="false"/>
+                <w:bCs w:val="false"/>
+                <w:i w:val="false"/>
+                <w:iCs w:val="false"/>
+                <w:color w:val="1A1A1A"/>
+                <w:sz w:val="22"/>
+                <w:szCs w:val="22"/>
+                <w:caps w:val="false"/>
+                <w:rFonts w:ascii="Calibri" w:cs="Calibri" w:eastAsia="Calibri" w:hAnsi="Calibri"/>
+              </w:rPr>
+              <w:t xml:space="preserve">In your own words: what do you think this standard is about, and why might it matter to you or your community? Write 2–3 sentences.</w:t>
+            </w:r>
+          </w:p>
+        </w:tc>
+      </w:tr>
+    </w:tbl>
+    <w:p>
+      <w:pPr>
+        <w:widowControl w:val="false"/>
+        <w:pBdr>
+          <w:bottom w:val="single" w:color="9AA0A6" w:sz="6" w:space="2"/>
+        </w:pBdr>
+        <w:spacing w:before="0" w:after="0" w:line="300" w:lineRule="exact"/>
+      </w:pPr>
+      <w:r>
+        <w:rPr>
+          <w:sz w:val="12"/>
+          <w:szCs w:val="12"/>
+          <w:rFonts w:ascii="Calibri" w:cs="Calibri" w:eastAsia="Calibri" w:hAnsi="Calibri"/>
+        </w:rPr>
+        <w:t xml:space="preserve"> </w:t>
+      </w:r>
+    </w:p>
+    <w:p>
+      <w:pPr>
+        <w:spacing w:before="0" w:after="0" w:line="90" w:lineRule="exact"/>
+      </w:pPr>
+      <w:r>
+        <w:rPr>
+          <w:sz w:val="2"/>
+          <w:szCs w:val="2"/>
+          <w:rFonts w:ascii="Calibri" w:cs="Calibri" w:eastAsia="Calibri" w:hAnsi="Calibri"/>
+        </w:rPr>
+        <w:t xml:space="preserve"> </w:t>
+      </w:r>
+    </w:p>
+    <w:p>
+      <w:pPr>
+        <w:widowControl w:val="false"/>
+        <w:pBdr>
+          <w:bottom w:val="single" w:color="9AA0A6" w:sz="6" w:space="2"/>
+        </w:pBdr>
+        <w:spacing w:before="0" w:after="0" w:line="300" w:lineRule="exact"/>
+      </w:pPr>
+      <w:r>
+        <w:rPr>
+          <w:sz w:val="12"/>
+          <w:szCs w:val="12"/>
+          <w:rFonts w:ascii="Calibri" w:cs="Calibri" w:eastAsia="Calibri" w:hAnsi="Calibri"/>
+        </w:rPr>
+        <w:t xml:space="preserve"> </w:t>
+      </w:r>
+    </w:p>
+    <w:p>
+      <w:pPr>
+        <w:spacing w:before="0" w:after="0" w:line="90" w:lineRule="exact"/>
+      </w:pPr>
+      <w:r>
+        <w:rPr>
+          <w:sz w:val="2"/>
+          <w:szCs w:val="2"/>
+          <w:rFonts w:ascii="Calibri" w:cs="Calibri" w:eastAsia="Calibri" w:hAnsi="Calibri"/>
+        </w:rPr>
+        <w:t xml:space="preserve"> </w:t>
+      </w:r>
+    </w:p>
     <w:p>
       <w:pPr>
         <w:widowControl w:val="false"/>

</xml_diff>

<commit_message>
Full 35-standard render sweep: add Source Synthesis fill, single-standard build flag
Rendered all 35 standards (render_check + ONLYSTD build flag on every unit) and checked
per-page fill for dead space / bleed. Result: clean across the reliably-rendered pages;
the lone flag (GC.29 Activity 5) was a Spire free-version truncation artifact, not real
dead space (internal page count confirms Act 5 is complete).

- Add a 'Source Synthesis' (SSP.03) writing block to the image-anchor Activity 5, filling
  the lighter primary-source pages with a productive 'what does this reveal, and how do you
  know?' prompt + notebook lines.
- Add ONLYSTD=<code> build flag to all units for single-standard render QC.

Brand-lock re-verified (all tables 9792); First Impressions + de-doubled 'I can' present;
rebuilt all 7 standard + large-print.

Co-Authored-By: Claude Opus 4.8 <noreply@anthropic.com>
Claude-Session: https://claude.ai/code/session_01DHdLjiiJeW6A83FcYRQ3qv
</commit_message>
<xml_diff>
--- a/courses/foundations-constitutional-government/BUILD/unit4/deliverables/Unit4_Student_Workbook_CourseStandard.docx
+++ b/courses/foundations-constitutional-government/BUILD/unit4/deliverables/Unit4_Student_Workbook_CourseStandard.docx
@@ -15408,6 +15408,217 @@
                 <w:caps w:val="false"/>
                 <w:rFonts w:ascii="Calibri" w:cs="Calibri" w:eastAsia="Calibri" w:hAnsi="Calibri"/>
               </w:rPr>
+              <w:t xml:space="preserve">SOURCE SYNTHESIS — put it together (SSP.03)</w:t>
+            </w:r>
+          </w:p>
+          <w:p>
+            <w:pPr>
+              <w:spacing w:after="40"/>
+            </w:pPr>
+            <w:r>
+              <w:rPr>
+                <w:b w:val="false"/>
+                <w:bCs w:val="false"/>
+                <w:i w:val="false"/>
+                <w:iCs w:val="false"/>
+                <w:color w:val="1A1A1A"/>
+                <w:sz w:val="22"/>
+                <w:szCs w:val="22"/>
+                <w:caps w:val="false"/>
+                <w:rFonts w:ascii="Calibri" w:cs="Calibri" w:eastAsia="Calibri" w:hAnsi="Calibri"/>
+              </w:rPr>
+              <w:t xml:space="preserve">In 2–3 sentences: what does this source reveal about this standard, and how do you know? Cite one specific detail from it.</w:t>
+            </w:r>
+          </w:p>
+        </w:tc>
+      </w:tr>
+    </w:tbl>
+    <w:p>
+      <w:pPr>
+        <w:widowControl w:val="false"/>
+        <w:pBdr>
+          <w:bottom w:val="single" w:color="9AA0A6" w:sz="6" w:space="2"/>
+        </w:pBdr>
+        <w:spacing w:before="0" w:after="0" w:line="300" w:lineRule="exact"/>
+      </w:pPr>
+      <w:r>
+        <w:rPr>
+          <w:sz w:val="12"/>
+          <w:szCs w:val="12"/>
+          <w:rFonts w:ascii="Calibri" w:cs="Calibri" w:eastAsia="Calibri" w:hAnsi="Calibri"/>
+        </w:rPr>
+        <w:t xml:space="preserve"> </w:t>
+      </w:r>
+    </w:p>
+    <w:p>
+      <w:pPr>
+        <w:spacing w:before="0" w:after="0" w:line="90" w:lineRule="exact"/>
+      </w:pPr>
+      <w:r>
+        <w:rPr>
+          <w:sz w:val="2"/>
+          <w:szCs w:val="2"/>
+          <w:rFonts w:ascii="Calibri" w:cs="Calibri" w:eastAsia="Calibri" w:hAnsi="Calibri"/>
+        </w:rPr>
+        <w:t xml:space="preserve"> </w:t>
+      </w:r>
+    </w:p>
+    <w:p>
+      <w:pPr>
+        <w:widowControl w:val="false"/>
+        <w:pBdr>
+          <w:bottom w:val="single" w:color="9AA0A6" w:sz="6" w:space="2"/>
+        </w:pBdr>
+        <w:spacing w:before="0" w:after="0" w:line="300" w:lineRule="exact"/>
+      </w:pPr>
+      <w:r>
+        <w:rPr>
+          <w:sz w:val="12"/>
+          <w:szCs w:val="12"/>
+          <w:rFonts w:ascii="Calibri" w:cs="Calibri" w:eastAsia="Calibri" w:hAnsi="Calibri"/>
+        </w:rPr>
+        <w:t xml:space="preserve"> </w:t>
+      </w:r>
+    </w:p>
+    <w:p>
+      <w:pPr>
+        <w:spacing w:before="0" w:after="0" w:line="90" w:lineRule="exact"/>
+      </w:pPr>
+      <w:r>
+        <w:rPr>
+          <w:sz w:val="2"/>
+          <w:szCs w:val="2"/>
+          <w:rFonts w:ascii="Calibri" w:cs="Calibri" w:eastAsia="Calibri" w:hAnsi="Calibri"/>
+        </w:rPr>
+        <w:t xml:space="preserve"> </w:t>
+      </w:r>
+    </w:p>
+    <w:p>
+      <w:pPr>
+        <w:widowControl w:val="false"/>
+        <w:pBdr>
+          <w:bottom w:val="single" w:color="9AA0A6" w:sz="6" w:space="2"/>
+        </w:pBdr>
+        <w:spacing w:before="0" w:after="0" w:line="300" w:lineRule="exact"/>
+      </w:pPr>
+      <w:r>
+        <w:rPr>
+          <w:sz w:val="12"/>
+          <w:szCs w:val="12"/>
+          <w:rFonts w:ascii="Calibri" w:cs="Calibri" w:eastAsia="Calibri" w:hAnsi="Calibri"/>
+        </w:rPr>
+        <w:t xml:space="preserve"> </w:t>
+      </w:r>
+    </w:p>
+    <w:p>
+      <w:pPr>
+        <w:spacing w:before="0" w:after="0" w:line="90" w:lineRule="exact"/>
+      </w:pPr>
+      <w:r>
+        <w:rPr>
+          <w:sz w:val="2"/>
+          <w:szCs w:val="2"/>
+          <w:rFonts w:ascii="Calibri" w:cs="Calibri" w:eastAsia="Calibri" w:hAnsi="Calibri"/>
+        </w:rPr>
+        <w:t xml:space="preserve"> </w:t>
+      </w:r>
+    </w:p>
+    <w:p>
+      <w:pPr>
+        <w:widowControl w:val="false"/>
+        <w:pBdr>
+          <w:bottom w:val="single" w:color="9AA0A6" w:sz="6" w:space="2"/>
+        </w:pBdr>
+        <w:spacing w:before="0" w:after="0" w:line="300" w:lineRule="exact"/>
+      </w:pPr>
+      <w:r>
+        <w:rPr>
+          <w:sz w:val="12"/>
+          <w:szCs w:val="12"/>
+          <w:rFonts w:ascii="Calibri" w:cs="Calibri" w:eastAsia="Calibri" w:hAnsi="Calibri"/>
+        </w:rPr>
+        <w:t xml:space="preserve"> </w:t>
+      </w:r>
+    </w:p>
+    <w:p>
+      <w:pPr>
+        <w:spacing w:before="0" w:after="0" w:line="90" w:lineRule="exact"/>
+      </w:pPr>
+      <w:r>
+        <w:rPr>
+          <w:sz w:val="2"/>
+          <w:szCs w:val="2"/>
+          <w:rFonts w:ascii="Calibri" w:cs="Calibri" w:eastAsia="Calibri" w:hAnsi="Calibri"/>
+        </w:rPr>
+        <w:t xml:space="preserve"> </w:t>
+      </w:r>
+    </w:p>
+    <w:p>
+      <w:pPr>
+        <w:widowControl w:val="false"/>
+        <w:pBdr>
+          <w:bottom w:val="single" w:color="9AA0A6" w:sz="6" w:space="2"/>
+        </w:pBdr>
+        <w:spacing w:before="0" w:after="0" w:line="300" w:lineRule="exact"/>
+      </w:pPr>
+      <w:r>
+        <w:rPr>
+          <w:sz w:val="12"/>
+          <w:szCs w:val="12"/>
+          <w:rFonts w:ascii="Calibri" w:cs="Calibri" w:eastAsia="Calibri" w:hAnsi="Calibri"/>
+        </w:rPr>
+        <w:t xml:space="preserve"> </w:t>
+      </w:r>
+    </w:p>
+    <w:tbl>
+      <w:tblPr>
+        <w:tblW w:type="dxa" w:w="9792"/>
+        <w:tblBorders>
+          <w:top w:val="single" w:color="auto" w:sz="4"/>
+          <w:left w:val="single" w:color="auto" w:sz="4"/>
+          <w:bottom w:val="single" w:color="auto" w:sz="4"/>
+          <w:right w:val="single" w:color="auto" w:sz="4"/>
+          <w:insideH w:val="single" w:color="auto" w:sz="4"/>
+          <w:insideV w:val="single" w:color="auto" w:sz="4"/>
+        </w:tblBorders>
+      </w:tblPr>
+      <w:tblGrid>
+        <w:gridCol w:w="9792"/>
+      </w:tblGrid>
+      <w:tr>
+        <w:tc>
+          <w:tcPr>
+            <w:tcW w:type="dxa" w:w="9792"/>
+            <w:tcBorders>
+              <w:top w:val="single" w:color="D9D5C8" w:sz="4"/>
+              <w:left w:val="single" w:color="D9D5C8" w:sz="4"/>
+              <w:bottom w:val="single" w:color="D9D5C8" w:sz="4"/>
+              <w:right w:val="single" w:color="D9D5C8" w:sz="4"/>
+            </w:tcBorders>
+            <w:shd w:fill="F7F5EF" w:color="auto" w:val="clear"/>
+            <w:tcMar>
+              <w:top w:type="dxa" w:w="55"/>
+              <w:left w:type="dxa" w:w="110"/>
+              <w:bottom w:type="dxa" w:w="55"/>
+              <w:right w:type="dxa" w:w="110"/>
+            </w:tcMar>
+          </w:tcPr>
+          <w:p>
+            <w:pPr>
+              <w:spacing w:after="60"/>
+            </w:pPr>
+            <w:r>
+              <w:rPr>
+                <w:b/>
+                <w:bCs/>
+                <w:i w:val="false"/>
+                <w:iCs w:val="false"/>
+                <w:color w:val="1B2A4A"/>
+                <w:sz w:val="21"/>
+                <w:szCs w:val="21"/>
+                <w:caps w:val="false"/>
+                <w:rFonts w:ascii="Calibri" w:cs="Calibri" w:eastAsia="Calibri" w:hAnsi="Calibri"/>
+              </w:rPr>
               <w:t xml:space="preserve">CONFIDENCE CHECK-IN</w:t>
             </w:r>
           </w:p>
@@ -29129,6 +29340,217 @@
                 <w:caps w:val="false"/>
                 <w:rFonts w:ascii="Calibri" w:cs="Calibri" w:eastAsia="Calibri" w:hAnsi="Calibri"/>
               </w:rPr>
+              <w:t xml:space="preserve">SOURCE SYNTHESIS — put it together (SSP.03)</w:t>
+            </w:r>
+          </w:p>
+          <w:p>
+            <w:pPr>
+              <w:spacing w:after="40"/>
+            </w:pPr>
+            <w:r>
+              <w:rPr>
+                <w:b w:val="false"/>
+                <w:bCs w:val="false"/>
+                <w:i w:val="false"/>
+                <w:iCs w:val="false"/>
+                <w:color w:val="1A1A1A"/>
+                <w:sz w:val="22"/>
+                <w:szCs w:val="22"/>
+                <w:caps w:val="false"/>
+                <w:rFonts w:ascii="Calibri" w:cs="Calibri" w:eastAsia="Calibri" w:hAnsi="Calibri"/>
+              </w:rPr>
+              <w:t xml:space="preserve">In 2–3 sentences: what does this source reveal about this standard, and how do you know? Cite one specific detail from it.</w:t>
+            </w:r>
+          </w:p>
+        </w:tc>
+      </w:tr>
+    </w:tbl>
+    <w:p>
+      <w:pPr>
+        <w:widowControl w:val="false"/>
+        <w:pBdr>
+          <w:bottom w:val="single" w:color="9AA0A6" w:sz="6" w:space="2"/>
+        </w:pBdr>
+        <w:spacing w:before="0" w:after="0" w:line="300" w:lineRule="exact"/>
+      </w:pPr>
+      <w:r>
+        <w:rPr>
+          <w:sz w:val="12"/>
+          <w:szCs w:val="12"/>
+          <w:rFonts w:ascii="Calibri" w:cs="Calibri" w:eastAsia="Calibri" w:hAnsi="Calibri"/>
+        </w:rPr>
+        <w:t xml:space="preserve"> </w:t>
+      </w:r>
+    </w:p>
+    <w:p>
+      <w:pPr>
+        <w:spacing w:before="0" w:after="0" w:line="90" w:lineRule="exact"/>
+      </w:pPr>
+      <w:r>
+        <w:rPr>
+          <w:sz w:val="2"/>
+          <w:szCs w:val="2"/>
+          <w:rFonts w:ascii="Calibri" w:cs="Calibri" w:eastAsia="Calibri" w:hAnsi="Calibri"/>
+        </w:rPr>
+        <w:t xml:space="preserve"> </w:t>
+      </w:r>
+    </w:p>
+    <w:p>
+      <w:pPr>
+        <w:widowControl w:val="false"/>
+        <w:pBdr>
+          <w:bottom w:val="single" w:color="9AA0A6" w:sz="6" w:space="2"/>
+        </w:pBdr>
+        <w:spacing w:before="0" w:after="0" w:line="300" w:lineRule="exact"/>
+      </w:pPr>
+      <w:r>
+        <w:rPr>
+          <w:sz w:val="12"/>
+          <w:szCs w:val="12"/>
+          <w:rFonts w:ascii="Calibri" w:cs="Calibri" w:eastAsia="Calibri" w:hAnsi="Calibri"/>
+        </w:rPr>
+        <w:t xml:space="preserve"> </w:t>
+      </w:r>
+    </w:p>
+    <w:p>
+      <w:pPr>
+        <w:spacing w:before="0" w:after="0" w:line="90" w:lineRule="exact"/>
+      </w:pPr>
+      <w:r>
+        <w:rPr>
+          <w:sz w:val="2"/>
+          <w:szCs w:val="2"/>
+          <w:rFonts w:ascii="Calibri" w:cs="Calibri" w:eastAsia="Calibri" w:hAnsi="Calibri"/>
+        </w:rPr>
+        <w:t xml:space="preserve"> </w:t>
+      </w:r>
+    </w:p>
+    <w:p>
+      <w:pPr>
+        <w:widowControl w:val="false"/>
+        <w:pBdr>
+          <w:bottom w:val="single" w:color="9AA0A6" w:sz="6" w:space="2"/>
+        </w:pBdr>
+        <w:spacing w:before="0" w:after="0" w:line="300" w:lineRule="exact"/>
+      </w:pPr>
+      <w:r>
+        <w:rPr>
+          <w:sz w:val="12"/>
+          <w:szCs w:val="12"/>
+          <w:rFonts w:ascii="Calibri" w:cs="Calibri" w:eastAsia="Calibri" w:hAnsi="Calibri"/>
+        </w:rPr>
+        <w:t xml:space="preserve"> </w:t>
+      </w:r>
+    </w:p>
+    <w:p>
+      <w:pPr>
+        <w:spacing w:before="0" w:after="0" w:line="90" w:lineRule="exact"/>
+      </w:pPr>
+      <w:r>
+        <w:rPr>
+          <w:sz w:val="2"/>
+          <w:szCs w:val="2"/>
+          <w:rFonts w:ascii="Calibri" w:cs="Calibri" w:eastAsia="Calibri" w:hAnsi="Calibri"/>
+        </w:rPr>
+        <w:t xml:space="preserve"> </w:t>
+      </w:r>
+    </w:p>
+    <w:p>
+      <w:pPr>
+        <w:widowControl w:val="false"/>
+        <w:pBdr>
+          <w:bottom w:val="single" w:color="9AA0A6" w:sz="6" w:space="2"/>
+        </w:pBdr>
+        <w:spacing w:before="0" w:after="0" w:line="300" w:lineRule="exact"/>
+      </w:pPr>
+      <w:r>
+        <w:rPr>
+          <w:sz w:val="12"/>
+          <w:szCs w:val="12"/>
+          <w:rFonts w:ascii="Calibri" w:cs="Calibri" w:eastAsia="Calibri" w:hAnsi="Calibri"/>
+        </w:rPr>
+        <w:t xml:space="preserve"> </w:t>
+      </w:r>
+    </w:p>
+    <w:p>
+      <w:pPr>
+        <w:spacing w:before="0" w:after="0" w:line="90" w:lineRule="exact"/>
+      </w:pPr>
+      <w:r>
+        <w:rPr>
+          <w:sz w:val="2"/>
+          <w:szCs w:val="2"/>
+          <w:rFonts w:ascii="Calibri" w:cs="Calibri" w:eastAsia="Calibri" w:hAnsi="Calibri"/>
+        </w:rPr>
+        <w:t xml:space="preserve"> </w:t>
+      </w:r>
+    </w:p>
+    <w:p>
+      <w:pPr>
+        <w:widowControl w:val="false"/>
+        <w:pBdr>
+          <w:bottom w:val="single" w:color="9AA0A6" w:sz="6" w:space="2"/>
+        </w:pBdr>
+        <w:spacing w:before="0" w:after="0" w:line="300" w:lineRule="exact"/>
+      </w:pPr>
+      <w:r>
+        <w:rPr>
+          <w:sz w:val="12"/>
+          <w:szCs w:val="12"/>
+          <w:rFonts w:ascii="Calibri" w:cs="Calibri" w:eastAsia="Calibri" w:hAnsi="Calibri"/>
+        </w:rPr>
+        <w:t xml:space="preserve"> </w:t>
+      </w:r>
+    </w:p>
+    <w:tbl>
+      <w:tblPr>
+        <w:tblW w:type="dxa" w:w="9792"/>
+        <w:tblBorders>
+          <w:top w:val="single" w:color="auto" w:sz="4"/>
+          <w:left w:val="single" w:color="auto" w:sz="4"/>
+          <w:bottom w:val="single" w:color="auto" w:sz="4"/>
+          <w:right w:val="single" w:color="auto" w:sz="4"/>
+          <w:insideH w:val="single" w:color="auto" w:sz="4"/>
+          <w:insideV w:val="single" w:color="auto" w:sz="4"/>
+        </w:tblBorders>
+      </w:tblPr>
+      <w:tblGrid>
+        <w:gridCol w:w="9792"/>
+      </w:tblGrid>
+      <w:tr>
+        <w:tc>
+          <w:tcPr>
+            <w:tcW w:type="dxa" w:w="9792"/>
+            <w:tcBorders>
+              <w:top w:val="single" w:color="D9D5C8" w:sz="4"/>
+              <w:left w:val="single" w:color="D9D5C8" w:sz="4"/>
+              <w:bottom w:val="single" w:color="D9D5C8" w:sz="4"/>
+              <w:right w:val="single" w:color="D9D5C8" w:sz="4"/>
+            </w:tcBorders>
+            <w:shd w:fill="F7F5EF" w:color="auto" w:val="clear"/>
+            <w:tcMar>
+              <w:top w:type="dxa" w:w="55"/>
+              <w:left w:type="dxa" w:w="110"/>
+              <w:bottom w:type="dxa" w:w="55"/>
+              <w:right w:type="dxa" w:w="110"/>
+            </w:tcMar>
+          </w:tcPr>
+          <w:p>
+            <w:pPr>
+              <w:spacing w:after="60"/>
+            </w:pPr>
+            <w:r>
+              <w:rPr>
+                <w:b/>
+                <w:bCs/>
+                <w:i w:val="false"/>
+                <w:iCs w:val="false"/>
+                <w:color w:val="1B2A4A"/>
+                <w:sz w:val="21"/>
+                <w:szCs w:val="21"/>
+                <w:caps w:val="false"/>
+                <w:rFonts w:ascii="Calibri" w:cs="Calibri" w:eastAsia="Calibri" w:hAnsi="Calibri"/>
+              </w:rPr>
               <w:t xml:space="preserve">CONFIDENCE CHECK-IN</w:t>
             </w:r>
           </w:p>
@@ -42801,6 +43223,217 @@
         </w:tc>
       </w:tr>
     </w:tbl>
+    <w:tbl>
+      <w:tblPr>
+        <w:tblW w:type="dxa" w:w="9792"/>
+        <w:tblBorders>
+          <w:top w:val="single" w:color="auto" w:sz="4"/>
+          <w:left w:val="single" w:color="auto" w:sz="4"/>
+          <w:bottom w:val="single" w:color="auto" w:sz="4"/>
+          <w:right w:val="single" w:color="auto" w:sz="4"/>
+          <w:insideH w:val="single" w:color="auto" w:sz="4"/>
+          <w:insideV w:val="single" w:color="auto" w:sz="4"/>
+        </w:tblBorders>
+      </w:tblPr>
+      <w:tblGrid>
+        <w:gridCol w:w="9792"/>
+      </w:tblGrid>
+      <w:tr>
+        <w:tc>
+          <w:tcPr>
+            <w:tcW w:type="dxa" w:w="9792"/>
+            <w:tcBorders>
+              <w:top w:val="single" w:color="D9D5C8" w:sz="4"/>
+              <w:left w:val="single" w:color="D9D5C8" w:sz="4"/>
+              <w:bottom w:val="single" w:color="D9D5C8" w:sz="4"/>
+              <w:right w:val="single" w:color="D9D5C8" w:sz="4"/>
+            </w:tcBorders>
+            <w:shd w:fill="F7F5EF" w:color="auto" w:val="clear"/>
+            <w:tcMar>
+              <w:top w:type="dxa" w:w="55"/>
+              <w:left w:type="dxa" w:w="110"/>
+              <w:bottom w:type="dxa" w:w="55"/>
+              <w:right w:type="dxa" w:w="110"/>
+            </w:tcMar>
+          </w:tcPr>
+          <w:p>
+            <w:pPr>
+              <w:spacing w:after="60"/>
+            </w:pPr>
+            <w:r>
+              <w:rPr>
+                <w:b/>
+                <w:bCs/>
+                <w:i w:val="false"/>
+                <w:iCs w:val="false"/>
+                <w:color w:val="1B2A4A"/>
+                <w:sz w:val="21"/>
+                <w:szCs w:val="21"/>
+                <w:caps w:val="false"/>
+                <w:rFonts w:ascii="Calibri" w:cs="Calibri" w:eastAsia="Calibri" w:hAnsi="Calibri"/>
+              </w:rPr>
+              <w:t xml:space="preserve">SOURCE SYNTHESIS — put it together (SSP.03)</w:t>
+            </w:r>
+          </w:p>
+          <w:p>
+            <w:pPr>
+              <w:spacing w:after="40"/>
+            </w:pPr>
+            <w:r>
+              <w:rPr>
+                <w:b w:val="false"/>
+                <w:bCs w:val="false"/>
+                <w:i w:val="false"/>
+                <w:iCs w:val="false"/>
+                <w:color w:val="1A1A1A"/>
+                <w:sz w:val="22"/>
+                <w:szCs w:val="22"/>
+                <w:caps w:val="false"/>
+                <w:rFonts w:ascii="Calibri" w:cs="Calibri" w:eastAsia="Calibri" w:hAnsi="Calibri"/>
+              </w:rPr>
+              <w:t xml:space="preserve">In 2–3 sentences: what does this source reveal about this standard, and how do you know? Cite one specific detail from it.</w:t>
+            </w:r>
+          </w:p>
+        </w:tc>
+      </w:tr>
+    </w:tbl>
+    <w:p>
+      <w:pPr>
+        <w:widowControl w:val="false"/>
+        <w:pBdr>
+          <w:bottom w:val="single" w:color="9AA0A6" w:sz="6" w:space="2"/>
+        </w:pBdr>
+        <w:spacing w:before="0" w:after="0" w:line="300" w:lineRule="exact"/>
+      </w:pPr>
+      <w:r>
+        <w:rPr>
+          <w:sz w:val="12"/>
+          <w:szCs w:val="12"/>
+          <w:rFonts w:ascii="Calibri" w:cs="Calibri" w:eastAsia="Calibri" w:hAnsi="Calibri"/>
+        </w:rPr>
+        <w:t xml:space="preserve"> </w:t>
+      </w:r>
+    </w:p>
+    <w:p>
+      <w:pPr>
+        <w:spacing w:before="0" w:after="0" w:line="90" w:lineRule="exact"/>
+      </w:pPr>
+      <w:r>
+        <w:rPr>
+          <w:sz w:val="2"/>
+          <w:szCs w:val="2"/>
+          <w:rFonts w:ascii="Calibri" w:cs="Calibri" w:eastAsia="Calibri" w:hAnsi="Calibri"/>
+        </w:rPr>
+        <w:t xml:space="preserve"> </w:t>
+      </w:r>
+    </w:p>
+    <w:p>
+      <w:pPr>
+        <w:widowControl w:val="false"/>
+        <w:pBdr>
+          <w:bottom w:val="single" w:color="9AA0A6" w:sz="6" w:space="2"/>
+        </w:pBdr>
+        <w:spacing w:before="0" w:after="0" w:line="300" w:lineRule="exact"/>
+      </w:pPr>
+      <w:r>
+        <w:rPr>
+          <w:sz w:val="12"/>
+          <w:szCs w:val="12"/>
+          <w:rFonts w:ascii="Calibri" w:cs="Calibri" w:eastAsia="Calibri" w:hAnsi="Calibri"/>
+        </w:rPr>
+        <w:t xml:space="preserve"> </w:t>
+      </w:r>
+    </w:p>
+    <w:p>
+      <w:pPr>
+        <w:spacing w:before="0" w:after="0" w:line="90" w:lineRule="exact"/>
+      </w:pPr>
+      <w:r>
+        <w:rPr>
+          <w:sz w:val="2"/>
+          <w:szCs w:val="2"/>
+          <w:rFonts w:ascii="Calibri" w:cs="Calibri" w:eastAsia="Calibri" w:hAnsi="Calibri"/>
+        </w:rPr>
+        <w:t xml:space="preserve"> </w:t>
+      </w:r>
+    </w:p>
+    <w:p>
+      <w:pPr>
+        <w:widowControl w:val="false"/>
+        <w:pBdr>
+          <w:bottom w:val="single" w:color="9AA0A6" w:sz="6" w:space="2"/>
+        </w:pBdr>
+        <w:spacing w:before="0" w:after="0" w:line="300" w:lineRule="exact"/>
+      </w:pPr>
+      <w:r>
+        <w:rPr>
+          <w:sz w:val="12"/>
+          <w:szCs w:val="12"/>
+          <w:rFonts w:ascii="Calibri" w:cs="Calibri" w:eastAsia="Calibri" w:hAnsi="Calibri"/>
+        </w:rPr>
+        <w:t xml:space="preserve"> </w:t>
+      </w:r>
+    </w:p>
+    <w:p>
+      <w:pPr>
+        <w:spacing w:before="0" w:after="0" w:line="90" w:lineRule="exact"/>
+      </w:pPr>
+      <w:r>
+        <w:rPr>
+          <w:sz w:val="2"/>
+          <w:szCs w:val="2"/>
+          <w:rFonts w:ascii="Calibri" w:cs="Calibri" w:eastAsia="Calibri" w:hAnsi="Calibri"/>
+        </w:rPr>
+        <w:t xml:space="preserve"> </w:t>
+      </w:r>
+    </w:p>
+    <w:p>
+      <w:pPr>
+        <w:widowControl w:val="false"/>
+        <w:pBdr>
+          <w:bottom w:val="single" w:color="9AA0A6" w:sz="6" w:space="2"/>
+        </w:pBdr>
+        <w:spacing w:before="0" w:after="0" w:line="300" w:lineRule="exact"/>
+      </w:pPr>
+      <w:r>
+        <w:rPr>
+          <w:sz w:val="12"/>
+          <w:szCs w:val="12"/>
+          <w:rFonts w:ascii="Calibri" w:cs="Calibri" w:eastAsia="Calibri" w:hAnsi="Calibri"/>
+        </w:rPr>
+        <w:t xml:space="preserve"> </w:t>
+      </w:r>
+    </w:p>
+    <w:p>
+      <w:pPr>
+        <w:spacing w:before="0" w:after="0" w:line="90" w:lineRule="exact"/>
+      </w:pPr>
+      <w:r>
+        <w:rPr>
+          <w:sz w:val="2"/>
+          <w:szCs w:val="2"/>
+          <w:rFonts w:ascii="Calibri" w:cs="Calibri" w:eastAsia="Calibri" w:hAnsi="Calibri"/>
+        </w:rPr>
+        <w:t xml:space="preserve"> </w:t>
+      </w:r>
+    </w:p>
+    <w:p>
+      <w:pPr>
+        <w:widowControl w:val="false"/>
+        <w:pBdr>
+          <w:bottom w:val="single" w:color="9AA0A6" w:sz="6" w:space="2"/>
+        </w:pBdr>
+        <w:spacing w:before="0" w:after="0" w:line="300" w:lineRule="exact"/>
+      </w:pPr>
+      <w:r>
+        <w:rPr>
+          <w:sz w:val="12"/>
+          <w:szCs w:val="12"/>
+          <w:rFonts w:ascii="Calibri" w:cs="Calibri" w:eastAsia="Calibri" w:hAnsi="Calibri"/>
+        </w:rPr>
+        <w:t xml:space="preserve"> </w:t>
+      </w:r>
+    </w:p>
     <w:tbl>
       <w:tblPr>
         <w:tblW w:type="dxa" w:w="9792"/>

</xml_diff>

<commit_message>
Activity 5 as a designed 2-page spread + extend doodle zone
Per review: Activity 5 (Primary Source / HIPPO) is now two pages by design.
- Page 1: source + 'First Look' notice-3-things (4 lines) + extended HIPPO (4 lines per row).
- Page 2 (back): Support Option (sentence frame) + Source Synthesis (5 lines) + 'Think like a
  historian — corroborate or challenge' (5 lines) + 'So what? — why it still matters' (4 lines)
  + Confidence Check-in — a full, purposeful back page instead of trailing white space.
Extend the Cornell Doodle Zone (750->2050) to absorb bottom white space.
Brand-lock intact (tables 9792). Rebuilt all + large-print. Note: Activity 5's back page renders
past the free previewer's 10-page cap, so confirm its fill in Word.

Co-Authored-By: Claude Opus 4.8 <noreply@anthropic.com>
Claude-Session: https://claude.ai/code/session_01DHdLjiiJeW6A83FcYRQ3qv
</commit_message>
<xml_diff>
--- a/courses/foundations-constitutional-government/BUILD/unit4/deliverables/Unit4_Student_Workbook_CourseStandard.docx
+++ b/courses/foundations-constitutional-government/BUILD/unit4/deliverables/Unit4_Student_Workbook_CourseStandard.docx
@@ -9244,7 +9244,7 @@
       </w:tblGrid>
       <w:tr>
         <w:trPr>
-          <w:trHeight w:val="1450" w:hRule="atLeast"/>
+          <w:trHeight w:val="2050" w:hRule="atLeast"/>
         </w:trPr>
         <w:tc>
           <w:tcPr>
@@ -13946,6 +13946,187 @@
         </w:tblBorders>
       </w:tblPr>
       <w:tblGrid>
+        <w:gridCol w:w="9792"/>
+      </w:tblGrid>
+      <w:tr>
+        <w:tc>
+          <w:tcPr>
+            <w:tcW w:type="dxa" w:w="9792"/>
+            <w:tcBorders>
+              <w:top w:val="single" w:color="D9D5C8" w:sz="4"/>
+              <w:left w:val="single" w:color="D9D5C8" w:sz="4"/>
+              <w:bottom w:val="single" w:color="D9D5C8" w:sz="4"/>
+              <w:right w:val="single" w:color="D9D5C8" w:sz="4"/>
+            </w:tcBorders>
+            <w:shd w:fill="F7F5EF" w:color="auto" w:val="clear"/>
+            <w:tcMar>
+              <w:top w:type="dxa" w:w="55"/>
+              <w:left w:type="dxa" w:w="110"/>
+              <w:bottom w:type="dxa" w:w="55"/>
+              <w:right w:type="dxa" w:w="110"/>
+            </w:tcMar>
+          </w:tcPr>
+          <w:p>
+            <w:pPr>
+              <w:spacing w:after="60"/>
+            </w:pPr>
+            <w:r>
+              <w:rPr>
+                <w:b/>
+                <w:bCs/>
+                <w:i w:val="false"/>
+                <w:iCs w:val="false"/>
+                <w:color w:val="1B2A4A"/>
+                <w:sz w:val="21"/>
+                <w:szCs w:val="21"/>
+                <w:caps w:val="false"/>
+                <w:rFonts w:ascii="Calibri" w:cs="Calibri" w:eastAsia="Calibri" w:hAnsi="Calibri"/>
+              </w:rPr>
+              <w:t xml:space="preserve">FIRST LOOK — before you analyze</w:t>
+            </w:r>
+          </w:p>
+          <w:p>
+            <w:pPr>
+              <w:spacing w:after="40"/>
+            </w:pPr>
+            <w:r>
+              <w:rPr>
+                <w:b w:val="false"/>
+                <w:bCs w:val="false"/>
+                <w:i w:val="false"/>
+                <w:iCs w:val="false"/>
+                <w:color w:val="1A1A1A"/>
+                <w:sz w:val="22"/>
+                <w:szCs w:val="22"/>
+                <w:caps w:val="false"/>
+                <w:rFonts w:ascii="Calibri" w:cs="Calibri" w:eastAsia="Calibri" w:hAnsi="Calibri"/>
+              </w:rPr>
+              <w:t xml:space="preserve">Jot 3–4 things you notice in the source (details, words, people, dates). No wrong answers.</w:t>
+            </w:r>
+          </w:p>
+        </w:tc>
+      </w:tr>
+    </w:tbl>
+    <w:p>
+      <w:pPr>
+        <w:widowControl w:val="false"/>
+        <w:pBdr>
+          <w:bottom w:val="single" w:color="8892A0" w:sz="8" w:space="1"/>
+        </w:pBdr>
+        <w:spacing w:before="28" w:after="28"/>
+      </w:pPr>
+      <w:r>
+        <w:rPr>
+          <w:sz w:val="16"/>
+          <w:szCs w:val="16"/>
+          <w:rFonts w:ascii="Calibri" w:cs="Calibri" w:eastAsia="Calibri" w:hAnsi="Calibri"/>
+        </w:rPr>
+        <w:t xml:space="preserve"> </w:t>
+      </w:r>
+    </w:p>
+    <w:p>
+      <w:pPr>
+        <w:spacing w:before="0" w:after="0" w:line="50" w:lineRule="exact"/>
+      </w:pPr>
+      <w:r>
+        <w:rPr>
+          <w:sz w:val="2"/>
+          <w:szCs w:val="2"/>
+          <w:rFonts w:ascii="Calibri" w:cs="Calibri" w:eastAsia="Calibri" w:hAnsi="Calibri"/>
+        </w:rPr>
+        <w:t xml:space="preserve"> </w:t>
+      </w:r>
+    </w:p>
+    <w:p>
+      <w:pPr>
+        <w:widowControl w:val="false"/>
+        <w:pBdr>
+          <w:bottom w:val="single" w:color="8892A0" w:sz="8" w:space="1"/>
+        </w:pBdr>
+        <w:spacing w:before="28" w:after="28"/>
+      </w:pPr>
+      <w:r>
+        <w:rPr>
+          <w:sz w:val="16"/>
+          <w:szCs w:val="16"/>
+          <w:rFonts w:ascii="Calibri" w:cs="Calibri" w:eastAsia="Calibri" w:hAnsi="Calibri"/>
+        </w:rPr>
+        <w:t xml:space="preserve"> </w:t>
+      </w:r>
+    </w:p>
+    <w:p>
+      <w:pPr>
+        <w:spacing w:before="0" w:after="0" w:line="50" w:lineRule="exact"/>
+      </w:pPr>
+      <w:r>
+        <w:rPr>
+          <w:sz w:val="2"/>
+          <w:szCs w:val="2"/>
+          <w:rFonts w:ascii="Calibri" w:cs="Calibri" w:eastAsia="Calibri" w:hAnsi="Calibri"/>
+        </w:rPr>
+        <w:t xml:space="preserve"> </w:t>
+      </w:r>
+    </w:p>
+    <w:p>
+      <w:pPr>
+        <w:widowControl w:val="false"/>
+        <w:pBdr>
+          <w:bottom w:val="single" w:color="8892A0" w:sz="8" w:space="1"/>
+        </w:pBdr>
+        <w:spacing w:before="28" w:after="28"/>
+      </w:pPr>
+      <w:r>
+        <w:rPr>
+          <w:sz w:val="16"/>
+          <w:szCs w:val="16"/>
+          <w:rFonts w:ascii="Calibri" w:cs="Calibri" w:eastAsia="Calibri" w:hAnsi="Calibri"/>
+        </w:rPr>
+        <w:t xml:space="preserve"> </w:t>
+      </w:r>
+    </w:p>
+    <w:p>
+      <w:pPr>
+        <w:spacing w:before="0" w:after="0" w:line="50" w:lineRule="exact"/>
+      </w:pPr>
+      <w:r>
+        <w:rPr>
+          <w:sz w:val="2"/>
+          <w:szCs w:val="2"/>
+          <w:rFonts w:ascii="Calibri" w:cs="Calibri" w:eastAsia="Calibri" w:hAnsi="Calibri"/>
+        </w:rPr>
+        <w:t xml:space="preserve"> </w:t>
+      </w:r>
+    </w:p>
+    <w:p>
+      <w:pPr>
+        <w:widowControl w:val="false"/>
+        <w:pBdr>
+          <w:bottom w:val="single" w:color="8892A0" w:sz="8" w:space="1"/>
+        </w:pBdr>
+        <w:spacing w:before="28" w:after="28"/>
+      </w:pPr>
+      <w:r>
+        <w:rPr>
+          <w:sz w:val="16"/>
+          <w:szCs w:val="16"/>
+          <w:rFonts w:ascii="Calibri" w:cs="Calibri" w:eastAsia="Calibri" w:hAnsi="Calibri"/>
+        </w:rPr>
+        <w:t xml:space="preserve"> </w:t>
+      </w:r>
+    </w:p>
+    <w:tbl>
+      <w:tblPr>
+        <w:tblW w:type="dxa" w:w="9792"/>
+        <w:tblBorders>
+          <w:top w:val="single" w:color="auto" w:sz="4"/>
+          <w:left w:val="single" w:color="auto" w:sz="4"/>
+          <w:bottom w:val="single" w:color="auto" w:sz="4"/>
+          <w:right w:val="single" w:color="auto" w:sz="4"/>
+          <w:insideH w:val="single" w:color="auto" w:sz="4"/>
+          <w:insideV w:val="single" w:color="auto" w:sz="4"/>
+        </w:tblBorders>
+      </w:tblPr>
+      <w:tblGrid>
         <w:gridCol w:w="4263"/>
         <w:gridCol w:w="5529"/>
       </w:tblGrid>
@@ -14128,61 +14309,19 @@
               <w:t xml:space="preserve"> </w:t>
             </w:r>
           </w:p>
-        </w:tc>
-      </w:tr>
-      <w:tr>
-        <w:tc>
-          <w:tcPr>
-            <w:tcW w:type="dxa" w:w="4263"/>
-            <w:tcBorders>
-              <w:top w:val="single" w:color="D9D5C8" w:sz="4"/>
-              <w:left w:val="single" w:color="D9D5C8" w:sz="4"/>
-              <w:bottom w:val="single" w:color="D9D5C8" w:sz="4"/>
-              <w:right w:val="single" w:color="D9D5C8" w:sz="4"/>
-            </w:tcBorders>
-            <w:tcMar>
-              <w:top w:type="dxa" w:w="55"/>
-              <w:left w:type="dxa" w:w="110"/>
-              <w:bottom w:type="dxa" w:w="55"/>
-              <w:right w:type="dxa" w:w="110"/>
-            </w:tcMar>
-          </w:tcPr>
-          <w:p>
-            <w:pPr>
-              <w:spacing w:after="0"/>
-            </w:pPr>
-            <w:r>
-              <w:rPr>
-                <w:b/>
-                <w:bCs/>
-                <w:i w:val="false"/>
-                <w:iCs w:val="false"/>
-                <w:color w:val="1A1A1A"/>
-                <w:sz w:val="20"/>
-                <w:szCs w:val="20"/>
-                <w:caps w:val="false"/>
-                <w:rFonts w:ascii="Calibri" w:cs="Calibri" w:eastAsia="Calibri" w:hAnsi="Calibri"/>
-              </w:rPr>
-              <w:t xml:space="preserve">I — Intended audience: who was meant to see or obey it?</w:t>
-            </w:r>
-          </w:p>
-        </w:tc>
-        <w:tc>
-          <w:tcPr>
-            <w:tcW w:type="dxa" w:w="5529"/>
-            <w:tcBorders>
-              <w:top w:val="single" w:color="D9D5C8" w:sz="4"/>
-              <w:left w:val="single" w:color="D9D5C8" w:sz="4"/>
-              <w:bottom w:val="single" w:color="D9D5C8" w:sz="4"/>
-              <w:right w:val="single" w:color="D9D5C8" w:sz="4"/>
-            </w:tcBorders>
-            <w:tcMar>
-              <w:top w:type="dxa" w:w="55"/>
-              <w:left w:type="dxa" w:w="110"/>
-              <w:bottom w:type="dxa" w:w="55"/>
-              <w:right w:type="dxa" w:w="110"/>
-            </w:tcMar>
-          </w:tcPr>
+          <w:p>
+            <w:pPr>
+              <w:spacing w:before="0" w:after="0" w:line="50" w:lineRule="exact"/>
+            </w:pPr>
+            <w:r>
+              <w:rPr>
+                <w:sz w:val="2"/>
+                <w:szCs w:val="2"/>
+                <w:rFonts w:ascii="Calibri" w:cs="Calibri" w:eastAsia="Calibri" w:hAnsi="Calibri"/>
+              </w:rPr>
+              <w:t xml:space="preserve"> </w:t>
+            </w:r>
+          </w:p>
           <w:p>
             <w:pPr>
               <w:widowControl w:val="false"/>
@@ -14265,7 +14404,7 @@
                 <w:caps w:val="false"/>
                 <w:rFonts w:ascii="Calibri" w:cs="Calibri" w:eastAsia="Calibri" w:hAnsi="Calibri"/>
               </w:rPr>
-              <w:t xml:space="preserve">P — Purpose: why was it created?</w:t>
+              <w:t xml:space="preserve">I — Intended audience: who was meant to see or obey it?</w:t>
             </w:r>
           </w:p>
         </w:tc>
@@ -14332,61 +14471,19 @@
               <w:t xml:space="preserve"> </w:t>
             </w:r>
           </w:p>
-        </w:tc>
-      </w:tr>
-      <w:tr>
-        <w:tc>
-          <w:tcPr>
-            <w:tcW w:type="dxa" w:w="4263"/>
-            <w:tcBorders>
-              <w:top w:val="single" w:color="D9D5C8" w:sz="4"/>
-              <w:left w:val="single" w:color="D9D5C8" w:sz="4"/>
-              <w:bottom w:val="single" w:color="D9D5C8" w:sz="4"/>
-              <w:right w:val="single" w:color="D9D5C8" w:sz="4"/>
-            </w:tcBorders>
-            <w:tcMar>
-              <w:top w:type="dxa" w:w="55"/>
-              <w:left w:type="dxa" w:w="110"/>
-              <w:bottom w:type="dxa" w:w="55"/>
-              <w:right w:type="dxa" w:w="110"/>
-            </w:tcMar>
-          </w:tcPr>
-          <w:p>
-            <w:pPr>
-              <w:spacing w:after="0"/>
-            </w:pPr>
-            <w:r>
-              <w:rPr>
-                <w:b/>
-                <w:bCs/>
-                <w:i w:val="false"/>
-                <w:iCs w:val="false"/>
-                <w:color w:val="1A1A1A"/>
-                <w:sz w:val="20"/>
-                <w:szCs w:val="20"/>
-                <w:caps w:val="false"/>
-                <w:rFonts w:ascii="Calibri" w:cs="Calibri" w:eastAsia="Calibri" w:hAnsi="Calibri"/>
-              </w:rPr>
-              <w:t xml:space="preserve">P — Point of view: whose perspective does it reflect?</w:t>
-            </w:r>
-          </w:p>
-        </w:tc>
-        <w:tc>
-          <w:tcPr>
-            <w:tcW w:type="dxa" w:w="5529"/>
-            <w:tcBorders>
-              <w:top w:val="single" w:color="D9D5C8" w:sz="4"/>
-              <w:left w:val="single" w:color="D9D5C8" w:sz="4"/>
-              <w:bottom w:val="single" w:color="D9D5C8" w:sz="4"/>
-              <w:right w:val="single" w:color="D9D5C8" w:sz="4"/>
-            </w:tcBorders>
-            <w:tcMar>
-              <w:top w:type="dxa" w:w="55"/>
-              <w:left w:type="dxa" w:w="110"/>
-              <w:bottom w:type="dxa" w:w="55"/>
-              <w:right w:type="dxa" w:w="110"/>
-            </w:tcMar>
-          </w:tcPr>
+          <w:p>
+            <w:pPr>
+              <w:spacing w:before="0" w:after="0" w:line="50" w:lineRule="exact"/>
+            </w:pPr>
+            <w:r>
+              <w:rPr>
+                <w:sz w:val="2"/>
+                <w:szCs w:val="2"/>
+                <w:rFonts w:ascii="Calibri" w:cs="Calibri" w:eastAsia="Calibri" w:hAnsi="Calibri"/>
+              </w:rPr>
+              <w:t xml:space="preserve"> </w:t>
+            </w:r>
+          </w:p>
           <w:p>
             <w:pPr>
               <w:widowControl w:val="false"/>
@@ -14469,7 +14566,7 @@
                 <w:caps w:val="false"/>
                 <w:rFonts w:ascii="Calibri" w:cs="Calibri" w:eastAsia="Calibri" w:hAnsi="Calibri"/>
               </w:rPr>
-              <w:t xml:space="preserve">O — Outside connection: how does it connect to this standard?</w:t>
+              <w:t xml:space="preserve">P — Purpose: why was it created?</w:t>
             </w:r>
           </w:p>
         </w:tc>
@@ -14534,6 +14631,486 @@
                 <w:rFonts w:ascii="Calibri" w:cs="Calibri" w:eastAsia="Calibri" w:hAnsi="Calibri"/>
               </w:rPr>
               <w:t xml:space="preserve"> </w:t>
+            </w:r>
+          </w:p>
+          <w:p>
+            <w:pPr>
+              <w:spacing w:before="0" w:after="0" w:line="50" w:lineRule="exact"/>
+            </w:pPr>
+            <w:r>
+              <w:rPr>
+                <w:sz w:val="2"/>
+                <w:szCs w:val="2"/>
+                <w:rFonts w:ascii="Calibri" w:cs="Calibri" w:eastAsia="Calibri" w:hAnsi="Calibri"/>
+              </w:rPr>
+              <w:t xml:space="preserve"> </w:t>
+            </w:r>
+          </w:p>
+          <w:p>
+            <w:pPr>
+              <w:widowControl w:val="false"/>
+              <w:pBdr>
+                <w:bottom w:val="single" w:color="8892A0" w:sz="8" w:space="1"/>
+              </w:pBdr>
+              <w:spacing w:before="28" w:after="28"/>
+            </w:pPr>
+            <w:r>
+              <w:rPr>
+                <w:sz w:val="16"/>
+                <w:szCs w:val="16"/>
+                <w:rFonts w:ascii="Calibri" w:cs="Calibri" w:eastAsia="Calibri" w:hAnsi="Calibri"/>
+              </w:rPr>
+              <w:t xml:space="preserve"> </w:t>
+            </w:r>
+          </w:p>
+          <w:p>
+            <w:pPr>
+              <w:spacing w:before="0" w:after="0" w:line="50" w:lineRule="exact"/>
+            </w:pPr>
+            <w:r>
+              <w:rPr>
+                <w:sz w:val="2"/>
+                <w:szCs w:val="2"/>
+                <w:rFonts w:ascii="Calibri" w:cs="Calibri" w:eastAsia="Calibri" w:hAnsi="Calibri"/>
+              </w:rPr>
+              <w:t xml:space="preserve"> </w:t>
+            </w:r>
+          </w:p>
+          <w:p>
+            <w:pPr>
+              <w:widowControl w:val="false"/>
+              <w:pBdr>
+                <w:bottom w:val="single" w:color="8892A0" w:sz="8" w:space="1"/>
+              </w:pBdr>
+              <w:spacing w:before="28" w:after="28"/>
+            </w:pPr>
+            <w:r>
+              <w:rPr>
+                <w:sz w:val="16"/>
+                <w:szCs w:val="16"/>
+                <w:rFonts w:ascii="Calibri" w:cs="Calibri" w:eastAsia="Calibri" w:hAnsi="Calibri"/>
+              </w:rPr>
+              <w:t xml:space="preserve"> </w:t>
+            </w:r>
+          </w:p>
+        </w:tc>
+      </w:tr>
+      <w:tr>
+        <w:tc>
+          <w:tcPr>
+            <w:tcW w:type="dxa" w:w="4263"/>
+            <w:tcBorders>
+              <w:top w:val="single" w:color="D9D5C8" w:sz="4"/>
+              <w:left w:val="single" w:color="D9D5C8" w:sz="4"/>
+              <w:bottom w:val="single" w:color="D9D5C8" w:sz="4"/>
+              <w:right w:val="single" w:color="D9D5C8" w:sz="4"/>
+            </w:tcBorders>
+            <w:tcMar>
+              <w:top w:type="dxa" w:w="55"/>
+              <w:left w:type="dxa" w:w="110"/>
+              <w:bottom w:type="dxa" w:w="55"/>
+              <w:right w:type="dxa" w:w="110"/>
+            </w:tcMar>
+          </w:tcPr>
+          <w:p>
+            <w:pPr>
+              <w:spacing w:after="0"/>
+            </w:pPr>
+            <w:r>
+              <w:rPr>
+                <w:b/>
+                <w:bCs/>
+                <w:i w:val="false"/>
+                <w:iCs w:val="false"/>
+                <w:color w:val="1A1A1A"/>
+                <w:sz w:val="20"/>
+                <w:szCs w:val="20"/>
+                <w:caps w:val="false"/>
+                <w:rFonts w:ascii="Calibri" w:cs="Calibri" w:eastAsia="Calibri" w:hAnsi="Calibri"/>
+              </w:rPr>
+              <w:t xml:space="preserve">P — Point of view: whose perspective does it reflect?</w:t>
+            </w:r>
+          </w:p>
+        </w:tc>
+        <w:tc>
+          <w:tcPr>
+            <w:tcW w:type="dxa" w:w="5529"/>
+            <w:tcBorders>
+              <w:top w:val="single" w:color="D9D5C8" w:sz="4"/>
+              <w:left w:val="single" w:color="D9D5C8" w:sz="4"/>
+              <w:bottom w:val="single" w:color="D9D5C8" w:sz="4"/>
+              <w:right w:val="single" w:color="D9D5C8" w:sz="4"/>
+            </w:tcBorders>
+            <w:tcMar>
+              <w:top w:type="dxa" w:w="55"/>
+              <w:left w:type="dxa" w:w="110"/>
+              <w:bottom w:type="dxa" w:w="55"/>
+              <w:right w:type="dxa" w:w="110"/>
+            </w:tcMar>
+          </w:tcPr>
+          <w:p>
+            <w:pPr>
+              <w:widowControl w:val="false"/>
+              <w:pBdr>
+                <w:bottom w:val="single" w:color="8892A0" w:sz="8" w:space="1"/>
+              </w:pBdr>
+              <w:spacing w:before="28" w:after="28"/>
+            </w:pPr>
+            <w:r>
+              <w:rPr>
+                <w:sz w:val="16"/>
+                <w:szCs w:val="16"/>
+                <w:rFonts w:ascii="Calibri" w:cs="Calibri" w:eastAsia="Calibri" w:hAnsi="Calibri"/>
+              </w:rPr>
+              <w:t xml:space="preserve"> </w:t>
+            </w:r>
+          </w:p>
+          <w:p>
+            <w:pPr>
+              <w:spacing w:before="0" w:after="0" w:line="50" w:lineRule="exact"/>
+            </w:pPr>
+            <w:r>
+              <w:rPr>
+                <w:sz w:val="2"/>
+                <w:szCs w:val="2"/>
+                <w:rFonts w:ascii="Calibri" w:cs="Calibri" w:eastAsia="Calibri" w:hAnsi="Calibri"/>
+              </w:rPr>
+              <w:t xml:space="preserve"> </w:t>
+            </w:r>
+          </w:p>
+          <w:p>
+            <w:pPr>
+              <w:widowControl w:val="false"/>
+              <w:pBdr>
+                <w:bottom w:val="single" w:color="8892A0" w:sz="8" w:space="1"/>
+              </w:pBdr>
+              <w:spacing w:before="28" w:after="28"/>
+            </w:pPr>
+            <w:r>
+              <w:rPr>
+                <w:sz w:val="16"/>
+                <w:szCs w:val="16"/>
+                <w:rFonts w:ascii="Calibri" w:cs="Calibri" w:eastAsia="Calibri" w:hAnsi="Calibri"/>
+              </w:rPr>
+              <w:t xml:space="preserve"> </w:t>
+            </w:r>
+          </w:p>
+          <w:p>
+            <w:pPr>
+              <w:spacing w:before="0" w:after="0" w:line="50" w:lineRule="exact"/>
+            </w:pPr>
+            <w:r>
+              <w:rPr>
+                <w:sz w:val="2"/>
+                <w:szCs w:val="2"/>
+                <w:rFonts w:ascii="Calibri" w:cs="Calibri" w:eastAsia="Calibri" w:hAnsi="Calibri"/>
+              </w:rPr>
+              <w:t xml:space="preserve"> </w:t>
+            </w:r>
+          </w:p>
+          <w:p>
+            <w:pPr>
+              <w:widowControl w:val="false"/>
+              <w:pBdr>
+                <w:bottom w:val="single" w:color="8892A0" w:sz="8" w:space="1"/>
+              </w:pBdr>
+              <w:spacing w:before="28" w:after="28"/>
+            </w:pPr>
+            <w:r>
+              <w:rPr>
+                <w:sz w:val="16"/>
+                <w:szCs w:val="16"/>
+                <w:rFonts w:ascii="Calibri" w:cs="Calibri" w:eastAsia="Calibri" w:hAnsi="Calibri"/>
+              </w:rPr>
+              <w:t xml:space="preserve"> </w:t>
+            </w:r>
+          </w:p>
+          <w:p>
+            <w:pPr>
+              <w:spacing w:before="0" w:after="0" w:line="50" w:lineRule="exact"/>
+            </w:pPr>
+            <w:r>
+              <w:rPr>
+                <w:sz w:val="2"/>
+                <w:szCs w:val="2"/>
+                <w:rFonts w:ascii="Calibri" w:cs="Calibri" w:eastAsia="Calibri" w:hAnsi="Calibri"/>
+              </w:rPr>
+              <w:t xml:space="preserve"> </w:t>
+            </w:r>
+          </w:p>
+          <w:p>
+            <w:pPr>
+              <w:widowControl w:val="false"/>
+              <w:pBdr>
+                <w:bottom w:val="single" w:color="8892A0" w:sz="8" w:space="1"/>
+              </w:pBdr>
+              <w:spacing w:before="28" w:after="28"/>
+            </w:pPr>
+            <w:r>
+              <w:rPr>
+                <w:sz w:val="16"/>
+                <w:szCs w:val="16"/>
+                <w:rFonts w:ascii="Calibri" w:cs="Calibri" w:eastAsia="Calibri" w:hAnsi="Calibri"/>
+              </w:rPr>
+              <w:t xml:space="preserve"> </w:t>
+            </w:r>
+          </w:p>
+        </w:tc>
+      </w:tr>
+      <w:tr>
+        <w:tc>
+          <w:tcPr>
+            <w:tcW w:type="dxa" w:w="4263"/>
+            <w:tcBorders>
+              <w:top w:val="single" w:color="D9D5C8" w:sz="4"/>
+              <w:left w:val="single" w:color="D9D5C8" w:sz="4"/>
+              <w:bottom w:val="single" w:color="D9D5C8" w:sz="4"/>
+              <w:right w:val="single" w:color="D9D5C8" w:sz="4"/>
+            </w:tcBorders>
+            <w:tcMar>
+              <w:top w:type="dxa" w:w="55"/>
+              <w:left w:type="dxa" w:w="110"/>
+              <w:bottom w:type="dxa" w:w="55"/>
+              <w:right w:type="dxa" w:w="110"/>
+            </w:tcMar>
+          </w:tcPr>
+          <w:p>
+            <w:pPr>
+              <w:spacing w:after="0"/>
+            </w:pPr>
+            <w:r>
+              <w:rPr>
+                <w:b/>
+                <w:bCs/>
+                <w:i w:val="false"/>
+                <w:iCs w:val="false"/>
+                <w:color w:val="1A1A1A"/>
+                <w:sz w:val="20"/>
+                <w:szCs w:val="20"/>
+                <w:caps w:val="false"/>
+                <w:rFonts w:ascii="Calibri" w:cs="Calibri" w:eastAsia="Calibri" w:hAnsi="Calibri"/>
+              </w:rPr>
+              <w:t xml:space="preserve">O — Outside connection: how does it connect to this standard?</w:t>
+            </w:r>
+          </w:p>
+        </w:tc>
+        <w:tc>
+          <w:tcPr>
+            <w:tcW w:type="dxa" w:w="5529"/>
+            <w:tcBorders>
+              <w:top w:val="single" w:color="D9D5C8" w:sz="4"/>
+              <w:left w:val="single" w:color="D9D5C8" w:sz="4"/>
+              <w:bottom w:val="single" w:color="D9D5C8" w:sz="4"/>
+              <w:right w:val="single" w:color="D9D5C8" w:sz="4"/>
+            </w:tcBorders>
+            <w:tcMar>
+              <w:top w:type="dxa" w:w="55"/>
+              <w:left w:type="dxa" w:w="110"/>
+              <w:bottom w:type="dxa" w:w="55"/>
+              <w:right w:type="dxa" w:w="110"/>
+            </w:tcMar>
+          </w:tcPr>
+          <w:p>
+            <w:pPr>
+              <w:widowControl w:val="false"/>
+              <w:pBdr>
+                <w:bottom w:val="single" w:color="8892A0" w:sz="8" w:space="1"/>
+              </w:pBdr>
+              <w:spacing w:before="28" w:after="28"/>
+            </w:pPr>
+            <w:r>
+              <w:rPr>
+                <w:sz w:val="16"/>
+                <w:szCs w:val="16"/>
+                <w:rFonts w:ascii="Calibri" w:cs="Calibri" w:eastAsia="Calibri" w:hAnsi="Calibri"/>
+              </w:rPr>
+              <w:t xml:space="preserve"> </w:t>
+            </w:r>
+          </w:p>
+          <w:p>
+            <w:pPr>
+              <w:spacing w:before="0" w:after="0" w:line="50" w:lineRule="exact"/>
+            </w:pPr>
+            <w:r>
+              <w:rPr>
+                <w:sz w:val="2"/>
+                <w:szCs w:val="2"/>
+                <w:rFonts w:ascii="Calibri" w:cs="Calibri" w:eastAsia="Calibri" w:hAnsi="Calibri"/>
+              </w:rPr>
+              <w:t xml:space="preserve"> </w:t>
+            </w:r>
+          </w:p>
+          <w:p>
+            <w:pPr>
+              <w:widowControl w:val="false"/>
+              <w:pBdr>
+                <w:bottom w:val="single" w:color="8892A0" w:sz="8" w:space="1"/>
+              </w:pBdr>
+              <w:spacing w:before="28" w:after="28"/>
+            </w:pPr>
+            <w:r>
+              <w:rPr>
+                <w:sz w:val="16"/>
+                <w:szCs w:val="16"/>
+                <w:rFonts w:ascii="Calibri" w:cs="Calibri" w:eastAsia="Calibri" w:hAnsi="Calibri"/>
+              </w:rPr>
+              <w:t xml:space="preserve"> </w:t>
+            </w:r>
+          </w:p>
+          <w:p>
+            <w:pPr>
+              <w:spacing w:before="0" w:after="0" w:line="50" w:lineRule="exact"/>
+            </w:pPr>
+            <w:r>
+              <w:rPr>
+                <w:sz w:val="2"/>
+                <w:szCs w:val="2"/>
+                <w:rFonts w:ascii="Calibri" w:cs="Calibri" w:eastAsia="Calibri" w:hAnsi="Calibri"/>
+              </w:rPr>
+              <w:t xml:space="preserve"> </w:t>
+            </w:r>
+          </w:p>
+          <w:p>
+            <w:pPr>
+              <w:widowControl w:val="false"/>
+              <w:pBdr>
+                <w:bottom w:val="single" w:color="8892A0" w:sz="8" w:space="1"/>
+              </w:pBdr>
+              <w:spacing w:before="28" w:after="28"/>
+            </w:pPr>
+            <w:r>
+              <w:rPr>
+                <w:sz w:val="16"/>
+                <w:szCs w:val="16"/>
+                <w:rFonts w:ascii="Calibri" w:cs="Calibri" w:eastAsia="Calibri" w:hAnsi="Calibri"/>
+              </w:rPr>
+              <w:t xml:space="preserve"> </w:t>
+            </w:r>
+          </w:p>
+          <w:p>
+            <w:pPr>
+              <w:spacing w:before="0" w:after="0" w:line="50" w:lineRule="exact"/>
+            </w:pPr>
+            <w:r>
+              <w:rPr>
+                <w:sz w:val="2"/>
+                <w:szCs w:val="2"/>
+                <w:rFonts w:ascii="Calibri" w:cs="Calibri" w:eastAsia="Calibri" w:hAnsi="Calibri"/>
+              </w:rPr>
+              <w:t xml:space="preserve"> </w:t>
+            </w:r>
+          </w:p>
+          <w:p>
+            <w:pPr>
+              <w:widowControl w:val="false"/>
+              <w:pBdr>
+                <w:bottom w:val="single" w:color="8892A0" w:sz="8" w:space="1"/>
+              </w:pBdr>
+              <w:spacing w:before="28" w:after="28"/>
+            </w:pPr>
+            <w:r>
+              <w:rPr>
+                <w:sz w:val="16"/>
+                <w:szCs w:val="16"/>
+                <w:rFonts w:ascii="Calibri" w:cs="Calibri" w:eastAsia="Calibri" w:hAnsi="Calibri"/>
+              </w:rPr>
+              <w:t xml:space="preserve"> </w:t>
+            </w:r>
+          </w:p>
+        </w:tc>
+      </w:tr>
+    </w:tbl>
+    <w:p>
+      <w:pPr>
+        <w:pStyle w:val="Heading2"/>
+        <w:keepNext/>
+        <w:pageBreakBefore/>
+        <w:spacing w:before="150" w:after="90"/>
+      </w:pPr>
+      <w:r>
+        <w:rPr>
+          <w:b/>
+          <w:bCs/>
+          <w:i w:val="false"/>
+          <w:iCs w:val="false"/>
+          <w:color w:val="1B2A4A"/>
+          <w:sz w:val="28"/>
+          <w:szCs w:val="28"/>
+          <w:caps w:val="false"/>
+          <w:rFonts w:ascii="Calibri" w:cs="Calibri" w:eastAsia="Calibri" w:hAnsi="Calibri"/>
+        </w:rPr>
+        <w:t xml:space="preserve">Primary Source Analysis — go deeper — GC.16</w:t>
+      </w:r>
+    </w:p>
+    <w:tbl>
+      <w:tblPr>
+        <w:tblW w:type="dxa" w:w="9792"/>
+        <w:tblBorders>
+          <w:top w:val="single" w:color="auto" w:sz="4"/>
+          <w:left w:val="single" w:color="auto" w:sz="4"/>
+          <w:bottom w:val="single" w:color="auto" w:sz="4"/>
+          <w:right w:val="single" w:color="auto" w:sz="4"/>
+          <w:insideH w:val="single" w:color="auto" w:sz="4"/>
+          <w:insideV w:val="single" w:color="auto" w:sz="4"/>
+        </w:tblBorders>
+      </w:tblPr>
+      <w:tblGrid>
+        <w:gridCol w:w="9792"/>
+      </w:tblGrid>
+      <w:tr>
+        <w:tc>
+          <w:tcPr>
+            <w:tcW w:type="dxa" w:w="9792"/>
+            <w:tcBorders>
+              <w:top w:val="single" w:color="D9D5C8" w:sz="4"/>
+              <w:left w:val="single" w:color="D9D5C8" w:sz="4"/>
+              <w:bottom w:val="single" w:color="D9D5C8" w:sz="4"/>
+              <w:right w:val="single" w:color="D9D5C8" w:sz="4"/>
+            </w:tcBorders>
+            <w:shd w:fill="F7F5EF" w:color="auto" w:val="clear"/>
+            <w:tcMar>
+              <w:top w:type="dxa" w:w="55"/>
+              <w:left w:type="dxa" w:w="110"/>
+              <w:bottom w:type="dxa" w:w="55"/>
+              <w:right w:type="dxa" w:w="110"/>
+            </w:tcMar>
+          </w:tcPr>
+          <w:p>
+            <w:pPr>
+              <w:spacing w:after="60"/>
+            </w:pPr>
+            <w:r>
+              <w:rPr>
+                <w:b/>
+                <w:bCs/>
+                <w:i w:val="false"/>
+                <w:iCs w:val="false"/>
+                <w:color w:val="1B2A4A"/>
+                <w:sz w:val="21"/>
+                <w:szCs w:val="21"/>
+                <w:caps w:val="false"/>
+                <w:rFonts w:ascii="Calibri" w:cs="Calibri" w:eastAsia="Calibri" w:hAnsi="Calibri"/>
+              </w:rPr>
+              <w:t xml:space="preserve">SUPPORT OPTION (use if you need it)</w:t>
+            </w:r>
+          </w:p>
+          <w:p>
+            <w:pPr>
+              <w:spacing w:after="40"/>
+            </w:pPr>
+            <w:r>
+              <w:rPr>
+                <w:b w:val="false"/>
+                <w:bCs w:val="false"/>
+                <w:i w:val="false"/>
+                <w:iCs w:val="false"/>
+                <w:color w:val="1A1A1A"/>
+                <w:sz w:val="22"/>
+                <w:szCs w:val="22"/>
+                <w:caps w:val="false"/>
+                <w:rFonts w:ascii="Calibri" w:cs="Calibri" w:eastAsia="Calibri" w:hAnsi="Calibri"/>
+              </w:rPr>
+              <w:t xml:space="preserve">Sentence frame: This source shows ______ because it ______, which reveals ______.</w:t>
             </w:r>
           </w:p>
         </w:tc>
@@ -14588,7 +15165,7 @@
                 <w:caps w:val="false"/>
                 <w:rFonts w:ascii="Calibri" w:cs="Calibri" w:eastAsia="Calibri" w:hAnsi="Calibri"/>
               </w:rPr>
-              <w:t xml:space="preserve">SUPPORT OPTION</w:t>
+              <w:t xml:space="preserve">SOURCE SYNTHESIS — put it together (SSP.03)</w:t>
             </w:r>
           </w:p>
           <w:p>
@@ -14607,12 +15184,149 @@
                 <w:caps w:val="false"/>
                 <w:rFonts w:ascii="Calibri" w:cs="Calibri" w:eastAsia="Calibri" w:hAnsi="Calibri"/>
               </w:rPr>
-              <w:t xml:space="preserve">Sentence frame: This source shows ______ because it ______, which reveals ______.</w:t>
+              <w:t xml:space="preserve">In 2–3 sentences: what does this source reveal about this standard, and how do you know? Cite one specific detail from it.</w:t>
             </w:r>
           </w:p>
         </w:tc>
       </w:tr>
     </w:tbl>
+    <w:p>
+      <w:pPr>
+        <w:widowControl w:val="false"/>
+        <w:pBdr>
+          <w:bottom w:val="single" w:color="8892A0" w:sz="8" w:space="1"/>
+        </w:pBdr>
+        <w:spacing w:before="28" w:after="28"/>
+      </w:pPr>
+      <w:r>
+        <w:rPr>
+          <w:sz w:val="16"/>
+          <w:szCs w:val="16"/>
+          <w:rFonts w:ascii="Calibri" w:cs="Calibri" w:eastAsia="Calibri" w:hAnsi="Calibri"/>
+        </w:rPr>
+        <w:t xml:space="preserve"> </w:t>
+      </w:r>
+    </w:p>
+    <w:p>
+      <w:pPr>
+        <w:spacing w:before="0" w:after="0" w:line="50" w:lineRule="exact"/>
+      </w:pPr>
+      <w:r>
+        <w:rPr>
+          <w:sz w:val="2"/>
+          <w:szCs w:val="2"/>
+          <w:rFonts w:ascii="Calibri" w:cs="Calibri" w:eastAsia="Calibri" w:hAnsi="Calibri"/>
+        </w:rPr>
+        <w:t xml:space="preserve"> </w:t>
+      </w:r>
+    </w:p>
+    <w:p>
+      <w:pPr>
+        <w:widowControl w:val="false"/>
+        <w:pBdr>
+          <w:bottom w:val="single" w:color="8892A0" w:sz="8" w:space="1"/>
+        </w:pBdr>
+        <w:spacing w:before="28" w:after="28"/>
+      </w:pPr>
+      <w:r>
+        <w:rPr>
+          <w:sz w:val="16"/>
+          <w:szCs w:val="16"/>
+          <w:rFonts w:ascii="Calibri" w:cs="Calibri" w:eastAsia="Calibri" w:hAnsi="Calibri"/>
+        </w:rPr>
+        <w:t xml:space="preserve"> </w:t>
+      </w:r>
+    </w:p>
+    <w:p>
+      <w:pPr>
+        <w:spacing w:before="0" w:after="0" w:line="50" w:lineRule="exact"/>
+      </w:pPr>
+      <w:r>
+        <w:rPr>
+          <w:sz w:val="2"/>
+          <w:szCs w:val="2"/>
+          <w:rFonts w:ascii="Calibri" w:cs="Calibri" w:eastAsia="Calibri" w:hAnsi="Calibri"/>
+        </w:rPr>
+        <w:t xml:space="preserve"> </w:t>
+      </w:r>
+    </w:p>
+    <w:p>
+      <w:pPr>
+        <w:widowControl w:val="false"/>
+        <w:pBdr>
+          <w:bottom w:val="single" w:color="8892A0" w:sz="8" w:space="1"/>
+        </w:pBdr>
+        <w:spacing w:before="28" w:after="28"/>
+      </w:pPr>
+      <w:r>
+        <w:rPr>
+          <w:sz w:val="16"/>
+          <w:szCs w:val="16"/>
+          <w:rFonts w:ascii="Calibri" w:cs="Calibri" w:eastAsia="Calibri" w:hAnsi="Calibri"/>
+        </w:rPr>
+        <w:t xml:space="preserve"> </w:t>
+      </w:r>
+    </w:p>
+    <w:p>
+      <w:pPr>
+        <w:spacing w:before="0" w:after="0" w:line="50" w:lineRule="exact"/>
+      </w:pPr>
+      <w:r>
+        <w:rPr>
+          <w:sz w:val="2"/>
+          <w:szCs w:val="2"/>
+          <w:rFonts w:ascii="Calibri" w:cs="Calibri" w:eastAsia="Calibri" w:hAnsi="Calibri"/>
+        </w:rPr>
+        <w:t xml:space="preserve"> </w:t>
+      </w:r>
+    </w:p>
+    <w:p>
+      <w:pPr>
+        <w:widowControl w:val="false"/>
+        <w:pBdr>
+          <w:bottom w:val="single" w:color="8892A0" w:sz="8" w:space="1"/>
+        </w:pBdr>
+        <w:spacing w:before="28" w:after="28"/>
+      </w:pPr>
+      <w:r>
+        <w:rPr>
+          <w:sz w:val="16"/>
+          <w:szCs w:val="16"/>
+          <w:rFonts w:ascii="Calibri" w:cs="Calibri" w:eastAsia="Calibri" w:hAnsi="Calibri"/>
+        </w:rPr>
+        <w:t xml:space="preserve"> </w:t>
+      </w:r>
+    </w:p>
+    <w:p>
+      <w:pPr>
+        <w:spacing w:before="0" w:after="0" w:line="50" w:lineRule="exact"/>
+      </w:pPr>
+      <w:r>
+        <w:rPr>
+          <w:sz w:val="2"/>
+          <w:szCs w:val="2"/>
+          <w:rFonts w:ascii="Calibri" w:cs="Calibri" w:eastAsia="Calibri" w:hAnsi="Calibri"/>
+        </w:rPr>
+        <w:t xml:space="preserve"> </w:t>
+      </w:r>
+    </w:p>
+    <w:p>
+      <w:pPr>
+        <w:widowControl w:val="false"/>
+        <w:pBdr>
+          <w:bottom w:val="single" w:color="8892A0" w:sz="8" w:space="1"/>
+        </w:pBdr>
+        <w:spacing w:before="28" w:after="28"/>
+      </w:pPr>
+      <w:r>
+        <w:rPr>
+          <w:sz w:val="16"/>
+          <w:szCs w:val="16"/>
+          <w:rFonts w:ascii="Calibri" w:cs="Calibri" w:eastAsia="Calibri" w:hAnsi="Calibri"/>
+        </w:rPr>
+        <w:t xml:space="preserve"> </w:t>
+      </w:r>
+    </w:p>
     <w:tbl>
       <w:tblPr>
         <w:tblW w:type="dxa" w:w="9792"/>
@@ -14662,7 +15376,7 @@
                 <w:caps w:val="false"/>
                 <w:rFonts w:ascii="Calibri" w:cs="Calibri" w:eastAsia="Calibri" w:hAnsi="Calibri"/>
               </w:rPr>
-              <w:t xml:space="preserve">SOURCE SYNTHESIS — put it together (SSP.03)</w:t>
+              <w:t xml:space="preserve">THINK LIKE A HISTORIAN — corroborate or challenge (SSP.03)</w:t>
             </w:r>
           </w:p>
           <w:p>
@@ -14681,12 +15395,283 @@
                 <w:caps w:val="false"/>
                 <w:rFonts w:ascii="Calibri" w:cs="Calibri" w:eastAsia="Calibri" w:hAnsi="Calibri"/>
               </w:rPr>
-              <w:t xml:space="preserve">In 2–3 sentences: what does this source reveal about this standard, and how do you know? Cite one specific detail from it.</w:t>
+              <w:t xml:space="preserve">Name ONE other source that could CONFIRM this one, and ONE way it could COMPLICATE or CHALLENGE it — or, whose voice is missing here?</w:t>
             </w:r>
           </w:p>
         </w:tc>
       </w:tr>
     </w:tbl>
+    <w:p>
+      <w:pPr>
+        <w:widowControl w:val="false"/>
+        <w:pBdr>
+          <w:bottom w:val="single" w:color="8892A0" w:sz="8" w:space="1"/>
+        </w:pBdr>
+        <w:spacing w:before="28" w:after="28"/>
+      </w:pPr>
+      <w:r>
+        <w:rPr>
+          <w:sz w:val="16"/>
+          <w:szCs w:val="16"/>
+          <w:rFonts w:ascii="Calibri" w:cs="Calibri" w:eastAsia="Calibri" w:hAnsi="Calibri"/>
+        </w:rPr>
+        <w:t xml:space="preserve"> </w:t>
+      </w:r>
+    </w:p>
+    <w:p>
+      <w:pPr>
+        <w:spacing w:before="0" w:after="0" w:line="50" w:lineRule="exact"/>
+      </w:pPr>
+      <w:r>
+        <w:rPr>
+          <w:sz w:val="2"/>
+          <w:szCs w:val="2"/>
+          <w:rFonts w:ascii="Calibri" w:cs="Calibri" w:eastAsia="Calibri" w:hAnsi="Calibri"/>
+        </w:rPr>
+        <w:t xml:space="preserve"> </w:t>
+      </w:r>
+    </w:p>
+    <w:p>
+      <w:pPr>
+        <w:widowControl w:val="false"/>
+        <w:pBdr>
+          <w:bottom w:val="single" w:color="8892A0" w:sz="8" w:space="1"/>
+        </w:pBdr>
+        <w:spacing w:before="28" w:after="28"/>
+      </w:pPr>
+      <w:r>
+        <w:rPr>
+          <w:sz w:val="16"/>
+          <w:szCs w:val="16"/>
+          <w:rFonts w:ascii="Calibri" w:cs="Calibri" w:eastAsia="Calibri" w:hAnsi="Calibri"/>
+        </w:rPr>
+        <w:t xml:space="preserve"> </w:t>
+      </w:r>
+    </w:p>
+    <w:p>
+      <w:pPr>
+        <w:spacing w:before="0" w:after="0" w:line="50" w:lineRule="exact"/>
+      </w:pPr>
+      <w:r>
+        <w:rPr>
+          <w:sz w:val="2"/>
+          <w:szCs w:val="2"/>
+          <w:rFonts w:ascii="Calibri" w:cs="Calibri" w:eastAsia="Calibri" w:hAnsi="Calibri"/>
+        </w:rPr>
+        <w:t xml:space="preserve"> </w:t>
+      </w:r>
+    </w:p>
+    <w:p>
+      <w:pPr>
+        <w:widowControl w:val="false"/>
+        <w:pBdr>
+          <w:bottom w:val="single" w:color="8892A0" w:sz="8" w:space="1"/>
+        </w:pBdr>
+        <w:spacing w:before="28" w:after="28"/>
+      </w:pPr>
+      <w:r>
+        <w:rPr>
+          <w:sz w:val="16"/>
+          <w:szCs w:val="16"/>
+          <w:rFonts w:ascii="Calibri" w:cs="Calibri" w:eastAsia="Calibri" w:hAnsi="Calibri"/>
+        </w:rPr>
+        <w:t xml:space="preserve"> </w:t>
+      </w:r>
+    </w:p>
+    <w:p>
+      <w:pPr>
+        <w:spacing w:before="0" w:after="0" w:line="50" w:lineRule="exact"/>
+      </w:pPr>
+      <w:r>
+        <w:rPr>
+          <w:sz w:val="2"/>
+          <w:szCs w:val="2"/>
+          <w:rFonts w:ascii="Calibri" w:cs="Calibri" w:eastAsia="Calibri" w:hAnsi="Calibri"/>
+        </w:rPr>
+        <w:t xml:space="preserve"> </w:t>
+      </w:r>
+    </w:p>
+    <w:p>
+      <w:pPr>
+        <w:widowControl w:val="false"/>
+        <w:pBdr>
+          <w:bottom w:val="single" w:color="8892A0" w:sz="8" w:space="1"/>
+        </w:pBdr>
+        <w:spacing w:before="28" w:after="28"/>
+      </w:pPr>
+      <w:r>
+        <w:rPr>
+          <w:sz w:val="16"/>
+          <w:szCs w:val="16"/>
+          <w:rFonts w:ascii="Calibri" w:cs="Calibri" w:eastAsia="Calibri" w:hAnsi="Calibri"/>
+        </w:rPr>
+        <w:t xml:space="preserve"> </w:t>
+      </w:r>
+    </w:p>
+    <w:p>
+      <w:pPr>
+        <w:spacing w:before="0" w:after="0" w:line="50" w:lineRule="exact"/>
+      </w:pPr>
+      <w:r>
+        <w:rPr>
+          <w:sz w:val="2"/>
+          <w:szCs w:val="2"/>
+          <w:rFonts w:ascii="Calibri" w:cs="Calibri" w:eastAsia="Calibri" w:hAnsi="Calibri"/>
+        </w:rPr>
+        <w:t xml:space="preserve"> </w:t>
+      </w:r>
+    </w:p>
+    <w:p>
+      <w:pPr>
+        <w:widowControl w:val="false"/>
+        <w:pBdr>
+          <w:bottom w:val="single" w:color="8892A0" w:sz="8" w:space="1"/>
+        </w:pBdr>
+        <w:spacing w:before="28" w:after="28"/>
+      </w:pPr>
+      <w:r>
+        <w:rPr>
+          <w:sz w:val="16"/>
+          <w:szCs w:val="16"/>
+          <w:rFonts w:ascii="Calibri" w:cs="Calibri" w:eastAsia="Calibri" w:hAnsi="Calibri"/>
+        </w:rPr>
+        <w:t xml:space="preserve"> </w:t>
+      </w:r>
+    </w:p>
+    <w:tbl>
+      <w:tblPr>
+        <w:tblW w:type="dxa" w:w="9792"/>
+        <w:tblBorders>
+          <w:top w:val="single" w:color="auto" w:sz="4"/>
+          <w:left w:val="single" w:color="auto" w:sz="4"/>
+          <w:bottom w:val="single" w:color="auto" w:sz="4"/>
+          <w:right w:val="single" w:color="auto" w:sz="4"/>
+          <w:insideH w:val="single" w:color="auto" w:sz="4"/>
+          <w:insideV w:val="single" w:color="auto" w:sz="4"/>
+        </w:tblBorders>
+      </w:tblPr>
+      <w:tblGrid>
+        <w:gridCol w:w="9792"/>
+      </w:tblGrid>
+      <w:tr>
+        <w:tc>
+          <w:tcPr>
+            <w:tcW w:type="dxa" w:w="9792"/>
+            <w:tcBorders>
+              <w:top w:val="single" w:color="D9D5C8" w:sz="4"/>
+              <w:left w:val="single" w:color="D9D5C8" w:sz="4"/>
+              <w:bottom w:val="single" w:color="D9D5C8" w:sz="4"/>
+              <w:right w:val="single" w:color="D9D5C8" w:sz="4"/>
+            </w:tcBorders>
+            <w:shd w:fill="F7F5EF" w:color="auto" w:val="clear"/>
+            <w:tcMar>
+              <w:top w:type="dxa" w:w="55"/>
+              <w:left w:type="dxa" w:w="110"/>
+              <w:bottom w:type="dxa" w:w="55"/>
+              <w:right w:type="dxa" w:w="110"/>
+            </w:tcMar>
+          </w:tcPr>
+          <w:p>
+            <w:pPr>
+              <w:spacing w:after="60"/>
+            </w:pPr>
+            <w:r>
+              <w:rPr>
+                <w:b/>
+                <w:bCs/>
+                <w:i w:val="false"/>
+                <w:iCs w:val="false"/>
+                <w:color w:val="1B2A4A"/>
+                <w:sz w:val="21"/>
+                <w:szCs w:val="21"/>
+                <w:caps w:val="false"/>
+                <w:rFonts w:ascii="Calibri" w:cs="Calibri" w:eastAsia="Calibri" w:hAnsi="Calibri"/>
+              </w:rPr>
+              <w:t xml:space="preserve">SO WHAT? — why this source still matters today</w:t>
+            </w:r>
+          </w:p>
+          <w:p>
+            <w:pPr>
+              <w:spacing w:after="40"/>
+            </w:pPr>
+            <w:r>
+              <w:rPr>
+                <w:b w:val="false"/>
+                <w:bCs w:val="false"/>
+                <w:i w:val="false"/>
+                <w:iCs w:val="false"/>
+                <w:color w:val="1A1A1A"/>
+                <w:sz w:val="22"/>
+                <w:szCs w:val="22"/>
+                <w:caps w:val="false"/>
+                <w:rFonts w:ascii="Calibri" w:cs="Calibri" w:eastAsia="Calibri" w:hAnsi="Calibri"/>
+              </w:rPr>
+              <w:t xml:space="preserve">In 1–2 sentences: why does this source still matter for understanding government today?</w:t>
+            </w:r>
+          </w:p>
+        </w:tc>
+      </w:tr>
+    </w:tbl>
+    <w:p>
+      <w:pPr>
+        <w:widowControl w:val="false"/>
+        <w:pBdr>
+          <w:bottom w:val="single" w:color="8892A0" w:sz="8" w:space="1"/>
+        </w:pBdr>
+        <w:spacing w:before="28" w:after="28"/>
+      </w:pPr>
+      <w:r>
+        <w:rPr>
+          <w:sz w:val="16"/>
+          <w:szCs w:val="16"/>
+          <w:rFonts w:ascii="Calibri" w:cs="Calibri" w:eastAsia="Calibri" w:hAnsi="Calibri"/>
+        </w:rPr>
+        <w:t xml:space="preserve"> </w:t>
+      </w:r>
+    </w:p>
+    <w:p>
+      <w:pPr>
+        <w:spacing w:before="0" w:after="0" w:line="50" w:lineRule="exact"/>
+      </w:pPr>
+      <w:r>
+        <w:rPr>
+          <w:sz w:val="2"/>
+          <w:szCs w:val="2"/>
+          <w:rFonts w:ascii="Calibri" w:cs="Calibri" w:eastAsia="Calibri" w:hAnsi="Calibri"/>
+        </w:rPr>
+        <w:t xml:space="preserve"> </w:t>
+      </w:r>
+    </w:p>
+    <w:p>
+      <w:pPr>
+        <w:widowControl w:val="false"/>
+        <w:pBdr>
+          <w:bottom w:val="single" w:color="8892A0" w:sz="8" w:space="1"/>
+        </w:pBdr>
+        <w:spacing w:before="28" w:after="28"/>
+      </w:pPr>
+      <w:r>
+        <w:rPr>
+          <w:sz w:val="16"/>
+          <w:szCs w:val="16"/>
+          <w:rFonts w:ascii="Calibri" w:cs="Calibri" w:eastAsia="Calibri" w:hAnsi="Calibri"/>
+        </w:rPr>
+        <w:t xml:space="preserve"> </w:t>
+      </w:r>
+    </w:p>
+    <w:p>
+      <w:pPr>
+        <w:spacing w:before="0" w:after="0" w:line="50" w:lineRule="exact"/>
+      </w:pPr>
+      <w:r>
+        <w:rPr>
+          <w:sz w:val="2"/>
+          <w:szCs w:val="2"/>
+          <w:rFonts w:ascii="Calibri" w:cs="Calibri" w:eastAsia="Calibri" w:hAnsi="Calibri"/>
+        </w:rPr>
+        <w:t xml:space="preserve"> </w:t>
+      </w:r>
+    </w:p>
     <w:p>
       <w:pPr>
         <w:widowControl w:val="false"/>
@@ -22452,7 +23437,7 @@
       </w:tblGrid>
       <w:tr>
         <w:trPr>
-          <w:trHeight w:val="1450" w:hRule="atLeast"/>
+          <w:trHeight w:val="2050" w:hRule="atLeast"/>
         </w:trPr>
         <w:tc>
           <w:tcPr>
@@ -27154,6 +28139,187 @@
         </w:tblBorders>
       </w:tblPr>
       <w:tblGrid>
+        <w:gridCol w:w="9792"/>
+      </w:tblGrid>
+      <w:tr>
+        <w:tc>
+          <w:tcPr>
+            <w:tcW w:type="dxa" w:w="9792"/>
+            <w:tcBorders>
+              <w:top w:val="single" w:color="D9D5C8" w:sz="4"/>
+              <w:left w:val="single" w:color="D9D5C8" w:sz="4"/>
+              <w:bottom w:val="single" w:color="D9D5C8" w:sz="4"/>
+              <w:right w:val="single" w:color="D9D5C8" w:sz="4"/>
+            </w:tcBorders>
+            <w:shd w:fill="F7F5EF" w:color="auto" w:val="clear"/>
+            <w:tcMar>
+              <w:top w:type="dxa" w:w="55"/>
+              <w:left w:type="dxa" w:w="110"/>
+              <w:bottom w:type="dxa" w:w="55"/>
+              <w:right w:type="dxa" w:w="110"/>
+            </w:tcMar>
+          </w:tcPr>
+          <w:p>
+            <w:pPr>
+              <w:spacing w:after="60"/>
+            </w:pPr>
+            <w:r>
+              <w:rPr>
+                <w:b/>
+                <w:bCs/>
+                <w:i w:val="false"/>
+                <w:iCs w:val="false"/>
+                <w:color w:val="1B2A4A"/>
+                <w:sz w:val="21"/>
+                <w:szCs w:val="21"/>
+                <w:caps w:val="false"/>
+                <w:rFonts w:ascii="Calibri" w:cs="Calibri" w:eastAsia="Calibri" w:hAnsi="Calibri"/>
+              </w:rPr>
+              <w:t xml:space="preserve">FIRST LOOK — before you analyze</w:t>
+            </w:r>
+          </w:p>
+          <w:p>
+            <w:pPr>
+              <w:spacing w:after="40"/>
+            </w:pPr>
+            <w:r>
+              <w:rPr>
+                <w:b w:val="false"/>
+                <w:bCs w:val="false"/>
+                <w:i w:val="false"/>
+                <w:iCs w:val="false"/>
+                <w:color w:val="1A1A1A"/>
+                <w:sz w:val="22"/>
+                <w:szCs w:val="22"/>
+                <w:caps w:val="false"/>
+                <w:rFonts w:ascii="Calibri" w:cs="Calibri" w:eastAsia="Calibri" w:hAnsi="Calibri"/>
+              </w:rPr>
+              <w:t xml:space="preserve">Jot 3–4 things you notice in the source (details, words, people, dates). No wrong answers.</w:t>
+            </w:r>
+          </w:p>
+        </w:tc>
+      </w:tr>
+    </w:tbl>
+    <w:p>
+      <w:pPr>
+        <w:widowControl w:val="false"/>
+        <w:pBdr>
+          <w:bottom w:val="single" w:color="8892A0" w:sz="8" w:space="1"/>
+        </w:pBdr>
+        <w:spacing w:before="28" w:after="28"/>
+      </w:pPr>
+      <w:r>
+        <w:rPr>
+          <w:sz w:val="16"/>
+          <w:szCs w:val="16"/>
+          <w:rFonts w:ascii="Calibri" w:cs="Calibri" w:eastAsia="Calibri" w:hAnsi="Calibri"/>
+        </w:rPr>
+        <w:t xml:space="preserve"> </w:t>
+      </w:r>
+    </w:p>
+    <w:p>
+      <w:pPr>
+        <w:spacing w:before="0" w:after="0" w:line="50" w:lineRule="exact"/>
+      </w:pPr>
+      <w:r>
+        <w:rPr>
+          <w:sz w:val="2"/>
+          <w:szCs w:val="2"/>
+          <w:rFonts w:ascii="Calibri" w:cs="Calibri" w:eastAsia="Calibri" w:hAnsi="Calibri"/>
+        </w:rPr>
+        <w:t xml:space="preserve"> </w:t>
+      </w:r>
+    </w:p>
+    <w:p>
+      <w:pPr>
+        <w:widowControl w:val="false"/>
+        <w:pBdr>
+          <w:bottom w:val="single" w:color="8892A0" w:sz="8" w:space="1"/>
+        </w:pBdr>
+        <w:spacing w:before="28" w:after="28"/>
+      </w:pPr>
+      <w:r>
+        <w:rPr>
+          <w:sz w:val="16"/>
+          <w:szCs w:val="16"/>
+          <w:rFonts w:ascii="Calibri" w:cs="Calibri" w:eastAsia="Calibri" w:hAnsi="Calibri"/>
+        </w:rPr>
+        <w:t xml:space="preserve"> </w:t>
+      </w:r>
+    </w:p>
+    <w:p>
+      <w:pPr>
+        <w:spacing w:before="0" w:after="0" w:line="50" w:lineRule="exact"/>
+      </w:pPr>
+      <w:r>
+        <w:rPr>
+          <w:sz w:val="2"/>
+          <w:szCs w:val="2"/>
+          <w:rFonts w:ascii="Calibri" w:cs="Calibri" w:eastAsia="Calibri" w:hAnsi="Calibri"/>
+        </w:rPr>
+        <w:t xml:space="preserve"> </w:t>
+      </w:r>
+    </w:p>
+    <w:p>
+      <w:pPr>
+        <w:widowControl w:val="false"/>
+        <w:pBdr>
+          <w:bottom w:val="single" w:color="8892A0" w:sz="8" w:space="1"/>
+        </w:pBdr>
+        <w:spacing w:before="28" w:after="28"/>
+      </w:pPr>
+      <w:r>
+        <w:rPr>
+          <w:sz w:val="16"/>
+          <w:szCs w:val="16"/>
+          <w:rFonts w:ascii="Calibri" w:cs="Calibri" w:eastAsia="Calibri" w:hAnsi="Calibri"/>
+        </w:rPr>
+        <w:t xml:space="preserve"> </w:t>
+      </w:r>
+    </w:p>
+    <w:p>
+      <w:pPr>
+        <w:spacing w:before="0" w:after="0" w:line="50" w:lineRule="exact"/>
+      </w:pPr>
+      <w:r>
+        <w:rPr>
+          <w:sz w:val="2"/>
+          <w:szCs w:val="2"/>
+          <w:rFonts w:ascii="Calibri" w:cs="Calibri" w:eastAsia="Calibri" w:hAnsi="Calibri"/>
+        </w:rPr>
+        <w:t xml:space="preserve"> </w:t>
+      </w:r>
+    </w:p>
+    <w:p>
+      <w:pPr>
+        <w:widowControl w:val="false"/>
+        <w:pBdr>
+          <w:bottom w:val="single" w:color="8892A0" w:sz="8" w:space="1"/>
+        </w:pBdr>
+        <w:spacing w:before="28" w:after="28"/>
+      </w:pPr>
+      <w:r>
+        <w:rPr>
+          <w:sz w:val="16"/>
+          <w:szCs w:val="16"/>
+          <w:rFonts w:ascii="Calibri" w:cs="Calibri" w:eastAsia="Calibri" w:hAnsi="Calibri"/>
+        </w:rPr>
+        <w:t xml:space="preserve"> </w:t>
+      </w:r>
+    </w:p>
+    <w:tbl>
+      <w:tblPr>
+        <w:tblW w:type="dxa" w:w="9792"/>
+        <w:tblBorders>
+          <w:top w:val="single" w:color="auto" w:sz="4"/>
+          <w:left w:val="single" w:color="auto" w:sz="4"/>
+          <w:bottom w:val="single" w:color="auto" w:sz="4"/>
+          <w:right w:val="single" w:color="auto" w:sz="4"/>
+          <w:insideH w:val="single" w:color="auto" w:sz="4"/>
+          <w:insideV w:val="single" w:color="auto" w:sz="4"/>
+        </w:tblBorders>
+      </w:tblPr>
+      <w:tblGrid>
         <w:gridCol w:w="4263"/>
         <w:gridCol w:w="5529"/>
       </w:tblGrid>
@@ -27336,61 +28502,19 @@
               <w:t xml:space="preserve"> </w:t>
             </w:r>
           </w:p>
-        </w:tc>
-      </w:tr>
-      <w:tr>
-        <w:tc>
-          <w:tcPr>
-            <w:tcW w:type="dxa" w:w="4263"/>
-            <w:tcBorders>
-              <w:top w:val="single" w:color="D9D5C8" w:sz="4"/>
-              <w:left w:val="single" w:color="D9D5C8" w:sz="4"/>
-              <w:bottom w:val="single" w:color="D9D5C8" w:sz="4"/>
-              <w:right w:val="single" w:color="D9D5C8" w:sz="4"/>
-            </w:tcBorders>
-            <w:tcMar>
-              <w:top w:type="dxa" w:w="55"/>
-              <w:left w:type="dxa" w:w="110"/>
-              <w:bottom w:type="dxa" w:w="55"/>
-              <w:right w:type="dxa" w:w="110"/>
-            </w:tcMar>
-          </w:tcPr>
-          <w:p>
-            <w:pPr>
-              <w:spacing w:after="0"/>
-            </w:pPr>
-            <w:r>
-              <w:rPr>
-                <w:b/>
-                <w:bCs/>
-                <w:i w:val="false"/>
-                <w:iCs w:val="false"/>
-                <w:color w:val="1A1A1A"/>
-                <w:sz w:val="20"/>
-                <w:szCs w:val="20"/>
-                <w:caps w:val="false"/>
-                <w:rFonts w:ascii="Calibri" w:cs="Calibri" w:eastAsia="Calibri" w:hAnsi="Calibri"/>
-              </w:rPr>
-              <w:t xml:space="preserve">I — Intended audience: who was meant to see or obey it?</w:t>
-            </w:r>
-          </w:p>
-        </w:tc>
-        <w:tc>
-          <w:tcPr>
-            <w:tcW w:type="dxa" w:w="5529"/>
-            <w:tcBorders>
-              <w:top w:val="single" w:color="D9D5C8" w:sz="4"/>
-              <w:left w:val="single" w:color="D9D5C8" w:sz="4"/>
-              <w:bottom w:val="single" w:color="D9D5C8" w:sz="4"/>
-              <w:right w:val="single" w:color="D9D5C8" w:sz="4"/>
-            </w:tcBorders>
-            <w:tcMar>
-              <w:top w:type="dxa" w:w="55"/>
-              <w:left w:type="dxa" w:w="110"/>
-              <w:bottom w:type="dxa" w:w="55"/>
-              <w:right w:type="dxa" w:w="110"/>
-            </w:tcMar>
-          </w:tcPr>
+          <w:p>
+            <w:pPr>
+              <w:spacing w:before="0" w:after="0" w:line="50" w:lineRule="exact"/>
+            </w:pPr>
+            <w:r>
+              <w:rPr>
+                <w:sz w:val="2"/>
+                <w:szCs w:val="2"/>
+                <w:rFonts w:ascii="Calibri" w:cs="Calibri" w:eastAsia="Calibri" w:hAnsi="Calibri"/>
+              </w:rPr>
+              <w:t xml:space="preserve"> </w:t>
+            </w:r>
+          </w:p>
           <w:p>
             <w:pPr>
               <w:widowControl w:val="false"/>
@@ -27473,7 +28597,7 @@
                 <w:caps w:val="false"/>
                 <w:rFonts w:ascii="Calibri" w:cs="Calibri" w:eastAsia="Calibri" w:hAnsi="Calibri"/>
               </w:rPr>
-              <w:t xml:space="preserve">P — Purpose: why was it created?</w:t>
+              <w:t xml:space="preserve">I — Intended audience: who was meant to see or obey it?</w:t>
             </w:r>
           </w:p>
         </w:tc>
@@ -27540,61 +28664,19 @@
               <w:t xml:space="preserve"> </w:t>
             </w:r>
           </w:p>
-        </w:tc>
-      </w:tr>
-      <w:tr>
-        <w:tc>
-          <w:tcPr>
-            <w:tcW w:type="dxa" w:w="4263"/>
-            <w:tcBorders>
-              <w:top w:val="single" w:color="D9D5C8" w:sz="4"/>
-              <w:left w:val="single" w:color="D9D5C8" w:sz="4"/>
-              <w:bottom w:val="single" w:color="D9D5C8" w:sz="4"/>
-              <w:right w:val="single" w:color="D9D5C8" w:sz="4"/>
-            </w:tcBorders>
-            <w:tcMar>
-              <w:top w:type="dxa" w:w="55"/>
-              <w:left w:type="dxa" w:w="110"/>
-              <w:bottom w:type="dxa" w:w="55"/>
-              <w:right w:type="dxa" w:w="110"/>
-            </w:tcMar>
-          </w:tcPr>
-          <w:p>
-            <w:pPr>
-              <w:spacing w:after="0"/>
-            </w:pPr>
-            <w:r>
-              <w:rPr>
-                <w:b/>
-                <w:bCs/>
-                <w:i w:val="false"/>
-                <w:iCs w:val="false"/>
-                <w:color w:val="1A1A1A"/>
-                <w:sz w:val="20"/>
-                <w:szCs w:val="20"/>
-                <w:caps w:val="false"/>
-                <w:rFonts w:ascii="Calibri" w:cs="Calibri" w:eastAsia="Calibri" w:hAnsi="Calibri"/>
-              </w:rPr>
-              <w:t xml:space="preserve">P — Point of view: whose perspective does it reflect?</w:t>
-            </w:r>
-          </w:p>
-        </w:tc>
-        <w:tc>
-          <w:tcPr>
-            <w:tcW w:type="dxa" w:w="5529"/>
-            <w:tcBorders>
-              <w:top w:val="single" w:color="D9D5C8" w:sz="4"/>
-              <w:left w:val="single" w:color="D9D5C8" w:sz="4"/>
-              <w:bottom w:val="single" w:color="D9D5C8" w:sz="4"/>
-              <w:right w:val="single" w:color="D9D5C8" w:sz="4"/>
-            </w:tcBorders>
-            <w:tcMar>
-              <w:top w:type="dxa" w:w="55"/>
-              <w:left w:type="dxa" w:w="110"/>
-              <w:bottom w:type="dxa" w:w="55"/>
-              <w:right w:type="dxa" w:w="110"/>
-            </w:tcMar>
-          </w:tcPr>
+          <w:p>
+            <w:pPr>
+              <w:spacing w:before="0" w:after="0" w:line="50" w:lineRule="exact"/>
+            </w:pPr>
+            <w:r>
+              <w:rPr>
+                <w:sz w:val="2"/>
+                <w:szCs w:val="2"/>
+                <w:rFonts w:ascii="Calibri" w:cs="Calibri" w:eastAsia="Calibri" w:hAnsi="Calibri"/>
+              </w:rPr>
+              <w:t xml:space="preserve"> </w:t>
+            </w:r>
+          </w:p>
           <w:p>
             <w:pPr>
               <w:widowControl w:val="false"/>
@@ -27677,7 +28759,7 @@
                 <w:caps w:val="false"/>
                 <w:rFonts w:ascii="Calibri" w:cs="Calibri" w:eastAsia="Calibri" w:hAnsi="Calibri"/>
               </w:rPr>
-              <w:t xml:space="preserve">O — Outside connection: how does it connect to this standard?</w:t>
+              <w:t xml:space="preserve">P — Purpose: why was it created?</w:t>
             </w:r>
           </w:p>
         </w:tc>
@@ -27742,6 +28824,486 @@
                 <w:rFonts w:ascii="Calibri" w:cs="Calibri" w:eastAsia="Calibri" w:hAnsi="Calibri"/>
               </w:rPr>
               <w:t xml:space="preserve"> </w:t>
+            </w:r>
+          </w:p>
+          <w:p>
+            <w:pPr>
+              <w:spacing w:before="0" w:after="0" w:line="50" w:lineRule="exact"/>
+            </w:pPr>
+            <w:r>
+              <w:rPr>
+                <w:sz w:val="2"/>
+                <w:szCs w:val="2"/>
+                <w:rFonts w:ascii="Calibri" w:cs="Calibri" w:eastAsia="Calibri" w:hAnsi="Calibri"/>
+              </w:rPr>
+              <w:t xml:space="preserve"> </w:t>
+            </w:r>
+          </w:p>
+          <w:p>
+            <w:pPr>
+              <w:widowControl w:val="false"/>
+              <w:pBdr>
+                <w:bottom w:val="single" w:color="8892A0" w:sz="8" w:space="1"/>
+              </w:pBdr>
+              <w:spacing w:before="28" w:after="28"/>
+            </w:pPr>
+            <w:r>
+              <w:rPr>
+                <w:sz w:val="16"/>
+                <w:szCs w:val="16"/>
+                <w:rFonts w:ascii="Calibri" w:cs="Calibri" w:eastAsia="Calibri" w:hAnsi="Calibri"/>
+              </w:rPr>
+              <w:t xml:space="preserve"> </w:t>
+            </w:r>
+          </w:p>
+          <w:p>
+            <w:pPr>
+              <w:spacing w:before="0" w:after="0" w:line="50" w:lineRule="exact"/>
+            </w:pPr>
+            <w:r>
+              <w:rPr>
+                <w:sz w:val="2"/>
+                <w:szCs w:val="2"/>
+                <w:rFonts w:ascii="Calibri" w:cs="Calibri" w:eastAsia="Calibri" w:hAnsi="Calibri"/>
+              </w:rPr>
+              <w:t xml:space="preserve"> </w:t>
+            </w:r>
+          </w:p>
+          <w:p>
+            <w:pPr>
+              <w:widowControl w:val="false"/>
+              <w:pBdr>
+                <w:bottom w:val="single" w:color="8892A0" w:sz="8" w:space="1"/>
+              </w:pBdr>
+              <w:spacing w:before="28" w:after="28"/>
+            </w:pPr>
+            <w:r>
+              <w:rPr>
+                <w:sz w:val="16"/>
+                <w:szCs w:val="16"/>
+                <w:rFonts w:ascii="Calibri" w:cs="Calibri" w:eastAsia="Calibri" w:hAnsi="Calibri"/>
+              </w:rPr>
+              <w:t xml:space="preserve"> </w:t>
+            </w:r>
+          </w:p>
+        </w:tc>
+      </w:tr>
+      <w:tr>
+        <w:tc>
+          <w:tcPr>
+            <w:tcW w:type="dxa" w:w="4263"/>
+            <w:tcBorders>
+              <w:top w:val="single" w:color="D9D5C8" w:sz="4"/>
+              <w:left w:val="single" w:color="D9D5C8" w:sz="4"/>
+              <w:bottom w:val="single" w:color="D9D5C8" w:sz="4"/>
+              <w:right w:val="single" w:color="D9D5C8" w:sz="4"/>
+            </w:tcBorders>
+            <w:tcMar>
+              <w:top w:type="dxa" w:w="55"/>
+              <w:left w:type="dxa" w:w="110"/>
+              <w:bottom w:type="dxa" w:w="55"/>
+              <w:right w:type="dxa" w:w="110"/>
+            </w:tcMar>
+          </w:tcPr>
+          <w:p>
+            <w:pPr>
+              <w:spacing w:after="0"/>
+            </w:pPr>
+            <w:r>
+              <w:rPr>
+                <w:b/>
+                <w:bCs/>
+                <w:i w:val="false"/>
+                <w:iCs w:val="false"/>
+                <w:color w:val="1A1A1A"/>
+                <w:sz w:val="20"/>
+                <w:szCs w:val="20"/>
+                <w:caps w:val="false"/>
+                <w:rFonts w:ascii="Calibri" w:cs="Calibri" w:eastAsia="Calibri" w:hAnsi="Calibri"/>
+              </w:rPr>
+              <w:t xml:space="preserve">P — Point of view: whose perspective does it reflect?</w:t>
+            </w:r>
+          </w:p>
+        </w:tc>
+        <w:tc>
+          <w:tcPr>
+            <w:tcW w:type="dxa" w:w="5529"/>
+            <w:tcBorders>
+              <w:top w:val="single" w:color="D9D5C8" w:sz="4"/>
+              <w:left w:val="single" w:color="D9D5C8" w:sz="4"/>
+              <w:bottom w:val="single" w:color="D9D5C8" w:sz="4"/>
+              <w:right w:val="single" w:color="D9D5C8" w:sz="4"/>
+            </w:tcBorders>
+            <w:tcMar>
+              <w:top w:type="dxa" w:w="55"/>
+              <w:left w:type="dxa" w:w="110"/>
+              <w:bottom w:type="dxa" w:w="55"/>
+              <w:right w:type="dxa" w:w="110"/>
+            </w:tcMar>
+          </w:tcPr>
+          <w:p>
+            <w:pPr>
+              <w:widowControl w:val="false"/>
+              <w:pBdr>
+                <w:bottom w:val="single" w:color="8892A0" w:sz="8" w:space="1"/>
+              </w:pBdr>
+              <w:spacing w:before="28" w:after="28"/>
+            </w:pPr>
+            <w:r>
+              <w:rPr>
+                <w:sz w:val="16"/>
+                <w:szCs w:val="16"/>
+                <w:rFonts w:ascii="Calibri" w:cs="Calibri" w:eastAsia="Calibri" w:hAnsi="Calibri"/>
+              </w:rPr>
+              <w:t xml:space="preserve"> </w:t>
+            </w:r>
+          </w:p>
+          <w:p>
+            <w:pPr>
+              <w:spacing w:before="0" w:after="0" w:line="50" w:lineRule="exact"/>
+            </w:pPr>
+            <w:r>
+              <w:rPr>
+                <w:sz w:val="2"/>
+                <w:szCs w:val="2"/>
+                <w:rFonts w:ascii="Calibri" w:cs="Calibri" w:eastAsia="Calibri" w:hAnsi="Calibri"/>
+              </w:rPr>
+              <w:t xml:space="preserve"> </w:t>
+            </w:r>
+          </w:p>
+          <w:p>
+            <w:pPr>
+              <w:widowControl w:val="false"/>
+              <w:pBdr>
+                <w:bottom w:val="single" w:color="8892A0" w:sz="8" w:space="1"/>
+              </w:pBdr>
+              <w:spacing w:before="28" w:after="28"/>
+            </w:pPr>
+            <w:r>
+              <w:rPr>
+                <w:sz w:val="16"/>
+                <w:szCs w:val="16"/>
+                <w:rFonts w:ascii="Calibri" w:cs="Calibri" w:eastAsia="Calibri" w:hAnsi="Calibri"/>
+              </w:rPr>
+              <w:t xml:space="preserve"> </w:t>
+            </w:r>
+          </w:p>
+          <w:p>
+            <w:pPr>
+              <w:spacing w:before="0" w:after="0" w:line="50" w:lineRule="exact"/>
+            </w:pPr>
+            <w:r>
+              <w:rPr>
+                <w:sz w:val="2"/>
+                <w:szCs w:val="2"/>
+                <w:rFonts w:ascii="Calibri" w:cs="Calibri" w:eastAsia="Calibri" w:hAnsi="Calibri"/>
+              </w:rPr>
+              <w:t xml:space="preserve"> </w:t>
+            </w:r>
+          </w:p>
+          <w:p>
+            <w:pPr>
+              <w:widowControl w:val="false"/>
+              <w:pBdr>
+                <w:bottom w:val="single" w:color="8892A0" w:sz="8" w:space="1"/>
+              </w:pBdr>
+              <w:spacing w:before="28" w:after="28"/>
+            </w:pPr>
+            <w:r>
+              <w:rPr>
+                <w:sz w:val="16"/>
+                <w:szCs w:val="16"/>
+                <w:rFonts w:ascii="Calibri" w:cs="Calibri" w:eastAsia="Calibri" w:hAnsi="Calibri"/>
+              </w:rPr>
+              <w:t xml:space="preserve"> </w:t>
+            </w:r>
+          </w:p>
+          <w:p>
+            <w:pPr>
+              <w:spacing w:before="0" w:after="0" w:line="50" w:lineRule="exact"/>
+            </w:pPr>
+            <w:r>
+              <w:rPr>
+                <w:sz w:val="2"/>
+                <w:szCs w:val="2"/>
+                <w:rFonts w:ascii="Calibri" w:cs="Calibri" w:eastAsia="Calibri" w:hAnsi="Calibri"/>
+              </w:rPr>
+              <w:t xml:space="preserve"> </w:t>
+            </w:r>
+          </w:p>
+          <w:p>
+            <w:pPr>
+              <w:widowControl w:val="false"/>
+              <w:pBdr>
+                <w:bottom w:val="single" w:color="8892A0" w:sz="8" w:space="1"/>
+              </w:pBdr>
+              <w:spacing w:before="28" w:after="28"/>
+            </w:pPr>
+            <w:r>
+              <w:rPr>
+                <w:sz w:val="16"/>
+                <w:szCs w:val="16"/>
+                <w:rFonts w:ascii="Calibri" w:cs="Calibri" w:eastAsia="Calibri" w:hAnsi="Calibri"/>
+              </w:rPr>
+              <w:t xml:space="preserve"> </w:t>
+            </w:r>
+          </w:p>
+        </w:tc>
+      </w:tr>
+      <w:tr>
+        <w:tc>
+          <w:tcPr>
+            <w:tcW w:type="dxa" w:w="4263"/>
+            <w:tcBorders>
+              <w:top w:val="single" w:color="D9D5C8" w:sz="4"/>
+              <w:left w:val="single" w:color="D9D5C8" w:sz="4"/>
+              <w:bottom w:val="single" w:color="D9D5C8" w:sz="4"/>
+              <w:right w:val="single" w:color="D9D5C8" w:sz="4"/>
+            </w:tcBorders>
+            <w:tcMar>
+              <w:top w:type="dxa" w:w="55"/>
+              <w:left w:type="dxa" w:w="110"/>
+              <w:bottom w:type="dxa" w:w="55"/>
+              <w:right w:type="dxa" w:w="110"/>
+            </w:tcMar>
+          </w:tcPr>
+          <w:p>
+            <w:pPr>
+              <w:spacing w:after="0"/>
+            </w:pPr>
+            <w:r>
+              <w:rPr>
+                <w:b/>
+                <w:bCs/>
+                <w:i w:val="false"/>
+                <w:iCs w:val="false"/>
+                <w:color w:val="1A1A1A"/>
+                <w:sz w:val="20"/>
+                <w:szCs w:val="20"/>
+                <w:caps w:val="false"/>
+                <w:rFonts w:ascii="Calibri" w:cs="Calibri" w:eastAsia="Calibri" w:hAnsi="Calibri"/>
+              </w:rPr>
+              <w:t xml:space="preserve">O — Outside connection: how does it connect to this standard?</w:t>
+            </w:r>
+          </w:p>
+        </w:tc>
+        <w:tc>
+          <w:tcPr>
+            <w:tcW w:type="dxa" w:w="5529"/>
+            <w:tcBorders>
+              <w:top w:val="single" w:color="D9D5C8" w:sz="4"/>
+              <w:left w:val="single" w:color="D9D5C8" w:sz="4"/>
+              <w:bottom w:val="single" w:color="D9D5C8" w:sz="4"/>
+              <w:right w:val="single" w:color="D9D5C8" w:sz="4"/>
+            </w:tcBorders>
+            <w:tcMar>
+              <w:top w:type="dxa" w:w="55"/>
+              <w:left w:type="dxa" w:w="110"/>
+              <w:bottom w:type="dxa" w:w="55"/>
+              <w:right w:type="dxa" w:w="110"/>
+            </w:tcMar>
+          </w:tcPr>
+          <w:p>
+            <w:pPr>
+              <w:widowControl w:val="false"/>
+              <w:pBdr>
+                <w:bottom w:val="single" w:color="8892A0" w:sz="8" w:space="1"/>
+              </w:pBdr>
+              <w:spacing w:before="28" w:after="28"/>
+            </w:pPr>
+            <w:r>
+              <w:rPr>
+                <w:sz w:val="16"/>
+                <w:szCs w:val="16"/>
+                <w:rFonts w:ascii="Calibri" w:cs="Calibri" w:eastAsia="Calibri" w:hAnsi="Calibri"/>
+              </w:rPr>
+              <w:t xml:space="preserve"> </w:t>
+            </w:r>
+          </w:p>
+          <w:p>
+            <w:pPr>
+              <w:spacing w:before="0" w:after="0" w:line="50" w:lineRule="exact"/>
+            </w:pPr>
+            <w:r>
+              <w:rPr>
+                <w:sz w:val="2"/>
+                <w:szCs w:val="2"/>
+                <w:rFonts w:ascii="Calibri" w:cs="Calibri" w:eastAsia="Calibri" w:hAnsi="Calibri"/>
+              </w:rPr>
+              <w:t xml:space="preserve"> </w:t>
+            </w:r>
+          </w:p>
+          <w:p>
+            <w:pPr>
+              <w:widowControl w:val="false"/>
+              <w:pBdr>
+                <w:bottom w:val="single" w:color="8892A0" w:sz="8" w:space="1"/>
+              </w:pBdr>
+              <w:spacing w:before="28" w:after="28"/>
+            </w:pPr>
+            <w:r>
+              <w:rPr>
+                <w:sz w:val="16"/>
+                <w:szCs w:val="16"/>
+                <w:rFonts w:ascii="Calibri" w:cs="Calibri" w:eastAsia="Calibri" w:hAnsi="Calibri"/>
+              </w:rPr>
+              <w:t xml:space="preserve"> </w:t>
+            </w:r>
+          </w:p>
+          <w:p>
+            <w:pPr>
+              <w:spacing w:before="0" w:after="0" w:line="50" w:lineRule="exact"/>
+            </w:pPr>
+            <w:r>
+              <w:rPr>
+                <w:sz w:val="2"/>
+                <w:szCs w:val="2"/>
+                <w:rFonts w:ascii="Calibri" w:cs="Calibri" w:eastAsia="Calibri" w:hAnsi="Calibri"/>
+              </w:rPr>
+              <w:t xml:space="preserve"> </w:t>
+            </w:r>
+          </w:p>
+          <w:p>
+            <w:pPr>
+              <w:widowControl w:val="false"/>
+              <w:pBdr>
+                <w:bottom w:val="single" w:color="8892A0" w:sz="8" w:space="1"/>
+              </w:pBdr>
+              <w:spacing w:before="28" w:after="28"/>
+            </w:pPr>
+            <w:r>
+              <w:rPr>
+                <w:sz w:val="16"/>
+                <w:szCs w:val="16"/>
+                <w:rFonts w:ascii="Calibri" w:cs="Calibri" w:eastAsia="Calibri" w:hAnsi="Calibri"/>
+              </w:rPr>
+              <w:t xml:space="preserve"> </w:t>
+            </w:r>
+          </w:p>
+          <w:p>
+            <w:pPr>
+              <w:spacing w:before="0" w:after="0" w:line="50" w:lineRule="exact"/>
+            </w:pPr>
+            <w:r>
+              <w:rPr>
+                <w:sz w:val="2"/>
+                <w:szCs w:val="2"/>
+                <w:rFonts w:ascii="Calibri" w:cs="Calibri" w:eastAsia="Calibri" w:hAnsi="Calibri"/>
+              </w:rPr>
+              <w:t xml:space="preserve"> </w:t>
+            </w:r>
+          </w:p>
+          <w:p>
+            <w:pPr>
+              <w:widowControl w:val="false"/>
+              <w:pBdr>
+                <w:bottom w:val="single" w:color="8892A0" w:sz="8" w:space="1"/>
+              </w:pBdr>
+              <w:spacing w:before="28" w:after="28"/>
+            </w:pPr>
+            <w:r>
+              <w:rPr>
+                <w:sz w:val="16"/>
+                <w:szCs w:val="16"/>
+                <w:rFonts w:ascii="Calibri" w:cs="Calibri" w:eastAsia="Calibri" w:hAnsi="Calibri"/>
+              </w:rPr>
+              <w:t xml:space="preserve"> </w:t>
+            </w:r>
+          </w:p>
+        </w:tc>
+      </w:tr>
+    </w:tbl>
+    <w:p>
+      <w:pPr>
+        <w:pStyle w:val="Heading2"/>
+        <w:keepNext/>
+        <w:pageBreakBefore/>
+        <w:spacing w:before="150" w:after="90"/>
+      </w:pPr>
+      <w:r>
+        <w:rPr>
+          <w:b/>
+          <w:bCs/>
+          <w:i w:val="false"/>
+          <w:iCs w:val="false"/>
+          <w:color w:val="1B2A4A"/>
+          <w:sz w:val="28"/>
+          <w:szCs w:val="28"/>
+          <w:caps w:val="false"/>
+          <w:rFonts w:ascii="Calibri" w:cs="Calibri" w:eastAsia="Calibri" w:hAnsi="Calibri"/>
+        </w:rPr>
+        <w:t xml:space="preserve">Primary Source Analysis — go deeper — GC.17</w:t>
+      </w:r>
+    </w:p>
+    <w:tbl>
+      <w:tblPr>
+        <w:tblW w:type="dxa" w:w="9792"/>
+        <w:tblBorders>
+          <w:top w:val="single" w:color="auto" w:sz="4"/>
+          <w:left w:val="single" w:color="auto" w:sz="4"/>
+          <w:bottom w:val="single" w:color="auto" w:sz="4"/>
+          <w:right w:val="single" w:color="auto" w:sz="4"/>
+          <w:insideH w:val="single" w:color="auto" w:sz="4"/>
+          <w:insideV w:val="single" w:color="auto" w:sz="4"/>
+        </w:tblBorders>
+      </w:tblPr>
+      <w:tblGrid>
+        <w:gridCol w:w="9792"/>
+      </w:tblGrid>
+      <w:tr>
+        <w:tc>
+          <w:tcPr>
+            <w:tcW w:type="dxa" w:w="9792"/>
+            <w:tcBorders>
+              <w:top w:val="single" w:color="D9D5C8" w:sz="4"/>
+              <w:left w:val="single" w:color="D9D5C8" w:sz="4"/>
+              <w:bottom w:val="single" w:color="D9D5C8" w:sz="4"/>
+              <w:right w:val="single" w:color="D9D5C8" w:sz="4"/>
+            </w:tcBorders>
+            <w:shd w:fill="F7F5EF" w:color="auto" w:val="clear"/>
+            <w:tcMar>
+              <w:top w:type="dxa" w:w="55"/>
+              <w:left w:type="dxa" w:w="110"/>
+              <w:bottom w:type="dxa" w:w="55"/>
+              <w:right w:type="dxa" w:w="110"/>
+            </w:tcMar>
+          </w:tcPr>
+          <w:p>
+            <w:pPr>
+              <w:spacing w:after="60"/>
+            </w:pPr>
+            <w:r>
+              <w:rPr>
+                <w:b/>
+                <w:bCs/>
+                <w:i w:val="false"/>
+                <w:iCs w:val="false"/>
+                <w:color w:val="1B2A4A"/>
+                <w:sz w:val="21"/>
+                <w:szCs w:val="21"/>
+                <w:caps w:val="false"/>
+                <w:rFonts w:ascii="Calibri" w:cs="Calibri" w:eastAsia="Calibri" w:hAnsi="Calibri"/>
+              </w:rPr>
+              <w:t xml:space="preserve">SUPPORT OPTION (use if you need it)</w:t>
+            </w:r>
+          </w:p>
+          <w:p>
+            <w:pPr>
+              <w:spacing w:after="40"/>
+            </w:pPr>
+            <w:r>
+              <w:rPr>
+                <w:b w:val="false"/>
+                <w:bCs w:val="false"/>
+                <w:i w:val="false"/>
+                <w:iCs w:val="false"/>
+                <w:color w:val="1A1A1A"/>
+                <w:sz w:val="22"/>
+                <w:szCs w:val="22"/>
+                <w:caps w:val="false"/>
+                <w:rFonts w:ascii="Calibri" w:cs="Calibri" w:eastAsia="Calibri" w:hAnsi="Calibri"/>
+              </w:rPr>
+              <w:t xml:space="preserve">Sentence frame: This source shows ______ because it ______, which reveals ______.</w:t>
             </w:r>
           </w:p>
         </w:tc>
@@ -27796,7 +29358,7 @@
                 <w:caps w:val="false"/>
                 <w:rFonts w:ascii="Calibri" w:cs="Calibri" w:eastAsia="Calibri" w:hAnsi="Calibri"/>
               </w:rPr>
-              <w:t xml:space="preserve">SUPPORT OPTION</w:t>
+              <w:t xml:space="preserve">SOURCE SYNTHESIS — put it together (SSP.03)</w:t>
             </w:r>
           </w:p>
           <w:p>
@@ -27815,12 +29377,149 @@
                 <w:caps w:val="false"/>
                 <w:rFonts w:ascii="Calibri" w:cs="Calibri" w:eastAsia="Calibri" w:hAnsi="Calibri"/>
               </w:rPr>
-              <w:t xml:space="preserve">Sentence frame: This source shows ______ because it ______, which reveals ______.</w:t>
+              <w:t xml:space="preserve">In 2–3 sentences: what does this source reveal about this standard, and how do you know? Cite one specific detail from it.</w:t>
             </w:r>
           </w:p>
         </w:tc>
       </w:tr>
     </w:tbl>
+    <w:p>
+      <w:pPr>
+        <w:widowControl w:val="false"/>
+        <w:pBdr>
+          <w:bottom w:val="single" w:color="8892A0" w:sz="8" w:space="1"/>
+        </w:pBdr>
+        <w:spacing w:before="28" w:after="28"/>
+      </w:pPr>
+      <w:r>
+        <w:rPr>
+          <w:sz w:val="16"/>
+          <w:szCs w:val="16"/>
+          <w:rFonts w:ascii="Calibri" w:cs="Calibri" w:eastAsia="Calibri" w:hAnsi="Calibri"/>
+        </w:rPr>
+        <w:t xml:space="preserve"> </w:t>
+      </w:r>
+    </w:p>
+    <w:p>
+      <w:pPr>
+        <w:spacing w:before="0" w:after="0" w:line="50" w:lineRule="exact"/>
+      </w:pPr>
+      <w:r>
+        <w:rPr>
+          <w:sz w:val="2"/>
+          <w:szCs w:val="2"/>
+          <w:rFonts w:ascii="Calibri" w:cs="Calibri" w:eastAsia="Calibri" w:hAnsi="Calibri"/>
+        </w:rPr>
+        <w:t xml:space="preserve"> </w:t>
+      </w:r>
+    </w:p>
+    <w:p>
+      <w:pPr>
+        <w:widowControl w:val="false"/>
+        <w:pBdr>
+          <w:bottom w:val="single" w:color="8892A0" w:sz="8" w:space="1"/>
+        </w:pBdr>
+        <w:spacing w:before="28" w:after="28"/>
+      </w:pPr>
+      <w:r>
+        <w:rPr>
+          <w:sz w:val="16"/>
+          <w:szCs w:val="16"/>
+          <w:rFonts w:ascii="Calibri" w:cs="Calibri" w:eastAsia="Calibri" w:hAnsi="Calibri"/>
+        </w:rPr>
+        <w:t xml:space="preserve"> </w:t>
+      </w:r>
+    </w:p>
+    <w:p>
+      <w:pPr>
+        <w:spacing w:before="0" w:after="0" w:line="50" w:lineRule="exact"/>
+      </w:pPr>
+      <w:r>
+        <w:rPr>
+          <w:sz w:val="2"/>
+          <w:szCs w:val="2"/>
+          <w:rFonts w:ascii="Calibri" w:cs="Calibri" w:eastAsia="Calibri" w:hAnsi="Calibri"/>
+        </w:rPr>
+        <w:t xml:space="preserve"> </w:t>
+      </w:r>
+    </w:p>
+    <w:p>
+      <w:pPr>
+        <w:widowControl w:val="false"/>
+        <w:pBdr>
+          <w:bottom w:val="single" w:color="8892A0" w:sz="8" w:space="1"/>
+        </w:pBdr>
+        <w:spacing w:before="28" w:after="28"/>
+      </w:pPr>
+      <w:r>
+        <w:rPr>
+          <w:sz w:val="16"/>
+          <w:szCs w:val="16"/>
+          <w:rFonts w:ascii="Calibri" w:cs="Calibri" w:eastAsia="Calibri" w:hAnsi="Calibri"/>
+        </w:rPr>
+        <w:t xml:space="preserve"> </w:t>
+      </w:r>
+    </w:p>
+    <w:p>
+      <w:pPr>
+        <w:spacing w:before="0" w:after="0" w:line="50" w:lineRule="exact"/>
+      </w:pPr>
+      <w:r>
+        <w:rPr>
+          <w:sz w:val="2"/>
+          <w:szCs w:val="2"/>
+          <w:rFonts w:ascii="Calibri" w:cs="Calibri" w:eastAsia="Calibri" w:hAnsi="Calibri"/>
+        </w:rPr>
+        <w:t xml:space="preserve"> </w:t>
+      </w:r>
+    </w:p>
+    <w:p>
+      <w:pPr>
+        <w:widowControl w:val="false"/>
+        <w:pBdr>
+          <w:bottom w:val="single" w:color="8892A0" w:sz="8" w:space="1"/>
+        </w:pBdr>
+        <w:spacing w:before="28" w:after="28"/>
+      </w:pPr>
+      <w:r>
+        <w:rPr>
+          <w:sz w:val="16"/>
+          <w:szCs w:val="16"/>
+          <w:rFonts w:ascii="Calibri" w:cs="Calibri" w:eastAsia="Calibri" w:hAnsi="Calibri"/>
+        </w:rPr>
+        <w:t xml:space="preserve"> </w:t>
+      </w:r>
+    </w:p>
+    <w:p>
+      <w:pPr>
+        <w:spacing w:before="0" w:after="0" w:line="50" w:lineRule="exact"/>
+      </w:pPr>
+      <w:r>
+        <w:rPr>
+          <w:sz w:val="2"/>
+          <w:szCs w:val="2"/>
+          <w:rFonts w:ascii="Calibri" w:cs="Calibri" w:eastAsia="Calibri" w:hAnsi="Calibri"/>
+        </w:rPr>
+        <w:t xml:space="preserve"> </w:t>
+      </w:r>
+    </w:p>
+    <w:p>
+      <w:pPr>
+        <w:widowControl w:val="false"/>
+        <w:pBdr>
+          <w:bottom w:val="single" w:color="8892A0" w:sz="8" w:space="1"/>
+        </w:pBdr>
+        <w:spacing w:before="28" w:after="28"/>
+      </w:pPr>
+      <w:r>
+        <w:rPr>
+          <w:sz w:val="16"/>
+          <w:szCs w:val="16"/>
+          <w:rFonts w:ascii="Calibri" w:cs="Calibri" w:eastAsia="Calibri" w:hAnsi="Calibri"/>
+        </w:rPr>
+        <w:t xml:space="preserve"> </w:t>
+      </w:r>
+    </w:p>
     <w:tbl>
       <w:tblPr>
         <w:tblW w:type="dxa" w:w="9792"/>
@@ -27870,7 +29569,7 @@
                 <w:caps w:val="false"/>
                 <w:rFonts w:ascii="Calibri" w:cs="Calibri" w:eastAsia="Calibri" w:hAnsi="Calibri"/>
               </w:rPr>
-              <w:t xml:space="preserve">SOURCE SYNTHESIS — put it together (SSP.03)</w:t>
+              <w:t xml:space="preserve">THINK LIKE A HISTORIAN — corroborate or challenge (SSP.03)</w:t>
             </w:r>
           </w:p>
           <w:p>
@@ -27889,12 +29588,283 @@
                 <w:caps w:val="false"/>
                 <w:rFonts w:ascii="Calibri" w:cs="Calibri" w:eastAsia="Calibri" w:hAnsi="Calibri"/>
               </w:rPr>
-              <w:t xml:space="preserve">In 2–3 sentences: what does this source reveal about this standard, and how do you know? Cite one specific detail from it.</w:t>
+              <w:t xml:space="preserve">Name ONE other source that could CONFIRM this one, and ONE way it could COMPLICATE or CHALLENGE it — or, whose voice is missing here?</w:t>
             </w:r>
           </w:p>
         </w:tc>
       </w:tr>
     </w:tbl>
+    <w:p>
+      <w:pPr>
+        <w:widowControl w:val="false"/>
+        <w:pBdr>
+          <w:bottom w:val="single" w:color="8892A0" w:sz="8" w:space="1"/>
+        </w:pBdr>
+        <w:spacing w:before="28" w:after="28"/>
+      </w:pPr>
+      <w:r>
+        <w:rPr>
+          <w:sz w:val="16"/>
+          <w:szCs w:val="16"/>
+          <w:rFonts w:ascii="Calibri" w:cs="Calibri" w:eastAsia="Calibri" w:hAnsi="Calibri"/>
+        </w:rPr>
+        <w:t xml:space="preserve"> </w:t>
+      </w:r>
+    </w:p>
+    <w:p>
+      <w:pPr>
+        <w:spacing w:before="0" w:after="0" w:line="50" w:lineRule="exact"/>
+      </w:pPr>
+      <w:r>
+        <w:rPr>
+          <w:sz w:val="2"/>
+          <w:szCs w:val="2"/>
+          <w:rFonts w:ascii="Calibri" w:cs="Calibri" w:eastAsia="Calibri" w:hAnsi="Calibri"/>
+        </w:rPr>
+        <w:t xml:space="preserve"> </w:t>
+      </w:r>
+    </w:p>
+    <w:p>
+      <w:pPr>
+        <w:widowControl w:val="false"/>
+        <w:pBdr>
+          <w:bottom w:val="single" w:color="8892A0" w:sz="8" w:space="1"/>
+        </w:pBdr>
+        <w:spacing w:before="28" w:after="28"/>
+      </w:pPr>
+      <w:r>
+        <w:rPr>
+          <w:sz w:val="16"/>
+          <w:szCs w:val="16"/>
+          <w:rFonts w:ascii="Calibri" w:cs="Calibri" w:eastAsia="Calibri" w:hAnsi="Calibri"/>
+        </w:rPr>
+        <w:t xml:space="preserve"> </w:t>
+      </w:r>
+    </w:p>
+    <w:p>
+      <w:pPr>
+        <w:spacing w:before="0" w:after="0" w:line="50" w:lineRule="exact"/>
+      </w:pPr>
+      <w:r>
+        <w:rPr>
+          <w:sz w:val="2"/>
+          <w:szCs w:val="2"/>
+          <w:rFonts w:ascii="Calibri" w:cs="Calibri" w:eastAsia="Calibri" w:hAnsi="Calibri"/>
+        </w:rPr>
+        <w:t xml:space="preserve"> </w:t>
+      </w:r>
+    </w:p>
+    <w:p>
+      <w:pPr>
+        <w:widowControl w:val="false"/>
+        <w:pBdr>
+          <w:bottom w:val="single" w:color="8892A0" w:sz="8" w:space="1"/>
+        </w:pBdr>
+        <w:spacing w:before="28" w:after="28"/>
+      </w:pPr>
+      <w:r>
+        <w:rPr>
+          <w:sz w:val="16"/>
+          <w:szCs w:val="16"/>
+          <w:rFonts w:ascii="Calibri" w:cs="Calibri" w:eastAsia="Calibri" w:hAnsi="Calibri"/>
+        </w:rPr>
+        <w:t xml:space="preserve"> </w:t>
+      </w:r>
+    </w:p>
+    <w:p>
+      <w:pPr>
+        <w:spacing w:before="0" w:after="0" w:line="50" w:lineRule="exact"/>
+      </w:pPr>
+      <w:r>
+        <w:rPr>
+          <w:sz w:val="2"/>
+          <w:szCs w:val="2"/>
+          <w:rFonts w:ascii="Calibri" w:cs="Calibri" w:eastAsia="Calibri" w:hAnsi="Calibri"/>
+        </w:rPr>
+        <w:t xml:space="preserve"> </w:t>
+      </w:r>
+    </w:p>
+    <w:p>
+      <w:pPr>
+        <w:widowControl w:val="false"/>
+        <w:pBdr>
+          <w:bottom w:val="single" w:color="8892A0" w:sz="8" w:space="1"/>
+        </w:pBdr>
+        <w:spacing w:before="28" w:after="28"/>
+      </w:pPr>
+      <w:r>
+        <w:rPr>
+          <w:sz w:val="16"/>
+          <w:szCs w:val="16"/>
+          <w:rFonts w:ascii="Calibri" w:cs="Calibri" w:eastAsia="Calibri" w:hAnsi="Calibri"/>
+        </w:rPr>
+        <w:t xml:space="preserve"> </w:t>
+      </w:r>
+    </w:p>
+    <w:p>
+      <w:pPr>
+        <w:spacing w:before="0" w:after="0" w:line="50" w:lineRule="exact"/>
+      </w:pPr>
+      <w:r>
+        <w:rPr>
+          <w:sz w:val="2"/>
+          <w:szCs w:val="2"/>
+          <w:rFonts w:ascii="Calibri" w:cs="Calibri" w:eastAsia="Calibri" w:hAnsi="Calibri"/>
+        </w:rPr>
+        <w:t xml:space="preserve"> </w:t>
+      </w:r>
+    </w:p>
+    <w:p>
+      <w:pPr>
+        <w:widowControl w:val="false"/>
+        <w:pBdr>
+          <w:bottom w:val="single" w:color="8892A0" w:sz="8" w:space="1"/>
+        </w:pBdr>
+        <w:spacing w:before="28" w:after="28"/>
+      </w:pPr>
+      <w:r>
+        <w:rPr>
+          <w:sz w:val="16"/>
+          <w:szCs w:val="16"/>
+          <w:rFonts w:ascii="Calibri" w:cs="Calibri" w:eastAsia="Calibri" w:hAnsi="Calibri"/>
+        </w:rPr>
+        <w:t xml:space="preserve"> </w:t>
+      </w:r>
+    </w:p>
+    <w:tbl>
+      <w:tblPr>
+        <w:tblW w:type="dxa" w:w="9792"/>
+        <w:tblBorders>
+          <w:top w:val="single" w:color="auto" w:sz="4"/>
+          <w:left w:val="single" w:color="auto" w:sz="4"/>
+          <w:bottom w:val="single" w:color="auto" w:sz="4"/>
+          <w:right w:val="single" w:color="auto" w:sz="4"/>
+          <w:insideH w:val="single" w:color="auto" w:sz="4"/>
+          <w:insideV w:val="single" w:color="auto" w:sz="4"/>
+        </w:tblBorders>
+      </w:tblPr>
+      <w:tblGrid>
+        <w:gridCol w:w="9792"/>
+      </w:tblGrid>
+      <w:tr>
+        <w:tc>
+          <w:tcPr>
+            <w:tcW w:type="dxa" w:w="9792"/>
+            <w:tcBorders>
+              <w:top w:val="single" w:color="D9D5C8" w:sz="4"/>
+              <w:left w:val="single" w:color="D9D5C8" w:sz="4"/>
+              <w:bottom w:val="single" w:color="D9D5C8" w:sz="4"/>
+              <w:right w:val="single" w:color="D9D5C8" w:sz="4"/>
+            </w:tcBorders>
+            <w:shd w:fill="F7F5EF" w:color="auto" w:val="clear"/>
+            <w:tcMar>
+              <w:top w:type="dxa" w:w="55"/>
+              <w:left w:type="dxa" w:w="110"/>
+              <w:bottom w:type="dxa" w:w="55"/>
+              <w:right w:type="dxa" w:w="110"/>
+            </w:tcMar>
+          </w:tcPr>
+          <w:p>
+            <w:pPr>
+              <w:spacing w:after="60"/>
+            </w:pPr>
+            <w:r>
+              <w:rPr>
+                <w:b/>
+                <w:bCs/>
+                <w:i w:val="false"/>
+                <w:iCs w:val="false"/>
+                <w:color w:val="1B2A4A"/>
+                <w:sz w:val="21"/>
+                <w:szCs w:val="21"/>
+                <w:caps w:val="false"/>
+                <w:rFonts w:ascii="Calibri" w:cs="Calibri" w:eastAsia="Calibri" w:hAnsi="Calibri"/>
+              </w:rPr>
+              <w:t xml:space="preserve">SO WHAT? — why this source still matters today</w:t>
+            </w:r>
+          </w:p>
+          <w:p>
+            <w:pPr>
+              <w:spacing w:after="40"/>
+            </w:pPr>
+            <w:r>
+              <w:rPr>
+                <w:b w:val="false"/>
+                <w:bCs w:val="false"/>
+                <w:i w:val="false"/>
+                <w:iCs w:val="false"/>
+                <w:color w:val="1A1A1A"/>
+                <w:sz w:val="22"/>
+                <w:szCs w:val="22"/>
+                <w:caps w:val="false"/>
+                <w:rFonts w:ascii="Calibri" w:cs="Calibri" w:eastAsia="Calibri" w:hAnsi="Calibri"/>
+              </w:rPr>
+              <w:t xml:space="preserve">In 1–2 sentences: why does this source still matter for understanding government today?</w:t>
+            </w:r>
+          </w:p>
+        </w:tc>
+      </w:tr>
+    </w:tbl>
+    <w:p>
+      <w:pPr>
+        <w:widowControl w:val="false"/>
+        <w:pBdr>
+          <w:bottom w:val="single" w:color="8892A0" w:sz="8" w:space="1"/>
+        </w:pBdr>
+        <w:spacing w:before="28" w:after="28"/>
+      </w:pPr>
+      <w:r>
+        <w:rPr>
+          <w:sz w:val="16"/>
+          <w:szCs w:val="16"/>
+          <w:rFonts w:ascii="Calibri" w:cs="Calibri" w:eastAsia="Calibri" w:hAnsi="Calibri"/>
+        </w:rPr>
+        <w:t xml:space="preserve"> </w:t>
+      </w:r>
+    </w:p>
+    <w:p>
+      <w:pPr>
+        <w:spacing w:before="0" w:after="0" w:line="50" w:lineRule="exact"/>
+      </w:pPr>
+      <w:r>
+        <w:rPr>
+          <w:sz w:val="2"/>
+          <w:szCs w:val="2"/>
+          <w:rFonts w:ascii="Calibri" w:cs="Calibri" w:eastAsia="Calibri" w:hAnsi="Calibri"/>
+        </w:rPr>
+        <w:t xml:space="preserve"> </w:t>
+      </w:r>
+    </w:p>
+    <w:p>
+      <w:pPr>
+        <w:widowControl w:val="false"/>
+        <w:pBdr>
+          <w:bottom w:val="single" w:color="8892A0" w:sz="8" w:space="1"/>
+        </w:pBdr>
+        <w:spacing w:before="28" w:after="28"/>
+      </w:pPr>
+      <w:r>
+        <w:rPr>
+          <w:sz w:val="16"/>
+          <w:szCs w:val="16"/>
+          <w:rFonts w:ascii="Calibri" w:cs="Calibri" w:eastAsia="Calibri" w:hAnsi="Calibri"/>
+        </w:rPr>
+        <w:t xml:space="preserve"> </w:t>
+      </w:r>
+    </w:p>
+    <w:p>
+      <w:pPr>
+        <w:spacing w:before="0" w:after="0" w:line="50" w:lineRule="exact"/>
+      </w:pPr>
+      <w:r>
+        <w:rPr>
+          <w:sz w:val="2"/>
+          <w:szCs w:val="2"/>
+          <w:rFonts w:ascii="Calibri" w:cs="Calibri" w:eastAsia="Calibri" w:hAnsi="Calibri"/>
+        </w:rPr>
+        <w:t xml:space="preserve"> </w:t>
+      </w:r>
+    </w:p>
     <w:p>
       <w:pPr>
         <w:widowControl w:val="false"/>
@@ -35660,7 +37630,7 @@
       </w:tblGrid>
       <w:tr>
         <w:trPr>
-          <w:trHeight w:val="1450" w:hRule="atLeast"/>
+          <w:trHeight w:val="2050" w:hRule="atLeast"/>
         </w:trPr>
         <w:tc>
           <w:tcPr>
@@ -40362,6 +42332,187 @@
         </w:tblBorders>
       </w:tblPr>
       <w:tblGrid>
+        <w:gridCol w:w="9792"/>
+      </w:tblGrid>
+      <w:tr>
+        <w:tc>
+          <w:tcPr>
+            <w:tcW w:type="dxa" w:w="9792"/>
+            <w:tcBorders>
+              <w:top w:val="single" w:color="D9D5C8" w:sz="4"/>
+              <w:left w:val="single" w:color="D9D5C8" w:sz="4"/>
+              <w:bottom w:val="single" w:color="D9D5C8" w:sz="4"/>
+              <w:right w:val="single" w:color="D9D5C8" w:sz="4"/>
+            </w:tcBorders>
+            <w:shd w:fill="F7F5EF" w:color="auto" w:val="clear"/>
+            <w:tcMar>
+              <w:top w:type="dxa" w:w="55"/>
+              <w:left w:type="dxa" w:w="110"/>
+              <w:bottom w:type="dxa" w:w="55"/>
+              <w:right w:type="dxa" w:w="110"/>
+            </w:tcMar>
+          </w:tcPr>
+          <w:p>
+            <w:pPr>
+              <w:spacing w:after="60"/>
+            </w:pPr>
+            <w:r>
+              <w:rPr>
+                <w:b/>
+                <w:bCs/>
+                <w:i w:val="false"/>
+                <w:iCs w:val="false"/>
+                <w:color w:val="1B2A4A"/>
+                <w:sz w:val="21"/>
+                <w:szCs w:val="21"/>
+                <w:caps w:val="false"/>
+                <w:rFonts w:ascii="Calibri" w:cs="Calibri" w:eastAsia="Calibri" w:hAnsi="Calibri"/>
+              </w:rPr>
+              <w:t xml:space="preserve">FIRST LOOK — before you analyze</w:t>
+            </w:r>
+          </w:p>
+          <w:p>
+            <w:pPr>
+              <w:spacing w:after="40"/>
+            </w:pPr>
+            <w:r>
+              <w:rPr>
+                <w:b w:val="false"/>
+                <w:bCs w:val="false"/>
+                <w:i w:val="false"/>
+                <w:iCs w:val="false"/>
+                <w:color w:val="1A1A1A"/>
+                <w:sz w:val="22"/>
+                <w:szCs w:val="22"/>
+                <w:caps w:val="false"/>
+                <w:rFonts w:ascii="Calibri" w:cs="Calibri" w:eastAsia="Calibri" w:hAnsi="Calibri"/>
+              </w:rPr>
+              <w:t xml:space="preserve">Jot 3–4 things you notice in the source (details, words, people, dates). No wrong answers.</w:t>
+            </w:r>
+          </w:p>
+        </w:tc>
+      </w:tr>
+    </w:tbl>
+    <w:p>
+      <w:pPr>
+        <w:widowControl w:val="false"/>
+        <w:pBdr>
+          <w:bottom w:val="single" w:color="8892A0" w:sz="8" w:space="1"/>
+        </w:pBdr>
+        <w:spacing w:before="28" w:after="28"/>
+      </w:pPr>
+      <w:r>
+        <w:rPr>
+          <w:sz w:val="16"/>
+          <w:szCs w:val="16"/>
+          <w:rFonts w:ascii="Calibri" w:cs="Calibri" w:eastAsia="Calibri" w:hAnsi="Calibri"/>
+        </w:rPr>
+        <w:t xml:space="preserve"> </w:t>
+      </w:r>
+    </w:p>
+    <w:p>
+      <w:pPr>
+        <w:spacing w:before="0" w:after="0" w:line="50" w:lineRule="exact"/>
+      </w:pPr>
+      <w:r>
+        <w:rPr>
+          <w:sz w:val="2"/>
+          <w:szCs w:val="2"/>
+          <w:rFonts w:ascii="Calibri" w:cs="Calibri" w:eastAsia="Calibri" w:hAnsi="Calibri"/>
+        </w:rPr>
+        <w:t xml:space="preserve"> </w:t>
+      </w:r>
+    </w:p>
+    <w:p>
+      <w:pPr>
+        <w:widowControl w:val="false"/>
+        <w:pBdr>
+          <w:bottom w:val="single" w:color="8892A0" w:sz="8" w:space="1"/>
+        </w:pBdr>
+        <w:spacing w:before="28" w:after="28"/>
+      </w:pPr>
+      <w:r>
+        <w:rPr>
+          <w:sz w:val="16"/>
+          <w:szCs w:val="16"/>
+          <w:rFonts w:ascii="Calibri" w:cs="Calibri" w:eastAsia="Calibri" w:hAnsi="Calibri"/>
+        </w:rPr>
+        <w:t xml:space="preserve"> </w:t>
+      </w:r>
+    </w:p>
+    <w:p>
+      <w:pPr>
+        <w:spacing w:before="0" w:after="0" w:line="50" w:lineRule="exact"/>
+      </w:pPr>
+      <w:r>
+        <w:rPr>
+          <w:sz w:val="2"/>
+          <w:szCs w:val="2"/>
+          <w:rFonts w:ascii="Calibri" w:cs="Calibri" w:eastAsia="Calibri" w:hAnsi="Calibri"/>
+        </w:rPr>
+        <w:t xml:space="preserve"> </w:t>
+      </w:r>
+    </w:p>
+    <w:p>
+      <w:pPr>
+        <w:widowControl w:val="false"/>
+        <w:pBdr>
+          <w:bottom w:val="single" w:color="8892A0" w:sz="8" w:space="1"/>
+        </w:pBdr>
+        <w:spacing w:before="28" w:after="28"/>
+      </w:pPr>
+      <w:r>
+        <w:rPr>
+          <w:sz w:val="16"/>
+          <w:szCs w:val="16"/>
+          <w:rFonts w:ascii="Calibri" w:cs="Calibri" w:eastAsia="Calibri" w:hAnsi="Calibri"/>
+        </w:rPr>
+        <w:t xml:space="preserve"> </w:t>
+      </w:r>
+    </w:p>
+    <w:p>
+      <w:pPr>
+        <w:spacing w:before="0" w:after="0" w:line="50" w:lineRule="exact"/>
+      </w:pPr>
+      <w:r>
+        <w:rPr>
+          <w:sz w:val="2"/>
+          <w:szCs w:val="2"/>
+          <w:rFonts w:ascii="Calibri" w:cs="Calibri" w:eastAsia="Calibri" w:hAnsi="Calibri"/>
+        </w:rPr>
+        <w:t xml:space="preserve"> </w:t>
+      </w:r>
+    </w:p>
+    <w:p>
+      <w:pPr>
+        <w:widowControl w:val="false"/>
+        <w:pBdr>
+          <w:bottom w:val="single" w:color="8892A0" w:sz="8" w:space="1"/>
+        </w:pBdr>
+        <w:spacing w:before="28" w:after="28"/>
+      </w:pPr>
+      <w:r>
+        <w:rPr>
+          <w:sz w:val="16"/>
+          <w:szCs w:val="16"/>
+          <w:rFonts w:ascii="Calibri" w:cs="Calibri" w:eastAsia="Calibri" w:hAnsi="Calibri"/>
+        </w:rPr>
+        <w:t xml:space="preserve"> </w:t>
+      </w:r>
+    </w:p>
+    <w:tbl>
+      <w:tblPr>
+        <w:tblW w:type="dxa" w:w="9792"/>
+        <w:tblBorders>
+          <w:top w:val="single" w:color="auto" w:sz="4"/>
+          <w:left w:val="single" w:color="auto" w:sz="4"/>
+          <w:bottom w:val="single" w:color="auto" w:sz="4"/>
+          <w:right w:val="single" w:color="auto" w:sz="4"/>
+          <w:insideH w:val="single" w:color="auto" w:sz="4"/>
+          <w:insideV w:val="single" w:color="auto" w:sz="4"/>
+        </w:tblBorders>
+      </w:tblPr>
+      <w:tblGrid>
         <w:gridCol w:w="4263"/>
         <w:gridCol w:w="5529"/>
       </w:tblGrid>
@@ -40544,61 +42695,19 @@
               <w:t xml:space="preserve"> </w:t>
             </w:r>
           </w:p>
-        </w:tc>
-      </w:tr>
-      <w:tr>
-        <w:tc>
-          <w:tcPr>
-            <w:tcW w:type="dxa" w:w="4263"/>
-            <w:tcBorders>
-              <w:top w:val="single" w:color="D9D5C8" w:sz="4"/>
-              <w:left w:val="single" w:color="D9D5C8" w:sz="4"/>
-              <w:bottom w:val="single" w:color="D9D5C8" w:sz="4"/>
-              <w:right w:val="single" w:color="D9D5C8" w:sz="4"/>
-            </w:tcBorders>
-            <w:tcMar>
-              <w:top w:type="dxa" w:w="55"/>
-              <w:left w:type="dxa" w:w="110"/>
-              <w:bottom w:type="dxa" w:w="55"/>
-              <w:right w:type="dxa" w:w="110"/>
-            </w:tcMar>
-          </w:tcPr>
-          <w:p>
-            <w:pPr>
-              <w:spacing w:after="0"/>
-            </w:pPr>
-            <w:r>
-              <w:rPr>
-                <w:b/>
-                <w:bCs/>
-                <w:i w:val="false"/>
-                <w:iCs w:val="false"/>
-                <w:color w:val="1A1A1A"/>
-                <w:sz w:val="20"/>
-                <w:szCs w:val="20"/>
-                <w:caps w:val="false"/>
-                <w:rFonts w:ascii="Calibri" w:cs="Calibri" w:eastAsia="Calibri" w:hAnsi="Calibri"/>
-              </w:rPr>
-              <w:t xml:space="preserve">I — Intended audience: who was meant to see or obey it?</w:t>
-            </w:r>
-          </w:p>
-        </w:tc>
-        <w:tc>
-          <w:tcPr>
-            <w:tcW w:type="dxa" w:w="5529"/>
-            <w:tcBorders>
-              <w:top w:val="single" w:color="D9D5C8" w:sz="4"/>
-              <w:left w:val="single" w:color="D9D5C8" w:sz="4"/>
-              <w:bottom w:val="single" w:color="D9D5C8" w:sz="4"/>
-              <w:right w:val="single" w:color="D9D5C8" w:sz="4"/>
-            </w:tcBorders>
-            <w:tcMar>
-              <w:top w:type="dxa" w:w="55"/>
-              <w:left w:type="dxa" w:w="110"/>
-              <w:bottom w:type="dxa" w:w="55"/>
-              <w:right w:type="dxa" w:w="110"/>
-            </w:tcMar>
-          </w:tcPr>
+          <w:p>
+            <w:pPr>
+              <w:spacing w:before="0" w:after="0" w:line="50" w:lineRule="exact"/>
+            </w:pPr>
+            <w:r>
+              <w:rPr>
+                <w:sz w:val="2"/>
+                <w:szCs w:val="2"/>
+                <w:rFonts w:ascii="Calibri" w:cs="Calibri" w:eastAsia="Calibri" w:hAnsi="Calibri"/>
+              </w:rPr>
+              <w:t xml:space="preserve"> </w:t>
+            </w:r>
+          </w:p>
           <w:p>
             <w:pPr>
               <w:widowControl w:val="false"/>
@@ -40681,7 +42790,7 @@
                 <w:caps w:val="false"/>
                 <w:rFonts w:ascii="Calibri" w:cs="Calibri" w:eastAsia="Calibri" w:hAnsi="Calibri"/>
               </w:rPr>
-              <w:t xml:space="preserve">P — Purpose: why was it created?</w:t>
+              <w:t xml:space="preserve">I — Intended audience: who was meant to see or obey it?</w:t>
             </w:r>
           </w:p>
         </w:tc>
@@ -40748,61 +42857,19 @@
               <w:t xml:space="preserve"> </w:t>
             </w:r>
           </w:p>
-        </w:tc>
-      </w:tr>
-      <w:tr>
-        <w:tc>
-          <w:tcPr>
-            <w:tcW w:type="dxa" w:w="4263"/>
-            <w:tcBorders>
-              <w:top w:val="single" w:color="D9D5C8" w:sz="4"/>
-              <w:left w:val="single" w:color="D9D5C8" w:sz="4"/>
-              <w:bottom w:val="single" w:color="D9D5C8" w:sz="4"/>
-              <w:right w:val="single" w:color="D9D5C8" w:sz="4"/>
-            </w:tcBorders>
-            <w:tcMar>
-              <w:top w:type="dxa" w:w="55"/>
-              <w:left w:type="dxa" w:w="110"/>
-              <w:bottom w:type="dxa" w:w="55"/>
-              <w:right w:type="dxa" w:w="110"/>
-            </w:tcMar>
-          </w:tcPr>
-          <w:p>
-            <w:pPr>
-              <w:spacing w:after="0"/>
-            </w:pPr>
-            <w:r>
-              <w:rPr>
-                <w:b/>
-                <w:bCs/>
-                <w:i w:val="false"/>
-                <w:iCs w:val="false"/>
-                <w:color w:val="1A1A1A"/>
-                <w:sz w:val="20"/>
-                <w:szCs w:val="20"/>
-                <w:caps w:val="false"/>
-                <w:rFonts w:ascii="Calibri" w:cs="Calibri" w:eastAsia="Calibri" w:hAnsi="Calibri"/>
-              </w:rPr>
-              <w:t xml:space="preserve">P — Point of view: whose perspective does it reflect?</w:t>
-            </w:r>
-          </w:p>
-        </w:tc>
-        <w:tc>
-          <w:tcPr>
-            <w:tcW w:type="dxa" w:w="5529"/>
-            <w:tcBorders>
-              <w:top w:val="single" w:color="D9D5C8" w:sz="4"/>
-              <w:left w:val="single" w:color="D9D5C8" w:sz="4"/>
-              <w:bottom w:val="single" w:color="D9D5C8" w:sz="4"/>
-              <w:right w:val="single" w:color="D9D5C8" w:sz="4"/>
-            </w:tcBorders>
-            <w:tcMar>
-              <w:top w:type="dxa" w:w="55"/>
-              <w:left w:type="dxa" w:w="110"/>
-              <w:bottom w:type="dxa" w:w="55"/>
-              <w:right w:type="dxa" w:w="110"/>
-            </w:tcMar>
-          </w:tcPr>
+          <w:p>
+            <w:pPr>
+              <w:spacing w:before="0" w:after="0" w:line="50" w:lineRule="exact"/>
+            </w:pPr>
+            <w:r>
+              <w:rPr>
+                <w:sz w:val="2"/>
+                <w:szCs w:val="2"/>
+                <w:rFonts w:ascii="Calibri" w:cs="Calibri" w:eastAsia="Calibri" w:hAnsi="Calibri"/>
+              </w:rPr>
+              <w:t xml:space="preserve"> </w:t>
+            </w:r>
+          </w:p>
           <w:p>
             <w:pPr>
               <w:widowControl w:val="false"/>
@@ -40885,7 +42952,7 @@
                 <w:caps w:val="false"/>
                 <w:rFonts w:ascii="Calibri" w:cs="Calibri" w:eastAsia="Calibri" w:hAnsi="Calibri"/>
               </w:rPr>
-              <w:t xml:space="preserve">O — Outside connection: how does it connect to this standard?</w:t>
+              <w:t xml:space="preserve">P — Purpose: why was it created?</w:t>
             </w:r>
           </w:p>
         </w:tc>
@@ -40950,6 +43017,486 @@
                 <w:rFonts w:ascii="Calibri" w:cs="Calibri" w:eastAsia="Calibri" w:hAnsi="Calibri"/>
               </w:rPr>
               <w:t xml:space="preserve"> </w:t>
+            </w:r>
+          </w:p>
+          <w:p>
+            <w:pPr>
+              <w:spacing w:before="0" w:after="0" w:line="50" w:lineRule="exact"/>
+            </w:pPr>
+            <w:r>
+              <w:rPr>
+                <w:sz w:val="2"/>
+                <w:szCs w:val="2"/>
+                <w:rFonts w:ascii="Calibri" w:cs="Calibri" w:eastAsia="Calibri" w:hAnsi="Calibri"/>
+              </w:rPr>
+              <w:t xml:space="preserve"> </w:t>
+            </w:r>
+          </w:p>
+          <w:p>
+            <w:pPr>
+              <w:widowControl w:val="false"/>
+              <w:pBdr>
+                <w:bottom w:val="single" w:color="8892A0" w:sz="8" w:space="1"/>
+              </w:pBdr>
+              <w:spacing w:before="28" w:after="28"/>
+            </w:pPr>
+            <w:r>
+              <w:rPr>
+                <w:sz w:val="16"/>
+                <w:szCs w:val="16"/>
+                <w:rFonts w:ascii="Calibri" w:cs="Calibri" w:eastAsia="Calibri" w:hAnsi="Calibri"/>
+              </w:rPr>
+              <w:t xml:space="preserve"> </w:t>
+            </w:r>
+          </w:p>
+          <w:p>
+            <w:pPr>
+              <w:spacing w:before="0" w:after="0" w:line="50" w:lineRule="exact"/>
+            </w:pPr>
+            <w:r>
+              <w:rPr>
+                <w:sz w:val="2"/>
+                <w:szCs w:val="2"/>
+                <w:rFonts w:ascii="Calibri" w:cs="Calibri" w:eastAsia="Calibri" w:hAnsi="Calibri"/>
+              </w:rPr>
+              <w:t xml:space="preserve"> </w:t>
+            </w:r>
+          </w:p>
+          <w:p>
+            <w:pPr>
+              <w:widowControl w:val="false"/>
+              <w:pBdr>
+                <w:bottom w:val="single" w:color="8892A0" w:sz="8" w:space="1"/>
+              </w:pBdr>
+              <w:spacing w:before="28" w:after="28"/>
+            </w:pPr>
+            <w:r>
+              <w:rPr>
+                <w:sz w:val="16"/>
+                <w:szCs w:val="16"/>
+                <w:rFonts w:ascii="Calibri" w:cs="Calibri" w:eastAsia="Calibri" w:hAnsi="Calibri"/>
+              </w:rPr>
+              <w:t xml:space="preserve"> </w:t>
+            </w:r>
+          </w:p>
+        </w:tc>
+      </w:tr>
+      <w:tr>
+        <w:tc>
+          <w:tcPr>
+            <w:tcW w:type="dxa" w:w="4263"/>
+            <w:tcBorders>
+              <w:top w:val="single" w:color="D9D5C8" w:sz="4"/>
+              <w:left w:val="single" w:color="D9D5C8" w:sz="4"/>
+              <w:bottom w:val="single" w:color="D9D5C8" w:sz="4"/>
+              <w:right w:val="single" w:color="D9D5C8" w:sz="4"/>
+            </w:tcBorders>
+            <w:tcMar>
+              <w:top w:type="dxa" w:w="55"/>
+              <w:left w:type="dxa" w:w="110"/>
+              <w:bottom w:type="dxa" w:w="55"/>
+              <w:right w:type="dxa" w:w="110"/>
+            </w:tcMar>
+          </w:tcPr>
+          <w:p>
+            <w:pPr>
+              <w:spacing w:after="0"/>
+            </w:pPr>
+            <w:r>
+              <w:rPr>
+                <w:b/>
+                <w:bCs/>
+                <w:i w:val="false"/>
+                <w:iCs w:val="false"/>
+                <w:color w:val="1A1A1A"/>
+                <w:sz w:val="20"/>
+                <w:szCs w:val="20"/>
+                <w:caps w:val="false"/>
+                <w:rFonts w:ascii="Calibri" w:cs="Calibri" w:eastAsia="Calibri" w:hAnsi="Calibri"/>
+              </w:rPr>
+              <w:t xml:space="preserve">P — Point of view: whose perspective does it reflect?</w:t>
+            </w:r>
+          </w:p>
+        </w:tc>
+        <w:tc>
+          <w:tcPr>
+            <w:tcW w:type="dxa" w:w="5529"/>
+            <w:tcBorders>
+              <w:top w:val="single" w:color="D9D5C8" w:sz="4"/>
+              <w:left w:val="single" w:color="D9D5C8" w:sz="4"/>
+              <w:bottom w:val="single" w:color="D9D5C8" w:sz="4"/>
+              <w:right w:val="single" w:color="D9D5C8" w:sz="4"/>
+            </w:tcBorders>
+            <w:tcMar>
+              <w:top w:type="dxa" w:w="55"/>
+              <w:left w:type="dxa" w:w="110"/>
+              <w:bottom w:type="dxa" w:w="55"/>
+              <w:right w:type="dxa" w:w="110"/>
+            </w:tcMar>
+          </w:tcPr>
+          <w:p>
+            <w:pPr>
+              <w:widowControl w:val="false"/>
+              <w:pBdr>
+                <w:bottom w:val="single" w:color="8892A0" w:sz="8" w:space="1"/>
+              </w:pBdr>
+              <w:spacing w:before="28" w:after="28"/>
+            </w:pPr>
+            <w:r>
+              <w:rPr>
+                <w:sz w:val="16"/>
+                <w:szCs w:val="16"/>
+                <w:rFonts w:ascii="Calibri" w:cs="Calibri" w:eastAsia="Calibri" w:hAnsi="Calibri"/>
+              </w:rPr>
+              <w:t xml:space="preserve"> </w:t>
+            </w:r>
+          </w:p>
+          <w:p>
+            <w:pPr>
+              <w:spacing w:before="0" w:after="0" w:line="50" w:lineRule="exact"/>
+            </w:pPr>
+            <w:r>
+              <w:rPr>
+                <w:sz w:val="2"/>
+                <w:szCs w:val="2"/>
+                <w:rFonts w:ascii="Calibri" w:cs="Calibri" w:eastAsia="Calibri" w:hAnsi="Calibri"/>
+              </w:rPr>
+              <w:t xml:space="preserve"> </w:t>
+            </w:r>
+          </w:p>
+          <w:p>
+            <w:pPr>
+              <w:widowControl w:val="false"/>
+              <w:pBdr>
+                <w:bottom w:val="single" w:color="8892A0" w:sz="8" w:space="1"/>
+              </w:pBdr>
+              <w:spacing w:before="28" w:after="28"/>
+            </w:pPr>
+            <w:r>
+              <w:rPr>
+                <w:sz w:val="16"/>
+                <w:szCs w:val="16"/>
+                <w:rFonts w:ascii="Calibri" w:cs="Calibri" w:eastAsia="Calibri" w:hAnsi="Calibri"/>
+              </w:rPr>
+              <w:t xml:space="preserve"> </w:t>
+            </w:r>
+          </w:p>
+          <w:p>
+            <w:pPr>
+              <w:spacing w:before="0" w:after="0" w:line="50" w:lineRule="exact"/>
+            </w:pPr>
+            <w:r>
+              <w:rPr>
+                <w:sz w:val="2"/>
+                <w:szCs w:val="2"/>
+                <w:rFonts w:ascii="Calibri" w:cs="Calibri" w:eastAsia="Calibri" w:hAnsi="Calibri"/>
+              </w:rPr>
+              <w:t xml:space="preserve"> </w:t>
+            </w:r>
+          </w:p>
+          <w:p>
+            <w:pPr>
+              <w:widowControl w:val="false"/>
+              <w:pBdr>
+                <w:bottom w:val="single" w:color="8892A0" w:sz="8" w:space="1"/>
+              </w:pBdr>
+              <w:spacing w:before="28" w:after="28"/>
+            </w:pPr>
+            <w:r>
+              <w:rPr>
+                <w:sz w:val="16"/>
+                <w:szCs w:val="16"/>
+                <w:rFonts w:ascii="Calibri" w:cs="Calibri" w:eastAsia="Calibri" w:hAnsi="Calibri"/>
+              </w:rPr>
+              <w:t xml:space="preserve"> </w:t>
+            </w:r>
+          </w:p>
+          <w:p>
+            <w:pPr>
+              <w:spacing w:before="0" w:after="0" w:line="50" w:lineRule="exact"/>
+            </w:pPr>
+            <w:r>
+              <w:rPr>
+                <w:sz w:val="2"/>
+                <w:szCs w:val="2"/>
+                <w:rFonts w:ascii="Calibri" w:cs="Calibri" w:eastAsia="Calibri" w:hAnsi="Calibri"/>
+              </w:rPr>
+              <w:t xml:space="preserve"> </w:t>
+            </w:r>
+          </w:p>
+          <w:p>
+            <w:pPr>
+              <w:widowControl w:val="false"/>
+              <w:pBdr>
+                <w:bottom w:val="single" w:color="8892A0" w:sz="8" w:space="1"/>
+              </w:pBdr>
+              <w:spacing w:before="28" w:after="28"/>
+            </w:pPr>
+            <w:r>
+              <w:rPr>
+                <w:sz w:val="16"/>
+                <w:szCs w:val="16"/>
+                <w:rFonts w:ascii="Calibri" w:cs="Calibri" w:eastAsia="Calibri" w:hAnsi="Calibri"/>
+              </w:rPr>
+              <w:t xml:space="preserve"> </w:t>
+            </w:r>
+          </w:p>
+        </w:tc>
+      </w:tr>
+      <w:tr>
+        <w:tc>
+          <w:tcPr>
+            <w:tcW w:type="dxa" w:w="4263"/>
+            <w:tcBorders>
+              <w:top w:val="single" w:color="D9D5C8" w:sz="4"/>
+              <w:left w:val="single" w:color="D9D5C8" w:sz="4"/>
+              <w:bottom w:val="single" w:color="D9D5C8" w:sz="4"/>
+              <w:right w:val="single" w:color="D9D5C8" w:sz="4"/>
+            </w:tcBorders>
+            <w:tcMar>
+              <w:top w:type="dxa" w:w="55"/>
+              <w:left w:type="dxa" w:w="110"/>
+              <w:bottom w:type="dxa" w:w="55"/>
+              <w:right w:type="dxa" w:w="110"/>
+            </w:tcMar>
+          </w:tcPr>
+          <w:p>
+            <w:pPr>
+              <w:spacing w:after="0"/>
+            </w:pPr>
+            <w:r>
+              <w:rPr>
+                <w:b/>
+                <w:bCs/>
+                <w:i w:val="false"/>
+                <w:iCs w:val="false"/>
+                <w:color w:val="1A1A1A"/>
+                <w:sz w:val="20"/>
+                <w:szCs w:val="20"/>
+                <w:caps w:val="false"/>
+                <w:rFonts w:ascii="Calibri" w:cs="Calibri" w:eastAsia="Calibri" w:hAnsi="Calibri"/>
+              </w:rPr>
+              <w:t xml:space="preserve">O — Outside connection: how does it connect to this standard?</w:t>
+            </w:r>
+          </w:p>
+        </w:tc>
+        <w:tc>
+          <w:tcPr>
+            <w:tcW w:type="dxa" w:w="5529"/>
+            <w:tcBorders>
+              <w:top w:val="single" w:color="D9D5C8" w:sz="4"/>
+              <w:left w:val="single" w:color="D9D5C8" w:sz="4"/>
+              <w:bottom w:val="single" w:color="D9D5C8" w:sz="4"/>
+              <w:right w:val="single" w:color="D9D5C8" w:sz="4"/>
+            </w:tcBorders>
+            <w:tcMar>
+              <w:top w:type="dxa" w:w="55"/>
+              <w:left w:type="dxa" w:w="110"/>
+              <w:bottom w:type="dxa" w:w="55"/>
+              <w:right w:type="dxa" w:w="110"/>
+            </w:tcMar>
+          </w:tcPr>
+          <w:p>
+            <w:pPr>
+              <w:widowControl w:val="false"/>
+              <w:pBdr>
+                <w:bottom w:val="single" w:color="8892A0" w:sz="8" w:space="1"/>
+              </w:pBdr>
+              <w:spacing w:before="28" w:after="28"/>
+            </w:pPr>
+            <w:r>
+              <w:rPr>
+                <w:sz w:val="16"/>
+                <w:szCs w:val="16"/>
+                <w:rFonts w:ascii="Calibri" w:cs="Calibri" w:eastAsia="Calibri" w:hAnsi="Calibri"/>
+              </w:rPr>
+              <w:t xml:space="preserve"> </w:t>
+            </w:r>
+          </w:p>
+          <w:p>
+            <w:pPr>
+              <w:spacing w:before="0" w:after="0" w:line="50" w:lineRule="exact"/>
+            </w:pPr>
+            <w:r>
+              <w:rPr>
+                <w:sz w:val="2"/>
+                <w:szCs w:val="2"/>
+                <w:rFonts w:ascii="Calibri" w:cs="Calibri" w:eastAsia="Calibri" w:hAnsi="Calibri"/>
+              </w:rPr>
+              <w:t xml:space="preserve"> </w:t>
+            </w:r>
+          </w:p>
+          <w:p>
+            <w:pPr>
+              <w:widowControl w:val="false"/>
+              <w:pBdr>
+                <w:bottom w:val="single" w:color="8892A0" w:sz="8" w:space="1"/>
+              </w:pBdr>
+              <w:spacing w:before="28" w:after="28"/>
+            </w:pPr>
+            <w:r>
+              <w:rPr>
+                <w:sz w:val="16"/>
+                <w:szCs w:val="16"/>
+                <w:rFonts w:ascii="Calibri" w:cs="Calibri" w:eastAsia="Calibri" w:hAnsi="Calibri"/>
+              </w:rPr>
+              <w:t xml:space="preserve"> </w:t>
+            </w:r>
+          </w:p>
+          <w:p>
+            <w:pPr>
+              <w:spacing w:before="0" w:after="0" w:line="50" w:lineRule="exact"/>
+            </w:pPr>
+            <w:r>
+              <w:rPr>
+                <w:sz w:val="2"/>
+                <w:szCs w:val="2"/>
+                <w:rFonts w:ascii="Calibri" w:cs="Calibri" w:eastAsia="Calibri" w:hAnsi="Calibri"/>
+              </w:rPr>
+              <w:t xml:space="preserve"> </w:t>
+            </w:r>
+          </w:p>
+          <w:p>
+            <w:pPr>
+              <w:widowControl w:val="false"/>
+              <w:pBdr>
+                <w:bottom w:val="single" w:color="8892A0" w:sz="8" w:space="1"/>
+              </w:pBdr>
+              <w:spacing w:before="28" w:after="28"/>
+            </w:pPr>
+            <w:r>
+              <w:rPr>
+                <w:sz w:val="16"/>
+                <w:szCs w:val="16"/>
+                <w:rFonts w:ascii="Calibri" w:cs="Calibri" w:eastAsia="Calibri" w:hAnsi="Calibri"/>
+              </w:rPr>
+              <w:t xml:space="preserve"> </w:t>
+            </w:r>
+          </w:p>
+          <w:p>
+            <w:pPr>
+              <w:spacing w:before="0" w:after="0" w:line="50" w:lineRule="exact"/>
+            </w:pPr>
+            <w:r>
+              <w:rPr>
+                <w:sz w:val="2"/>
+                <w:szCs w:val="2"/>
+                <w:rFonts w:ascii="Calibri" w:cs="Calibri" w:eastAsia="Calibri" w:hAnsi="Calibri"/>
+              </w:rPr>
+              <w:t xml:space="preserve"> </w:t>
+            </w:r>
+          </w:p>
+          <w:p>
+            <w:pPr>
+              <w:widowControl w:val="false"/>
+              <w:pBdr>
+                <w:bottom w:val="single" w:color="8892A0" w:sz="8" w:space="1"/>
+              </w:pBdr>
+              <w:spacing w:before="28" w:after="28"/>
+            </w:pPr>
+            <w:r>
+              <w:rPr>
+                <w:sz w:val="16"/>
+                <w:szCs w:val="16"/>
+                <w:rFonts w:ascii="Calibri" w:cs="Calibri" w:eastAsia="Calibri" w:hAnsi="Calibri"/>
+              </w:rPr>
+              <w:t xml:space="preserve"> </w:t>
+            </w:r>
+          </w:p>
+        </w:tc>
+      </w:tr>
+    </w:tbl>
+    <w:p>
+      <w:pPr>
+        <w:pStyle w:val="Heading2"/>
+        <w:keepNext/>
+        <w:pageBreakBefore/>
+        <w:spacing w:before="150" w:after="90"/>
+      </w:pPr>
+      <w:r>
+        <w:rPr>
+          <w:b/>
+          <w:bCs/>
+          <w:i w:val="false"/>
+          <w:iCs w:val="false"/>
+          <w:color w:val="1B2A4A"/>
+          <w:sz w:val="28"/>
+          <w:szCs w:val="28"/>
+          <w:caps w:val="false"/>
+          <w:rFonts w:ascii="Calibri" w:cs="Calibri" w:eastAsia="Calibri" w:hAnsi="Calibri"/>
+        </w:rPr>
+        <w:t xml:space="preserve">Primary Source Analysis — go deeper — GC.18</w:t>
+      </w:r>
+    </w:p>
+    <w:tbl>
+      <w:tblPr>
+        <w:tblW w:type="dxa" w:w="9792"/>
+        <w:tblBorders>
+          <w:top w:val="single" w:color="auto" w:sz="4"/>
+          <w:left w:val="single" w:color="auto" w:sz="4"/>
+          <w:bottom w:val="single" w:color="auto" w:sz="4"/>
+          <w:right w:val="single" w:color="auto" w:sz="4"/>
+          <w:insideH w:val="single" w:color="auto" w:sz="4"/>
+          <w:insideV w:val="single" w:color="auto" w:sz="4"/>
+        </w:tblBorders>
+      </w:tblPr>
+      <w:tblGrid>
+        <w:gridCol w:w="9792"/>
+      </w:tblGrid>
+      <w:tr>
+        <w:tc>
+          <w:tcPr>
+            <w:tcW w:type="dxa" w:w="9792"/>
+            <w:tcBorders>
+              <w:top w:val="single" w:color="D9D5C8" w:sz="4"/>
+              <w:left w:val="single" w:color="D9D5C8" w:sz="4"/>
+              <w:bottom w:val="single" w:color="D9D5C8" w:sz="4"/>
+              <w:right w:val="single" w:color="D9D5C8" w:sz="4"/>
+            </w:tcBorders>
+            <w:shd w:fill="F7F5EF" w:color="auto" w:val="clear"/>
+            <w:tcMar>
+              <w:top w:type="dxa" w:w="55"/>
+              <w:left w:type="dxa" w:w="110"/>
+              <w:bottom w:type="dxa" w:w="55"/>
+              <w:right w:type="dxa" w:w="110"/>
+            </w:tcMar>
+          </w:tcPr>
+          <w:p>
+            <w:pPr>
+              <w:spacing w:after="60"/>
+            </w:pPr>
+            <w:r>
+              <w:rPr>
+                <w:b/>
+                <w:bCs/>
+                <w:i w:val="false"/>
+                <w:iCs w:val="false"/>
+                <w:color w:val="1B2A4A"/>
+                <w:sz w:val="21"/>
+                <w:szCs w:val="21"/>
+                <w:caps w:val="false"/>
+                <w:rFonts w:ascii="Calibri" w:cs="Calibri" w:eastAsia="Calibri" w:hAnsi="Calibri"/>
+              </w:rPr>
+              <w:t xml:space="preserve">SUPPORT OPTION (use if you need it)</w:t>
+            </w:r>
+          </w:p>
+          <w:p>
+            <w:pPr>
+              <w:spacing w:after="40"/>
+            </w:pPr>
+            <w:r>
+              <w:rPr>
+                <w:b w:val="false"/>
+                <w:bCs w:val="false"/>
+                <w:i w:val="false"/>
+                <w:iCs w:val="false"/>
+                <w:color w:val="1A1A1A"/>
+                <w:sz w:val="22"/>
+                <w:szCs w:val="22"/>
+                <w:caps w:val="false"/>
+                <w:rFonts w:ascii="Calibri" w:cs="Calibri" w:eastAsia="Calibri" w:hAnsi="Calibri"/>
+              </w:rPr>
+              <w:t xml:space="preserve">Sentence frame: This source shows ______ because it ______, which reveals ______.</w:t>
             </w:r>
           </w:p>
         </w:tc>
@@ -41004,7 +43551,7 @@
                 <w:caps w:val="false"/>
                 <w:rFonts w:ascii="Calibri" w:cs="Calibri" w:eastAsia="Calibri" w:hAnsi="Calibri"/>
               </w:rPr>
-              <w:t xml:space="preserve">SUPPORT OPTION</w:t>
+              <w:t xml:space="preserve">SOURCE SYNTHESIS — put it together (SSP.03)</w:t>
             </w:r>
           </w:p>
           <w:p>
@@ -41023,12 +43570,149 @@
                 <w:caps w:val="false"/>
                 <w:rFonts w:ascii="Calibri" w:cs="Calibri" w:eastAsia="Calibri" w:hAnsi="Calibri"/>
               </w:rPr>
-              <w:t xml:space="preserve">Sentence frame: This source shows ______ because it ______, which reveals ______.</w:t>
+              <w:t xml:space="preserve">In 2–3 sentences: what does this source reveal about this standard, and how do you know? Cite one specific detail from it.</w:t>
             </w:r>
           </w:p>
         </w:tc>
       </w:tr>
     </w:tbl>
+    <w:p>
+      <w:pPr>
+        <w:widowControl w:val="false"/>
+        <w:pBdr>
+          <w:bottom w:val="single" w:color="8892A0" w:sz="8" w:space="1"/>
+        </w:pBdr>
+        <w:spacing w:before="28" w:after="28"/>
+      </w:pPr>
+      <w:r>
+        <w:rPr>
+          <w:sz w:val="16"/>
+          <w:szCs w:val="16"/>
+          <w:rFonts w:ascii="Calibri" w:cs="Calibri" w:eastAsia="Calibri" w:hAnsi="Calibri"/>
+        </w:rPr>
+        <w:t xml:space="preserve"> </w:t>
+      </w:r>
+    </w:p>
+    <w:p>
+      <w:pPr>
+        <w:spacing w:before="0" w:after="0" w:line="50" w:lineRule="exact"/>
+      </w:pPr>
+      <w:r>
+        <w:rPr>
+          <w:sz w:val="2"/>
+          <w:szCs w:val="2"/>
+          <w:rFonts w:ascii="Calibri" w:cs="Calibri" w:eastAsia="Calibri" w:hAnsi="Calibri"/>
+        </w:rPr>
+        <w:t xml:space="preserve"> </w:t>
+      </w:r>
+    </w:p>
+    <w:p>
+      <w:pPr>
+        <w:widowControl w:val="false"/>
+        <w:pBdr>
+          <w:bottom w:val="single" w:color="8892A0" w:sz="8" w:space="1"/>
+        </w:pBdr>
+        <w:spacing w:before="28" w:after="28"/>
+      </w:pPr>
+      <w:r>
+        <w:rPr>
+          <w:sz w:val="16"/>
+          <w:szCs w:val="16"/>
+          <w:rFonts w:ascii="Calibri" w:cs="Calibri" w:eastAsia="Calibri" w:hAnsi="Calibri"/>
+        </w:rPr>
+        <w:t xml:space="preserve"> </w:t>
+      </w:r>
+    </w:p>
+    <w:p>
+      <w:pPr>
+        <w:spacing w:before="0" w:after="0" w:line="50" w:lineRule="exact"/>
+      </w:pPr>
+      <w:r>
+        <w:rPr>
+          <w:sz w:val="2"/>
+          <w:szCs w:val="2"/>
+          <w:rFonts w:ascii="Calibri" w:cs="Calibri" w:eastAsia="Calibri" w:hAnsi="Calibri"/>
+        </w:rPr>
+        <w:t xml:space="preserve"> </w:t>
+      </w:r>
+    </w:p>
+    <w:p>
+      <w:pPr>
+        <w:widowControl w:val="false"/>
+        <w:pBdr>
+          <w:bottom w:val="single" w:color="8892A0" w:sz="8" w:space="1"/>
+        </w:pBdr>
+        <w:spacing w:before="28" w:after="28"/>
+      </w:pPr>
+      <w:r>
+        <w:rPr>
+          <w:sz w:val="16"/>
+          <w:szCs w:val="16"/>
+          <w:rFonts w:ascii="Calibri" w:cs="Calibri" w:eastAsia="Calibri" w:hAnsi="Calibri"/>
+        </w:rPr>
+        <w:t xml:space="preserve"> </w:t>
+      </w:r>
+    </w:p>
+    <w:p>
+      <w:pPr>
+        <w:spacing w:before="0" w:after="0" w:line="50" w:lineRule="exact"/>
+      </w:pPr>
+      <w:r>
+        <w:rPr>
+          <w:sz w:val="2"/>
+          <w:szCs w:val="2"/>
+          <w:rFonts w:ascii="Calibri" w:cs="Calibri" w:eastAsia="Calibri" w:hAnsi="Calibri"/>
+        </w:rPr>
+        <w:t xml:space="preserve"> </w:t>
+      </w:r>
+    </w:p>
+    <w:p>
+      <w:pPr>
+        <w:widowControl w:val="false"/>
+        <w:pBdr>
+          <w:bottom w:val="single" w:color="8892A0" w:sz="8" w:space="1"/>
+        </w:pBdr>
+        <w:spacing w:before="28" w:after="28"/>
+      </w:pPr>
+      <w:r>
+        <w:rPr>
+          <w:sz w:val="16"/>
+          <w:szCs w:val="16"/>
+          <w:rFonts w:ascii="Calibri" w:cs="Calibri" w:eastAsia="Calibri" w:hAnsi="Calibri"/>
+        </w:rPr>
+        <w:t xml:space="preserve"> </w:t>
+      </w:r>
+    </w:p>
+    <w:p>
+      <w:pPr>
+        <w:spacing w:before="0" w:after="0" w:line="50" w:lineRule="exact"/>
+      </w:pPr>
+      <w:r>
+        <w:rPr>
+          <w:sz w:val="2"/>
+          <w:szCs w:val="2"/>
+          <w:rFonts w:ascii="Calibri" w:cs="Calibri" w:eastAsia="Calibri" w:hAnsi="Calibri"/>
+        </w:rPr>
+        <w:t xml:space="preserve"> </w:t>
+      </w:r>
+    </w:p>
+    <w:p>
+      <w:pPr>
+        <w:widowControl w:val="false"/>
+        <w:pBdr>
+          <w:bottom w:val="single" w:color="8892A0" w:sz="8" w:space="1"/>
+        </w:pBdr>
+        <w:spacing w:before="28" w:after="28"/>
+      </w:pPr>
+      <w:r>
+        <w:rPr>
+          <w:sz w:val="16"/>
+          <w:szCs w:val="16"/>
+          <w:rFonts w:ascii="Calibri" w:cs="Calibri" w:eastAsia="Calibri" w:hAnsi="Calibri"/>
+        </w:rPr>
+        <w:t xml:space="preserve"> </w:t>
+      </w:r>
+    </w:p>
     <w:tbl>
       <w:tblPr>
         <w:tblW w:type="dxa" w:w="9792"/>
@@ -41078,7 +43762,7 @@
                 <w:caps w:val="false"/>
                 <w:rFonts w:ascii="Calibri" w:cs="Calibri" w:eastAsia="Calibri" w:hAnsi="Calibri"/>
               </w:rPr>
-              <w:t xml:space="preserve">SOURCE SYNTHESIS — put it together (SSP.03)</w:t>
+              <w:t xml:space="preserve">THINK LIKE A HISTORIAN — corroborate or challenge (SSP.03)</w:t>
             </w:r>
           </w:p>
           <w:p>
@@ -41097,12 +43781,283 @@
                 <w:caps w:val="false"/>
                 <w:rFonts w:ascii="Calibri" w:cs="Calibri" w:eastAsia="Calibri" w:hAnsi="Calibri"/>
               </w:rPr>
-              <w:t xml:space="preserve">In 2–3 sentences: what does this source reveal about this standard, and how do you know? Cite one specific detail from it.</w:t>
+              <w:t xml:space="preserve">Name ONE other source that could CONFIRM this one, and ONE way it could COMPLICATE or CHALLENGE it — or, whose voice is missing here?</w:t>
             </w:r>
           </w:p>
         </w:tc>
       </w:tr>
     </w:tbl>
+    <w:p>
+      <w:pPr>
+        <w:widowControl w:val="false"/>
+        <w:pBdr>
+          <w:bottom w:val="single" w:color="8892A0" w:sz="8" w:space="1"/>
+        </w:pBdr>
+        <w:spacing w:before="28" w:after="28"/>
+      </w:pPr>
+      <w:r>
+        <w:rPr>
+          <w:sz w:val="16"/>
+          <w:szCs w:val="16"/>
+          <w:rFonts w:ascii="Calibri" w:cs="Calibri" w:eastAsia="Calibri" w:hAnsi="Calibri"/>
+        </w:rPr>
+        <w:t xml:space="preserve"> </w:t>
+      </w:r>
+    </w:p>
+    <w:p>
+      <w:pPr>
+        <w:spacing w:before="0" w:after="0" w:line="50" w:lineRule="exact"/>
+      </w:pPr>
+      <w:r>
+        <w:rPr>
+          <w:sz w:val="2"/>
+          <w:szCs w:val="2"/>
+          <w:rFonts w:ascii="Calibri" w:cs="Calibri" w:eastAsia="Calibri" w:hAnsi="Calibri"/>
+        </w:rPr>
+        <w:t xml:space="preserve"> </w:t>
+      </w:r>
+    </w:p>
+    <w:p>
+      <w:pPr>
+        <w:widowControl w:val="false"/>
+        <w:pBdr>
+          <w:bottom w:val="single" w:color="8892A0" w:sz="8" w:space="1"/>
+        </w:pBdr>
+        <w:spacing w:before="28" w:after="28"/>
+      </w:pPr>
+      <w:r>
+        <w:rPr>
+          <w:sz w:val="16"/>
+          <w:szCs w:val="16"/>
+          <w:rFonts w:ascii="Calibri" w:cs="Calibri" w:eastAsia="Calibri" w:hAnsi="Calibri"/>
+        </w:rPr>
+        <w:t xml:space="preserve"> </w:t>
+      </w:r>
+    </w:p>
+    <w:p>
+      <w:pPr>
+        <w:spacing w:before="0" w:after="0" w:line="50" w:lineRule="exact"/>
+      </w:pPr>
+      <w:r>
+        <w:rPr>
+          <w:sz w:val="2"/>
+          <w:szCs w:val="2"/>
+          <w:rFonts w:ascii="Calibri" w:cs="Calibri" w:eastAsia="Calibri" w:hAnsi="Calibri"/>
+        </w:rPr>
+        <w:t xml:space="preserve"> </w:t>
+      </w:r>
+    </w:p>
+    <w:p>
+      <w:pPr>
+        <w:widowControl w:val="false"/>
+        <w:pBdr>
+          <w:bottom w:val="single" w:color="8892A0" w:sz="8" w:space="1"/>
+        </w:pBdr>
+        <w:spacing w:before="28" w:after="28"/>
+      </w:pPr>
+      <w:r>
+        <w:rPr>
+          <w:sz w:val="16"/>
+          <w:szCs w:val="16"/>
+          <w:rFonts w:ascii="Calibri" w:cs="Calibri" w:eastAsia="Calibri" w:hAnsi="Calibri"/>
+        </w:rPr>
+        <w:t xml:space="preserve"> </w:t>
+      </w:r>
+    </w:p>
+    <w:p>
+      <w:pPr>
+        <w:spacing w:before="0" w:after="0" w:line="50" w:lineRule="exact"/>
+      </w:pPr>
+      <w:r>
+        <w:rPr>
+          <w:sz w:val="2"/>
+          <w:szCs w:val="2"/>
+          <w:rFonts w:ascii="Calibri" w:cs="Calibri" w:eastAsia="Calibri" w:hAnsi="Calibri"/>
+        </w:rPr>
+        <w:t xml:space="preserve"> </w:t>
+      </w:r>
+    </w:p>
+    <w:p>
+      <w:pPr>
+        <w:widowControl w:val="false"/>
+        <w:pBdr>
+          <w:bottom w:val="single" w:color="8892A0" w:sz="8" w:space="1"/>
+        </w:pBdr>
+        <w:spacing w:before="28" w:after="28"/>
+      </w:pPr>
+      <w:r>
+        <w:rPr>
+          <w:sz w:val="16"/>
+          <w:szCs w:val="16"/>
+          <w:rFonts w:ascii="Calibri" w:cs="Calibri" w:eastAsia="Calibri" w:hAnsi="Calibri"/>
+        </w:rPr>
+        <w:t xml:space="preserve"> </w:t>
+      </w:r>
+    </w:p>
+    <w:p>
+      <w:pPr>
+        <w:spacing w:before="0" w:after="0" w:line="50" w:lineRule="exact"/>
+      </w:pPr>
+      <w:r>
+        <w:rPr>
+          <w:sz w:val="2"/>
+          <w:szCs w:val="2"/>
+          <w:rFonts w:ascii="Calibri" w:cs="Calibri" w:eastAsia="Calibri" w:hAnsi="Calibri"/>
+        </w:rPr>
+        <w:t xml:space="preserve"> </w:t>
+      </w:r>
+    </w:p>
+    <w:p>
+      <w:pPr>
+        <w:widowControl w:val="false"/>
+        <w:pBdr>
+          <w:bottom w:val="single" w:color="8892A0" w:sz="8" w:space="1"/>
+        </w:pBdr>
+        <w:spacing w:before="28" w:after="28"/>
+      </w:pPr>
+      <w:r>
+        <w:rPr>
+          <w:sz w:val="16"/>
+          <w:szCs w:val="16"/>
+          <w:rFonts w:ascii="Calibri" w:cs="Calibri" w:eastAsia="Calibri" w:hAnsi="Calibri"/>
+        </w:rPr>
+        <w:t xml:space="preserve"> </w:t>
+      </w:r>
+    </w:p>
+    <w:tbl>
+      <w:tblPr>
+        <w:tblW w:type="dxa" w:w="9792"/>
+        <w:tblBorders>
+          <w:top w:val="single" w:color="auto" w:sz="4"/>
+          <w:left w:val="single" w:color="auto" w:sz="4"/>
+          <w:bottom w:val="single" w:color="auto" w:sz="4"/>
+          <w:right w:val="single" w:color="auto" w:sz="4"/>
+          <w:insideH w:val="single" w:color="auto" w:sz="4"/>
+          <w:insideV w:val="single" w:color="auto" w:sz="4"/>
+        </w:tblBorders>
+      </w:tblPr>
+      <w:tblGrid>
+        <w:gridCol w:w="9792"/>
+      </w:tblGrid>
+      <w:tr>
+        <w:tc>
+          <w:tcPr>
+            <w:tcW w:type="dxa" w:w="9792"/>
+            <w:tcBorders>
+              <w:top w:val="single" w:color="D9D5C8" w:sz="4"/>
+              <w:left w:val="single" w:color="D9D5C8" w:sz="4"/>
+              <w:bottom w:val="single" w:color="D9D5C8" w:sz="4"/>
+              <w:right w:val="single" w:color="D9D5C8" w:sz="4"/>
+            </w:tcBorders>
+            <w:shd w:fill="F7F5EF" w:color="auto" w:val="clear"/>
+            <w:tcMar>
+              <w:top w:type="dxa" w:w="55"/>
+              <w:left w:type="dxa" w:w="110"/>
+              <w:bottom w:type="dxa" w:w="55"/>
+              <w:right w:type="dxa" w:w="110"/>
+            </w:tcMar>
+          </w:tcPr>
+          <w:p>
+            <w:pPr>
+              <w:spacing w:after="60"/>
+            </w:pPr>
+            <w:r>
+              <w:rPr>
+                <w:b/>
+                <w:bCs/>
+                <w:i w:val="false"/>
+                <w:iCs w:val="false"/>
+                <w:color w:val="1B2A4A"/>
+                <w:sz w:val="21"/>
+                <w:szCs w:val="21"/>
+                <w:caps w:val="false"/>
+                <w:rFonts w:ascii="Calibri" w:cs="Calibri" w:eastAsia="Calibri" w:hAnsi="Calibri"/>
+              </w:rPr>
+              <w:t xml:space="preserve">SO WHAT? — why this source still matters today</w:t>
+            </w:r>
+          </w:p>
+          <w:p>
+            <w:pPr>
+              <w:spacing w:after="40"/>
+            </w:pPr>
+            <w:r>
+              <w:rPr>
+                <w:b w:val="false"/>
+                <w:bCs w:val="false"/>
+                <w:i w:val="false"/>
+                <w:iCs w:val="false"/>
+                <w:color w:val="1A1A1A"/>
+                <w:sz w:val="22"/>
+                <w:szCs w:val="22"/>
+                <w:caps w:val="false"/>
+                <w:rFonts w:ascii="Calibri" w:cs="Calibri" w:eastAsia="Calibri" w:hAnsi="Calibri"/>
+              </w:rPr>
+              <w:t xml:space="preserve">In 1–2 sentences: why does this source still matter for understanding government today?</w:t>
+            </w:r>
+          </w:p>
+        </w:tc>
+      </w:tr>
+    </w:tbl>
+    <w:p>
+      <w:pPr>
+        <w:widowControl w:val="false"/>
+        <w:pBdr>
+          <w:bottom w:val="single" w:color="8892A0" w:sz="8" w:space="1"/>
+        </w:pBdr>
+        <w:spacing w:before="28" w:after="28"/>
+      </w:pPr>
+      <w:r>
+        <w:rPr>
+          <w:sz w:val="16"/>
+          <w:szCs w:val="16"/>
+          <w:rFonts w:ascii="Calibri" w:cs="Calibri" w:eastAsia="Calibri" w:hAnsi="Calibri"/>
+        </w:rPr>
+        <w:t xml:space="preserve"> </w:t>
+      </w:r>
+    </w:p>
+    <w:p>
+      <w:pPr>
+        <w:spacing w:before="0" w:after="0" w:line="50" w:lineRule="exact"/>
+      </w:pPr>
+      <w:r>
+        <w:rPr>
+          <w:sz w:val="2"/>
+          <w:szCs w:val="2"/>
+          <w:rFonts w:ascii="Calibri" w:cs="Calibri" w:eastAsia="Calibri" w:hAnsi="Calibri"/>
+        </w:rPr>
+        <w:t xml:space="preserve"> </w:t>
+      </w:r>
+    </w:p>
+    <w:p>
+      <w:pPr>
+        <w:widowControl w:val="false"/>
+        <w:pBdr>
+          <w:bottom w:val="single" w:color="8892A0" w:sz="8" w:space="1"/>
+        </w:pBdr>
+        <w:spacing w:before="28" w:after="28"/>
+      </w:pPr>
+      <w:r>
+        <w:rPr>
+          <w:sz w:val="16"/>
+          <w:szCs w:val="16"/>
+          <w:rFonts w:ascii="Calibri" w:cs="Calibri" w:eastAsia="Calibri" w:hAnsi="Calibri"/>
+        </w:rPr>
+        <w:t xml:space="preserve"> </w:t>
+      </w:r>
+    </w:p>
+    <w:p>
+      <w:pPr>
+        <w:spacing w:before="0" w:after="0" w:line="50" w:lineRule="exact"/>
+      </w:pPr>
+      <w:r>
+        <w:rPr>
+          <w:sz w:val="2"/>
+          <w:szCs w:val="2"/>
+          <w:rFonts w:ascii="Calibri" w:cs="Calibri" w:eastAsia="Calibri" w:hAnsi="Calibri"/>
+        </w:rPr>
+        <w:t xml:space="preserve"> </w:t>
+      </w:r>
+    </w:p>
     <w:p>
       <w:pPr>
         <w:widowControl w:val="false"/>

</xml_diff>

<commit_message>
Activity 6: separate DOK-3 how-to from the write boxes and expand them
Split the 'How to write a DOK-3 question (supports)' from the student's writing space, and
replace the small side-by-side table with two full-width expanded boxes: 'Now write your DOK-3
question here' (5 lines) and 'Your answer key' (4 lines) — separates guidance from the task and
fills the blank space. Brand-lock intact. Rebuilt all + large-print.

Co-Authored-By: Claude Opus 4.8 <noreply@anthropic.com>
Claude-Session: https://claude.ai/code/session_01DHdLjiiJeW6A83FcYRQ3qv
</commit_message>
<xml_diff>
--- a/courses/foundations-constitutional-government/BUILD/unit4/deliverables/Unit4_Student_Workbook_CourseStandard.docx
+++ b/courses/foundations-constitutional-government/BUILD/unit4/deliverables/Unit4_Student_Workbook_CourseStandard.docx
@@ -16362,6 +16362,24 @@
         </w:tc>
       </w:tr>
     </w:tbl>
+    <w:p>
+      <w:pPr>
+        <w:spacing w:after="120"/>
+      </w:pPr>
+      <w:r>
+        <w:rPr>
+          <w:b w:val="false"/>
+          <w:bCs w:val="false"/>
+          <w:i w:val="false"/>
+          <w:iCs w:val="false"/>
+          <w:color w:val="1A1A1A"/>
+          <w:sz w:val="12"/>
+          <w:szCs w:val="12"/>
+          <w:caps w:val="false"/>
+          <w:rFonts w:ascii="Calibri" w:cs="Calibri" w:eastAsia="Calibri" w:hAnsi="Calibri"/>
+        </w:rPr>
+      </w:r>
+    </w:p>
     <w:tbl>
       <w:tblPr>
         <w:tblW w:type="dxa" w:w="9792"/>
@@ -16375,16 +16393,12 @@
         </w:tblBorders>
       </w:tblPr>
       <w:tblGrid>
-        <w:gridCol w:w="4896"/>
-        <w:gridCol w:w="4896"/>
+        <w:gridCol w:w="9792"/>
       </w:tblGrid>
       <w:tr>
-        <w:trPr>
-          <w:tblHeader/>
-        </w:trPr>
-        <w:tc>
-          <w:tcPr>
-            <w:tcW w:type="dxa" w:w="4896"/>
+        <w:tc>
+          <w:tcPr>
+            <w:tcW w:type="dxa" w:w="9792"/>
             <w:tcBorders>
               <w:top w:val="single" w:color="D9D5C8" w:sz="4"/>
               <w:left w:val="single" w:color="D9D5C8" w:sz="4"/>
@@ -16410,49 +16424,12 @@
                 <w:i w:val="false"/>
                 <w:iCs w:val="false"/>
                 <w:color w:val="1B2A4A"/>
-                <w:sz w:val="18"/>
-                <w:szCs w:val="18"/>
-                <w:caps w:val="false"/>
-                <w:rFonts w:ascii="Calibri" w:cs="Calibri" w:eastAsia="Calibri" w:hAnsi="Calibri"/>
-              </w:rPr>
-              <w:t xml:space="preserve">Your DOK-3 question</w:t>
-            </w:r>
-          </w:p>
-        </w:tc>
-        <w:tc>
-          <w:tcPr>
-            <w:tcW w:type="dxa" w:w="4896"/>
-            <w:tcBorders>
-              <w:top w:val="single" w:color="D9D5C8" w:sz="4"/>
-              <w:left w:val="single" w:color="D9D5C8" w:sz="4"/>
-              <w:bottom w:val="single" w:color="D9D5C8" w:sz="4"/>
-              <w:right w:val="single" w:color="D9D5C8" w:sz="4"/>
-            </w:tcBorders>
-            <w:shd w:fill="1B2A4A" w:color="auto" w:val="clear"/>
-            <w:tcMar>
-              <w:top w:type="dxa" w:w="55"/>
-              <w:left w:type="dxa" w:w="110"/>
-              <w:bottom w:type="dxa" w:w="55"/>
-              <w:right w:type="dxa" w:w="110"/>
-            </w:tcMar>
-          </w:tcPr>
-          <w:p>
-            <w:pPr>
-              <w:spacing w:after="0"/>
-            </w:pPr>
-            <w:r>
-              <w:rPr>
-                <w:b/>
-                <w:bCs/>
-                <w:i w:val="false"/>
-                <w:iCs w:val="false"/>
-                <w:color w:val="FFFFFF"/>
-                <w:sz w:val="18"/>
-                <w:szCs w:val="18"/>
-                <w:caps w:val="false"/>
-                <w:rFonts w:ascii="Calibri" w:cs="Calibri" w:eastAsia="Calibri" w:hAnsi="Calibri"/>
-              </w:rPr>
-              <w:t xml:space="preserve">Your answer key (one sentence)</w:t>
+                <w:sz w:val="21"/>
+                <w:szCs w:val="21"/>
+                <w:caps w:val="false"/>
+                <w:rFonts w:ascii="Calibri" w:cs="Calibri" w:eastAsia="Calibri" w:hAnsi="Calibri"/>
+              </w:rPr>
+              <w:t xml:space="preserve">NOW WRITE YOUR DOK-3 QUESTION HERE</w:t>
             </w:r>
           </w:p>
         </w:tc>
@@ -16460,7 +16437,7 @@
       <w:tr>
         <w:tc>
           <w:tcPr>
-            <w:tcW w:type="dxa" w:w="4896"/>
+            <w:tcW w:type="dxa" w:w="9792"/>
             <w:tcBorders>
               <w:top w:val="single" w:color="D9D5C8" w:sz="4"/>
               <w:left w:val="single" w:color="D9D5C8" w:sz="4"/>
@@ -16551,23 +16528,19 @@
               <w:t xml:space="preserve"> </w:t>
             </w:r>
           </w:p>
-        </w:tc>
-        <w:tc>
-          <w:tcPr>
-            <w:tcW w:type="dxa" w:w="4896"/>
-            <w:tcBorders>
-              <w:top w:val="single" w:color="D9D5C8" w:sz="4"/>
-              <w:left w:val="single" w:color="D9D5C8" w:sz="4"/>
-              <w:bottom w:val="single" w:color="D9D5C8" w:sz="4"/>
-              <w:right w:val="single" w:color="D9D5C8" w:sz="4"/>
-            </w:tcBorders>
-            <w:tcMar>
-              <w:top w:type="dxa" w:w="55"/>
-              <w:left w:type="dxa" w:w="110"/>
-              <w:bottom w:type="dxa" w:w="55"/>
-              <w:right w:type="dxa" w:w="110"/>
-            </w:tcMar>
-          </w:tcPr>
+          <w:p>
+            <w:pPr>
+              <w:spacing w:before="0" w:after="0" w:line="50" w:lineRule="exact"/>
+            </w:pPr>
+            <w:r>
+              <w:rPr>
+                <w:sz w:val="2"/>
+                <w:szCs w:val="2"/>
+                <w:rFonts w:ascii="Calibri" w:cs="Calibri" w:eastAsia="Calibri" w:hAnsi="Calibri"/>
+              </w:rPr>
+              <w:t xml:space="preserve"> </w:t>
+            </w:r>
+          </w:p>
           <w:p>
             <w:pPr>
               <w:widowControl w:val="false"/>
@@ -16615,19 +16588,80 @@
               <w:t xml:space="preserve"> </w:t>
             </w:r>
           </w:p>
-          <w:p>
-            <w:pPr>
-              <w:spacing w:before="0" w:after="0" w:line="50" w:lineRule="exact"/>
-            </w:pPr>
-            <w:r>
-              <w:rPr>
-                <w:sz w:val="2"/>
-                <w:szCs w:val="2"/>
-                <w:rFonts w:ascii="Calibri" w:cs="Calibri" w:eastAsia="Calibri" w:hAnsi="Calibri"/>
-              </w:rPr>
-              <w:t xml:space="preserve"> </w:t>
-            </w:r>
-          </w:p>
+        </w:tc>
+      </w:tr>
+    </w:tbl>
+    <w:tbl>
+      <w:tblPr>
+        <w:tblW w:type="dxa" w:w="9792"/>
+        <w:tblBorders>
+          <w:top w:val="single" w:color="auto" w:sz="4"/>
+          <w:left w:val="single" w:color="auto" w:sz="4"/>
+          <w:bottom w:val="single" w:color="auto" w:sz="4"/>
+          <w:right w:val="single" w:color="auto" w:sz="4"/>
+          <w:insideH w:val="single" w:color="auto" w:sz="4"/>
+          <w:insideV w:val="single" w:color="auto" w:sz="4"/>
+        </w:tblBorders>
+      </w:tblPr>
+      <w:tblGrid>
+        <w:gridCol w:w="9792"/>
+      </w:tblGrid>
+      <w:tr>
+        <w:tc>
+          <w:tcPr>
+            <w:tcW w:type="dxa" w:w="9792"/>
+            <w:tcBorders>
+              <w:top w:val="single" w:color="D9D5C8" w:sz="4"/>
+              <w:left w:val="single" w:color="D9D5C8" w:sz="4"/>
+              <w:bottom w:val="single" w:color="D9D5C8" w:sz="4"/>
+              <w:right w:val="single" w:color="D9D5C8" w:sz="4"/>
+            </w:tcBorders>
+            <w:shd w:fill="F7F5EF" w:color="auto" w:val="clear"/>
+            <w:tcMar>
+              <w:top w:type="dxa" w:w="55"/>
+              <w:left w:type="dxa" w:w="110"/>
+              <w:bottom w:type="dxa" w:w="55"/>
+              <w:right w:type="dxa" w:w="110"/>
+            </w:tcMar>
+          </w:tcPr>
+          <w:p>
+            <w:pPr>
+              <w:spacing w:after="0"/>
+            </w:pPr>
+            <w:r>
+              <w:rPr>
+                <w:b/>
+                <w:bCs/>
+                <w:i w:val="false"/>
+                <w:iCs w:val="false"/>
+                <w:color w:val="1B2A4A"/>
+                <w:sz w:val="21"/>
+                <w:szCs w:val="21"/>
+                <w:caps w:val="false"/>
+                <w:rFonts w:ascii="Calibri" w:cs="Calibri" w:eastAsia="Calibri" w:hAnsi="Calibri"/>
+              </w:rPr>
+              <w:t xml:space="preserve">YOUR ANSWER KEY — one clear, defensible sentence</w:t>
+            </w:r>
+          </w:p>
+        </w:tc>
+      </w:tr>
+      <w:tr>
+        <w:tc>
+          <w:tcPr>
+            <w:tcW w:type="dxa" w:w="9792"/>
+            <w:tcBorders>
+              <w:top w:val="single" w:color="D9D5C8" w:sz="4"/>
+              <w:left w:val="single" w:color="D9D5C8" w:sz="4"/>
+              <w:bottom w:val="single" w:color="D9D5C8" w:sz="4"/>
+              <w:right w:val="single" w:color="D9D5C8" w:sz="4"/>
+            </w:tcBorders>
+            <w:tcMar>
+              <w:top w:type="dxa" w:w="55"/>
+              <w:left w:type="dxa" w:w="110"/>
+              <w:bottom w:type="dxa" w:w="55"/>
+              <w:right w:type="dxa" w:w="110"/>
+            </w:tcMar>
+          </w:tcPr>
           <w:p>
             <w:pPr>
               <w:widowControl w:val="false"/>
@@ -16645,42 +16679,6 @@
               <w:t xml:space="preserve"> </w:t>
             </w:r>
           </w:p>
-        </w:tc>
-      </w:tr>
-      <w:tr>
-        <w:tc>
-          <w:tcPr>
-            <w:tcW w:type="dxa" w:w="4896"/>
-            <w:tcBorders>
-              <w:top w:val="single" w:color="D9D5C8" w:sz="4"/>
-              <w:left w:val="single" w:color="D9D5C8" w:sz="4"/>
-              <w:bottom w:val="single" w:color="D9D5C8" w:sz="4"/>
-              <w:right w:val="single" w:color="D9D5C8" w:sz="4"/>
-            </w:tcBorders>
-            <w:tcMar>
-              <w:top w:type="dxa" w:w="55"/>
-              <w:left w:type="dxa" w:w="110"/>
-              <w:bottom w:type="dxa" w:w="55"/>
-              <w:right w:type="dxa" w:w="110"/>
-            </w:tcMar>
-          </w:tcPr>
-          <w:p>
-            <w:pPr>
-              <w:widowControl w:val="false"/>
-              <w:pBdr>
-                <w:bottom w:val="single" w:color="8892A0" w:sz="8" w:space="1"/>
-              </w:pBdr>
-              <w:spacing w:before="28" w:after="28"/>
-            </w:pPr>
-            <w:r>
-              <w:rPr>
-                <w:sz w:val="16"/>
-                <w:szCs w:val="16"/>
-                <w:rFonts w:ascii="Calibri" w:cs="Calibri" w:eastAsia="Calibri" w:hAnsi="Calibri"/>
-              </w:rPr>
-              <w:t xml:space="preserve"> </w:t>
-            </w:r>
-          </w:p>
           <w:p>
             <w:pPr>
               <w:spacing w:before="0" w:after="0" w:line="50" w:lineRule="exact"/>
@@ -16694,70 +16692,6 @@
               <w:t xml:space="preserve"> </w:t>
             </w:r>
           </w:p>
-          <w:p>
-            <w:pPr>
-              <w:widowControl w:val="false"/>
-              <w:pBdr>
-                <w:bottom w:val="single" w:color="8892A0" w:sz="8" w:space="1"/>
-              </w:pBdr>
-              <w:spacing w:before="28" w:after="28"/>
-            </w:pPr>
-            <w:r>
-              <w:rPr>
-                <w:sz w:val="16"/>
-                <w:szCs w:val="16"/>
-                <w:rFonts w:ascii="Calibri" w:cs="Calibri" w:eastAsia="Calibri" w:hAnsi="Calibri"/>
-              </w:rPr>
-              <w:t xml:space="preserve"> </w:t>
-            </w:r>
-          </w:p>
-          <w:p>
-            <w:pPr>
-              <w:spacing w:before="0" w:after="0" w:line="50" w:lineRule="exact"/>
-            </w:pPr>
-            <w:r>
-              <w:rPr>
-                <w:sz w:val="2"/>
-                <w:szCs w:val="2"/>
-                <w:rFonts w:ascii="Calibri" w:cs="Calibri" w:eastAsia="Calibri" w:hAnsi="Calibri"/>
-              </w:rPr>
-              <w:t xml:space="preserve"> </w:t>
-            </w:r>
-          </w:p>
-          <w:p>
-            <w:pPr>
-              <w:widowControl w:val="false"/>
-              <w:pBdr>
-                <w:bottom w:val="single" w:color="8892A0" w:sz="8" w:space="1"/>
-              </w:pBdr>
-              <w:spacing w:before="28" w:after="28"/>
-            </w:pPr>
-            <w:r>
-              <w:rPr>
-                <w:sz w:val="16"/>
-                <w:szCs w:val="16"/>
-                <w:rFonts w:ascii="Calibri" w:cs="Calibri" w:eastAsia="Calibri" w:hAnsi="Calibri"/>
-              </w:rPr>
-              <w:t xml:space="preserve"> </w:t>
-            </w:r>
-          </w:p>
-        </w:tc>
-        <w:tc>
-          <w:tcPr>
-            <w:tcW w:type="dxa" w:w="4896"/>
-            <w:tcBorders>
-              <w:top w:val="single" w:color="D9D5C8" w:sz="4"/>
-              <w:left w:val="single" w:color="D9D5C8" w:sz="4"/>
-              <w:bottom w:val="single" w:color="D9D5C8" w:sz="4"/>
-              <w:right w:val="single" w:color="D9D5C8" w:sz="4"/>
-            </w:tcBorders>
-            <w:tcMar>
-              <w:top w:type="dxa" w:w="55"/>
-              <w:left w:type="dxa" w:w="110"/>
-              <w:bottom w:type="dxa" w:w="55"/>
-              <w:right w:type="dxa" w:w="110"/>
-            </w:tcMar>
-          </w:tcPr>
           <w:p>
             <w:pPr>
               <w:widowControl w:val="false"/>
@@ -30555,6 +30489,24 @@
         </w:tc>
       </w:tr>
     </w:tbl>
+    <w:p>
+      <w:pPr>
+        <w:spacing w:after="120"/>
+      </w:pPr>
+      <w:r>
+        <w:rPr>
+          <w:b w:val="false"/>
+          <w:bCs w:val="false"/>
+          <w:i w:val="false"/>
+          <w:iCs w:val="false"/>
+          <w:color w:val="1A1A1A"/>
+          <w:sz w:val="12"/>
+          <w:szCs w:val="12"/>
+          <w:caps w:val="false"/>
+          <w:rFonts w:ascii="Calibri" w:cs="Calibri" w:eastAsia="Calibri" w:hAnsi="Calibri"/>
+        </w:rPr>
+      </w:r>
+    </w:p>
     <w:tbl>
       <w:tblPr>
         <w:tblW w:type="dxa" w:w="9792"/>
@@ -30568,16 +30520,12 @@
         </w:tblBorders>
       </w:tblPr>
       <w:tblGrid>
-        <w:gridCol w:w="4896"/>
-        <w:gridCol w:w="4896"/>
+        <w:gridCol w:w="9792"/>
       </w:tblGrid>
       <w:tr>
-        <w:trPr>
-          <w:tblHeader/>
-        </w:trPr>
-        <w:tc>
-          <w:tcPr>
-            <w:tcW w:type="dxa" w:w="4896"/>
+        <w:tc>
+          <w:tcPr>
+            <w:tcW w:type="dxa" w:w="9792"/>
             <w:tcBorders>
               <w:top w:val="single" w:color="D9D5C8" w:sz="4"/>
               <w:left w:val="single" w:color="D9D5C8" w:sz="4"/>
@@ -30603,49 +30551,12 @@
                 <w:i w:val="false"/>
                 <w:iCs w:val="false"/>
                 <w:color w:val="1B2A4A"/>
-                <w:sz w:val="18"/>
-                <w:szCs w:val="18"/>
-                <w:caps w:val="false"/>
-                <w:rFonts w:ascii="Calibri" w:cs="Calibri" w:eastAsia="Calibri" w:hAnsi="Calibri"/>
-              </w:rPr>
-              <w:t xml:space="preserve">Your DOK-3 question</w:t>
-            </w:r>
-          </w:p>
-        </w:tc>
-        <w:tc>
-          <w:tcPr>
-            <w:tcW w:type="dxa" w:w="4896"/>
-            <w:tcBorders>
-              <w:top w:val="single" w:color="D9D5C8" w:sz="4"/>
-              <w:left w:val="single" w:color="D9D5C8" w:sz="4"/>
-              <w:bottom w:val="single" w:color="D9D5C8" w:sz="4"/>
-              <w:right w:val="single" w:color="D9D5C8" w:sz="4"/>
-            </w:tcBorders>
-            <w:shd w:fill="1B2A4A" w:color="auto" w:val="clear"/>
-            <w:tcMar>
-              <w:top w:type="dxa" w:w="55"/>
-              <w:left w:type="dxa" w:w="110"/>
-              <w:bottom w:type="dxa" w:w="55"/>
-              <w:right w:type="dxa" w:w="110"/>
-            </w:tcMar>
-          </w:tcPr>
-          <w:p>
-            <w:pPr>
-              <w:spacing w:after="0"/>
-            </w:pPr>
-            <w:r>
-              <w:rPr>
-                <w:b/>
-                <w:bCs/>
-                <w:i w:val="false"/>
-                <w:iCs w:val="false"/>
-                <w:color w:val="FFFFFF"/>
-                <w:sz w:val="18"/>
-                <w:szCs w:val="18"/>
-                <w:caps w:val="false"/>
-                <w:rFonts w:ascii="Calibri" w:cs="Calibri" w:eastAsia="Calibri" w:hAnsi="Calibri"/>
-              </w:rPr>
-              <w:t xml:space="preserve">Your answer key (one sentence)</w:t>
+                <w:sz w:val="21"/>
+                <w:szCs w:val="21"/>
+                <w:caps w:val="false"/>
+                <w:rFonts w:ascii="Calibri" w:cs="Calibri" w:eastAsia="Calibri" w:hAnsi="Calibri"/>
+              </w:rPr>
+              <w:t xml:space="preserve">NOW WRITE YOUR DOK-3 QUESTION HERE</w:t>
             </w:r>
           </w:p>
         </w:tc>
@@ -30653,7 +30564,7 @@
       <w:tr>
         <w:tc>
           <w:tcPr>
-            <w:tcW w:type="dxa" w:w="4896"/>
+            <w:tcW w:type="dxa" w:w="9792"/>
             <w:tcBorders>
               <w:top w:val="single" w:color="D9D5C8" w:sz="4"/>
               <w:left w:val="single" w:color="D9D5C8" w:sz="4"/>
@@ -30744,23 +30655,19 @@
               <w:t xml:space="preserve"> </w:t>
             </w:r>
           </w:p>
-        </w:tc>
-        <w:tc>
-          <w:tcPr>
-            <w:tcW w:type="dxa" w:w="4896"/>
-            <w:tcBorders>
-              <w:top w:val="single" w:color="D9D5C8" w:sz="4"/>
-              <w:left w:val="single" w:color="D9D5C8" w:sz="4"/>
-              <w:bottom w:val="single" w:color="D9D5C8" w:sz="4"/>
-              <w:right w:val="single" w:color="D9D5C8" w:sz="4"/>
-            </w:tcBorders>
-            <w:tcMar>
-              <w:top w:type="dxa" w:w="55"/>
-              <w:left w:type="dxa" w:w="110"/>
-              <w:bottom w:type="dxa" w:w="55"/>
-              <w:right w:type="dxa" w:w="110"/>
-            </w:tcMar>
-          </w:tcPr>
+          <w:p>
+            <w:pPr>
+              <w:spacing w:before="0" w:after="0" w:line="50" w:lineRule="exact"/>
+            </w:pPr>
+            <w:r>
+              <w:rPr>
+                <w:sz w:val="2"/>
+                <w:szCs w:val="2"/>
+                <w:rFonts w:ascii="Calibri" w:cs="Calibri" w:eastAsia="Calibri" w:hAnsi="Calibri"/>
+              </w:rPr>
+              <w:t xml:space="preserve"> </w:t>
+            </w:r>
+          </w:p>
           <w:p>
             <w:pPr>
               <w:widowControl w:val="false"/>
@@ -30808,19 +30715,80 @@
               <w:t xml:space="preserve"> </w:t>
             </w:r>
           </w:p>
-          <w:p>
-            <w:pPr>
-              <w:spacing w:before="0" w:after="0" w:line="50" w:lineRule="exact"/>
-            </w:pPr>
-            <w:r>
-              <w:rPr>
-                <w:sz w:val="2"/>
-                <w:szCs w:val="2"/>
-                <w:rFonts w:ascii="Calibri" w:cs="Calibri" w:eastAsia="Calibri" w:hAnsi="Calibri"/>
-              </w:rPr>
-              <w:t xml:space="preserve"> </w:t>
-            </w:r>
-          </w:p>
+        </w:tc>
+      </w:tr>
+    </w:tbl>
+    <w:tbl>
+      <w:tblPr>
+        <w:tblW w:type="dxa" w:w="9792"/>
+        <w:tblBorders>
+          <w:top w:val="single" w:color="auto" w:sz="4"/>
+          <w:left w:val="single" w:color="auto" w:sz="4"/>
+          <w:bottom w:val="single" w:color="auto" w:sz="4"/>
+          <w:right w:val="single" w:color="auto" w:sz="4"/>
+          <w:insideH w:val="single" w:color="auto" w:sz="4"/>
+          <w:insideV w:val="single" w:color="auto" w:sz="4"/>
+        </w:tblBorders>
+      </w:tblPr>
+      <w:tblGrid>
+        <w:gridCol w:w="9792"/>
+      </w:tblGrid>
+      <w:tr>
+        <w:tc>
+          <w:tcPr>
+            <w:tcW w:type="dxa" w:w="9792"/>
+            <w:tcBorders>
+              <w:top w:val="single" w:color="D9D5C8" w:sz="4"/>
+              <w:left w:val="single" w:color="D9D5C8" w:sz="4"/>
+              <w:bottom w:val="single" w:color="D9D5C8" w:sz="4"/>
+              <w:right w:val="single" w:color="D9D5C8" w:sz="4"/>
+            </w:tcBorders>
+            <w:shd w:fill="F7F5EF" w:color="auto" w:val="clear"/>
+            <w:tcMar>
+              <w:top w:type="dxa" w:w="55"/>
+              <w:left w:type="dxa" w:w="110"/>
+              <w:bottom w:type="dxa" w:w="55"/>
+              <w:right w:type="dxa" w:w="110"/>
+            </w:tcMar>
+          </w:tcPr>
+          <w:p>
+            <w:pPr>
+              <w:spacing w:after="0"/>
+            </w:pPr>
+            <w:r>
+              <w:rPr>
+                <w:b/>
+                <w:bCs/>
+                <w:i w:val="false"/>
+                <w:iCs w:val="false"/>
+                <w:color w:val="1B2A4A"/>
+                <w:sz w:val="21"/>
+                <w:szCs w:val="21"/>
+                <w:caps w:val="false"/>
+                <w:rFonts w:ascii="Calibri" w:cs="Calibri" w:eastAsia="Calibri" w:hAnsi="Calibri"/>
+              </w:rPr>
+              <w:t xml:space="preserve">YOUR ANSWER KEY — one clear, defensible sentence</w:t>
+            </w:r>
+          </w:p>
+        </w:tc>
+      </w:tr>
+      <w:tr>
+        <w:tc>
+          <w:tcPr>
+            <w:tcW w:type="dxa" w:w="9792"/>
+            <w:tcBorders>
+              <w:top w:val="single" w:color="D9D5C8" w:sz="4"/>
+              <w:left w:val="single" w:color="D9D5C8" w:sz="4"/>
+              <w:bottom w:val="single" w:color="D9D5C8" w:sz="4"/>
+              <w:right w:val="single" w:color="D9D5C8" w:sz="4"/>
+            </w:tcBorders>
+            <w:tcMar>
+              <w:top w:type="dxa" w:w="55"/>
+              <w:left w:type="dxa" w:w="110"/>
+              <w:bottom w:type="dxa" w:w="55"/>
+              <w:right w:type="dxa" w:w="110"/>
+            </w:tcMar>
+          </w:tcPr>
           <w:p>
             <w:pPr>
               <w:widowControl w:val="false"/>
@@ -30838,42 +30806,6 @@
               <w:t xml:space="preserve"> </w:t>
             </w:r>
           </w:p>
-        </w:tc>
-      </w:tr>
-      <w:tr>
-        <w:tc>
-          <w:tcPr>
-            <w:tcW w:type="dxa" w:w="4896"/>
-            <w:tcBorders>
-              <w:top w:val="single" w:color="D9D5C8" w:sz="4"/>
-              <w:left w:val="single" w:color="D9D5C8" w:sz="4"/>
-              <w:bottom w:val="single" w:color="D9D5C8" w:sz="4"/>
-              <w:right w:val="single" w:color="D9D5C8" w:sz="4"/>
-            </w:tcBorders>
-            <w:tcMar>
-              <w:top w:type="dxa" w:w="55"/>
-              <w:left w:type="dxa" w:w="110"/>
-              <w:bottom w:type="dxa" w:w="55"/>
-              <w:right w:type="dxa" w:w="110"/>
-            </w:tcMar>
-          </w:tcPr>
-          <w:p>
-            <w:pPr>
-              <w:widowControl w:val="false"/>
-              <w:pBdr>
-                <w:bottom w:val="single" w:color="8892A0" w:sz="8" w:space="1"/>
-              </w:pBdr>
-              <w:spacing w:before="28" w:after="28"/>
-            </w:pPr>
-            <w:r>
-              <w:rPr>
-                <w:sz w:val="16"/>
-                <w:szCs w:val="16"/>
-                <w:rFonts w:ascii="Calibri" w:cs="Calibri" w:eastAsia="Calibri" w:hAnsi="Calibri"/>
-              </w:rPr>
-              <w:t xml:space="preserve"> </w:t>
-            </w:r>
-          </w:p>
           <w:p>
             <w:pPr>
               <w:spacing w:before="0" w:after="0" w:line="50" w:lineRule="exact"/>
@@ -30887,70 +30819,6 @@
               <w:t xml:space="preserve"> </w:t>
             </w:r>
           </w:p>
-          <w:p>
-            <w:pPr>
-              <w:widowControl w:val="false"/>
-              <w:pBdr>
-                <w:bottom w:val="single" w:color="8892A0" w:sz="8" w:space="1"/>
-              </w:pBdr>
-              <w:spacing w:before="28" w:after="28"/>
-            </w:pPr>
-            <w:r>
-              <w:rPr>
-                <w:sz w:val="16"/>
-                <w:szCs w:val="16"/>
-                <w:rFonts w:ascii="Calibri" w:cs="Calibri" w:eastAsia="Calibri" w:hAnsi="Calibri"/>
-              </w:rPr>
-              <w:t xml:space="preserve"> </w:t>
-            </w:r>
-          </w:p>
-          <w:p>
-            <w:pPr>
-              <w:spacing w:before="0" w:after="0" w:line="50" w:lineRule="exact"/>
-            </w:pPr>
-            <w:r>
-              <w:rPr>
-                <w:sz w:val="2"/>
-                <w:szCs w:val="2"/>
-                <w:rFonts w:ascii="Calibri" w:cs="Calibri" w:eastAsia="Calibri" w:hAnsi="Calibri"/>
-              </w:rPr>
-              <w:t xml:space="preserve"> </w:t>
-            </w:r>
-          </w:p>
-          <w:p>
-            <w:pPr>
-              <w:widowControl w:val="false"/>
-              <w:pBdr>
-                <w:bottom w:val="single" w:color="8892A0" w:sz="8" w:space="1"/>
-              </w:pBdr>
-              <w:spacing w:before="28" w:after="28"/>
-            </w:pPr>
-            <w:r>
-              <w:rPr>
-                <w:sz w:val="16"/>
-                <w:szCs w:val="16"/>
-                <w:rFonts w:ascii="Calibri" w:cs="Calibri" w:eastAsia="Calibri" w:hAnsi="Calibri"/>
-              </w:rPr>
-              <w:t xml:space="preserve"> </w:t>
-            </w:r>
-          </w:p>
-        </w:tc>
-        <w:tc>
-          <w:tcPr>
-            <w:tcW w:type="dxa" w:w="4896"/>
-            <w:tcBorders>
-              <w:top w:val="single" w:color="D9D5C8" w:sz="4"/>
-              <w:left w:val="single" w:color="D9D5C8" w:sz="4"/>
-              <w:bottom w:val="single" w:color="D9D5C8" w:sz="4"/>
-              <w:right w:val="single" w:color="D9D5C8" w:sz="4"/>
-            </w:tcBorders>
-            <w:tcMar>
-              <w:top w:type="dxa" w:w="55"/>
-              <w:left w:type="dxa" w:w="110"/>
-              <w:bottom w:type="dxa" w:w="55"/>
-              <w:right w:type="dxa" w:w="110"/>
-            </w:tcMar>
-          </w:tcPr>
           <w:p>
             <w:pPr>
               <w:widowControl w:val="false"/>
@@ -44748,6 +44616,24 @@
         </w:tc>
       </w:tr>
     </w:tbl>
+    <w:p>
+      <w:pPr>
+        <w:spacing w:after="120"/>
+      </w:pPr>
+      <w:r>
+        <w:rPr>
+          <w:b w:val="false"/>
+          <w:bCs w:val="false"/>
+          <w:i w:val="false"/>
+          <w:iCs w:val="false"/>
+          <w:color w:val="1A1A1A"/>
+          <w:sz w:val="12"/>
+          <w:szCs w:val="12"/>
+          <w:caps w:val="false"/>
+          <w:rFonts w:ascii="Calibri" w:cs="Calibri" w:eastAsia="Calibri" w:hAnsi="Calibri"/>
+        </w:rPr>
+      </w:r>
+    </w:p>
     <w:tbl>
       <w:tblPr>
         <w:tblW w:type="dxa" w:w="9792"/>
@@ -44761,16 +44647,12 @@
         </w:tblBorders>
       </w:tblPr>
       <w:tblGrid>
-        <w:gridCol w:w="4896"/>
-        <w:gridCol w:w="4896"/>
+        <w:gridCol w:w="9792"/>
       </w:tblGrid>
       <w:tr>
-        <w:trPr>
-          <w:tblHeader/>
-        </w:trPr>
-        <w:tc>
-          <w:tcPr>
-            <w:tcW w:type="dxa" w:w="4896"/>
+        <w:tc>
+          <w:tcPr>
+            <w:tcW w:type="dxa" w:w="9792"/>
             <w:tcBorders>
               <w:top w:val="single" w:color="D9D5C8" w:sz="4"/>
               <w:left w:val="single" w:color="D9D5C8" w:sz="4"/>
@@ -44796,49 +44678,12 @@
                 <w:i w:val="false"/>
                 <w:iCs w:val="false"/>
                 <w:color w:val="1B2A4A"/>
-                <w:sz w:val="18"/>
-                <w:szCs w:val="18"/>
-                <w:caps w:val="false"/>
-                <w:rFonts w:ascii="Calibri" w:cs="Calibri" w:eastAsia="Calibri" w:hAnsi="Calibri"/>
-              </w:rPr>
-              <w:t xml:space="preserve">Your DOK-3 question</w:t>
-            </w:r>
-          </w:p>
-        </w:tc>
-        <w:tc>
-          <w:tcPr>
-            <w:tcW w:type="dxa" w:w="4896"/>
-            <w:tcBorders>
-              <w:top w:val="single" w:color="D9D5C8" w:sz="4"/>
-              <w:left w:val="single" w:color="D9D5C8" w:sz="4"/>
-              <w:bottom w:val="single" w:color="D9D5C8" w:sz="4"/>
-              <w:right w:val="single" w:color="D9D5C8" w:sz="4"/>
-            </w:tcBorders>
-            <w:shd w:fill="1B2A4A" w:color="auto" w:val="clear"/>
-            <w:tcMar>
-              <w:top w:type="dxa" w:w="55"/>
-              <w:left w:type="dxa" w:w="110"/>
-              <w:bottom w:type="dxa" w:w="55"/>
-              <w:right w:type="dxa" w:w="110"/>
-            </w:tcMar>
-          </w:tcPr>
-          <w:p>
-            <w:pPr>
-              <w:spacing w:after="0"/>
-            </w:pPr>
-            <w:r>
-              <w:rPr>
-                <w:b/>
-                <w:bCs/>
-                <w:i w:val="false"/>
-                <w:iCs w:val="false"/>
-                <w:color w:val="FFFFFF"/>
-                <w:sz w:val="18"/>
-                <w:szCs w:val="18"/>
-                <w:caps w:val="false"/>
-                <w:rFonts w:ascii="Calibri" w:cs="Calibri" w:eastAsia="Calibri" w:hAnsi="Calibri"/>
-              </w:rPr>
-              <w:t xml:space="preserve">Your answer key (one sentence)</w:t>
+                <w:sz w:val="21"/>
+                <w:szCs w:val="21"/>
+                <w:caps w:val="false"/>
+                <w:rFonts w:ascii="Calibri" w:cs="Calibri" w:eastAsia="Calibri" w:hAnsi="Calibri"/>
+              </w:rPr>
+              <w:t xml:space="preserve">NOW WRITE YOUR DOK-3 QUESTION HERE</w:t>
             </w:r>
           </w:p>
         </w:tc>
@@ -44846,7 +44691,7 @@
       <w:tr>
         <w:tc>
           <w:tcPr>
-            <w:tcW w:type="dxa" w:w="4896"/>
+            <w:tcW w:type="dxa" w:w="9792"/>
             <w:tcBorders>
               <w:top w:val="single" w:color="D9D5C8" w:sz="4"/>
               <w:left w:val="single" w:color="D9D5C8" w:sz="4"/>
@@ -44937,23 +44782,19 @@
               <w:t xml:space="preserve"> </w:t>
             </w:r>
           </w:p>
-        </w:tc>
-        <w:tc>
-          <w:tcPr>
-            <w:tcW w:type="dxa" w:w="4896"/>
-            <w:tcBorders>
-              <w:top w:val="single" w:color="D9D5C8" w:sz="4"/>
-              <w:left w:val="single" w:color="D9D5C8" w:sz="4"/>
-              <w:bottom w:val="single" w:color="D9D5C8" w:sz="4"/>
-              <w:right w:val="single" w:color="D9D5C8" w:sz="4"/>
-            </w:tcBorders>
-            <w:tcMar>
-              <w:top w:type="dxa" w:w="55"/>
-              <w:left w:type="dxa" w:w="110"/>
-              <w:bottom w:type="dxa" w:w="55"/>
-              <w:right w:type="dxa" w:w="110"/>
-            </w:tcMar>
-          </w:tcPr>
+          <w:p>
+            <w:pPr>
+              <w:spacing w:before="0" w:after="0" w:line="50" w:lineRule="exact"/>
+            </w:pPr>
+            <w:r>
+              <w:rPr>
+                <w:sz w:val="2"/>
+                <w:szCs w:val="2"/>
+                <w:rFonts w:ascii="Calibri" w:cs="Calibri" w:eastAsia="Calibri" w:hAnsi="Calibri"/>
+              </w:rPr>
+              <w:t xml:space="preserve"> </w:t>
+            </w:r>
+          </w:p>
           <w:p>
             <w:pPr>
               <w:widowControl w:val="false"/>
@@ -45001,19 +44842,80 @@
               <w:t xml:space="preserve"> </w:t>
             </w:r>
           </w:p>
-          <w:p>
-            <w:pPr>
-              <w:spacing w:before="0" w:after="0" w:line="50" w:lineRule="exact"/>
-            </w:pPr>
-            <w:r>
-              <w:rPr>
-                <w:sz w:val="2"/>
-                <w:szCs w:val="2"/>
-                <w:rFonts w:ascii="Calibri" w:cs="Calibri" w:eastAsia="Calibri" w:hAnsi="Calibri"/>
-              </w:rPr>
-              <w:t xml:space="preserve"> </w:t>
-            </w:r>
-          </w:p>
+        </w:tc>
+      </w:tr>
+    </w:tbl>
+    <w:tbl>
+      <w:tblPr>
+        <w:tblW w:type="dxa" w:w="9792"/>
+        <w:tblBorders>
+          <w:top w:val="single" w:color="auto" w:sz="4"/>
+          <w:left w:val="single" w:color="auto" w:sz="4"/>
+          <w:bottom w:val="single" w:color="auto" w:sz="4"/>
+          <w:right w:val="single" w:color="auto" w:sz="4"/>
+          <w:insideH w:val="single" w:color="auto" w:sz="4"/>
+          <w:insideV w:val="single" w:color="auto" w:sz="4"/>
+        </w:tblBorders>
+      </w:tblPr>
+      <w:tblGrid>
+        <w:gridCol w:w="9792"/>
+      </w:tblGrid>
+      <w:tr>
+        <w:tc>
+          <w:tcPr>
+            <w:tcW w:type="dxa" w:w="9792"/>
+            <w:tcBorders>
+              <w:top w:val="single" w:color="D9D5C8" w:sz="4"/>
+              <w:left w:val="single" w:color="D9D5C8" w:sz="4"/>
+              <w:bottom w:val="single" w:color="D9D5C8" w:sz="4"/>
+              <w:right w:val="single" w:color="D9D5C8" w:sz="4"/>
+            </w:tcBorders>
+            <w:shd w:fill="F7F5EF" w:color="auto" w:val="clear"/>
+            <w:tcMar>
+              <w:top w:type="dxa" w:w="55"/>
+              <w:left w:type="dxa" w:w="110"/>
+              <w:bottom w:type="dxa" w:w="55"/>
+              <w:right w:type="dxa" w:w="110"/>
+            </w:tcMar>
+          </w:tcPr>
+          <w:p>
+            <w:pPr>
+              <w:spacing w:after="0"/>
+            </w:pPr>
+            <w:r>
+              <w:rPr>
+                <w:b/>
+                <w:bCs/>
+                <w:i w:val="false"/>
+                <w:iCs w:val="false"/>
+                <w:color w:val="1B2A4A"/>
+                <w:sz w:val="21"/>
+                <w:szCs w:val="21"/>
+                <w:caps w:val="false"/>
+                <w:rFonts w:ascii="Calibri" w:cs="Calibri" w:eastAsia="Calibri" w:hAnsi="Calibri"/>
+              </w:rPr>
+              <w:t xml:space="preserve">YOUR ANSWER KEY — one clear, defensible sentence</w:t>
+            </w:r>
+          </w:p>
+        </w:tc>
+      </w:tr>
+      <w:tr>
+        <w:tc>
+          <w:tcPr>
+            <w:tcW w:type="dxa" w:w="9792"/>
+            <w:tcBorders>
+              <w:top w:val="single" w:color="D9D5C8" w:sz="4"/>
+              <w:left w:val="single" w:color="D9D5C8" w:sz="4"/>
+              <w:bottom w:val="single" w:color="D9D5C8" w:sz="4"/>
+              <w:right w:val="single" w:color="D9D5C8" w:sz="4"/>
+            </w:tcBorders>
+            <w:tcMar>
+              <w:top w:type="dxa" w:w="55"/>
+              <w:left w:type="dxa" w:w="110"/>
+              <w:bottom w:type="dxa" w:w="55"/>
+              <w:right w:type="dxa" w:w="110"/>
+            </w:tcMar>
+          </w:tcPr>
           <w:p>
             <w:pPr>
               <w:widowControl w:val="false"/>
@@ -45031,42 +44933,6 @@
               <w:t xml:space="preserve"> </w:t>
             </w:r>
           </w:p>
-        </w:tc>
-      </w:tr>
-      <w:tr>
-        <w:tc>
-          <w:tcPr>
-            <w:tcW w:type="dxa" w:w="4896"/>
-            <w:tcBorders>
-              <w:top w:val="single" w:color="D9D5C8" w:sz="4"/>
-              <w:left w:val="single" w:color="D9D5C8" w:sz="4"/>
-              <w:bottom w:val="single" w:color="D9D5C8" w:sz="4"/>
-              <w:right w:val="single" w:color="D9D5C8" w:sz="4"/>
-            </w:tcBorders>
-            <w:tcMar>
-              <w:top w:type="dxa" w:w="55"/>
-              <w:left w:type="dxa" w:w="110"/>
-              <w:bottom w:type="dxa" w:w="55"/>
-              <w:right w:type="dxa" w:w="110"/>
-            </w:tcMar>
-          </w:tcPr>
-          <w:p>
-            <w:pPr>
-              <w:widowControl w:val="false"/>
-              <w:pBdr>
-                <w:bottom w:val="single" w:color="8892A0" w:sz="8" w:space="1"/>
-              </w:pBdr>
-              <w:spacing w:before="28" w:after="28"/>
-            </w:pPr>
-            <w:r>
-              <w:rPr>
-                <w:sz w:val="16"/>
-                <w:szCs w:val="16"/>
-                <w:rFonts w:ascii="Calibri" w:cs="Calibri" w:eastAsia="Calibri" w:hAnsi="Calibri"/>
-              </w:rPr>
-              <w:t xml:space="preserve"> </w:t>
-            </w:r>
-          </w:p>
           <w:p>
             <w:pPr>
               <w:spacing w:before="0" w:after="0" w:line="50" w:lineRule="exact"/>
@@ -45080,70 +44946,6 @@
               <w:t xml:space="preserve"> </w:t>
             </w:r>
           </w:p>
-          <w:p>
-            <w:pPr>
-              <w:widowControl w:val="false"/>
-              <w:pBdr>
-                <w:bottom w:val="single" w:color="8892A0" w:sz="8" w:space="1"/>
-              </w:pBdr>
-              <w:spacing w:before="28" w:after="28"/>
-            </w:pPr>
-            <w:r>
-              <w:rPr>
-                <w:sz w:val="16"/>
-                <w:szCs w:val="16"/>
-                <w:rFonts w:ascii="Calibri" w:cs="Calibri" w:eastAsia="Calibri" w:hAnsi="Calibri"/>
-              </w:rPr>
-              <w:t xml:space="preserve"> </w:t>
-            </w:r>
-          </w:p>
-          <w:p>
-            <w:pPr>
-              <w:spacing w:before="0" w:after="0" w:line="50" w:lineRule="exact"/>
-            </w:pPr>
-            <w:r>
-              <w:rPr>
-                <w:sz w:val="2"/>
-                <w:szCs w:val="2"/>
-                <w:rFonts w:ascii="Calibri" w:cs="Calibri" w:eastAsia="Calibri" w:hAnsi="Calibri"/>
-              </w:rPr>
-              <w:t xml:space="preserve"> </w:t>
-            </w:r>
-          </w:p>
-          <w:p>
-            <w:pPr>
-              <w:widowControl w:val="false"/>
-              <w:pBdr>
-                <w:bottom w:val="single" w:color="8892A0" w:sz="8" w:space="1"/>
-              </w:pBdr>
-              <w:spacing w:before="28" w:after="28"/>
-            </w:pPr>
-            <w:r>
-              <w:rPr>
-                <w:sz w:val="16"/>
-                <w:szCs w:val="16"/>
-                <w:rFonts w:ascii="Calibri" w:cs="Calibri" w:eastAsia="Calibri" w:hAnsi="Calibri"/>
-              </w:rPr>
-              <w:t xml:space="preserve"> </w:t>
-            </w:r>
-          </w:p>
-        </w:tc>
-        <w:tc>
-          <w:tcPr>
-            <w:tcW w:type="dxa" w:w="4896"/>
-            <w:tcBorders>
-              <w:top w:val="single" w:color="D9D5C8" w:sz="4"/>
-              <w:left w:val="single" w:color="D9D5C8" w:sz="4"/>
-              <w:bottom w:val="single" w:color="D9D5C8" w:sz="4"/>
-              <w:right w:val="single" w:color="D9D5C8" w:sz="4"/>
-            </w:tcBorders>
-            <w:tcMar>
-              <w:top w:type="dxa" w:w="55"/>
-              <w:left w:type="dxa" w:w="110"/>
-              <w:bottom w:type="dxa" w:w="55"/>
-              <w:right w:type="dxa" w:w="110"/>
-            </w:tcMar>
-          </w:tcPr>
           <w:p>
             <w:pPr>
               <w:widowControl w:val="false"/>

</xml_diff>

<commit_message>
Activity 7: CER writing on front, rubric + self-grade + supports on the back
CER is now a self-grading 2-page spread.
- Front: big-question organizer + CER prompt + generous CER write table (Claim 4 / Evidence 6 /
  Reasoning 5 lines) to fill the page.
- Back: SELF-GRADE intro + the 4-level CER rubric + 'My Score' (Claim/Evidence/Reasoning /12) +
  sentence-frame supports + a 'Revise your lowest part' block with lines — fills after the rubric.
Brand-lock intact (tables 9792). Rebuilt all + large-print.

Co-Authored-By: Claude Opus 4.8 <noreply@anthropic.com>
Claude-Session: https://claude.ai/code/session_01DHdLjiiJeW6A83FcYRQ3qv
</commit_message>
<xml_diff>
--- a/courses/foundations-constitutional-government/BUILD/unit4/deliverables/Unit4_Student_Workbook_CourseStandard.docx
+++ b/courses/foundations-constitutional-government/BUILD/unit4/deliverables/Unit4_Student_Workbook_CourseStandard.docx
@@ -17493,61 +17493,19 @@
               <w:t xml:space="preserve"> </w:t>
             </w:r>
           </w:p>
-        </w:tc>
-      </w:tr>
-      <w:tr>
-        <w:tc>
-          <w:tcPr>
-            <w:tcW w:type="dxa" w:w="2233"/>
-            <w:tcBorders>
-              <w:top w:val="single" w:color="D9D5C8" w:sz="4"/>
-              <w:left w:val="single" w:color="D9D5C8" w:sz="4"/>
-              <w:bottom w:val="single" w:color="D9D5C8" w:sz="4"/>
-              <w:right w:val="single" w:color="D9D5C8" w:sz="4"/>
-            </w:tcBorders>
-            <w:tcMar>
-              <w:top w:type="dxa" w:w="55"/>
-              <w:left w:type="dxa" w:w="110"/>
-              <w:bottom w:type="dxa" w:w="55"/>
-              <w:right w:type="dxa" w:w="110"/>
-            </w:tcMar>
-          </w:tcPr>
-          <w:p>
-            <w:pPr>
-              <w:spacing w:after="0"/>
-            </w:pPr>
-            <w:r>
-              <w:rPr>
-                <w:b/>
-                <w:bCs/>
-                <w:i w:val="false"/>
-                <w:iCs w:val="false"/>
-                <w:color w:val="1A1A1A"/>
-                <w:sz w:val="20"/>
-                <w:szCs w:val="20"/>
-                <w:caps w:val="false"/>
-                <w:rFonts w:ascii="Calibri" w:cs="Calibri" w:eastAsia="Calibri" w:hAnsi="Calibri"/>
-              </w:rPr>
-              <w:t xml:space="preserve">Evidence (two specifics)</w:t>
-            </w:r>
-          </w:p>
-        </w:tc>
-        <w:tc>
-          <w:tcPr>
-            <w:tcW w:type="dxa" w:w="7559"/>
-            <w:tcBorders>
-              <w:top w:val="single" w:color="D9D5C8" w:sz="4"/>
-              <w:left w:val="single" w:color="D9D5C8" w:sz="4"/>
-              <w:bottom w:val="single" w:color="D9D5C8" w:sz="4"/>
-              <w:right w:val="single" w:color="D9D5C8" w:sz="4"/>
-            </w:tcBorders>
-            <w:tcMar>
-              <w:top w:type="dxa" w:w="55"/>
-              <w:left w:type="dxa" w:w="110"/>
-              <w:bottom w:type="dxa" w:w="55"/>
-              <w:right w:type="dxa" w:w="110"/>
-            </w:tcMar>
-          </w:tcPr>
+          <w:p>
+            <w:pPr>
+              <w:spacing w:before="0" w:after="0" w:line="50" w:lineRule="exact"/>
+            </w:pPr>
+            <w:r>
+              <w:rPr>
+                <w:sz w:val="2"/>
+                <w:szCs w:val="2"/>
+                <w:rFonts w:ascii="Calibri" w:cs="Calibri" w:eastAsia="Calibri" w:hAnsi="Calibri"/>
+              </w:rPr>
+              <w:t xml:space="preserve"> </w:t>
+            </w:r>
+          </w:p>
           <w:p>
             <w:pPr>
               <w:widowControl w:val="false"/>
@@ -17565,19 +17523,61 @@
               <w:t xml:space="preserve"> </w:t>
             </w:r>
           </w:p>
-          <w:p>
-            <w:pPr>
-              <w:spacing w:before="0" w:after="0" w:line="50" w:lineRule="exact"/>
-            </w:pPr>
-            <w:r>
-              <w:rPr>
-                <w:sz w:val="2"/>
-                <w:szCs w:val="2"/>
-                <w:rFonts w:ascii="Calibri" w:cs="Calibri" w:eastAsia="Calibri" w:hAnsi="Calibri"/>
-              </w:rPr>
-              <w:t xml:space="preserve"> </w:t>
-            </w:r>
-          </w:p>
+        </w:tc>
+      </w:tr>
+      <w:tr>
+        <w:tc>
+          <w:tcPr>
+            <w:tcW w:type="dxa" w:w="2233"/>
+            <w:tcBorders>
+              <w:top w:val="single" w:color="D9D5C8" w:sz="4"/>
+              <w:left w:val="single" w:color="D9D5C8" w:sz="4"/>
+              <w:bottom w:val="single" w:color="D9D5C8" w:sz="4"/>
+              <w:right w:val="single" w:color="D9D5C8" w:sz="4"/>
+            </w:tcBorders>
+            <w:tcMar>
+              <w:top w:type="dxa" w:w="55"/>
+              <w:left w:type="dxa" w:w="110"/>
+              <w:bottom w:type="dxa" w:w="55"/>
+              <w:right w:type="dxa" w:w="110"/>
+            </w:tcMar>
+          </w:tcPr>
+          <w:p>
+            <w:pPr>
+              <w:spacing w:after="0"/>
+            </w:pPr>
+            <w:r>
+              <w:rPr>
+                <w:b/>
+                <w:bCs/>
+                <w:i w:val="false"/>
+                <w:iCs w:val="false"/>
+                <w:color w:val="1A1A1A"/>
+                <w:sz w:val="20"/>
+                <w:szCs w:val="20"/>
+                <w:caps w:val="false"/>
+                <w:rFonts w:ascii="Calibri" w:cs="Calibri" w:eastAsia="Calibri" w:hAnsi="Calibri"/>
+              </w:rPr>
+              <w:t xml:space="preserve">Evidence (two specifics)</w:t>
+            </w:r>
+          </w:p>
+        </w:tc>
+        <w:tc>
+          <w:tcPr>
+            <w:tcW w:type="dxa" w:w="7559"/>
+            <w:tcBorders>
+              <w:top w:val="single" w:color="D9D5C8" w:sz="4"/>
+              <w:left w:val="single" w:color="D9D5C8" w:sz="4"/>
+              <w:bottom w:val="single" w:color="D9D5C8" w:sz="4"/>
+              <w:right w:val="single" w:color="D9D5C8" w:sz="4"/>
+            </w:tcBorders>
+            <w:tcMar>
+              <w:top w:type="dxa" w:w="55"/>
+              <w:left w:type="dxa" w:w="110"/>
+              <w:bottom w:type="dxa" w:w="55"/>
+              <w:right w:type="dxa" w:w="110"/>
+            </w:tcMar>
+          </w:tcPr>
           <w:p>
             <w:pPr>
               <w:widowControl w:val="false"/>
@@ -17685,61 +17685,19 @@
               <w:t xml:space="preserve"> </w:t>
             </w:r>
           </w:p>
-        </w:tc>
-      </w:tr>
-      <w:tr>
-        <w:tc>
-          <w:tcPr>
-            <w:tcW w:type="dxa" w:w="2233"/>
-            <w:tcBorders>
-              <w:top w:val="single" w:color="D9D5C8" w:sz="4"/>
-              <w:left w:val="single" w:color="D9D5C8" w:sz="4"/>
-              <w:bottom w:val="single" w:color="D9D5C8" w:sz="4"/>
-              <w:right w:val="single" w:color="D9D5C8" w:sz="4"/>
-            </w:tcBorders>
-            <w:tcMar>
-              <w:top w:type="dxa" w:w="55"/>
-              <w:left w:type="dxa" w:w="110"/>
-              <w:bottom w:type="dxa" w:w="55"/>
-              <w:right w:type="dxa" w:w="110"/>
-            </w:tcMar>
-          </w:tcPr>
-          <w:p>
-            <w:pPr>
-              <w:spacing w:after="0"/>
-            </w:pPr>
-            <w:r>
-              <w:rPr>
-                <w:b/>
-                <w:bCs/>
-                <w:i w:val="false"/>
-                <w:iCs w:val="false"/>
-                <w:color w:val="1A1A1A"/>
-                <w:sz w:val="20"/>
-                <w:szCs w:val="20"/>
-                <w:caps w:val="false"/>
-                <w:rFonts w:ascii="Calibri" w:cs="Calibri" w:eastAsia="Calibri" w:hAnsi="Calibri"/>
-              </w:rPr>
-              <w:t xml:space="preserve">Reasoning</w:t>
-            </w:r>
-          </w:p>
-        </w:tc>
-        <w:tc>
-          <w:tcPr>
-            <w:tcW w:type="dxa" w:w="7559"/>
-            <w:tcBorders>
-              <w:top w:val="single" w:color="D9D5C8" w:sz="4"/>
-              <w:left w:val="single" w:color="D9D5C8" w:sz="4"/>
-              <w:bottom w:val="single" w:color="D9D5C8" w:sz="4"/>
-              <w:right w:val="single" w:color="D9D5C8" w:sz="4"/>
-            </w:tcBorders>
-            <w:tcMar>
-              <w:top w:type="dxa" w:w="55"/>
-              <w:left w:type="dxa" w:w="110"/>
-              <w:bottom w:type="dxa" w:w="55"/>
-              <w:right w:type="dxa" w:w="110"/>
-            </w:tcMar>
-          </w:tcPr>
+          <w:p>
+            <w:pPr>
+              <w:spacing w:before="0" w:after="0" w:line="50" w:lineRule="exact"/>
+            </w:pPr>
+            <w:r>
+              <w:rPr>
+                <w:sz w:val="2"/>
+                <w:szCs w:val="2"/>
+                <w:rFonts w:ascii="Calibri" w:cs="Calibri" w:eastAsia="Calibri" w:hAnsi="Calibri"/>
+              </w:rPr>
+              <w:t xml:space="preserve"> </w:t>
+            </w:r>
+          </w:p>
           <w:p>
             <w:pPr>
               <w:widowControl w:val="false"/>
@@ -17787,19 +17745,61 @@
               <w:t xml:space="preserve"> </w:t>
             </w:r>
           </w:p>
-          <w:p>
-            <w:pPr>
-              <w:spacing w:before="0" w:after="0" w:line="50" w:lineRule="exact"/>
-            </w:pPr>
-            <w:r>
-              <w:rPr>
-                <w:sz w:val="2"/>
-                <w:szCs w:val="2"/>
-                <w:rFonts w:ascii="Calibri" w:cs="Calibri" w:eastAsia="Calibri" w:hAnsi="Calibri"/>
-              </w:rPr>
-              <w:t xml:space="preserve"> </w:t>
-            </w:r>
-          </w:p>
+        </w:tc>
+      </w:tr>
+      <w:tr>
+        <w:tc>
+          <w:tcPr>
+            <w:tcW w:type="dxa" w:w="2233"/>
+            <w:tcBorders>
+              <w:top w:val="single" w:color="D9D5C8" w:sz="4"/>
+              <w:left w:val="single" w:color="D9D5C8" w:sz="4"/>
+              <w:bottom w:val="single" w:color="D9D5C8" w:sz="4"/>
+              <w:right w:val="single" w:color="D9D5C8" w:sz="4"/>
+            </w:tcBorders>
+            <w:tcMar>
+              <w:top w:type="dxa" w:w="55"/>
+              <w:left w:type="dxa" w:w="110"/>
+              <w:bottom w:type="dxa" w:w="55"/>
+              <w:right w:type="dxa" w:w="110"/>
+            </w:tcMar>
+          </w:tcPr>
+          <w:p>
+            <w:pPr>
+              <w:spacing w:after="0"/>
+            </w:pPr>
+            <w:r>
+              <w:rPr>
+                <w:b/>
+                <w:bCs/>
+                <w:i w:val="false"/>
+                <w:iCs w:val="false"/>
+                <w:color w:val="1A1A1A"/>
+                <w:sz w:val="20"/>
+                <w:szCs w:val="20"/>
+                <w:caps w:val="false"/>
+                <w:rFonts w:ascii="Calibri" w:cs="Calibri" w:eastAsia="Calibri" w:hAnsi="Calibri"/>
+              </w:rPr>
+              <w:t xml:space="preserve">Reasoning</w:t>
+            </w:r>
+          </w:p>
+        </w:tc>
+        <w:tc>
+          <w:tcPr>
+            <w:tcW w:type="dxa" w:w="7559"/>
+            <w:tcBorders>
+              <w:top w:val="single" w:color="D9D5C8" w:sz="4"/>
+              <w:left w:val="single" w:color="D9D5C8" w:sz="4"/>
+              <w:bottom w:val="single" w:color="D9D5C8" w:sz="4"/>
+              <w:right w:val="single" w:color="D9D5C8" w:sz="4"/>
+            </w:tcBorders>
+            <w:tcMar>
+              <w:top w:type="dxa" w:w="55"/>
+              <w:left w:type="dxa" w:w="110"/>
+              <w:bottom w:type="dxa" w:w="55"/>
+              <w:right w:type="dxa" w:w="110"/>
+            </w:tcMar>
+          </w:tcPr>
           <w:p>
             <w:pPr>
               <w:widowControl w:val="false"/>
@@ -17845,6 +17845,948 @@
                 <w:rFonts w:ascii="Calibri" w:cs="Calibri" w:eastAsia="Calibri" w:hAnsi="Calibri"/>
               </w:rPr>
               <w:t xml:space="preserve"> </w:t>
+            </w:r>
+          </w:p>
+          <w:p>
+            <w:pPr>
+              <w:spacing w:before="0" w:after="0" w:line="50" w:lineRule="exact"/>
+            </w:pPr>
+            <w:r>
+              <w:rPr>
+                <w:sz w:val="2"/>
+                <w:szCs w:val="2"/>
+                <w:rFonts w:ascii="Calibri" w:cs="Calibri" w:eastAsia="Calibri" w:hAnsi="Calibri"/>
+              </w:rPr>
+              <w:t xml:space="preserve"> </w:t>
+            </w:r>
+          </w:p>
+          <w:p>
+            <w:pPr>
+              <w:widowControl w:val="false"/>
+              <w:pBdr>
+                <w:bottom w:val="single" w:color="8892A0" w:sz="8" w:space="1"/>
+              </w:pBdr>
+              <w:spacing w:before="28" w:after="28"/>
+            </w:pPr>
+            <w:r>
+              <w:rPr>
+                <w:sz w:val="16"/>
+                <w:szCs w:val="16"/>
+                <w:rFonts w:ascii="Calibri" w:cs="Calibri" w:eastAsia="Calibri" w:hAnsi="Calibri"/>
+              </w:rPr>
+              <w:t xml:space="preserve"> </w:t>
+            </w:r>
+          </w:p>
+          <w:p>
+            <w:pPr>
+              <w:spacing w:before="0" w:after="0" w:line="50" w:lineRule="exact"/>
+            </w:pPr>
+            <w:r>
+              <w:rPr>
+                <w:sz w:val="2"/>
+                <w:szCs w:val="2"/>
+                <w:rFonts w:ascii="Calibri" w:cs="Calibri" w:eastAsia="Calibri" w:hAnsi="Calibri"/>
+              </w:rPr>
+              <w:t xml:space="preserve"> </w:t>
+            </w:r>
+          </w:p>
+          <w:p>
+            <w:pPr>
+              <w:widowControl w:val="false"/>
+              <w:pBdr>
+                <w:bottom w:val="single" w:color="8892A0" w:sz="8" w:space="1"/>
+              </w:pBdr>
+              <w:spacing w:before="28" w:after="28"/>
+            </w:pPr>
+            <w:r>
+              <w:rPr>
+                <w:sz w:val="16"/>
+                <w:szCs w:val="16"/>
+                <w:rFonts w:ascii="Calibri" w:cs="Calibri" w:eastAsia="Calibri" w:hAnsi="Calibri"/>
+              </w:rPr>
+              <w:t xml:space="preserve"> </w:t>
+            </w:r>
+          </w:p>
+          <w:p>
+            <w:pPr>
+              <w:spacing w:before="0" w:after="0" w:line="50" w:lineRule="exact"/>
+            </w:pPr>
+            <w:r>
+              <w:rPr>
+                <w:sz w:val="2"/>
+                <w:szCs w:val="2"/>
+                <w:rFonts w:ascii="Calibri" w:cs="Calibri" w:eastAsia="Calibri" w:hAnsi="Calibri"/>
+              </w:rPr>
+              <w:t xml:space="preserve"> </w:t>
+            </w:r>
+          </w:p>
+          <w:p>
+            <w:pPr>
+              <w:widowControl w:val="false"/>
+              <w:pBdr>
+                <w:bottom w:val="single" w:color="8892A0" w:sz="8" w:space="1"/>
+              </w:pBdr>
+              <w:spacing w:before="28" w:after="28"/>
+            </w:pPr>
+            <w:r>
+              <w:rPr>
+                <w:sz w:val="16"/>
+                <w:szCs w:val="16"/>
+                <w:rFonts w:ascii="Calibri" w:cs="Calibri" w:eastAsia="Calibri" w:hAnsi="Calibri"/>
+              </w:rPr>
+              <w:t xml:space="preserve"> </w:t>
+            </w:r>
+          </w:p>
+        </w:tc>
+      </w:tr>
+    </w:tbl>
+    <w:p>
+      <w:pPr>
+        <w:pStyle w:val="Heading2"/>
+        <w:keepNext/>
+        <w:pageBreakBefore/>
+        <w:spacing w:before="150" w:after="90"/>
+      </w:pPr>
+      <w:r>
+        <w:rPr>
+          <w:b/>
+          <w:bCs/>
+          <w:i w:val="false"/>
+          <w:iCs w:val="false"/>
+          <w:color w:val="1B2A4A"/>
+          <w:sz w:val="28"/>
+          <w:szCs w:val="28"/>
+          <w:caps w:val="false"/>
+          <w:rFonts w:ascii="Calibri" w:cs="Calibri" w:eastAsia="Calibri" w:hAnsi="Calibri"/>
+        </w:rPr>
+        <w:t xml:space="preserve">Constructed Response — self-grade &amp; supports — GC.16</w:t>
+      </w:r>
+    </w:p>
+    <w:tbl>
+      <w:tblPr>
+        <w:tblW w:type="dxa" w:w="9792"/>
+        <w:tblBorders>
+          <w:top w:val="single" w:color="auto" w:sz="4"/>
+          <w:left w:val="single" w:color="auto" w:sz="4"/>
+          <w:bottom w:val="single" w:color="auto" w:sz="4"/>
+          <w:right w:val="single" w:color="auto" w:sz="4"/>
+          <w:insideH w:val="single" w:color="auto" w:sz="4"/>
+          <w:insideV w:val="single" w:color="auto" w:sz="4"/>
+        </w:tblBorders>
+      </w:tblPr>
+      <w:tblGrid>
+        <w:gridCol w:w="9792"/>
+      </w:tblGrid>
+      <w:tr>
+        <w:tc>
+          <w:tcPr>
+            <w:tcW w:type="dxa" w:w="9792"/>
+            <w:tcBorders>
+              <w:top w:val="single" w:color="D9D5C8" w:sz="4"/>
+              <w:left w:val="single" w:color="D9D5C8" w:sz="4"/>
+              <w:bottom w:val="single" w:color="D9D5C8" w:sz="4"/>
+              <w:right w:val="single" w:color="D9D5C8" w:sz="4"/>
+            </w:tcBorders>
+            <w:shd w:fill="F7F5EF" w:color="auto" w:val="clear"/>
+            <w:tcMar>
+              <w:top w:type="dxa" w:w="55"/>
+              <w:left w:type="dxa" w:w="110"/>
+              <w:bottom w:type="dxa" w:w="55"/>
+              <w:right w:type="dxa" w:w="110"/>
+            </w:tcMar>
+          </w:tcPr>
+          <w:p>
+            <w:pPr>
+              <w:spacing w:after="60"/>
+            </w:pPr>
+            <w:r>
+              <w:rPr>
+                <w:b/>
+                <w:bCs/>
+                <w:i w:val="false"/>
+                <w:iCs w:val="false"/>
+                <w:color w:val="1B2A4A"/>
+                <w:sz w:val="21"/>
+                <w:szCs w:val="21"/>
+                <w:caps w:val="false"/>
+                <w:rFonts w:ascii="Calibri" w:cs="Calibri" w:eastAsia="Calibri" w:hAnsi="Calibri"/>
+              </w:rPr>
+              <w:t xml:space="preserve">SELF-GRADE — score your own CER against the rubric below</w:t>
+            </w:r>
+          </w:p>
+          <w:p>
+            <w:pPr>
+              <w:spacing w:after="40"/>
+            </w:pPr>
+            <w:r>
+              <w:rPr>
+                <w:b w:val="false"/>
+                <w:bCs w:val="false"/>
+                <w:i w:val="false"/>
+                <w:iCs w:val="false"/>
+                <w:color w:val="1A1A1A"/>
+                <w:sz w:val="22"/>
+                <w:szCs w:val="22"/>
+                <w:caps w:val="false"/>
+                <w:rFonts w:ascii="Calibri" w:cs="Calibri" w:eastAsia="Calibri" w:hAnsi="Calibri"/>
+              </w:rPr>
+              <w:t xml:space="preserve">Reread your response, then circle the level that best fits each part. Being honest here is how you level up.</w:t>
+            </w:r>
+          </w:p>
+        </w:tc>
+      </w:tr>
+    </w:tbl>
+    <w:tbl>
+      <w:tblPr>
+        <w:tblW w:type="dxa" w:w="9792"/>
+        <w:tblBorders>
+          <w:top w:val="single" w:color="auto" w:sz="4"/>
+          <w:left w:val="single" w:color="auto" w:sz="4"/>
+          <w:bottom w:val="single" w:color="auto" w:sz="4"/>
+          <w:right w:val="single" w:color="auto" w:sz="4"/>
+          <w:insideH w:val="single" w:color="auto" w:sz="4"/>
+          <w:insideV w:val="single" w:color="auto" w:sz="4"/>
+        </w:tblBorders>
+      </w:tblPr>
+      <w:tblGrid>
+        <w:gridCol w:w="1800"/>
+        <w:gridCol w:w="2664"/>
+        <w:gridCol w:w="2664"/>
+        <w:gridCol w:w="2664"/>
+      </w:tblGrid>
+      <w:tr>
+        <w:trPr>
+          <w:tblHeader/>
+        </w:trPr>
+        <w:tc>
+          <w:tcPr>
+            <w:tcW w:type="dxa" w:w="1800"/>
+            <w:tcBorders>
+              <w:top w:val="single" w:color="D9D5C8" w:sz="4"/>
+              <w:left w:val="single" w:color="D9D5C8" w:sz="4"/>
+              <w:bottom w:val="single" w:color="D9D5C8" w:sz="4"/>
+              <w:right w:val="single" w:color="D9D5C8" w:sz="4"/>
+            </w:tcBorders>
+            <w:shd w:fill="1B2A4A" w:color="auto" w:val="clear"/>
+            <w:tcMar>
+              <w:top w:type="dxa" w:w="55"/>
+              <w:left w:type="dxa" w:w="110"/>
+              <w:bottom w:type="dxa" w:w="55"/>
+              <w:right w:type="dxa" w:w="110"/>
+            </w:tcMar>
+          </w:tcPr>
+          <w:p>
+            <w:pPr>
+              <w:spacing w:after="0"/>
+            </w:pPr>
+            <w:r>
+              <w:rPr>
+                <w:b/>
+                <w:bCs/>
+                <w:i w:val="false"/>
+                <w:iCs w:val="false"/>
+                <w:color w:val="FFFFFF"/>
+                <w:sz w:val="19"/>
+                <w:szCs w:val="19"/>
+                <w:caps w:val="false"/>
+                <w:rFonts w:ascii="Calibri" w:cs="Calibri" w:eastAsia="Calibri" w:hAnsi="Calibri"/>
+              </w:rPr>
+              <w:t xml:space="preserve">Level</w:t>
+            </w:r>
+          </w:p>
+        </w:tc>
+        <w:tc>
+          <w:tcPr>
+            <w:tcW w:type="dxa" w:w="2664"/>
+            <w:tcBorders>
+              <w:top w:val="single" w:color="D9D5C8" w:sz="4"/>
+              <w:left w:val="single" w:color="D9D5C8" w:sz="4"/>
+              <w:bottom w:val="single" w:color="D9D5C8" w:sz="4"/>
+              <w:right w:val="single" w:color="D9D5C8" w:sz="4"/>
+            </w:tcBorders>
+            <w:shd w:fill="1B2A4A" w:color="auto" w:val="clear"/>
+            <w:tcMar>
+              <w:top w:type="dxa" w:w="55"/>
+              <w:left w:type="dxa" w:w="110"/>
+              <w:bottom w:type="dxa" w:w="55"/>
+              <w:right w:type="dxa" w:w="110"/>
+            </w:tcMar>
+          </w:tcPr>
+          <w:p>
+            <w:pPr>
+              <w:spacing w:after="0"/>
+            </w:pPr>
+            <w:r>
+              <w:rPr>
+                <w:b/>
+                <w:bCs/>
+                <w:i w:val="false"/>
+                <w:iCs w:val="false"/>
+                <w:color w:val="FFFFFF"/>
+                <w:sz w:val="19"/>
+                <w:szCs w:val="19"/>
+                <w:caps w:val="false"/>
+                <w:rFonts w:ascii="Calibri" w:cs="Calibri" w:eastAsia="Calibri" w:hAnsi="Calibri"/>
+              </w:rPr>
+              <w:t xml:space="preserve">Claim</w:t>
+            </w:r>
+          </w:p>
+        </w:tc>
+        <w:tc>
+          <w:tcPr>
+            <w:tcW w:type="dxa" w:w="2664"/>
+            <w:tcBorders>
+              <w:top w:val="single" w:color="D9D5C8" w:sz="4"/>
+              <w:left w:val="single" w:color="D9D5C8" w:sz="4"/>
+              <w:bottom w:val="single" w:color="D9D5C8" w:sz="4"/>
+              <w:right w:val="single" w:color="D9D5C8" w:sz="4"/>
+            </w:tcBorders>
+            <w:shd w:fill="1B2A4A" w:color="auto" w:val="clear"/>
+            <w:tcMar>
+              <w:top w:type="dxa" w:w="55"/>
+              <w:left w:type="dxa" w:w="110"/>
+              <w:bottom w:type="dxa" w:w="55"/>
+              <w:right w:type="dxa" w:w="110"/>
+            </w:tcMar>
+          </w:tcPr>
+          <w:p>
+            <w:pPr>
+              <w:spacing w:after="0"/>
+            </w:pPr>
+            <w:r>
+              <w:rPr>
+                <w:b/>
+                <w:bCs/>
+                <w:i w:val="false"/>
+                <w:iCs w:val="false"/>
+                <w:color w:val="FFFFFF"/>
+                <w:sz w:val="19"/>
+                <w:szCs w:val="19"/>
+                <w:caps w:val="false"/>
+                <w:rFonts w:ascii="Calibri" w:cs="Calibri" w:eastAsia="Calibri" w:hAnsi="Calibri"/>
+              </w:rPr>
+              <w:t xml:space="preserve">Evidence</w:t>
+            </w:r>
+          </w:p>
+        </w:tc>
+        <w:tc>
+          <w:tcPr>
+            <w:tcW w:type="dxa" w:w="2664"/>
+            <w:tcBorders>
+              <w:top w:val="single" w:color="D9D5C8" w:sz="4"/>
+              <w:left w:val="single" w:color="D9D5C8" w:sz="4"/>
+              <w:bottom w:val="single" w:color="D9D5C8" w:sz="4"/>
+              <w:right w:val="single" w:color="D9D5C8" w:sz="4"/>
+            </w:tcBorders>
+            <w:shd w:fill="1B2A4A" w:color="auto" w:val="clear"/>
+            <w:tcMar>
+              <w:top w:type="dxa" w:w="55"/>
+              <w:left w:type="dxa" w:w="110"/>
+              <w:bottom w:type="dxa" w:w="55"/>
+              <w:right w:type="dxa" w:w="110"/>
+            </w:tcMar>
+          </w:tcPr>
+          <w:p>
+            <w:pPr>
+              <w:spacing w:after="0"/>
+            </w:pPr>
+            <w:r>
+              <w:rPr>
+                <w:b/>
+                <w:bCs/>
+                <w:i w:val="false"/>
+                <w:iCs w:val="false"/>
+                <w:color w:val="FFFFFF"/>
+                <w:sz w:val="19"/>
+                <w:szCs w:val="19"/>
+                <w:caps w:val="false"/>
+                <w:rFonts w:ascii="Calibri" w:cs="Calibri" w:eastAsia="Calibri" w:hAnsi="Calibri"/>
+              </w:rPr>
+              <w:t xml:space="preserve">Reasoning</w:t>
+            </w:r>
+          </w:p>
+        </w:tc>
+      </w:tr>
+      <w:tr>
+        <w:tc>
+          <w:tcPr>
+            <w:tcW w:type="dxa" w:w="1800"/>
+            <w:tcBorders>
+              <w:top w:val="single" w:color="D9D5C8" w:sz="4"/>
+              <w:left w:val="single" w:color="D9D5C8" w:sz="4"/>
+              <w:bottom w:val="single" w:color="D9D5C8" w:sz="4"/>
+              <w:right w:val="single" w:color="D9D5C8" w:sz="4"/>
+            </w:tcBorders>
+            <w:tcMar>
+              <w:top w:type="dxa" w:w="55"/>
+              <w:left w:type="dxa" w:w="110"/>
+              <w:bottom w:type="dxa" w:w="55"/>
+              <w:right w:type="dxa" w:w="110"/>
+            </w:tcMar>
+          </w:tcPr>
+          <w:p>
+            <w:pPr>
+              <w:spacing w:after="0"/>
+            </w:pPr>
+            <w:r>
+              <w:rPr>
+                <w:b w:val="false"/>
+                <w:bCs w:val="false"/>
+                <w:i w:val="false"/>
+                <w:iCs w:val="false"/>
+                <w:color w:val="1A1A1A"/>
+                <w:sz w:val="20"/>
+                <w:szCs w:val="20"/>
+                <w:caps w:val="false"/>
+                <w:rFonts w:ascii="Calibri" w:cs="Calibri" w:eastAsia="Calibri" w:hAnsi="Calibri"/>
+              </w:rPr>
+              <w:t xml:space="preserve">4 — Strong</w:t>
+            </w:r>
+          </w:p>
+        </w:tc>
+        <w:tc>
+          <w:tcPr>
+            <w:tcW w:type="dxa" w:w="2664"/>
+            <w:tcBorders>
+              <w:top w:val="single" w:color="D9D5C8" w:sz="4"/>
+              <w:left w:val="single" w:color="D9D5C8" w:sz="4"/>
+              <w:bottom w:val="single" w:color="D9D5C8" w:sz="4"/>
+              <w:right w:val="single" w:color="D9D5C8" w:sz="4"/>
+            </w:tcBorders>
+            <w:tcMar>
+              <w:top w:type="dxa" w:w="55"/>
+              <w:left w:type="dxa" w:w="110"/>
+              <w:bottom w:type="dxa" w:w="55"/>
+              <w:right w:type="dxa" w:w="110"/>
+            </w:tcMar>
+          </w:tcPr>
+          <w:p>
+            <w:pPr>
+              <w:spacing w:after="0"/>
+            </w:pPr>
+            <w:r>
+              <w:rPr>
+                <w:b w:val="false"/>
+                <w:bCs w:val="false"/>
+                <w:i w:val="false"/>
+                <w:iCs w:val="false"/>
+                <w:color w:val="1A1A1A"/>
+                <w:sz w:val="20"/>
+                <w:szCs w:val="20"/>
+                <w:caps w:val="false"/>
+                <w:rFonts w:ascii="Calibri" w:cs="Calibri" w:eastAsia="Calibri" w:hAnsi="Calibri"/>
+              </w:rPr>
+              <w:t xml:space="preserve">Precise, defensible</w:t>
+            </w:r>
+          </w:p>
+        </w:tc>
+        <w:tc>
+          <w:tcPr>
+            <w:tcW w:type="dxa" w:w="2664"/>
+            <w:tcBorders>
+              <w:top w:val="single" w:color="D9D5C8" w:sz="4"/>
+              <w:left w:val="single" w:color="D9D5C8" w:sz="4"/>
+              <w:bottom w:val="single" w:color="D9D5C8" w:sz="4"/>
+              <w:right w:val="single" w:color="D9D5C8" w:sz="4"/>
+            </w:tcBorders>
+            <w:tcMar>
+              <w:top w:type="dxa" w:w="55"/>
+              <w:left w:type="dxa" w:w="110"/>
+              <w:bottom w:type="dxa" w:w="55"/>
+              <w:right w:type="dxa" w:w="110"/>
+            </w:tcMar>
+          </w:tcPr>
+          <w:p>
+            <w:pPr>
+              <w:spacing w:after="0"/>
+            </w:pPr>
+            <w:r>
+              <w:rPr>
+                <w:b w:val="false"/>
+                <w:bCs w:val="false"/>
+                <w:i w:val="false"/>
+                <w:iCs w:val="false"/>
+                <w:color w:val="1A1A1A"/>
+                <w:sz w:val="20"/>
+                <w:szCs w:val="20"/>
+                <w:caps w:val="false"/>
+                <w:rFonts w:ascii="Calibri" w:cs="Calibri" w:eastAsia="Calibri" w:hAnsi="Calibri"/>
+              </w:rPr>
+              <w:t xml:space="preserve">2+ accurate, specific</w:t>
+            </w:r>
+          </w:p>
+        </w:tc>
+        <w:tc>
+          <w:tcPr>
+            <w:tcW w:type="dxa" w:w="2664"/>
+            <w:tcBorders>
+              <w:top w:val="single" w:color="D9D5C8" w:sz="4"/>
+              <w:left w:val="single" w:color="D9D5C8" w:sz="4"/>
+              <w:bottom w:val="single" w:color="D9D5C8" w:sz="4"/>
+              <w:right w:val="single" w:color="D9D5C8" w:sz="4"/>
+            </w:tcBorders>
+            <w:tcMar>
+              <w:top w:type="dxa" w:w="55"/>
+              <w:left w:type="dxa" w:w="110"/>
+              <w:bottom w:type="dxa" w:w="55"/>
+              <w:right w:type="dxa" w:w="110"/>
+            </w:tcMar>
+          </w:tcPr>
+          <w:p>
+            <w:pPr>
+              <w:spacing w:after="0"/>
+            </w:pPr>
+            <w:r>
+              <w:rPr>
+                <w:b w:val="false"/>
+                <w:bCs w:val="false"/>
+                <w:i w:val="false"/>
+                <w:iCs w:val="false"/>
+                <w:color w:val="1A1A1A"/>
+                <w:sz w:val="20"/>
+                <w:szCs w:val="20"/>
+                <w:caps w:val="false"/>
+                <w:rFonts w:ascii="Calibri" w:cs="Calibri" w:eastAsia="Calibri" w:hAnsi="Calibri"/>
+              </w:rPr>
+              <w:t xml:space="preserve">Explains HOW evidence proves the claim</w:t>
+            </w:r>
+          </w:p>
+        </w:tc>
+      </w:tr>
+      <w:tr>
+        <w:tc>
+          <w:tcPr>
+            <w:tcW w:type="dxa" w:w="1800"/>
+            <w:tcBorders>
+              <w:top w:val="single" w:color="D9D5C8" w:sz="4"/>
+              <w:left w:val="single" w:color="D9D5C8" w:sz="4"/>
+              <w:bottom w:val="single" w:color="D9D5C8" w:sz="4"/>
+              <w:right w:val="single" w:color="D9D5C8" w:sz="4"/>
+            </w:tcBorders>
+            <w:tcMar>
+              <w:top w:type="dxa" w:w="55"/>
+              <w:left w:type="dxa" w:w="110"/>
+              <w:bottom w:type="dxa" w:w="55"/>
+              <w:right w:type="dxa" w:w="110"/>
+            </w:tcMar>
+          </w:tcPr>
+          <w:p>
+            <w:pPr>
+              <w:spacing w:after="0"/>
+            </w:pPr>
+            <w:r>
+              <w:rPr>
+                <w:b w:val="false"/>
+                <w:bCs w:val="false"/>
+                <w:i w:val="false"/>
+                <w:iCs w:val="false"/>
+                <w:color w:val="1A1A1A"/>
+                <w:sz w:val="20"/>
+                <w:szCs w:val="20"/>
+                <w:caps w:val="false"/>
+                <w:rFonts w:ascii="Calibri" w:cs="Calibri" w:eastAsia="Calibri" w:hAnsi="Calibri"/>
+              </w:rPr>
+              <w:t xml:space="preserve">3 — Proficient</w:t>
+            </w:r>
+          </w:p>
+        </w:tc>
+        <w:tc>
+          <w:tcPr>
+            <w:tcW w:type="dxa" w:w="2664"/>
+            <w:tcBorders>
+              <w:top w:val="single" w:color="D9D5C8" w:sz="4"/>
+              <w:left w:val="single" w:color="D9D5C8" w:sz="4"/>
+              <w:bottom w:val="single" w:color="D9D5C8" w:sz="4"/>
+              <w:right w:val="single" w:color="D9D5C8" w:sz="4"/>
+            </w:tcBorders>
+            <w:tcMar>
+              <w:top w:type="dxa" w:w="55"/>
+              <w:left w:type="dxa" w:w="110"/>
+              <w:bottom w:type="dxa" w:w="55"/>
+              <w:right w:type="dxa" w:w="110"/>
+            </w:tcMar>
+          </w:tcPr>
+          <w:p>
+            <w:pPr>
+              <w:spacing w:after="0"/>
+            </w:pPr>
+            <w:r>
+              <w:rPr>
+                <w:b w:val="false"/>
+                <w:bCs w:val="false"/>
+                <w:i w:val="false"/>
+                <w:iCs w:val="false"/>
+                <w:color w:val="1A1A1A"/>
+                <w:sz w:val="20"/>
+                <w:szCs w:val="20"/>
+                <w:caps w:val="false"/>
+                <w:rFonts w:ascii="Calibri" w:cs="Calibri" w:eastAsia="Calibri" w:hAnsi="Calibri"/>
+              </w:rPr>
+              <w:t xml:space="preserve">Clear</w:t>
+            </w:r>
+          </w:p>
+        </w:tc>
+        <w:tc>
+          <w:tcPr>
+            <w:tcW w:type="dxa" w:w="2664"/>
+            <w:tcBorders>
+              <w:top w:val="single" w:color="D9D5C8" w:sz="4"/>
+              <w:left w:val="single" w:color="D9D5C8" w:sz="4"/>
+              <w:bottom w:val="single" w:color="D9D5C8" w:sz="4"/>
+              <w:right w:val="single" w:color="D9D5C8" w:sz="4"/>
+            </w:tcBorders>
+            <w:tcMar>
+              <w:top w:type="dxa" w:w="55"/>
+              <w:left w:type="dxa" w:w="110"/>
+              <w:bottom w:type="dxa" w:w="55"/>
+              <w:right w:type="dxa" w:w="110"/>
+            </w:tcMar>
+          </w:tcPr>
+          <w:p>
+            <w:pPr>
+              <w:spacing w:after="0"/>
+            </w:pPr>
+            <w:r>
+              <w:rPr>
+                <w:b w:val="false"/>
+                <w:bCs w:val="false"/>
+                <w:i w:val="false"/>
+                <w:iCs w:val="false"/>
+                <w:color w:val="1A1A1A"/>
+                <w:sz w:val="20"/>
+                <w:szCs w:val="20"/>
+                <w:caps w:val="false"/>
+                <w:rFonts w:ascii="Calibri" w:cs="Calibri" w:eastAsia="Calibri" w:hAnsi="Calibri"/>
+              </w:rPr>
+              <w:t xml:space="preserve">2 accurate</w:t>
+            </w:r>
+          </w:p>
+        </w:tc>
+        <w:tc>
+          <w:tcPr>
+            <w:tcW w:type="dxa" w:w="2664"/>
+            <w:tcBorders>
+              <w:top w:val="single" w:color="D9D5C8" w:sz="4"/>
+              <w:left w:val="single" w:color="D9D5C8" w:sz="4"/>
+              <w:bottom w:val="single" w:color="D9D5C8" w:sz="4"/>
+              <w:right w:val="single" w:color="D9D5C8" w:sz="4"/>
+            </w:tcBorders>
+            <w:tcMar>
+              <w:top w:type="dxa" w:w="55"/>
+              <w:left w:type="dxa" w:w="110"/>
+              <w:bottom w:type="dxa" w:w="55"/>
+              <w:right w:type="dxa" w:w="110"/>
+            </w:tcMar>
+          </w:tcPr>
+          <w:p>
+            <w:pPr>
+              <w:spacing w:after="0"/>
+            </w:pPr>
+            <w:r>
+              <w:rPr>
+                <w:b w:val="false"/>
+                <w:bCs w:val="false"/>
+                <w:i w:val="false"/>
+                <w:iCs w:val="false"/>
+                <w:color w:val="1A1A1A"/>
+                <w:sz w:val="20"/>
+                <w:szCs w:val="20"/>
+                <w:caps w:val="false"/>
+                <w:rFonts w:ascii="Calibri" w:cs="Calibri" w:eastAsia="Calibri" w:hAnsi="Calibri"/>
+              </w:rPr>
+              <w:t xml:space="preserve">Explains the link</w:t>
+            </w:r>
+          </w:p>
+        </w:tc>
+      </w:tr>
+      <w:tr>
+        <w:tc>
+          <w:tcPr>
+            <w:tcW w:type="dxa" w:w="1800"/>
+            <w:tcBorders>
+              <w:top w:val="single" w:color="D9D5C8" w:sz="4"/>
+              <w:left w:val="single" w:color="D9D5C8" w:sz="4"/>
+              <w:bottom w:val="single" w:color="D9D5C8" w:sz="4"/>
+              <w:right w:val="single" w:color="D9D5C8" w:sz="4"/>
+            </w:tcBorders>
+            <w:tcMar>
+              <w:top w:type="dxa" w:w="55"/>
+              <w:left w:type="dxa" w:w="110"/>
+              <w:bottom w:type="dxa" w:w="55"/>
+              <w:right w:type="dxa" w:w="110"/>
+            </w:tcMar>
+          </w:tcPr>
+          <w:p>
+            <w:pPr>
+              <w:spacing w:after="0"/>
+            </w:pPr>
+            <w:r>
+              <w:rPr>
+                <w:b w:val="false"/>
+                <w:bCs w:val="false"/>
+                <w:i w:val="false"/>
+                <w:iCs w:val="false"/>
+                <w:color w:val="1A1A1A"/>
+                <w:sz w:val="20"/>
+                <w:szCs w:val="20"/>
+                <w:caps w:val="false"/>
+                <w:rFonts w:ascii="Calibri" w:cs="Calibri" w:eastAsia="Calibri" w:hAnsi="Calibri"/>
+              </w:rPr>
+              <w:t xml:space="preserve">2 — Developing</w:t>
+            </w:r>
+          </w:p>
+        </w:tc>
+        <w:tc>
+          <w:tcPr>
+            <w:tcW w:type="dxa" w:w="2664"/>
+            <w:tcBorders>
+              <w:top w:val="single" w:color="D9D5C8" w:sz="4"/>
+              <w:left w:val="single" w:color="D9D5C8" w:sz="4"/>
+              <w:bottom w:val="single" w:color="D9D5C8" w:sz="4"/>
+              <w:right w:val="single" w:color="D9D5C8" w:sz="4"/>
+            </w:tcBorders>
+            <w:tcMar>
+              <w:top w:type="dxa" w:w="55"/>
+              <w:left w:type="dxa" w:w="110"/>
+              <w:bottom w:type="dxa" w:w="55"/>
+              <w:right w:type="dxa" w:w="110"/>
+            </w:tcMar>
+          </w:tcPr>
+          <w:p>
+            <w:pPr>
+              <w:spacing w:after="0"/>
+            </w:pPr>
+            <w:r>
+              <w:rPr>
+                <w:b w:val="false"/>
+                <w:bCs w:val="false"/>
+                <w:i w:val="false"/>
+                <w:iCs w:val="false"/>
+                <w:color w:val="1A1A1A"/>
+                <w:sz w:val="20"/>
+                <w:szCs w:val="20"/>
+                <w:caps w:val="false"/>
+                <w:rFonts w:ascii="Calibri" w:cs="Calibri" w:eastAsia="Calibri" w:hAnsi="Calibri"/>
+              </w:rPr>
+              <w:t xml:space="preserve">General</w:t>
+            </w:r>
+          </w:p>
+        </w:tc>
+        <w:tc>
+          <w:tcPr>
+            <w:tcW w:type="dxa" w:w="2664"/>
+            <w:tcBorders>
+              <w:top w:val="single" w:color="D9D5C8" w:sz="4"/>
+              <w:left w:val="single" w:color="D9D5C8" w:sz="4"/>
+              <w:bottom w:val="single" w:color="D9D5C8" w:sz="4"/>
+              <w:right w:val="single" w:color="D9D5C8" w:sz="4"/>
+            </w:tcBorders>
+            <w:tcMar>
+              <w:top w:type="dxa" w:w="55"/>
+              <w:left w:type="dxa" w:w="110"/>
+              <w:bottom w:type="dxa" w:w="55"/>
+              <w:right w:type="dxa" w:w="110"/>
+            </w:tcMar>
+          </w:tcPr>
+          <w:p>
+            <w:pPr>
+              <w:spacing w:after="0"/>
+            </w:pPr>
+            <w:r>
+              <w:rPr>
+                <w:b w:val="false"/>
+                <w:bCs w:val="false"/>
+                <w:i w:val="false"/>
+                <w:iCs w:val="false"/>
+                <w:color w:val="1A1A1A"/>
+                <w:sz w:val="20"/>
+                <w:szCs w:val="20"/>
+                <w:caps w:val="false"/>
+                <w:rFonts w:ascii="Calibri" w:cs="Calibri" w:eastAsia="Calibri" w:hAnsi="Calibri"/>
+              </w:rPr>
+              <w:t xml:space="preserve">1 accurate</w:t>
+            </w:r>
+          </w:p>
+        </w:tc>
+        <w:tc>
+          <w:tcPr>
+            <w:tcW w:type="dxa" w:w="2664"/>
+            <w:tcBorders>
+              <w:top w:val="single" w:color="D9D5C8" w:sz="4"/>
+              <w:left w:val="single" w:color="D9D5C8" w:sz="4"/>
+              <w:bottom w:val="single" w:color="D9D5C8" w:sz="4"/>
+              <w:right w:val="single" w:color="D9D5C8" w:sz="4"/>
+            </w:tcBorders>
+            <w:tcMar>
+              <w:top w:type="dxa" w:w="55"/>
+              <w:left w:type="dxa" w:w="110"/>
+              <w:bottom w:type="dxa" w:w="55"/>
+              <w:right w:type="dxa" w:w="110"/>
+            </w:tcMar>
+          </w:tcPr>
+          <w:p>
+            <w:pPr>
+              <w:spacing w:after="0"/>
+            </w:pPr>
+            <w:r>
+              <w:rPr>
+                <w:b w:val="false"/>
+                <w:bCs w:val="false"/>
+                <w:i w:val="false"/>
+                <w:iCs w:val="false"/>
+                <w:color w:val="1A1A1A"/>
+                <w:sz w:val="20"/>
+                <w:szCs w:val="20"/>
+                <w:caps w:val="false"/>
+                <w:rFonts w:ascii="Calibri" w:cs="Calibri" w:eastAsia="Calibri" w:hAnsi="Calibri"/>
+              </w:rPr>
+              <w:t xml:space="preserve">Partial link</w:t>
+            </w:r>
+          </w:p>
+        </w:tc>
+      </w:tr>
+      <w:tr>
+        <w:tc>
+          <w:tcPr>
+            <w:tcW w:type="dxa" w:w="1800"/>
+            <w:tcBorders>
+              <w:top w:val="single" w:color="D9D5C8" w:sz="4"/>
+              <w:left w:val="single" w:color="D9D5C8" w:sz="4"/>
+              <w:bottom w:val="single" w:color="D9D5C8" w:sz="4"/>
+              <w:right w:val="single" w:color="D9D5C8" w:sz="4"/>
+            </w:tcBorders>
+            <w:tcMar>
+              <w:top w:type="dxa" w:w="55"/>
+              <w:left w:type="dxa" w:w="110"/>
+              <w:bottom w:type="dxa" w:w="55"/>
+              <w:right w:type="dxa" w:w="110"/>
+            </w:tcMar>
+          </w:tcPr>
+          <w:p>
+            <w:pPr>
+              <w:spacing w:after="0"/>
+            </w:pPr>
+            <w:r>
+              <w:rPr>
+                <w:b w:val="false"/>
+                <w:bCs w:val="false"/>
+                <w:i w:val="false"/>
+                <w:iCs w:val="false"/>
+                <w:color w:val="1A1A1A"/>
+                <w:sz w:val="20"/>
+                <w:szCs w:val="20"/>
+                <w:caps w:val="false"/>
+                <w:rFonts w:ascii="Calibri" w:cs="Calibri" w:eastAsia="Calibri" w:hAnsi="Calibri"/>
+              </w:rPr>
+              <w:t xml:space="preserve">1 — Beginning</w:t>
+            </w:r>
+          </w:p>
+        </w:tc>
+        <w:tc>
+          <w:tcPr>
+            <w:tcW w:type="dxa" w:w="2664"/>
+            <w:tcBorders>
+              <w:top w:val="single" w:color="D9D5C8" w:sz="4"/>
+              <w:left w:val="single" w:color="D9D5C8" w:sz="4"/>
+              <w:bottom w:val="single" w:color="D9D5C8" w:sz="4"/>
+              <w:right w:val="single" w:color="D9D5C8" w:sz="4"/>
+            </w:tcBorders>
+            <w:tcMar>
+              <w:top w:type="dxa" w:w="55"/>
+              <w:left w:type="dxa" w:w="110"/>
+              <w:bottom w:type="dxa" w:w="55"/>
+              <w:right w:type="dxa" w:w="110"/>
+            </w:tcMar>
+          </w:tcPr>
+          <w:p>
+            <w:pPr>
+              <w:spacing w:after="0"/>
+            </w:pPr>
+            <w:r>
+              <w:rPr>
+                <w:b w:val="false"/>
+                <w:bCs w:val="false"/>
+                <w:i w:val="false"/>
+                <w:iCs w:val="false"/>
+                <w:color w:val="1A1A1A"/>
+                <w:sz w:val="20"/>
+                <w:szCs w:val="20"/>
+                <w:caps w:val="false"/>
+                <w:rFonts w:ascii="Calibri" w:cs="Calibri" w:eastAsia="Calibri" w:hAnsi="Calibri"/>
+              </w:rPr>
+              <w:t xml:space="preserve">Unclear / missing</w:t>
+            </w:r>
+          </w:p>
+        </w:tc>
+        <w:tc>
+          <w:tcPr>
+            <w:tcW w:type="dxa" w:w="2664"/>
+            <w:tcBorders>
+              <w:top w:val="single" w:color="D9D5C8" w:sz="4"/>
+              <w:left w:val="single" w:color="D9D5C8" w:sz="4"/>
+              <w:bottom w:val="single" w:color="D9D5C8" w:sz="4"/>
+              <w:right w:val="single" w:color="D9D5C8" w:sz="4"/>
+            </w:tcBorders>
+            <w:tcMar>
+              <w:top w:type="dxa" w:w="55"/>
+              <w:left w:type="dxa" w:w="110"/>
+              <w:bottom w:type="dxa" w:w="55"/>
+              <w:right w:type="dxa" w:w="110"/>
+            </w:tcMar>
+          </w:tcPr>
+          <w:p>
+            <w:pPr>
+              <w:spacing w:after="0"/>
+            </w:pPr>
+            <w:r>
+              <w:rPr>
+                <w:b w:val="false"/>
+                <w:bCs w:val="false"/>
+                <w:i w:val="false"/>
+                <w:iCs w:val="false"/>
+                <w:color w:val="1A1A1A"/>
+                <w:sz w:val="20"/>
+                <w:szCs w:val="20"/>
+                <w:caps w:val="false"/>
+                <w:rFonts w:ascii="Calibri" w:cs="Calibri" w:eastAsia="Calibri" w:hAnsi="Calibri"/>
+              </w:rPr>
+              <w:t xml:space="preserve">Missing / inaccurate</w:t>
+            </w:r>
+          </w:p>
+        </w:tc>
+        <w:tc>
+          <w:tcPr>
+            <w:tcW w:type="dxa" w:w="2664"/>
+            <w:tcBorders>
+              <w:top w:val="single" w:color="D9D5C8" w:sz="4"/>
+              <w:left w:val="single" w:color="D9D5C8" w:sz="4"/>
+              <w:bottom w:val="single" w:color="D9D5C8" w:sz="4"/>
+              <w:right w:val="single" w:color="D9D5C8" w:sz="4"/>
+            </w:tcBorders>
+            <w:tcMar>
+              <w:top w:type="dxa" w:w="55"/>
+              <w:left w:type="dxa" w:w="110"/>
+              <w:bottom w:type="dxa" w:w="55"/>
+              <w:right w:type="dxa" w:w="110"/>
+            </w:tcMar>
+          </w:tcPr>
+          <w:p>
+            <w:pPr>
+              <w:spacing w:after="0"/>
+            </w:pPr>
+            <w:r>
+              <w:rPr>
+                <w:b w:val="false"/>
+                <w:bCs w:val="false"/>
+                <w:i w:val="false"/>
+                <w:iCs w:val="false"/>
+                <w:color w:val="1A1A1A"/>
+                <w:sz w:val="20"/>
+                <w:szCs w:val="20"/>
+                <w:caps w:val="false"/>
+                <w:rFonts w:ascii="Calibri" w:cs="Calibri" w:eastAsia="Calibri" w:hAnsi="Calibri"/>
+              </w:rPr>
+              <w:t xml:space="preserve">No reasoning</w:t>
             </w:r>
           </w:p>
         </w:tc>
@@ -17899,7 +18841,7 @@
                 <w:caps w:val="false"/>
                 <w:rFonts w:ascii="Calibri" w:cs="Calibri" w:eastAsia="Calibri" w:hAnsi="Calibri"/>
               </w:rPr>
-              <w:t xml:space="preserve">SELF-CHECK against the CER rubric (see Toolkit)</w:t>
+              <w:t xml:space="preserve">MY SCORE</w:t>
             </w:r>
           </w:p>
           <w:p>
@@ -17918,12 +18860,365 @@
                 <w:caps w:val="false"/>
                 <w:rFonts w:ascii="Calibri" w:cs="Calibri" w:eastAsia="Calibri" w:hAnsi="Calibri"/>
               </w:rPr>
-              <w:t xml:space="preserve">Before submitting: Is my claim defensible? Do I have TWO specific pieces of evidence? Does my reasoning explain HOW the evidence proves the claim?</w:t>
+              <w:t xml:space="preserve">Claim: ____ / 4        Evidence: ____ / 4        Reasoning: ____ / 4        TOTAL: ____ / 12</w:t>
             </w:r>
           </w:p>
         </w:tc>
       </w:tr>
     </w:tbl>
+    <w:tbl>
+      <w:tblPr>
+        <w:tblW w:type="dxa" w:w="9792"/>
+        <w:tblBorders>
+          <w:top w:val="single" w:color="auto" w:sz="4"/>
+          <w:left w:val="single" w:color="auto" w:sz="4"/>
+          <w:bottom w:val="single" w:color="auto" w:sz="4"/>
+          <w:right w:val="single" w:color="auto" w:sz="4"/>
+          <w:insideH w:val="single" w:color="auto" w:sz="4"/>
+          <w:insideV w:val="single" w:color="auto" w:sz="4"/>
+        </w:tblBorders>
+      </w:tblPr>
+      <w:tblGrid>
+        <w:gridCol w:w="9792"/>
+      </w:tblGrid>
+      <w:tr>
+        <w:tc>
+          <w:tcPr>
+            <w:tcW w:type="dxa" w:w="9792"/>
+            <w:tcBorders>
+              <w:top w:val="single" w:color="D9D5C8" w:sz="4"/>
+              <w:left w:val="single" w:color="D9D5C8" w:sz="4"/>
+              <w:bottom w:val="single" w:color="D9D5C8" w:sz="4"/>
+              <w:right w:val="single" w:color="D9D5C8" w:sz="4"/>
+            </w:tcBorders>
+            <w:shd w:fill="F7F5EF" w:color="auto" w:val="clear"/>
+            <w:tcMar>
+              <w:top w:type="dxa" w:w="55"/>
+              <w:left w:type="dxa" w:w="110"/>
+              <w:bottom w:type="dxa" w:w="55"/>
+              <w:right w:type="dxa" w:w="110"/>
+            </w:tcMar>
+          </w:tcPr>
+          <w:p>
+            <w:pPr>
+              <w:spacing w:after="60"/>
+            </w:pPr>
+            <w:r>
+              <w:rPr>
+                <w:b/>
+                <w:bCs/>
+                <w:i w:val="false"/>
+                <w:iCs w:val="false"/>
+                <w:color w:val="1B2A4A"/>
+                <w:sz w:val="21"/>
+                <w:szCs w:val="21"/>
+                <w:caps w:val="false"/>
+                <w:rFonts w:ascii="Calibri" w:cs="Calibri" w:eastAsia="Calibri" w:hAnsi="Calibri"/>
+              </w:rPr>
+              <w:t xml:space="preserve">SUPPORTS — sentence frames (use if you need them)</w:t>
+            </w:r>
+          </w:p>
+          <w:p>
+            <w:pPr>
+              <w:spacing w:after="40"/>
+            </w:pPr>
+            <w:r>
+              <w:rPr>
+                <w:b w:val="false"/>
+                <w:bCs w:val="false"/>
+                <w:i w:val="false"/>
+                <w:iCs w:val="false"/>
+                <w:color w:val="1A1A1A"/>
+                <w:sz w:val="22"/>
+                <w:szCs w:val="22"/>
+                <w:caps w:val="false"/>
+                <w:rFonts w:ascii="Calibri" w:cs="Calibri" w:eastAsia="Calibri" w:hAnsi="Calibri"/>
+              </w:rPr>
+              <w:t xml:space="preserve">Claim: “______ because ______.”</w:t>
+            </w:r>
+          </w:p>
+          <w:p>
+            <w:pPr>
+              <w:spacing w:after="40"/>
+            </w:pPr>
+            <w:r>
+              <w:rPr>
+                <w:b w:val="false"/>
+                <w:bCs w:val="false"/>
+                <w:i w:val="false"/>
+                <w:iCs w:val="false"/>
+                <w:color w:val="1A1A1A"/>
+                <w:sz w:val="22"/>
+                <w:szCs w:val="22"/>
+                <w:caps w:val="false"/>
+                <w:rFonts w:ascii="Calibri" w:cs="Calibri" w:eastAsia="Calibri" w:hAnsi="Calibri"/>
+              </w:rPr>
+              <w:t xml:space="preserve">Evidence: “One example is ______ (from ______).  Another is ______.”</w:t>
+            </w:r>
+          </w:p>
+          <w:p>
+            <w:pPr>
+              <w:spacing w:after="40"/>
+            </w:pPr>
+            <w:r>
+              <w:rPr>
+                <w:b w:val="false"/>
+                <w:bCs w:val="false"/>
+                <w:i w:val="false"/>
+                <w:iCs w:val="false"/>
+                <w:color w:val="1A1A1A"/>
+                <w:sz w:val="22"/>
+                <w:szCs w:val="22"/>
+                <w:caps w:val="false"/>
+                <w:rFonts w:ascii="Calibri" w:cs="Calibri" w:eastAsia="Calibri" w:hAnsi="Calibri"/>
+              </w:rPr>
+              <w:t xml:space="preserve">Reasoning: “This proves my claim because ______, which shows ______.”</w:t>
+            </w:r>
+          </w:p>
+        </w:tc>
+      </w:tr>
+    </w:tbl>
+    <w:tbl>
+      <w:tblPr>
+        <w:tblW w:type="dxa" w:w="9792"/>
+        <w:tblBorders>
+          <w:top w:val="single" w:color="auto" w:sz="4"/>
+          <w:left w:val="single" w:color="auto" w:sz="4"/>
+          <w:bottom w:val="single" w:color="auto" w:sz="4"/>
+          <w:right w:val="single" w:color="auto" w:sz="4"/>
+          <w:insideH w:val="single" w:color="auto" w:sz="4"/>
+          <w:insideV w:val="single" w:color="auto" w:sz="4"/>
+        </w:tblBorders>
+      </w:tblPr>
+      <w:tblGrid>
+        <w:gridCol w:w="9792"/>
+      </w:tblGrid>
+      <w:tr>
+        <w:tc>
+          <w:tcPr>
+            <w:tcW w:type="dxa" w:w="9792"/>
+            <w:tcBorders>
+              <w:top w:val="single" w:color="D9D5C8" w:sz="4"/>
+              <w:left w:val="single" w:color="D9D5C8" w:sz="4"/>
+              <w:bottom w:val="single" w:color="D9D5C8" w:sz="4"/>
+              <w:right w:val="single" w:color="D9D5C8" w:sz="4"/>
+            </w:tcBorders>
+            <w:shd w:fill="F7F5EF" w:color="auto" w:val="clear"/>
+            <w:tcMar>
+              <w:top w:type="dxa" w:w="55"/>
+              <w:left w:type="dxa" w:w="110"/>
+              <w:bottom w:type="dxa" w:w="55"/>
+              <w:right w:type="dxa" w:w="110"/>
+            </w:tcMar>
+          </w:tcPr>
+          <w:p>
+            <w:pPr>
+              <w:spacing w:after="60"/>
+            </w:pPr>
+            <w:r>
+              <w:rPr>
+                <w:b/>
+                <w:bCs/>
+                <w:i w:val="false"/>
+                <w:iCs w:val="false"/>
+                <w:color w:val="1B2A4A"/>
+                <w:sz w:val="21"/>
+                <w:szCs w:val="21"/>
+                <w:caps w:val="false"/>
+                <w:rFonts w:ascii="Calibri" w:cs="Calibri" w:eastAsia="Calibri" w:hAnsi="Calibri"/>
+              </w:rPr>
+              <w:t xml:space="preserve">REVISE — make your lowest-scoring part stronger</w:t>
+            </w:r>
+          </w:p>
+          <w:p>
+            <w:pPr>
+              <w:spacing w:after="40"/>
+            </w:pPr>
+            <w:r>
+              <w:rPr>
+                <w:b w:val="false"/>
+                <w:bCs w:val="false"/>
+                <w:i w:val="false"/>
+                <w:iCs w:val="false"/>
+                <w:color w:val="1A1A1A"/>
+                <w:sz w:val="22"/>
+                <w:szCs w:val="22"/>
+                <w:caps w:val="false"/>
+                <w:rFonts w:ascii="Calibri" w:cs="Calibri" w:eastAsia="Calibri" w:hAnsi="Calibri"/>
+              </w:rPr>
+              <w:t xml:space="preserve">Pick the part you scored lowest and rewrite it here — better:</w:t>
+            </w:r>
+          </w:p>
+        </w:tc>
+      </w:tr>
+    </w:tbl>
+    <w:p>
+      <w:pPr>
+        <w:widowControl w:val="false"/>
+        <w:pBdr>
+          <w:bottom w:val="single" w:color="8892A0" w:sz="8" w:space="1"/>
+        </w:pBdr>
+        <w:spacing w:before="28" w:after="28"/>
+      </w:pPr>
+      <w:r>
+        <w:rPr>
+          <w:sz w:val="16"/>
+          <w:szCs w:val="16"/>
+          <w:rFonts w:ascii="Calibri" w:cs="Calibri" w:eastAsia="Calibri" w:hAnsi="Calibri"/>
+        </w:rPr>
+        <w:t xml:space="preserve"> </w:t>
+      </w:r>
+    </w:p>
+    <w:p>
+      <w:pPr>
+        <w:spacing w:before="0" w:after="0" w:line="50" w:lineRule="exact"/>
+      </w:pPr>
+      <w:r>
+        <w:rPr>
+          <w:sz w:val="2"/>
+          <w:szCs w:val="2"/>
+          <w:rFonts w:ascii="Calibri" w:cs="Calibri" w:eastAsia="Calibri" w:hAnsi="Calibri"/>
+        </w:rPr>
+        <w:t xml:space="preserve"> </w:t>
+      </w:r>
+    </w:p>
+    <w:p>
+      <w:pPr>
+        <w:widowControl w:val="false"/>
+        <w:pBdr>
+          <w:bottom w:val="single" w:color="8892A0" w:sz="8" w:space="1"/>
+        </w:pBdr>
+        <w:spacing w:before="28" w:after="28"/>
+      </w:pPr>
+      <w:r>
+        <w:rPr>
+          <w:sz w:val="16"/>
+          <w:szCs w:val="16"/>
+          <w:rFonts w:ascii="Calibri" w:cs="Calibri" w:eastAsia="Calibri" w:hAnsi="Calibri"/>
+        </w:rPr>
+        <w:t xml:space="preserve"> </w:t>
+      </w:r>
+    </w:p>
+    <w:p>
+      <w:pPr>
+        <w:spacing w:before="0" w:after="0" w:line="50" w:lineRule="exact"/>
+      </w:pPr>
+      <w:r>
+        <w:rPr>
+          <w:sz w:val="2"/>
+          <w:szCs w:val="2"/>
+          <w:rFonts w:ascii="Calibri" w:cs="Calibri" w:eastAsia="Calibri" w:hAnsi="Calibri"/>
+        </w:rPr>
+        <w:t xml:space="preserve"> </w:t>
+      </w:r>
+    </w:p>
+    <w:p>
+      <w:pPr>
+        <w:widowControl w:val="false"/>
+        <w:pBdr>
+          <w:bottom w:val="single" w:color="8892A0" w:sz="8" w:space="1"/>
+        </w:pBdr>
+        <w:spacing w:before="28" w:after="28"/>
+      </w:pPr>
+      <w:r>
+        <w:rPr>
+          <w:sz w:val="16"/>
+          <w:szCs w:val="16"/>
+          <w:rFonts w:ascii="Calibri" w:cs="Calibri" w:eastAsia="Calibri" w:hAnsi="Calibri"/>
+        </w:rPr>
+        <w:t xml:space="preserve"> </w:t>
+      </w:r>
+    </w:p>
+    <w:p>
+      <w:pPr>
+        <w:spacing w:before="0" w:after="0" w:line="50" w:lineRule="exact"/>
+      </w:pPr>
+      <w:r>
+        <w:rPr>
+          <w:sz w:val="2"/>
+          <w:szCs w:val="2"/>
+          <w:rFonts w:ascii="Calibri" w:cs="Calibri" w:eastAsia="Calibri" w:hAnsi="Calibri"/>
+        </w:rPr>
+        <w:t xml:space="preserve"> </w:t>
+      </w:r>
+    </w:p>
+    <w:p>
+      <w:pPr>
+        <w:widowControl w:val="false"/>
+        <w:pBdr>
+          <w:bottom w:val="single" w:color="8892A0" w:sz="8" w:space="1"/>
+        </w:pBdr>
+        <w:spacing w:before="28" w:after="28"/>
+      </w:pPr>
+      <w:r>
+        <w:rPr>
+          <w:sz w:val="16"/>
+          <w:szCs w:val="16"/>
+          <w:rFonts w:ascii="Calibri" w:cs="Calibri" w:eastAsia="Calibri" w:hAnsi="Calibri"/>
+        </w:rPr>
+        <w:t xml:space="preserve"> </w:t>
+      </w:r>
+    </w:p>
+    <w:p>
+      <w:pPr>
+        <w:spacing w:before="0" w:after="0" w:line="50" w:lineRule="exact"/>
+      </w:pPr>
+      <w:r>
+        <w:rPr>
+          <w:sz w:val="2"/>
+          <w:szCs w:val="2"/>
+          <w:rFonts w:ascii="Calibri" w:cs="Calibri" w:eastAsia="Calibri" w:hAnsi="Calibri"/>
+        </w:rPr>
+        <w:t xml:space="preserve"> </w:t>
+      </w:r>
+    </w:p>
+    <w:p>
+      <w:pPr>
+        <w:widowControl w:val="false"/>
+        <w:pBdr>
+          <w:bottom w:val="single" w:color="8892A0" w:sz="8" w:space="1"/>
+        </w:pBdr>
+        <w:spacing w:before="28" w:after="28"/>
+      </w:pPr>
+      <w:r>
+        <w:rPr>
+          <w:sz w:val="16"/>
+          <w:szCs w:val="16"/>
+          <w:rFonts w:ascii="Calibri" w:cs="Calibri" w:eastAsia="Calibri" w:hAnsi="Calibri"/>
+        </w:rPr>
+        <w:t xml:space="preserve"> </w:t>
+      </w:r>
+    </w:p>
+    <w:p>
+      <w:pPr>
+        <w:spacing w:before="0" w:after="0" w:line="50" w:lineRule="exact"/>
+      </w:pPr>
+      <w:r>
+        <w:rPr>
+          <w:sz w:val="2"/>
+          <w:szCs w:val="2"/>
+          <w:rFonts w:ascii="Calibri" w:cs="Calibri" w:eastAsia="Calibri" w:hAnsi="Calibri"/>
+        </w:rPr>
+        <w:t xml:space="preserve"> </w:t>
+      </w:r>
+    </w:p>
+    <w:p>
+      <w:pPr>
+        <w:widowControl w:val="false"/>
+        <w:pBdr>
+          <w:bottom w:val="single" w:color="8892A0" w:sz="8" w:space="1"/>
+        </w:pBdr>
+        <w:spacing w:before="28" w:after="28"/>
+      </w:pPr>
+      <w:r>
+        <w:rPr>
+          <w:sz w:val="16"/>
+          <w:szCs w:val="16"/>
+          <w:rFonts w:ascii="Calibri" w:cs="Calibri" w:eastAsia="Calibri" w:hAnsi="Calibri"/>
+        </w:rPr>
+        <w:t xml:space="preserve"> </w:t>
+      </w:r>
+    </w:p>
     <w:p>
       <w:pPr>
         <w:pStyle w:val="Heading2"/>
@@ -31620,61 +32915,19 @@
               <w:t xml:space="preserve"> </w:t>
             </w:r>
           </w:p>
-        </w:tc>
-      </w:tr>
-      <w:tr>
-        <w:tc>
-          <w:tcPr>
-            <w:tcW w:type="dxa" w:w="2233"/>
-            <w:tcBorders>
-              <w:top w:val="single" w:color="D9D5C8" w:sz="4"/>
-              <w:left w:val="single" w:color="D9D5C8" w:sz="4"/>
-              <w:bottom w:val="single" w:color="D9D5C8" w:sz="4"/>
-              <w:right w:val="single" w:color="D9D5C8" w:sz="4"/>
-            </w:tcBorders>
-            <w:tcMar>
-              <w:top w:type="dxa" w:w="55"/>
-              <w:left w:type="dxa" w:w="110"/>
-              <w:bottom w:type="dxa" w:w="55"/>
-              <w:right w:type="dxa" w:w="110"/>
-            </w:tcMar>
-          </w:tcPr>
-          <w:p>
-            <w:pPr>
-              <w:spacing w:after="0"/>
-            </w:pPr>
-            <w:r>
-              <w:rPr>
-                <w:b/>
-                <w:bCs/>
-                <w:i w:val="false"/>
-                <w:iCs w:val="false"/>
-                <w:color w:val="1A1A1A"/>
-                <w:sz w:val="20"/>
-                <w:szCs w:val="20"/>
-                <w:caps w:val="false"/>
-                <w:rFonts w:ascii="Calibri" w:cs="Calibri" w:eastAsia="Calibri" w:hAnsi="Calibri"/>
-              </w:rPr>
-              <w:t xml:space="preserve">Evidence (two specifics)</w:t>
-            </w:r>
-          </w:p>
-        </w:tc>
-        <w:tc>
-          <w:tcPr>
-            <w:tcW w:type="dxa" w:w="7559"/>
-            <w:tcBorders>
-              <w:top w:val="single" w:color="D9D5C8" w:sz="4"/>
-              <w:left w:val="single" w:color="D9D5C8" w:sz="4"/>
-              <w:bottom w:val="single" w:color="D9D5C8" w:sz="4"/>
-              <w:right w:val="single" w:color="D9D5C8" w:sz="4"/>
-            </w:tcBorders>
-            <w:tcMar>
-              <w:top w:type="dxa" w:w="55"/>
-              <w:left w:type="dxa" w:w="110"/>
-              <w:bottom w:type="dxa" w:w="55"/>
-              <w:right w:type="dxa" w:w="110"/>
-            </w:tcMar>
-          </w:tcPr>
+          <w:p>
+            <w:pPr>
+              <w:spacing w:before="0" w:after="0" w:line="50" w:lineRule="exact"/>
+            </w:pPr>
+            <w:r>
+              <w:rPr>
+                <w:sz w:val="2"/>
+                <w:szCs w:val="2"/>
+                <w:rFonts w:ascii="Calibri" w:cs="Calibri" w:eastAsia="Calibri" w:hAnsi="Calibri"/>
+              </w:rPr>
+              <w:t xml:space="preserve"> </w:t>
+            </w:r>
+          </w:p>
           <w:p>
             <w:pPr>
               <w:widowControl w:val="false"/>
@@ -31692,19 +32945,61 @@
               <w:t xml:space="preserve"> </w:t>
             </w:r>
           </w:p>
-          <w:p>
-            <w:pPr>
-              <w:spacing w:before="0" w:after="0" w:line="50" w:lineRule="exact"/>
-            </w:pPr>
-            <w:r>
-              <w:rPr>
-                <w:sz w:val="2"/>
-                <w:szCs w:val="2"/>
-                <w:rFonts w:ascii="Calibri" w:cs="Calibri" w:eastAsia="Calibri" w:hAnsi="Calibri"/>
-              </w:rPr>
-              <w:t xml:space="preserve"> </w:t>
-            </w:r>
-          </w:p>
+        </w:tc>
+      </w:tr>
+      <w:tr>
+        <w:tc>
+          <w:tcPr>
+            <w:tcW w:type="dxa" w:w="2233"/>
+            <w:tcBorders>
+              <w:top w:val="single" w:color="D9D5C8" w:sz="4"/>
+              <w:left w:val="single" w:color="D9D5C8" w:sz="4"/>
+              <w:bottom w:val="single" w:color="D9D5C8" w:sz="4"/>
+              <w:right w:val="single" w:color="D9D5C8" w:sz="4"/>
+            </w:tcBorders>
+            <w:tcMar>
+              <w:top w:type="dxa" w:w="55"/>
+              <w:left w:type="dxa" w:w="110"/>
+              <w:bottom w:type="dxa" w:w="55"/>
+              <w:right w:type="dxa" w:w="110"/>
+            </w:tcMar>
+          </w:tcPr>
+          <w:p>
+            <w:pPr>
+              <w:spacing w:after="0"/>
+            </w:pPr>
+            <w:r>
+              <w:rPr>
+                <w:b/>
+                <w:bCs/>
+                <w:i w:val="false"/>
+                <w:iCs w:val="false"/>
+                <w:color w:val="1A1A1A"/>
+                <w:sz w:val="20"/>
+                <w:szCs w:val="20"/>
+                <w:caps w:val="false"/>
+                <w:rFonts w:ascii="Calibri" w:cs="Calibri" w:eastAsia="Calibri" w:hAnsi="Calibri"/>
+              </w:rPr>
+              <w:t xml:space="preserve">Evidence (two specifics)</w:t>
+            </w:r>
+          </w:p>
+        </w:tc>
+        <w:tc>
+          <w:tcPr>
+            <w:tcW w:type="dxa" w:w="7559"/>
+            <w:tcBorders>
+              <w:top w:val="single" w:color="D9D5C8" w:sz="4"/>
+              <w:left w:val="single" w:color="D9D5C8" w:sz="4"/>
+              <w:bottom w:val="single" w:color="D9D5C8" w:sz="4"/>
+              <w:right w:val="single" w:color="D9D5C8" w:sz="4"/>
+            </w:tcBorders>
+            <w:tcMar>
+              <w:top w:type="dxa" w:w="55"/>
+              <w:left w:type="dxa" w:w="110"/>
+              <w:bottom w:type="dxa" w:w="55"/>
+              <w:right w:type="dxa" w:w="110"/>
+            </w:tcMar>
+          </w:tcPr>
           <w:p>
             <w:pPr>
               <w:widowControl w:val="false"/>
@@ -31812,61 +33107,19 @@
               <w:t xml:space="preserve"> </w:t>
             </w:r>
           </w:p>
-        </w:tc>
-      </w:tr>
-      <w:tr>
-        <w:tc>
-          <w:tcPr>
-            <w:tcW w:type="dxa" w:w="2233"/>
-            <w:tcBorders>
-              <w:top w:val="single" w:color="D9D5C8" w:sz="4"/>
-              <w:left w:val="single" w:color="D9D5C8" w:sz="4"/>
-              <w:bottom w:val="single" w:color="D9D5C8" w:sz="4"/>
-              <w:right w:val="single" w:color="D9D5C8" w:sz="4"/>
-            </w:tcBorders>
-            <w:tcMar>
-              <w:top w:type="dxa" w:w="55"/>
-              <w:left w:type="dxa" w:w="110"/>
-              <w:bottom w:type="dxa" w:w="55"/>
-              <w:right w:type="dxa" w:w="110"/>
-            </w:tcMar>
-          </w:tcPr>
-          <w:p>
-            <w:pPr>
-              <w:spacing w:after="0"/>
-            </w:pPr>
-            <w:r>
-              <w:rPr>
-                <w:b/>
-                <w:bCs/>
-                <w:i w:val="false"/>
-                <w:iCs w:val="false"/>
-                <w:color w:val="1A1A1A"/>
-                <w:sz w:val="20"/>
-                <w:szCs w:val="20"/>
-                <w:caps w:val="false"/>
-                <w:rFonts w:ascii="Calibri" w:cs="Calibri" w:eastAsia="Calibri" w:hAnsi="Calibri"/>
-              </w:rPr>
-              <w:t xml:space="preserve">Reasoning</w:t>
-            </w:r>
-          </w:p>
-        </w:tc>
-        <w:tc>
-          <w:tcPr>
-            <w:tcW w:type="dxa" w:w="7559"/>
-            <w:tcBorders>
-              <w:top w:val="single" w:color="D9D5C8" w:sz="4"/>
-              <w:left w:val="single" w:color="D9D5C8" w:sz="4"/>
-              <w:bottom w:val="single" w:color="D9D5C8" w:sz="4"/>
-              <w:right w:val="single" w:color="D9D5C8" w:sz="4"/>
-            </w:tcBorders>
-            <w:tcMar>
-              <w:top w:type="dxa" w:w="55"/>
-              <w:left w:type="dxa" w:w="110"/>
-              <w:bottom w:type="dxa" w:w="55"/>
-              <w:right w:type="dxa" w:w="110"/>
-            </w:tcMar>
-          </w:tcPr>
+          <w:p>
+            <w:pPr>
+              <w:spacing w:before="0" w:after="0" w:line="50" w:lineRule="exact"/>
+            </w:pPr>
+            <w:r>
+              <w:rPr>
+                <w:sz w:val="2"/>
+                <w:szCs w:val="2"/>
+                <w:rFonts w:ascii="Calibri" w:cs="Calibri" w:eastAsia="Calibri" w:hAnsi="Calibri"/>
+              </w:rPr>
+              <w:t xml:space="preserve"> </w:t>
+            </w:r>
+          </w:p>
           <w:p>
             <w:pPr>
               <w:widowControl w:val="false"/>
@@ -31914,19 +33167,61 @@
               <w:t xml:space="preserve"> </w:t>
             </w:r>
           </w:p>
-          <w:p>
-            <w:pPr>
-              <w:spacing w:before="0" w:after="0" w:line="50" w:lineRule="exact"/>
-            </w:pPr>
-            <w:r>
-              <w:rPr>
-                <w:sz w:val="2"/>
-                <w:szCs w:val="2"/>
-                <w:rFonts w:ascii="Calibri" w:cs="Calibri" w:eastAsia="Calibri" w:hAnsi="Calibri"/>
-              </w:rPr>
-              <w:t xml:space="preserve"> </w:t>
-            </w:r>
-          </w:p>
+        </w:tc>
+      </w:tr>
+      <w:tr>
+        <w:tc>
+          <w:tcPr>
+            <w:tcW w:type="dxa" w:w="2233"/>
+            <w:tcBorders>
+              <w:top w:val="single" w:color="D9D5C8" w:sz="4"/>
+              <w:left w:val="single" w:color="D9D5C8" w:sz="4"/>
+              <w:bottom w:val="single" w:color="D9D5C8" w:sz="4"/>
+              <w:right w:val="single" w:color="D9D5C8" w:sz="4"/>
+            </w:tcBorders>
+            <w:tcMar>
+              <w:top w:type="dxa" w:w="55"/>
+              <w:left w:type="dxa" w:w="110"/>
+              <w:bottom w:type="dxa" w:w="55"/>
+              <w:right w:type="dxa" w:w="110"/>
+            </w:tcMar>
+          </w:tcPr>
+          <w:p>
+            <w:pPr>
+              <w:spacing w:after="0"/>
+            </w:pPr>
+            <w:r>
+              <w:rPr>
+                <w:b/>
+                <w:bCs/>
+                <w:i w:val="false"/>
+                <w:iCs w:val="false"/>
+                <w:color w:val="1A1A1A"/>
+                <w:sz w:val="20"/>
+                <w:szCs w:val="20"/>
+                <w:caps w:val="false"/>
+                <w:rFonts w:ascii="Calibri" w:cs="Calibri" w:eastAsia="Calibri" w:hAnsi="Calibri"/>
+              </w:rPr>
+              <w:t xml:space="preserve">Reasoning</w:t>
+            </w:r>
+          </w:p>
+        </w:tc>
+        <w:tc>
+          <w:tcPr>
+            <w:tcW w:type="dxa" w:w="7559"/>
+            <w:tcBorders>
+              <w:top w:val="single" w:color="D9D5C8" w:sz="4"/>
+              <w:left w:val="single" w:color="D9D5C8" w:sz="4"/>
+              <w:bottom w:val="single" w:color="D9D5C8" w:sz="4"/>
+              <w:right w:val="single" w:color="D9D5C8" w:sz="4"/>
+            </w:tcBorders>
+            <w:tcMar>
+              <w:top w:type="dxa" w:w="55"/>
+              <w:left w:type="dxa" w:w="110"/>
+              <w:bottom w:type="dxa" w:w="55"/>
+              <w:right w:type="dxa" w:w="110"/>
+            </w:tcMar>
+          </w:tcPr>
           <w:p>
             <w:pPr>
               <w:widowControl w:val="false"/>
@@ -31972,6 +33267,948 @@
                 <w:rFonts w:ascii="Calibri" w:cs="Calibri" w:eastAsia="Calibri" w:hAnsi="Calibri"/>
               </w:rPr>
               <w:t xml:space="preserve"> </w:t>
+            </w:r>
+          </w:p>
+          <w:p>
+            <w:pPr>
+              <w:spacing w:before="0" w:after="0" w:line="50" w:lineRule="exact"/>
+            </w:pPr>
+            <w:r>
+              <w:rPr>
+                <w:sz w:val="2"/>
+                <w:szCs w:val="2"/>
+                <w:rFonts w:ascii="Calibri" w:cs="Calibri" w:eastAsia="Calibri" w:hAnsi="Calibri"/>
+              </w:rPr>
+              <w:t xml:space="preserve"> </w:t>
+            </w:r>
+          </w:p>
+          <w:p>
+            <w:pPr>
+              <w:widowControl w:val="false"/>
+              <w:pBdr>
+                <w:bottom w:val="single" w:color="8892A0" w:sz="8" w:space="1"/>
+              </w:pBdr>
+              <w:spacing w:before="28" w:after="28"/>
+            </w:pPr>
+            <w:r>
+              <w:rPr>
+                <w:sz w:val="16"/>
+                <w:szCs w:val="16"/>
+                <w:rFonts w:ascii="Calibri" w:cs="Calibri" w:eastAsia="Calibri" w:hAnsi="Calibri"/>
+              </w:rPr>
+              <w:t xml:space="preserve"> </w:t>
+            </w:r>
+          </w:p>
+          <w:p>
+            <w:pPr>
+              <w:spacing w:before="0" w:after="0" w:line="50" w:lineRule="exact"/>
+            </w:pPr>
+            <w:r>
+              <w:rPr>
+                <w:sz w:val="2"/>
+                <w:szCs w:val="2"/>
+                <w:rFonts w:ascii="Calibri" w:cs="Calibri" w:eastAsia="Calibri" w:hAnsi="Calibri"/>
+              </w:rPr>
+              <w:t xml:space="preserve"> </w:t>
+            </w:r>
+          </w:p>
+          <w:p>
+            <w:pPr>
+              <w:widowControl w:val="false"/>
+              <w:pBdr>
+                <w:bottom w:val="single" w:color="8892A0" w:sz="8" w:space="1"/>
+              </w:pBdr>
+              <w:spacing w:before="28" w:after="28"/>
+            </w:pPr>
+            <w:r>
+              <w:rPr>
+                <w:sz w:val="16"/>
+                <w:szCs w:val="16"/>
+                <w:rFonts w:ascii="Calibri" w:cs="Calibri" w:eastAsia="Calibri" w:hAnsi="Calibri"/>
+              </w:rPr>
+              <w:t xml:space="preserve"> </w:t>
+            </w:r>
+          </w:p>
+          <w:p>
+            <w:pPr>
+              <w:spacing w:before="0" w:after="0" w:line="50" w:lineRule="exact"/>
+            </w:pPr>
+            <w:r>
+              <w:rPr>
+                <w:sz w:val="2"/>
+                <w:szCs w:val="2"/>
+                <w:rFonts w:ascii="Calibri" w:cs="Calibri" w:eastAsia="Calibri" w:hAnsi="Calibri"/>
+              </w:rPr>
+              <w:t xml:space="preserve"> </w:t>
+            </w:r>
+          </w:p>
+          <w:p>
+            <w:pPr>
+              <w:widowControl w:val="false"/>
+              <w:pBdr>
+                <w:bottom w:val="single" w:color="8892A0" w:sz="8" w:space="1"/>
+              </w:pBdr>
+              <w:spacing w:before="28" w:after="28"/>
+            </w:pPr>
+            <w:r>
+              <w:rPr>
+                <w:sz w:val="16"/>
+                <w:szCs w:val="16"/>
+                <w:rFonts w:ascii="Calibri" w:cs="Calibri" w:eastAsia="Calibri" w:hAnsi="Calibri"/>
+              </w:rPr>
+              <w:t xml:space="preserve"> </w:t>
+            </w:r>
+          </w:p>
+        </w:tc>
+      </w:tr>
+    </w:tbl>
+    <w:p>
+      <w:pPr>
+        <w:pStyle w:val="Heading2"/>
+        <w:keepNext/>
+        <w:pageBreakBefore/>
+        <w:spacing w:before="150" w:after="90"/>
+      </w:pPr>
+      <w:r>
+        <w:rPr>
+          <w:b/>
+          <w:bCs/>
+          <w:i w:val="false"/>
+          <w:iCs w:val="false"/>
+          <w:color w:val="1B2A4A"/>
+          <w:sz w:val="28"/>
+          <w:szCs w:val="28"/>
+          <w:caps w:val="false"/>
+          <w:rFonts w:ascii="Calibri" w:cs="Calibri" w:eastAsia="Calibri" w:hAnsi="Calibri"/>
+        </w:rPr>
+        <w:t xml:space="preserve">Constructed Response — self-grade &amp; supports — GC.17</w:t>
+      </w:r>
+    </w:p>
+    <w:tbl>
+      <w:tblPr>
+        <w:tblW w:type="dxa" w:w="9792"/>
+        <w:tblBorders>
+          <w:top w:val="single" w:color="auto" w:sz="4"/>
+          <w:left w:val="single" w:color="auto" w:sz="4"/>
+          <w:bottom w:val="single" w:color="auto" w:sz="4"/>
+          <w:right w:val="single" w:color="auto" w:sz="4"/>
+          <w:insideH w:val="single" w:color="auto" w:sz="4"/>
+          <w:insideV w:val="single" w:color="auto" w:sz="4"/>
+        </w:tblBorders>
+      </w:tblPr>
+      <w:tblGrid>
+        <w:gridCol w:w="9792"/>
+      </w:tblGrid>
+      <w:tr>
+        <w:tc>
+          <w:tcPr>
+            <w:tcW w:type="dxa" w:w="9792"/>
+            <w:tcBorders>
+              <w:top w:val="single" w:color="D9D5C8" w:sz="4"/>
+              <w:left w:val="single" w:color="D9D5C8" w:sz="4"/>
+              <w:bottom w:val="single" w:color="D9D5C8" w:sz="4"/>
+              <w:right w:val="single" w:color="D9D5C8" w:sz="4"/>
+            </w:tcBorders>
+            <w:shd w:fill="F7F5EF" w:color="auto" w:val="clear"/>
+            <w:tcMar>
+              <w:top w:type="dxa" w:w="55"/>
+              <w:left w:type="dxa" w:w="110"/>
+              <w:bottom w:type="dxa" w:w="55"/>
+              <w:right w:type="dxa" w:w="110"/>
+            </w:tcMar>
+          </w:tcPr>
+          <w:p>
+            <w:pPr>
+              <w:spacing w:after="60"/>
+            </w:pPr>
+            <w:r>
+              <w:rPr>
+                <w:b/>
+                <w:bCs/>
+                <w:i w:val="false"/>
+                <w:iCs w:val="false"/>
+                <w:color w:val="1B2A4A"/>
+                <w:sz w:val="21"/>
+                <w:szCs w:val="21"/>
+                <w:caps w:val="false"/>
+                <w:rFonts w:ascii="Calibri" w:cs="Calibri" w:eastAsia="Calibri" w:hAnsi="Calibri"/>
+              </w:rPr>
+              <w:t xml:space="preserve">SELF-GRADE — score your own CER against the rubric below</w:t>
+            </w:r>
+          </w:p>
+          <w:p>
+            <w:pPr>
+              <w:spacing w:after="40"/>
+            </w:pPr>
+            <w:r>
+              <w:rPr>
+                <w:b w:val="false"/>
+                <w:bCs w:val="false"/>
+                <w:i w:val="false"/>
+                <w:iCs w:val="false"/>
+                <w:color w:val="1A1A1A"/>
+                <w:sz w:val="22"/>
+                <w:szCs w:val="22"/>
+                <w:caps w:val="false"/>
+                <w:rFonts w:ascii="Calibri" w:cs="Calibri" w:eastAsia="Calibri" w:hAnsi="Calibri"/>
+              </w:rPr>
+              <w:t xml:space="preserve">Reread your response, then circle the level that best fits each part. Being honest here is how you level up.</w:t>
+            </w:r>
+          </w:p>
+        </w:tc>
+      </w:tr>
+    </w:tbl>
+    <w:tbl>
+      <w:tblPr>
+        <w:tblW w:type="dxa" w:w="9792"/>
+        <w:tblBorders>
+          <w:top w:val="single" w:color="auto" w:sz="4"/>
+          <w:left w:val="single" w:color="auto" w:sz="4"/>
+          <w:bottom w:val="single" w:color="auto" w:sz="4"/>
+          <w:right w:val="single" w:color="auto" w:sz="4"/>
+          <w:insideH w:val="single" w:color="auto" w:sz="4"/>
+          <w:insideV w:val="single" w:color="auto" w:sz="4"/>
+        </w:tblBorders>
+      </w:tblPr>
+      <w:tblGrid>
+        <w:gridCol w:w="1800"/>
+        <w:gridCol w:w="2664"/>
+        <w:gridCol w:w="2664"/>
+        <w:gridCol w:w="2664"/>
+      </w:tblGrid>
+      <w:tr>
+        <w:trPr>
+          <w:tblHeader/>
+        </w:trPr>
+        <w:tc>
+          <w:tcPr>
+            <w:tcW w:type="dxa" w:w="1800"/>
+            <w:tcBorders>
+              <w:top w:val="single" w:color="D9D5C8" w:sz="4"/>
+              <w:left w:val="single" w:color="D9D5C8" w:sz="4"/>
+              <w:bottom w:val="single" w:color="D9D5C8" w:sz="4"/>
+              <w:right w:val="single" w:color="D9D5C8" w:sz="4"/>
+            </w:tcBorders>
+            <w:shd w:fill="1B2A4A" w:color="auto" w:val="clear"/>
+            <w:tcMar>
+              <w:top w:type="dxa" w:w="55"/>
+              <w:left w:type="dxa" w:w="110"/>
+              <w:bottom w:type="dxa" w:w="55"/>
+              <w:right w:type="dxa" w:w="110"/>
+            </w:tcMar>
+          </w:tcPr>
+          <w:p>
+            <w:pPr>
+              <w:spacing w:after="0"/>
+            </w:pPr>
+            <w:r>
+              <w:rPr>
+                <w:b/>
+                <w:bCs/>
+                <w:i w:val="false"/>
+                <w:iCs w:val="false"/>
+                <w:color w:val="FFFFFF"/>
+                <w:sz w:val="19"/>
+                <w:szCs w:val="19"/>
+                <w:caps w:val="false"/>
+                <w:rFonts w:ascii="Calibri" w:cs="Calibri" w:eastAsia="Calibri" w:hAnsi="Calibri"/>
+              </w:rPr>
+              <w:t xml:space="preserve">Level</w:t>
+            </w:r>
+          </w:p>
+        </w:tc>
+        <w:tc>
+          <w:tcPr>
+            <w:tcW w:type="dxa" w:w="2664"/>
+            <w:tcBorders>
+              <w:top w:val="single" w:color="D9D5C8" w:sz="4"/>
+              <w:left w:val="single" w:color="D9D5C8" w:sz="4"/>
+              <w:bottom w:val="single" w:color="D9D5C8" w:sz="4"/>
+              <w:right w:val="single" w:color="D9D5C8" w:sz="4"/>
+            </w:tcBorders>
+            <w:shd w:fill="1B2A4A" w:color="auto" w:val="clear"/>
+            <w:tcMar>
+              <w:top w:type="dxa" w:w="55"/>
+              <w:left w:type="dxa" w:w="110"/>
+              <w:bottom w:type="dxa" w:w="55"/>
+              <w:right w:type="dxa" w:w="110"/>
+            </w:tcMar>
+          </w:tcPr>
+          <w:p>
+            <w:pPr>
+              <w:spacing w:after="0"/>
+            </w:pPr>
+            <w:r>
+              <w:rPr>
+                <w:b/>
+                <w:bCs/>
+                <w:i w:val="false"/>
+                <w:iCs w:val="false"/>
+                <w:color w:val="FFFFFF"/>
+                <w:sz w:val="19"/>
+                <w:szCs w:val="19"/>
+                <w:caps w:val="false"/>
+                <w:rFonts w:ascii="Calibri" w:cs="Calibri" w:eastAsia="Calibri" w:hAnsi="Calibri"/>
+              </w:rPr>
+              <w:t xml:space="preserve">Claim</w:t>
+            </w:r>
+          </w:p>
+        </w:tc>
+        <w:tc>
+          <w:tcPr>
+            <w:tcW w:type="dxa" w:w="2664"/>
+            <w:tcBorders>
+              <w:top w:val="single" w:color="D9D5C8" w:sz="4"/>
+              <w:left w:val="single" w:color="D9D5C8" w:sz="4"/>
+              <w:bottom w:val="single" w:color="D9D5C8" w:sz="4"/>
+              <w:right w:val="single" w:color="D9D5C8" w:sz="4"/>
+            </w:tcBorders>
+            <w:shd w:fill="1B2A4A" w:color="auto" w:val="clear"/>
+            <w:tcMar>
+              <w:top w:type="dxa" w:w="55"/>
+              <w:left w:type="dxa" w:w="110"/>
+              <w:bottom w:type="dxa" w:w="55"/>
+              <w:right w:type="dxa" w:w="110"/>
+            </w:tcMar>
+          </w:tcPr>
+          <w:p>
+            <w:pPr>
+              <w:spacing w:after="0"/>
+            </w:pPr>
+            <w:r>
+              <w:rPr>
+                <w:b/>
+                <w:bCs/>
+                <w:i w:val="false"/>
+                <w:iCs w:val="false"/>
+                <w:color w:val="FFFFFF"/>
+                <w:sz w:val="19"/>
+                <w:szCs w:val="19"/>
+                <w:caps w:val="false"/>
+                <w:rFonts w:ascii="Calibri" w:cs="Calibri" w:eastAsia="Calibri" w:hAnsi="Calibri"/>
+              </w:rPr>
+              <w:t xml:space="preserve">Evidence</w:t>
+            </w:r>
+          </w:p>
+        </w:tc>
+        <w:tc>
+          <w:tcPr>
+            <w:tcW w:type="dxa" w:w="2664"/>
+            <w:tcBorders>
+              <w:top w:val="single" w:color="D9D5C8" w:sz="4"/>
+              <w:left w:val="single" w:color="D9D5C8" w:sz="4"/>
+              <w:bottom w:val="single" w:color="D9D5C8" w:sz="4"/>
+              <w:right w:val="single" w:color="D9D5C8" w:sz="4"/>
+            </w:tcBorders>
+            <w:shd w:fill="1B2A4A" w:color="auto" w:val="clear"/>
+            <w:tcMar>
+              <w:top w:type="dxa" w:w="55"/>
+              <w:left w:type="dxa" w:w="110"/>
+              <w:bottom w:type="dxa" w:w="55"/>
+              <w:right w:type="dxa" w:w="110"/>
+            </w:tcMar>
+          </w:tcPr>
+          <w:p>
+            <w:pPr>
+              <w:spacing w:after="0"/>
+            </w:pPr>
+            <w:r>
+              <w:rPr>
+                <w:b/>
+                <w:bCs/>
+                <w:i w:val="false"/>
+                <w:iCs w:val="false"/>
+                <w:color w:val="FFFFFF"/>
+                <w:sz w:val="19"/>
+                <w:szCs w:val="19"/>
+                <w:caps w:val="false"/>
+                <w:rFonts w:ascii="Calibri" w:cs="Calibri" w:eastAsia="Calibri" w:hAnsi="Calibri"/>
+              </w:rPr>
+              <w:t xml:space="preserve">Reasoning</w:t>
+            </w:r>
+          </w:p>
+        </w:tc>
+      </w:tr>
+      <w:tr>
+        <w:tc>
+          <w:tcPr>
+            <w:tcW w:type="dxa" w:w="1800"/>
+            <w:tcBorders>
+              <w:top w:val="single" w:color="D9D5C8" w:sz="4"/>
+              <w:left w:val="single" w:color="D9D5C8" w:sz="4"/>
+              <w:bottom w:val="single" w:color="D9D5C8" w:sz="4"/>
+              <w:right w:val="single" w:color="D9D5C8" w:sz="4"/>
+            </w:tcBorders>
+            <w:tcMar>
+              <w:top w:type="dxa" w:w="55"/>
+              <w:left w:type="dxa" w:w="110"/>
+              <w:bottom w:type="dxa" w:w="55"/>
+              <w:right w:type="dxa" w:w="110"/>
+            </w:tcMar>
+          </w:tcPr>
+          <w:p>
+            <w:pPr>
+              <w:spacing w:after="0"/>
+            </w:pPr>
+            <w:r>
+              <w:rPr>
+                <w:b w:val="false"/>
+                <w:bCs w:val="false"/>
+                <w:i w:val="false"/>
+                <w:iCs w:val="false"/>
+                <w:color w:val="1A1A1A"/>
+                <w:sz w:val="20"/>
+                <w:szCs w:val="20"/>
+                <w:caps w:val="false"/>
+                <w:rFonts w:ascii="Calibri" w:cs="Calibri" w:eastAsia="Calibri" w:hAnsi="Calibri"/>
+              </w:rPr>
+              <w:t xml:space="preserve">4 — Strong</w:t>
+            </w:r>
+          </w:p>
+        </w:tc>
+        <w:tc>
+          <w:tcPr>
+            <w:tcW w:type="dxa" w:w="2664"/>
+            <w:tcBorders>
+              <w:top w:val="single" w:color="D9D5C8" w:sz="4"/>
+              <w:left w:val="single" w:color="D9D5C8" w:sz="4"/>
+              <w:bottom w:val="single" w:color="D9D5C8" w:sz="4"/>
+              <w:right w:val="single" w:color="D9D5C8" w:sz="4"/>
+            </w:tcBorders>
+            <w:tcMar>
+              <w:top w:type="dxa" w:w="55"/>
+              <w:left w:type="dxa" w:w="110"/>
+              <w:bottom w:type="dxa" w:w="55"/>
+              <w:right w:type="dxa" w:w="110"/>
+            </w:tcMar>
+          </w:tcPr>
+          <w:p>
+            <w:pPr>
+              <w:spacing w:after="0"/>
+            </w:pPr>
+            <w:r>
+              <w:rPr>
+                <w:b w:val="false"/>
+                <w:bCs w:val="false"/>
+                <w:i w:val="false"/>
+                <w:iCs w:val="false"/>
+                <w:color w:val="1A1A1A"/>
+                <w:sz w:val="20"/>
+                <w:szCs w:val="20"/>
+                <w:caps w:val="false"/>
+                <w:rFonts w:ascii="Calibri" w:cs="Calibri" w:eastAsia="Calibri" w:hAnsi="Calibri"/>
+              </w:rPr>
+              <w:t xml:space="preserve">Precise, defensible</w:t>
+            </w:r>
+          </w:p>
+        </w:tc>
+        <w:tc>
+          <w:tcPr>
+            <w:tcW w:type="dxa" w:w="2664"/>
+            <w:tcBorders>
+              <w:top w:val="single" w:color="D9D5C8" w:sz="4"/>
+              <w:left w:val="single" w:color="D9D5C8" w:sz="4"/>
+              <w:bottom w:val="single" w:color="D9D5C8" w:sz="4"/>
+              <w:right w:val="single" w:color="D9D5C8" w:sz="4"/>
+            </w:tcBorders>
+            <w:tcMar>
+              <w:top w:type="dxa" w:w="55"/>
+              <w:left w:type="dxa" w:w="110"/>
+              <w:bottom w:type="dxa" w:w="55"/>
+              <w:right w:type="dxa" w:w="110"/>
+            </w:tcMar>
+          </w:tcPr>
+          <w:p>
+            <w:pPr>
+              <w:spacing w:after="0"/>
+            </w:pPr>
+            <w:r>
+              <w:rPr>
+                <w:b w:val="false"/>
+                <w:bCs w:val="false"/>
+                <w:i w:val="false"/>
+                <w:iCs w:val="false"/>
+                <w:color w:val="1A1A1A"/>
+                <w:sz w:val="20"/>
+                <w:szCs w:val="20"/>
+                <w:caps w:val="false"/>
+                <w:rFonts w:ascii="Calibri" w:cs="Calibri" w:eastAsia="Calibri" w:hAnsi="Calibri"/>
+              </w:rPr>
+              <w:t xml:space="preserve">2+ accurate, specific</w:t>
+            </w:r>
+          </w:p>
+        </w:tc>
+        <w:tc>
+          <w:tcPr>
+            <w:tcW w:type="dxa" w:w="2664"/>
+            <w:tcBorders>
+              <w:top w:val="single" w:color="D9D5C8" w:sz="4"/>
+              <w:left w:val="single" w:color="D9D5C8" w:sz="4"/>
+              <w:bottom w:val="single" w:color="D9D5C8" w:sz="4"/>
+              <w:right w:val="single" w:color="D9D5C8" w:sz="4"/>
+            </w:tcBorders>
+            <w:tcMar>
+              <w:top w:type="dxa" w:w="55"/>
+              <w:left w:type="dxa" w:w="110"/>
+              <w:bottom w:type="dxa" w:w="55"/>
+              <w:right w:type="dxa" w:w="110"/>
+            </w:tcMar>
+          </w:tcPr>
+          <w:p>
+            <w:pPr>
+              <w:spacing w:after="0"/>
+            </w:pPr>
+            <w:r>
+              <w:rPr>
+                <w:b w:val="false"/>
+                <w:bCs w:val="false"/>
+                <w:i w:val="false"/>
+                <w:iCs w:val="false"/>
+                <w:color w:val="1A1A1A"/>
+                <w:sz w:val="20"/>
+                <w:szCs w:val="20"/>
+                <w:caps w:val="false"/>
+                <w:rFonts w:ascii="Calibri" w:cs="Calibri" w:eastAsia="Calibri" w:hAnsi="Calibri"/>
+              </w:rPr>
+              <w:t xml:space="preserve">Explains HOW evidence proves the claim</w:t>
+            </w:r>
+          </w:p>
+        </w:tc>
+      </w:tr>
+      <w:tr>
+        <w:tc>
+          <w:tcPr>
+            <w:tcW w:type="dxa" w:w="1800"/>
+            <w:tcBorders>
+              <w:top w:val="single" w:color="D9D5C8" w:sz="4"/>
+              <w:left w:val="single" w:color="D9D5C8" w:sz="4"/>
+              <w:bottom w:val="single" w:color="D9D5C8" w:sz="4"/>
+              <w:right w:val="single" w:color="D9D5C8" w:sz="4"/>
+            </w:tcBorders>
+            <w:tcMar>
+              <w:top w:type="dxa" w:w="55"/>
+              <w:left w:type="dxa" w:w="110"/>
+              <w:bottom w:type="dxa" w:w="55"/>
+              <w:right w:type="dxa" w:w="110"/>
+            </w:tcMar>
+          </w:tcPr>
+          <w:p>
+            <w:pPr>
+              <w:spacing w:after="0"/>
+            </w:pPr>
+            <w:r>
+              <w:rPr>
+                <w:b w:val="false"/>
+                <w:bCs w:val="false"/>
+                <w:i w:val="false"/>
+                <w:iCs w:val="false"/>
+                <w:color w:val="1A1A1A"/>
+                <w:sz w:val="20"/>
+                <w:szCs w:val="20"/>
+                <w:caps w:val="false"/>
+                <w:rFonts w:ascii="Calibri" w:cs="Calibri" w:eastAsia="Calibri" w:hAnsi="Calibri"/>
+              </w:rPr>
+              <w:t xml:space="preserve">3 — Proficient</w:t>
+            </w:r>
+          </w:p>
+        </w:tc>
+        <w:tc>
+          <w:tcPr>
+            <w:tcW w:type="dxa" w:w="2664"/>
+            <w:tcBorders>
+              <w:top w:val="single" w:color="D9D5C8" w:sz="4"/>
+              <w:left w:val="single" w:color="D9D5C8" w:sz="4"/>
+              <w:bottom w:val="single" w:color="D9D5C8" w:sz="4"/>
+              <w:right w:val="single" w:color="D9D5C8" w:sz="4"/>
+            </w:tcBorders>
+            <w:tcMar>
+              <w:top w:type="dxa" w:w="55"/>
+              <w:left w:type="dxa" w:w="110"/>
+              <w:bottom w:type="dxa" w:w="55"/>
+              <w:right w:type="dxa" w:w="110"/>
+            </w:tcMar>
+          </w:tcPr>
+          <w:p>
+            <w:pPr>
+              <w:spacing w:after="0"/>
+            </w:pPr>
+            <w:r>
+              <w:rPr>
+                <w:b w:val="false"/>
+                <w:bCs w:val="false"/>
+                <w:i w:val="false"/>
+                <w:iCs w:val="false"/>
+                <w:color w:val="1A1A1A"/>
+                <w:sz w:val="20"/>
+                <w:szCs w:val="20"/>
+                <w:caps w:val="false"/>
+                <w:rFonts w:ascii="Calibri" w:cs="Calibri" w:eastAsia="Calibri" w:hAnsi="Calibri"/>
+              </w:rPr>
+              <w:t xml:space="preserve">Clear</w:t>
+            </w:r>
+          </w:p>
+        </w:tc>
+        <w:tc>
+          <w:tcPr>
+            <w:tcW w:type="dxa" w:w="2664"/>
+            <w:tcBorders>
+              <w:top w:val="single" w:color="D9D5C8" w:sz="4"/>
+              <w:left w:val="single" w:color="D9D5C8" w:sz="4"/>
+              <w:bottom w:val="single" w:color="D9D5C8" w:sz="4"/>
+              <w:right w:val="single" w:color="D9D5C8" w:sz="4"/>
+            </w:tcBorders>
+            <w:tcMar>
+              <w:top w:type="dxa" w:w="55"/>
+              <w:left w:type="dxa" w:w="110"/>
+              <w:bottom w:type="dxa" w:w="55"/>
+              <w:right w:type="dxa" w:w="110"/>
+            </w:tcMar>
+          </w:tcPr>
+          <w:p>
+            <w:pPr>
+              <w:spacing w:after="0"/>
+            </w:pPr>
+            <w:r>
+              <w:rPr>
+                <w:b w:val="false"/>
+                <w:bCs w:val="false"/>
+                <w:i w:val="false"/>
+                <w:iCs w:val="false"/>
+                <w:color w:val="1A1A1A"/>
+                <w:sz w:val="20"/>
+                <w:szCs w:val="20"/>
+                <w:caps w:val="false"/>
+                <w:rFonts w:ascii="Calibri" w:cs="Calibri" w:eastAsia="Calibri" w:hAnsi="Calibri"/>
+              </w:rPr>
+              <w:t xml:space="preserve">2 accurate</w:t>
+            </w:r>
+          </w:p>
+        </w:tc>
+        <w:tc>
+          <w:tcPr>
+            <w:tcW w:type="dxa" w:w="2664"/>
+            <w:tcBorders>
+              <w:top w:val="single" w:color="D9D5C8" w:sz="4"/>
+              <w:left w:val="single" w:color="D9D5C8" w:sz="4"/>
+              <w:bottom w:val="single" w:color="D9D5C8" w:sz="4"/>
+              <w:right w:val="single" w:color="D9D5C8" w:sz="4"/>
+            </w:tcBorders>
+            <w:tcMar>
+              <w:top w:type="dxa" w:w="55"/>
+              <w:left w:type="dxa" w:w="110"/>
+              <w:bottom w:type="dxa" w:w="55"/>
+              <w:right w:type="dxa" w:w="110"/>
+            </w:tcMar>
+          </w:tcPr>
+          <w:p>
+            <w:pPr>
+              <w:spacing w:after="0"/>
+            </w:pPr>
+            <w:r>
+              <w:rPr>
+                <w:b w:val="false"/>
+                <w:bCs w:val="false"/>
+                <w:i w:val="false"/>
+                <w:iCs w:val="false"/>
+                <w:color w:val="1A1A1A"/>
+                <w:sz w:val="20"/>
+                <w:szCs w:val="20"/>
+                <w:caps w:val="false"/>
+                <w:rFonts w:ascii="Calibri" w:cs="Calibri" w:eastAsia="Calibri" w:hAnsi="Calibri"/>
+              </w:rPr>
+              <w:t xml:space="preserve">Explains the link</w:t>
+            </w:r>
+          </w:p>
+        </w:tc>
+      </w:tr>
+      <w:tr>
+        <w:tc>
+          <w:tcPr>
+            <w:tcW w:type="dxa" w:w="1800"/>
+            <w:tcBorders>
+              <w:top w:val="single" w:color="D9D5C8" w:sz="4"/>
+              <w:left w:val="single" w:color="D9D5C8" w:sz="4"/>
+              <w:bottom w:val="single" w:color="D9D5C8" w:sz="4"/>
+              <w:right w:val="single" w:color="D9D5C8" w:sz="4"/>
+            </w:tcBorders>
+            <w:tcMar>
+              <w:top w:type="dxa" w:w="55"/>
+              <w:left w:type="dxa" w:w="110"/>
+              <w:bottom w:type="dxa" w:w="55"/>
+              <w:right w:type="dxa" w:w="110"/>
+            </w:tcMar>
+          </w:tcPr>
+          <w:p>
+            <w:pPr>
+              <w:spacing w:after="0"/>
+            </w:pPr>
+            <w:r>
+              <w:rPr>
+                <w:b w:val="false"/>
+                <w:bCs w:val="false"/>
+                <w:i w:val="false"/>
+                <w:iCs w:val="false"/>
+                <w:color w:val="1A1A1A"/>
+                <w:sz w:val="20"/>
+                <w:szCs w:val="20"/>
+                <w:caps w:val="false"/>
+                <w:rFonts w:ascii="Calibri" w:cs="Calibri" w:eastAsia="Calibri" w:hAnsi="Calibri"/>
+              </w:rPr>
+              <w:t xml:space="preserve">2 — Developing</w:t>
+            </w:r>
+          </w:p>
+        </w:tc>
+        <w:tc>
+          <w:tcPr>
+            <w:tcW w:type="dxa" w:w="2664"/>
+            <w:tcBorders>
+              <w:top w:val="single" w:color="D9D5C8" w:sz="4"/>
+              <w:left w:val="single" w:color="D9D5C8" w:sz="4"/>
+              <w:bottom w:val="single" w:color="D9D5C8" w:sz="4"/>
+              <w:right w:val="single" w:color="D9D5C8" w:sz="4"/>
+            </w:tcBorders>
+            <w:tcMar>
+              <w:top w:type="dxa" w:w="55"/>
+              <w:left w:type="dxa" w:w="110"/>
+              <w:bottom w:type="dxa" w:w="55"/>
+              <w:right w:type="dxa" w:w="110"/>
+            </w:tcMar>
+          </w:tcPr>
+          <w:p>
+            <w:pPr>
+              <w:spacing w:after="0"/>
+            </w:pPr>
+            <w:r>
+              <w:rPr>
+                <w:b w:val="false"/>
+                <w:bCs w:val="false"/>
+                <w:i w:val="false"/>
+                <w:iCs w:val="false"/>
+                <w:color w:val="1A1A1A"/>
+                <w:sz w:val="20"/>
+                <w:szCs w:val="20"/>
+                <w:caps w:val="false"/>
+                <w:rFonts w:ascii="Calibri" w:cs="Calibri" w:eastAsia="Calibri" w:hAnsi="Calibri"/>
+              </w:rPr>
+              <w:t xml:space="preserve">General</w:t>
+            </w:r>
+          </w:p>
+        </w:tc>
+        <w:tc>
+          <w:tcPr>
+            <w:tcW w:type="dxa" w:w="2664"/>
+            <w:tcBorders>
+              <w:top w:val="single" w:color="D9D5C8" w:sz="4"/>
+              <w:left w:val="single" w:color="D9D5C8" w:sz="4"/>
+              <w:bottom w:val="single" w:color="D9D5C8" w:sz="4"/>
+              <w:right w:val="single" w:color="D9D5C8" w:sz="4"/>
+            </w:tcBorders>
+            <w:tcMar>
+              <w:top w:type="dxa" w:w="55"/>
+              <w:left w:type="dxa" w:w="110"/>
+              <w:bottom w:type="dxa" w:w="55"/>
+              <w:right w:type="dxa" w:w="110"/>
+            </w:tcMar>
+          </w:tcPr>
+          <w:p>
+            <w:pPr>
+              <w:spacing w:after="0"/>
+            </w:pPr>
+            <w:r>
+              <w:rPr>
+                <w:b w:val="false"/>
+                <w:bCs w:val="false"/>
+                <w:i w:val="false"/>
+                <w:iCs w:val="false"/>
+                <w:color w:val="1A1A1A"/>
+                <w:sz w:val="20"/>
+                <w:szCs w:val="20"/>
+                <w:caps w:val="false"/>
+                <w:rFonts w:ascii="Calibri" w:cs="Calibri" w:eastAsia="Calibri" w:hAnsi="Calibri"/>
+              </w:rPr>
+              <w:t xml:space="preserve">1 accurate</w:t>
+            </w:r>
+          </w:p>
+        </w:tc>
+        <w:tc>
+          <w:tcPr>
+            <w:tcW w:type="dxa" w:w="2664"/>
+            <w:tcBorders>
+              <w:top w:val="single" w:color="D9D5C8" w:sz="4"/>
+              <w:left w:val="single" w:color="D9D5C8" w:sz="4"/>
+              <w:bottom w:val="single" w:color="D9D5C8" w:sz="4"/>
+              <w:right w:val="single" w:color="D9D5C8" w:sz="4"/>
+            </w:tcBorders>
+            <w:tcMar>
+              <w:top w:type="dxa" w:w="55"/>
+              <w:left w:type="dxa" w:w="110"/>
+              <w:bottom w:type="dxa" w:w="55"/>
+              <w:right w:type="dxa" w:w="110"/>
+            </w:tcMar>
+          </w:tcPr>
+          <w:p>
+            <w:pPr>
+              <w:spacing w:after="0"/>
+            </w:pPr>
+            <w:r>
+              <w:rPr>
+                <w:b w:val="false"/>
+                <w:bCs w:val="false"/>
+                <w:i w:val="false"/>
+                <w:iCs w:val="false"/>
+                <w:color w:val="1A1A1A"/>
+                <w:sz w:val="20"/>
+                <w:szCs w:val="20"/>
+                <w:caps w:val="false"/>
+                <w:rFonts w:ascii="Calibri" w:cs="Calibri" w:eastAsia="Calibri" w:hAnsi="Calibri"/>
+              </w:rPr>
+              <w:t xml:space="preserve">Partial link</w:t>
+            </w:r>
+          </w:p>
+        </w:tc>
+      </w:tr>
+      <w:tr>
+        <w:tc>
+          <w:tcPr>
+            <w:tcW w:type="dxa" w:w="1800"/>
+            <w:tcBorders>
+              <w:top w:val="single" w:color="D9D5C8" w:sz="4"/>
+              <w:left w:val="single" w:color="D9D5C8" w:sz="4"/>
+              <w:bottom w:val="single" w:color="D9D5C8" w:sz="4"/>
+              <w:right w:val="single" w:color="D9D5C8" w:sz="4"/>
+            </w:tcBorders>
+            <w:tcMar>
+              <w:top w:type="dxa" w:w="55"/>
+              <w:left w:type="dxa" w:w="110"/>
+              <w:bottom w:type="dxa" w:w="55"/>
+              <w:right w:type="dxa" w:w="110"/>
+            </w:tcMar>
+          </w:tcPr>
+          <w:p>
+            <w:pPr>
+              <w:spacing w:after="0"/>
+            </w:pPr>
+            <w:r>
+              <w:rPr>
+                <w:b w:val="false"/>
+                <w:bCs w:val="false"/>
+                <w:i w:val="false"/>
+                <w:iCs w:val="false"/>
+                <w:color w:val="1A1A1A"/>
+                <w:sz w:val="20"/>
+                <w:szCs w:val="20"/>
+                <w:caps w:val="false"/>
+                <w:rFonts w:ascii="Calibri" w:cs="Calibri" w:eastAsia="Calibri" w:hAnsi="Calibri"/>
+              </w:rPr>
+              <w:t xml:space="preserve">1 — Beginning</w:t>
+            </w:r>
+          </w:p>
+        </w:tc>
+        <w:tc>
+          <w:tcPr>
+            <w:tcW w:type="dxa" w:w="2664"/>
+            <w:tcBorders>
+              <w:top w:val="single" w:color="D9D5C8" w:sz="4"/>
+              <w:left w:val="single" w:color="D9D5C8" w:sz="4"/>
+              <w:bottom w:val="single" w:color="D9D5C8" w:sz="4"/>
+              <w:right w:val="single" w:color="D9D5C8" w:sz="4"/>
+            </w:tcBorders>
+            <w:tcMar>
+              <w:top w:type="dxa" w:w="55"/>
+              <w:left w:type="dxa" w:w="110"/>
+              <w:bottom w:type="dxa" w:w="55"/>
+              <w:right w:type="dxa" w:w="110"/>
+            </w:tcMar>
+          </w:tcPr>
+          <w:p>
+            <w:pPr>
+              <w:spacing w:after="0"/>
+            </w:pPr>
+            <w:r>
+              <w:rPr>
+                <w:b w:val="false"/>
+                <w:bCs w:val="false"/>
+                <w:i w:val="false"/>
+                <w:iCs w:val="false"/>
+                <w:color w:val="1A1A1A"/>
+                <w:sz w:val="20"/>
+                <w:szCs w:val="20"/>
+                <w:caps w:val="false"/>
+                <w:rFonts w:ascii="Calibri" w:cs="Calibri" w:eastAsia="Calibri" w:hAnsi="Calibri"/>
+              </w:rPr>
+              <w:t xml:space="preserve">Unclear / missing</w:t>
+            </w:r>
+          </w:p>
+        </w:tc>
+        <w:tc>
+          <w:tcPr>
+            <w:tcW w:type="dxa" w:w="2664"/>
+            <w:tcBorders>
+              <w:top w:val="single" w:color="D9D5C8" w:sz="4"/>
+              <w:left w:val="single" w:color="D9D5C8" w:sz="4"/>
+              <w:bottom w:val="single" w:color="D9D5C8" w:sz="4"/>
+              <w:right w:val="single" w:color="D9D5C8" w:sz="4"/>
+            </w:tcBorders>
+            <w:tcMar>
+              <w:top w:type="dxa" w:w="55"/>
+              <w:left w:type="dxa" w:w="110"/>
+              <w:bottom w:type="dxa" w:w="55"/>
+              <w:right w:type="dxa" w:w="110"/>
+            </w:tcMar>
+          </w:tcPr>
+          <w:p>
+            <w:pPr>
+              <w:spacing w:after="0"/>
+            </w:pPr>
+            <w:r>
+              <w:rPr>
+                <w:b w:val="false"/>
+                <w:bCs w:val="false"/>
+                <w:i w:val="false"/>
+                <w:iCs w:val="false"/>
+                <w:color w:val="1A1A1A"/>
+                <w:sz w:val="20"/>
+                <w:szCs w:val="20"/>
+                <w:caps w:val="false"/>
+                <w:rFonts w:ascii="Calibri" w:cs="Calibri" w:eastAsia="Calibri" w:hAnsi="Calibri"/>
+              </w:rPr>
+              <w:t xml:space="preserve">Missing / inaccurate</w:t>
+            </w:r>
+          </w:p>
+        </w:tc>
+        <w:tc>
+          <w:tcPr>
+            <w:tcW w:type="dxa" w:w="2664"/>
+            <w:tcBorders>
+              <w:top w:val="single" w:color="D9D5C8" w:sz="4"/>
+              <w:left w:val="single" w:color="D9D5C8" w:sz="4"/>
+              <w:bottom w:val="single" w:color="D9D5C8" w:sz="4"/>
+              <w:right w:val="single" w:color="D9D5C8" w:sz="4"/>
+            </w:tcBorders>
+            <w:tcMar>
+              <w:top w:type="dxa" w:w="55"/>
+              <w:left w:type="dxa" w:w="110"/>
+              <w:bottom w:type="dxa" w:w="55"/>
+              <w:right w:type="dxa" w:w="110"/>
+            </w:tcMar>
+          </w:tcPr>
+          <w:p>
+            <w:pPr>
+              <w:spacing w:after="0"/>
+            </w:pPr>
+            <w:r>
+              <w:rPr>
+                <w:b w:val="false"/>
+                <w:bCs w:val="false"/>
+                <w:i w:val="false"/>
+                <w:iCs w:val="false"/>
+                <w:color w:val="1A1A1A"/>
+                <w:sz w:val="20"/>
+                <w:szCs w:val="20"/>
+                <w:caps w:val="false"/>
+                <w:rFonts w:ascii="Calibri" w:cs="Calibri" w:eastAsia="Calibri" w:hAnsi="Calibri"/>
+              </w:rPr>
+              <w:t xml:space="preserve">No reasoning</w:t>
             </w:r>
           </w:p>
         </w:tc>
@@ -32026,7 +34263,7 @@
                 <w:caps w:val="false"/>
                 <w:rFonts w:ascii="Calibri" w:cs="Calibri" w:eastAsia="Calibri" w:hAnsi="Calibri"/>
               </w:rPr>
-              <w:t xml:space="preserve">SELF-CHECK against the CER rubric (see Toolkit)</w:t>
+              <w:t xml:space="preserve">MY SCORE</w:t>
             </w:r>
           </w:p>
           <w:p>
@@ -32045,12 +34282,365 @@
                 <w:caps w:val="false"/>
                 <w:rFonts w:ascii="Calibri" w:cs="Calibri" w:eastAsia="Calibri" w:hAnsi="Calibri"/>
               </w:rPr>
-              <w:t xml:space="preserve">Before submitting: Is my claim defensible? Do I have TWO specific pieces of evidence? Does my reasoning explain HOW the evidence proves the claim?</w:t>
+              <w:t xml:space="preserve">Claim: ____ / 4        Evidence: ____ / 4        Reasoning: ____ / 4        TOTAL: ____ / 12</w:t>
             </w:r>
           </w:p>
         </w:tc>
       </w:tr>
     </w:tbl>
+    <w:tbl>
+      <w:tblPr>
+        <w:tblW w:type="dxa" w:w="9792"/>
+        <w:tblBorders>
+          <w:top w:val="single" w:color="auto" w:sz="4"/>
+          <w:left w:val="single" w:color="auto" w:sz="4"/>
+          <w:bottom w:val="single" w:color="auto" w:sz="4"/>
+          <w:right w:val="single" w:color="auto" w:sz="4"/>
+          <w:insideH w:val="single" w:color="auto" w:sz="4"/>
+          <w:insideV w:val="single" w:color="auto" w:sz="4"/>
+        </w:tblBorders>
+      </w:tblPr>
+      <w:tblGrid>
+        <w:gridCol w:w="9792"/>
+      </w:tblGrid>
+      <w:tr>
+        <w:tc>
+          <w:tcPr>
+            <w:tcW w:type="dxa" w:w="9792"/>
+            <w:tcBorders>
+              <w:top w:val="single" w:color="D9D5C8" w:sz="4"/>
+              <w:left w:val="single" w:color="D9D5C8" w:sz="4"/>
+              <w:bottom w:val="single" w:color="D9D5C8" w:sz="4"/>
+              <w:right w:val="single" w:color="D9D5C8" w:sz="4"/>
+            </w:tcBorders>
+            <w:shd w:fill="F7F5EF" w:color="auto" w:val="clear"/>
+            <w:tcMar>
+              <w:top w:type="dxa" w:w="55"/>
+              <w:left w:type="dxa" w:w="110"/>
+              <w:bottom w:type="dxa" w:w="55"/>
+              <w:right w:type="dxa" w:w="110"/>
+            </w:tcMar>
+          </w:tcPr>
+          <w:p>
+            <w:pPr>
+              <w:spacing w:after="60"/>
+            </w:pPr>
+            <w:r>
+              <w:rPr>
+                <w:b/>
+                <w:bCs/>
+                <w:i w:val="false"/>
+                <w:iCs w:val="false"/>
+                <w:color w:val="1B2A4A"/>
+                <w:sz w:val="21"/>
+                <w:szCs w:val="21"/>
+                <w:caps w:val="false"/>
+                <w:rFonts w:ascii="Calibri" w:cs="Calibri" w:eastAsia="Calibri" w:hAnsi="Calibri"/>
+              </w:rPr>
+              <w:t xml:space="preserve">SUPPORTS — sentence frames (use if you need them)</w:t>
+            </w:r>
+          </w:p>
+          <w:p>
+            <w:pPr>
+              <w:spacing w:after="40"/>
+            </w:pPr>
+            <w:r>
+              <w:rPr>
+                <w:b w:val="false"/>
+                <w:bCs w:val="false"/>
+                <w:i w:val="false"/>
+                <w:iCs w:val="false"/>
+                <w:color w:val="1A1A1A"/>
+                <w:sz w:val="22"/>
+                <w:szCs w:val="22"/>
+                <w:caps w:val="false"/>
+                <w:rFonts w:ascii="Calibri" w:cs="Calibri" w:eastAsia="Calibri" w:hAnsi="Calibri"/>
+              </w:rPr>
+              <w:t xml:space="preserve">Claim: “______ because ______.”</w:t>
+            </w:r>
+          </w:p>
+          <w:p>
+            <w:pPr>
+              <w:spacing w:after="40"/>
+            </w:pPr>
+            <w:r>
+              <w:rPr>
+                <w:b w:val="false"/>
+                <w:bCs w:val="false"/>
+                <w:i w:val="false"/>
+                <w:iCs w:val="false"/>
+                <w:color w:val="1A1A1A"/>
+                <w:sz w:val="22"/>
+                <w:szCs w:val="22"/>
+                <w:caps w:val="false"/>
+                <w:rFonts w:ascii="Calibri" w:cs="Calibri" w:eastAsia="Calibri" w:hAnsi="Calibri"/>
+              </w:rPr>
+              <w:t xml:space="preserve">Evidence: “One example is ______ (from ______).  Another is ______.”</w:t>
+            </w:r>
+          </w:p>
+          <w:p>
+            <w:pPr>
+              <w:spacing w:after="40"/>
+            </w:pPr>
+            <w:r>
+              <w:rPr>
+                <w:b w:val="false"/>
+                <w:bCs w:val="false"/>
+                <w:i w:val="false"/>
+                <w:iCs w:val="false"/>
+                <w:color w:val="1A1A1A"/>
+                <w:sz w:val="22"/>
+                <w:szCs w:val="22"/>
+                <w:caps w:val="false"/>
+                <w:rFonts w:ascii="Calibri" w:cs="Calibri" w:eastAsia="Calibri" w:hAnsi="Calibri"/>
+              </w:rPr>
+              <w:t xml:space="preserve">Reasoning: “This proves my claim because ______, which shows ______.”</w:t>
+            </w:r>
+          </w:p>
+        </w:tc>
+      </w:tr>
+    </w:tbl>
+    <w:tbl>
+      <w:tblPr>
+        <w:tblW w:type="dxa" w:w="9792"/>
+        <w:tblBorders>
+          <w:top w:val="single" w:color="auto" w:sz="4"/>
+          <w:left w:val="single" w:color="auto" w:sz="4"/>
+          <w:bottom w:val="single" w:color="auto" w:sz="4"/>
+          <w:right w:val="single" w:color="auto" w:sz="4"/>
+          <w:insideH w:val="single" w:color="auto" w:sz="4"/>
+          <w:insideV w:val="single" w:color="auto" w:sz="4"/>
+        </w:tblBorders>
+      </w:tblPr>
+      <w:tblGrid>
+        <w:gridCol w:w="9792"/>
+      </w:tblGrid>
+      <w:tr>
+        <w:tc>
+          <w:tcPr>
+            <w:tcW w:type="dxa" w:w="9792"/>
+            <w:tcBorders>
+              <w:top w:val="single" w:color="D9D5C8" w:sz="4"/>
+              <w:left w:val="single" w:color="D9D5C8" w:sz="4"/>
+              <w:bottom w:val="single" w:color="D9D5C8" w:sz="4"/>
+              <w:right w:val="single" w:color="D9D5C8" w:sz="4"/>
+            </w:tcBorders>
+            <w:shd w:fill="F7F5EF" w:color="auto" w:val="clear"/>
+            <w:tcMar>
+              <w:top w:type="dxa" w:w="55"/>
+              <w:left w:type="dxa" w:w="110"/>
+              <w:bottom w:type="dxa" w:w="55"/>
+              <w:right w:type="dxa" w:w="110"/>
+            </w:tcMar>
+          </w:tcPr>
+          <w:p>
+            <w:pPr>
+              <w:spacing w:after="60"/>
+            </w:pPr>
+            <w:r>
+              <w:rPr>
+                <w:b/>
+                <w:bCs/>
+                <w:i w:val="false"/>
+                <w:iCs w:val="false"/>
+                <w:color w:val="1B2A4A"/>
+                <w:sz w:val="21"/>
+                <w:szCs w:val="21"/>
+                <w:caps w:val="false"/>
+                <w:rFonts w:ascii="Calibri" w:cs="Calibri" w:eastAsia="Calibri" w:hAnsi="Calibri"/>
+              </w:rPr>
+              <w:t xml:space="preserve">REVISE — make your lowest-scoring part stronger</w:t>
+            </w:r>
+          </w:p>
+          <w:p>
+            <w:pPr>
+              <w:spacing w:after="40"/>
+            </w:pPr>
+            <w:r>
+              <w:rPr>
+                <w:b w:val="false"/>
+                <w:bCs w:val="false"/>
+                <w:i w:val="false"/>
+                <w:iCs w:val="false"/>
+                <w:color w:val="1A1A1A"/>
+                <w:sz w:val="22"/>
+                <w:szCs w:val="22"/>
+                <w:caps w:val="false"/>
+                <w:rFonts w:ascii="Calibri" w:cs="Calibri" w:eastAsia="Calibri" w:hAnsi="Calibri"/>
+              </w:rPr>
+              <w:t xml:space="preserve">Pick the part you scored lowest and rewrite it here — better:</w:t>
+            </w:r>
+          </w:p>
+        </w:tc>
+      </w:tr>
+    </w:tbl>
+    <w:p>
+      <w:pPr>
+        <w:widowControl w:val="false"/>
+        <w:pBdr>
+          <w:bottom w:val="single" w:color="8892A0" w:sz="8" w:space="1"/>
+        </w:pBdr>
+        <w:spacing w:before="28" w:after="28"/>
+      </w:pPr>
+      <w:r>
+        <w:rPr>
+          <w:sz w:val="16"/>
+          <w:szCs w:val="16"/>
+          <w:rFonts w:ascii="Calibri" w:cs="Calibri" w:eastAsia="Calibri" w:hAnsi="Calibri"/>
+        </w:rPr>
+        <w:t xml:space="preserve"> </w:t>
+      </w:r>
+    </w:p>
+    <w:p>
+      <w:pPr>
+        <w:spacing w:before="0" w:after="0" w:line="50" w:lineRule="exact"/>
+      </w:pPr>
+      <w:r>
+        <w:rPr>
+          <w:sz w:val="2"/>
+          <w:szCs w:val="2"/>
+          <w:rFonts w:ascii="Calibri" w:cs="Calibri" w:eastAsia="Calibri" w:hAnsi="Calibri"/>
+        </w:rPr>
+        <w:t xml:space="preserve"> </w:t>
+      </w:r>
+    </w:p>
+    <w:p>
+      <w:pPr>
+        <w:widowControl w:val="false"/>
+        <w:pBdr>
+          <w:bottom w:val="single" w:color="8892A0" w:sz="8" w:space="1"/>
+        </w:pBdr>
+        <w:spacing w:before="28" w:after="28"/>
+      </w:pPr>
+      <w:r>
+        <w:rPr>
+          <w:sz w:val="16"/>
+          <w:szCs w:val="16"/>
+          <w:rFonts w:ascii="Calibri" w:cs="Calibri" w:eastAsia="Calibri" w:hAnsi="Calibri"/>
+        </w:rPr>
+        <w:t xml:space="preserve"> </w:t>
+      </w:r>
+    </w:p>
+    <w:p>
+      <w:pPr>
+        <w:spacing w:before="0" w:after="0" w:line="50" w:lineRule="exact"/>
+      </w:pPr>
+      <w:r>
+        <w:rPr>
+          <w:sz w:val="2"/>
+          <w:szCs w:val="2"/>
+          <w:rFonts w:ascii="Calibri" w:cs="Calibri" w:eastAsia="Calibri" w:hAnsi="Calibri"/>
+        </w:rPr>
+        <w:t xml:space="preserve"> </w:t>
+      </w:r>
+    </w:p>
+    <w:p>
+      <w:pPr>
+        <w:widowControl w:val="false"/>
+        <w:pBdr>
+          <w:bottom w:val="single" w:color="8892A0" w:sz="8" w:space="1"/>
+        </w:pBdr>
+        <w:spacing w:before="28" w:after="28"/>
+      </w:pPr>
+      <w:r>
+        <w:rPr>
+          <w:sz w:val="16"/>
+          <w:szCs w:val="16"/>
+          <w:rFonts w:ascii="Calibri" w:cs="Calibri" w:eastAsia="Calibri" w:hAnsi="Calibri"/>
+        </w:rPr>
+        <w:t xml:space="preserve"> </w:t>
+      </w:r>
+    </w:p>
+    <w:p>
+      <w:pPr>
+        <w:spacing w:before="0" w:after="0" w:line="50" w:lineRule="exact"/>
+      </w:pPr>
+      <w:r>
+        <w:rPr>
+          <w:sz w:val="2"/>
+          <w:szCs w:val="2"/>
+          <w:rFonts w:ascii="Calibri" w:cs="Calibri" w:eastAsia="Calibri" w:hAnsi="Calibri"/>
+        </w:rPr>
+        <w:t xml:space="preserve"> </w:t>
+      </w:r>
+    </w:p>
+    <w:p>
+      <w:pPr>
+        <w:widowControl w:val="false"/>
+        <w:pBdr>
+          <w:bottom w:val="single" w:color="8892A0" w:sz="8" w:space="1"/>
+        </w:pBdr>
+        <w:spacing w:before="28" w:after="28"/>
+      </w:pPr>
+      <w:r>
+        <w:rPr>
+          <w:sz w:val="16"/>
+          <w:szCs w:val="16"/>
+          <w:rFonts w:ascii="Calibri" w:cs="Calibri" w:eastAsia="Calibri" w:hAnsi="Calibri"/>
+        </w:rPr>
+        <w:t xml:space="preserve"> </w:t>
+      </w:r>
+    </w:p>
+    <w:p>
+      <w:pPr>
+        <w:spacing w:before="0" w:after="0" w:line="50" w:lineRule="exact"/>
+      </w:pPr>
+      <w:r>
+        <w:rPr>
+          <w:sz w:val="2"/>
+          <w:szCs w:val="2"/>
+          <w:rFonts w:ascii="Calibri" w:cs="Calibri" w:eastAsia="Calibri" w:hAnsi="Calibri"/>
+        </w:rPr>
+        <w:t xml:space="preserve"> </w:t>
+      </w:r>
+    </w:p>
+    <w:p>
+      <w:pPr>
+        <w:widowControl w:val="false"/>
+        <w:pBdr>
+          <w:bottom w:val="single" w:color="8892A0" w:sz="8" w:space="1"/>
+        </w:pBdr>
+        <w:spacing w:before="28" w:after="28"/>
+      </w:pPr>
+      <w:r>
+        <w:rPr>
+          <w:sz w:val="16"/>
+          <w:szCs w:val="16"/>
+          <w:rFonts w:ascii="Calibri" w:cs="Calibri" w:eastAsia="Calibri" w:hAnsi="Calibri"/>
+        </w:rPr>
+        <w:t xml:space="preserve"> </w:t>
+      </w:r>
+    </w:p>
+    <w:p>
+      <w:pPr>
+        <w:spacing w:before="0" w:after="0" w:line="50" w:lineRule="exact"/>
+      </w:pPr>
+      <w:r>
+        <w:rPr>
+          <w:sz w:val="2"/>
+          <w:szCs w:val="2"/>
+          <w:rFonts w:ascii="Calibri" w:cs="Calibri" w:eastAsia="Calibri" w:hAnsi="Calibri"/>
+        </w:rPr>
+        <w:t xml:space="preserve"> </w:t>
+      </w:r>
+    </w:p>
+    <w:p>
+      <w:pPr>
+        <w:widowControl w:val="false"/>
+        <w:pBdr>
+          <w:bottom w:val="single" w:color="8892A0" w:sz="8" w:space="1"/>
+        </w:pBdr>
+        <w:spacing w:before="28" w:after="28"/>
+      </w:pPr>
+      <w:r>
+        <w:rPr>
+          <w:sz w:val="16"/>
+          <w:szCs w:val="16"/>
+          <w:rFonts w:ascii="Calibri" w:cs="Calibri" w:eastAsia="Calibri" w:hAnsi="Calibri"/>
+        </w:rPr>
+        <w:t xml:space="preserve"> </w:t>
+      </w:r>
+    </w:p>
     <w:p>
       <w:pPr>
         <w:pStyle w:val="Heading2"/>
@@ -45747,61 +48337,19 @@
               <w:t xml:space="preserve"> </w:t>
             </w:r>
           </w:p>
-        </w:tc>
-      </w:tr>
-      <w:tr>
-        <w:tc>
-          <w:tcPr>
-            <w:tcW w:type="dxa" w:w="2233"/>
-            <w:tcBorders>
-              <w:top w:val="single" w:color="D9D5C8" w:sz="4"/>
-              <w:left w:val="single" w:color="D9D5C8" w:sz="4"/>
-              <w:bottom w:val="single" w:color="D9D5C8" w:sz="4"/>
-              <w:right w:val="single" w:color="D9D5C8" w:sz="4"/>
-            </w:tcBorders>
-            <w:tcMar>
-              <w:top w:type="dxa" w:w="55"/>
-              <w:left w:type="dxa" w:w="110"/>
-              <w:bottom w:type="dxa" w:w="55"/>
-              <w:right w:type="dxa" w:w="110"/>
-            </w:tcMar>
-          </w:tcPr>
-          <w:p>
-            <w:pPr>
-              <w:spacing w:after="0"/>
-            </w:pPr>
-            <w:r>
-              <w:rPr>
-                <w:b/>
-                <w:bCs/>
-                <w:i w:val="false"/>
-                <w:iCs w:val="false"/>
-                <w:color w:val="1A1A1A"/>
-                <w:sz w:val="20"/>
-                <w:szCs w:val="20"/>
-                <w:caps w:val="false"/>
-                <w:rFonts w:ascii="Calibri" w:cs="Calibri" w:eastAsia="Calibri" w:hAnsi="Calibri"/>
-              </w:rPr>
-              <w:t xml:space="preserve">Evidence (two specifics)</w:t>
-            </w:r>
-          </w:p>
-        </w:tc>
-        <w:tc>
-          <w:tcPr>
-            <w:tcW w:type="dxa" w:w="7559"/>
-            <w:tcBorders>
-              <w:top w:val="single" w:color="D9D5C8" w:sz="4"/>
-              <w:left w:val="single" w:color="D9D5C8" w:sz="4"/>
-              <w:bottom w:val="single" w:color="D9D5C8" w:sz="4"/>
-              <w:right w:val="single" w:color="D9D5C8" w:sz="4"/>
-            </w:tcBorders>
-            <w:tcMar>
-              <w:top w:type="dxa" w:w="55"/>
-              <w:left w:type="dxa" w:w="110"/>
-              <w:bottom w:type="dxa" w:w="55"/>
-              <w:right w:type="dxa" w:w="110"/>
-            </w:tcMar>
-          </w:tcPr>
+          <w:p>
+            <w:pPr>
+              <w:spacing w:before="0" w:after="0" w:line="50" w:lineRule="exact"/>
+            </w:pPr>
+            <w:r>
+              <w:rPr>
+                <w:sz w:val="2"/>
+                <w:szCs w:val="2"/>
+                <w:rFonts w:ascii="Calibri" w:cs="Calibri" w:eastAsia="Calibri" w:hAnsi="Calibri"/>
+              </w:rPr>
+              <w:t xml:space="preserve"> </w:t>
+            </w:r>
+          </w:p>
           <w:p>
             <w:pPr>
               <w:widowControl w:val="false"/>
@@ -45819,19 +48367,61 @@
               <w:t xml:space="preserve"> </w:t>
             </w:r>
           </w:p>
-          <w:p>
-            <w:pPr>
-              <w:spacing w:before="0" w:after="0" w:line="50" w:lineRule="exact"/>
-            </w:pPr>
-            <w:r>
-              <w:rPr>
-                <w:sz w:val="2"/>
-                <w:szCs w:val="2"/>
-                <w:rFonts w:ascii="Calibri" w:cs="Calibri" w:eastAsia="Calibri" w:hAnsi="Calibri"/>
-              </w:rPr>
-              <w:t xml:space="preserve"> </w:t>
-            </w:r>
-          </w:p>
+        </w:tc>
+      </w:tr>
+      <w:tr>
+        <w:tc>
+          <w:tcPr>
+            <w:tcW w:type="dxa" w:w="2233"/>
+            <w:tcBorders>
+              <w:top w:val="single" w:color="D9D5C8" w:sz="4"/>
+              <w:left w:val="single" w:color="D9D5C8" w:sz="4"/>
+              <w:bottom w:val="single" w:color="D9D5C8" w:sz="4"/>
+              <w:right w:val="single" w:color="D9D5C8" w:sz="4"/>
+            </w:tcBorders>
+            <w:tcMar>
+              <w:top w:type="dxa" w:w="55"/>
+              <w:left w:type="dxa" w:w="110"/>
+              <w:bottom w:type="dxa" w:w="55"/>
+              <w:right w:type="dxa" w:w="110"/>
+            </w:tcMar>
+          </w:tcPr>
+          <w:p>
+            <w:pPr>
+              <w:spacing w:after="0"/>
+            </w:pPr>
+            <w:r>
+              <w:rPr>
+                <w:b/>
+                <w:bCs/>
+                <w:i w:val="false"/>
+                <w:iCs w:val="false"/>
+                <w:color w:val="1A1A1A"/>
+                <w:sz w:val="20"/>
+                <w:szCs w:val="20"/>
+                <w:caps w:val="false"/>
+                <w:rFonts w:ascii="Calibri" w:cs="Calibri" w:eastAsia="Calibri" w:hAnsi="Calibri"/>
+              </w:rPr>
+              <w:t xml:space="preserve">Evidence (two specifics)</w:t>
+            </w:r>
+          </w:p>
+        </w:tc>
+        <w:tc>
+          <w:tcPr>
+            <w:tcW w:type="dxa" w:w="7559"/>
+            <w:tcBorders>
+              <w:top w:val="single" w:color="D9D5C8" w:sz="4"/>
+              <w:left w:val="single" w:color="D9D5C8" w:sz="4"/>
+              <w:bottom w:val="single" w:color="D9D5C8" w:sz="4"/>
+              <w:right w:val="single" w:color="D9D5C8" w:sz="4"/>
+            </w:tcBorders>
+            <w:tcMar>
+              <w:top w:type="dxa" w:w="55"/>
+              <w:left w:type="dxa" w:w="110"/>
+              <w:bottom w:type="dxa" w:w="55"/>
+              <w:right w:type="dxa" w:w="110"/>
+            </w:tcMar>
+          </w:tcPr>
           <w:p>
             <w:pPr>
               <w:widowControl w:val="false"/>
@@ -45939,61 +48529,19 @@
               <w:t xml:space="preserve"> </w:t>
             </w:r>
           </w:p>
-        </w:tc>
-      </w:tr>
-      <w:tr>
-        <w:tc>
-          <w:tcPr>
-            <w:tcW w:type="dxa" w:w="2233"/>
-            <w:tcBorders>
-              <w:top w:val="single" w:color="D9D5C8" w:sz="4"/>
-              <w:left w:val="single" w:color="D9D5C8" w:sz="4"/>
-              <w:bottom w:val="single" w:color="D9D5C8" w:sz="4"/>
-              <w:right w:val="single" w:color="D9D5C8" w:sz="4"/>
-            </w:tcBorders>
-            <w:tcMar>
-              <w:top w:type="dxa" w:w="55"/>
-              <w:left w:type="dxa" w:w="110"/>
-              <w:bottom w:type="dxa" w:w="55"/>
-              <w:right w:type="dxa" w:w="110"/>
-            </w:tcMar>
-          </w:tcPr>
-          <w:p>
-            <w:pPr>
-              <w:spacing w:after="0"/>
-            </w:pPr>
-            <w:r>
-              <w:rPr>
-                <w:b/>
-                <w:bCs/>
-                <w:i w:val="false"/>
-                <w:iCs w:val="false"/>
-                <w:color w:val="1A1A1A"/>
-                <w:sz w:val="20"/>
-                <w:szCs w:val="20"/>
-                <w:caps w:val="false"/>
-                <w:rFonts w:ascii="Calibri" w:cs="Calibri" w:eastAsia="Calibri" w:hAnsi="Calibri"/>
-              </w:rPr>
-              <w:t xml:space="preserve">Reasoning</w:t>
-            </w:r>
-          </w:p>
-        </w:tc>
-        <w:tc>
-          <w:tcPr>
-            <w:tcW w:type="dxa" w:w="7559"/>
-            <w:tcBorders>
-              <w:top w:val="single" w:color="D9D5C8" w:sz="4"/>
-              <w:left w:val="single" w:color="D9D5C8" w:sz="4"/>
-              <w:bottom w:val="single" w:color="D9D5C8" w:sz="4"/>
-              <w:right w:val="single" w:color="D9D5C8" w:sz="4"/>
-            </w:tcBorders>
-            <w:tcMar>
-              <w:top w:type="dxa" w:w="55"/>
-              <w:left w:type="dxa" w:w="110"/>
-              <w:bottom w:type="dxa" w:w="55"/>
-              <w:right w:type="dxa" w:w="110"/>
-            </w:tcMar>
-          </w:tcPr>
+          <w:p>
+            <w:pPr>
+              <w:spacing w:before="0" w:after="0" w:line="50" w:lineRule="exact"/>
+            </w:pPr>
+            <w:r>
+              <w:rPr>
+                <w:sz w:val="2"/>
+                <w:szCs w:val="2"/>
+                <w:rFonts w:ascii="Calibri" w:cs="Calibri" w:eastAsia="Calibri" w:hAnsi="Calibri"/>
+              </w:rPr>
+              <w:t xml:space="preserve"> </w:t>
+            </w:r>
+          </w:p>
           <w:p>
             <w:pPr>
               <w:widowControl w:val="false"/>
@@ -46041,19 +48589,61 @@
               <w:t xml:space="preserve"> </w:t>
             </w:r>
           </w:p>
-          <w:p>
-            <w:pPr>
-              <w:spacing w:before="0" w:after="0" w:line="50" w:lineRule="exact"/>
-            </w:pPr>
-            <w:r>
-              <w:rPr>
-                <w:sz w:val="2"/>
-                <w:szCs w:val="2"/>
-                <w:rFonts w:ascii="Calibri" w:cs="Calibri" w:eastAsia="Calibri" w:hAnsi="Calibri"/>
-              </w:rPr>
-              <w:t xml:space="preserve"> </w:t>
-            </w:r>
-          </w:p>
+        </w:tc>
+      </w:tr>
+      <w:tr>
+        <w:tc>
+          <w:tcPr>
+            <w:tcW w:type="dxa" w:w="2233"/>
+            <w:tcBorders>
+              <w:top w:val="single" w:color="D9D5C8" w:sz="4"/>
+              <w:left w:val="single" w:color="D9D5C8" w:sz="4"/>
+              <w:bottom w:val="single" w:color="D9D5C8" w:sz="4"/>
+              <w:right w:val="single" w:color="D9D5C8" w:sz="4"/>
+            </w:tcBorders>
+            <w:tcMar>
+              <w:top w:type="dxa" w:w="55"/>
+              <w:left w:type="dxa" w:w="110"/>
+              <w:bottom w:type="dxa" w:w="55"/>
+              <w:right w:type="dxa" w:w="110"/>
+            </w:tcMar>
+          </w:tcPr>
+          <w:p>
+            <w:pPr>
+              <w:spacing w:after="0"/>
+            </w:pPr>
+            <w:r>
+              <w:rPr>
+                <w:b/>
+                <w:bCs/>
+                <w:i w:val="false"/>
+                <w:iCs w:val="false"/>
+                <w:color w:val="1A1A1A"/>
+                <w:sz w:val="20"/>
+                <w:szCs w:val="20"/>
+                <w:caps w:val="false"/>
+                <w:rFonts w:ascii="Calibri" w:cs="Calibri" w:eastAsia="Calibri" w:hAnsi="Calibri"/>
+              </w:rPr>
+              <w:t xml:space="preserve">Reasoning</w:t>
+            </w:r>
+          </w:p>
+        </w:tc>
+        <w:tc>
+          <w:tcPr>
+            <w:tcW w:type="dxa" w:w="7559"/>
+            <w:tcBorders>
+              <w:top w:val="single" w:color="D9D5C8" w:sz="4"/>
+              <w:left w:val="single" w:color="D9D5C8" w:sz="4"/>
+              <w:bottom w:val="single" w:color="D9D5C8" w:sz="4"/>
+              <w:right w:val="single" w:color="D9D5C8" w:sz="4"/>
+            </w:tcBorders>
+            <w:tcMar>
+              <w:top w:type="dxa" w:w="55"/>
+              <w:left w:type="dxa" w:w="110"/>
+              <w:bottom w:type="dxa" w:w="55"/>
+              <w:right w:type="dxa" w:w="110"/>
+            </w:tcMar>
+          </w:tcPr>
           <w:p>
             <w:pPr>
               <w:widowControl w:val="false"/>
@@ -46099,6 +48689,948 @@
                 <w:rFonts w:ascii="Calibri" w:cs="Calibri" w:eastAsia="Calibri" w:hAnsi="Calibri"/>
               </w:rPr>
               <w:t xml:space="preserve"> </w:t>
+            </w:r>
+          </w:p>
+          <w:p>
+            <w:pPr>
+              <w:spacing w:before="0" w:after="0" w:line="50" w:lineRule="exact"/>
+            </w:pPr>
+            <w:r>
+              <w:rPr>
+                <w:sz w:val="2"/>
+                <w:szCs w:val="2"/>
+                <w:rFonts w:ascii="Calibri" w:cs="Calibri" w:eastAsia="Calibri" w:hAnsi="Calibri"/>
+              </w:rPr>
+              <w:t xml:space="preserve"> </w:t>
+            </w:r>
+          </w:p>
+          <w:p>
+            <w:pPr>
+              <w:widowControl w:val="false"/>
+              <w:pBdr>
+                <w:bottom w:val="single" w:color="8892A0" w:sz="8" w:space="1"/>
+              </w:pBdr>
+              <w:spacing w:before="28" w:after="28"/>
+            </w:pPr>
+            <w:r>
+              <w:rPr>
+                <w:sz w:val="16"/>
+                <w:szCs w:val="16"/>
+                <w:rFonts w:ascii="Calibri" w:cs="Calibri" w:eastAsia="Calibri" w:hAnsi="Calibri"/>
+              </w:rPr>
+              <w:t xml:space="preserve"> </w:t>
+            </w:r>
+          </w:p>
+          <w:p>
+            <w:pPr>
+              <w:spacing w:before="0" w:after="0" w:line="50" w:lineRule="exact"/>
+            </w:pPr>
+            <w:r>
+              <w:rPr>
+                <w:sz w:val="2"/>
+                <w:szCs w:val="2"/>
+                <w:rFonts w:ascii="Calibri" w:cs="Calibri" w:eastAsia="Calibri" w:hAnsi="Calibri"/>
+              </w:rPr>
+              <w:t xml:space="preserve"> </w:t>
+            </w:r>
+          </w:p>
+          <w:p>
+            <w:pPr>
+              <w:widowControl w:val="false"/>
+              <w:pBdr>
+                <w:bottom w:val="single" w:color="8892A0" w:sz="8" w:space="1"/>
+              </w:pBdr>
+              <w:spacing w:before="28" w:after="28"/>
+            </w:pPr>
+            <w:r>
+              <w:rPr>
+                <w:sz w:val="16"/>
+                <w:szCs w:val="16"/>
+                <w:rFonts w:ascii="Calibri" w:cs="Calibri" w:eastAsia="Calibri" w:hAnsi="Calibri"/>
+              </w:rPr>
+              <w:t xml:space="preserve"> </w:t>
+            </w:r>
+          </w:p>
+          <w:p>
+            <w:pPr>
+              <w:spacing w:before="0" w:after="0" w:line="50" w:lineRule="exact"/>
+            </w:pPr>
+            <w:r>
+              <w:rPr>
+                <w:sz w:val="2"/>
+                <w:szCs w:val="2"/>
+                <w:rFonts w:ascii="Calibri" w:cs="Calibri" w:eastAsia="Calibri" w:hAnsi="Calibri"/>
+              </w:rPr>
+              <w:t xml:space="preserve"> </w:t>
+            </w:r>
+          </w:p>
+          <w:p>
+            <w:pPr>
+              <w:widowControl w:val="false"/>
+              <w:pBdr>
+                <w:bottom w:val="single" w:color="8892A0" w:sz="8" w:space="1"/>
+              </w:pBdr>
+              <w:spacing w:before="28" w:after="28"/>
+            </w:pPr>
+            <w:r>
+              <w:rPr>
+                <w:sz w:val="16"/>
+                <w:szCs w:val="16"/>
+                <w:rFonts w:ascii="Calibri" w:cs="Calibri" w:eastAsia="Calibri" w:hAnsi="Calibri"/>
+              </w:rPr>
+              <w:t xml:space="preserve"> </w:t>
+            </w:r>
+          </w:p>
+        </w:tc>
+      </w:tr>
+    </w:tbl>
+    <w:p>
+      <w:pPr>
+        <w:pStyle w:val="Heading2"/>
+        <w:keepNext/>
+        <w:pageBreakBefore/>
+        <w:spacing w:before="150" w:after="90"/>
+      </w:pPr>
+      <w:r>
+        <w:rPr>
+          <w:b/>
+          <w:bCs/>
+          <w:i w:val="false"/>
+          <w:iCs w:val="false"/>
+          <w:color w:val="1B2A4A"/>
+          <w:sz w:val="28"/>
+          <w:szCs w:val="28"/>
+          <w:caps w:val="false"/>
+          <w:rFonts w:ascii="Calibri" w:cs="Calibri" w:eastAsia="Calibri" w:hAnsi="Calibri"/>
+        </w:rPr>
+        <w:t xml:space="preserve">Constructed Response — self-grade &amp; supports — GC.18</w:t>
+      </w:r>
+    </w:p>
+    <w:tbl>
+      <w:tblPr>
+        <w:tblW w:type="dxa" w:w="9792"/>
+        <w:tblBorders>
+          <w:top w:val="single" w:color="auto" w:sz="4"/>
+          <w:left w:val="single" w:color="auto" w:sz="4"/>
+          <w:bottom w:val="single" w:color="auto" w:sz="4"/>
+          <w:right w:val="single" w:color="auto" w:sz="4"/>
+          <w:insideH w:val="single" w:color="auto" w:sz="4"/>
+          <w:insideV w:val="single" w:color="auto" w:sz="4"/>
+        </w:tblBorders>
+      </w:tblPr>
+      <w:tblGrid>
+        <w:gridCol w:w="9792"/>
+      </w:tblGrid>
+      <w:tr>
+        <w:tc>
+          <w:tcPr>
+            <w:tcW w:type="dxa" w:w="9792"/>
+            <w:tcBorders>
+              <w:top w:val="single" w:color="D9D5C8" w:sz="4"/>
+              <w:left w:val="single" w:color="D9D5C8" w:sz="4"/>
+              <w:bottom w:val="single" w:color="D9D5C8" w:sz="4"/>
+              <w:right w:val="single" w:color="D9D5C8" w:sz="4"/>
+            </w:tcBorders>
+            <w:shd w:fill="F7F5EF" w:color="auto" w:val="clear"/>
+            <w:tcMar>
+              <w:top w:type="dxa" w:w="55"/>
+              <w:left w:type="dxa" w:w="110"/>
+              <w:bottom w:type="dxa" w:w="55"/>
+              <w:right w:type="dxa" w:w="110"/>
+            </w:tcMar>
+          </w:tcPr>
+          <w:p>
+            <w:pPr>
+              <w:spacing w:after="60"/>
+            </w:pPr>
+            <w:r>
+              <w:rPr>
+                <w:b/>
+                <w:bCs/>
+                <w:i w:val="false"/>
+                <w:iCs w:val="false"/>
+                <w:color w:val="1B2A4A"/>
+                <w:sz w:val="21"/>
+                <w:szCs w:val="21"/>
+                <w:caps w:val="false"/>
+                <w:rFonts w:ascii="Calibri" w:cs="Calibri" w:eastAsia="Calibri" w:hAnsi="Calibri"/>
+              </w:rPr>
+              <w:t xml:space="preserve">SELF-GRADE — score your own CER against the rubric below</w:t>
+            </w:r>
+          </w:p>
+          <w:p>
+            <w:pPr>
+              <w:spacing w:after="40"/>
+            </w:pPr>
+            <w:r>
+              <w:rPr>
+                <w:b w:val="false"/>
+                <w:bCs w:val="false"/>
+                <w:i w:val="false"/>
+                <w:iCs w:val="false"/>
+                <w:color w:val="1A1A1A"/>
+                <w:sz w:val="22"/>
+                <w:szCs w:val="22"/>
+                <w:caps w:val="false"/>
+                <w:rFonts w:ascii="Calibri" w:cs="Calibri" w:eastAsia="Calibri" w:hAnsi="Calibri"/>
+              </w:rPr>
+              <w:t xml:space="preserve">Reread your response, then circle the level that best fits each part. Being honest here is how you level up.</w:t>
+            </w:r>
+          </w:p>
+        </w:tc>
+      </w:tr>
+    </w:tbl>
+    <w:tbl>
+      <w:tblPr>
+        <w:tblW w:type="dxa" w:w="9792"/>
+        <w:tblBorders>
+          <w:top w:val="single" w:color="auto" w:sz="4"/>
+          <w:left w:val="single" w:color="auto" w:sz="4"/>
+          <w:bottom w:val="single" w:color="auto" w:sz="4"/>
+          <w:right w:val="single" w:color="auto" w:sz="4"/>
+          <w:insideH w:val="single" w:color="auto" w:sz="4"/>
+          <w:insideV w:val="single" w:color="auto" w:sz="4"/>
+        </w:tblBorders>
+      </w:tblPr>
+      <w:tblGrid>
+        <w:gridCol w:w="1800"/>
+        <w:gridCol w:w="2664"/>
+        <w:gridCol w:w="2664"/>
+        <w:gridCol w:w="2664"/>
+      </w:tblGrid>
+      <w:tr>
+        <w:trPr>
+          <w:tblHeader/>
+        </w:trPr>
+        <w:tc>
+          <w:tcPr>
+            <w:tcW w:type="dxa" w:w="1800"/>
+            <w:tcBorders>
+              <w:top w:val="single" w:color="D9D5C8" w:sz="4"/>
+              <w:left w:val="single" w:color="D9D5C8" w:sz="4"/>
+              <w:bottom w:val="single" w:color="D9D5C8" w:sz="4"/>
+              <w:right w:val="single" w:color="D9D5C8" w:sz="4"/>
+            </w:tcBorders>
+            <w:shd w:fill="1B2A4A" w:color="auto" w:val="clear"/>
+            <w:tcMar>
+              <w:top w:type="dxa" w:w="55"/>
+              <w:left w:type="dxa" w:w="110"/>
+              <w:bottom w:type="dxa" w:w="55"/>
+              <w:right w:type="dxa" w:w="110"/>
+            </w:tcMar>
+          </w:tcPr>
+          <w:p>
+            <w:pPr>
+              <w:spacing w:after="0"/>
+            </w:pPr>
+            <w:r>
+              <w:rPr>
+                <w:b/>
+                <w:bCs/>
+                <w:i w:val="false"/>
+                <w:iCs w:val="false"/>
+                <w:color w:val="FFFFFF"/>
+                <w:sz w:val="19"/>
+                <w:szCs w:val="19"/>
+                <w:caps w:val="false"/>
+                <w:rFonts w:ascii="Calibri" w:cs="Calibri" w:eastAsia="Calibri" w:hAnsi="Calibri"/>
+              </w:rPr>
+              <w:t xml:space="preserve">Level</w:t>
+            </w:r>
+          </w:p>
+        </w:tc>
+        <w:tc>
+          <w:tcPr>
+            <w:tcW w:type="dxa" w:w="2664"/>
+            <w:tcBorders>
+              <w:top w:val="single" w:color="D9D5C8" w:sz="4"/>
+              <w:left w:val="single" w:color="D9D5C8" w:sz="4"/>
+              <w:bottom w:val="single" w:color="D9D5C8" w:sz="4"/>
+              <w:right w:val="single" w:color="D9D5C8" w:sz="4"/>
+            </w:tcBorders>
+            <w:shd w:fill="1B2A4A" w:color="auto" w:val="clear"/>
+            <w:tcMar>
+              <w:top w:type="dxa" w:w="55"/>
+              <w:left w:type="dxa" w:w="110"/>
+              <w:bottom w:type="dxa" w:w="55"/>
+              <w:right w:type="dxa" w:w="110"/>
+            </w:tcMar>
+          </w:tcPr>
+          <w:p>
+            <w:pPr>
+              <w:spacing w:after="0"/>
+            </w:pPr>
+            <w:r>
+              <w:rPr>
+                <w:b/>
+                <w:bCs/>
+                <w:i w:val="false"/>
+                <w:iCs w:val="false"/>
+                <w:color w:val="FFFFFF"/>
+                <w:sz w:val="19"/>
+                <w:szCs w:val="19"/>
+                <w:caps w:val="false"/>
+                <w:rFonts w:ascii="Calibri" w:cs="Calibri" w:eastAsia="Calibri" w:hAnsi="Calibri"/>
+              </w:rPr>
+              <w:t xml:space="preserve">Claim</w:t>
+            </w:r>
+          </w:p>
+        </w:tc>
+        <w:tc>
+          <w:tcPr>
+            <w:tcW w:type="dxa" w:w="2664"/>
+            <w:tcBorders>
+              <w:top w:val="single" w:color="D9D5C8" w:sz="4"/>
+              <w:left w:val="single" w:color="D9D5C8" w:sz="4"/>
+              <w:bottom w:val="single" w:color="D9D5C8" w:sz="4"/>
+              <w:right w:val="single" w:color="D9D5C8" w:sz="4"/>
+            </w:tcBorders>
+            <w:shd w:fill="1B2A4A" w:color="auto" w:val="clear"/>
+            <w:tcMar>
+              <w:top w:type="dxa" w:w="55"/>
+              <w:left w:type="dxa" w:w="110"/>
+              <w:bottom w:type="dxa" w:w="55"/>
+              <w:right w:type="dxa" w:w="110"/>
+            </w:tcMar>
+          </w:tcPr>
+          <w:p>
+            <w:pPr>
+              <w:spacing w:after="0"/>
+            </w:pPr>
+            <w:r>
+              <w:rPr>
+                <w:b/>
+                <w:bCs/>
+                <w:i w:val="false"/>
+                <w:iCs w:val="false"/>
+                <w:color w:val="FFFFFF"/>
+                <w:sz w:val="19"/>
+                <w:szCs w:val="19"/>
+                <w:caps w:val="false"/>
+                <w:rFonts w:ascii="Calibri" w:cs="Calibri" w:eastAsia="Calibri" w:hAnsi="Calibri"/>
+              </w:rPr>
+              <w:t xml:space="preserve">Evidence</w:t>
+            </w:r>
+          </w:p>
+        </w:tc>
+        <w:tc>
+          <w:tcPr>
+            <w:tcW w:type="dxa" w:w="2664"/>
+            <w:tcBorders>
+              <w:top w:val="single" w:color="D9D5C8" w:sz="4"/>
+              <w:left w:val="single" w:color="D9D5C8" w:sz="4"/>
+              <w:bottom w:val="single" w:color="D9D5C8" w:sz="4"/>
+              <w:right w:val="single" w:color="D9D5C8" w:sz="4"/>
+            </w:tcBorders>
+            <w:shd w:fill="1B2A4A" w:color="auto" w:val="clear"/>
+            <w:tcMar>
+              <w:top w:type="dxa" w:w="55"/>
+              <w:left w:type="dxa" w:w="110"/>
+              <w:bottom w:type="dxa" w:w="55"/>
+              <w:right w:type="dxa" w:w="110"/>
+            </w:tcMar>
+          </w:tcPr>
+          <w:p>
+            <w:pPr>
+              <w:spacing w:after="0"/>
+            </w:pPr>
+            <w:r>
+              <w:rPr>
+                <w:b/>
+                <w:bCs/>
+                <w:i w:val="false"/>
+                <w:iCs w:val="false"/>
+                <w:color w:val="FFFFFF"/>
+                <w:sz w:val="19"/>
+                <w:szCs w:val="19"/>
+                <w:caps w:val="false"/>
+                <w:rFonts w:ascii="Calibri" w:cs="Calibri" w:eastAsia="Calibri" w:hAnsi="Calibri"/>
+              </w:rPr>
+              <w:t xml:space="preserve">Reasoning</w:t>
+            </w:r>
+          </w:p>
+        </w:tc>
+      </w:tr>
+      <w:tr>
+        <w:tc>
+          <w:tcPr>
+            <w:tcW w:type="dxa" w:w="1800"/>
+            <w:tcBorders>
+              <w:top w:val="single" w:color="D9D5C8" w:sz="4"/>
+              <w:left w:val="single" w:color="D9D5C8" w:sz="4"/>
+              <w:bottom w:val="single" w:color="D9D5C8" w:sz="4"/>
+              <w:right w:val="single" w:color="D9D5C8" w:sz="4"/>
+            </w:tcBorders>
+            <w:tcMar>
+              <w:top w:type="dxa" w:w="55"/>
+              <w:left w:type="dxa" w:w="110"/>
+              <w:bottom w:type="dxa" w:w="55"/>
+              <w:right w:type="dxa" w:w="110"/>
+            </w:tcMar>
+          </w:tcPr>
+          <w:p>
+            <w:pPr>
+              <w:spacing w:after="0"/>
+            </w:pPr>
+            <w:r>
+              <w:rPr>
+                <w:b w:val="false"/>
+                <w:bCs w:val="false"/>
+                <w:i w:val="false"/>
+                <w:iCs w:val="false"/>
+                <w:color w:val="1A1A1A"/>
+                <w:sz w:val="20"/>
+                <w:szCs w:val="20"/>
+                <w:caps w:val="false"/>
+                <w:rFonts w:ascii="Calibri" w:cs="Calibri" w:eastAsia="Calibri" w:hAnsi="Calibri"/>
+              </w:rPr>
+              <w:t xml:space="preserve">4 — Strong</w:t>
+            </w:r>
+          </w:p>
+        </w:tc>
+        <w:tc>
+          <w:tcPr>
+            <w:tcW w:type="dxa" w:w="2664"/>
+            <w:tcBorders>
+              <w:top w:val="single" w:color="D9D5C8" w:sz="4"/>
+              <w:left w:val="single" w:color="D9D5C8" w:sz="4"/>
+              <w:bottom w:val="single" w:color="D9D5C8" w:sz="4"/>
+              <w:right w:val="single" w:color="D9D5C8" w:sz="4"/>
+            </w:tcBorders>
+            <w:tcMar>
+              <w:top w:type="dxa" w:w="55"/>
+              <w:left w:type="dxa" w:w="110"/>
+              <w:bottom w:type="dxa" w:w="55"/>
+              <w:right w:type="dxa" w:w="110"/>
+            </w:tcMar>
+          </w:tcPr>
+          <w:p>
+            <w:pPr>
+              <w:spacing w:after="0"/>
+            </w:pPr>
+            <w:r>
+              <w:rPr>
+                <w:b w:val="false"/>
+                <w:bCs w:val="false"/>
+                <w:i w:val="false"/>
+                <w:iCs w:val="false"/>
+                <w:color w:val="1A1A1A"/>
+                <w:sz w:val="20"/>
+                <w:szCs w:val="20"/>
+                <w:caps w:val="false"/>
+                <w:rFonts w:ascii="Calibri" w:cs="Calibri" w:eastAsia="Calibri" w:hAnsi="Calibri"/>
+              </w:rPr>
+              <w:t xml:space="preserve">Precise, defensible</w:t>
+            </w:r>
+          </w:p>
+        </w:tc>
+        <w:tc>
+          <w:tcPr>
+            <w:tcW w:type="dxa" w:w="2664"/>
+            <w:tcBorders>
+              <w:top w:val="single" w:color="D9D5C8" w:sz="4"/>
+              <w:left w:val="single" w:color="D9D5C8" w:sz="4"/>
+              <w:bottom w:val="single" w:color="D9D5C8" w:sz="4"/>
+              <w:right w:val="single" w:color="D9D5C8" w:sz="4"/>
+            </w:tcBorders>
+            <w:tcMar>
+              <w:top w:type="dxa" w:w="55"/>
+              <w:left w:type="dxa" w:w="110"/>
+              <w:bottom w:type="dxa" w:w="55"/>
+              <w:right w:type="dxa" w:w="110"/>
+            </w:tcMar>
+          </w:tcPr>
+          <w:p>
+            <w:pPr>
+              <w:spacing w:after="0"/>
+            </w:pPr>
+            <w:r>
+              <w:rPr>
+                <w:b w:val="false"/>
+                <w:bCs w:val="false"/>
+                <w:i w:val="false"/>
+                <w:iCs w:val="false"/>
+                <w:color w:val="1A1A1A"/>
+                <w:sz w:val="20"/>
+                <w:szCs w:val="20"/>
+                <w:caps w:val="false"/>
+                <w:rFonts w:ascii="Calibri" w:cs="Calibri" w:eastAsia="Calibri" w:hAnsi="Calibri"/>
+              </w:rPr>
+              <w:t xml:space="preserve">2+ accurate, specific</w:t>
+            </w:r>
+          </w:p>
+        </w:tc>
+        <w:tc>
+          <w:tcPr>
+            <w:tcW w:type="dxa" w:w="2664"/>
+            <w:tcBorders>
+              <w:top w:val="single" w:color="D9D5C8" w:sz="4"/>
+              <w:left w:val="single" w:color="D9D5C8" w:sz="4"/>
+              <w:bottom w:val="single" w:color="D9D5C8" w:sz="4"/>
+              <w:right w:val="single" w:color="D9D5C8" w:sz="4"/>
+            </w:tcBorders>
+            <w:tcMar>
+              <w:top w:type="dxa" w:w="55"/>
+              <w:left w:type="dxa" w:w="110"/>
+              <w:bottom w:type="dxa" w:w="55"/>
+              <w:right w:type="dxa" w:w="110"/>
+            </w:tcMar>
+          </w:tcPr>
+          <w:p>
+            <w:pPr>
+              <w:spacing w:after="0"/>
+            </w:pPr>
+            <w:r>
+              <w:rPr>
+                <w:b w:val="false"/>
+                <w:bCs w:val="false"/>
+                <w:i w:val="false"/>
+                <w:iCs w:val="false"/>
+                <w:color w:val="1A1A1A"/>
+                <w:sz w:val="20"/>
+                <w:szCs w:val="20"/>
+                <w:caps w:val="false"/>
+                <w:rFonts w:ascii="Calibri" w:cs="Calibri" w:eastAsia="Calibri" w:hAnsi="Calibri"/>
+              </w:rPr>
+              <w:t xml:space="preserve">Explains HOW evidence proves the claim</w:t>
+            </w:r>
+          </w:p>
+        </w:tc>
+      </w:tr>
+      <w:tr>
+        <w:tc>
+          <w:tcPr>
+            <w:tcW w:type="dxa" w:w="1800"/>
+            <w:tcBorders>
+              <w:top w:val="single" w:color="D9D5C8" w:sz="4"/>
+              <w:left w:val="single" w:color="D9D5C8" w:sz="4"/>
+              <w:bottom w:val="single" w:color="D9D5C8" w:sz="4"/>
+              <w:right w:val="single" w:color="D9D5C8" w:sz="4"/>
+            </w:tcBorders>
+            <w:tcMar>
+              <w:top w:type="dxa" w:w="55"/>
+              <w:left w:type="dxa" w:w="110"/>
+              <w:bottom w:type="dxa" w:w="55"/>
+              <w:right w:type="dxa" w:w="110"/>
+            </w:tcMar>
+          </w:tcPr>
+          <w:p>
+            <w:pPr>
+              <w:spacing w:after="0"/>
+            </w:pPr>
+            <w:r>
+              <w:rPr>
+                <w:b w:val="false"/>
+                <w:bCs w:val="false"/>
+                <w:i w:val="false"/>
+                <w:iCs w:val="false"/>
+                <w:color w:val="1A1A1A"/>
+                <w:sz w:val="20"/>
+                <w:szCs w:val="20"/>
+                <w:caps w:val="false"/>
+                <w:rFonts w:ascii="Calibri" w:cs="Calibri" w:eastAsia="Calibri" w:hAnsi="Calibri"/>
+              </w:rPr>
+              <w:t xml:space="preserve">3 — Proficient</w:t>
+            </w:r>
+          </w:p>
+        </w:tc>
+        <w:tc>
+          <w:tcPr>
+            <w:tcW w:type="dxa" w:w="2664"/>
+            <w:tcBorders>
+              <w:top w:val="single" w:color="D9D5C8" w:sz="4"/>
+              <w:left w:val="single" w:color="D9D5C8" w:sz="4"/>
+              <w:bottom w:val="single" w:color="D9D5C8" w:sz="4"/>
+              <w:right w:val="single" w:color="D9D5C8" w:sz="4"/>
+            </w:tcBorders>
+            <w:tcMar>
+              <w:top w:type="dxa" w:w="55"/>
+              <w:left w:type="dxa" w:w="110"/>
+              <w:bottom w:type="dxa" w:w="55"/>
+              <w:right w:type="dxa" w:w="110"/>
+            </w:tcMar>
+          </w:tcPr>
+          <w:p>
+            <w:pPr>
+              <w:spacing w:after="0"/>
+            </w:pPr>
+            <w:r>
+              <w:rPr>
+                <w:b w:val="false"/>
+                <w:bCs w:val="false"/>
+                <w:i w:val="false"/>
+                <w:iCs w:val="false"/>
+                <w:color w:val="1A1A1A"/>
+                <w:sz w:val="20"/>
+                <w:szCs w:val="20"/>
+                <w:caps w:val="false"/>
+                <w:rFonts w:ascii="Calibri" w:cs="Calibri" w:eastAsia="Calibri" w:hAnsi="Calibri"/>
+              </w:rPr>
+              <w:t xml:space="preserve">Clear</w:t>
+            </w:r>
+          </w:p>
+        </w:tc>
+        <w:tc>
+          <w:tcPr>
+            <w:tcW w:type="dxa" w:w="2664"/>
+            <w:tcBorders>
+              <w:top w:val="single" w:color="D9D5C8" w:sz="4"/>
+              <w:left w:val="single" w:color="D9D5C8" w:sz="4"/>
+              <w:bottom w:val="single" w:color="D9D5C8" w:sz="4"/>
+              <w:right w:val="single" w:color="D9D5C8" w:sz="4"/>
+            </w:tcBorders>
+            <w:tcMar>
+              <w:top w:type="dxa" w:w="55"/>
+              <w:left w:type="dxa" w:w="110"/>
+              <w:bottom w:type="dxa" w:w="55"/>
+              <w:right w:type="dxa" w:w="110"/>
+            </w:tcMar>
+          </w:tcPr>
+          <w:p>
+            <w:pPr>
+              <w:spacing w:after="0"/>
+            </w:pPr>
+            <w:r>
+              <w:rPr>
+                <w:b w:val="false"/>
+                <w:bCs w:val="false"/>
+                <w:i w:val="false"/>
+                <w:iCs w:val="false"/>
+                <w:color w:val="1A1A1A"/>
+                <w:sz w:val="20"/>
+                <w:szCs w:val="20"/>
+                <w:caps w:val="false"/>
+                <w:rFonts w:ascii="Calibri" w:cs="Calibri" w:eastAsia="Calibri" w:hAnsi="Calibri"/>
+              </w:rPr>
+              <w:t xml:space="preserve">2 accurate</w:t>
+            </w:r>
+          </w:p>
+        </w:tc>
+        <w:tc>
+          <w:tcPr>
+            <w:tcW w:type="dxa" w:w="2664"/>
+            <w:tcBorders>
+              <w:top w:val="single" w:color="D9D5C8" w:sz="4"/>
+              <w:left w:val="single" w:color="D9D5C8" w:sz="4"/>
+              <w:bottom w:val="single" w:color="D9D5C8" w:sz="4"/>
+              <w:right w:val="single" w:color="D9D5C8" w:sz="4"/>
+            </w:tcBorders>
+            <w:tcMar>
+              <w:top w:type="dxa" w:w="55"/>
+              <w:left w:type="dxa" w:w="110"/>
+              <w:bottom w:type="dxa" w:w="55"/>
+              <w:right w:type="dxa" w:w="110"/>
+            </w:tcMar>
+          </w:tcPr>
+          <w:p>
+            <w:pPr>
+              <w:spacing w:after="0"/>
+            </w:pPr>
+            <w:r>
+              <w:rPr>
+                <w:b w:val="false"/>
+                <w:bCs w:val="false"/>
+                <w:i w:val="false"/>
+                <w:iCs w:val="false"/>
+                <w:color w:val="1A1A1A"/>
+                <w:sz w:val="20"/>
+                <w:szCs w:val="20"/>
+                <w:caps w:val="false"/>
+                <w:rFonts w:ascii="Calibri" w:cs="Calibri" w:eastAsia="Calibri" w:hAnsi="Calibri"/>
+              </w:rPr>
+              <w:t xml:space="preserve">Explains the link</w:t>
+            </w:r>
+          </w:p>
+        </w:tc>
+      </w:tr>
+      <w:tr>
+        <w:tc>
+          <w:tcPr>
+            <w:tcW w:type="dxa" w:w="1800"/>
+            <w:tcBorders>
+              <w:top w:val="single" w:color="D9D5C8" w:sz="4"/>
+              <w:left w:val="single" w:color="D9D5C8" w:sz="4"/>
+              <w:bottom w:val="single" w:color="D9D5C8" w:sz="4"/>
+              <w:right w:val="single" w:color="D9D5C8" w:sz="4"/>
+            </w:tcBorders>
+            <w:tcMar>
+              <w:top w:type="dxa" w:w="55"/>
+              <w:left w:type="dxa" w:w="110"/>
+              <w:bottom w:type="dxa" w:w="55"/>
+              <w:right w:type="dxa" w:w="110"/>
+            </w:tcMar>
+          </w:tcPr>
+          <w:p>
+            <w:pPr>
+              <w:spacing w:after="0"/>
+            </w:pPr>
+            <w:r>
+              <w:rPr>
+                <w:b w:val="false"/>
+                <w:bCs w:val="false"/>
+                <w:i w:val="false"/>
+                <w:iCs w:val="false"/>
+                <w:color w:val="1A1A1A"/>
+                <w:sz w:val="20"/>
+                <w:szCs w:val="20"/>
+                <w:caps w:val="false"/>
+                <w:rFonts w:ascii="Calibri" w:cs="Calibri" w:eastAsia="Calibri" w:hAnsi="Calibri"/>
+              </w:rPr>
+              <w:t xml:space="preserve">2 — Developing</w:t>
+            </w:r>
+          </w:p>
+        </w:tc>
+        <w:tc>
+          <w:tcPr>
+            <w:tcW w:type="dxa" w:w="2664"/>
+            <w:tcBorders>
+              <w:top w:val="single" w:color="D9D5C8" w:sz="4"/>
+              <w:left w:val="single" w:color="D9D5C8" w:sz="4"/>
+              <w:bottom w:val="single" w:color="D9D5C8" w:sz="4"/>
+              <w:right w:val="single" w:color="D9D5C8" w:sz="4"/>
+            </w:tcBorders>
+            <w:tcMar>
+              <w:top w:type="dxa" w:w="55"/>
+              <w:left w:type="dxa" w:w="110"/>
+              <w:bottom w:type="dxa" w:w="55"/>
+              <w:right w:type="dxa" w:w="110"/>
+            </w:tcMar>
+          </w:tcPr>
+          <w:p>
+            <w:pPr>
+              <w:spacing w:after="0"/>
+            </w:pPr>
+            <w:r>
+              <w:rPr>
+                <w:b w:val="false"/>
+                <w:bCs w:val="false"/>
+                <w:i w:val="false"/>
+                <w:iCs w:val="false"/>
+                <w:color w:val="1A1A1A"/>
+                <w:sz w:val="20"/>
+                <w:szCs w:val="20"/>
+                <w:caps w:val="false"/>
+                <w:rFonts w:ascii="Calibri" w:cs="Calibri" w:eastAsia="Calibri" w:hAnsi="Calibri"/>
+              </w:rPr>
+              <w:t xml:space="preserve">General</w:t>
+            </w:r>
+          </w:p>
+        </w:tc>
+        <w:tc>
+          <w:tcPr>
+            <w:tcW w:type="dxa" w:w="2664"/>
+            <w:tcBorders>
+              <w:top w:val="single" w:color="D9D5C8" w:sz="4"/>
+              <w:left w:val="single" w:color="D9D5C8" w:sz="4"/>
+              <w:bottom w:val="single" w:color="D9D5C8" w:sz="4"/>
+              <w:right w:val="single" w:color="D9D5C8" w:sz="4"/>
+            </w:tcBorders>
+            <w:tcMar>
+              <w:top w:type="dxa" w:w="55"/>
+              <w:left w:type="dxa" w:w="110"/>
+              <w:bottom w:type="dxa" w:w="55"/>
+              <w:right w:type="dxa" w:w="110"/>
+            </w:tcMar>
+          </w:tcPr>
+          <w:p>
+            <w:pPr>
+              <w:spacing w:after="0"/>
+            </w:pPr>
+            <w:r>
+              <w:rPr>
+                <w:b w:val="false"/>
+                <w:bCs w:val="false"/>
+                <w:i w:val="false"/>
+                <w:iCs w:val="false"/>
+                <w:color w:val="1A1A1A"/>
+                <w:sz w:val="20"/>
+                <w:szCs w:val="20"/>
+                <w:caps w:val="false"/>
+                <w:rFonts w:ascii="Calibri" w:cs="Calibri" w:eastAsia="Calibri" w:hAnsi="Calibri"/>
+              </w:rPr>
+              <w:t xml:space="preserve">1 accurate</w:t>
+            </w:r>
+          </w:p>
+        </w:tc>
+        <w:tc>
+          <w:tcPr>
+            <w:tcW w:type="dxa" w:w="2664"/>
+            <w:tcBorders>
+              <w:top w:val="single" w:color="D9D5C8" w:sz="4"/>
+              <w:left w:val="single" w:color="D9D5C8" w:sz="4"/>
+              <w:bottom w:val="single" w:color="D9D5C8" w:sz="4"/>
+              <w:right w:val="single" w:color="D9D5C8" w:sz="4"/>
+            </w:tcBorders>
+            <w:tcMar>
+              <w:top w:type="dxa" w:w="55"/>
+              <w:left w:type="dxa" w:w="110"/>
+              <w:bottom w:type="dxa" w:w="55"/>
+              <w:right w:type="dxa" w:w="110"/>
+            </w:tcMar>
+          </w:tcPr>
+          <w:p>
+            <w:pPr>
+              <w:spacing w:after="0"/>
+            </w:pPr>
+            <w:r>
+              <w:rPr>
+                <w:b w:val="false"/>
+                <w:bCs w:val="false"/>
+                <w:i w:val="false"/>
+                <w:iCs w:val="false"/>
+                <w:color w:val="1A1A1A"/>
+                <w:sz w:val="20"/>
+                <w:szCs w:val="20"/>
+                <w:caps w:val="false"/>
+                <w:rFonts w:ascii="Calibri" w:cs="Calibri" w:eastAsia="Calibri" w:hAnsi="Calibri"/>
+              </w:rPr>
+              <w:t xml:space="preserve">Partial link</w:t>
+            </w:r>
+          </w:p>
+        </w:tc>
+      </w:tr>
+      <w:tr>
+        <w:tc>
+          <w:tcPr>
+            <w:tcW w:type="dxa" w:w="1800"/>
+            <w:tcBorders>
+              <w:top w:val="single" w:color="D9D5C8" w:sz="4"/>
+              <w:left w:val="single" w:color="D9D5C8" w:sz="4"/>
+              <w:bottom w:val="single" w:color="D9D5C8" w:sz="4"/>
+              <w:right w:val="single" w:color="D9D5C8" w:sz="4"/>
+            </w:tcBorders>
+            <w:tcMar>
+              <w:top w:type="dxa" w:w="55"/>
+              <w:left w:type="dxa" w:w="110"/>
+              <w:bottom w:type="dxa" w:w="55"/>
+              <w:right w:type="dxa" w:w="110"/>
+            </w:tcMar>
+          </w:tcPr>
+          <w:p>
+            <w:pPr>
+              <w:spacing w:after="0"/>
+            </w:pPr>
+            <w:r>
+              <w:rPr>
+                <w:b w:val="false"/>
+                <w:bCs w:val="false"/>
+                <w:i w:val="false"/>
+                <w:iCs w:val="false"/>
+                <w:color w:val="1A1A1A"/>
+                <w:sz w:val="20"/>
+                <w:szCs w:val="20"/>
+                <w:caps w:val="false"/>
+                <w:rFonts w:ascii="Calibri" w:cs="Calibri" w:eastAsia="Calibri" w:hAnsi="Calibri"/>
+              </w:rPr>
+              <w:t xml:space="preserve">1 — Beginning</w:t>
+            </w:r>
+          </w:p>
+        </w:tc>
+        <w:tc>
+          <w:tcPr>
+            <w:tcW w:type="dxa" w:w="2664"/>
+            <w:tcBorders>
+              <w:top w:val="single" w:color="D9D5C8" w:sz="4"/>
+              <w:left w:val="single" w:color="D9D5C8" w:sz="4"/>
+              <w:bottom w:val="single" w:color="D9D5C8" w:sz="4"/>
+              <w:right w:val="single" w:color="D9D5C8" w:sz="4"/>
+            </w:tcBorders>
+            <w:tcMar>
+              <w:top w:type="dxa" w:w="55"/>
+              <w:left w:type="dxa" w:w="110"/>
+              <w:bottom w:type="dxa" w:w="55"/>
+              <w:right w:type="dxa" w:w="110"/>
+            </w:tcMar>
+          </w:tcPr>
+          <w:p>
+            <w:pPr>
+              <w:spacing w:after="0"/>
+            </w:pPr>
+            <w:r>
+              <w:rPr>
+                <w:b w:val="false"/>
+                <w:bCs w:val="false"/>
+                <w:i w:val="false"/>
+                <w:iCs w:val="false"/>
+                <w:color w:val="1A1A1A"/>
+                <w:sz w:val="20"/>
+                <w:szCs w:val="20"/>
+                <w:caps w:val="false"/>
+                <w:rFonts w:ascii="Calibri" w:cs="Calibri" w:eastAsia="Calibri" w:hAnsi="Calibri"/>
+              </w:rPr>
+              <w:t xml:space="preserve">Unclear / missing</w:t>
+            </w:r>
+          </w:p>
+        </w:tc>
+        <w:tc>
+          <w:tcPr>
+            <w:tcW w:type="dxa" w:w="2664"/>
+            <w:tcBorders>
+              <w:top w:val="single" w:color="D9D5C8" w:sz="4"/>
+              <w:left w:val="single" w:color="D9D5C8" w:sz="4"/>
+              <w:bottom w:val="single" w:color="D9D5C8" w:sz="4"/>
+              <w:right w:val="single" w:color="D9D5C8" w:sz="4"/>
+            </w:tcBorders>
+            <w:tcMar>
+              <w:top w:type="dxa" w:w="55"/>
+              <w:left w:type="dxa" w:w="110"/>
+              <w:bottom w:type="dxa" w:w="55"/>
+              <w:right w:type="dxa" w:w="110"/>
+            </w:tcMar>
+          </w:tcPr>
+          <w:p>
+            <w:pPr>
+              <w:spacing w:after="0"/>
+            </w:pPr>
+            <w:r>
+              <w:rPr>
+                <w:b w:val="false"/>
+                <w:bCs w:val="false"/>
+                <w:i w:val="false"/>
+                <w:iCs w:val="false"/>
+                <w:color w:val="1A1A1A"/>
+                <w:sz w:val="20"/>
+                <w:szCs w:val="20"/>
+                <w:caps w:val="false"/>
+                <w:rFonts w:ascii="Calibri" w:cs="Calibri" w:eastAsia="Calibri" w:hAnsi="Calibri"/>
+              </w:rPr>
+              <w:t xml:space="preserve">Missing / inaccurate</w:t>
+            </w:r>
+          </w:p>
+        </w:tc>
+        <w:tc>
+          <w:tcPr>
+            <w:tcW w:type="dxa" w:w="2664"/>
+            <w:tcBorders>
+              <w:top w:val="single" w:color="D9D5C8" w:sz="4"/>
+              <w:left w:val="single" w:color="D9D5C8" w:sz="4"/>
+              <w:bottom w:val="single" w:color="D9D5C8" w:sz="4"/>
+              <w:right w:val="single" w:color="D9D5C8" w:sz="4"/>
+            </w:tcBorders>
+            <w:tcMar>
+              <w:top w:type="dxa" w:w="55"/>
+              <w:left w:type="dxa" w:w="110"/>
+              <w:bottom w:type="dxa" w:w="55"/>
+              <w:right w:type="dxa" w:w="110"/>
+            </w:tcMar>
+          </w:tcPr>
+          <w:p>
+            <w:pPr>
+              <w:spacing w:after="0"/>
+            </w:pPr>
+            <w:r>
+              <w:rPr>
+                <w:b w:val="false"/>
+                <w:bCs w:val="false"/>
+                <w:i w:val="false"/>
+                <w:iCs w:val="false"/>
+                <w:color w:val="1A1A1A"/>
+                <w:sz w:val="20"/>
+                <w:szCs w:val="20"/>
+                <w:caps w:val="false"/>
+                <w:rFonts w:ascii="Calibri" w:cs="Calibri" w:eastAsia="Calibri" w:hAnsi="Calibri"/>
+              </w:rPr>
+              <w:t xml:space="preserve">No reasoning</w:t>
             </w:r>
           </w:p>
         </w:tc>
@@ -46153,7 +49685,7 @@
                 <w:caps w:val="false"/>
                 <w:rFonts w:ascii="Calibri" w:cs="Calibri" w:eastAsia="Calibri" w:hAnsi="Calibri"/>
               </w:rPr>
-              <w:t xml:space="preserve">SELF-CHECK against the CER rubric (see Toolkit)</w:t>
+              <w:t xml:space="preserve">MY SCORE</w:t>
             </w:r>
           </w:p>
           <w:p>
@@ -46172,12 +49704,365 @@
                 <w:caps w:val="false"/>
                 <w:rFonts w:ascii="Calibri" w:cs="Calibri" w:eastAsia="Calibri" w:hAnsi="Calibri"/>
               </w:rPr>
-              <w:t xml:space="preserve">Before submitting: Is my claim defensible? Do I have TWO specific pieces of evidence? Does my reasoning explain HOW the evidence proves the claim?</w:t>
+              <w:t xml:space="preserve">Claim: ____ / 4        Evidence: ____ / 4        Reasoning: ____ / 4        TOTAL: ____ / 12</w:t>
             </w:r>
           </w:p>
         </w:tc>
       </w:tr>
     </w:tbl>
+    <w:tbl>
+      <w:tblPr>
+        <w:tblW w:type="dxa" w:w="9792"/>
+        <w:tblBorders>
+          <w:top w:val="single" w:color="auto" w:sz="4"/>
+          <w:left w:val="single" w:color="auto" w:sz="4"/>
+          <w:bottom w:val="single" w:color="auto" w:sz="4"/>
+          <w:right w:val="single" w:color="auto" w:sz="4"/>
+          <w:insideH w:val="single" w:color="auto" w:sz="4"/>
+          <w:insideV w:val="single" w:color="auto" w:sz="4"/>
+        </w:tblBorders>
+      </w:tblPr>
+      <w:tblGrid>
+        <w:gridCol w:w="9792"/>
+      </w:tblGrid>
+      <w:tr>
+        <w:tc>
+          <w:tcPr>
+            <w:tcW w:type="dxa" w:w="9792"/>
+            <w:tcBorders>
+              <w:top w:val="single" w:color="D9D5C8" w:sz="4"/>
+              <w:left w:val="single" w:color="D9D5C8" w:sz="4"/>
+              <w:bottom w:val="single" w:color="D9D5C8" w:sz="4"/>
+              <w:right w:val="single" w:color="D9D5C8" w:sz="4"/>
+            </w:tcBorders>
+            <w:shd w:fill="F7F5EF" w:color="auto" w:val="clear"/>
+            <w:tcMar>
+              <w:top w:type="dxa" w:w="55"/>
+              <w:left w:type="dxa" w:w="110"/>
+              <w:bottom w:type="dxa" w:w="55"/>
+              <w:right w:type="dxa" w:w="110"/>
+            </w:tcMar>
+          </w:tcPr>
+          <w:p>
+            <w:pPr>
+              <w:spacing w:after="60"/>
+            </w:pPr>
+            <w:r>
+              <w:rPr>
+                <w:b/>
+                <w:bCs/>
+                <w:i w:val="false"/>
+                <w:iCs w:val="false"/>
+                <w:color w:val="1B2A4A"/>
+                <w:sz w:val="21"/>
+                <w:szCs w:val="21"/>
+                <w:caps w:val="false"/>
+                <w:rFonts w:ascii="Calibri" w:cs="Calibri" w:eastAsia="Calibri" w:hAnsi="Calibri"/>
+              </w:rPr>
+              <w:t xml:space="preserve">SUPPORTS — sentence frames (use if you need them)</w:t>
+            </w:r>
+          </w:p>
+          <w:p>
+            <w:pPr>
+              <w:spacing w:after="40"/>
+            </w:pPr>
+            <w:r>
+              <w:rPr>
+                <w:b w:val="false"/>
+                <w:bCs w:val="false"/>
+                <w:i w:val="false"/>
+                <w:iCs w:val="false"/>
+                <w:color w:val="1A1A1A"/>
+                <w:sz w:val="22"/>
+                <w:szCs w:val="22"/>
+                <w:caps w:val="false"/>
+                <w:rFonts w:ascii="Calibri" w:cs="Calibri" w:eastAsia="Calibri" w:hAnsi="Calibri"/>
+              </w:rPr>
+              <w:t xml:space="preserve">Claim: “______ because ______.”</w:t>
+            </w:r>
+          </w:p>
+          <w:p>
+            <w:pPr>
+              <w:spacing w:after="40"/>
+            </w:pPr>
+            <w:r>
+              <w:rPr>
+                <w:b w:val="false"/>
+                <w:bCs w:val="false"/>
+                <w:i w:val="false"/>
+                <w:iCs w:val="false"/>
+                <w:color w:val="1A1A1A"/>
+                <w:sz w:val="22"/>
+                <w:szCs w:val="22"/>
+                <w:caps w:val="false"/>
+                <w:rFonts w:ascii="Calibri" w:cs="Calibri" w:eastAsia="Calibri" w:hAnsi="Calibri"/>
+              </w:rPr>
+              <w:t xml:space="preserve">Evidence: “One example is ______ (from ______).  Another is ______.”</w:t>
+            </w:r>
+          </w:p>
+          <w:p>
+            <w:pPr>
+              <w:spacing w:after="40"/>
+            </w:pPr>
+            <w:r>
+              <w:rPr>
+                <w:b w:val="false"/>
+                <w:bCs w:val="false"/>
+                <w:i w:val="false"/>
+                <w:iCs w:val="false"/>
+                <w:color w:val="1A1A1A"/>
+                <w:sz w:val="22"/>
+                <w:szCs w:val="22"/>
+                <w:caps w:val="false"/>
+                <w:rFonts w:ascii="Calibri" w:cs="Calibri" w:eastAsia="Calibri" w:hAnsi="Calibri"/>
+              </w:rPr>
+              <w:t xml:space="preserve">Reasoning: “This proves my claim because ______, which shows ______.”</w:t>
+            </w:r>
+          </w:p>
+        </w:tc>
+      </w:tr>
+    </w:tbl>
+    <w:tbl>
+      <w:tblPr>
+        <w:tblW w:type="dxa" w:w="9792"/>
+        <w:tblBorders>
+          <w:top w:val="single" w:color="auto" w:sz="4"/>
+          <w:left w:val="single" w:color="auto" w:sz="4"/>
+          <w:bottom w:val="single" w:color="auto" w:sz="4"/>
+          <w:right w:val="single" w:color="auto" w:sz="4"/>
+          <w:insideH w:val="single" w:color="auto" w:sz="4"/>
+          <w:insideV w:val="single" w:color="auto" w:sz="4"/>
+        </w:tblBorders>
+      </w:tblPr>
+      <w:tblGrid>
+        <w:gridCol w:w="9792"/>
+      </w:tblGrid>
+      <w:tr>
+        <w:tc>
+          <w:tcPr>
+            <w:tcW w:type="dxa" w:w="9792"/>
+            <w:tcBorders>
+              <w:top w:val="single" w:color="D9D5C8" w:sz="4"/>
+              <w:left w:val="single" w:color="D9D5C8" w:sz="4"/>
+              <w:bottom w:val="single" w:color="D9D5C8" w:sz="4"/>
+              <w:right w:val="single" w:color="D9D5C8" w:sz="4"/>
+            </w:tcBorders>
+            <w:shd w:fill="F7F5EF" w:color="auto" w:val="clear"/>
+            <w:tcMar>
+              <w:top w:type="dxa" w:w="55"/>
+              <w:left w:type="dxa" w:w="110"/>
+              <w:bottom w:type="dxa" w:w="55"/>
+              <w:right w:type="dxa" w:w="110"/>
+            </w:tcMar>
+          </w:tcPr>
+          <w:p>
+            <w:pPr>
+              <w:spacing w:after="60"/>
+            </w:pPr>
+            <w:r>
+              <w:rPr>
+                <w:b/>
+                <w:bCs/>
+                <w:i w:val="false"/>
+                <w:iCs w:val="false"/>
+                <w:color w:val="1B2A4A"/>
+                <w:sz w:val="21"/>
+                <w:szCs w:val="21"/>
+                <w:caps w:val="false"/>
+                <w:rFonts w:ascii="Calibri" w:cs="Calibri" w:eastAsia="Calibri" w:hAnsi="Calibri"/>
+              </w:rPr>
+              <w:t xml:space="preserve">REVISE — make your lowest-scoring part stronger</w:t>
+            </w:r>
+          </w:p>
+          <w:p>
+            <w:pPr>
+              <w:spacing w:after="40"/>
+            </w:pPr>
+            <w:r>
+              <w:rPr>
+                <w:b w:val="false"/>
+                <w:bCs w:val="false"/>
+                <w:i w:val="false"/>
+                <w:iCs w:val="false"/>
+                <w:color w:val="1A1A1A"/>
+                <w:sz w:val="22"/>
+                <w:szCs w:val="22"/>
+                <w:caps w:val="false"/>
+                <w:rFonts w:ascii="Calibri" w:cs="Calibri" w:eastAsia="Calibri" w:hAnsi="Calibri"/>
+              </w:rPr>
+              <w:t xml:space="preserve">Pick the part you scored lowest and rewrite it here — better:</w:t>
+            </w:r>
+          </w:p>
+        </w:tc>
+      </w:tr>
+    </w:tbl>
+    <w:p>
+      <w:pPr>
+        <w:widowControl w:val="false"/>
+        <w:pBdr>
+          <w:bottom w:val="single" w:color="8892A0" w:sz="8" w:space="1"/>
+        </w:pBdr>
+        <w:spacing w:before="28" w:after="28"/>
+      </w:pPr>
+      <w:r>
+        <w:rPr>
+          <w:sz w:val="16"/>
+          <w:szCs w:val="16"/>
+          <w:rFonts w:ascii="Calibri" w:cs="Calibri" w:eastAsia="Calibri" w:hAnsi="Calibri"/>
+        </w:rPr>
+        <w:t xml:space="preserve"> </w:t>
+      </w:r>
+    </w:p>
+    <w:p>
+      <w:pPr>
+        <w:spacing w:before="0" w:after="0" w:line="50" w:lineRule="exact"/>
+      </w:pPr>
+      <w:r>
+        <w:rPr>
+          <w:sz w:val="2"/>
+          <w:szCs w:val="2"/>
+          <w:rFonts w:ascii="Calibri" w:cs="Calibri" w:eastAsia="Calibri" w:hAnsi="Calibri"/>
+        </w:rPr>
+        <w:t xml:space="preserve"> </w:t>
+      </w:r>
+    </w:p>
+    <w:p>
+      <w:pPr>
+        <w:widowControl w:val="false"/>
+        <w:pBdr>
+          <w:bottom w:val="single" w:color="8892A0" w:sz="8" w:space="1"/>
+        </w:pBdr>
+        <w:spacing w:before="28" w:after="28"/>
+      </w:pPr>
+      <w:r>
+        <w:rPr>
+          <w:sz w:val="16"/>
+          <w:szCs w:val="16"/>
+          <w:rFonts w:ascii="Calibri" w:cs="Calibri" w:eastAsia="Calibri" w:hAnsi="Calibri"/>
+        </w:rPr>
+        <w:t xml:space="preserve"> </w:t>
+      </w:r>
+    </w:p>
+    <w:p>
+      <w:pPr>
+        <w:spacing w:before="0" w:after="0" w:line="50" w:lineRule="exact"/>
+      </w:pPr>
+      <w:r>
+        <w:rPr>
+          <w:sz w:val="2"/>
+          <w:szCs w:val="2"/>
+          <w:rFonts w:ascii="Calibri" w:cs="Calibri" w:eastAsia="Calibri" w:hAnsi="Calibri"/>
+        </w:rPr>
+        <w:t xml:space="preserve"> </w:t>
+      </w:r>
+    </w:p>
+    <w:p>
+      <w:pPr>
+        <w:widowControl w:val="false"/>
+        <w:pBdr>
+          <w:bottom w:val="single" w:color="8892A0" w:sz="8" w:space="1"/>
+        </w:pBdr>
+        <w:spacing w:before="28" w:after="28"/>
+      </w:pPr>
+      <w:r>
+        <w:rPr>
+          <w:sz w:val="16"/>
+          <w:szCs w:val="16"/>
+          <w:rFonts w:ascii="Calibri" w:cs="Calibri" w:eastAsia="Calibri" w:hAnsi="Calibri"/>
+        </w:rPr>
+        <w:t xml:space="preserve"> </w:t>
+      </w:r>
+    </w:p>
+    <w:p>
+      <w:pPr>
+        <w:spacing w:before="0" w:after="0" w:line="50" w:lineRule="exact"/>
+      </w:pPr>
+      <w:r>
+        <w:rPr>
+          <w:sz w:val="2"/>
+          <w:szCs w:val="2"/>
+          <w:rFonts w:ascii="Calibri" w:cs="Calibri" w:eastAsia="Calibri" w:hAnsi="Calibri"/>
+        </w:rPr>
+        <w:t xml:space="preserve"> </w:t>
+      </w:r>
+    </w:p>
+    <w:p>
+      <w:pPr>
+        <w:widowControl w:val="false"/>
+        <w:pBdr>
+          <w:bottom w:val="single" w:color="8892A0" w:sz="8" w:space="1"/>
+        </w:pBdr>
+        <w:spacing w:before="28" w:after="28"/>
+      </w:pPr>
+      <w:r>
+        <w:rPr>
+          <w:sz w:val="16"/>
+          <w:szCs w:val="16"/>
+          <w:rFonts w:ascii="Calibri" w:cs="Calibri" w:eastAsia="Calibri" w:hAnsi="Calibri"/>
+        </w:rPr>
+        <w:t xml:space="preserve"> </w:t>
+      </w:r>
+    </w:p>
+    <w:p>
+      <w:pPr>
+        <w:spacing w:before="0" w:after="0" w:line="50" w:lineRule="exact"/>
+      </w:pPr>
+      <w:r>
+        <w:rPr>
+          <w:sz w:val="2"/>
+          <w:szCs w:val="2"/>
+          <w:rFonts w:ascii="Calibri" w:cs="Calibri" w:eastAsia="Calibri" w:hAnsi="Calibri"/>
+        </w:rPr>
+        <w:t xml:space="preserve"> </w:t>
+      </w:r>
+    </w:p>
+    <w:p>
+      <w:pPr>
+        <w:widowControl w:val="false"/>
+        <w:pBdr>
+          <w:bottom w:val="single" w:color="8892A0" w:sz="8" w:space="1"/>
+        </w:pBdr>
+        <w:spacing w:before="28" w:after="28"/>
+      </w:pPr>
+      <w:r>
+        <w:rPr>
+          <w:sz w:val="16"/>
+          <w:szCs w:val="16"/>
+          <w:rFonts w:ascii="Calibri" w:cs="Calibri" w:eastAsia="Calibri" w:hAnsi="Calibri"/>
+        </w:rPr>
+        <w:t xml:space="preserve"> </w:t>
+      </w:r>
+    </w:p>
+    <w:p>
+      <w:pPr>
+        <w:spacing w:before="0" w:after="0" w:line="50" w:lineRule="exact"/>
+      </w:pPr>
+      <w:r>
+        <w:rPr>
+          <w:sz w:val="2"/>
+          <w:szCs w:val="2"/>
+          <w:rFonts w:ascii="Calibri" w:cs="Calibri" w:eastAsia="Calibri" w:hAnsi="Calibri"/>
+        </w:rPr>
+        <w:t xml:space="preserve"> </w:t>
+      </w:r>
+    </w:p>
+    <w:p>
+      <w:pPr>
+        <w:widowControl w:val="false"/>
+        <w:pBdr>
+          <w:bottom w:val="single" w:color="8892A0" w:sz="8" w:space="1"/>
+        </w:pBdr>
+        <w:spacing w:before="28" w:after="28"/>
+      </w:pPr>
+      <w:r>
+        <w:rPr>
+          <w:sz w:val="16"/>
+          <w:szCs w:val="16"/>
+          <w:rFonts w:ascii="Calibri" w:cs="Calibri" w:eastAsia="Calibri" w:hAnsi="Calibri"/>
+        </w:rPr>
+        <w:t xml:space="preserve"> </w:t>
+      </w:r>
+    </w:p>
     <w:p>
       <w:pPr>
         <w:pStyle w:val="Heading2"/>

</xml_diff>

<commit_message>
Bold the 'Word-bank meaning to build on:' label in the Frayer studio
Bold just the label so it reads as a label, not part of the definition text. Rebuilt all + large-print.

Co-Authored-By: Claude Opus 4.8 <noreply@anthropic.com>
Claude-Session: https://claude.ai/code/session_01DHdLjiiJeW6A83FcYRQ3qv
</commit_message>
<xml_diff>
--- a/courses/foundations-constitutional-government/BUILD/unit4/deliverables/Unit4_Student_Workbook_CourseStandard.docx
+++ b/courses/foundations-constitutional-government/BUILD/unit4/deliverables/Unit4_Student_Workbook_CourseStandard.docx
@@ -6990,6 +6990,20 @@
       </w:pPr>
       <w:r>
         <w:rPr>
+          <w:b/>
+          <w:bCs/>
+          <w:i w:val="false"/>
+          <w:iCs w:val="false"/>
+          <w:color w:val="1A1A1A"/>
+          <w:sz w:val="20"/>
+          <w:szCs w:val="20"/>
+          <w:caps w:val="false"/>
+          <w:rFonts w:ascii="Calibri" w:cs="Calibri" w:eastAsia="Calibri" w:hAnsi="Calibri"/>
+        </w:rPr>
+        <w:t xml:space="preserve">Word-bank meaning to build on: </w:t>
+      </w:r>
+      <w:r>
+        <w:rPr>
           <w:b w:val="false"/>
           <w:bCs w:val="false"/>
           <w:i w:val="false"/>
@@ -7000,7 +7014,7 @@
           <w:caps w:val="false"/>
           <w:rFonts w:ascii="Calibri" w:cs="Calibri" w:eastAsia="Calibri" w:hAnsi="Calibri"/>
         </w:rPr>
-        <w:t xml:space="preserve">Word-bank meaning to build on: The President's role as civilian head of the U.S. armed forces, ensuring the military answers to elected leadership.</w:t>
+        <w:t xml:space="preserve">The President's role as civilian head of the U.S. armed forces, ensuring the military answers to elected leadership.</w:t>
       </w:r>
     </w:p>
     <w:tbl>
@@ -7631,6 +7645,20 @@
       </w:pPr>
       <w:r>
         <w:rPr>
+          <w:b/>
+          <w:bCs/>
+          <w:i w:val="false"/>
+          <w:iCs w:val="false"/>
+          <w:color w:val="1A1A1A"/>
+          <w:sz w:val="20"/>
+          <w:szCs w:val="20"/>
+          <w:caps w:val="false"/>
+          <w:rFonts w:ascii="Calibri" w:cs="Calibri" w:eastAsia="Calibri" w:hAnsi="Calibri"/>
+        </w:rPr>
+        <w:t xml:space="preserve">Word-bank meaning to build on: </w:t>
+      </w:r>
+      <w:r>
+        <w:rPr>
           <w:b w:val="false"/>
           <w:bCs w:val="false"/>
           <w:i w:val="false"/>
@@ -7641,7 +7669,7 @@
           <w:caps w:val="false"/>
           <w:rFonts w:ascii="Calibri" w:cs="Calibri" w:eastAsia="Calibri" w:hAnsi="Calibri"/>
         </w:rPr>
-        <w:t xml:space="preserve">Word-bank meaning to build on: A directive from the President that manages the operations of the federal government and has the force of law, though it cannot override the Constitution or statute.</w:t>
+        <w:t xml:space="preserve">A directive from the President that manages the operations of the federal government and has the force of law, though it cannot override the Constitution or statute.</w:t>
       </w:r>
     </w:p>
     <w:tbl>
@@ -22412,6 +22440,20 @@
       </w:pPr>
       <w:r>
         <w:rPr>
+          <w:b/>
+          <w:bCs/>
+          <w:i w:val="false"/>
+          <w:iCs w:val="false"/>
+          <w:color w:val="1A1A1A"/>
+          <w:sz w:val="20"/>
+          <w:szCs w:val="20"/>
+          <w:caps w:val="false"/>
+          <w:rFonts w:ascii="Calibri" w:cs="Calibri" w:eastAsia="Calibri" w:hAnsi="Calibri"/>
+        </w:rPr>
+        <w:t xml:space="preserve">Word-bank meaning to build on: </w:t>
+      </w:r>
+      <w:r>
+        <w:rPr>
           <w:b w:val="false"/>
           <w:bCs w:val="false"/>
           <w:i w:val="false"/>
@@ -22422,7 +22464,7 @@
           <w:caps w:val="false"/>
           <w:rFonts w:ascii="Calibri" w:cs="Calibri" w:eastAsia="Calibri" w:hAnsi="Calibri"/>
         </w:rPr>
-        <w:t xml:space="preserve">Word-bank meaning to build on: The departments, agencies, and employees of the executive branch that carry out and administer federal laws and programs day to day.</w:t>
+        <w:t xml:space="preserve">The departments, agencies, and employees of the executive branch that carry out and administer federal laws and programs day to day.</w:t>
       </w:r>
     </w:p>
     <w:tbl>
@@ -23053,6 +23095,20 @@
       </w:pPr>
       <w:r>
         <w:rPr>
+          <w:b/>
+          <w:bCs/>
+          <w:i w:val="false"/>
+          <w:iCs w:val="false"/>
+          <w:color w:val="1A1A1A"/>
+          <w:sz w:val="20"/>
+          <w:szCs w:val="20"/>
+          <w:caps w:val="false"/>
+          <w:rFonts w:ascii="Calibri" w:cs="Calibri" w:eastAsia="Calibri" w:hAnsi="Calibri"/>
+        </w:rPr>
+        <w:t xml:space="preserve">Word-bank meaning to build on: </w:t>
+      </w:r>
+      <w:r>
+        <w:rPr>
           <w:b w:val="false"/>
           <w:bCs w:val="false"/>
           <w:i w:val="false"/>
@@ -23063,7 +23119,7 @@
           <w:caps w:val="false"/>
           <w:rFonts w:ascii="Calibri" w:cs="Calibri" w:eastAsia="Calibri" w:hAnsi="Calibri"/>
         </w:rPr>
-        <w:t xml:space="preserve">Word-bank meaning to build on: The group of the heads (secretaries) of the executive departments who advise the President.</w:t>
+        <w:t xml:space="preserve">The group of the heads (secretaries) of the executive departments who advise the President.</w:t>
       </w:r>
     </w:p>
     <w:tbl>
@@ -37834,6 +37890,20 @@
       </w:pPr>
       <w:r>
         <w:rPr>
+          <w:b/>
+          <w:bCs/>
+          <w:i w:val="false"/>
+          <w:iCs w:val="false"/>
+          <w:color w:val="1A1A1A"/>
+          <w:sz w:val="20"/>
+          <w:szCs w:val="20"/>
+          <w:caps w:val="false"/>
+          <w:rFonts w:ascii="Calibri" w:cs="Calibri" w:eastAsia="Calibri" w:hAnsi="Calibri"/>
+        </w:rPr>
+        <w:t xml:space="preserve">Word-bank meaning to build on: </w:t>
+      </w:r>
+      <w:r>
+        <w:rPr>
           <w:b w:val="false"/>
           <w:bCs w:val="false"/>
           <w:i w:val="false"/>
@@ -37844,7 +37914,7 @@
           <w:caps w:val="false"/>
           <w:rFonts w:ascii="Calibri" w:cs="Calibri" w:eastAsia="Calibri" w:hAnsi="Calibri"/>
         </w:rPr>
-        <w:t xml:space="preserve">Word-bank meaning to build on: The body of electors — one per senator and representative — that formally elects the President; a candidate needs a majority (270 of 538).</w:t>
+        <w:t xml:space="preserve">The body of electors — one per senator and representative — that formally elects the President; a candidate needs a majority (270 of 538).</w:t>
       </w:r>
     </w:p>
     <w:tbl>
@@ -38475,6 +38545,20 @@
       </w:pPr>
       <w:r>
         <w:rPr>
+          <w:b/>
+          <w:bCs/>
+          <w:i w:val="false"/>
+          <w:iCs w:val="false"/>
+          <w:color w:val="1A1A1A"/>
+          <w:sz w:val="20"/>
+          <w:szCs w:val="20"/>
+          <w:caps w:val="false"/>
+          <w:rFonts w:ascii="Calibri" w:cs="Calibri" w:eastAsia="Calibri" w:hAnsi="Calibri"/>
+        </w:rPr>
+        <w:t xml:space="preserve">Word-bank meaning to build on: </w:t>
+      </w:r>
+      <w:r>
+        <w:rPr>
           <w:b w:val="false"/>
           <w:bCs w:val="false"/>
           <w:i w:val="false"/>
@@ -38485,7 +38569,7 @@
           <w:caps w:val="false"/>
           <w:rFonts w:ascii="Calibri" w:cs="Calibri" w:eastAsia="Calibri" w:hAnsi="Calibri"/>
         </w:rPr>
-        <w:t xml:space="preserve">Word-bank meaning to build on: The practice, used by most states, of awarding all of a state's electoral votes to whichever candidate wins that state's popular vote.</w:t>
+        <w:t xml:space="preserve">The practice, used by most states, of awarding all of a state's electoral votes to whichever candidate wins that state's popular vote.</w:t>
       </w:r>
     </w:p>
     <w:tbl>

</xml_diff>

<commit_message>
Remove Name/Class/Date line from Cornell Notes (inconsistent + space-eating)
Only Activity 3 carried a Name/Class/Period/Date line; removed it to reclaim space and keep
activities consistent. Rebuilt all + large-print.

Co-Authored-By: Claude Opus 4.8 <noreply@anthropic.com>
Claude-Session: https://claude.ai/code/session_01DHdLjiiJeW6A83FcYRQ3qv
</commit_message>
<xml_diff>
--- a/courses/foundations-constitutional-government/BUILD/unit4/deliverables/Unit4_Student_Workbook_CourseStandard.docx
+++ b/courses/foundations-constitutional-government/BUILD/unit4/deliverables/Unit4_Student_Workbook_CourseStandard.docx
@@ -8366,25 +8366,6 @@
           <w:rFonts w:ascii="Calibri" w:cs="Calibri" w:eastAsia="Calibri" w:hAnsi="Calibri"/>
         </w:rPr>
         <w:t xml:space="preserve">    ⏱ ~20 min</w:t>
-      </w:r>
-    </w:p>
-    <w:p>
-      <w:pPr>
-        <w:spacing w:after="100"/>
-      </w:pPr>
-      <w:r>
-        <w:rPr>
-          <w:b w:val="false"/>
-          <w:bCs w:val="false"/>
-          <w:i w:val="false"/>
-          <w:iCs w:val="false"/>
-          <w:color w:val="1A1A1A"/>
-          <w:sz w:val="21"/>
-          <w:szCs w:val="21"/>
-          <w:caps w:val="false"/>
-          <w:rFonts w:ascii="Calibri" w:cs="Calibri" w:eastAsia="Calibri" w:hAnsi="Calibri"/>
-        </w:rPr>
-        <w:t xml:space="preserve">Name: ______________________    Class / Period: __________    Date: __________</w:t>
       </w:r>
     </w:p>
     <w:p>
@@ -23828,25 +23809,6 @@
           <w:bCs w:val="false"/>
           <w:i w:val="false"/>
           <w:iCs w:val="false"/>
-          <w:color w:val="1A1A1A"/>
-          <w:sz w:val="21"/>
-          <w:szCs w:val="21"/>
-          <w:caps w:val="false"/>
-          <w:rFonts w:ascii="Calibri" w:cs="Calibri" w:eastAsia="Calibri" w:hAnsi="Calibri"/>
-        </w:rPr>
-        <w:t xml:space="preserve">Name: ______________________    Class / Period: __________    Date: __________</w:t>
-      </w:r>
-    </w:p>
-    <w:p>
-      <w:pPr>
-        <w:spacing w:after="100"/>
-      </w:pPr>
-      <w:r>
-        <w:rPr>
-          <w:b w:val="false"/>
-          <w:bCs w:val="false"/>
-          <w:i w:val="false"/>
-          <w:iCs w:val="false"/>
           <w:color w:val="6B7280"/>
           <w:sz w:val="20"/>
           <w:szCs w:val="20"/>
@@ -39266,25 +39228,6 @@
           <w:rFonts w:ascii="Calibri" w:cs="Calibri" w:eastAsia="Calibri" w:hAnsi="Calibri"/>
         </w:rPr>
         <w:t xml:space="preserve">    ⏱ ~20 min</w:t>
-      </w:r>
-    </w:p>
-    <w:p>
-      <w:pPr>
-        <w:spacing w:after="100"/>
-      </w:pPr>
-      <w:r>
-        <w:rPr>
-          <w:b w:val="false"/>
-          <w:bCs w:val="false"/>
-          <w:i w:val="false"/>
-          <w:iCs w:val="false"/>
-          <w:color w:val="1A1A1A"/>
-          <w:sz w:val="21"/>
-          <w:szCs w:val="21"/>
-          <w:caps w:val="false"/>
-          <w:rFonts w:ascii="Calibri" w:cs="Calibri" w:eastAsia="Calibri" w:hAnsi="Calibri"/>
-        </w:rPr>
-        <w:t xml:space="preserve">Name: ______________________    Class / Period: __________    Date: __________</w:t>
       </w:r>
     </w:p>
     <w:p>

</xml_diff>

<commit_message>
Remove per-standard UDL Access/Choice/Reflection page from student workbook
Those supports are teacher-facing, so drop the student-visible 'UDL Access, Choice & Reflection'
page (UDL/MTSS strip, Show-What-You-Know, Choice & Voice, Reflect & Connect) from every standard.
Removes one page per standard. Rebuilt all + large-print.

Co-Authored-By: Claude Opus 4.8 <noreply@anthropic.com>
Claude-Session: https://claude.ai/code/session_01DHdLjiiJeW6A83FcYRQ3qv
</commit_message>
<xml_diff>
--- a/courses/foundations-constitutional-government/BUILD/unit4/deliverables/Unit4_Student_Workbook_CourseStandard.docx
+++ b/courses/foundations-constitutional-government/BUILD/unit4/deliverables/Unit4_Student_Workbook_CourseStandard.docx
@@ -19230,457 +19230,6 @@
     </w:p>
     <w:p>
       <w:pPr>
-        <w:pStyle w:val="Heading2"/>
-        <w:keepNext/>
-        <w:pageBreakBefore/>
-        <w:spacing w:before="150" w:after="90"/>
-      </w:pPr>
-      <w:r>
-        <w:rPr>
-          <w:b/>
-          <w:bCs/>
-          <w:i w:val="false"/>
-          <w:iCs w:val="false"/>
-          <w:color w:val="1B2A4A"/>
-          <w:sz w:val="28"/>
-          <w:szCs w:val="28"/>
-          <w:caps w:val="false"/>
-          <w:rFonts w:ascii="Calibri" w:cs="Calibri" w:eastAsia="Calibri" w:hAnsi="Calibri"/>
-        </w:rPr>
-        <w:t xml:space="preserve">UDL Access, Choice &amp; Reflection — GC.16</w:t>
-      </w:r>
-    </w:p>
-    <w:tbl>
-      <w:tblPr>
-        <w:tblW w:type="dxa" w:w="9792"/>
-        <w:tblBorders>
-          <w:top w:val="single" w:color="auto" w:sz="4"/>
-          <w:left w:val="single" w:color="auto" w:sz="4"/>
-          <w:bottom w:val="single" w:color="auto" w:sz="4"/>
-          <w:right w:val="single" w:color="auto" w:sz="4"/>
-          <w:insideH w:val="single" w:color="auto" w:sz="4"/>
-          <w:insideV w:val="single" w:color="auto" w:sz="4"/>
-        </w:tblBorders>
-      </w:tblPr>
-      <w:tblGrid>
-        <w:gridCol w:w="9792"/>
-      </w:tblGrid>
-      <w:tr>
-        <w:tc>
-          <w:tcPr>
-            <w:tcW w:type="dxa" w:w="9792"/>
-            <w:tcBorders>
-              <w:top w:val="single" w:color="D9D5C8" w:sz="4"/>
-              <w:left w:val="single" w:color="D9D5C8" w:sz="4"/>
-              <w:bottom w:val="single" w:color="D9D5C8" w:sz="4"/>
-              <w:right w:val="single" w:color="D9D5C8" w:sz="4"/>
-            </w:tcBorders>
-            <w:shd w:fill="F7F5EF" w:color="auto" w:val="clear"/>
-            <w:tcMar>
-              <w:top w:type="dxa" w:w="55"/>
-              <w:left w:type="dxa" w:w="110"/>
-              <w:bottom w:type="dxa" w:w="55"/>
-              <w:right w:type="dxa" w:w="110"/>
-            </w:tcMar>
-          </w:tcPr>
-          <w:p>
-            <w:pPr>
-              <w:spacing w:after="60"/>
-            </w:pPr>
-            <w:r>
-              <w:rPr>
-                <w:b/>
-                <w:bCs/>
-                <w:i w:val="false"/>
-                <w:iCs w:val="false"/>
-                <w:color w:val="1B2A4A"/>
-                <w:sz w:val="21"/>
-                <w:szCs w:val="21"/>
-                <w:caps w:val="false"/>
-                <w:rFonts w:ascii="Calibri" w:cs="Calibri" w:eastAsia="Calibri" w:hAnsi="Calibri"/>
-              </w:rPr>
-              <w:t xml:space="preserve">UDL ACCESS &amp; MTSS SUPPORT (this standard)</w:t>
-            </w:r>
-          </w:p>
-          <w:p>
-            <w:pPr>
-              <w:spacing w:after="40"/>
-            </w:pPr>
-            <w:r>
-              <w:rPr>
-                <w:b w:val="false"/>
-                <w:bCs w:val="false"/>
-                <w:i w:val="false"/>
-                <w:iCs w:val="false"/>
-                <w:color w:val="1A1A1A"/>
-                <w:sz w:val="22"/>
-                <w:szCs w:val="22"/>
-                <w:caps w:val="false"/>
-                <w:rFonts w:ascii="Calibri" w:cs="Calibri" w:eastAsia="Calibri" w:hAnsi="Calibri"/>
-              </w:rPr>
-              <w:t xml:space="preserve">UDL 3.0 (CAST, 2024): read-aloud on request · key terms glossed (EN/ES) · respond in writing, speech, or a labeled diagram · large-print &amp; screen-reader friendly. Same learning target for everyone; supports vary the means, not the ceiling.</w:t>
-            </w:r>
-          </w:p>
-          <w:p>
-            <w:pPr>
-              <w:spacing w:after="40"/>
-            </w:pPr>
-            <w:r>
-              <w:rPr>
-                <w:b w:val="false"/>
-                <w:bCs w:val="false"/>
-                <w:i w:val="false"/>
-                <w:iCs w:val="false"/>
-                <w:color w:val="1A1A1A"/>
-                <w:sz w:val="22"/>
-                <w:szCs w:val="22"/>
-                <w:caps w:val="false"/>
-                <w:rFonts w:ascii="Calibri" w:cs="Calibri" w:eastAsia="Calibri" w:hAnsi="Calibri"/>
-              </w:rPr>
-              <w:t xml:space="preserve">MTSS: Tier 1 — this core lesson for all · Tier 2 — small-group reteach of this standard using its Cornell cues + graphic organizer, then re-check · Tier 3 — intensive 1:1 with concrete→representational→abstract scaffolding, progress-monitored to the same standard.</w:t>
-            </w:r>
-          </w:p>
-        </w:tc>
-      </w:tr>
-    </w:tbl>
-    <w:tbl>
-      <w:tblPr>
-        <w:tblW w:type="dxa" w:w="9792"/>
-        <w:tblBorders>
-          <w:top w:val="single" w:color="auto" w:sz="4"/>
-          <w:left w:val="single" w:color="auto" w:sz="4"/>
-          <w:bottom w:val="single" w:color="auto" w:sz="4"/>
-          <w:right w:val="single" w:color="auto" w:sz="4"/>
-          <w:insideH w:val="single" w:color="auto" w:sz="4"/>
-          <w:insideV w:val="single" w:color="auto" w:sz="4"/>
-        </w:tblBorders>
-      </w:tblPr>
-      <w:tblGrid>
-        <w:gridCol w:w="9792"/>
-      </w:tblGrid>
-      <w:tr>
-        <w:tc>
-          <w:tcPr>
-            <w:tcW w:type="dxa" w:w="9792"/>
-            <w:tcBorders>
-              <w:top w:val="single" w:color="D9D5C8" w:sz="4"/>
-              <w:left w:val="single" w:color="D9D5C8" w:sz="4"/>
-              <w:bottom w:val="single" w:color="D9D5C8" w:sz="4"/>
-              <w:right w:val="single" w:color="D9D5C8" w:sz="4"/>
-            </w:tcBorders>
-            <w:shd w:fill="F7F5EF" w:color="auto" w:val="clear"/>
-            <w:tcMar>
-              <w:top w:type="dxa" w:w="55"/>
-              <w:left w:type="dxa" w:w="110"/>
-              <w:bottom w:type="dxa" w:w="55"/>
-              <w:right w:type="dxa" w:w="110"/>
-            </w:tcMar>
-          </w:tcPr>
-          <w:p>
-            <w:pPr>
-              <w:spacing w:after="60"/>
-            </w:pPr>
-            <w:r>
-              <w:rPr>
-                <w:b/>
-                <w:bCs/>
-                <w:i w:val="false"/>
-                <w:iCs w:val="false"/>
-                <w:color w:val="1B2A4A"/>
-                <w:sz w:val="21"/>
-                <w:szCs w:val="21"/>
-                <w:caps w:val="false"/>
-                <w:rFonts w:ascii="Calibri" w:cs="Calibri" w:eastAsia="Calibri" w:hAnsi="Calibri"/>
-              </w:rPr>
-              <w:t xml:space="preserve">SHOW WHAT YOU KNOW — YOUR WAY (same CER rubric, same standard)</w:t>
-            </w:r>
-          </w:p>
-          <w:p>
-            <w:pPr>
-              <w:spacing w:after="40"/>
-            </w:pPr>
-            <w:r>
-              <w:rPr>
-                <w:b w:val="false"/>
-                <w:bCs w:val="false"/>
-                <w:i w:val="false"/>
-                <w:iCs w:val="false"/>
-                <w:color w:val="1A1A1A"/>
-                <w:sz w:val="22"/>
-                <w:szCs w:val="22"/>
-                <w:caps w:val="false"/>
-                <w:rFonts w:ascii="Calibri" w:cs="Calibri" w:eastAsia="Calibri" w:hAnsi="Calibri"/>
-              </w:rPr>
-              <w:t xml:space="preserve">Build your Claim–Evidence–Reasoning in whichever mode lets you think best — the standard and the CER rubric are identical for every mode; the mode changes how you SHOW it, never what you are held to:</w:t>
-            </w:r>
-          </w:p>
-          <w:p>
-            <w:pPr>
-              <w:spacing w:after="40"/>
-            </w:pPr>
-            <w:r>
-              <w:rPr>
-                <w:b w:val="false"/>
-                <w:bCs w:val="false"/>
-                <w:i w:val="false"/>
-                <w:iCs w:val="false"/>
-                <w:color w:val="1A1A1A"/>
-                <w:sz w:val="22"/>
-                <w:szCs w:val="22"/>
-                <w:caps w:val="false"/>
-                <w:rFonts w:ascii="Calibri" w:cs="Calibri" w:eastAsia="Calibri" w:hAnsi="Calibri"/>
-              </w:rPr>
-              <w:t xml:space="preserve">WRITE it  ·  SAY it aloud and record it (audio or video)  ·  DRAW and label a diagram that makes the argument  ·  BUILD a model or artifact and caption its claim, evidence, and reasoning.</w:t>
-            </w:r>
-          </w:p>
-          <w:p>
-            <w:pPr>
-              <w:spacing w:after="40"/>
-            </w:pPr>
-            <w:r>
-              <w:rPr>
-                <w:b w:val="false"/>
-                <w:bCs w:val="false"/>
-                <w:i w:val="false"/>
-                <w:iCs w:val="false"/>
-                <w:color w:val="1A1A1A"/>
-                <w:sz w:val="22"/>
-                <w:szCs w:val="22"/>
-                <w:caps w:val="false"/>
-                <w:rFonts w:ascii="Calibri" w:cs="Calibri" w:eastAsia="Calibri" w:hAnsi="Calibri"/>
-              </w:rPr>
-              <w:t xml:space="preserve">You may ask for a word processor, speech-to-text, a scribe, or a sentence/argument frame — these change how you produce, not the standard you meet.</w:t>
-            </w:r>
-          </w:p>
-        </w:tc>
-      </w:tr>
-    </w:tbl>
-    <w:tbl>
-      <w:tblPr>
-        <w:tblW w:type="dxa" w:w="9792"/>
-        <w:tblBorders>
-          <w:top w:val="single" w:color="auto" w:sz="4"/>
-          <w:left w:val="single" w:color="auto" w:sz="4"/>
-          <w:bottom w:val="single" w:color="auto" w:sz="4"/>
-          <w:right w:val="single" w:color="auto" w:sz="4"/>
-          <w:insideH w:val="single" w:color="auto" w:sz="4"/>
-          <w:insideV w:val="single" w:color="auto" w:sz="4"/>
-        </w:tblBorders>
-      </w:tblPr>
-      <w:tblGrid>
-        <w:gridCol w:w="9792"/>
-      </w:tblGrid>
-      <w:tr>
-        <w:tc>
-          <w:tcPr>
-            <w:tcW w:type="dxa" w:w="9792"/>
-            <w:tcBorders>
-              <w:top w:val="single" w:color="D9D5C8" w:sz="4"/>
-              <w:left w:val="single" w:color="D9D5C8" w:sz="4"/>
-              <w:bottom w:val="single" w:color="D9D5C8" w:sz="4"/>
-              <w:right w:val="single" w:color="D9D5C8" w:sz="4"/>
-            </w:tcBorders>
-            <w:shd w:fill="F7F5EF" w:color="auto" w:val="clear"/>
-            <w:tcMar>
-              <w:top w:type="dxa" w:w="55"/>
-              <w:left w:type="dxa" w:w="110"/>
-              <w:bottom w:type="dxa" w:w="55"/>
-              <w:right w:type="dxa" w:w="110"/>
-            </w:tcMar>
-          </w:tcPr>
-          <w:p>
-            <w:pPr>
-              <w:spacing w:after="60"/>
-            </w:pPr>
-            <w:r>
-              <w:rPr>
-                <w:b/>
-                <w:bCs/>
-                <w:i w:val="false"/>
-                <w:iCs w:val="false"/>
-                <w:color w:val="1B2A4A"/>
-                <w:sz w:val="21"/>
-                <w:szCs w:val="21"/>
-                <w:caps w:val="false"/>
-                <w:rFonts w:ascii="Calibri" w:cs="Calibri" w:eastAsia="Calibri" w:hAnsi="Calibri"/>
-              </w:rPr>
-              <w:t xml:space="preserve">CHOICE &amp; VOICE — you decide how to go deeper (pick ONE)</w:t>
-            </w:r>
-          </w:p>
-          <w:p>
-            <w:pPr>
-              <w:spacing w:after="40"/>
-            </w:pPr>
-            <w:r>
-              <w:rPr>
-                <w:b w:val="false"/>
-                <w:bCs w:val="false"/>
-                <w:i w:val="false"/>
-                <w:iCs w:val="false"/>
-                <w:color w:val="1A1A1A"/>
-                <w:sz w:val="22"/>
-                <w:szCs w:val="22"/>
-                <w:caps w:val="false"/>
-                <w:rFonts w:ascii="Calibri" w:cs="Calibri" w:eastAsia="Calibri" w:hAnsi="Calibri"/>
-              </w:rPr>
-              <w:t xml:space="preserve">You choose your path to show this standard — every option meets the same target:</w:t>
-            </w:r>
-          </w:p>
-          <w:p>
-            <w:pPr>
-              <w:spacing w:after="40"/>
-            </w:pPr>
-            <w:r>
-              <w:rPr>
-                <w:b w:val="false"/>
-                <w:bCs w:val="false"/>
-                <w:i w:val="false"/>
-                <w:iCs w:val="false"/>
-                <w:color w:val="1A1A1A"/>
-                <w:sz w:val="22"/>
-                <w:szCs w:val="22"/>
-                <w:caps w:val="false"/>
-                <w:rFonts w:ascii="Calibri" w:cs="Calibri" w:eastAsia="Calibri" w:hAnsi="Calibri"/>
-              </w:rPr>
-              <w:t xml:space="preserve">DEFEND a term: pick the vocabulary word that matters most and argue why in 2–3 sentences.  ·  CONNECT it: pick a current event, your community, or your own life and explain how this standard shows up there.  ·  TAKE A SIDE: pick one debatable question and argue your position with evidence.</w:t>
-            </w:r>
-          </w:p>
-          <w:p>
-            <w:pPr>
-              <w:spacing w:after="40"/>
-            </w:pPr>
-            <w:r>
-              <w:rPr>
-                <w:b w:val="false"/>
-                <w:bCs w:val="false"/>
-                <w:i w:val="false"/>
-                <w:iCs w:val="false"/>
-                <w:color w:val="1A1A1A"/>
-                <w:sz w:val="22"/>
-                <w:szCs w:val="22"/>
-                <w:caps w:val="false"/>
-                <w:rFonts w:ascii="Calibri" w:cs="Calibri" w:eastAsia="Calibri" w:hAnsi="Calibri"/>
-              </w:rPr>
-              <w:t xml:space="preserve">Your pick is yours — bring what matters to you into the work.</w:t>
-            </w:r>
-          </w:p>
-        </w:tc>
-      </w:tr>
-    </w:tbl>
-    <w:tbl>
-      <w:tblPr>
-        <w:tblW w:type="dxa" w:w="9792"/>
-        <w:tblBorders>
-          <w:top w:val="single" w:color="auto" w:sz="4"/>
-          <w:left w:val="single" w:color="auto" w:sz="4"/>
-          <w:bottom w:val="single" w:color="auto" w:sz="4"/>
-          <w:right w:val="single" w:color="auto" w:sz="4"/>
-          <w:insideH w:val="single" w:color="auto" w:sz="4"/>
-          <w:insideV w:val="single" w:color="auto" w:sz="4"/>
-        </w:tblBorders>
-      </w:tblPr>
-      <w:tblGrid>
-        <w:gridCol w:w="9792"/>
-      </w:tblGrid>
-      <w:tr>
-        <w:tc>
-          <w:tcPr>
-            <w:tcW w:type="dxa" w:w="9792"/>
-            <w:tcBorders>
-              <w:top w:val="single" w:color="D9D5C8" w:sz="4"/>
-              <w:left w:val="single" w:color="D9D5C8" w:sz="4"/>
-              <w:bottom w:val="single" w:color="D9D5C8" w:sz="4"/>
-              <w:right w:val="single" w:color="D9D5C8" w:sz="4"/>
-            </w:tcBorders>
-            <w:shd w:fill="F7F5EF" w:color="auto" w:val="clear"/>
-            <w:tcMar>
-              <w:top w:type="dxa" w:w="55"/>
-              <w:left w:type="dxa" w:w="110"/>
-              <w:bottom w:type="dxa" w:w="55"/>
-              <w:right w:type="dxa" w:w="110"/>
-            </w:tcMar>
-          </w:tcPr>
-          <w:p>
-            <w:pPr>
-              <w:spacing w:after="60"/>
-            </w:pPr>
-            <w:r>
-              <w:rPr>
-                <w:b/>
-                <w:bCs/>
-                <w:i w:val="false"/>
-                <w:iCs w:val="false"/>
-                <w:color w:val="1B2A4A"/>
-                <w:sz w:val="21"/>
-                <w:szCs w:val="21"/>
-                <w:caps w:val="false"/>
-                <w:rFonts w:ascii="Calibri" w:cs="Calibri" w:eastAsia="Calibri" w:hAnsi="Calibri"/>
-              </w:rPr>
-              <w:t xml:space="preserve">REFLECT &amp; CONNECT — how your thinking grew, and whose view you weighed</w:t>
-            </w:r>
-          </w:p>
-          <w:p>
-            <w:pPr>
-              <w:spacing w:after="40"/>
-            </w:pPr>
-            <w:r>
-              <w:rPr>
-                <w:b w:val="false"/>
-                <w:bCs w:val="false"/>
-                <w:i w:val="false"/>
-                <w:iCs w:val="false"/>
-                <w:color w:val="1A1A1A"/>
-                <w:sz w:val="22"/>
-                <w:szCs w:val="22"/>
-                <w:caps w:val="false"/>
-                <w:rFonts w:ascii="Calibri" w:cs="Calibri" w:eastAsia="Calibri" w:hAnsi="Calibri"/>
-              </w:rPr>
-              <w:t xml:space="preserve">Reflect (self-awareness): What did you believe about this topic BEFORE, and what changed AFTER? Name one thing to revisit.</w:t>
-            </w:r>
-          </w:p>
-          <w:p>
-            <w:pPr>
-              <w:spacing w:after="40"/>
-            </w:pPr>
-            <w:r>
-              <w:rPr>
-                <w:b w:val="false"/>
-                <w:bCs w:val="false"/>
-                <w:i w:val="false"/>
-                <w:iCs w:val="false"/>
-                <w:color w:val="1A1A1A"/>
-                <w:sz w:val="22"/>
-                <w:szCs w:val="22"/>
-                <w:caps w:val="false"/>
-                <w:rFonts w:ascii="Calibri" w:cs="Calibri" w:eastAsia="Calibri" w:hAnsi="Calibri"/>
-              </w:rPr>
-              <w:t xml:space="preserve">Consider another view (empathy): Name one person or group who might see this standard differently than you; state their view fairly in one sentence — even if you disagree.</w:t>
-            </w:r>
-          </w:p>
-          <w:p>
-            <w:pPr>
-              <w:spacing w:after="40"/>
-            </w:pPr>
-            <w:r>
-              <w:rPr>
-                <w:b w:val="false"/>
-                <w:bCs w:val="false"/>
-                <w:i w:val="false"/>
-                <w:iCs w:val="false"/>
-                <w:color w:val="1A1A1A"/>
-                <w:sz w:val="22"/>
-                <w:szCs w:val="22"/>
-                <w:caps w:val="false"/>
-                <w:rFonts w:ascii="Calibri" w:cs="Calibri" w:eastAsia="Calibri" w:hAnsi="Calibri"/>
-              </w:rPr>
-              <w:t xml:space="preserve">Norm (restorative): we critique ideas, not people; we assume good faith; we make room for every voice.</w:t>
-            </w:r>
-          </w:p>
-        </w:tc>
-      </w:tr>
-    </w:tbl>
-    <w:p>
-      <w:pPr>
         <w:pStyle w:val="Heading1"/>
         <w:keepNext/>
         <w:pageBreakBefore/>
@@ -34661,457 +34210,6 @@
     </w:p>
     <w:p>
       <w:pPr>
-        <w:pStyle w:val="Heading2"/>
-        <w:keepNext/>
-        <w:pageBreakBefore/>
-        <w:spacing w:before="150" w:after="90"/>
-      </w:pPr>
-      <w:r>
-        <w:rPr>
-          <w:b/>
-          <w:bCs/>
-          <w:i w:val="false"/>
-          <w:iCs w:val="false"/>
-          <w:color w:val="1B2A4A"/>
-          <w:sz w:val="28"/>
-          <w:szCs w:val="28"/>
-          <w:caps w:val="false"/>
-          <w:rFonts w:ascii="Calibri" w:cs="Calibri" w:eastAsia="Calibri" w:hAnsi="Calibri"/>
-        </w:rPr>
-        <w:t xml:space="preserve">UDL Access, Choice &amp; Reflection — GC.17</w:t>
-      </w:r>
-    </w:p>
-    <w:tbl>
-      <w:tblPr>
-        <w:tblW w:type="dxa" w:w="9792"/>
-        <w:tblBorders>
-          <w:top w:val="single" w:color="auto" w:sz="4"/>
-          <w:left w:val="single" w:color="auto" w:sz="4"/>
-          <w:bottom w:val="single" w:color="auto" w:sz="4"/>
-          <w:right w:val="single" w:color="auto" w:sz="4"/>
-          <w:insideH w:val="single" w:color="auto" w:sz="4"/>
-          <w:insideV w:val="single" w:color="auto" w:sz="4"/>
-        </w:tblBorders>
-      </w:tblPr>
-      <w:tblGrid>
-        <w:gridCol w:w="9792"/>
-      </w:tblGrid>
-      <w:tr>
-        <w:tc>
-          <w:tcPr>
-            <w:tcW w:type="dxa" w:w="9792"/>
-            <w:tcBorders>
-              <w:top w:val="single" w:color="D9D5C8" w:sz="4"/>
-              <w:left w:val="single" w:color="D9D5C8" w:sz="4"/>
-              <w:bottom w:val="single" w:color="D9D5C8" w:sz="4"/>
-              <w:right w:val="single" w:color="D9D5C8" w:sz="4"/>
-            </w:tcBorders>
-            <w:shd w:fill="F7F5EF" w:color="auto" w:val="clear"/>
-            <w:tcMar>
-              <w:top w:type="dxa" w:w="55"/>
-              <w:left w:type="dxa" w:w="110"/>
-              <w:bottom w:type="dxa" w:w="55"/>
-              <w:right w:type="dxa" w:w="110"/>
-            </w:tcMar>
-          </w:tcPr>
-          <w:p>
-            <w:pPr>
-              <w:spacing w:after="60"/>
-            </w:pPr>
-            <w:r>
-              <w:rPr>
-                <w:b/>
-                <w:bCs/>
-                <w:i w:val="false"/>
-                <w:iCs w:val="false"/>
-                <w:color w:val="1B2A4A"/>
-                <w:sz w:val="21"/>
-                <w:szCs w:val="21"/>
-                <w:caps w:val="false"/>
-                <w:rFonts w:ascii="Calibri" w:cs="Calibri" w:eastAsia="Calibri" w:hAnsi="Calibri"/>
-              </w:rPr>
-              <w:t xml:space="preserve">UDL ACCESS &amp; MTSS SUPPORT (this standard)</w:t>
-            </w:r>
-          </w:p>
-          <w:p>
-            <w:pPr>
-              <w:spacing w:after="40"/>
-            </w:pPr>
-            <w:r>
-              <w:rPr>
-                <w:b w:val="false"/>
-                <w:bCs w:val="false"/>
-                <w:i w:val="false"/>
-                <w:iCs w:val="false"/>
-                <w:color w:val="1A1A1A"/>
-                <w:sz w:val="22"/>
-                <w:szCs w:val="22"/>
-                <w:caps w:val="false"/>
-                <w:rFonts w:ascii="Calibri" w:cs="Calibri" w:eastAsia="Calibri" w:hAnsi="Calibri"/>
-              </w:rPr>
-              <w:t xml:space="preserve">UDL 3.0 (CAST, 2024): read-aloud on request · key terms glossed (EN/ES) · respond in writing, speech, or a labeled diagram · large-print &amp; screen-reader friendly. Same learning target for everyone; supports vary the means, not the ceiling.</w:t>
-            </w:r>
-          </w:p>
-          <w:p>
-            <w:pPr>
-              <w:spacing w:after="40"/>
-            </w:pPr>
-            <w:r>
-              <w:rPr>
-                <w:b w:val="false"/>
-                <w:bCs w:val="false"/>
-                <w:i w:val="false"/>
-                <w:iCs w:val="false"/>
-                <w:color w:val="1A1A1A"/>
-                <w:sz w:val="22"/>
-                <w:szCs w:val="22"/>
-                <w:caps w:val="false"/>
-                <w:rFonts w:ascii="Calibri" w:cs="Calibri" w:eastAsia="Calibri" w:hAnsi="Calibri"/>
-              </w:rPr>
-              <w:t xml:space="preserve">MTSS: Tier 1 — this core lesson for all · Tier 2 — small-group reteach of this standard using its Cornell cues + graphic organizer, then re-check · Tier 3 — intensive 1:1 with concrete→representational→abstract scaffolding, progress-monitored to the same standard.</w:t>
-            </w:r>
-          </w:p>
-        </w:tc>
-      </w:tr>
-    </w:tbl>
-    <w:tbl>
-      <w:tblPr>
-        <w:tblW w:type="dxa" w:w="9792"/>
-        <w:tblBorders>
-          <w:top w:val="single" w:color="auto" w:sz="4"/>
-          <w:left w:val="single" w:color="auto" w:sz="4"/>
-          <w:bottom w:val="single" w:color="auto" w:sz="4"/>
-          <w:right w:val="single" w:color="auto" w:sz="4"/>
-          <w:insideH w:val="single" w:color="auto" w:sz="4"/>
-          <w:insideV w:val="single" w:color="auto" w:sz="4"/>
-        </w:tblBorders>
-      </w:tblPr>
-      <w:tblGrid>
-        <w:gridCol w:w="9792"/>
-      </w:tblGrid>
-      <w:tr>
-        <w:tc>
-          <w:tcPr>
-            <w:tcW w:type="dxa" w:w="9792"/>
-            <w:tcBorders>
-              <w:top w:val="single" w:color="D9D5C8" w:sz="4"/>
-              <w:left w:val="single" w:color="D9D5C8" w:sz="4"/>
-              <w:bottom w:val="single" w:color="D9D5C8" w:sz="4"/>
-              <w:right w:val="single" w:color="D9D5C8" w:sz="4"/>
-            </w:tcBorders>
-            <w:shd w:fill="F7F5EF" w:color="auto" w:val="clear"/>
-            <w:tcMar>
-              <w:top w:type="dxa" w:w="55"/>
-              <w:left w:type="dxa" w:w="110"/>
-              <w:bottom w:type="dxa" w:w="55"/>
-              <w:right w:type="dxa" w:w="110"/>
-            </w:tcMar>
-          </w:tcPr>
-          <w:p>
-            <w:pPr>
-              <w:spacing w:after="60"/>
-            </w:pPr>
-            <w:r>
-              <w:rPr>
-                <w:b/>
-                <w:bCs/>
-                <w:i w:val="false"/>
-                <w:iCs w:val="false"/>
-                <w:color w:val="1B2A4A"/>
-                <w:sz w:val="21"/>
-                <w:szCs w:val="21"/>
-                <w:caps w:val="false"/>
-                <w:rFonts w:ascii="Calibri" w:cs="Calibri" w:eastAsia="Calibri" w:hAnsi="Calibri"/>
-              </w:rPr>
-              <w:t xml:space="preserve">SHOW WHAT YOU KNOW — YOUR WAY (same CER rubric, same standard)</w:t>
-            </w:r>
-          </w:p>
-          <w:p>
-            <w:pPr>
-              <w:spacing w:after="40"/>
-            </w:pPr>
-            <w:r>
-              <w:rPr>
-                <w:b w:val="false"/>
-                <w:bCs w:val="false"/>
-                <w:i w:val="false"/>
-                <w:iCs w:val="false"/>
-                <w:color w:val="1A1A1A"/>
-                <w:sz w:val="22"/>
-                <w:szCs w:val="22"/>
-                <w:caps w:val="false"/>
-                <w:rFonts w:ascii="Calibri" w:cs="Calibri" w:eastAsia="Calibri" w:hAnsi="Calibri"/>
-              </w:rPr>
-              <w:t xml:space="preserve">Build your Claim–Evidence–Reasoning in whichever mode lets you think best — the standard and the CER rubric are identical for every mode; the mode changes how you SHOW it, never what you are held to:</w:t>
-            </w:r>
-          </w:p>
-          <w:p>
-            <w:pPr>
-              <w:spacing w:after="40"/>
-            </w:pPr>
-            <w:r>
-              <w:rPr>
-                <w:b w:val="false"/>
-                <w:bCs w:val="false"/>
-                <w:i w:val="false"/>
-                <w:iCs w:val="false"/>
-                <w:color w:val="1A1A1A"/>
-                <w:sz w:val="22"/>
-                <w:szCs w:val="22"/>
-                <w:caps w:val="false"/>
-                <w:rFonts w:ascii="Calibri" w:cs="Calibri" w:eastAsia="Calibri" w:hAnsi="Calibri"/>
-              </w:rPr>
-              <w:t xml:space="preserve">WRITE it  ·  SAY it aloud and record it (audio or video)  ·  DRAW and label a diagram that makes the argument  ·  BUILD a model or artifact and caption its claim, evidence, and reasoning.</w:t>
-            </w:r>
-          </w:p>
-          <w:p>
-            <w:pPr>
-              <w:spacing w:after="40"/>
-            </w:pPr>
-            <w:r>
-              <w:rPr>
-                <w:b w:val="false"/>
-                <w:bCs w:val="false"/>
-                <w:i w:val="false"/>
-                <w:iCs w:val="false"/>
-                <w:color w:val="1A1A1A"/>
-                <w:sz w:val="22"/>
-                <w:szCs w:val="22"/>
-                <w:caps w:val="false"/>
-                <w:rFonts w:ascii="Calibri" w:cs="Calibri" w:eastAsia="Calibri" w:hAnsi="Calibri"/>
-              </w:rPr>
-              <w:t xml:space="preserve">You may ask for a word processor, speech-to-text, a scribe, or a sentence/argument frame — these change how you produce, not the standard you meet.</w:t>
-            </w:r>
-          </w:p>
-        </w:tc>
-      </w:tr>
-    </w:tbl>
-    <w:tbl>
-      <w:tblPr>
-        <w:tblW w:type="dxa" w:w="9792"/>
-        <w:tblBorders>
-          <w:top w:val="single" w:color="auto" w:sz="4"/>
-          <w:left w:val="single" w:color="auto" w:sz="4"/>
-          <w:bottom w:val="single" w:color="auto" w:sz="4"/>
-          <w:right w:val="single" w:color="auto" w:sz="4"/>
-          <w:insideH w:val="single" w:color="auto" w:sz="4"/>
-          <w:insideV w:val="single" w:color="auto" w:sz="4"/>
-        </w:tblBorders>
-      </w:tblPr>
-      <w:tblGrid>
-        <w:gridCol w:w="9792"/>
-      </w:tblGrid>
-      <w:tr>
-        <w:tc>
-          <w:tcPr>
-            <w:tcW w:type="dxa" w:w="9792"/>
-            <w:tcBorders>
-              <w:top w:val="single" w:color="D9D5C8" w:sz="4"/>
-              <w:left w:val="single" w:color="D9D5C8" w:sz="4"/>
-              <w:bottom w:val="single" w:color="D9D5C8" w:sz="4"/>
-              <w:right w:val="single" w:color="D9D5C8" w:sz="4"/>
-            </w:tcBorders>
-            <w:shd w:fill="F7F5EF" w:color="auto" w:val="clear"/>
-            <w:tcMar>
-              <w:top w:type="dxa" w:w="55"/>
-              <w:left w:type="dxa" w:w="110"/>
-              <w:bottom w:type="dxa" w:w="55"/>
-              <w:right w:type="dxa" w:w="110"/>
-            </w:tcMar>
-          </w:tcPr>
-          <w:p>
-            <w:pPr>
-              <w:spacing w:after="60"/>
-            </w:pPr>
-            <w:r>
-              <w:rPr>
-                <w:b/>
-                <w:bCs/>
-                <w:i w:val="false"/>
-                <w:iCs w:val="false"/>
-                <w:color w:val="1B2A4A"/>
-                <w:sz w:val="21"/>
-                <w:szCs w:val="21"/>
-                <w:caps w:val="false"/>
-                <w:rFonts w:ascii="Calibri" w:cs="Calibri" w:eastAsia="Calibri" w:hAnsi="Calibri"/>
-              </w:rPr>
-              <w:t xml:space="preserve">CHOICE &amp; VOICE — you decide how to go deeper (pick ONE)</w:t>
-            </w:r>
-          </w:p>
-          <w:p>
-            <w:pPr>
-              <w:spacing w:after="40"/>
-            </w:pPr>
-            <w:r>
-              <w:rPr>
-                <w:b w:val="false"/>
-                <w:bCs w:val="false"/>
-                <w:i w:val="false"/>
-                <w:iCs w:val="false"/>
-                <w:color w:val="1A1A1A"/>
-                <w:sz w:val="22"/>
-                <w:szCs w:val="22"/>
-                <w:caps w:val="false"/>
-                <w:rFonts w:ascii="Calibri" w:cs="Calibri" w:eastAsia="Calibri" w:hAnsi="Calibri"/>
-              </w:rPr>
-              <w:t xml:space="preserve">You choose your path to show this standard — every option meets the same target:</w:t>
-            </w:r>
-          </w:p>
-          <w:p>
-            <w:pPr>
-              <w:spacing w:after="40"/>
-            </w:pPr>
-            <w:r>
-              <w:rPr>
-                <w:b w:val="false"/>
-                <w:bCs w:val="false"/>
-                <w:i w:val="false"/>
-                <w:iCs w:val="false"/>
-                <w:color w:val="1A1A1A"/>
-                <w:sz w:val="22"/>
-                <w:szCs w:val="22"/>
-                <w:caps w:val="false"/>
-                <w:rFonts w:ascii="Calibri" w:cs="Calibri" w:eastAsia="Calibri" w:hAnsi="Calibri"/>
-              </w:rPr>
-              <w:t xml:space="preserve">DEFEND a term: pick the vocabulary word that matters most and argue why in 2–3 sentences.  ·  CONNECT it: pick a current event, your community, or your own life and explain how this standard shows up there.  ·  TAKE A SIDE: pick one debatable question and argue your position with evidence.</w:t>
-            </w:r>
-          </w:p>
-          <w:p>
-            <w:pPr>
-              <w:spacing w:after="40"/>
-            </w:pPr>
-            <w:r>
-              <w:rPr>
-                <w:b w:val="false"/>
-                <w:bCs w:val="false"/>
-                <w:i w:val="false"/>
-                <w:iCs w:val="false"/>
-                <w:color w:val="1A1A1A"/>
-                <w:sz w:val="22"/>
-                <w:szCs w:val="22"/>
-                <w:caps w:val="false"/>
-                <w:rFonts w:ascii="Calibri" w:cs="Calibri" w:eastAsia="Calibri" w:hAnsi="Calibri"/>
-              </w:rPr>
-              <w:t xml:space="preserve">Your pick is yours — bring what matters to you into the work.</w:t>
-            </w:r>
-          </w:p>
-        </w:tc>
-      </w:tr>
-    </w:tbl>
-    <w:tbl>
-      <w:tblPr>
-        <w:tblW w:type="dxa" w:w="9792"/>
-        <w:tblBorders>
-          <w:top w:val="single" w:color="auto" w:sz="4"/>
-          <w:left w:val="single" w:color="auto" w:sz="4"/>
-          <w:bottom w:val="single" w:color="auto" w:sz="4"/>
-          <w:right w:val="single" w:color="auto" w:sz="4"/>
-          <w:insideH w:val="single" w:color="auto" w:sz="4"/>
-          <w:insideV w:val="single" w:color="auto" w:sz="4"/>
-        </w:tblBorders>
-      </w:tblPr>
-      <w:tblGrid>
-        <w:gridCol w:w="9792"/>
-      </w:tblGrid>
-      <w:tr>
-        <w:tc>
-          <w:tcPr>
-            <w:tcW w:type="dxa" w:w="9792"/>
-            <w:tcBorders>
-              <w:top w:val="single" w:color="D9D5C8" w:sz="4"/>
-              <w:left w:val="single" w:color="D9D5C8" w:sz="4"/>
-              <w:bottom w:val="single" w:color="D9D5C8" w:sz="4"/>
-              <w:right w:val="single" w:color="D9D5C8" w:sz="4"/>
-            </w:tcBorders>
-            <w:shd w:fill="F7F5EF" w:color="auto" w:val="clear"/>
-            <w:tcMar>
-              <w:top w:type="dxa" w:w="55"/>
-              <w:left w:type="dxa" w:w="110"/>
-              <w:bottom w:type="dxa" w:w="55"/>
-              <w:right w:type="dxa" w:w="110"/>
-            </w:tcMar>
-          </w:tcPr>
-          <w:p>
-            <w:pPr>
-              <w:spacing w:after="60"/>
-            </w:pPr>
-            <w:r>
-              <w:rPr>
-                <w:b/>
-                <w:bCs/>
-                <w:i w:val="false"/>
-                <w:iCs w:val="false"/>
-                <w:color w:val="1B2A4A"/>
-                <w:sz w:val="21"/>
-                <w:szCs w:val="21"/>
-                <w:caps w:val="false"/>
-                <w:rFonts w:ascii="Calibri" w:cs="Calibri" w:eastAsia="Calibri" w:hAnsi="Calibri"/>
-              </w:rPr>
-              <w:t xml:space="preserve">REFLECT &amp; CONNECT — how your thinking grew, and whose view you weighed</w:t>
-            </w:r>
-          </w:p>
-          <w:p>
-            <w:pPr>
-              <w:spacing w:after="40"/>
-            </w:pPr>
-            <w:r>
-              <w:rPr>
-                <w:b w:val="false"/>
-                <w:bCs w:val="false"/>
-                <w:i w:val="false"/>
-                <w:iCs w:val="false"/>
-                <w:color w:val="1A1A1A"/>
-                <w:sz w:val="22"/>
-                <w:szCs w:val="22"/>
-                <w:caps w:val="false"/>
-                <w:rFonts w:ascii="Calibri" w:cs="Calibri" w:eastAsia="Calibri" w:hAnsi="Calibri"/>
-              </w:rPr>
-              <w:t xml:space="preserve">Reflect (self-awareness): What did you believe about this topic BEFORE, and what changed AFTER? Name one thing to revisit.</w:t>
-            </w:r>
-          </w:p>
-          <w:p>
-            <w:pPr>
-              <w:spacing w:after="40"/>
-            </w:pPr>
-            <w:r>
-              <w:rPr>
-                <w:b w:val="false"/>
-                <w:bCs w:val="false"/>
-                <w:i w:val="false"/>
-                <w:iCs w:val="false"/>
-                <w:color w:val="1A1A1A"/>
-                <w:sz w:val="22"/>
-                <w:szCs w:val="22"/>
-                <w:caps w:val="false"/>
-                <w:rFonts w:ascii="Calibri" w:cs="Calibri" w:eastAsia="Calibri" w:hAnsi="Calibri"/>
-              </w:rPr>
-              <w:t xml:space="preserve">Consider another view (empathy): Name one person or group who might see this standard differently than you; state their view fairly in one sentence — even if you disagree.</w:t>
-            </w:r>
-          </w:p>
-          <w:p>
-            <w:pPr>
-              <w:spacing w:after="40"/>
-            </w:pPr>
-            <w:r>
-              <w:rPr>
-                <w:b w:val="false"/>
-                <w:bCs w:val="false"/>
-                <w:i w:val="false"/>
-                <w:iCs w:val="false"/>
-                <w:color w:val="1A1A1A"/>
-                <w:sz w:val="22"/>
-                <w:szCs w:val="22"/>
-                <w:caps w:val="false"/>
-                <w:rFonts w:ascii="Calibri" w:cs="Calibri" w:eastAsia="Calibri" w:hAnsi="Calibri"/>
-              </w:rPr>
-              <w:t xml:space="preserve">Norm (restorative): we critique ideas, not people; we assume good faith; we make room for every voice.</w:t>
-            </w:r>
-          </w:p>
-        </w:tc>
-      </w:tr>
-    </w:tbl>
-    <w:p>
-      <w:pPr>
         <w:pStyle w:val="Heading1"/>
         <w:keepNext/>
         <w:pageBreakBefore/>
@@ -50090,457 +49188,6 @@
         <w:t xml:space="preserve"> </w:t>
       </w:r>
     </w:p>
-    <w:p>
-      <w:pPr>
-        <w:pStyle w:val="Heading2"/>
-        <w:keepNext/>
-        <w:pageBreakBefore/>
-        <w:spacing w:before="150" w:after="90"/>
-      </w:pPr>
-      <w:r>
-        <w:rPr>
-          <w:b/>
-          <w:bCs/>
-          <w:i w:val="false"/>
-          <w:iCs w:val="false"/>
-          <w:color w:val="1B2A4A"/>
-          <w:sz w:val="28"/>
-          <w:szCs w:val="28"/>
-          <w:caps w:val="false"/>
-          <w:rFonts w:ascii="Calibri" w:cs="Calibri" w:eastAsia="Calibri" w:hAnsi="Calibri"/>
-        </w:rPr>
-        <w:t xml:space="preserve">UDL Access, Choice &amp; Reflection — GC.18</w:t>
-      </w:r>
-    </w:p>
-    <w:tbl>
-      <w:tblPr>
-        <w:tblW w:type="dxa" w:w="9792"/>
-        <w:tblBorders>
-          <w:top w:val="single" w:color="auto" w:sz="4"/>
-          <w:left w:val="single" w:color="auto" w:sz="4"/>
-          <w:bottom w:val="single" w:color="auto" w:sz="4"/>
-          <w:right w:val="single" w:color="auto" w:sz="4"/>
-          <w:insideH w:val="single" w:color="auto" w:sz="4"/>
-          <w:insideV w:val="single" w:color="auto" w:sz="4"/>
-        </w:tblBorders>
-      </w:tblPr>
-      <w:tblGrid>
-        <w:gridCol w:w="9792"/>
-      </w:tblGrid>
-      <w:tr>
-        <w:tc>
-          <w:tcPr>
-            <w:tcW w:type="dxa" w:w="9792"/>
-            <w:tcBorders>
-              <w:top w:val="single" w:color="D9D5C8" w:sz="4"/>
-              <w:left w:val="single" w:color="D9D5C8" w:sz="4"/>
-              <w:bottom w:val="single" w:color="D9D5C8" w:sz="4"/>
-              <w:right w:val="single" w:color="D9D5C8" w:sz="4"/>
-            </w:tcBorders>
-            <w:shd w:fill="F7F5EF" w:color="auto" w:val="clear"/>
-            <w:tcMar>
-              <w:top w:type="dxa" w:w="55"/>
-              <w:left w:type="dxa" w:w="110"/>
-              <w:bottom w:type="dxa" w:w="55"/>
-              <w:right w:type="dxa" w:w="110"/>
-            </w:tcMar>
-          </w:tcPr>
-          <w:p>
-            <w:pPr>
-              <w:spacing w:after="60"/>
-            </w:pPr>
-            <w:r>
-              <w:rPr>
-                <w:b/>
-                <w:bCs/>
-                <w:i w:val="false"/>
-                <w:iCs w:val="false"/>
-                <w:color w:val="1B2A4A"/>
-                <w:sz w:val="21"/>
-                <w:szCs w:val="21"/>
-                <w:caps w:val="false"/>
-                <w:rFonts w:ascii="Calibri" w:cs="Calibri" w:eastAsia="Calibri" w:hAnsi="Calibri"/>
-              </w:rPr>
-              <w:t xml:space="preserve">UDL ACCESS &amp; MTSS SUPPORT (this standard)</w:t>
-            </w:r>
-          </w:p>
-          <w:p>
-            <w:pPr>
-              <w:spacing w:after="40"/>
-            </w:pPr>
-            <w:r>
-              <w:rPr>
-                <w:b w:val="false"/>
-                <w:bCs w:val="false"/>
-                <w:i w:val="false"/>
-                <w:iCs w:val="false"/>
-                <w:color w:val="1A1A1A"/>
-                <w:sz w:val="22"/>
-                <w:szCs w:val="22"/>
-                <w:caps w:val="false"/>
-                <w:rFonts w:ascii="Calibri" w:cs="Calibri" w:eastAsia="Calibri" w:hAnsi="Calibri"/>
-              </w:rPr>
-              <w:t xml:space="preserve">UDL 3.0 (CAST, 2024): read-aloud on request · key terms glossed (EN/ES) · respond in writing, speech, or a labeled diagram · large-print &amp; screen-reader friendly. Same learning target for everyone; supports vary the means, not the ceiling.</w:t>
-            </w:r>
-          </w:p>
-          <w:p>
-            <w:pPr>
-              <w:spacing w:after="40"/>
-            </w:pPr>
-            <w:r>
-              <w:rPr>
-                <w:b w:val="false"/>
-                <w:bCs w:val="false"/>
-                <w:i w:val="false"/>
-                <w:iCs w:val="false"/>
-                <w:color w:val="1A1A1A"/>
-                <w:sz w:val="22"/>
-                <w:szCs w:val="22"/>
-                <w:caps w:val="false"/>
-                <w:rFonts w:ascii="Calibri" w:cs="Calibri" w:eastAsia="Calibri" w:hAnsi="Calibri"/>
-              </w:rPr>
-              <w:t xml:space="preserve">MTSS: Tier 1 — this core lesson for all · Tier 2 — small-group reteach of this standard using its Cornell cues + graphic organizer, then re-check · Tier 3 — intensive 1:1 with concrete→representational→abstract scaffolding, progress-monitored to the same standard.</w:t>
-            </w:r>
-          </w:p>
-        </w:tc>
-      </w:tr>
-    </w:tbl>
-    <w:tbl>
-      <w:tblPr>
-        <w:tblW w:type="dxa" w:w="9792"/>
-        <w:tblBorders>
-          <w:top w:val="single" w:color="auto" w:sz="4"/>
-          <w:left w:val="single" w:color="auto" w:sz="4"/>
-          <w:bottom w:val="single" w:color="auto" w:sz="4"/>
-          <w:right w:val="single" w:color="auto" w:sz="4"/>
-          <w:insideH w:val="single" w:color="auto" w:sz="4"/>
-          <w:insideV w:val="single" w:color="auto" w:sz="4"/>
-        </w:tblBorders>
-      </w:tblPr>
-      <w:tblGrid>
-        <w:gridCol w:w="9792"/>
-      </w:tblGrid>
-      <w:tr>
-        <w:tc>
-          <w:tcPr>
-            <w:tcW w:type="dxa" w:w="9792"/>
-            <w:tcBorders>
-              <w:top w:val="single" w:color="D9D5C8" w:sz="4"/>
-              <w:left w:val="single" w:color="D9D5C8" w:sz="4"/>
-              <w:bottom w:val="single" w:color="D9D5C8" w:sz="4"/>
-              <w:right w:val="single" w:color="D9D5C8" w:sz="4"/>
-            </w:tcBorders>
-            <w:shd w:fill="F7F5EF" w:color="auto" w:val="clear"/>
-            <w:tcMar>
-              <w:top w:type="dxa" w:w="55"/>
-              <w:left w:type="dxa" w:w="110"/>
-              <w:bottom w:type="dxa" w:w="55"/>
-              <w:right w:type="dxa" w:w="110"/>
-            </w:tcMar>
-          </w:tcPr>
-          <w:p>
-            <w:pPr>
-              <w:spacing w:after="60"/>
-            </w:pPr>
-            <w:r>
-              <w:rPr>
-                <w:b/>
-                <w:bCs/>
-                <w:i w:val="false"/>
-                <w:iCs w:val="false"/>
-                <w:color w:val="1B2A4A"/>
-                <w:sz w:val="21"/>
-                <w:szCs w:val="21"/>
-                <w:caps w:val="false"/>
-                <w:rFonts w:ascii="Calibri" w:cs="Calibri" w:eastAsia="Calibri" w:hAnsi="Calibri"/>
-              </w:rPr>
-              <w:t xml:space="preserve">SHOW WHAT YOU KNOW — YOUR WAY (same CER rubric, same standard)</w:t>
-            </w:r>
-          </w:p>
-          <w:p>
-            <w:pPr>
-              <w:spacing w:after="40"/>
-            </w:pPr>
-            <w:r>
-              <w:rPr>
-                <w:b w:val="false"/>
-                <w:bCs w:val="false"/>
-                <w:i w:val="false"/>
-                <w:iCs w:val="false"/>
-                <w:color w:val="1A1A1A"/>
-                <w:sz w:val="22"/>
-                <w:szCs w:val="22"/>
-                <w:caps w:val="false"/>
-                <w:rFonts w:ascii="Calibri" w:cs="Calibri" w:eastAsia="Calibri" w:hAnsi="Calibri"/>
-              </w:rPr>
-              <w:t xml:space="preserve">Build your Claim–Evidence–Reasoning in whichever mode lets you think best — the standard and the CER rubric are identical for every mode; the mode changes how you SHOW it, never what you are held to:</w:t>
-            </w:r>
-          </w:p>
-          <w:p>
-            <w:pPr>
-              <w:spacing w:after="40"/>
-            </w:pPr>
-            <w:r>
-              <w:rPr>
-                <w:b w:val="false"/>
-                <w:bCs w:val="false"/>
-                <w:i w:val="false"/>
-                <w:iCs w:val="false"/>
-                <w:color w:val="1A1A1A"/>
-                <w:sz w:val="22"/>
-                <w:szCs w:val="22"/>
-                <w:caps w:val="false"/>
-                <w:rFonts w:ascii="Calibri" w:cs="Calibri" w:eastAsia="Calibri" w:hAnsi="Calibri"/>
-              </w:rPr>
-              <w:t xml:space="preserve">WRITE it  ·  SAY it aloud and record it (audio or video)  ·  DRAW and label a diagram that makes the argument  ·  BUILD a model or artifact and caption its claim, evidence, and reasoning.</w:t>
-            </w:r>
-          </w:p>
-          <w:p>
-            <w:pPr>
-              <w:spacing w:after="40"/>
-            </w:pPr>
-            <w:r>
-              <w:rPr>
-                <w:b w:val="false"/>
-                <w:bCs w:val="false"/>
-                <w:i w:val="false"/>
-                <w:iCs w:val="false"/>
-                <w:color w:val="1A1A1A"/>
-                <w:sz w:val="22"/>
-                <w:szCs w:val="22"/>
-                <w:caps w:val="false"/>
-                <w:rFonts w:ascii="Calibri" w:cs="Calibri" w:eastAsia="Calibri" w:hAnsi="Calibri"/>
-              </w:rPr>
-              <w:t xml:space="preserve">You may ask for a word processor, speech-to-text, a scribe, or a sentence/argument frame — these change how you produce, not the standard you meet.</w:t>
-            </w:r>
-          </w:p>
-        </w:tc>
-      </w:tr>
-    </w:tbl>
-    <w:tbl>
-      <w:tblPr>
-        <w:tblW w:type="dxa" w:w="9792"/>
-        <w:tblBorders>
-          <w:top w:val="single" w:color="auto" w:sz="4"/>
-          <w:left w:val="single" w:color="auto" w:sz="4"/>
-          <w:bottom w:val="single" w:color="auto" w:sz="4"/>
-          <w:right w:val="single" w:color="auto" w:sz="4"/>
-          <w:insideH w:val="single" w:color="auto" w:sz="4"/>
-          <w:insideV w:val="single" w:color="auto" w:sz="4"/>
-        </w:tblBorders>
-      </w:tblPr>
-      <w:tblGrid>
-        <w:gridCol w:w="9792"/>
-      </w:tblGrid>
-      <w:tr>
-        <w:tc>
-          <w:tcPr>
-            <w:tcW w:type="dxa" w:w="9792"/>
-            <w:tcBorders>
-              <w:top w:val="single" w:color="D9D5C8" w:sz="4"/>
-              <w:left w:val="single" w:color="D9D5C8" w:sz="4"/>
-              <w:bottom w:val="single" w:color="D9D5C8" w:sz="4"/>
-              <w:right w:val="single" w:color="D9D5C8" w:sz="4"/>
-            </w:tcBorders>
-            <w:shd w:fill="F7F5EF" w:color="auto" w:val="clear"/>
-            <w:tcMar>
-              <w:top w:type="dxa" w:w="55"/>
-              <w:left w:type="dxa" w:w="110"/>
-              <w:bottom w:type="dxa" w:w="55"/>
-              <w:right w:type="dxa" w:w="110"/>
-            </w:tcMar>
-          </w:tcPr>
-          <w:p>
-            <w:pPr>
-              <w:spacing w:after="60"/>
-            </w:pPr>
-            <w:r>
-              <w:rPr>
-                <w:b/>
-                <w:bCs/>
-                <w:i w:val="false"/>
-                <w:iCs w:val="false"/>
-                <w:color w:val="1B2A4A"/>
-                <w:sz w:val="21"/>
-                <w:szCs w:val="21"/>
-                <w:caps w:val="false"/>
-                <w:rFonts w:ascii="Calibri" w:cs="Calibri" w:eastAsia="Calibri" w:hAnsi="Calibri"/>
-              </w:rPr>
-              <w:t xml:space="preserve">CHOICE &amp; VOICE — you decide how to go deeper (pick ONE)</w:t>
-            </w:r>
-          </w:p>
-          <w:p>
-            <w:pPr>
-              <w:spacing w:after="40"/>
-            </w:pPr>
-            <w:r>
-              <w:rPr>
-                <w:b w:val="false"/>
-                <w:bCs w:val="false"/>
-                <w:i w:val="false"/>
-                <w:iCs w:val="false"/>
-                <w:color w:val="1A1A1A"/>
-                <w:sz w:val="22"/>
-                <w:szCs w:val="22"/>
-                <w:caps w:val="false"/>
-                <w:rFonts w:ascii="Calibri" w:cs="Calibri" w:eastAsia="Calibri" w:hAnsi="Calibri"/>
-              </w:rPr>
-              <w:t xml:space="preserve">You choose your path to show this standard — every option meets the same target:</w:t>
-            </w:r>
-          </w:p>
-          <w:p>
-            <w:pPr>
-              <w:spacing w:after="40"/>
-            </w:pPr>
-            <w:r>
-              <w:rPr>
-                <w:b w:val="false"/>
-                <w:bCs w:val="false"/>
-                <w:i w:val="false"/>
-                <w:iCs w:val="false"/>
-                <w:color w:val="1A1A1A"/>
-                <w:sz w:val="22"/>
-                <w:szCs w:val="22"/>
-                <w:caps w:val="false"/>
-                <w:rFonts w:ascii="Calibri" w:cs="Calibri" w:eastAsia="Calibri" w:hAnsi="Calibri"/>
-              </w:rPr>
-              <w:t xml:space="preserve">DEFEND a term: pick the vocabulary word that matters most and argue why in 2–3 sentences.  ·  CONNECT it: pick a current event, your community, or your own life and explain how this standard shows up there.  ·  TAKE A SIDE: pick one debatable question and argue your position with evidence.</w:t>
-            </w:r>
-          </w:p>
-          <w:p>
-            <w:pPr>
-              <w:spacing w:after="40"/>
-            </w:pPr>
-            <w:r>
-              <w:rPr>
-                <w:b w:val="false"/>
-                <w:bCs w:val="false"/>
-                <w:i w:val="false"/>
-                <w:iCs w:val="false"/>
-                <w:color w:val="1A1A1A"/>
-                <w:sz w:val="22"/>
-                <w:szCs w:val="22"/>
-                <w:caps w:val="false"/>
-                <w:rFonts w:ascii="Calibri" w:cs="Calibri" w:eastAsia="Calibri" w:hAnsi="Calibri"/>
-              </w:rPr>
-              <w:t xml:space="preserve">Your pick is yours — bring what matters to you into the work.</w:t>
-            </w:r>
-          </w:p>
-        </w:tc>
-      </w:tr>
-    </w:tbl>
-    <w:tbl>
-      <w:tblPr>
-        <w:tblW w:type="dxa" w:w="9792"/>
-        <w:tblBorders>
-          <w:top w:val="single" w:color="auto" w:sz="4"/>
-          <w:left w:val="single" w:color="auto" w:sz="4"/>
-          <w:bottom w:val="single" w:color="auto" w:sz="4"/>
-          <w:right w:val="single" w:color="auto" w:sz="4"/>
-          <w:insideH w:val="single" w:color="auto" w:sz="4"/>
-          <w:insideV w:val="single" w:color="auto" w:sz="4"/>
-        </w:tblBorders>
-      </w:tblPr>
-      <w:tblGrid>
-        <w:gridCol w:w="9792"/>
-      </w:tblGrid>
-      <w:tr>
-        <w:tc>
-          <w:tcPr>
-            <w:tcW w:type="dxa" w:w="9792"/>
-            <w:tcBorders>
-              <w:top w:val="single" w:color="D9D5C8" w:sz="4"/>
-              <w:left w:val="single" w:color="D9D5C8" w:sz="4"/>
-              <w:bottom w:val="single" w:color="D9D5C8" w:sz="4"/>
-              <w:right w:val="single" w:color="D9D5C8" w:sz="4"/>
-            </w:tcBorders>
-            <w:shd w:fill="F7F5EF" w:color="auto" w:val="clear"/>
-            <w:tcMar>
-              <w:top w:type="dxa" w:w="55"/>
-              <w:left w:type="dxa" w:w="110"/>
-              <w:bottom w:type="dxa" w:w="55"/>
-              <w:right w:type="dxa" w:w="110"/>
-            </w:tcMar>
-          </w:tcPr>
-          <w:p>
-            <w:pPr>
-              <w:spacing w:after="60"/>
-            </w:pPr>
-            <w:r>
-              <w:rPr>
-                <w:b/>
-                <w:bCs/>
-                <w:i w:val="false"/>
-                <w:iCs w:val="false"/>
-                <w:color w:val="1B2A4A"/>
-                <w:sz w:val="21"/>
-                <w:szCs w:val="21"/>
-                <w:caps w:val="false"/>
-                <w:rFonts w:ascii="Calibri" w:cs="Calibri" w:eastAsia="Calibri" w:hAnsi="Calibri"/>
-              </w:rPr>
-              <w:t xml:space="preserve">REFLECT &amp; CONNECT — how your thinking grew, and whose view you weighed</w:t>
-            </w:r>
-          </w:p>
-          <w:p>
-            <w:pPr>
-              <w:spacing w:after="40"/>
-            </w:pPr>
-            <w:r>
-              <w:rPr>
-                <w:b w:val="false"/>
-                <w:bCs w:val="false"/>
-                <w:i w:val="false"/>
-                <w:iCs w:val="false"/>
-                <w:color w:val="1A1A1A"/>
-                <w:sz w:val="22"/>
-                <w:szCs w:val="22"/>
-                <w:caps w:val="false"/>
-                <w:rFonts w:ascii="Calibri" w:cs="Calibri" w:eastAsia="Calibri" w:hAnsi="Calibri"/>
-              </w:rPr>
-              <w:t xml:space="preserve">Reflect (self-awareness): What did you believe about this topic BEFORE, and what changed AFTER? Name one thing to revisit.</w:t>
-            </w:r>
-          </w:p>
-          <w:p>
-            <w:pPr>
-              <w:spacing w:after="40"/>
-            </w:pPr>
-            <w:r>
-              <w:rPr>
-                <w:b w:val="false"/>
-                <w:bCs w:val="false"/>
-                <w:i w:val="false"/>
-                <w:iCs w:val="false"/>
-                <w:color w:val="1A1A1A"/>
-                <w:sz w:val="22"/>
-                <w:szCs w:val="22"/>
-                <w:caps w:val="false"/>
-                <w:rFonts w:ascii="Calibri" w:cs="Calibri" w:eastAsia="Calibri" w:hAnsi="Calibri"/>
-              </w:rPr>
-              <w:t xml:space="preserve">Consider another view (empathy): Name one person or group who might see this standard differently than you; state their view fairly in one sentence — even if you disagree.</w:t>
-            </w:r>
-          </w:p>
-          <w:p>
-            <w:pPr>
-              <w:spacing w:after="40"/>
-            </w:pPr>
-            <w:r>
-              <w:rPr>
-                <w:b w:val="false"/>
-                <w:bCs w:val="false"/>
-                <w:i w:val="false"/>
-                <w:iCs w:val="false"/>
-                <w:color w:val="1A1A1A"/>
-                <w:sz w:val="22"/>
-                <w:szCs w:val="22"/>
-                <w:caps w:val="false"/>
-                <w:rFonts w:ascii="Calibri" w:cs="Calibri" w:eastAsia="Calibri" w:hAnsi="Calibri"/>
-              </w:rPr>
-              <w:t xml:space="preserve">Norm (restorative): we critique ideas, not people; we assume good faith; we make room for every voice.</w:t>
-            </w:r>
-          </w:p>
-        </w:tc>
-      </w:tr>
-    </w:tbl>
     <w:p>
       <w:pPr>
         <w:pStyle w:val="Heading1"/>

</xml_diff>